<commit_message>
Rebuild from the Google files (2026-10-23)
Fresh downloads of the framework Doc, the game text Sheet and the
commons-comma matrix and packet: three tries to solve the case, no
follow-up bonus, the revised Rules of the game, and the sidebar's
"HEAR Framework Guide" link.

Co-Authored-By: Claude Opus 5.5 <noreply@anthropic.com>
Claude-Session: https://claude.ai/code/session_01J8R4SET6LminzKA26BGVqh
</commit_message>
<xml_diff>
--- a/engine/HEARsay mysteries.docx
+++ b/engine/HEARsay mysteries.docx
@@ -6,42 +6,93 @@
     <w:p>
       <w:pPr>
         <w:pStyle w:val="Title"/>
-        <w:spacing w:after="60" w:before="200" w:line="276" w:lineRule="auto"/>
-        <w:jc w:val="center"/>
+        <w:keepNext w:val="0"/>
+        <w:keepLines w:val="0"/>
+        <w:pageBreakBefore w:val="0"/>
+        <w:widowControl w:val="0"/>
+        <w:pBdr>
+          <w:top w:space="0" w:sz="0" w:val="nil"/>
+          <w:left w:space="0" w:sz="0" w:val="nil"/>
+          <w:bottom w:space="0" w:sz="0" w:val="nil"/>
+          <w:right w:space="0" w:sz="0" w:val="nil"/>
+          <w:between w:space="0" w:sz="0" w:val="nil"/>
+        </w:pBdr>
+        <w:shd w:fill="auto" w:val="clear"/>
+        <w:spacing w:after="0" w:before="0" w:line="276" w:lineRule="auto"/>
+        <w:ind w:left="0" w:right="0" w:firstLine="0"/>
+        <w:jc w:val="left"/>
+        <w:rPr>
+          <w:rFonts w:ascii="Arial" w:cs="Arial" w:eastAsia="Arial" w:hAnsi="Arial"/>
+          <w:b w:val="0"/>
+          <w:bCs w:val="0"/>
+          <w:i w:val="0"/>
+          <w:iCs w:val="0"/>
+          <w:smallCaps w:val="0"/>
+          <w:strike w:val="0"/>
+          <w:color w:val="000000"/>
+          <w:sz w:val="22"/>
+          <w:szCs w:val="22"/>
+          <w:u w:val="none"/>
+          <w:shd w:fill="auto" w:val="clear"/>
+          <w:vertAlign w:val="baseline"/>
+        </w:rPr>
+        <w:sectPr>
+          <w:pgSz w:h="15840" w:w="12240" w:orient="portrait"/>
+          <w:pgMar w:bottom="1440" w:top="1440" w:left="1440" w:right="1440" w:header="720" w:footer="720"/>
+          <w:pgNumType w:start="1"/>
+        </w:sectPr>
+      </w:pPr>
+      <w:bookmarkStart w:colFirst="0" w:colLast="0" w:name="_tkhbnfaoszso" w:id="0"/>
+      <w:bookmarkEnd w:id="0"/>
+      <w:r>
         <w:rPr>
           <w:rFonts w:ascii="Garamond" w:cs="Garamond" w:eastAsia="Garamond" w:hAnsi="Garamond"/>
+          <w:b w:val="1"/>
+          <w:bCs w:val="1"/>
+          <w:i w:val="0"/>
+          <w:iCs w:val="0"/>
+          <w:smallCaps w:val="0"/>
+          <w:strike w:val="0"/>
+          <w:color w:val="000000"/>
           <w:sz w:val="60"/>
           <w:szCs w:val="60"/>
-        </w:rPr>
-      </w:pPr>
-      <w:bookmarkStart w:colFirst="0" w:colLast="0" w:name="_ik0ajinzayw4" w:id="0"/>
-      <w:bookmarkEnd w:id="0"/>
-      <w:r>
-        <w:rPr>
-          <w:rFonts w:ascii="Garamond" w:cs="Garamond" w:eastAsia="Garamond" w:hAnsi="Garamond"/>
-          <w:sz w:val="60"/>
-          <w:szCs w:val="60"/>
+          <w:u w:val="none"/>
+          <w:shd w:fill="auto" w:val="clear"/>
+          <w:vertAlign w:val="baseline"/>
           <w:rtl w:val="0"/>
         </w:rPr>
         <w:t xml:space="preserve">HEARsay Mysteries</w:t>
       </w:r>
+      <w:r>
+        <w:rPr>
+          <w:rtl w:val="0"/>
+        </w:rPr>
+      </w:r>
+    </w:p>
+    <w:p>
+      <w:pPr>
+        <w:pStyle w:val="Title"/>
+        <w:jc w:val="center"/>
+        <w:rPr/>
+      </w:pPr>
+      <w:bookmarkStart w:colFirst="0" w:colLast="0" w:name="_ik0ajinzayw4" w:id="1"/>
+      <w:bookmarkEnd w:id="1"/>
+      <w:r>
+        <w:rPr>
+          <w:rtl w:val="0"/>
+        </w:rPr>
+        <w:t xml:space="preserve">HEARsay Mysteries</w:t>
+      </w:r>
     </w:p>
     <w:p>
       <w:pPr>
         <w:pStyle w:val="Subtitle"/>
-        <w:spacing w:after="320" w:before="200" w:line="276" w:lineRule="auto"/>
-        <w:jc w:val="center"/>
-        <w:rPr>
-          <w:sz w:val="22"/>
-          <w:szCs w:val="22"/>
-        </w:rPr>
-      </w:pPr>
-      <w:bookmarkStart w:colFirst="0" w:colLast="0" w:name="_rjfdtmwzzd07" w:id="1"/>
-      <w:bookmarkEnd w:id="1"/>
-      <w:r>
-        <w:rPr>
-          <w:sz w:val="22"/>
-          <w:szCs w:val="22"/>
+        <w:rPr/>
+      </w:pPr>
+      <w:bookmarkStart w:colFirst="0" w:colLast="0" w:name="_rjfdtmwzzd07" w:id="2"/>
+      <w:bookmarkEnd w:id="2"/>
+      <w:r>
+        <w:rPr>
           <w:rtl w:val="0"/>
         </w:rPr>
         <w:t xml:space="preserve">A mystery game framework for teaching and practicing the HEAR framework</w:t>
@@ -50,15 +101,13 @@
     <w:p>
       <w:pPr>
         <w:pStyle w:val="Subtitle"/>
-        <w:spacing w:after="320" w:before="200" w:line="276" w:lineRule="auto"/>
-        <w:jc w:val="center"/>
         <w:rPr>
           <w:sz w:val="20"/>
           <w:szCs w:val="20"/>
         </w:rPr>
       </w:pPr>
-      <w:bookmarkStart w:colFirst="0" w:colLast="0" w:name="_dhe0haaxgpbf" w:id="2"/>
-      <w:bookmarkEnd w:id="2"/>
+      <w:bookmarkStart w:colFirst="0" w:colLast="0" w:name="_dhe0haaxgpbf" w:id="3"/>
+      <w:bookmarkEnd w:id="3"/>
       <w:r>
         <w:rPr>
           <w:sz w:val="20"/>
@@ -70,31 +119,22 @@
     </w:p>
     <w:p>
       <w:pPr>
-        <w:spacing w:before="200" w:line="276" w:lineRule="auto"/>
-        <w:rPr>
-          <w:rFonts w:ascii="Garamond" w:cs="Garamond" w:eastAsia="Garamond" w:hAnsi="Garamond"/>
-          <w:sz w:val="24"/>
-          <w:szCs w:val="24"/>
-        </w:rPr>
-      </w:pPr>
-      <w:r>
-        <w:rPr>
-          <w:rFonts w:ascii="Garamond" w:cs="Garamond" w:eastAsia="Garamond" w:hAnsi="Garamond"/>
-          <w:sz w:val="24"/>
-          <w:szCs w:val="24"/>
-        </w:rPr>
+        <w:rPr/>
+      </w:pPr>
+      <w:r>
+        <w:rPr/>
         <mc:AlternateContent>
           <mc:Choice Requires="wpg">
             <w:drawing>
               <wp:inline distB="114300" distT="114300" distL="114300" distR="114300">
                 <wp:extent cx="6510258" cy="892601"/>
                 <wp:effectExtent b="0" l="0" r="0" t="0"/>
-                <wp:docPr id="2" name=""/>
+                <wp:docPr id="1" name=""/>
                 <a:graphic>
                   <a:graphicData uri="http://schemas.microsoft.com/office/word/2010/wordprocessingShape">
                     <wps:wsp>
                       <wps:cNvSpPr txBox="1"/>
-                      <wps:cNvPr id="3" name="Shape 3"/>
+                      <wps:cNvPr id="2" name="Shape 2"/>
                       <wps:spPr>
                         <a:xfrm>
                           <a:off x="0" y="872975"/>
@@ -201,16 +241,16 @@
               <wp:inline distB="114300" distT="114300" distL="114300" distR="114300">
                 <wp:extent cx="6510258" cy="892601"/>
                 <wp:effectExtent b="0" l="0" r="0" t="0"/>
-                <wp:docPr id="2" name="image2.png"/>
+                <wp:docPr id="1" name="image1.png"/>
                 <a:graphic>
                   <a:graphicData uri="http://schemas.openxmlformats.org/drawingml/2006/picture">
                     <pic:pic>
                       <pic:nvPicPr>
-                        <pic:cNvPr id="0" name="image2.png"/>
+                        <pic:cNvPr id="0" name="image1.png"/>
                         <pic:cNvPicPr preferRelativeResize="0"/>
                       </pic:nvPicPr>
                       <pic:blipFill>
-                        <a:blip r:embed="rId7"/>
+                        <a:blip r:embed="rId8"/>
                         <a:srcRect/>
                         <a:stretch>
                           <a:fillRect/>
@@ -240,31 +280,22 @@
     </w:p>
     <w:p>
       <w:pPr>
-        <w:spacing w:before="200" w:line="276" w:lineRule="auto"/>
-        <w:rPr>
-          <w:rFonts w:ascii="Garamond" w:cs="Garamond" w:eastAsia="Garamond" w:hAnsi="Garamond"/>
-          <w:sz w:val="24"/>
-          <w:szCs w:val="24"/>
-        </w:rPr>
-      </w:pPr>
-      <w:r>
-        <w:rPr>
-          <w:rFonts w:ascii="Garamond" w:cs="Garamond" w:eastAsia="Garamond" w:hAnsi="Garamond"/>
-          <w:sz w:val="24"/>
-          <w:szCs w:val="24"/>
-        </w:rPr>
+        <w:rPr/>
+      </w:pPr>
+      <w:r>
+        <w:rPr/>
         <mc:AlternateContent>
           <mc:Choice Requires="wpg">
             <w:drawing>
               <wp:inline distB="114300" distT="114300" distL="114300" distR="114300">
                 <wp:extent cx="6505575" cy="1114744"/>
                 <wp:effectExtent b="0" l="0" r="0" t="0"/>
-                <wp:docPr id="1" name=""/>
+                <wp:docPr id="2" name=""/>
                 <a:graphic>
                   <a:graphicData uri="http://schemas.microsoft.com/office/word/2010/wordprocessingShape">
                     <wps:wsp>
                       <wps:cNvSpPr txBox="1"/>
-                      <wps:cNvPr id="2" name="Shape 2"/>
+                      <wps:cNvPr id="3" name="Shape 3"/>
                       <wps:spPr>
                         <a:xfrm>
                           <a:off x="262200" y="791775"/>
@@ -404,16 +435,16 @@
               <wp:inline distB="114300" distT="114300" distL="114300" distR="114300">
                 <wp:extent cx="6505575" cy="1114744"/>
                 <wp:effectExtent b="0" l="0" r="0" t="0"/>
-                <wp:docPr id="1" name="image1.png"/>
+                <wp:docPr id="2" name="image2.png"/>
                 <a:graphic>
                   <a:graphicData uri="http://schemas.openxmlformats.org/drawingml/2006/picture">
                     <pic:pic>
                       <pic:nvPicPr>
-                        <pic:cNvPr id="0" name="image1.png"/>
+                        <pic:cNvPr id="0" name="image2.png"/>
                         <pic:cNvPicPr preferRelativeResize="0"/>
                       </pic:nvPicPr>
                       <pic:blipFill>
-                        <a:blip r:embed="rId7"/>
+                        <a:blip r:embed="rId8"/>
                         <a:srcRect/>
                         <a:stretch>
                           <a:fillRect/>
@@ -444,24 +475,12 @@
     <w:p>
       <w:pPr>
         <w:pStyle w:val="Heading1"/>
-        <w:spacing w:before="400" w:line="276" w:lineRule="auto"/>
-        <w:rPr>
-          <w:rFonts w:ascii="Garamond" w:cs="Garamond" w:eastAsia="Garamond" w:hAnsi="Garamond"/>
-          <w:b w:val="0"/>
-          <w:bCs w:val="0"/>
-          <w:sz w:val="40"/>
-          <w:szCs w:val="40"/>
-        </w:rPr>
-      </w:pPr>
-      <w:bookmarkStart w:colFirst="0" w:colLast="0" w:name="_91ezqgojjt8o" w:id="3"/>
-      <w:bookmarkEnd w:id="3"/>
-      <w:r>
-        <w:rPr>
-          <w:rFonts w:ascii="Garamond" w:cs="Garamond" w:eastAsia="Garamond" w:hAnsi="Garamond"/>
-          <w:b w:val="0"/>
-          <w:bCs w:val="0"/>
-          <w:sz w:val="40"/>
-          <w:szCs w:val="40"/>
+        <w:rPr/>
+      </w:pPr>
+      <w:bookmarkStart w:colFirst="0" w:colLast="0" w:name="_91ezqgojjt8o" w:id="4"/>
+      <w:bookmarkEnd w:id="4"/>
+      <w:r>
+        <w:rPr>
           <w:rtl w:val="0"/>
         </w:rPr>
         <w:t xml:space="preserve">1. What is a HEARsay mystery? </w:t>
@@ -474,67 +493,44 @@
     </w:p>
     <w:p>
       <w:pPr>
-        <w:spacing w:before="200" w:line="276" w:lineRule="auto"/>
-        <w:rPr>
-          <w:rFonts w:ascii="Garamond" w:cs="Garamond" w:eastAsia="Garamond" w:hAnsi="Garamond"/>
-          <w:sz w:val="24"/>
-          <w:szCs w:val="24"/>
-        </w:rPr>
-      </w:pPr>
-      <w:r>
-        <w:rPr>
-          <w:rFonts w:ascii="Garamond" w:cs="Garamond" w:eastAsia="Garamond" w:hAnsi="Garamond"/>
-          <w:sz w:val="24"/>
-          <w:szCs w:val="24"/>
+        <w:rPr/>
+      </w:pPr>
+      <w:r>
+        <w:rPr>
           <w:rtl w:val="0"/>
         </w:rPr>
         <w:t xml:space="preserve">HEARsay is a series of mystery games designed to help students learn and practice </w:t>
       </w:r>
       <w:r>
         <w:rPr>
-          <w:rFonts w:ascii="Garamond" w:cs="Garamond" w:eastAsia="Garamond" w:hAnsi="Garamond"/>
           <w:i w:val="1"/>
           <w:iCs w:val="1"/>
-          <w:sz w:val="24"/>
-          <w:szCs w:val="24"/>
           <w:rtl w:val="0"/>
         </w:rPr>
         <w:t xml:space="preserve">conversational receptiveness</w:t>
       </w:r>
       <w:r>
         <w:rPr>
-          <w:rFonts w:ascii="Garamond" w:cs="Garamond" w:eastAsia="Garamond" w:hAnsi="Garamond"/>
           <w:i w:val="1"/>
           <w:iCs w:val="1"/>
-          <w:sz w:val="24"/>
-          <w:szCs w:val="24"/>
           <w:vertAlign w:val="superscript"/>
         </w:rPr>
         <w:footnoteReference w:customMarkFollows="0" w:id="0"/>
       </w:r>
       <w:r>
         <w:rPr>
-          <w:rFonts w:ascii="Garamond" w:cs="Garamond" w:eastAsia="Garamond" w:hAnsi="Garamond"/>
-          <w:sz w:val="24"/>
-          <w:szCs w:val="24"/>
           <w:rtl w:val="0"/>
         </w:rPr>
         <w:t xml:space="preserve">- “the use of language to communicate one’s willingness to thoughtfully engage with opposing views.”</w:t>
       </w:r>
       <w:r>
         <w:rPr>
-          <w:rFonts w:ascii="Garamond" w:cs="Garamond" w:eastAsia="Garamond" w:hAnsi="Garamond"/>
-          <w:sz w:val="24"/>
-          <w:szCs w:val="24"/>
           <w:vertAlign w:val="superscript"/>
         </w:rPr>
         <w:footnoteReference w:customMarkFollows="0" w:id="1"/>
       </w:r>
       <w:r>
         <w:rPr>
-          <w:rFonts w:ascii="Garamond" w:cs="Garamond" w:eastAsia="Garamond" w:hAnsi="Garamond"/>
-          <w:sz w:val="24"/>
-          <w:szCs w:val="24"/>
           <w:rtl w:val="0"/>
         </w:rPr>
         <w:t xml:space="preserve"> The focus of the games is the HEAR Framework, a practical tool aimed to help people remember and apply the principles of conversational receptiveness. </w:t>
@@ -542,56 +538,36 @@
     </w:p>
     <w:p>
       <w:pPr>
-        <w:spacing w:before="200" w:line="276" w:lineRule="auto"/>
-        <w:rPr>
-          <w:rFonts w:ascii="Garamond" w:cs="Garamond" w:eastAsia="Garamond" w:hAnsi="Garamond"/>
-          <w:sz w:val="24"/>
-          <w:szCs w:val="24"/>
-        </w:rPr>
-      </w:pPr>
-      <w:r>
-        <w:rPr>
-          <w:rFonts w:ascii="Garamond" w:cs="Garamond" w:eastAsia="Garamond" w:hAnsi="Garamond"/>
-          <w:sz w:val="24"/>
-          <w:szCs w:val="24"/>
+        <w:rPr/>
+      </w:pPr>
+      <w:r>
+        <w:rPr>
           <w:rtl w:val="0"/>
         </w:rPr>
         <w:t xml:space="preserve">HEARsay mysteries are story-driven games built on Twine, a free choose-your-own-adventure engine game that requires little to no coding. This framework provides the details about the way the game works as well as instructions for crafting scenarios. The first scenario, </w:t>
       </w:r>
       <w:r>
         <w:rPr>
-          <w:rFonts w:ascii="Garamond" w:cs="Garamond" w:eastAsia="Garamond" w:hAnsi="Garamond"/>
           <w:i w:val="1"/>
           <w:iCs w:val="1"/>
-          <w:sz w:val="24"/>
-          <w:szCs w:val="24"/>
           <w:rtl w:val="0"/>
         </w:rPr>
         <w:t xml:space="preserve">The Commons’ Comma</w:t>
       </w:r>
       <w:r>
         <w:rPr>
-          <w:rFonts w:ascii="Garamond" w:cs="Garamond" w:eastAsia="Garamond" w:hAnsi="Garamond"/>
-          <w:sz w:val="24"/>
-          <w:szCs w:val="24"/>
           <w:rtl w:val="0"/>
         </w:rPr>
         <w:t xml:space="preserve">, is included in an accompanying folder and describes a scenario based on a university campus, which I will treat here as the default backdrop for HEARsay mysteries.</w:t>
       </w:r>
       <w:r>
         <w:rPr>
-          <w:rFonts w:ascii="Garamond" w:cs="Garamond" w:eastAsia="Garamond" w:hAnsi="Garamond"/>
-          <w:sz w:val="24"/>
-          <w:szCs w:val="24"/>
           <w:vertAlign w:val="superscript"/>
         </w:rPr>
         <w:footnoteReference w:customMarkFollows="0" w:id="2"/>
       </w:r>
       <w:r>
         <w:rPr>
-          <w:rFonts w:ascii="Garamond" w:cs="Garamond" w:eastAsia="Garamond" w:hAnsi="Garamond"/>
-          <w:sz w:val="24"/>
-          <w:szCs w:val="24"/>
           <w:rtl w:val="0"/>
         </w:rPr>
         <w:t xml:space="preserve"> </w:t>
@@ -599,54 +575,34 @@
     </w:p>
     <w:p>
       <w:pPr>
-        <w:spacing w:before="200" w:line="276" w:lineRule="auto"/>
-        <w:rPr>
-          <w:rFonts w:ascii="Garamond" w:cs="Garamond" w:eastAsia="Garamond" w:hAnsi="Garamond"/>
-          <w:sz w:val="24"/>
-          <w:szCs w:val="24"/>
-        </w:rPr>
-      </w:pPr>
-      <w:r>
-        <w:rPr>
-          <w:rFonts w:ascii="Garamond" w:cs="Garamond" w:eastAsia="Garamond" w:hAnsi="Garamond"/>
-          <w:sz w:val="24"/>
-          <w:szCs w:val="24"/>
+        <w:rPr/>
+      </w:pPr>
+      <w:r>
+        <w:rPr>
           <w:rtl w:val="0"/>
         </w:rPr>
         <w:t xml:space="preserve">Each scenario </w:t>
       </w:r>
       <w:r>
         <w:rPr>
-          <w:rFonts w:ascii="Garamond" w:cs="Garamond" w:eastAsia="Garamond" w:hAnsi="Garamond"/>
-          <w:sz w:val="24"/>
-          <w:szCs w:val="24"/>
           <w:rtl w:val="0"/>
         </w:rPr>
         <w:t xml:space="preserve">is comprised</w:t>
       </w:r>
       <w:r>
         <w:rPr>
-          <w:rFonts w:ascii="Garamond" w:cs="Garamond" w:eastAsia="Garamond" w:hAnsi="Garamond"/>
-          <w:sz w:val="24"/>
-          <w:szCs w:val="24"/>
           <w:rtl w:val="0"/>
         </w:rPr>
         <w:t xml:space="preserve"> of (a) a</w:t>
       </w:r>
       <w:r>
         <w:rPr>
-          <w:rFonts w:ascii="Garamond" w:cs="Garamond" w:eastAsia="Garamond" w:hAnsi="Garamond"/>
-          <w:sz w:val="24"/>
-          <w:szCs w:val="24"/>
           <w:rtl w:val="0"/>
         </w:rPr>
         <w:t xml:space="preserve"> puzzle the players have to solve and (b) a controversy that’s unfolding in the background, which I will call the Current Campus Controversy (CCC</w:t>
       </w:r>
       <w:r>
         <w:rPr>
-          <w:rFonts w:ascii="Garamond" w:cs="Garamond" w:eastAsia="Garamond" w:hAnsi="Garamond"/>
-          <w:sz w:val="24"/>
-          <w:szCs w:val="24"/>
           <w:vertAlign w:val="superscript"/>
           <w:rtl w:val="0"/>
         </w:rPr>
@@ -654,9 +610,6 @@
       </w:r>
       <w:r>
         <w:rPr>
-          <w:rFonts w:ascii="Garamond" w:cs="Garamond" w:eastAsia="Garamond" w:hAnsi="Garamond"/>
-          <w:sz w:val="24"/>
-          <w:szCs w:val="24"/>
           <w:rtl w:val="0"/>
         </w:rPr>
         <w:t xml:space="preserve">). Players will be interviewing witnesses, such as students or university personnel, trying to gain clues that would help them solve the mystery and avoiding red herrings that point them in the wrong direction. At the same time, witnesses will share their views on the CCC and players will have to apply the HEAR framework in order to solve the mystery and improve their scores in the game:</w:t>
@@ -668,19 +621,11 @@
           <w:ilvl w:val="0"/>
           <w:numId w:val="7"/>
         </w:numPr>
-        <w:spacing w:after="0" w:afterAutospacing="0" w:before="200" w:line="276" w:lineRule="auto"/>
+        <w:spacing w:after="0" w:afterAutospacing="0"/>
         <w:ind w:left="720" w:hanging="360"/>
-        <w:rPr>
-          <w:rFonts w:ascii="Garamond" w:cs="Garamond" w:eastAsia="Garamond" w:hAnsi="Garamond"/>
-          <w:sz w:val="24"/>
-          <w:szCs w:val="24"/>
-        </w:rPr>
-      </w:pPr>
-      <w:r>
-        <w:rPr>
-          <w:rFonts w:ascii="Garamond" w:cs="Garamond" w:eastAsia="Garamond" w:hAnsi="Garamond"/>
-          <w:sz w:val="24"/>
-          <w:szCs w:val="24"/>
+      </w:pPr>
+      <w:r>
+        <w:rPr>
           <w:rtl w:val="0"/>
         </w:rPr>
         <w:t xml:space="preserve">Once with each witness players may ask a follow-up question about the witness’s expressed view regarding the CCC. Players will have to choose between two phrasings of the question, one more receptive than the other (the difference may be stark or subtle). Choosing the receptive phrasing unlocks a Major Clue while choosing the less receptive question ends the interview abruptly (the witness storms away and will not  answer any more questions). </w:t>
@@ -692,19 +637,11 @@
           <w:ilvl w:val="0"/>
           <w:numId w:val="7"/>
         </w:numPr>
-        <w:spacing w:after="0" w:afterAutospacing="0" w:before="0" w:beforeAutospacing="0" w:line="276" w:lineRule="auto"/>
+        <w:spacing w:after="0" w:afterAutospacing="0" w:before="0" w:beforeAutospacing="0"/>
         <w:ind w:left="720" w:hanging="360"/>
-        <w:rPr>
-          <w:rFonts w:ascii="Garamond" w:cs="Garamond" w:eastAsia="Garamond" w:hAnsi="Garamond"/>
-          <w:sz w:val="24"/>
-          <w:szCs w:val="24"/>
-        </w:rPr>
-      </w:pPr>
-      <w:r>
-        <w:rPr>
-          <w:rFonts w:ascii="Garamond" w:cs="Garamond" w:eastAsia="Garamond" w:hAnsi="Garamond"/>
-          <w:sz w:val="24"/>
-          <w:szCs w:val="24"/>
+      </w:pPr>
+      <w:r>
+        <w:rPr>
           <w:rtl w:val="0"/>
         </w:rPr>
         <w:t xml:space="preserve">Unlocking a Major Clue earns the students a letter from the HEAR acronym, reinforcing the mnemonic tool, and explaining one of the four pillars of the framework.</w:t>
@@ -716,19 +653,11 @@
           <w:ilvl w:val="0"/>
           <w:numId w:val="7"/>
         </w:numPr>
-        <w:spacing w:before="0" w:beforeAutospacing="0" w:line="276" w:lineRule="auto"/>
+        <w:spacing w:before="0" w:beforeAutospacing="0"/>
         <w:ind w:left="720" w:hanging="360"/>
-        <w:rPr>
-          <w:rFonts w:ascii="Garamond" w:cs="Garamond" w:eastAsia="Garamond" w:hAnsi="Garamond"/>
-          <w:sz w:val="24"/>
-          <w:szCs w:val="24"/>
-        </w:rPr>
-      </w:pPr>
-      <w:r>
-        <w:rPr>
-          <w:rFonts w:ascii="Garamond" w:cs="Garamond" w:eastAsia="Garamond" w:hAnsi="Garamond"/>
-          <w:sz w:val="24"/>
-          <w:szCs w:val="24"/>
+      </w:pPr>
+      <w:r>
+        <w:rPr>
           <w:rtl w:val="0"/>
         </w:rPr>
         <w:t xml:space="preserve">Each witness will volunteer their opinions on the CCC, with varying degrees of receptiveness. Players will receive bonus points at the end of the game for ranking the witnesses correctly in terms of the receptiveness. </w:t>
@@ -737,24 +666,12 @@
     <w:p>
       <w:pPr>
         <w:pStyle w:val="Heading1"/>
-        <w:spacing w:before="400" w:line="276" w:lineRule="auto"/>
-        <w:rPr>
-          <w:rFonts w:ascii="Garamond" w:cs="Garamond" w:eastAsia="Garamond" w:hAnsi="Garamond"/>
-          <w:b w:val="0"/>
-          <w:bCs w:val="0"/>
-          <w:sz w:val="40"/>
-          <w:szCs w:val="40"/>
-        </w:rPr>
-      </w:pPr>
-      <w:bookmarkStart w:colFirst="0" w:colLast="0" w:name="_724y3rmj63y4" w:id="4"/>
-      <w:bookmarkEnd w:id="4"/>
-      <w:r>
-        <w:rPr>
-          <w:rFonts w:ascii="Garamond" w:cs="Garamond" w:eastAsia="Garamond" w:hAnsi="Garamond"/>
-          <w:b w:val="0"/>
-          <w:bCs w:val="0"/>
-          <w:sz w:val="40"/>
-          <w:szCs w:val="40"/>
+        <w:rPr/>
+      </w:pPr>
+      <w:bookmarkStart w:colFirst="0" w:colLast="0" w:name="_724y3rmj63y4" w:id="5"/>
+      <w:bookmarkEnd w:id="5"/>
+      <w:r>
+        <w:rPr>
           <w:rtl w:val="0"/>
         </w:rPr>
         <w:t xml:space="preserve">2. The HEAR Framework </w:t>
@@ -762,18 +679,11 @@
     </w:p>
     <w:p>
       <w:pPr>
-        <w:spacing w:after="200" w:before="200" w:line="276" w:lineRule="auto"/>
-        <w:rPr>
-          <w:rFonts w:ascii="Garamond" w:cs="Garamond" w:eastAsia="Garamond" w:hAnsi="Garamond"/>
-          <w:sz w:val="24"/>
-          <w:szCs w:val="24"/>
-        </w:rPr>
-      </w:pPr>
-      <w:r>
-        <w:rPr>
-          <w:rFonts w:ascii="Garamond" w:cs="Garamond" w:eastAsia="Garamond" w:hAnsi="Garamond"/>
-          <w:sz w:val="24"/>
-          <w:szCs w:val="24"/>
+        <w:spacing w:after="200" w:lineRule="auto"/>
+        <w:rPr/>
+      </w:pPr>
+      <w:r>
+        <w:rPr>
           <w:rtl w:val="0"/>
         </w:rPr>
         <w:t xml:space="preserve">Conversational receptiveness is the use of language that signals you are engaging thoughtfully with a view you disagree with. Minson and colleagues found that people who are perceived as receptive are seen as better teammates and advisors, are more persuasive, and are more likely to be engaged with in return, and that receptiveness can be learned as a set of concrete verbal moves. The teachable recipe is summarised as HEAR:</w:t>
@@ -813,16 +723,14 @@
           </w:tcPr>
           <w:p>
             <w:pPr>
-              <w:spacing w:line="240" w:lineRule="auto"/>
-              <w:rPr>
-                <w:rFonts w:ascii="Garamond" w:cs="Garamond" w:eastAsia="Garamond" w:hAnsi="Garamond"/>
+              <w:spacing w:before="0" w:line="240" w:lineRule="auto"/>
+              <w:rPr>
                 <w:sz w:val="32"/>
                 <w:szCs w:val="32"/>
               </w:rPr>
             </w:pPr>
             <w:r>
               <w:rPr>
-                <w:rFonts w:ascii="Garamond" w:cs="Garamond" w:eastAsia="Garamond" w:hAnsi="Garamond"/>
                 <w:sz w:val="32"/>
                 <w:szCs w:val="32"/>
                 <w:rtl w:val="0"/>
@@ -837,16 +745,14 @@
           </w:tcPr>
           <w:p>
             <w:pPr>
-              <w:spacing w:line="240" w:lineRule="auto"/>
-              <w:rPr>
-                <w:rFonts w:ascii="Garamond" w:cs="Garamond" w:eastAsia="Garamond" w:hAnsi="Garamond"/>
+              <w:spacing w:before="0" w:line="240" w:lineRule="auto"/>
+              <w:rPr>
                 <w:sz w:val="32"/>
                 <w:szCs w:val="32"/>
               </w:rPr>
             </w:pPr>
             <w:r>
               <w:rPr>
-                <w:rFonts w:ascii="Garamond" w:cs="Garamond" w:eastAsia="Garamond" w:hAnsi="Garamond"/>
                 <w:sz w:val="32"/>
                 <w:szCs w:val="32"/>
                 <w:rtl w:val="0"/>
@@ -861,16 +767,14 @@
           </w:tcPr>
           <w:p>
             <w:pPr>
-              <w:spacing w:line="240" w:lineRule="auto"/>
-              <w:rPr>
-                <w:rFonts w:ascii="Garamond" w:cs="Garamond" w:eastAsia="Garamond" w:hAnsi="Garamond"/>
+              <w:spacing w:before="0" w:line="240" w:lineRule="auto"/>
+              <w:rPr>
                 <w:sz w:val="32"/>
                 <w:szCs w:val="32"/>
               </w:rPr>
             </w:pPr>
             <w:r>
               <w:rPr>
-                <w:rFonts w:ascii="Garamond" w:cs="Garamond" w:eastAsia="Garamond" w:hAnsi="Garamond"/>
                 <w:sz w:val="32"/>
                 <w:szCs w:val="32"/>
                 <w:rtl w:val="0"/>
@@ -890,22 +794,16 @@
           <w:tcPr/>
           <w:p>
             <w:pPr>
-              <w:spacing w:line="240" w:lineRule="auto"/>
-              <w:rPr>
-                <w:rFonts w:ascii="Garamond" w:cs="Garamond" w:eastAsia="Garamond" w:hAnsi="Garamond"/>
+              <w:spacing w:before="0" w:line="240" w:lineRule="auto"/>
+              <w:rPr>
                 <w:b w:val="1"/>
                 <w:bCs w:val="1"/>
-                <w:sz w:val="24"/>
-                <w:szCs w:val="24"/>
-              </w:rPr>
-            </w:pPr>
-            <w:r>
-              <w:rPr>
-                <w:rFonts w:ascii="Garamond" w:cs="Garamond" w:eastAsia="Garamond" w:hAnsi="Garamond"/>
+              </w:rPr>
+            </w:pPr>
+            <w:r>
+              <w:rPr>
                 <w:b w:val="1"/>
                 <w:bCs w:val="1"/>
-                <w:sz w:val="24"/>
-                <w:szCs w:val="24"/>
                 <w:rtl w:val="0"/>
               </w:rPr>
               <w:t xml:space="preserve">H</w:t>
@@ -916,29 +814,19 @@
           <w:tcPr/>
           <w:p>
             <w:pPr>
-              <w:spacing w:line="240" w:lineRule="auto"/>
-              <w:rPr>
-                <w:rFonts w:ascii="Garamond" w:cs="Garamond" w:eastAsia="Garamond" w:hAnsi="Garamond"/>
-                <w:sz w:val="24"/>
-                <w:szCs w:val="24"/>
-              </w:rPr>
-            </w:pPr>
-            <w:r>
-              <w:rPr>
-                <w:rFonts w:ascii="Garamond" w:cs="Garamond" w:eastAsia="Garamond" w:hAnsi="Garamond"/>
+              <w:spacing w:before="0" w:line="240" w:lineRule="auto"/>
+              <w:rPr/>
+            </w:pPr>
+            <w:r>
+              <w:rPr>
                 <w:b w:val="1"/>
                 <w:bCs w:val="1"/>
-                <w:sz w:val="24"/>
-                <w:szCs w:val="24"/>
                 <w:rtl w:val="0"/>
               </w:rPr>
               <w:t xml:space="preserve">Hedge</w:t>
             </w:r>
             <w:r>
               <w:rPr>
-                <w:rFonts w:ascii="Garamond" w:cs="Garamond" w:eastAsia="Garamond" w:hAnsi="Garamond"/>
-                <w:sz w:val="24"/>
-                <w:szCs w:val="24"/>
                 <w:rtl w:val="0"/>
               </w:rPr>
               <w:t xml:space="preserve"> your claims</w:t>
@@ -949,18 +837,11 @@
           <w:tcPr/>
           <w:p>
             <w:pPr>
-              <w:spacing w:line="240" w:lineRule="auto"/>
-              <w:rPr>
-                <w:rFonts w:ascii="Garamond" w:cs="Garamond" w:eastAsia="Garamond" w:hAnsi="Garamond"/>
-                <w:sz w:val="24"/>
-                <w:szCs w:val="24"/>
-              </w:rPr>
-            </w:pPr>
-            <w:r>
-              <w:rPr>
-                <w:rFonts w:ascii="Garamond" w:cs="Garamond" w:eastAsia="Garamond" w:hAnsi="Garamond"/>
-                <w:sz w:val="24"/>
-                <w:szCs w:val="24"/>
+              <w:spacing w:before="0" w:line="240" w:lineRule="auto"/>
+              <w:rPr/>
+            </w:pPr>
+            <w:r>
+              <w:rPr>
                 <w:rtl w:val="0"/>
               </w:rPr>
               <w:t xml:space="preserve">“I may be wrong about this”, “in some cases”, “it seems to me”, “probably”. Hedging signals that you hold your view as a view, not as a fact the other person is failing to see.</w:t>
@@ -978,22 +859,16 @@
           <w:tcPr/>
           <w:p>
             <w:pPr>
-              <w:spacing w:line="240" w:lineRule="auto"/>
-              <w:rPr>
-                <w:rFonts w:ascii="Garamond" w:cs="Garamond" w:eastAsia="Garamond" w:hAnsi="Garamond"/>
+              <w:spacing w:before="0" w:line="240" w:lineRule="auto"/>
+              <w:rPr>
                 <w:b w:val="1"/>
                 <w:bCs w:val="1"/>
-                <w:sz w:val="24"/>
-                <w:szCs w:val="24"/>
-              </w:rPr>
-            </w:pPr>
-            <w:r>
-              <w:rPr>
-                <w:rFonts w:ascii="Garamond" w:cs="Garamond" w:eastAsia="Garamond" w:hAnsi="Garamond"/>
+              </w:rPr>
+            </w:pPr>
+            <w:r>
+              <w:rPr>
                 <w:b w:val="1"/>
                 <w:bCs w:val="1"/>
-                <w:sz w:val="24"/>
-                <w:szCs w:val="24"/>
                 <w:rtl w:val="0"/>
               </w:rPr>
               <w:t xml:space="preserve">E</w:t>
@@ -1004,29 +879,19 @@
           <w:tcPr/>
           <w:p>
             <w:pPr>
-              <w:spacing w:line="240" w:lineRule="auto"/>
-              <w:rPr>
-                <w:rFonts w:ascii="Garamond" w:cs="Garamond" w:eastAsia="Garamond" w:hAnsi="Garamond"/>
-                <w:sz w:val="24"/>
-                <w:szCs w:val="24"/>
-              </w:rPr>
-            </w:pPr>
-            <w:r>
-              <w:rPr>
-                <w:rFonts w:ascii="Garamond" w:cs="Garamond" w:eastAsia="Garamond" w:hAnsi="Garamond"/>
+              <w:spacing w:before="0" w:line="240" w:lineRule="auto"/>
+              <w:rPr/>
+            </w:pPr>
+            <w:r>
+              <w:rPr>
                 <w:b w:val="1"/>
                 <w:bCs w:val="1"/>
-                <w:sz w:val="24"/>
-                <w:szCs w:val="24"/>
                 <w:rtl w:val="0"/>
               </w:rPr>
               <w:t xml:space="preserve">Emphasize</w:t>
             </w:r>
             <w:r>
               <w:rPr>
-                <w:rFonts w:ascii="Garamond" w:cs="Garamond" w:eastAsia="Garamond" w:hAnsi="Garamond"/>
-                <w:sz w:val="24"/>
-                <w:szCs w:val="24"/>
                 <w:rtl w:val="0"/>
               </w:rPr>
               <w:t xml:space="preserve"> agreement</w:t>
@@ -1037,18 +902,11 @@
           <w:tcPr/>
           <w:p>
             <w:pPr>
-              <w:spacing w:line="240" w:lineRule="auto"/>
-              <w:rPr>
-                <w:rFonts w:ascii="Garamond" w:cs="Garamond" w:eastAsia="Garamond" w:hAnsi="Garamond"/>
-                <w:sz w:val="24"/>
-                <w:szCs w:val="24"/>
-              </w:rPr>
-            </w:pPr>
-            <w:r>
-              <w:rPr>
-                <w:rFonts w:ascii="Garamond" w:cs="Garamond" w:eastAsia="Garamond" w:hAnsi="Garamond"/>
-                <w:sz w:val="24"/>
-                <w:szCs w:val="24"/>
+              <w:spacing w:before="0" w:line="240" w:lineRule="auto"/>
+              <w:rPr/>
+            </w:pPr>
+            <w:r>
+              <w:rPr>
                 <w:rtl w:val="0"/>
               </w:rPr>
               <w:t xml:space="preserve">“We both want the building to work for students”, “I think we agree on the goal”. Naming shared ground before stating a difference makes the difference feel like a disagreement between allies.</w:t>
@@ -1066,22 +924,16 @@
           <w:tcPr/>
           <w:p>
             <w:pPr>
-              <w:spacing w:line="240" w:lineRule="auto"/>
-              <w:rPr>
-                <w:rFonts w:ascii="Garamond" w:cs="Garamond" w:eastAsia="Garamond" w:hAnsi="Garamond"/>
+              <w:spacing w:before="0" w:line="240" w:lineRule="auto"/>
+              <w:rPr>
                 <w:b w:val="1"/>
                 <w:bCs w:val="1"/>
-                <w:sz w:val="24"/>
-                <w:szCs w:val="24"/>
-              </w:rPr>
-            </w:pPr>
-            <w:r>
-              <w:rPr>
-                <w:rFonts w:ascii="Garamond" w:cs="Garamond" w:eastAsia="Garamond" w:hAnsi="Garamond"/>
+              </w:rPr>
+            </w:pPr>
+            <w:r>
+              <w:rPr>
                 <w:b w:val="1"/>
                 <w:bCs w:val="1"/>
-                <w:sz w:val="24"/>
-                <w:szCs w:val="24"/>
                 <w:rtl w:val="0"/>
               </w:rPr>
               <w:t xml:space="preserve">A</w:t>
@@ -1092,29 +944,19 @@
           <w:tcPr/>
           <w:p>
             <w:pPr>
-              <w:spacing w:line="240" w:lineRule="auto"/>
-              <w:rPr>
-                <w:rFonts w:ascii="Garamond" w:cs="Garamond" w:eastAsia="Garamond" w:hAnsi="Garamond"/>
-                <w:sz w:val="24"/>
-                <w:szCs w:val="24"/>
-              </w:rPr>
-            </w:pPr>
-            <w:r>
-              <w:rPr>
-                <w:rFonts w:ascii="Garamond" w:cs="Garamond" w:eastAsia="Garamond" w:hAnsi="Garamond"/>
+              <w:spacing w:before="0" w:line="240" w:lineRule="auto"/>
+              <w:rPr/>
+            </w:pPr>
+            <w:r>
+              <w:rPr>
                 <w:b w:val="1"/>
                 <w:bCs w:val="1"/>
-                <w:sz w:val="24"/>
-                <w:szCs w:val="24"/>
                 <w:rtl w:val="0"/>
               </w:rPr>
               <w:t xml:space="preserve">Acknowledge</w:t>
             </w:r>
             <w:r>
               <w:rPr>
-                <w:rFonts w:ascii="Garamond" w:cs="Garamond" w:eastAsia="Garamond" w:hAnsi="Garamond"/>
-                <w:sz w:val="24"/>
-                <w:szCs w:val="24"/>
                 <w:rtl w:val="0"/>
               </w:rPr>
               <w:t xml:space="preserve"> the other’s perspective</w:t>
@@ -1125,18 +967,11 @@
           <w:tcPr/>
           <w:p>
             <w:pPr>
-              <w:spacing w:line="240" w:lineRule="auto"/>
-              <w:rPr>
-                <w:rFonts w:ascii="Garamond" w:cs="Garamond" w:eastAsia="Garamond" w:hAnsi="Garamond"/>
-                <w:sz w:val="24"/>
-                <w:szCs w:val="24"/>
-              </w:rPr>
-            </w:pPr>
-            <w:r>
-              <w:rPr>
-                <w:rFonts w:ascii="Garamond" w:cs="Garamond" w:eastAsia="Garamond" w:hAnsi="Garamond"/>
-                <w:sz w:val="24"/>
-                <w:szCs w:val="24"/>
+              <w:spacing w:before="0" w:line="240" w:lineRule="auto"/>
+              <w:rPr/>
+            </w:pPr>
+            <w:r>
+              <w:rPr>
                 <w:rtl w:val="0"/>
               </w:rPr>
               <w:t xml:space="preserve">“Leo’s point about space is fair”, “I can see why you’d read it that way”. Restating the other view accurately, and granting what is right in it, shows you have actually listened.</w:t>
@@ -1154,22 +989,16 @@
           <w:tcPr/>
           <w:p>
             <w:pPr>
-              <w:spacing w:line="240" w:lineRule="auto"/>
-              <w:rPr>
-                <w:rFonts w:ascii="Garamond" w:cs="Garamond" w:eastAsia="Garamond" w:hAnsi="Garamond"/>
+              <w:spacing w:before="0" w:line="240" w:lineRule="auto"/>
+              <w:rPr>
                 <w:b w:val="1"/>
                 <w:bCs w:val="1"/>
-                <w:sz w:val="24"/>
-                <w:szCs w:val="24"/>
-              </w:rPr>
-            </w:pPr>
-            <w:r>
-              <w:rPr>
-                <w:rFonts w:ascii="Garamond" w:cs="Garamond" w:eastAsia="Garamond" w:hAnsi="Garamond"/>
+              </w:rPr>
+            </w:pPr>
+            <w:r>
+              <w:rPr>
                 <w:b w:val="1"/>
                 <w:bCs w:val="1"/>
-                <w:sz w:val="24"/>
-                <w:szCs w:val="24"/>
                 <w:rtl w:val="0"/>
               </w:rPr>
               <w:t xml:space="preserve">R</w:t>
@@ -1180,29 +1009,19 @@
           <w:tcPr/>
           <w:p>
             <w:pPr>
-              <w:spacing w:line="240" w:lineRule="auto"/>
-              <w:rPr>
-                <w:rFonts w:ascii="Garamond" w:cs="Garamond" w:eastAsia="Garamond" w:hAnsi="Garamond"/>
-                <w:sz w:val="24"/>
-                <w:szCs w:val="24"/>
-              </w:rPr>
-            </w:pPr>
-            <w:r>
-              <w:rPr>
-                <w:rFonts w:ascii="Garamond" w:cs="Garamond" w:eastAsia="Garamond" w:hAnsi="Garamond"/>
+              <w:spacing w:before="0" w:line="240" w:lineRule="auto"/>
+              <w:rPr/>
+            </w:pPr>
+            <w:r>
+              <w:rPr>
                 <w:b w:val="1"/>
                 <w:bCs w:val="1"/>
-                <w:sz w:val="24"/>
-                <w:szCs w:val="24"/>
                 <w:rtl w:val="0"/>
               </w:rPr>
               <w:t xml:space="preserve">Reframe</w:t>
             </w:r>
             <w:r>
               <w:rPr>
-                <w:rFonts w:ascii="Garamond" w:cs="Garamond" w:eastAsia="Garamond" w:hAnsi="Garamond"/>
-                <w:sz w:val="24"/>
-                <w:szCs w:val="24"/>
                 <w:rtl w:val="0"/>
               </w:rPr>
               <w:t xml:space="preserve"> to the positive</w:t>
@@ -1213,18 +1032,11 @@
           <w:tcPr/>
           <w:p>
             <w:pPr>
-              <w:spacing w:line="240" w:lineRule="auto"/>
-              <w:rPr>
-                <w:rFonts w:ascii="Garamond" w:cs="Garamond" w:eastAsia="Garamond" w:hAnsi="Garamond"/>
-                <w:sz w:val="24"/>
-                <w:szCs w:val="24"/>
-              </w:rPr>
-            </w:pPr>
-            <w:r>
-              <w:rPr>
-                <w:rFonts w:ascii="Garamond" w:cs="Garamond" w:eastAsia="Garamond" w:hAnsi="Garamond"/>
-                <w:sz w:val="24"/>
-                <w:szCs w:val="24"/>
+              <w:spacing w:before="0" w:line="240" w:lineRule="auto"/>
+              <w:rPr/>
+            </w:pPr>
+            <w:r>
+              <w:rPr>
                 <w:rtl w:val="0"/>
               </w:rPr>
               <w:t xml:space="preserve">“What would help is…” rather than “what’s wrong is…” avoiding absolute and negative language (“never”, “obviously”, “no one seriously thinks”). Positive framing keeps the exchange open rather than closing it.</w:t>
@@ -1236,24 +1048,12 @@
     <w:p>
       <w:pPr>
         <w:pStyle w:val="Heading1"/>
-        <w:spacing w:before="400" w:line="276" w:lineRule="auto"/>
-        <w:rPr>
-          <w:rFonts w:ascii="Garamond" w:cs="Garamond" w:eastAsia="Garamond" w:hAnsi="Garamond"/>
-          <w:b w:val="0"/>
-          <w:bCs w:val="0"/>
-          <w:sz w:val="40"/>
-          <w:szCs w:val="40"/>
-        </w:rPr>
-      </w:pPr>
-      <w:bookmarkStart w:colFirst="0" w:colLast="0" w:name="_8x7u4gqrdju0" w:id="5"/>
-      <w:bookmarkEnd w:id="5"/>
-      <w:r>
-        <w:rPr>
-          <w:rFonts w:ascii="Garamond" w:cs="Garamond" w:eastAsia="Garamond" w:hAnsi="Garamond"/>
-          <w:b w:val="0"/>
-          <w:bCs w:val="0"/>
-          <w:sz w:val="40"/>
-          <w:szCs w:val="40"/>
+        <w:rPr/>
+      </w:pPr>
+      <w:bookmarkStart w:colFirst="0" w:colLast="0" w:name="_8x7u4gqrdju0" w:id="6"/>
+      <w:bookmarkEnd w:id="6"/>
+      <w:r>
+        <w:rPr>
           <w:rtl w:val="0"/>
         </w:rPr>
         <w:t xml:space="preserve">3. The Game </w:t>
@@ -1261,18 +1061,10 @@
     </w:p>
     <w:p>
       <w:pPr>
-        <w:spacing w:before="200" w:line="276" w:lineRule="auto"/>
-        <w:rPr>
-          <w:rFonts w:ascii="Garamond" w:cs="Garamond" w:eastAsia="Garamond" w:hAnsi="Garamond"/>
-          <w:sz w:val="24"/>
-          <w:szCs w:val="24"/>
-        </w:rPr>
-      </w:pPr>
-      <w:r>
-        <w:rPr>
-          <w:rFonts w:ascii="Garamond" w:cs="Garamond" w:eastAsia="Garamond" w:hAnsi="Garamond"/>
-          <w:sz w:val="24"/>
-          <w:szCs w:val="24"/>
+        <w:rPr/>
+      </w:pPr>
+      <w:r>
+        <w:rPr>
           <w:rtl w:val="0"/>
         </w:rPr>
         <w:t xml:space="preserve">The game revolves around a mystery and so the game begins with a brief introduction of the game and then jumping right into the presentation of the mystery with the Hook. </w:t>
@@ -1281,24 +1073,12 @@
     <w:p>
       <w:pPr>
         <w:pStyle w:val="Heading2"/>
-        <w:spacing w:after="120" w:line="276" w:lineRule="auto"/>
-        <w:rPr>
-          <w:rFonts w:ascii="Garamond" w:cs="Garamond" w:eastAsia="Garamond" w:hAnsi="Garamond"/>
-          <w:b w:val="0"/>
-          <w:bCs w:val="0"/>
-          <w:sz w:val="32"/>
-          <w:szCs w:val="32"/>
-        </w:rPr>
-      </w:pPr>
-      <w:bookmarkStart w:colFirst="0" w:colLast="0" w:name="_h6c12zbk9cf" w:id="6"/>
-      <w:bookmarkEnd w:id="6"/>
-      <w:r>
-        <w:rPr>
-          <w:rFonts w:ascii="Garamond" w:cs="Garamond" w:eastAsia="Garamond" w:hAnsi="Garamond"/>
-          <w:b w:val="0"/>
-          <w:bCs w:val="0"/>
-          <w:sz w:val="32"/>
-          <w:szCs w:val="32"/>
+        <w:rPr/>
+      </w:pPr>
+      <w:bookmarkStart w:colFirst="0" w:colLast="0" w:name="_h6c12zbk9cf" w:id="7"/>
+      <w:bookmarkEnd w:id="7"/>
+      <w:r>
+        <w:rPr>
           <w:rtl w:val="0"/>
         </w:rPr>
         <w:t xml:space="preserve">3.1 Introduction </w:t>
@@ -1306,18 +1086,10 @@
     </w:p>
     <w:p>
       <w:pPr>
-        <w:spacing w:before="200" w:line="276" w:lineRule="auto"/>
-        <w:rPr>
-          <w:rFonts w:ascii="Garamond" w:cs="Garamond" w:eastAsia="Garamond" w:hAnsi="Garamond"/>
-          <w:sz w:val="24"/>
-          <w:szCs w:val="24"/>
-        </w:rPr>
-      </w:pPr>
-      <w:r>
-        <w:rPr>
-          <w:rFonts w:ascii="Garamond" w:cs="Garamond" w:eastAsia="Garamond" w:hAnsi="Garamond"/>
-          <w:sz w:val="24"/>
-          <w:szCs w:val="24"/>
+        <w:rPr/>
+      </w:pPr>
+      <w:r>
+        <w:rPr>
           <w:rtl w:val="0"/>
         </w:rPr>
         <w:t xml:space="preserve">In the introduction players are told that they are playing a mystery game while also practicing the HEAR framework. The game is designed to follow a module or a class where students have studied the HEAR framework, and conversational receptiveness more generally, in greater detail and so the introduction presents the framework briefly. A slide with a quick summary of the HEAR framework should be available for players throughout the game so they can review the material at any time. </w:t>
@@ -1325,18 +1097,10 @@
     </w:p>
     <w:p>
       <w:pPr>
-        <w:spacing w:before="200" w:line="276" w:lineRule="auto"/>
-        <w:rPr>
-          <w:rFonts w:ascii="Garamond" w:cs="Garamond" w:eastAsia="Garamond" w:hAnsi="Garamond"/>
-          <w:sz w:val="24"/>
-          <w:szCs w:val="24"/>
-        </w:rPr>
-      </w:pPr>
-      <w:r>
-        <w:rPr>
-          <w:rFonts w:ascii="Garamond" w:cs="Garamond" w:eastAsia="Garamond" w:hAnsi="Garamond"/>
-          <w:sz w:val="24"/>
-          <w:szCs w:val="24"/>
+        <w:rPr/>
+      </w:pPr>
+      <w:r>
+        <w:rPr>
           <w:rtl w:val="0"/>
         </w:rPr>
         <w:t xml:space="preserve">The introduction explains the rules of the game:</w:t>
@@ -1348,37 +1112,23 @@
           <w:ilvl w:val="0"/>
           <w:numId w:val="3"/>
         </w:numPr>
-        <w:spacing w:after="0" w:afterAutospacing="0" w:before="200" w:line="276" w:lineRule="auto"/>
+        <w:spacing w:after="0" w:afterAutospacing="0"/>
         <w:ind w:left="720" w:hanging="360"/>
-        <w:rPr>
-          <w:rFonts w:ascii="Garamond" w:cs="Garamond" w:eastAsia="Garamond" w:hAnsi="Garamond"/>
-          <w:sz w:val="24"/>
-          <w:szCs w:val="24"/>
-        </w:rPr>
-      </w:pPr>
-      <w:r>
-        <w:rPr>
-          <w:rFonts w:ascii="Garamond" w:cs="Garamond" w:eastAsia="Garamond" w:hAnsi="Garamond"/>
-          <w:sz w:val="24"/>
-          <w:szCs w:val="24"/>
+      </w:pPr>
+      <w:r>
+        <w:rPr>
           <w:rtl w:val="0"/>
         </w:rPr>
         <w:t xml:space="preserve">The goal of the game is to solve the mystery. At the end players will be asked to make a guess which addresses the central puzzle of the mystery. This may include identifying a culprit, if there is one, a motive or a reasoning, and the method.</w:t>
       </w:r>
       <w:r>
         <w:rPr>
-          <w:rFonts w:ascii="Garamond" w:cs="Garamond" w:eastAsia="Garamond" w:hAnsi="Garamond"/>
-          <w:sz w:val="24"/>
-          <w:szCs w:val="24"/>
           <w:vertAlign w:val="superscript"/>
         </w:rPr>
         <w:footnoteReference w:customMarkFollows="0" w:id="3"/>
       </w:r>
       <w:r>
         <w:rPr>
-          <w:rFonts w:ascii="Garamond" w:cs="Garamond" w:eastAsia="Garamond" w:hAnsi="Garamond"/>
-          <w:sz w:val="24"/>
-          <w:szCs w:val="24"/>
           <w:rtl w:val="0"/>
         </w:rPr>
         <w:t xml:space="preserve"> </w:t>
@@ -1390,19 +1140,11 @@
           <w:ilvl w:val="1"/>
           <w:numId w:val="3"/>
         </w:numPr>
-        <w:spacing w:after="0" w:afterAutospacing="0" w:before="0" w:beforeAutospacing="0" w:line="276" w:lineRule="auto"/>
+        <w:spacing w:after="0" w:afterAutospacing="0" w:before="0" w:beforeAutospacing="0"/>
         <w:ind w:left="1440" w:hanging="360"/>
-        <w:rPr>
-          <w:rFonts w:ascii="Garamond" w:cs="Garamond" w:eastAsia="Garamond" w:hAnsi="Garamond"/>
-          <w:sz w:val="24"/>
-          <w:szCs w:val="24"/>
-        </w:rPr>
-      </w:pPr>
-      <w:r>
-        <w:rPr>
-          <w:rFonts w:ascii="Garamond" w:cs="Garamond" w:eastAsia="Garamond" w:hAnsi="Garamond"/>
-          <w:sz w:val="24"/>
-          <w:szCs w:val="24"/>
+      </w:pPr>
+      <w:r>
+        <w:rPr>
           <w:rtl w:val="0"/>
         </w:rPr>
         <w:t xml:space="preserve">As a general rule, each of the witnesses should have a reasonable </w:t>
@@ -1414,19 +1156,11 @@
           <w:ilvl w:val="0"/>
           <w:numId w:val="3"/>
         </w:numPr>
-        <w:spacing w:after="0" w:afterAutospacing="0" w:before="0" w:beforeAutospacing="0" w:line="276" w:lineRule="auto"/>
+        <w:spacing w:after="0" w:afterAutospacing="0" w:before="0" w:beforeAutospacing="0"/>
         <w:ind w:left="720" w:hanging="360"/>
-        <w:rPr>
-          <w:rFonts w:ascii="Garamond" w:cs="Garamond" w:eastAsia="Garamond" w:hAnsi="Garamond"/>
-          <w:sz w:val="24"/>
-          <w:szCs w:val="24"/>
-        </w:rPr>
-      </w:pPr>
-      <w:r>
-        <w:rPr>
-          <w:rFonts w:ascii="Garamond" w:cs="Garamond" w:eastAsia="Garamond" w:hAnsi="Garamond"/>
-          <w:sz w:val="24"/>
-          <w:szCs w:val="24"/>
+      </w:pPr>
+      <w:r>
+        <w:rPr>
           <w:rtl w:val="0"/>
         </w:rPr>
         <w:t xml:space="preserve">The bulk of the game is made of students interviewing witnesses. The interview process is made of a series of questions. There are 8 witnesses and each can be asked a variant of 8 questions.</w:t>
@@ -1438,19 +1172,11 @@
           <w:ilvl w:val="0"/>
           <w:numId w:val="3"/>
         </w:numPr>
-        <w:spacing w:after="0" w:afterAutospacing="0" w:before="0" w:beforeAutospacing="0" w:line="276" w:lineRule="auto"/>
+        <w:spacing w:after="0" w:afterAutospacing="0" w:before="0" w:beforeAutospacing="0"/>
         <w:ind w:left="720" w:hanging="360"/>
-        <w:rPr>
-          <w:rFonts w:ascii="Garamond" w:cs="Garamond" w:eastAsia="Garamond" w:hAnsi="Garamond"/>
-          <w:sz w:val="24"/>
-          <w:szCs w:val="24"/>
-        </w:rPr>
-      </w:pPr>
-      <w:r>
-        <w:rPr>
-          <w:rFonts w:ascii="Garamond" w:cs="Garamond" w:eastAsia="Garamond" w:hAnsi="Garamond"/>
-          <w:sz w:val="24"/>
-          <w:szCs w:val="24"/>
+      </w:pPr>
+      <w:r>
+        <w:rPr>
           <w:rtl w:val="0"/>
         </w:rPr>
         <w:t xml:space="preserve">Students have a total ‘budget’ of </w:t>
@@ -1462,9 +1188,6 @@
       </w:r>
       <w:r>
         <w:rPr>
-          <w:rFonts w:ascii="Garamond" w:cs="Garamond" w:eastAsia="Garamond" w:hAnsi="Garamond"/>
-          <w:sz w:val="24"/>
-          <w:szCs w:val="24"/>
           <w:rtl w:val="0"/>
         </w:rPr>
         <w:t xml:space="preserve">30</w:t>
@@ -1474,12 +1197,9 @@
       </w:r>
       <w:r>
         <w:rPr>
-          <w:rFonts w:ascii="Garamond" w:cs="Garamond" w:eastAsia="Garamond" w:hAnsi="Garamond"/>
-          <w:sz w:val="24"/>
-          <w:szCs w:val="24"/>
-          <w:rtl w:val="0"/>
-        </w:rPr>
-        <w:t xml:space="preserve"> questions that they can spread out across the witnesses however they want. Visiting a question that was asked before does not cost another question. Once they ask all their questions, or at any time before that if they like, they may make a guess and attempt to solve the mystery. Players only have one chance to make a correct guess. </w:t>
+          <w:rtl w:val="0"/>
+        </w:rPr>
+        <w:t xml:space="preserve"> questions that they can spread out across the witnesses however they want. Visiting a question that was asked before does not cost another question. Once they ask all their questions, or at any time before that if they like, they may make a guess and attempt to solve the mystery. Players have three chances to make a correct guess. If a player makes the wrong guess, they are told only that their guess is wrong, not which part, and they may keep investigating if they have questions left. Players gain more points if they guess correctly on their first try. </w:t>
       </w:r>
     </w:p>
     <w:p>
@@ -1488,57 +1208,37 @@
           <w:ilvl w:val="0"/>
           <w:numId w:val="3"/>
         </w:numPr>
-        <w:spacing w:after="0" w:afterAutospacing="0" w:before="0" w:beforeAutospacing="0" w:line="276" w:lineRule="auto"/>
+        <w:spacing w:after="0" w:afterAutospacing="0" w:before="0" w:beforeAutospacing="0"/>
         <w:ind w:left="720" w:hanging="360"/>
-        <w:rPr>
-          <w:rFonts w:ascii="Garamond" w:cs="Garamond" w:eastAsia="Garamond" w:hAnsi="Garamond"/>
-          <w:sz w:val="24"/>
-          <w:szCs w:val="24"/>
-        </w:rPr>
-      </w:pPr>
-      <w:r>
-        <w:rPr>
-          <w:rFonts w:ascii="Garamond" w:cs="Garamond" w:eastAsia="Garamond" w:hAnsi="Garamond"/>
-          <w:sz w:val="24"/>
-          <w:szCs w:val="24"/>
+      </w:pPr>
+      <w:r>
+        <w:rPr>
           <w:rtl w:val="0"/>
         </w:rPr>
         <w:t xml:space="preserve"> For each witness, one question is a </w:t>
       </w:r>
       <w:r>
         <w:rPr>
-          <w:rFonts w:ascii="Garamond" w:cs="Garamond" w:eastAsia="Garamond" w:hAnsi="Garamond"/>
           <w:b w:val="1"/>
           <w:bCs w:val="1"/>
-          <w:sz w:val="24"/>
-          <w:szCs w:val="24"/>
           <w:rtl w:val="0"/>
         </w:rPr>
         <w:t xml:space="preserve">tripwire</w:t>
       </w:r>
       <w:r>
         <w:rPr>
-          <w:rFonts w:ascii="Garamond" w:cs="Garamond" w:eastAsia="Garamond" w:hAnsi="Garamond"/>
-          <w:sz w:val="24"/>
-          <w:szCs w:val="24"/>
           <w:rtl w:val="0"/>
         </w:rPr>
         <w:t xml:space="preserve">: it offends or annoys them such that they walk away and the interview ends abruptly. There is no asking any more questions of a witness who was </w:t>
       </w:r>
       <w:r>
         <w:rPr>
-          <w:rFonts w:ascii="Garamond" w:cs="Garamond" w:eastAsia="Garamond" w:hAnsi="Garamond"/>
-          <w:sz w:val="24"/>
-          <w:szCs w:val="24"/>
           <w:rtl w:val="0"/>
         </w:rPr>
         <w:t xml:space="preserve">asked a tripwire</w:t>
       </w:r>
       <w:r>
         <w:rPr>
-          <w:rFonts w:ascii="Garamond" w:cs="Garamond" w:eastAsia="Garamond" w:hAnsi="Garamond"/>
-          <w:sz w:val="24"/>
-          <w:szCs w:val="24"/>
           <w:rtl w:val="0"/>
         </w:rPr>
         <w:t xml:space="preserve">.</w:t>
@@ -1550,37 +1250,23 @@
           <w:ilvl w:val="0"/>
           <w:numId w:val="3"/>
         </w:numPr>
-        <w:spacing w:after="0" w:afterAutospacing="0" w:before="0" w:beforeAutospacing="0" w:line="276" w:lineRule="auto"/>
+        <w:spacing w:after="0" w:afterAutospacing="0" w:before="0" w:beforeAutospacing="0"/>
         <w:ind w:left="720" w:hanging="360"/>
-        <w:rPr>
-          <w:rFonts w:ascii="Garamond" w:cs="Garamond" w:eastAsia="Garamond" w:hAnsi="Garamond"/>
-          <w:sz w:val="24"/>
-          <w:szCs w:val="24"/>
-        </w:rPr>
-      </w:pPr>
-      <w:r>
-        <w:rPr>
-          <w:rFonts w:ascii="Garamond" w:cs="Garamond" w:eastAsia="Garamond" w:hAnsi="Garamond"/>
-          <w:sz w:val="24"/>
-          <w:szCs w:val="24"/>
+      </w:pPr>
+      <w:r>
+        <w:rPr>
           <w:rtl w:val="0"/>
         </w:rPr>
         <w:t xml:space="preserve"> With each witness, players have a chance to do a follow-up. They may do so after any answer the witness gave them (i.e. for all questions except the tripwire). To follow-up students will have to choose one of </w:t>
       </w:r>
       <w:r>
         <w:rPr>
-          <w:rFonts w:ascii="Garamond" w:cs="Garamond" w:eastAsia="Garamond" w:hAnsi="Garamond"/>
-          <w:sz w:val="24"/>
-          <w:szCs w:val="24"/>
           <w:rtl w:val="0"/>
         </w:rPr>
         <w:t xml:space="preserve">two phrasings</w:t>
       </w:r>
       <w:r>
         <w:rPr>
-          <w:rFonts w:ascii="Garamond" w:cs="Garamond" w:eastAsia="Garamond" w:hAnsi="Garamond"/>
-          <w:sz w:val="24"/>
-          <w:szCs w:val="24"/>
           <w:rtl w:val="0"/>
         </w:rPr>
         <w:t xml:space="preserve"> of a follow-up question or comment regarding the witness’s view on the CCC. If they pick correctly, they gain a Major Clue which helps them solve the mystery faster. If they pick incorrectly, the witness storms off angrily (just like they would with a tripwire).</w:t>
@@ -1592,19 +1278,11 @@
           <w:ilvl w:val="0"/>
           <w:numId w:val="3"/>
         </w:numPr>
-        <w:spacing w:after="0" w:afterAutospacing="0" w:before="0" w:beforeAutospacing="0" w:line="276" w:lineRule="auto"/>
+        <w:spacing w:after="0" w:afterAutospacing="0" w:before="0" w:beforeAutospacing="0"/>
         <w:ind w:left="720" w:hanging="360"/>
-        <w:rPr>
-          <w:rFonts w:ascii="Garamond" w:cs="Garamond" w:eastAsia="Garamond" w:hAnsi="Garamond"/>
-          <w:sz w:val="24"/>
-          <w:szCs w:val="24"/>
-        </w:rPr>
-      </w:pPr>
-      <w:r>
-        <w:rPr>
-          <w:rFonts w:ascii="Garamond" w:cs="Garamond" w:eastAsia="Garamond" w:hAnsi="Garamond"/>
-          <w:sz w:val="24"/>
-          <w:szCs w:val="24"/>
+      </w:pPr>
+      <w:r>
+        <w:rPr>
           <w:rtl w:val="0"/>
         </w:rPr>
         <w:t xml:space="preserve">The choice between the two options should present a temptation to answer the question with the ‘wrong’ answer. The emotional stakes in the case and the way in which the follow-up questions are phrased should provide some emotional satisfaction. </w:t>
@@ -1616,19 +1294,11 @@
           <w:ilvl w:val="0"/>
           <w:numId w:val="3"/>
         </w:numPr>
-        <w:spacing w:before="0" w:beforeAutospacing="0" w:line="276" w:lineRule="auto"/>
+        <w:spacing w:before="0" w:beforeAutospacing="0"/>
         <w:ind w:left="720" w:hanging="360"/>
-        <w:rPr>
-          <w:rFonts w:ascii="Garamond" w:cs="Garamond" w:eastAsia="Garamond" w:hAnsi="Garamond"/>
-          <w:sz w:val="24"/>
-          <w:szCs w:val="24"/>
-        </w:rPr>
-      </w:pPr>
-      <w:r>
-        <w:rPr>
-          <w:rFonts w:ascii="Garamond" w:cs="Garamond" w:eastAsia="Garamond" w:hAnsi="Garamond"/>
-          <w:sz w:val="24"/>
-          <w:szCs w:val="24"/>
+      </w:pPr>
+      <w:r>
+        <w:rPr>
           <w:rtl w:val="0"/>
         </w:rPr>
         <w:t xml:space="preserve">Witnesses themselves vary in their receptiveness. It would pay to pay attention to which of these witnesses is more or less receptive. </w:t>
@@ -1641,18 +1311,10 @@
     </w:p>
     <w:p>
       <w:pPr>
-        <w:spacing w:before="200" w:line="276" w:lineRule="auto"/>
-        <w:rPr>
-          <w:rFonts w:ascii="Garamond" w:cs="Garamond" w:eastAsia="Garamond" w:hAnsi="Garamond"/>
-          <w:sz w:val="24"/>
-          <w:szCs w:val="24"/>
-        </w:rPr>
-      </w:pPr>
-      <w:r>
-        <w:rPr>
-          <w:rFonts w:ascii="Garamond" w:cs="Garamond" w:eastAsia="Garamond" w:hAnsi="Garamond"/>
-          <w:sz w:val="24"/>
-          <w:szCs w:val="24"/>
+        <w:rPr/>
+      </w:pPr>
+      <w:r>
+        <w:rPr>
           <w:rtl w:val="0"/>
         </w:rPr>
         <w:t xml:space="preserve">A slide with these rules should be available for players throughout the game so they can refresh their memories if they need to. </w:t>
@@ -1661,24 +1323,12 @@
     <w:p>
       <w:pPr>
         <w:pStyle w:val="Heading2"/>
-        <w:spacing w:after="120" w:line="276" w:lineRule="auto"/>
-        <w:rPr>
-          <w:rFonts w:ascii="Garamond" w:cs="Garamond" w:eastAsia="Garamond" w:hAnsi="Garamond"/>
-          <w:b w:val="0"/>
-          <w:bCs w:val="0"/>
-          <w:sz w:val="32"/>
-          <w:szCs w:val="32"/>
-        </w:rPr>
-      </w:pPr>
-      <w:bookmarkStart w:colFirst="0" w:colLast="0" w:name="_35qvn8hk7yak" w:id="7"/>
-      <w:bookmarkEnd w:id="7"/>
-      <w:r>
-        <w:rPr>
-          <w:rFonts w:ascii="Garamond" w:cs="Garamond" w:eastAsia="Garamond" w:hAnsi="Garamond"/>
-          <w:b w:val="0"/>
-          <w:bCs w:val="0"/>
-          <w:sz w:val="32"/>
-          <w:szCs w:val="32"/>
+        <w:rPr/>
+      </w:pPr>
+      <w:bookmarkStart w:colFirst="0" w:colLast="0" w:name="_35qvn8hk7yak" w:id="8"/>
+      <w:bookmarkEnd w:id="8"/>
+      <w:r>
+        <w:rPr>
           <w:rtl w:val="0"/>
         </w:rPr>
         <w:t xml:space="preserve">3.2 The Hook</w:t>
@@ -1686,78 +1336,52 @@
     </w:p>
     <w:p>
       <w:pPr>
-        <w:spacing w:before="200" w:line="276" w:lineRule="auto"/>
-        <w:rPr>
-          <w:rFonts w:ascii="Garamond" w:cs="Garamond" w:eastAsia="Garamond" w:hAnsi="Garamond"/>
-          <w:sz w:val="24"/>
-          <w:szCs w:val="24"/>
-        </w:rPr>
-      </w:pPr>
-      <w:r>
-        <w:rPr>
-          <w:rFonts w:ascii="Garamond" w:cs="Garamond" w:eastAsia="Garamond" w:hAnsi="Garamond"/>
-          <w:sz w:val="24"/>
-          <w:szCs w:val="24"/>
+        <w:rPr/>
+      </w:pPr>
+      <w:r>
+        <w:rPr>
           <w:rtl w:val="0"/>
         </w:rPr>
         <w:t xml:space="preserve">After the introduction, players are introduced to the mystery by way of </w:t>
       </w:r>
       <w:r>
         <w:rPr>
-          <w:rFonts w:ascii="Garamond" w:cs="Garamond" w:eastAsia="Garamond" w:hAnsi="Garamond"/>
           <w:i w:val="1"/>
           <w:iCs w:val="1"/>
-          <w:sz w:val="24"/>
-          <w:szCs w:val="24"/>
           <w:rtl w:val="0"/>
         </w:rPr>
         <w:t xml:space="preserve">the hook</w:t>
       </w:r>
       <w:r>
         <w:rPr>
-          <w:rFonts w:ascii="Garamond" w:cs="Garamond" w:eastAsia="Garamond" w:hAnsi="Garamond"/>
-          <w:sz w:val="24"/>
-          <w:szCs w:val="24"/>
           <w:rtl w:val="0"/>
         </w:rPr>
         <w:t xml:space="preserve">: a piece of the narrative that presents the CCC, introduces the mystery </w:t>
       </w:r>
       <w:r>
         <w:rPr>
-          <w:rFonts w:ascii="Garamond" w:cs="Garamond" w:eastAsia="Garamond" w:hAnsi="Garamond"/>
           <w:i w:val="1"/>
           <w:iCs w:val="1"/>
-          <w:sz w:val="24"/>
-          <w:szCs w:val="24"/>
           <w:rtl w:val="0"/>
         </w:rPr>
         <w:t xml:space="preserve">and</w:t>
       </w:r>
       <w:r>
         <w:rPr>
-          <w:rFonts w:ascii="Garamond" w:cs="Garamond" w:eastAsia="Garamond" w:hAnsi="Garamond"/>
-          <w:sz w:val="24"/>
-          <w:szCs w:val="24"/>
           <w:rtl w:val="0"/>
         </w:rPr>
         <w:t xml:space="preserve"> situates the players within. For example, in </w:t>
       </w:r>
       <w:r>
         <w:rPr>
-          <w:rFonts w:ascii="Garamond" w:cs="Garamond" w:eastAsia="Garamond" w:hAnsi="Garamond"/>
           <w:i w:val="1"/>
           <w:iCs w:val="1"/>
-          <w:sz w:val="24"/>
-          <w:szCs w:val="24"/>
           <w:rtl w:val="0"/>
         </w:rPr>
         <w:t xml:space="preserve">The Commons’ Comma</w:t>
       </w:r>
       <w:r>
         <w:rPr>
-          <w:rFonts w:ascii="Garamond" w:cs="Garamond" w:eastAsia="Garamond" w:hAnsi="Garamond"/>
-          <w:sz w:val="24"/>
-          <w:szCs w:val="24"/>
           <w:rtl w:val="0"/>
         </w:rPr>
         <w:t xml:space="preserve"> players are student-interns working at the university president office and are tasked with solving their mystery as a task for a part time job they thought would be mostly scanning papers or organizing kitchenette cabinets.</w:t>
@@ -1765,18 +1389,10 @@
     </w:p>
     <w:p>
       <w:pPr>
-        <w:spacing w:before="200" w:line="276" w:lineRule="auto"/>
-        <w:rPr>
-          <w:rFonts w:ascii="Garamond" w:cs="Garamond" w:eastAsia="Garamond" w:hAnsi="Garamond"/>
-          <w:sz w:val="24"/>
-          <w:szCs w:val="24"/>
-        </w:rPr>
-      </w:pPr>
-      <w:r>
-        <w:rPr>
-          <w:rFonts w:ascii="Garamond" w:cs="Garamond" w:eastAsia="Garamond" w:hAnsi="Garamond"/>
-          <w:sz w:val="24"/>
-          <w:szCs w:val="24"/>
+        <w:rPr/>
+      </w:pPr>
+      <w:r>
+        <w:rPr>
           <w:rtl w:val="0"/>
         </w:rPr>
         <w:t xml:space="preserve">The hook should be carefully crafted to be both informative and entertaining, to give the players enough to go off of (there are no other opportunities for big chunks of exposition) as well as something interesting to pull them in and motivate them to be involved. The hook should also include a compelling time pressure which explains why there’s a limited number of questions that the players can ask before… well before something bad happens, but which bad thing, that is told during the hook. </w:t>
@@ -1785,24 +1401,12 @@
     <w:p>
       <w:pPr>
         <w:pStyle w:val="Heading2"/>
-        <w:spacing w:after="120" w:line="276" w:lineRule="auto"/>
-        <w:rPr>
-          <w:rFonts w:ascii="Garamond" w:cs="Garamond" w:eastAsia="Garamond" w:hAnsi="Garamond"/>
-          <w:b w:val="0"/>
-          <w:bCs w:val="0"/>
-          <w:sz w:val="32"/>
-          <w:szCs w:val="32"/>
-        </w:rPr>
-      </w:pPr>
-      <w:bookmarkStart w:colFirst="0" w:colLast="0" w:name="_j7v1h2yirc0i" w:id="8"/>
-      <w:bookmarkEnd w:id="8"/>
-      <w:r>
-        <w:rPr>
-          <w:rFonts w:ascii="Garamond" w:cs="Garamond" w:eastAsia="Garamond" w:hAnsi="Garamond"/>
-          <w:b w:val="0"/>
-          <w:bCs w:val="0"/>
-          <w:sz w:val="32"/>
-          <w:szCs w:val="32"/>
+        <w:rPr/>
+      </w:pPr>
+      <w:bookmarkStart w:colFirst="0" w:colLast="0" w:name="_j7v1h2yirc0i" w:id="9"/>
+      <w:bookmarkEnd w:id="9"/>
+      <w:r>
+        <w:rPr>
           <w:rtl w:val="0"/>
         </w:rPr>
         <w:t xml:space="preserve">3.3 Interviews</w:t>
@@ -1810,18 +1414,10 @@
     </w:p>
     <w:p>
       <w:pPr>
-        <w:spacing w:before="200" w:line="276" w:lineRule="auto"/>
-        <w:rPr>
-          <w:rFonts w:ascii="Garamond" w:cs="Garamond" w:eastAsia="Garamond" w:hAnsi="Garamond"/>
-          <w:sz w:val="24"/>
-          <w:szCs w:val="24"/>
-        </w:rPr>
-      </w:pPr>
-      <w:r>
-        <w:rPr>
-          <w:rFonts w:ascii="Garamond" w:cs="Garamond" w:eastAsia="Garamond" w:hAnsi="Garamond"/>
-          <w:sz w:val="24"/>
-          <w:szCs w:val="24"/>
+        <w:rPr/>
+      </w:pPr>
+      <w:r>
+        <w:rPr>
           <w:rtl w:val="0"/>
         </w:rPr>
         <w:t xml:space="preserve">As noted, the bulk of the game is made of interviews. Students will have a menu of options, each corresponding to a witness they can interview. Students can then ‘walk around’ the campus - going from witness to witness and asking each of them as many questions as they want, provided they have not yet run out of time (i.e. depleted their question ‘budget’) or angered that witness. There are 8 witnesses and each can be asked 8 questions. Since one question for each witness is a tripwire, that leaves us with 56 witness answers. Each one of these 56 answers is made of two parts.  </w:t>
@@ -1829,69 +1425,46 @@
     </w:p>
     <w:p>
       <w:pPr>
-        <w:spacing w:before="200" w:line="276" w:lineRule="auto"/>
-        <w:rPr>
-          <w:rFonts w:ascii="Garamond" w:cs="Garamond" w:eastAsia="Garamond" w:hAnsi="Garamond"/>
-          <w:sz w:val="24"/>
-          <w:szCs w:val="24"/>
-        </w:rPr>
-      </w:pPr>
-      <w:r>
-        <w:rPr>
-          <w:rFonts w:ascii="Garamond" w:cs="Garamond" w:eastAsia="Garamond" w:hAnsi="Garamond"/>
+        <w:rPr/>
+      </w:pPr>
+      <w:r>
+        <w:rPr>
           <w:b w:val="1"/>
           <w:bCs w:val="1"/>
-          <w:sz w:val="24"/>
-          <w:szCs w:val="24"/>
           <w:rtl w:val="0"/>
         </w:rPr>
         <w:t xml:space="preserve">A piece of information</w:t>
       </w:r>
       <w:r>
         <w:rPr>
-          <w:rFonts w:ascii="Garamond" w:cs="Garamond" w:eastAsia="Garamond" w:hAnsi="Garamond"/>
-          <w:sz w:val="24"/>
-          <w:szCs w:val="24"/>
           <w:rtl w:val="0"/>
         </w:rPr>
         <w:t xml:space="preserve"> about the mystery. Of the seven non-tripwire answers of each witness, 4 convey useful information, which technically will be referred to as </w:t>
       </w:r>
       <w:r>
         <w:rPr>
-          <w:rFonts w:ascii="Garamond" w:cs="Garamond" w:eastAsia="Garamond" w:hAnsi="Garamond"/>
           <w:i w:val="1"/>
           <w:iCs w:val="1"/>
-          <w:sz w:val="24"/>
-          <w:szCs w:val="24"/>
           <w:rtl w:val="0"/>
         </w:rPr>
         <w:t xml:space="preserve">Clues</w:t>
       </w:r>
       <w:r>
         <w:rPr>
-          <w:rFonts w:ascii="Garamond" w:cs="Garamond" w:eastAsia="Garamond" w:hAnsi="Garamond"/>
-          <w:sz w:val="24"/>
-          <w:szCs w:val="24"/>
           <w:rtl w:val="0"/>
         </w:rPr>
         <w:t xml:space="preserve">, and 3 pieces of misleading or unhelpful information, which technically will be referred to as </w:t>
       </w:r>
       <w:r>
         <w:rPr>
-          <w:rFonts w:ascii="Garamond" w:cs="Garamond" w:eastAsia="Garamond" w:hAnsi="Garamond"/>
           <w:i w:val="1"/>
           <w:iCs w:val="1"/>
-          <w:sz w:val="24"/>
-          <w:szCs w:val="24"/>
           <w:rtl w:val="0"/>
         </w:rPr>
         <w:t xml:space="preserve">Red Herrings,</w:t>
       </w:r>
       <w:r>
         <w:rPr>
-          <w:rFonts w:ascii="Garamond" w:cs="Garamond" w:eastAsia="Garamond" w:hAnsi="Garamond"/>
-          <w:sz w:val="24"/>
-          <w:szCs w:val="24"/>
           <w:rtl w:val="0"/>
         </w:rPr>
         <w:t xml:space="preserve"> Across eight witnesses that is 32 useful answers and 24 red herrings.</w:t>
@@ -1903,39 +1476,25 @@
           <w:ilvl w:val="0"/>
           <w:numId w:val="8"/>
         </w:numPr>
-        <w:spacing w:after="0" w:afterAutospacing="0" w:before="200" w:line="276" w:lineRule="auto"/>
+        <w:spacing w:after="0" w:afterAutospacing="0"/>
         <w:ind w:left="720" w:hanging="360"/>
-        <w:rPr>
-          <w:rFonts w:ascii="Garamond" w:cs="Garamond" w:eastAsia="Garamond" w:hAnsi="Garamond"/>
-          <w:sz w:val="24"/>
-          <w:szCs w:val="24"/>
-        </w:rPr>
-      </w:pPr>
-      <w:r>
-        <w:rPr>
-          <w:rFonts w:ascii="Garamond" w:cs="Garamond" w:eastAsia="Garamond" w:hAnsi="Garamond"/>
-          <w:sz w:val="24"/>
-          <w:szCs w:val="24"/>
+      </w:pPr>
+      <w:r>
+        <w:rPr>
           <w:rtl w:val="0"/>
         </w:rPr>
         <w:t xml:space="preserve">The 32 useful answers include </w:t>
       </w:r>
       <w:r>
         <w:rPr>
-          <w:rFonts w:ascii="Garamond" w:cs="Garamond" w:eastAsia="Garamond" w:hAnsi="Garamond"/>
           <w:b w:val="1"/>
           <w:bCs w:val="1"/>
-          <w:sz w:val="24"/>
-          <w:szCs w:val="24"/>
           <w:rtl w:val="0"/>
         </w:rPr>
         <w:t xml:space="preserve">16 Clues</w:t>
       </w:r>
       <w:r>
         <w:rPr>
-          <w:rFonts w:ascii="Garamond" w:cs="Garamond" w:eastAsia="Garamond" w:hAnsi="Garamond"/>
-          <w:sz w:val="24"/>
-          <w:szCs w:val="24"/>
           <w:rtl w:val="0"/>
         </w:rPr>
         <w:t xml:space="preserve">, each given by two different witnesses. This gives the player more than one route to access each clue as well as an (imperfect) signal regarding the reliability of the information.</w:t>
@@ -1947,57 +1506,37 @@
           <w:ilvl w:val="0"/>
           <w:numId w:val="8"/>
         </w:numPr>
-        <w:spacing w:after="0" w:afterAutospacing="0" w:before="0" w:beforeAutospacing="0" w:line="276" w:lineRule="auto"/>
+        <w:spacing w:after="0" w:afterAutospacing="0" w:before="0" w:beforeAutospacing="0"/>
         <w:ind w:left="720" w:hanging="360"/>
-        <w:rPr>
-          <w:rFonts w:ascii="Garamond" w:cs="Garamond" w:eastAsia="Garamond" w:hAnsi="Garamond"/>
-          <w:sz w:val="24"/>
-          <w:szCs w:val="24"/>
-        </w:rPr>
-      </w:pPr>
-      <w:r>
-        <w:rPr>
-          <w:rFonts w:ascii="Garamond" w:cs="Garamond" w:eastAsia="Garamond" w:hAnsi="Garamond"/>
-          <w:sz w:val="24"/>
-          <w:szCs w:val="24"/>
+      </w:pPr>
+      <w:r>
+        <w:rPr>
           <w:rtl w:val="0"/>
         </w:rPr>
         <w:t xml:space="preserve">The </w:t>
       </w:r>
       <w:r>
         <w:rPr>
-          <w:rFonts w:ascii="Garamond" w:cs="Garamond" w:eastAsia="Garamond" w:hAnsi="Garamond"/>
           <w:b w:val="1"/>
           <w:bCs w:val="1"/>
-          <w:sz w:val="24"/>
-          <w:szCs w:val="24"/>
           <w:rtl w:val="0"/>
         </w:rPr>
         <w:t xml:space="preserve">24 Red Herrings</w:t>
       </w:r>
       <w:r>
         <w:rPr>
-          <w:rFonts w:ascii="Garamond" w:cs="Garamond" w:eastAsia="Garamond" w:hAnsi="Garamond"/>
-          <w:sz w:val="24"/>
-          <w:szCs w:val="24"/>
           <w:rtl w:val="0"/>
         </w:rPr>
         <w:t xml:space="preserve"> are each given once and they are grouped in sets (of 2/3/4) such that the Red Herrings that form a set 'cancel each other out,' so if you have all members of a set you should be able to deduce that neither of them are relevant to the case. For example, a set of Red Herrings may include descriptions of suspicious-but-not-actually-incriminating behaviors by one of the suspects as well as some exonerating information about that suspect. Taken on their own, the suspicious behaviors may seem pertinent to the case but the exonerating information shows that despite their attractiveness, the pieces of information about the suspicious behavior are not helpful.</w:t>
       </w:r>
       <w:r>
         <w:rPr>
-          <w:rFonts w:ascii="Garamond" w:cs="Garamond" w:eastAsia="Garamond" w:hAnsi="Garamond"/>
-          <w:sz w:val="24"/>
-          <w:szCs w:val="24"/>
           <w:vertAlign w:val="superscript"/>
         </w:rPr>
         <w:footnoteReference w:customMarkFollows="0" w:id="4"/>
       </w:r>
       <w:r>
         <w:rPr>
-          <w:rFonts w:ascii="Garamond" w:cs="Garamond" w:eastAsia="Garamond" w:hAnsi="Garamond"/>
-          <w:sz w:val="24"/>
-          <w:szCs w:val="24"/>
           <w:rtl w:val="0"/>
         </w:rPr>
         <w:t xml:space="preserve"> Another example is a set of Red Herrings that make up lies which can be exposed when one has the whole set. </w:t>
@@ -2009,19 +1548,11 @@
           <w:ilvl w:val="0"/>
           <w:numId w:val="8"/>
         </w:numPr>
-        <w:spacing w:before="0" w:beforeAutospacing="0" w:line="276" w:lineRule="auto"/>
+        <w:spacing w:before="0" w:beforeAutospacing="0"/>
         <w:ind w:left="720" w:hanging="360"/>
-        <w:rPr>
-          <w:rFonts w:ascii="Garamond" w:cs="Garamond" w:eastAsia="Garamond" w:hAnsi="Garamond"/>
-          <w:sz w:val="24"/>
-          <w:szCs w:val="24"/>
-        </w:rPr>
-      </w:pPr>
-      <w:r>
-        <w:rPr>
-          <w:rFonts w:ascii="Garamond" w:cs="Garamond" w:eastAsia="Garamond" w:hAnsi="Garamond"/>
-          <w:sz w:val="24"/>
-          <w:szCs w:val="24"/>
+      </w:pPr>
+      <w:r>
+        <w:rPr>
           <w:rtl w:val="0"/>
         </w:rPr>
         <w:t xml:space="preserve">Useful clues gained without follow-ups point in the right direction but are individually inconclusive. Together, all 16 do add up to the solution, but a player working from ordinary clues alone will usually have to reason across gaps.</w:t>
@@ -2029,29 +1560,18 @@
     </w:p>
     <w:p>
       <w:pPr>
-        <w:spacing w:before="200" w:line="276" w:lineRule="auto"/>
-        <w:rPr>
-          <w:rFonts w:ascii="Garamond" w:cs="Garamond" w:eastAsia="Garamond" w:hAnsi="Garamond"/>
-          <w:sz w:val="24"/>
-          <w:szCs w:val="24"/>
-        </w:rPr>
-      </w:pPr>
-      <w:r>
-        <w:rPr>
-          <w:rFonts w:ascii="Garamond" w:cs="Garamond" w:eastAsia="Garamond" w:hAnsi="Garamond"/>
+        <w:rPr/>
+      </w:pPr>
+      <w:r>
+        <w:rPr>
           <w:b w:val="1"/>
           <w:bCs w:val="1"/>
-          <w:sz w:val="24"/>
-          <w:szCs w:val="24"/>
           <w:rtl w:val="0"/>
         </w:rPr>
         <w:t xml:space="preserve">An expressed opinion about the controversy</w:t>
       </w:r>
       <w:r>
         <w:rPr>
-          <w:rFonts w:ascii="Garamond" w:cs="Garamond" w:eastAsia="Garamond" w:hAnsi="Garamond"/>
-          <w:sz w:val="24"/>
-          <w:szCs w:val="24"/>
           <w:rtl w:val="0"/>
         </w:rPr>
         <w:t xml:space="preserve">. Alongside the information provided about the mystery, witnesses volunteer their view of the CCC and say how their view differs from that of one of the other witnesses. As part of the scenario setup, witnesses are ranked by their receptiveness. The witness ranked 1 expresses their opinion receptively in all seven answers, rank 2 in six of seven, rank 3 in five, and so on down to rank 8, who is receptive in none. Overall, exactly half of the 56 opinion expressions are receptive. The details of this ranking are not shared with the players though the general fact regarding the variance in receptiveness. </w:t>
@@ -2059,38 +1579,24 @@
     </w:p>
     <w:p>
       <w:pPr>
-        <w:spacing w:before="200" w:line="276" w:lineRule="auto"/>
-        <w:rPr>
-          <w:rFonts w:ascii="Garamond" w:cs="Garamond" w:eastAsia="Garamond" w:hAnsi="Garamond"/>
-          <w:sz w:val="24"/>
-          <w:szCs w:val="24"/>
-        </w:rPr>
-      </w:pPr>
-      <w:r>
-        <w:rPr>
-          <w:rFonts w:ascii="Garamond" w:cs="Garamond" w:eastAsia="Garamond" w:hAnsi="Garamond"/>
-          <w:sz w:val="24"/>
-          <w:szCs w:val="24"/>
+        <w:rPr/>
+      </w:pPr>
+      <w:r>
+        <w:rPr>
           <w:rtl w:val="0"/>
         </w:rPr>
         <w:t xml:space="preserve">Receptive expressions use one or more HEAR moves while unreceptive ones expresses their views on the basis of </w:t>
       </w:r>
       <w:r>
         <w:rPr>
-          <w:rFonts w:ascii="Garamond" w:cs="Garamond" w:eastAsia="Garamond" w:hAnsi="Garamond"/>
           <w:i w:val="1"/>
           <w:iCs w:val="1"/>
-          <w:sz w:val="24"/>
-          <w:szCs w:val="24"/>
           <w:rtl w:val="0"/>
         </w:rPr>
         <w:t xml:space="preserve">naive realism</w:t>
       </w:r>
       <w:r>
         <w:rPr>
-          <w:rFonts w:ascii="Garamond" w:cs="Garamond" w:eastAsia="Garamond" w:hAnsi="Garamond"/>
-          <w:sz w:val="24"/>
-          <w:szCs w:val="24"/>
           <w:rtl w:val="0"/>
         </w:rPr>
         <w:t xml:space="preserve">, assuming their perspective is obviously true and so uses absolute language (‘obviously’), fails to acknowledge the other perspective or recognize it as legitimate, focus on how other views are wrong rather than seek agreement and so forth.  </w:t>
@@ -2099,22 +1605,12 @@
     <w:p>
       <w:pPr>
         <w:pStyle w:val="Heading3"/>
-        <w:spacing w:before="320" w:line="276" w:lineRule="auto"/>
-        <w:rPr>
-          <w:rFonts w:ascii="Garamond" w:cs="Garamond" w:eastAsia="Garamond" w:hAnsi="Garamond"/>
-          <w:b w:val="0"/>
-          <w:bCs w:val="0"/>
-          <w:color w:val="434343"/>
-        </w:rPr>
-      </w:pPr>
-      <w:bookmarkStart w:colFirst="0" w:colLast="0" w:name="_n565rz9sqema" w:id="9"/>
-      <w:bookmarkEnd w:id="9"/>
-      <w:r>
-        <w:rPr>
-          <w:rFonts w:ascii="Garamond" w:cs="Garamond" w:eastAsia="Garamond" w:hAnsi="Garamond"/>
-          <w:b w:val="0"/>
-          <w:bCs w:val="0"/>
-          <w:color w:val="434343"/>
+        <w:rPr/>
+      </w:pPr>
+      <w:bookmarkStart w:colFirst="0" w:colLast="0" w:name="_n565rz9sqema" w:id="10"/>
+      <w:bookmarkEnd w:id="10"/>
+      <w:r>
+        <w:rPr>
           <w:rtl w:val="0"/>
         </w:rPr>
         <w:t xml:space="preserve">3.3.1 Follow-up questions and Major Clues</w:t>
@@ -2122,36 +1618,22 @@
     </w:p>
     <w:p>
       <w:pPr>
-        <w:spacing w:before="200" w:line="276" w:lineRule="auto"/>
-        <w:rPr>
-          <w:rFonts w:ascii="Garamond" w:cs="Garamond" w:eastAsia="Garamond" w:hAnsi="Garamond"/>
-          <w:sz w:val="24"/>
-          <w:szCs w:val="24"/>
-        </w:rPr>
-      </w:pPr>
-      <w:r>
-        <w:rPr>
-          <w:rFonts w:ascii="Garamond" w:cs="Garamond" w:eastAsia="Garamond" w:hAnsi="Garamond"/>
-          <w:sz w:val="24"/>
-          <w:szCs w:val="24"/>
+        <w:rPr/>
+      </w:pPr>
+      <w:r>
+        <w:rPr>
           <w:rtl w:val="0"/>
         </w:rPr>
         <w:t xml:space="preserve">Once per witness, after any answer except for the tripwire, players may choose to “ask a follow-up about their opinion”. The game then offers </w:t>
       </w:r>
       <w:r>
         <w:rPr>
-          <w:rFonts w:ascii="Garamond" w:cs="Garamond" w:eastAsia="Garamond" w:hAnsi="Garamond"/>
-          <w:sz w:val="24"/>
-          <w:szCs w:val="24"/>
           <w:rtl w:val="0"/>
         </w:rPr>
         <w:t xml:space="preserve">two </w:t>
       </w:r>
       <w:r>
         <w:rPr>
-          <w:rFonts w:ascii="Garamond" w:cs="Garamond" w:eastAsia="Garamond" w:hAnsi="Garamond"/>
-          <w:sz w:val="24"/>
-          <w:szCs w:val="24"/>
           <w:rtl w:val="0"/>
         </w:rPr>
         <w:t xml:space="preserve">follow-up questions about the witness’s view of the controversy. Both options should be relevant and seem like reasonable responses though one will be framed as more receptive than the other. Each witness has only one pair of follow-up questions so they would not be super tailored to the particular response a witness just gave but instead will be responsive to their position about the CCC. Note: The follow-up does not depend on the witness’s own receptiveness.</w:t>
@@ -2159,38 +1641,24 @@
     </w:p>
     <w:p>
       <w:pPr>
-        <w:spacing w:before="200" w:line="276" w:lineRule="auto"/>
-        <w:rPr>
-          <w:rFonts w:ascii="Garamond" w:cs="Garamond" w:eastAsia="Garamond" w:hAnsi="Garamond"/>
-          <w:sz w:val="24"/>
-          <w:szCs w:val="24"/>
-        </w:rPr>
-      </w:pPr>
-      <w:r>
-        <w:rPr>
-          <w:rFonts w:ascii="Garamond" w:cs="Garamond" w:eastAsia="Garamond" w:hAnsi="Garamond"/>
-          <w:sz w:val="24"/>
-          <w:szCs w:val="24"/>
+        <w:rPr/>
+      </w:pPr>
+      <w:r>
+        <w:rPr>
           <w:rtl w:val="0"/>
         </w:rPr>
         <w:t xml:space="preserve">How obvious or subtle this difference will be requires careful calibration. Making it too obvious will make the learning element of the game feel cheap and could render the mystery trivial. Making it too subtle can cause frustration to users who may feel like they couldn’t have been expected to interpret such a subtle difference. In general, </w:t>
       </w:r>
       <w:r>
         <w:rPr>
-          <w:rFonts w:ascii="Garamond" w:cs="Garamond" w:eastAsia="Garamond" w:hAnsi="Garamond"/>
           <w:b w:val="1"/>
           <w:bCs w:val="1"/>
-          <w:sz w:val="24"/>
-          <w:szCs w:val="24"/>
           <w:rtl w:val="0"/>
         </w:rPr>
         <w:t xml:space="preserve">picking the correct follow-up should be as difficult as possible</w:t>
       </w:r>
       <w:r>
         <w:rPr>
-          <w:rFonts w:ascii="Garamond" w:cs="Garamond" w:eastAsia="Garamond" w:hAnsi="Garamond"/>
-          <w:sz w:val="24"/>
-          <w:szCs w:val="24"/>
           <w:rtl w:val="0"/>
         </w:rPr>
         <w:t xml:space="preserve"> while having a solid justification from the HEAR framework. It’s ok if there is some variation in the difficulty between witnesses. </w:t>
@@ -2202,39 +1670,25 @@
           <w:ilvl w:val="0"/>
           <w:numId w:val="1"/>
         </w:numPr>
-        <w:spacing w:after="0" w:afterAutospacing="0" w:before="200" w:line="276" w:lineRule="auto"/>
+        <w:spacing w:after="0" w:afterAutospacing="0"/>
         <w:ind w:left="720" w:hanging="360"/>
-        <w:rPr>
-          <w:rFonts w:ascii="Garamond" w:cs="Garamond" w:eastAsia="Garamond" w:hAnsi="Garamond"/>
-          <w:sz w:val="24"/>
-          <w:szCs w:val="24"/>
-        </w:rPr>
-      </w:pPr>
-      <w:r>
-        <w:rPr>
-          <w:rFonts w:ascii="Garamond" w:cs="Garamond" w:eastAsia="Garamond" w:hAnsi="Garamond"/>
-          <w:sz w:val="24"/>
-          <w:szCs w:val="24"/>
+      </w:pPr>
+      <w:r>
+        <w:rPr>
           <w:rtl w:val="0"/>
         </w:rPr>
         <w:t xml:space="preserve">If the player picks the more receptive follow-up, the witness opens up and the player earns one of the four </w:t>
       </w:r>
       <w:r>
         <w:rPr>
-          <w:rFonts w:ascii="Garamond" w:cs="Garamond" w:eastAsia="Garamond" w:hAnsi="Garamond"/>
           <w:b w:val="1"/>
           <w:bCs w:val="1"/>
-          <w:sz w:val="24"/>
-          <w:szCs w:val="24"/>
           <w:rtl w:val="0"/>
         </w:rPr>
         <w:t xml:space="preserve">Major Clues</w:t>
       </w:r>
       <w:r>
         <w:rPr>
-          <w:rFonts w:ascii="Garamond" w:cs="Garamond" w:eastAsia="Garamond" w:hAnsi="Garamond"/>
-          <w:sz w:val="24"/>
-          <w:szCs w:val="24"/>
           <w:rtl w:val="0"/>
         </w:rPr>
         <w:t xml:space="preserve">. The game then shows a short explanation of why that phrasing worked and which HEAR elements it used.</w:t>
@@ -2246,19 +1700,11 @@
           <w:ilvl w:val="0"/>
           <w:numId w:val="1"/>
         </w:numPr>
-        <w:spacing w:before="0" w:beforeAutospacing="0" w:line="276" w:lineRule="auto"/>
+        <w:spacing w:before="0" w:beforeAutospacing="0"/>
         <w:ind w:left="720" w:hanging="360"/>
-        <w:rPr>
-          <w:rFonts w:ascii="Garamond" w:cs="Garamond" w:eastAsia="Garamond" w:hAnsi="Garamond"/>
-          <w:sz w:val="24"/>
-          <w:szCs w:val="24"/>
-        </w:rPr>
-      </w:pPr>
-      <w:r>
-        <w:rPr>
-          <w:rFonts w:ascii="Garamond" w:cs="Garamond" w:eastAsia="Garamond" w:hAnsi="Garamond"/>
-          <w:sz w:val="24"/>
-          <w:szCs w:val="24"/>
+      </w:pPr>
+      <w:r>
+        <w:rPr>
           <w:rtl w:val="0"/>
         </w:rPr>
         <w:t xml:space="preserve">If the player picks the unreceptive follow-up, the witness refuses to say anything more and the interview ends, exactly as if a tripwire had been asked.</w:t>
@@ -2266,44 +1712,24 @@
     </w:p>
     <w:p>
       <w:pPr>
-        <w:spacing w:before="200" w:line="276" w:lineRule="auto"/>
-        <w:rPr>
-          <w:rFonts w:ascii="Garamond" w:cs="Garamond" w:eastAsia="Garamond" w:hAnsi="Garamond"/>
-          <w:sz w:val="24"/>
-          <w:szCs w:val="24"/>
-        </w:rPr>
-      </w:pPr>
-      <w:r>
-        <w:rPr>
-          <w:rFonts w:ascii="Garamond" w:cs="Garamond" w:eastAsia="Garamond" w:hAnsi="Garamond"/>
-          <w:sz w:val="24"/>
-          <w:szCs w:val="24"/>
-          <w:rtl w:val="0"/>
-        </w:rPr>
-        <w:t xml:space="preserve">There are four Major Clues per scenario. Each Major Clue combines four of the 16 ordinary clues such that all four Major Clues together cover all 16 standard Clues without overlap. Therefore, together the four Major Clues make the solution unmistakable. Each time a Major Clue is earned the player also gains the next letter of the word H-E-A-R, displayed on screen. The letters are a progress tally and are not tied to specific HEAR elements or specific clues. After all four Major Clues are earned, a further successful follow-up still produces the explanation (and bonus points) but no new clue.</w:t>
+        <w:rPr/>
+      </w:pPr>
+      <w:r>
+        <w:rPr>
+          <w:rtl w:val="0"/>
+        </w:rPr>
+        <w:t xml:space="preserve">There are four Major Clues per scenario. Each Major Clue combines four of the 16 ordinary clues such that all four Major Clues together cover all 16 standard Clues without overlap. Therefore, together the four Major Clues make the solution unmistakable. Each time a Major Clue is earned the player also gains the next letter of the word H-E-A-R, displayed on screen. The letters are a progress tally and are not tied to specific HEAR elements or specific clues. After all four Major Clues are earned, a further successful follow-up still produces the explanation but no new clue.</w:t>
       </w:r>
     </w:p>
     <w:p>
       <w:pPr>
         <w:pStyle w:val="Heading2"/>
-        <w:spacing w:after="120" w:line="276" w:lineRule="auto"/>
-        <w:rPr>
-          <w:rFonts w:ascii="Garamond" w:cs="Garamond" w:eastAsia="Garamond" w:hAnsi="Garamond"/>
-          <w:b w:val="0"/>
-          <w:bCs w:val="0"/>
-          <w:sz w:val="32"/>
-          <w:szCs w:val="32"/>
-        </w:rPr>
-      </w:pPr>
-      <w:bookmarkStart w:colFirst="0" w:colLast="0" w:name="_1qymattj2854" w:id="10"/>
-      <w:bookmarkEnd w:id="10"/>
-      <w:r>
-        <w:rPr>
-          <w:rFonts w:ascii="Garamond" w:cs="Garamond" w:eastAsia="Garamond" w:hAnsi="Garamond"/>
-          <w:b w:val="0"/>
-          <w:bCs w:val="0"/>
-          <w:sz w:val="32"/>
-          <w:szCs w:val="32"/>
+        <w:rPr/>
+      </w:pPr>
+      <w:bookmarkStart w:colFirst="0" w:colLast="0" w:name="_1qymattj2854" w:id="11"/>
+      <w:bookmarkEnd w:id="11"/>
+      <w:r>
+        <w:rPr>
           <w:rtl w:val="0"/>
         </w:rPr>
         <w:t xml:space="preserve">3.4 Solving the Mystery and Ending</w:t>
@@ -2311,77 +1737,49 @@
     </w:p>
     <w:p>
       <w:pPr>
-        <w:spacing w:before="200" w:line="276" w:lineRule="auto"/>
-        <w:rPr>
-          <w:rFonts w:ascii="Garamond" w:cs="Garamond" w:eastAsia="Garamond" w:hAnsi="Garamond"/>
-          <w:sz w:val="24"/>
-          <w:szCs w:val="24"/>
-        </w:rPr>
-      </w:pPr>
-      <w:r>
-        <w:rPr>
-          <w:rFonts w:ascii="Garamond" w:cs="Garamond" w:eastAsia="Garamond" w:hAnsi="Garamond"/>
-          <w:sz w:val="24"/>
-          <w:szCs w:val="24"/>
+        <w:rPr/>
+      </w:pPr>
+      <w:r>
+        <w:rPr>
           <w:rtl w:val="0"/>
         </w:rPr>
         <w:t xml:space="preserve">After every interview question that’s resolved, players may choose to </w:t>
       </w:r>
       <w:r>
         <w:rPr>
-          <w:rFonts w:ascii="Garamond" w:cs="Garamond" w:eastAsia="Garamond" w:hAnsi="Garamond"/>
           <w:i w:val="1"/>
           <w:iCs w:val="1"/>
-          <w:sz w:val="24"/>
-          <w:szCs w:val="24"/>
           <w:rtl w:val="0"/>
         </w:rPr>
         <w:t xml:space="preserve">solve</w:t>
       </w:r>
       <w:r>
         <w:rPr>
-          <w:rFonts w:ascii="Garamond" w:cs="Garamond" w:eastAsia="Garamond" w:hAnsi="Garamond"/>
-          <w:sz w:val="24"/>
-          <w:szCs w:val="24"/>
           <w:rtl w:val="0"/>
         </w:rPr>
         <w:t xml:space="preserve"> the case. Solving the case just means that players are given an opportunity to submit their answers (which may be referred to as a guess, though hopefully isn’t the result of pure guesswork). </w:t>
       </w:r>
       <w:r>
         <w:rPr>
-          <w:rFonts w:ascii="Garamond" w:cs="Garamond" w:eastAsia="Garamond" w:hAnsi="Garamond"/>
           <w:b w:val="1"/>
           <w:bCs w:val="1"/>
-          <w:sz w:val="24"/>
-          <w:szCs w:val="24"/>
-          <w:rtl w:val="0"/>
-        </w:rPr>
-        <w:t xml:space="preserve">Players are only given one chance to submit their answers</w:t>
-      </w:r>
-      <w:r>
-        <w:rPr>
-          <w:rFonts w:ascii="Garamond" w:cs="Garamond" w:eastAsia="Garamond" w:hAnsi="Garamond"/>
-          <w:sz w:val="24"/>
-          <w:szCs w:val="24"/>
-          <w:rtl w:val="0"/>
-        </w:rPr>
-        <w:t xml:space="preserve"> and so after they share their answers they are directed to the ending. </w:t>
-      </w:r>
-    </w:p>
-    <w:p>
-      <w:pPr>
-        <w:spacing w:before="200" w:line="276" w:lineRule="auto"/>
-        <w:rPr>
-          <w:rFonts w:ascii="Garamond" w:cs="Garamond" w:eastAsia="Garamond" w:hAnsi="Garamond"/>
-          <w:sz w:val="24"/>
-          <w:szCs w:val="24"/>
-        </w:rPr>
-      </w:pPr>
-      <w:r>
-        <w:rPr>
-          <w:rFonts w:ascii="Garamond" w:cs="Garamond" w:eastAsia="Garamond" w:hAnsi="Garamond"/>
-          <w:sz w:val="24"/>
-          <w:szCs w:val="24"/>
+          <w:rtl w:val="0"/>
+        </w:rPr>
+        <w:t xml:space="preserve">Players are given three chances to submit their answers</w:t>
+      </w:r>
+      <w:r>
+        <w:rPr>
+          <w:rtl w:val="0"/>
+        </w:rPr>
+        <w:t xml:space="preserve">. After a wrong submission the game says only that it is not the solution, not which part is wrong. Players may then keep investigating (if they have questions left) or submit again. After a correct submission, or a third wrong one, they are directed to the ending. A correct solution earns 3 points on the first try, 2 on the second and 1 on the third; the debrief shows how many tries were used. </w:t>
+      </w:r>
+    </w:p>
+    <w:p>
+      <w:pPr>
+        <w:rPr/>
+      </w:pPr>
+      <w:r>
+        <w:rPr>
           <w:rtl w:val="0"/>
         </w:rPr>
         <w:t xml:space="preserve">If players have no more questions in their allotted budget, they ‘run out of time’ - they have to submit their best guess and hope for the best. </w:t>
@@ -2389,18 +1787,10 @@
     </w:p>
     <w:p>
       <w:pPr>
-        <w:spacing w:before="200" w:line="276" w:lineRule="auto"/>
-        <w:rPr>
-          <w:rFonts w:ascii="Garamond" w:cs="Garamond" w:eastAsia="Garamond" w:hAnsi="Garamond"/>
-          <w:sz w:val="24"/>
-          <w:szCs w:val="24"/>
-        </w:rPr>
-      </w:pPr>
-      <w:r>
-        <w:rPr>
-          <w:rFonts w:ascii="Garamond" w:cs="Garamond" w:eastAsia="Garamond" w:hAnsi="Garamond"/>
-          <w:sz w:val="24"/>
-          <w:szCs w:val="24"/>
+        <w:rPr/>
+      </w:pPr>
+      <w:r>
+        <w:rPr>
           <w:rtl w:val="0"/>
         </w:rPr>
         <w:t xml:space="preserve">The ending should include a reveal of the full story which should be a satisfying twist. There would be slightly different endings depending on whether the players picked the right solution or not. Alongside the satisfaction of solving the case correctly, the story reveal is a big part of the payoff players get from playing the game so hopefully even players that didn’t solve correctly will have a pleasing experience. </w:t>
@@ -2408,18 +1798,10 @@
     </w:p>
     <w:p>
       <w:pPr>
-        <w:spacing w:before="200" w:line="276" w:lineRule="auto"/>
-        <w:rPr>
-          <w:rFonts w:ascii="Garamond" w:cs="Garamond" w:eastAsia="Garamond" w:hAnsi="Garamond"/>
-          <w:sz w:val="24"/>
-          <w:szCs w:val="24"/>
-        </w:rPr>
-      </w:pPr>
-      <w:r>
-        <w:rPr>
-          <w:rFonts w:ascii="Garamond" w:cs="Garamond" w:eastAsia="Garamond" w:hAnsi="Garamond"/>
-          <w:sz w:val="24"/>
-          <w:szCs w:val="24"/>
+        <w:rPr/>
+      </w:pPr>
+      <w:r>
+        <w:rPr>
           <w:rtl w:val="0"/>
         </w:rPr>
         <w:t xml:space="preserve">After the big reveal, players should be asked to rank the witnesses in order of their receptiveness. The ranking should be graded in terms of its difference from the real ranking and a score be given. Depending on the context, there’s an option to create a leaderboard with scores of different students.</w:t>
@@ -2428,48 +1810,33 @@
     <w:p>
       <w:pPr>
         <w:pStyle w:val="Heading1"/>
-        <w:spacing w:before="400" w:line="276" w:lineRule="auto"/>
-        <w:rPr>
-          <w:rFonts w:ascii="Garamond" w:cs="Garamond" w:eastAsia="Garamond" w:hAnsi="Garamond"/>
-          <w:b w:val="0"/>
-          <w:bCs w:val="0"/>
-          <w:sz w:val="40"/>
-          <w:szCs w:val="40"/>
-        </w:rPr>
-      </w:pPr>
-      <w:bookmarkStart w:colFirst="0" w:colLast="0" w:name="_6ox7aix20q37" w:id="11"/>
-      <w:bookmarkEnd w:id="11"/>
-      <w:r>
-        <w:rPr>
-          <w:rFonts w:ascii="Garamond" w:cs="Garamond" w:eastAsia="Garamond" w:hAnsi="Garamond"/>
-          <w:b w:val="0"/>
-          <w:bCs w:val="0"/>
-          <w:sz w:val="40"/>
-          <w:szCs w:val="40"/>
+        <w:rPr/>
+      </w:pPr>
+      <w:bookmarkStart w:colFirst="0" w:colLast="0" w:name="_6ox7aix20q37" w:id="12"/>
+      <w:bookmarkEnd w:id="12"/>
+      <w:commentRangeStart w:id="0"/>
+      <w:r>
+        <w:rPr>
           <w:rtl w:val="0"/>
         </w:rPr>
         <w:t xml:space="preserve">4. What a scenario packet contains</w:t>
       </w:r>
-      <w:r>
-        <w:rPr>
-          <w:rtl w:val="0"/>
-        </w:rPr>
-      </w:r>
-    </w:p>
-    <w:p>
-      <w:pPr>
-        <w:spacing w:before="200" w:line="276" w:lineRule="auto"/>
-        <w:rPr>
-          <w:rFonts w:ascii="Garamond" w:cs="Garamond" w:eastAsia="Garamond" w:hAnsi="Garamond"/>
-          <w:sz w:val="24"/>
-          <w:szCs w:val="24"/>
-        </w:rPr>
-      </w:pPr>
-      <w:r>
-        <w:rPr>
-          <w:rFonts w:ascii="Garamond" w:cs="Garamond" w:eastAsia="Garamond" w:hAnsi="Garamond"/>
-          <w:sz w:val="24"/>
-          <w:szCs w:val="24"/>
+      <w:commentRangeEnd w:id="0"/>
+      <w:r>
+        <w:commentReference w:id="0"/>
+      </w:r>
+      <w:r>
+        <w:rPr>
+          <w:rtl w:val="0"/>
+        </w:rPr>
+      </w:r>
+    </w:p>
+    <w:p>
+      <w:pPr>
+        <w:rPr/>
+      </w:pPr>
+      <w:r>
+        <w:rPr>
           <w:rtl w:val="0"/>
         </w:rPr>
         <w:t xml:space="preserve">A scenario packet is everything the Twine engine needs to produce a playable game. It consists of one narrative document, one response-matrix workbook, and an assets folder, and it must contain the following.</w:t>
@@ -2481,19 +1848,11 @@
           <w:ilvl w:val="0"/>
           <w:numId w:val="2"/>
         </w:numPr>
-        <w:spacing w:after="0" w:afterAutospacing="0" w:before="200" w:line="276" w:lineRule="auto"/>
+        <w:spacing w:after="0" w:afterAutospacing="0"/>
         <w:ind w:left="720" w:hanging="360"/>
-        <w:rPr>
-          <w:rFonts w:ascii="Garamond" w:cs="Garamond" w:eastAsia="Garamond" w:hAnsi="Garamond"/>
-          <w:sz w:val="24"/>
-          <w:szCs w:val="24"/>
-        </w:rPr>
-      </w:pPr>
-      <w:r>
-        <w:rPr>
-          <w:rFonts w:ascii="Garamond" w:cs="Garamond" w:eastAsia="Garamond" w:hAnsi="Garamond"/>
-          <w:sz w:val="24"/>
-          <w:szCs w:val="24"/>
+      </w:pPr>
+      <w:r>
+        <w:rPr>
           <w:rtl w:val="0"/>
         </w:rPr>
         <w:t xml:space="preserve">Title, scenario ID (used in filenames and the engine), background/summary. </w:t>
@@ -2505,30 +1864,19 @@
           <w:ilvl w:val="0"/>
           <w:numId w:val="2"/>
         </w:numPr>
-        <w:spacing w:after="0" w:afterAutospacing="0" w:before="0" w:beforeAutospacing="0" w:line="276" w:lineRule="auto"/>
+        <w:spacing w:after="0" w:afterAutospacing="0" w:before="0" w:beforeAutospacing="0"/>
         <w:ind w:left="720" w:hanging="360"/>
-        <w:rPr>
-          <w:rFonts w:ascii="Garamond" w:cs="Garamond" w:eastAsia="Garamond" w:hAnsi="Garamond"/>
-          <w:sz w:val="24"/>
-          <w:szCs w:val="24"/>
-        </w:rPr>
-      </w:pPr>
-      <w:r>
-        <w:rPr>
-          <w:rFonts w:ascii="Garamond" w:cs="Garamond" w:eastAsia="Garamond" w:hAnsi="Garamond"/>
+      </w:pPr>
+      <w:r>
+        <w:rPr>
           <w:b w:val="1"/>
           <w:bCs w:val="1"/>
-          <w:sz w:val="24"/>
-          <w:szCs w:val="24"/>
           <w:rtl w:val="0"/>
         </w:rPr>
         <w:t xml:space="preserve">The mystery</w:t>
       </w:r>
       <w:r>
         <w:rPr>
-          <w:rFonts w:ascii="Garamond" w:cs="Garamond" w:eastAsia="Garamond" w:hAnsi="Garamond"/>
-          <w:sz w:val="24"/>
-          <w:szCs w:val="24"/>
           <w:rtl w:val="0"/>
         </w:rPr>
         <w:t xml:space="preserve">: the question the player is asked to answer (for example “who removed X, why, and where is it now?”).</w:t>
@@ -2540,30 +1888,19 @@
           <w:ilvl w:val="0"/>
           <w:numId w:val="2"/>
         </w:numPr>
-        <w:spacing w:after="0" w:afterAutospacing="0" w:before="0" w:beforeAutospacing="0" w:line="276" w:lineRule="auto"/>
+        <w:spacing w:after="0" w:afterAutospacing="0" w:before="0" w:beforeAutospacing="0"/>
         <w:ind w:left="720" w:hanging="360"/>
-        <w:rPr>
-          <w:rFonts w:ascii="Garamond" w:cs="Garamond" w:eastAsia="Garamond" w:hAnsi="Garamond"/>
-          <w:sz w:val="24"/>
-          <w:szCs w:val="24"/>
-        </w:rPr>
-      </w:pPr>
-      <w:r>
-        <w:rPr>
-          <w:rFonts w:ascii="Garamond" w:cs="Garamond" w:eastAsia="Garamond" w:hAnsi="Garamond"/>
+      </w:pPr>
+      <w:r>
+        <w:rPr>
           <w:b w:val="1"/>
           <w:bCs w:val="1"/>
-          <w:sz w:val="24"/>
-          <w:szCs w:val="24"/>
           <w:rtl w:val="0"/>
         </w:rPr>
         <w:t xml:space="preserve">The solution: </w:t>
       </w:r>
       <w:r>
         <w:rPr>
-          <w:rFonts w:ascii="Garamond" w:cs="Garamond" w:eastAsia="Garamond" w:hAnsi="Garamond"/>
-          <w:sz w:val="24"/>
-          <w:szCs w:val="24"/>
           <w:rtl w:val="0"/>
         </w:rPr>
         <w:t xml:space="preserve">the answer to the mystery</w:t>
@@ -2575,19 +1912,11 @@
           <w:ilvl w:val="1"/>
           <w:numId w:val="2"/>
         </w:numPr>
-        <w:spacing w:after="0" w:afterAutospacing="0" w:before="0" w:beforeAutospacing="0" w:line="276" w:lineRule="auto"/>
+        <w:spacing w:after="0" w:afterAutospacing="0" w:before="0" w:beforeAutospacing="0"/>
         <w:ind w:left="1440" w:hanging="360"/>
-        <w:rPr>
-          <w:rFonts w:ascii="Garamond" w:cs="Garamond" w:eastAsia="Garamond" w:hAnsi="Garamond"/>
-          <w:sz w:val="24"/>
-          <w:szCs w:val="24"/>
-        </w:rPr>
-      </w:pPr>
-      <w:r>
-        <w:rPr>
-          <w:rFonts w:ascii="Garamond" w:cs="Garamond" w:eastAsia="Garamond" w:hAnsi="Garamond"/>
-          <w:sz w:val="24"/>
-          <w:szCs w:val="24"/>
+      </w:pPr>
+      <w:r>
+        <w:rPr>
           <w:rtl w:val="0"/>
         </w:rPr>
         <w:t xml:space="preserve">The 16 Clues that tell the story of the answer, alongside the 4 Major Clues that make each group of four.</w:t>
@@ -2599,30 +1928,19 @@
           <w:ilvl w:val="0"/>
           <w:numId w:val="2"/>
         </w:numPr>
-        <w:spacing w:after="0" w:afterAutospacing="0" w:before="0" w:beforeAutospacing="0" w:line="276" w:lineRule="auto"/>
+        <w:spacing w:after="0" w:afterAutospacing="0" w:before="0" w:beforeAutospacing="0"/>
         <w:ind w:left="720" w:hanging="360"/>
-        <w:rPr>
-          <w:rFonts w:ascii="Garamond" w:cs="Garamond" w:eastAsia="Garamond" w:hAnsi="Garamond"/>
-          <w:sz w:val="24"/>
-          <w:szCs w:val="24"/>
-        </w:rPr>
-      </w:pPr>
-      <w:r>
-        <w:rPr>
-          <w:rFonts w:ascii="Garamond" w:cs="Garamond" w:eastAsia="Garamond" w:hAnsi="Garamond"/>
+      </w:pPr>
+      <w:r>
+        <w:rPr>
           <w:b w:val="1"/>
           <w:bCs w:val="1"/>
-          <w:sz w:val="24"/>
-          <w:szCs w:val="24"/>
           <w:rtl w:val="0"/>
         </w:rPr>
         <w:t xml:space="preserve">The final-answer form</w:t>
       </w:r>
       <w:r>
         <w:rPr>
-          <w:rFonts w:ascii="Garamond" w:cs="Garamond" w:eastAsia="Garamond" w:hAnsi="Garamond"/>
-          <w:sz w:val="24"/>
-          <w:szCs w:val="24"/>
           <w:rtl w:val="0"/>
         </w:rPr>
         <w:t xml:space="preserve">: what the player must select at the end (e.g. one person from a list and one location from a list), and which combination is correct.</w:t>
@@ -2639,19 +1957,11 @@
           <w:ilvl w:val="0"/>
           <w:numId w:val="2"/>
         </w:numPr>
-        <w:spacing w:after="0" w:afterAutospacing="0" w:before="0" w:beforeAutospacing="0" w:line="276" w:lineRule="auto"/>
+        <w:spacing w:after="0" w:afterAutospacing="0" w:before="0" w:beforeAutospacing="0"/>
         <w:ind w:left="720" w:hanging="360"/>
-        <w:rPr>
-          <w:rFonts w:ascii="Garamond" w:cs="Garamond" w:eastAsia="Garamond" w:hAnsi="Garamond"/>
-          <w:sz w:val="24"/>
-          <w:szCs w:val="24"/>
-        </w:rPr>
-      </w:pPr>
-      <w:r>
-        <w:rPr>
-          <w:rFonts w:ascii="Garamond" w:cs="Garamond" w:eastAsia="Garamond" w:hAnsi="Garamond"/>
-          <w:sz w:val="24"/>
-          <w:szCs w:val="24"/>
+      </w:pPr>
+      <w:r>
+        <w:rPr>
           <w:rtl w:val="0"/>
         </w:rPr>
         <w:t xml:space="preserve">Passages text: Start, Rules, the Hook, Map, Interview, Answer, Follow-up, Evidence Board, Submission, Result, ending, ranking</w:t>
@@ -2663,19 +1973,11 @@
           <w:ilvl w:val="0"/>
           <w:numId w:val="2"/>
         </w:numPr>
-        <w:spacing w:after="0" w:afterAutospacing="0" w:before="0" w:beforeAutospacing="0" w:line="276" w:lineRule="auto"/>
+        <w:spacing w:after="0" w:afterAutospacing="0" w:before="0" w:beforeAutospacing="0"/>
         <w:ind w:left="720" w:hanging="360"/>
-        <w:rPr>
-          <w:rFonts w:ascii="Garamond" w:cs="Garamond" w:eastAsia="Garamond" w:hAnsi="Garamond"/>
-          <w:sz w:val="24"/>
-          <w:szCs w:val="24"/>
-        </w:rPr>
-      </w:pPr>
-      <w:r>
-        <w:rPr>
-          <w:rFonts w:ascii="Garamond" w:cs="Garamond" w:eastAsia="Garamond" w:hAnsi="Garamond"/>
-          <w:sz w:val="24"/>
-          <w:szCs w:val="24"/>
+      </w:pPr>
+      <w:r>
+        <w:rPr>
           <w:rtl w:val="0"/>
         </w:rPr>
         <w:t xml:space="preserve">The eight questions </w:t>
@@ -2687,19 +1989,11 @@
           <w:ilvl w:val="0"/>
           <w:numId w:val="2"/>
         </w:numPr>
-        <w:spacing w:after="0" w:afterAutospacing="0" w:before="0" w:beforeAutospacing="0" w:line="276" w:lineRule="auto"/>
+        <w:spacing w:after="0" w:afterAutospacing="0" w:before="0" w:beforeAutospacing="0"/>
         <w:ind w:left="720" w:hanging="360"/>
-        <w:rPr>
-          <w:rFonts w:ascii="Garamond" w:cs="Garamond" w:eastAsia="Garamond" w:hAnsi="Garamond"/>
-          <w:sz w:val="24"/>
-          <w:szCs w:val="24"/>
-        </w:rPr>
-      </w:pPr>
-      <w:r>
-        <w:rPr>
-          <w:rFonts w:ascii="Garamond" w:cs="Garamond" w:eastAsia="Garamond" w:hAnsi="Garamond"/>
-          <w:sz w:val="24"/>
-          <w:szCs w:val="24"/>
+      </w:pPr>
+      <w:r>
+        <w:rPr>
           <w:rtl w:val="0"/>
         </w:rPr>
         <w:t xml:space="preserve">The eight witnesses list:</w:t>
@@ -2711,19 +2005,11 @@
           <w:ilvl w:val="1"/>
           <w:numId w:val="2"/>
         </w:numPr>
-        <w:spacing w:after="0" w:afterAutospacing="0" w:before="0" w:beforeAutospacing="0" w:line="276" w:lineRule="auto"/>
+        <w:spacing w:after="0" w:afterAutospacing="0" w:before="0" w:beforeAutospacing="0"/>
         <w:ind w:left="1440" w:hanging="360"/>
-        <w:rPr>
-          <w:rFonts w:ascii="Garamond" w:cs="Garamond" w:eastAsia="Garamond" w:hAnsi="Garamond"/>
-          <w:sz w:val="24"/>
-          <w:szCs w:val="24"/>
-        </w:rPr>
-      </w:pPr>
-      <w:r>
-        <w:rPr>
-          <w:rFonts w:ascii="Garamond" w:cs="Garamond" w:eastAsia="Garamond" w:hAnsi="Garamond"/>
-          <w:sz w:val="24"/>
-          <w:szCs w:val="24"/>
+      </w:pPr>
+      <w:r>
+        <w:rPr>
           <w:rtl w:val="0"/>
         </w:rPr>
         <w:t xml:space="preserve">Information, image, ID (W01-W08)</w:t>
@@ -2735,19 +2021,11 @@
           <w:ilvl w:val="1"/>
           <w:numId w:val="2"/>
         </w:numPr>
-        <w:spacing w:after="0" w:afterAutospacing="0" w:before="0" w:beforeAutospacing="0" w:line="276" w:lineRule="auto"/>
+        <w:spacing w:after="0" w:afterAutospacing="0" w:before="0" w:beforeAutospacing="0"/>
         <w:ind w:left="1440" w:hanging="360"/>
-        <w:rPr>
-          <w:rFonts w:ascii="Garamond" w:cs="Garamond" w:eastAsia="Garamond" w:hAnsi="Garamond"/>
-          <w:sz w:val="24"/>
-          <w:szCs w:val="24"/>
-        </w:rPr>
-      </w:pPr>
-      <w:r>
-        <w:rPr>
-          <w:rFonts w:ascii="Garamond" w:cs="Garamond" w:eastAsia="Garamond" w:hAnsi="Garamond"/>
-          <w:sz w:val="24"/>
-          <w:szCs w:val="24"/>
+      </w:pPr>
+      <w:r>
+        <w:rPr>
           <w:rtl w:val="0"/>
         </w:rPr>
         <w:t xml:space="preserve">Position on the CCC</w:t>
@@ -2759,19 +2037,11 @@
           <w:ilvl w:val="1"/>
           <w:numId w:val="2"/>
         </w:numPr>
-        <w:spacing w:after="0" w:afterAutospacing="0" w:before="0" w:beforeAutospacing="0" w:line="276" w:lineRule="auto"/>
+        <w:spacing w:after="0" w:afterAutospacing="0" w:before="0" w:beforeAutospacing="0"/>
         <w:ind w:left="1440" w:hanging="360"/>
-        <w:rPr>
-          <w:rFonts w:ascii="Garamond" w:cs="Garamond" w:eastAsia="Garamond" w:hAnsi="Garamond"/>
-          <w:sz w:val="24"/>
-          <w:szCs w:val="24"/>
-        </w:rPr>
-      </w:pPr>
-      <w:r>
-        <w:rPr>
-          <w:rFonts w:ascii="Garamond" w:cs="Garamond" w:eastAsia="Garamond" w:hAnsi="Garamond"/>
-          <w:sz w:val="24"/>
-          <w:szCs w:val="24"/>
+      </w:pPr>
+      <w:r>
+        <w:rPr>
           <w:rtl w:val="0"/>
         </w:rPr>
         <w:t xml:space="preserve">Which question is their tripwire </w:t>
@@ -2783,19 +2053,11 @@
           <w:ilvl w:val="1"/>
           <w:numId w:val="2"/>
         </w:numPr>
-        <w:spacing w:after="0" w:afterAutospacing="0" w:before="0" w:beforeAutospacing="0" w:line="276" w:lineRule="auto"/>
+        <w:spacing w:after="0" w:afterAutospacing="0" w:before="0" w:beforeAutospacing="0"/>
         <w:ind w:left="1440" w:hanging="360"/>
-        <w:rPr>
-          <w:rFonts w:ascii="Garamond" w:cs="Garamond" w:eastAsia="Garamond" w:hAnsi="Garamond"/>
-          <w:sz w:val="24"/>
-          <w:szCs w:val="24"/>
-        </w:rPr>
-      </w:pPr>
-      <w:r>
-        <w:rPr>
-          <w:rFonts w:ascii="Garamond" w:cs="Garamond" w:eastAsia="Garamond" w:hAnsi="Garamond"/>
-          <w:sz w:val="24"/>
-          <w:szCs w:val="24"/>
+      </w:pPr>
+      <w:r>
+        <w:rPr>
           <w:rtl w:val="0"/>
         </w:rPr>
         <w:t xml:space="preserve">Receptiveness score</w:t>
@@ -2807,19 +2069,11 @@
           <w:ilvl w:val="1"/>
           <w:numId w:val="2"/>
         </w:numPr>
-        <w:spacing w:after="0" w:afterAutospacing="0" w:before="0" w:beforeAutospacing="0" w:line="276" w:lineRule="auto"/>
+        <w:spacing w:after="0" w:afterAutospacing="0" w:before="0" w:beforeAutospacing="0"/>
         <w:ind w:left="1440" w:hanging="360"/>
-        <w:rPr>
-          <w:rFonts w:ascii="Garamond" w:cs="Garamond" w:eastAsia="Garamond" w:hAnsi="Garamond"/>
-          <w:sz w:val="24"/>
-          <w:szCs w:val="24"/>
-        </w:rPr>
-      </w:pPr>
-      <w:r>
-        <w:rPr>
-          <w:rFonts w:ascii="Garamond" w:cs="Garamond" w:eastAsia="Garamond" w:hAnsi="Garamond"/>
-          <w:sz w:val="24"/>
-          <w:szCs w:val="24"/>
+      </w:pPr>
+      <w:r>
+        <w:rPr>
           <w:rtl w:val="0"/>
         </w:rPr>
         <w:t xml:space="preserve">A follow-up pair of questions </w:t>
@@ -2831,19 +2085,11 @@
           <w:ilvl w:val="0"/>
           <w:numId w:val="2"/>
         </w:numPr>
-        <w:spacing w:after="0" w:afterAutospacing="0" w:before="0" w:beforeAutospacing="0" w:line="276" w:lineRule="auto"/>
+        <w:spacing w:after="0" w:afterAutospacing="0" w:before="0" w:beforeAutospacing="0"/>
         <w:ind w:left="720" w:hanging="360"/>
-        <w:rPr>
-          <w:rFonts w:ascii="Garamond" w:cs="Garamond" w:eastAsia="Garamond" w:hAnsi="Garamond"/>
-          <w:sz w:val="24"/>
-          <w:szCs w:val="24"/>
-        </w:rPr>
-      </w:pPr>
-      <w:r>
-        <w:rPr>
-          <w:rFonts w:ascii="Garamond" w:cs="Garamond" w:eastAsia="Garamond" w:hAnsi="Garamond"/>
-          <w:sz w:val="24"/>
-          <w:szCs w:val="24"/>
+      </w:pPr>
+      <w:r>
+        <w:rPr>
           <w:rtl w:val="0"/>
         </w:rPr>
         <w:t xml:space="preserve">The 24 Red Herrings organized into sets</w:t>
@@ -2855,19 +2101,11 @@
           <w:ilvl w:val="0"/>
           <w:numId w:val="2"/>
         </w:numPr>
-        <w:spacing w:before="0" w:beforeAutospacing="0" w:line="276" w:lineRule="auto"/>
+        <w:spacing w:before="0" w:beforeAutospacing="0"/>
         <w:ind w:left="720" w:hanging="360"/>
-        <w:rPr>
-          <w:rFonts w:ascii="Garamond" w:cs="Garamond" w:eastAsia="Garamond" w:hAnsi="Garamond"/>
-          <w:sz w:val="24"/>
-          <w:szCs w:val="24"/>
-        </w:rPr>
-      </w:pPr>
-      <w:r>
-        <w:rPr>
-          <w:rFonts w:ascii="Garamond" w:cs="Garamond" w:eastAsia="Garamond" w:hAnsi="Garamond"/>
-          <w:sz w:val="24"/>
-          <w:szCs w:val="24"/>
+      </w:pPr>
+      <w:r>
+        <w:rPr>
           <w:rtl w:val="0"/>
         </w:rPr>
         <w:t xml:space="preserve">The Response Matrix: 8 × 8 grid of witnesses by questions. Each cell is either the tripwire (for exactly one cell per column and one per row) or an answer containing one piece of information (a clue ID or a red-herring ID) and one opinion expression (marked receptive or not, referencing another witness by name). The matrix is kept in the workbook in two forms: a readable condensed version, and a longform table (one row per cell, with columns for witness, question, item, item type, receptive flag, and text) that the engine reads.</w:t>
@@ -2875,18 +2113,67 @@
     </w:p>
     <w:p>
       <w:pPr>
-        <w:spacing w:before="200" w:line="276" w:lineRule="auto"/>
-        <w:rPr>
-          <w:rFonts w:ascii="Garamond" w:cs="Garamond" w:eastAsia="Garamond" w:hAnsi="Garamond"/>
-          <w:sz w:val="24"/>
-          <w:szCs w:val="24"/>
-        </w:rPr>
+        <w:rPr/>
         <w:sectPr>
+          <w:type w:val="nextPage"/>
           <w:pgSz w:h="15840" w:w="12240" w:orient="portrait"/>
           <w:pgMar w:bottom="1440" w:top="1440" w:left="1440" w:right="1440" w:header="720" w:footer="720"/>
           <w:pgNumType w:start="1"/>
         </w:sectPr>
       </w:pPr>
+      <w:r>
+        <w:rPr>
+          <w:rtl w:val="0"/>
+        </w:rPr>
+      </w:r>
+    </w:p>
+    <w:p>
+      <w:pPr>
+        <w:pStyle w:val="Title"/>
+        <w:keepNext w:val="0"/>
+        <w:keepLines w:val="0"/>
+        <w:pageBreakBefore w:val="0"/>
+        <w:widowControl w:val="0"/>
+        <w:pBdr>
+          <w:top w:space="0" w:sz="0" w:val="nil"/>
+          <w:left w:space="0" w:sz="0" w:val="nil"/>
+          <w:bottom w:space="0" w:sz="0" w:val="nil"/>
+          <w:right w:space="0" w:sz="0" w:val="nil"/>
+          <w:between w:space="0" w:sz="0" w:val="nil"/>
+        </w:pBdr>
+        <w:shd w:fill="auto" w:val="clear"/>
+        <w:spacing w:after="0" w:before="0" w:line="276" w:lineRule="auto"/>
+        <w:ind w:left="0" w:right="0" w:firstLine="0"/>
+        <w:jc w:val="left"/>
+        <w:rPr/>
+        <w:sectPr>
+          <w:type w:val="nextPage"/>
+          <w:pgSz w:h="15840" w:w="12240" w:orient="portrait"/>
+          <w:pgMar w:bottom="1440" w:top="1440" w:left="1440" w:right="1440" w:header="720" w:footer="720"/>
+          <w:pgNumType w:start="1"/>
+        </w:sectPr>
+      </w:pPr>
+      <w:bookmarkStart w:colFirst="0" w:colLast="0" w:name="_ed1r6eb5gp8x" w:id="13"/>
+      <w:bookmarkEnd w:id="13"/>
+      <w:r>
+        <w:rPr>
+          <w:rFonts w:ascii="Garamond" w:cs="Garamond" w:eastAsia="Garamond" w:hAnsi="Garamond"/>
+          <w:b w:val="1"/>
+          <w:bCs w:val="1"/>
+          <w:i w:val="0"/>
+          <w:iCs w:val="0"/>
+          <w:smallCaps w:val="0"/>
+          <w:strike w:val="0"/>
+          <w:color w:val="000000"/>
+          <w:sz w:val="60"/>
+          <w:szCs w:val="60"/>
+          <w:u w:val="none"/>
+          <w:shd w:fill="auto" w:val="clear"/>
+          <w:vertAlign w:val="baseline"/>
+          <w:rtl w:val="0"/>
+        </w:rPr>
+        <w:t xml:space="preserve">Notes</w:t>
+      </w:r>
       <w:r>
         <w:rPr>
           <w:rtl w:val="0"/>
@@ -3219,11 +2506,64 @@
     </w:p>
     <w:p>
       <w:pPr>
+        <w:pStyle w:val="Title"/>
+        <w:keepNext w:val="0"/>
+        <w:keepLines w:val="0"/>
+        <w:pageBreakBefore w:val="0"/>
+        <w:widowControl w:val="0"/>
+        <w:pBdr>
+          <w:top w:space="0" w:sz="0" w:val="nil"/>
+          <w:left w:space="0" w:sz="0" w:val="nil"/>
+          <w:bottom w:space="0" w:sz="0" w:val="nil"/>
+          <w:right w:space="0" w:sz="0" w:val="nil"/>
+          <w:between w:space="0" w:sz="0" w:val="nil"/>
+        </w:pBdr>
+        <w:shd w:fill="auto" w:val="clear"/>
+        <w:spacing w:after="0" w:before="0" w:line="276" w:lineRule="auto"/>
+        <w:ind w:left="0" w:right="0" w:firstLine="0"/>
+        <w:jc w:val="left"/>
+        <w:rPr/>
+        <w:sectPr>
+          <w:type w:val="nextPage"/>
+          <w:pgSz w:h="15840" w:w="12240" w:orient="portrait"/>
+          <w:pgMar w:bottom="1440" w:top="1440" w:left="1440" w:right="1440" w:header="720" w:footer="720"/>
+          <w:pgNumType w:start="1"/>
+        </w:sectPr>
+      </w:pPr>
+      <w:bookmarkStart w:colFirst="0" w:colLast="0" w:name="_fcvyjb2dti1d" w:id="14"/>
+      <w:bookmarkEnd w:id="14"/>
+      <w:r>
+        <w:rPr>
+          <w:rFonts w:ascii="Garamond" w:cs="Garamond" w:eastAsia="Garamond" w:hAnsi="Garamond"/>
+          <w:b w:val="1"/>
+          <w:bCs w:val="1"/>
+          <w:i w:val="0"/>
+          <w:iCs w:val="0"/>
+          <w:smallCaps w:val="0"/>
+          <w:strike w:val="0"/>
+          <w:color w:val="000000"/>
+          <w:sz w:val="60"/>
+          <w:szCs w:val="60"/>
+          <w:u w:val="none"/>
+          <w:shd w:fill="auto" w:val="clear"/>
+          <w:vertAlign w:val="baseline"/>
+          <w:rtl w:val="0"/>
+        </w:rPr>
+        <w:t xml:space="preserve">Rules of the game</w:t>
+      </w:r>
+      <w:r>
+        <w:rPr>
+          <w:rtl w:val="0"/>
+        </w:rPr>
+      </w:r>
+    </w:p>
+    <w:p>
+      <w:pPr>
         <w:pStyle w:val="Heading1"/>
         <w:rPr/>
       </w:pPr>
-      <w:bookmarkStart w:colFirst="0" w:colLast="0" w:name="_xsv09x7iedko" w:id="12"/>
-      <w:bookmarkEnd w:id="12"/>
+      <w:bookmarkStart w:colFirst="0" w:colLast="0" w:name="_xsv09x7iedko" w:id="15"/>
+      <w:bookmarkEnd w:id="15"/>
       <w:r>
         <w:rPr>
           <w:rtl w:val="0"/>
@@ -3244,7 +2584,7 @@
         <w:rPr>
           <w:rtl w:val="0"/>
         </w:rPr>
-        <w:t xml:space="preserve">Your goal in this game is to solve a mystery! You’ll be going around the campus interviewing witnesses and gaining information. When you are ready to solve or when you run out of time, you have to make a guess. If you are correct you win!</w:t>
+        <w:t xml:space="preserve">Your goal in this game is to solve a mystery! You’re  going around campus, interviewing witnesses, and gaining information. When you are ready to solve or when you run out of time, you have to make a guess. You must solve the mystery correctly to win!</w:t>
       </w:r>
     </w:p>
     <w:p>
@@ -3292,7 +2632,7 @@
         <w:rPr>
           <w:rtl w:val="0"/>
         </w:rPr>
-        <w:t xml:space="preserve">For each witness, one question is a **tripwire**: it offends them and they walk away from the interview. The tripwire costs a question. Read each witness's background card for hints about what they would resent. No two witnesses trip on the same question. </w:t>
+        <w:t xml:space="preserve">For each witness, one question is a **tripwire**: it offends them and they walk away from the interview. Read each witness's background card for hints about what they would resent. No two witnesses trip on the same question. </w:t>
         <w:tab/>
         <w:tab/>
       </w:r>
@@ -3310,7 +2650,7 @@
         <w:rPr>
           <w:rtl w:val="0"/>
         </w:rPr>
-        <w:t xml:space="preserve">Every answer gives you a piece of information and the witness's opinion about {ccc}. Some information is useful, some is a red herring that a careful reasoner can rule out.</w:t>
+        <w:t xml:space="preserve">Every answer gives you a clue that helps solve the mystery as well as the witness's opinion on {ccc}. Some information is useful, some is a red herring: you must be careful and diligent to separate the truth from the chaff.</w:t>
       </w:r>
     </w:p>
     <w:p>
@@ -3342,7 +2682,7 @@
         <w:rPr>
           <w:rtl w:val="0"/>
         </w:rPr>
-        <w:t xml:space="preserve">Once per witness, after any answer, you may ask a follow-up about their opinion. You pick between two phrasings. The receptive phrasing earns the next Major Clue and the next letter of H-E-A-R. The other one ends the interview. Follow-ups do not cost a question.</w:t>
+        <w:t xml:space="preserve">Once per witness, after any answer, you may ask a follow-up about their opinion. You get to choose between two versions of the follow-up question. Pick wisely! If you pick the answer that communicates receptivity better, you’ll earn a Major Clue and the next letter of H-E-A-R. If you pick incorrectly, the witness walks away.</w:t>
       </w:r>
     </w:p>
     <w:p>
@@ -3358,23 +2698,7 @@
         <w:rPr>
           <w:rtl w:val="0"/>
         </w:rPr>
-        <w:t xml:space="preserve">There are {n_major} Major Clues. Together they make the solution clear. A successful follow-up after all of them are earned gives bonus points.</w:t>
-      </w:r>
-    </w:p>
-    <w:p>
-      <w:pPr>
-        <w:numPr>
-          <w:ilvl w:val="0"/>
-          <w:numId w:val="5"/>
-        </w:numPr>
-        <w:spacing w:after="0" w:afterAutospacing="0" w:before="0" w:beforeAutospacing="0"/>
-        <w:ind w:left="720" w:hanging="360"/>
-      </w:pPr>
-      <w:r>
-        <w:rPr>
-          <w:rtl w:val="0"/>
-        </w:rPr>
-        <w:t xml:space="preserve">You can solve the case at any time, but only once. When your questions run out, you must submit.</w:t>
+        <w:t xml:space="preserve">You can solve the case at any time. You get three tries. Solving the case on the first try earns you full marks, while solving it with your second or third chance earns you fewer points. When your questions run out, you must submit.</w:t>
       </w:r>
     </w:p>
     <w:p>
@@ -3396,168 +2720,27 @@
         <w:rPr>
           <w:rtl w:val="0"/>
         </w:rPr>
-        <w:t xml:space="preserve">The Evidence board keeps everything you have learned. The HEAR guide and these rules are always in the sidebar.</w:t>
-      </w:r>
-    </w:p>
-    <w:p>
-      <w:pPr>
-        <w:pStyle w:val="Heading1"/>
-        <w:rPr/>
-      </w:pPr>
-      <w:bookmarkStart w:colFirst="0" w:colLast="0" w:name="_gca2y5oth70s" w:id="13"/>
-      <w:bookmarkEnd w:id="13"/>
-      <w:r>
-        <w:rPr>
-          <w:rtl w:val="0"/>
-        </w:rPr>
-        <w:t xml:space="preserve">The HEAR framework</w:t>
-      </w:r>
-    </w:p>
-    <w:p>
-      <w:pPr>
-        <w:rPr/>
-      </w:pPr>
-      <w:r>
-        <w:rPr>
-          <w:rtl w:val="0"/>
-        </w:rPr>
-        <w:t xml:space="preserve">Conversational receptiveness is a willingness to engage with opposing views, shown through the words you use. Research by Julia Minson and colleagues found four markers that make someone come across as receptive:</w:t>
-      </w:r>
-    </w:p>
-    <w:p>
-      <w:pPr>
-        <w:pStyle w:val="Heading2"/>
-        <w:numPr>
-          <w:ilvl w:val="0"/>
-          <w:numId w:val="4"/>
-        </w:numPr>
-        <w:ind w:left="720" w:hanging="360"/>
-        <w:rPr>
-          <w:sz w:val="32"/>
-          <w:szCs w:val="32"/>
-        </w:rPr>
-      </w:pPr>
-      <w:bookmarkStart w:colFirst="0" w:colLast="0" w:name="_15kfzlgp827m" w:id="14"/>
-      <w:bookmarkEnd w:id="14"/>
-      <w:r>
-        <w:rPr>
-          <w:rtl w:val="0"/>
-        </w:rPr>
-        <w:t xml:space="preserve">Hedge your claims</w:t>
-      </w:r>
-    </w:p>
-    <w:p>
-      <w:pPr>
-        <w:rPr/>
-      </w:pPr>
-      <w:r>
-        <w:rPr>
-          <w:rtl w:val="0"/>
-        </w:rPr>
-        <w:t xml:space="preserve">Leave space alongside your views: “I think”, “it's possible that”, “I could be misreading this”.</w:t>
-      </w:r>
-    </w:p>
-    <w:p>
-      <w:pPr>
-        <w:pStyle w:val="Heading2"/>
-        <w:numPr>
-          <w:ilvl w:val="0"/>
-          <w:numId w:val="4"/>
-        </w:numPr>
-        <w:ind w:left="720" w:hanging="360"/>
-        <w:rPr>
-          <w:sz w:val="32"/>
-          <w:szCs w:val="32"/>
-        </w:rPr>
-      </w:pPr>
-      <w:bookmarkStart w:colFirst="0" w:colLast="0" w:name="_14bj2v2wcr9b" w:id="15"/>
-      <w:bookmarkEnd w:id="15"/>
-      <w:r>
-        <w:rPr>
-          <w:rtl w:val="0"/>
-        </w:rPr>
-        <w:t xml:space="preserve">Emphasize agreement</w:t>
-      </w:r>
-    </w:p>
-    <w:p>
-      <w:pPr>
-        <w:rPr/>
-      </w:pPr>
-      <w:r>
-        <w:rPr>
-          <w:rtl w:val="0"/>
-        </w:rPr>
-        <w:t xml:space="preserve">Find common ground: “We both want…”, “I agree that…”.</w:t>
-      </w:r>
-    </w:p>
-    <w:p>
-      <w:pPr>
-        <w:pStyle w:val="Heading2"/>
-        <w:numPr>
-          <w:ilvl w:val="0"/>
-          <w:numId w:val="4"/>
-        </w:numPr>
-        <w:ind w:left="720" w:hanging="360"/>
-        <w:rPr>
-          <w:sz w:val="32"/>
-          <w:szCs w:val="32"/>
-        </w:rPr>
-      </w:pPr>
-      <w:bookmarkStart w:colFirst="0" w:colLast="0" w:name="_zheajp4hsm8n" w:id="16"/>
-      <w:bookmarkEnd w:id="16"/>
-      <w:r>
-        <w:rPr>
-          <w:rtl w:val="0"/>
-        </w:rPr>
-        <w:t xml:space="preserve">Acknowledge the other's perspective</w:t>
-      </w:r>
-    </w:p>
-    <w:p>
-      <w:pPr>
-        <w:rPr/>
-      </w:pPr>
-      <w:r>
-        <w:rPr>
-          <w:rtl w:val="0"/>
-        </w:rPr>
-        <w:t xml:space="preserve">Show you have understood: “I understand that you…”, “You're right that…”.</w:t>
-      </w:r>
-    </w:p>
-    <w:p>
-      <w:pPr>
-        <w:pStyle w:val="Heading2"/>
-        <w:numPr>
-          <w:ilvl w:val="0"/>
-          <w:numId w:val="4"/>
-        </w:numPr>
-        <w:ind w:left="720" w:hanging="360"/>
-        <w:rPr>
-          <w:sz w:val="32"/>
-          <w:szCs w:val="32"/>
-        </w:rPr>
-      </w:pPr>
-      <w:bookmarkStart w:colFirst="0" w:colLast="0" w:name="_47i9enf78bla" w:id="17"/>
-      <w:bookmarkEnd w:id="17"/>
-      <w:r>
-        <w:rPr>
-          <w:rtl w:val="0"/>
-        </w:rPr>
-        <w:t xml:space="preserve">Reframe to the positive</w:t>
-      </w:r>
-    </w:p>
-    <w:p>
-      <w:pPr>
-        <w:rPr/>
-      </w:pPr>
-      <w:r>
-        <w:rPr>
-          <w:rtl w:val="0"/>
-        </w:rPr>
-        <w:t xml:space="preserve">Say what you want rather than what you oppose, avoid dismissive language such as “that's wrong” or “no serious person thinks…”.</w:t>
-      </w:r>
-    </w:p>
-    <w:p>
-      <w:pPr>
+        <w:t xml:space="preserve">The Evidence board keeps everything you have learned. The HEAR Framework uide and these rules are always in the sidebar.</w:t>
+      </w:r>
+    </w:p>
+    <w:p>
+      <w:pPr>
+        <w:pStyle w:val="Title"/>
+        <w:keepNext w:val="0"/>
+        <w:keepLines w:val="0"/>
+        <w:pageBreakBefore w:val="0"/>
+        <w:widowControl w:val="0"/>
+        <w:pBdr>
+          <w:top w:space="0" w:sz="0" w:val="nil"/>
+          <w:left w:space="0" w:sz="0" w:val="nil"/>
+          <w:bottom w:space="0" w:sz="0" w:val="nil"/>
+          <w:right w:space="0" w:sz="0" w:val="nil"/>
+          <w:between w:space="0" w:sz="0" w:val="nil"/>
+        </w:pBdr>
+        <w:shd w:fill="auto" w:val="clear"/>
+        <w:spacing w:after="0" w:before="0" w:line="276" w:lineRule="auto"/>
+        <w:ind w:left="0" w:right="0" w:firstLine="0"/>
+        <w:jc w:val="left"/>
         <w:rPr/>
         <w:sectPr>
           <w:type w:val="nextPage"/>
@@ -3566,11 +2749,31 @@
           <w:pgNumType w:start="1"/>
         </w:sectPr>
       </w:pPr>
-      <w:r>
-        <w:rPr>
-          <w:rtl w:val="0"/>
-        </w:rPr>
-        <w:t xml:space="preserve">Unreceptive language states opinions flatly, generalizes about the other person, attributes motives, or dismisses them. Listen for both kinds as the witnesses talk about the controversy.</w:t>
+      <w:bookmarkStart w:colFirst="0" w:colLast="0" w:name="_6krtdbv554k" w:id="16"/>
+      <w:bookmarkEnd w:id="16"/>
+      <w:r>
+        <w:rPr>
+          <w:rFonts w:ascii="Garamond" w:cs="Garamond" w:eastAsia="Garamond" w:hAnsi="Garamond"/>
+          <w:b w:val="1"/>
+          <w:bCs w:val="1"/>
+          <w:i w:val="0"/>
+          <w:iCs w:val="0"/>
+          <w:smallCaps w:val="0"/>
+          <w:strike w:val="0"/>
+          <w:color w:val="000000"/>
+          <w:sz w:val="60"/>
+          <w:szCs w:val="60"/>
+          <w:u w:val="none"/>
+          <w:shd w:fill="auto" w:val="clear"/>
+          <w:vertAlign w:val="baseline"/>
+          <w:rtl w:val="0"/>
+        </w:rPr>
+        <w:t xml:space="preserve">HEAR Framework introduction</w:t>
+      </w:r>
+      <w:r>
+        <w:rPr>
+          <w:rtl w:val="0"/>
+        </w:rPr>
       </w:r>
     </w:p>
     <w:p>
@@ -3578,8 +2781,235 @@
         <w:pStyle w:val="Heading1"/>
         <w:rPr/>
       </w:pPr>
-      <w:bookmarkStart w:colFirst="0" w:colLast="0" w:name="_uynt6v9uhldf" w:id="18"/>
+      <w:bookmarkStart w:colFirst="0" w:colLast="0" w:name="_gca2y5oth70s" w:id="17"/>
+      <w:bookmarkEnd w:id="17"/>
+      <w:r>
+        <w:rPr>
+          <w:rtl w:val="0"/>
+        </w:rPr>
+        <w:t xml:space="preserve">The HEAR framework</w:t>
+      </w:r>
+    </w:p>
+    <w:p>
+      <w:pPr>
+        <w:rPr/>
+      </w:pPr>
+      <w:r>
+        <w:rPr>
+          <w:rtl w:val="0"/>
+        </w:rPr>
+        <w:t xml:space="preserve">Conversational receptiveness is a willingness to engage with opposing views, shown through the words you use. Research by Julia Minson and colleagues found four markers that make someone come across as receptive:</w:t>
+      </w:r>
+    </w:p>
+    <w:p>
+      <w:pPr>
+        <w:pStyle w:val="Heading2"/>
+        <w:numPr>
+          <w:ilvl w:val="0"/>
+          <w:numId w:val="4"/>
+        </w:numPr>
+        <w:ind w:left="720" w:hanging="360"/>
+        <w:rPr>
+          <w:sz w:val="32"/>
+          <w:szCs w:val="32"/>
+        </w:rPr>
+      </w:pPr>
+      <w:bookmarkStart w:colFirst="0" w:colLast="0" w:name="_15kfzlgp827m" w:id="18"/>
       <w:bookmarkEnd w:id="18"/>
+      <w:r>
+        <w:rPr>
+          <w:rtl w:val="0"/>
+        </w:rPr>
+        <w:t xml:space="preserve">Hedge your claims</w:t>
+      </w:r>
+    </w:p>
+    <w:p>
+      <w:pPr>
+        <w:rPr/>
+      </w:pPr>
+      <w:r>
+        <w:rPr>
+          <w:rtl w:val="0"/>
+        </w:rPr>
+        <w:t xml:space="preserve">Leave space alongside your views: “I think”, “it's possible that”, “I could be misreading this”.</w:t>
+      </w:r>
+    </w:p>
+    <w:p>
+      <w:pPr>
+        <w:pStyle w:val="Heading2"/>
+        <w:numPr>
+          <w:ilvl w:val="0"/>
+          <w:numId w:val="4"/>
+        </w:numPr>
+        <w:ind w:left="720" w:hanging="360"/>
+        <w:rPr>
+          <w:sz w:val="32"/>
+          <w:szCs w:val="32"/>
+        </w:rPr>
+      </w:pPr>
+      <w:bookmarkStart w:colFirst="0" w:colLast="0" w:name="_14bj2v2wcr9b" w:id="19"/>
+      <w:bookmarkEnd w:id="19"/>
+      <w:r>
+        <w:rPr>
+          <w:rtl w:val="0"/>
+        </w:rPr>
+        <w:t xml:space="preserve">Emphasize agreement</w:t>
+      </w:r>
+    </w:p>
+    <w:p>
+      <w:pPr>
+        <w:rPr/>
+      </w:pPr>
+      <w:r>
+        <w:rPr>
+          <w:rtl w:val="0"/>
+        </w:rPr>
+        <w:t xml:space="preserve">Find common ground: “We both want…”, “I agree that…”.</w:t>
+      </w:r>
+    </w:p>
+    <w:p>
+      <w:pPr>
+        <w:pStyle w:val="Heading2"/>
+        <w:numPr>
+          <w:ilvl w:val="0"/>
+          <w:numId w:val="4"/>
+        </w:numPr>
+        <w:ind w:left="720" w:hanging="360"/>
+        <w:rPr>
+          <w:sz w:val="32"/>
+          <w:szCs w:val="32"/>
+        </w:rPr>
+      </w:pPr>
+      <w:bookmarkStart w:colFirst="0" w:colLast="0" w:name="_zheajp4hsm8n" w:id="20"/>
+      <w:bookmarkEnd w:id="20"/>
+      <w:r>
+        <w:rPr>
+          <w:rtl w:val="0"/>
+        </w:rPr>
+        <w:t xml:space="preserve">Acknowledge the other's perspective</w:t>
+      </w:r>
+    </w:p>
+    <w:p>
+      <w:pPr>
+        <w:rPr/>
+      </w:pPr>
+      <w:r>
+        <w:rPr>
+          <w:rtl w:val="0"/>
+        </w:rPr>
+        <w:t xml:space="preserve">Show you have understood: “I understand that you…”, “You're right that…”.</w:t>
+      </w:r>
+    </w:p>
+    <w:p>
+      <w:pPr>
+        <w:pStyle w:val="Heading2"/>
+        <w:numPr>
+          <w:ilvl w:val="0"/>
+          <w:numId w:val="4"/>
+        </w:numPr>
+        <w:ind w:left="720" w:hanging="360"/>
+        <w:rPr>
+          <w:sz w:val="32"/>
+          <w:szCs w:val="32"/>
+        </w:rPr>
+      </w:pPr>
+      <w:bookmarkStart w:colFirst="0" w:colLast="0" w:name="_47i9enf78bla" w:id="21"/>
+      <w:bookmarkEnd w:id="21"/>
+      <w:r>
+        <w:rPr>
+          <w:rtl w:val="0"/>
+        </w:rPr>
+        <w:t xml:space="preserve">Reframe to the positive</w:t>
+      </w:r>
+    </w:p>
+    <w:p>
+      <w:pPr>
+        <w:rPr/>
+      </w:pPr>
+      <w:r>
+        <w:rPr>
+          <w:rtl w:val="0"/>
+        </w:rPr>
+        <w:t xml:space="preserve">Say what you want rather than what you oppose, avoid dismissive language such as “that's wrong” or “no serious person thinks…”.</w:t>
+      </w:r>
+    </w:p>
+    <w:p>
+      <w:pPr>
+        <w:rPr/>
+        <w:sectPr>
+          <w:type w:val="nextPage"/>
+          <w:pgSz w:h="15840" w:w="12240" w:orient="portrait"/>
+          <w:pgMar w:bottom="1440" w:top="1440" w:left="1440" w:right="1440" w:header="720" w:footer="720"/>
+          <w:pgNumType w:start="1"/>
+        </w:sectPr>
+      </w:pPr>
+      <w:r>
+        <w:rPr>
+          <w:rtl w:val="0"/>
+        </w:rPr>
+        <w:t xml:space="preserve">Unreceptive language states opinions flatly, generalizes about the other person, attributes motives, or dismisses them. Listen for both kinds as the witnesses talk about the controversy.</w:t>
+      </w:r>
+    </w:p>
+    <w:p>
+      <w:pPr>
+        <w:pStyle w:val="Title"/>
+        <w:keepNext w:val="0"/>
+        <w:keepLines w:val="0"/>
+        <w:pageBreakBefore w:val="0"/>
+        <w:widowControl w:val="0"/>
+        <w:pBdr>
+          <w:top w:space="0" w:sz="0" w:val="nil"/>
+          <w:left w:space="0" w:sz="0" w:val="nil"/>
+          <w:bottom w:space="0" w:sz="0" w:val="nil"/>
+          <w:right w:space="0" w:sz="0" w:val="nil"/>
+          <w:between w:space="0" w:sz="0" w:val="nil"/>
+        </w:pBdr>
+        <w:shd w:fill="auto" w:val="clear"/>
+        <w:spacing w:after="0" w:before="0" w:line="276" w:lineRule="auto"/>
+        <w:ind w:left="0" w:right="0" w:firstLine="0"/>
+        <w:jc w:val="left"/>
+        <w:rPr/>
+        <w:sectPr>
+          <w:type w:val="nextPage"/>
+          <w:pgSz w:h="15840" w:w="12240" w:orient="portrait"/>
+          <w:pgMar w:bottom="1440" w:top="1440" w:left="1440" w:right="1440" w:header="720" w:footer="720"/>
+          <w:pgNumType w:start="1"/>
+        </w:sectPr>
+      </w:pPr>
+      <w:bookmarkStart w:colFirst="0" w:colLast="0" w:name="_orl4h1gpdhqh" w:id="22"/>
+      <w:bookmarkEnd w:id="22"/>
+      <w:r>
+        <w:rPr>
+          <w:rFonts w:ascii="Garamond" w:cs="Garamond" w:eastAsia="Garamond" w:hAnsi="Garamond"/>
+          <w:b w:val="1"/>
+          <w:bCs w:val="1"/>
+          <w:i w:val="0"/>
+          <w:iCs w:val="0"/>
+          <w:smallCaps w:val="0"/>
+          <w:strike w:val="0"/>
+          <w:color w:val="000000"/>
+          <w:sz w:val="60"/>
+          <w:szCs w:val="60"/>
+          <w:u w:val="none"/>
+          <w:shd w:fill="auto" w:val="clear"/>
+          <w:vertAlign w:val="baseline"/>
+          <w:rtl w:val="0"/>
+        </w:rPr>
+        <w:t xml:space="preserve">Game facts</w:t>
+      </w:r>
+      <w:r>
+        <w:rPr>
+          <w:rtl w:val="0"/>
+        </w:rPr>
+      </w:r>
+    </w:p>
+    <w:p>
+      <w:pPr>
+        <w:pStyle w:val="Heading1"/>
+        <w:rPr/>
+      </w:pPr>
+      <w:bookmarkStart w:colFirst="0" w:colLast="0" w:name="_uynt6v9uhldf" w:id="23"/>
+      <w:bookmarkEnd w:id="23"/>
       <w:r>
         <w:rPr>
           <w:rtl w:val="0"/>
@@ -5044,23 +4474,23 @@
               <w:rPr>
                 <w:rtl w:val="0"/>
               </w:rPr>
-              <w:t xml:space="preserve">1</w:t>
-            </w:r>
-          </w:p>
-        </w:tc>
-        <w:tc>
-          <w:tcPr/>
-          <w:p>
-            <w:pPr>
-              <w:widowControl w:val="0"/>
-              <w:spacing w:before="0" w:line="240" w:lineRule="auto"/>
-              <w:rPr/>
-            </w:pPr>
-            <w:r>
-              <w:rPr>
-                <w:rtl w:val="0"/>
-              </w:rPr>
-              <w:t xml:space="preserve">Players only have one chance</w:t>
+              <w:t xml:space="preserve">3</w:t>
+            </w:r>
+          </w:p>
+        </w:tc>
+        <w:tc>
+          <w:tcPr/>
+          <w:p>
+            <w:pPr>
+              <w:widowControl w:val="0"/>
+              <w:spacing w:before="0" w:line="240" w:lineRule="auto"/>
+              <w:rPr/>
+            </w:pPr>
+            <w:r>
+              <w:rPr>
+                <w:rtl w:val="0"/>
+              </w:rPr>
+              <w:t xml:space="preserve">Players have three chances</w:t>
             </w:r>
           </w:p>
         </w:tc>
@@ -5077,90 +4507,6 @@
                 <w:rtl w:val="0"/>
               </w:rPr>
               <w:t xml:space="preserve">3.1</w:t>
-            </w:r>
-          </w:p>
-        </w:tc>
-      </w:tr>
-      <w:tr>
-        <w:trPr>
-          <w:cantSplit w:val="0"/>
-          <w:tblHeader w:val="0"/>
-        </w:trPr>
-        <w:tc>
-          <w:tcPr/>
-          <w:p>
-            <w:pPr>
-              <w:widowControl w:val="0"/>
-              <w:spacing w:before="0" w:line="240" w:lineRule="auto"/>
-              <w:rPr/>
-            </w:pPr>
-            <w:r>
-              <w:rPr>
-                <w:rtl w:val="0"/>
-              </w:rPr>
-              <w:t xml:space="preserve">followup_bonus</w:t>
-            </w:r>
-          </w:p>
-        </w:tc>
-        <w:tc>
-          <w:tcPr/>
-          <w:p>
-            <w:pPr>
-              <w:widowControl w:val="0"/>
-              <w:spacing w:before="0" w:line="240" w:lineRule="auto"/>
-              <w:rPr/>
-            </w:pPr>
-            <w:r>
-              <w:rPr>
-                <w:rtl w:val="0"/>
-              </w:rPr>
-              <w:t xml:space="preserve">Bonus points per successful follow-up after all Major Clues</w:t>
-            </w:r>
-          </w:p>
-        </w:tc>
-        <w:tc>
-          <w:tcPr/>
-          <w:p>
-            <w:pPr>
-              <w:widowControl w:val="0"/>
-              <w:spacing w:before="0" w:line="240" w:lineRule="auto"/>
-              <w:rPr/>
-            </w:pPr>
-            <w:r>
-              <w:rPr>
-                <w:rtl w:val="0"/>
-              </w:rPr>
-              <w:t xml:space="preserve">1</w:t>
-            </w:r>
-          </w:p>
-        </w:tc>
-        <w:tc>
-          <w:tcPr/>
-          <w:p>
-            <w:pPr>
-              <w:widowControl w:val="0"/>
-              <w:spacing w:before="0" w:line="240" w:lineRule="auto"/>
-              <w:rPr/>
-            </w:pPr>
-            <w:r>
-              <w:rPr>
-                <w:rtl w:val="0"/>
-              </w:rPr>
-            </w:r>
-          </w:p>
-        </w:tc>
-        <w:tc>
-          <w:tcPr/>
-          <w:p>
-            <w:pPr>
-              <w:widowControl w:val="0"/>
-              <w:spacing w:before="0" w:line="240" w:lineRule="auto"/>
-              <w:rPr/>
-            </w:pPr>
-            <w:r>
-              <w:rPr>
-                <w:rtl w:val="0"/>
-              </w:rPr>
             </w:r>
           </w:p>
         </w:tc>
@@ -5352,11 +4698,64 @@
     </w:p>
     <w:p>
       <w:pPr>
+        <w:pStyle w:val="Title"/>
+        <w:keepNext w:val="0"/>
+        <w:keepLines w:val="0"/>
+        <w:pageBreakBefore w:val="0"/>
+        <w:widowControl w:val="0"/>
+        <w:pBdr>
+          <w:top w:space="0" w:sz="0" w:val="nil"/>
+          <w:left w:space="0" w:sz="0" w:val="nil"/>
+          <w:bottom w:space="0" w:sz="0" w:val="nil"/>
+          <w:right w:space="0" w:sz="0" w:val="nil"/>
+          <w:between w:space="0" w:sz="0" w:val="nil"/>
+        </w:pBdr>
+        <w:shd w:fill="auto" w:val="clear"/>
+        <w:spacing w:after="0" w:before="0" w:line="276" w:lineRule="auto"/>
+        <w:ind w:left="0" w:right="0" w:firstLine="0"/>
+        <w:jc w:val="left"/>
+        <w:rPr/>
+        <w:sectPr>
+          <w:type w:val="nextPage"/>
+          <w:pgSz w:h="15840" w:w="12240" w:orient="portrait"/>
+          <w:pgMar w:bottom="1440" w:top="1440" w:left="1440" w:right="1440" w:header="720" w:footer="720"/>
+          <w:pgNumType w:start="1"/>
+        </w:sectPr>
+      </w:pPr>
+      <w:bookmarkStart w:colFirst="0" w:colLast="0" w:name="_7z3gy8tpsl8x" w:id="24"/>
+      <w:bookmarkEnd w:id="24"/>
+      <w:r>
+        <w:rPr>
+          <w:rFonts w:ascii="Garamond" w:cs="Garamond" w:eastAsia="Garamond" w:hAnsi="Garamond"/>
+          <w:b w:val="1"/>
+          <w:bCs w:val="1"/>
+          <w:i w:val="0"/>
+          <w:iCs w:val="0"/>
+          <w:smallCaps w:val="0"/>
+          <w:strike w:val="0"/>
+          <w:color w:val="000000"/>
+          <w:sz w:val="60"/>
+          <w:szCs w:val="60"/>
+          <w:u w:val="none"/>
+          <w:shd w:fill="auto" w:val="clear"/>
+          <w:vertAlign w:val="baseline"/>
+          <w:rtl w:val="0"/>
+        </w:rPr>
+        <w:t xml:space="preserve">Game text</w:t>
+      </w:r>
+      <w:r>
+        <w:rPr>
+          <w:rtl w:val="0"/>
+        </w:rPr>
+      </w:r>
+    </w:p>
+    <w:p>
+      <w:pPr>
         <w:pStyle w:val="Heading1"/>
         <w:rPr/>
       </w:pPr>
-      <w:bookmarkStart w:colFirst="0" w:colLast="0" w:name="_f5xcdpggf68j" w:id="19"/>
-      <w:bookmarkEnd w:id="19"/>
+      <w:bookmarkStart w:colFirst="0" w:colLast="0" w:name="_f5xcdpggf68j" w:id="25"/>
+      <w:bookmarkEnd w:id="25"/>
       <w:r>
         <w:rPr>
           <w:rtl w:val="0"/>
@@ -5860,7 +5259,7 @@
               <w:rPr>
                 <w:rtl w:val="0"/>
               </w:rPr>
-              <w:t xml:space="preserve">You already hold every Major Clue, so {name} has nothing new to add, but the question lands well. Bonus: +{bonus}.</w:t>
+              <w:t xml:space="preserve">You already hold every Major Clue, so {name} has nothing new to add, but the question lands well.</w:t>
             </w:r>
           </w:p>
         </w:tc>
@@ -5968,7 +5367,7 @@
               <w:rPr>
                 <w:rtl w:val="0"/>
               </w:rPr>
-              <w:t xml:space="preserve">submit.once</w:t>
+              <w:t xml:space="preserve">submit.tries</w:t>
             </w:r>
           </w:p>
         </w:tc>
@@ -6000,22 +5399,23 @@
               <w:rPr>
                 <w:rtl w:val="0"/>
               </w:rPr>
-              <w:t xml:space="preserve">You can submit only once. Check your Evidence board first.</w:t>
-            </w:r>
-          </w:p>
-        </w:tc>
-        <w:tc>
-          <w:tcPr/>
-          <w:p>
-            <w:pPr>
-              <w:widowControl w:val="0"/>
-              <w:spacing w:before="0" w:line="240" w:lineRule="auto"/>
-              <w:rPr/>
-            </w:pPr>
-            <w:r>
-              <w:rPr>
-                <w:rtl w:val="0"/>
-              </w:rPr>
+              <w:t xml:space="preserve">You have {left} tries left of {total} tries.  Check your Evidence board first.</w:t>
+            </w:r>
+          </w:p>
+        </w:tc>
+        <w:tc>
+          <w:tcPr/>
+          <w:p>
+            <w:pPr>
+              <w:widowControl w:val="0"/>
+              <w:spacing w:before="0" w:line="240" w:lineRule="auto"/>
+              <w:rPr/>
+            </w:pPr>
+            <w:r>
+              <w:rPr>
+                <w:rtl w:val="0"/>
+              </w:rPr>
+              <w:t xml:space="preserve">left total</w:t>
             </w:r>
           </w:p>
         </w:tc>
@@ -6110,14 +5510,73 @@
 </w:document>
 </file>
 
+<file path=word/comments.xml><?xml version="1.0" encoding="utf-8"?>
+<w:comments xmlns:mc="http://schemas.openxmlformats.org/markup-compatibility/2006" xmlns:o="urn:schemas-microsoft-com:office:office" xmlns:r="http://schemas.openxmlformats.org/officeDocument/2006/relationships" xmlns:m="http://schemas.openxmlformats.org/officeDocument/2006/math" xmlns:v="urn:schemas-microsoft-com:vml" xmlns:wp="http://schemas.openxmlformats.org/drawingml/2006/wordprocessingDrawing" xmlns:w10="urn:schemas-microsoft-com:office:word" xmlns:w="http://schemas.openxmlformats.org/wordprocessingml/2006/main" xmlns:wne="http://schemas.microsoft.com/office/word/2006/wordml" xmlns:sl="http://schemas.openxmlformats.org/schemaLibrary/2006/main" xmlns:a="http://schemas.openxmlformats.org/drawingml/2006/main" xmlns:pic="http://schemas.openxmlformats.org/drawingml/2006/picture" xmlns:c="http://schemas.openxmlformats.org/drawingml/2006/chart" xmlns:lc="http://schemas.openxmlformats.org/drawingml/2006/lockedCanvas" xmlns:dgm="http://schemas.openxmlformats.org/drawingml/2006/diagram" xmlns:wps="http://schemas.microsoft.com/office/word/2010/wordprocessingShape" xmlns:wpg="http://schemas.microsoft.com/office/word/2010/wordprocessingGroup" xmlns:w14="http://schemas.microsoft.com/office/word/2010/wordml" xmlns:w15="http://schemas.microsoft.com/office/word/2012/wordml" xmlns:w16="http://schemas.microsoft.com/office/word/2018/wordml" xmlns:w16cex="http://schemas.microsoft.com/office/word/2018/wordml/cex" xmlns:w16cid="http://schemas.microsoft.com/office/word/2016/wordml/cid" xmlns="http://schemas.microsoft.com/office/tasks/2019/documenttasks" xmlns:cr="http://schemas.microsoft.com/office/comments/2020/reactions">
+  <w:comment w:author="Tomer Perry" w:id="0" w:date="2026-09-24T04:42:29Z">
+    <w:p>
+      <w:pPr>
+        <w:keepNext w:val="0"/>
+        <w:keepLines w:val="0"/>
+        <w:pageBreakBefore w:val="0"/>
+        <w:widowControl w:val="0"/>
+        <w:pBdr>
+          <w:top w:space="0" w:sz="0" w:val="nil"/>
+          <w:left w:space="0" w:sz="0" w:val="nil"/>
+          <w:bottom w:space="0" w:sz="0" w:val="nil"/>
+          <w:right w:space="0" w:sz="0" w:val="nil"/>
+          <w:between w:space="0" w:sz="0" w:val="nil"/>
+        </w:pBdr>
+        <w:shd w:fill="auto" w:val="clear"/>
+        <w:spacing w:after="0" w:before="0" w:line="240" w:lineRule="auto"/>
+        <w:ind w:left="0" w:right="0" w:firstLine="0"/>
+        <w:jc w:val="left"/>
+        <w:rPr>
+          <w:rFonts w:ascii="Arial" w:cs="Arial" w:eastAsia="Arial" w:hAnsi="Arial"/>
+          <w:b w:val="0"/>
+          <w:bCs w:val="0"/>
+          <w:i w:val="0"/>
+          <w:iCs w:val="0"/>
+          <w:smallCaps w:val="0"/>
+          <w:strike w:val="0"/>
+          <w:color w:val="000000"/>
+          <w:sz w:val="22"/>
+          <w:szCs w:val="22"/>
+          <w:u w:val="none"/>
+          <w:shd w:fill="auto" w:val="clear"/>
+          <w:vertAlign w:val="baseline"/>
+        </w:rPr>
+      </w:pPr>
+      <w:r>
+        <w:rPr>
+          <w:rFonts w:ascii="Arial" w:cs="Arial" w:eastAsia="Arial" w:hAnsi="Arial"/>
+          <w:b w:val="0"/>
+          <w:bCs w:val="0"/>
+          <w:i w:val="0"/>
+          <w:iCs w:val="0"/>
+          <w:smallCaps w:val="0"/>
+          <w:strike w:val="0"/>
+          <w:color w:val="000000"/>
+          <w:sz w:val="22"/>
+          <w:szCs w:val="22"/>
+          <w:u w:val="none"/>
+          <w:shd w:fill="auto" w:val="clear"/>
+          <w:vertAlign w:val="baseline"/>
+          <w:rtl w:val="0"/>
+        </w:rPr>
+        <w:t xml:space="preserve">not finished</w:t>
+      </w:r>
+    </w:p>
+  </w:comment>
+</w:comments>
+</file>
+
 <file path=word/footnotes.xml><?xml version="1.0" encoding="utf-8"?>
 <w:footnotes xmlns:mc="http://schemas.openxmlformats.org/markup-compatibility/2006" xmlns:o="urn:schemas-microsoft-com:office:office" xmlns:r="http://schemas.openxmlformats.org/officeDocument/2006/relationships" xmlns:m="http://schemas.openxmlformats.org/officeDocument/2006/math" xmlns:v="urn:schemas-microsoft-com:vml" xmlns:wp="http://schemas.openxmlformats.org/drawingml/2006/wordprocessingDrawing" xmlns:w10="urn:schemas-microsoft-com:office:word" xmlns:w="http://schemas.openxmlformats.org/wordprocessingml/2006/main" xmlns:wne="http://schemas.microsoft.com/office/word/2006/wordml" xmlns:sl="http://schemas.openxmlformats.org/schemaLibrary/2006/main" xmlns:a="http://schemas.openxmlformats.org/drawingml/2006/main" xmlns:pic="http://schemas.openxmlformats.org/drawingml/2006/picture" xmlns:c="http://schemas.openxmlformats.org/drawingml/2006/chart" xmlns:lc="http://schemas.openxmlformats.org/drawingml/2006/lockedCanvas" xmlns:dgm="http://schemas.openxmlformats.org/drawingml/2006/diagram" xmlns:wps="http://schemas.microsoft.com/office/word/2010/wordprocessingShape" xmlns:wpg="http://schemas.microsoft.com/office/word/2010/wordprocessingGroup" xmlns:w14="http://schemas.microsoft.com/office/word/2010/wordml" xmlns:w15="http://schemas.microsoft.com/office/word/2012/wordml" xmlns:w16="http://schemas.microsoft.com/office/word/2018/wordml" xmlns:w16cex="http://schemas.microsoft.com/office/word/2018/wordml/cex" xmlns:w16cid="http://schemas.microsoft.com/office/word/2016/wordml/cid" xmlns="http://schemas.microsoft.com/office/tasks/2019/documenttasks" xmlns:cr="http://schemas.microsoft.com/office/comments/2020/reactions">
   <w:footnote w:id="0">
     <w:p>
       <w:pPr>
-        <w:spacing w:line="240" w:lineRule="auto"/>
-        <w:rPr>
-          <w:rFonts w:ascii="Garamond" w:cs="Garamond" w:eastAsia="Garamond" w:hAnsi="Garamond"/>
+        <w:spacing w:before="0" w:line="240" w:lineRule="auto"/>
+        <w:rPr>
           <w:sz w:val="20"/>
           <w:szCs w:val="20"/>
         </w:rPr>
@@ -6131,7 +5590,6 @@
       </w:r>
       <w:r>
         <w:rPr>
-          <w:rFonts w:ascii="Garamond" w:cs="Garamond" w:eastAsia="Garamond" w:hAnsi="Garamond"/>
           <w:sz w:val="20"/>
           <w:szCs w:val="20"/>
           <w:rtl w:val="0"/>
@@ -6140,7 +5598,6 @@
       </w:r>
       <w:r>
         <w:rPr>
-          <w:rFonts w:ascii="Garamond" w:cs="Garamond" w:eastAsia="Garamond" w:hAnsi="Garamond"/>
           <w:i w:val="1"/>
           <w:iCs w:val="1"/>
           <w:sz w:val="20"/>
@@ -6151,7 +5608,6 @@
       </w:r>
       <w:r>
         <w:rPr>
-          <w:rFonts w:ascii="Garamond" w:cs="Garamond" w:eastAsia="Garamond" w:hAnsi="Garamond"/>
           <w:sz w:val="20"/>
           <w:szCs w:val="20"/>
           <w:rtl w:val="0"/>
@@ -6161,7 +5617,6 @@
       <w:hyperlink r:id="rId1">
         <w:r>
           <w:rPr>
-            <w:rFonts w:ascii="Garamond" w:cs="Garamond" w:eastAsia="Garamond" w:hAnsi="Garamond"/>
             <w:color w:val="1155cc"/>
             <w:sz w:val="20"/>
             <w:szCs w:val="20"/>
@@ -6179,9 +5634,8 @@
     </w:p>
     <w:p>
       <w:pPr>
-        <w:spacing w:line="240" w:lineRule="auto"/>
-        <w:rPr>
-          <w:rFonts w:ascii="Garamond" w:cs="Garamond" w:eastAsia="Garamond" w:hAnsi="Garamond"/>
+        <w:spacing w:before="0" w:line="240" w:lineRule="auto"/>
+        <w:rPr>
           <w:sz w:val="20"/>
           <w:szCs w:val="20"/>
         </w:rPr>
@@ -6196,9 +5650,8 @@
   <w:footnote w:id="1">
     <w:p>
       <w:pPr>
-        <w:spacing w:line="240" w:lineRule="auto"/>
-        <w:rPr>
-          <w:rFonts w:ascii="Garamond" w:cs="Garamond" w:eastAsia="Garamond" w:hAnsi="Garamond"/>
+        <w:spacing w:before="0" w:line="240" w:lineRule="auto"/>
+        <w:rPr>
           <w:sz w:val="20"/>
           <w:szCs w:val="20"/>
         </w:rPr>
@@ -6212,7 +5665,6 @@
       </w:r>
       <w:r>
         <w:rPr>
-          <w:rFonts w:ascii="Garamond" w:cs="Garamond" w:eastAsia="Garamond" w:hAnsi="Garamond"/>
           <w:sz w:val="20"/>
           <w:szCs w:val="20"/>
           <w:rtl w:val="0"/>
@@ -6221,7 +5673,6 @@
       </w:r>
       <w:r>
         <w:rPr>
-          <w:rFonts w:ascii="Garamond" w:cs="Garamond" w:eastAsia="Garamond" w:hAnsi="Garamond"/>
           <w:i w:val="1"/>
           <w:iCs w:val="1"/>
           <w:sz w:val="20"/>
@@ -6232,7 +5683,6 @@
       </w:r>
       <w:r>
         <w:rPr>
-          <w:rFonts w:ascii="Garamond" w:cs="Garamond" w:eastAsia="Garamond" w:hAnsi="Garamond"/>
           <w:sz w:val="20"/>
           <w:szCs w:val="20"/>
           <w:rtl w:val="0"/>
@@ -6244,9 +5694,8 @@
   <w:footnote w:id="2">
     <w:p>
       <w:pPr>
-        <w:spacing w:line="240" w:lineRule="auto"/>
-        <w:rPr>
-          <w:rFonts w:ascii="Garamond" w:cs="Garamond" w:eastAsia="Garamond" w:hAnsi="Garamond"/>
+        <w:spacing w:before="0" w:line="240" w:lineRule="auto"/>
+        <w:rPr>
           <w:sz w:val="20"/>
           <w:szCs w:val="20"/>
         </w:rPr>
@@ -6260,7 +5709,6 @@
       </w:r>
       <w:r>
         <w:rPr>
-          <w:rFonts w:ascii="Garamond" w:cs="Garamond" w:eastAsia="Garamond" w:hAnsi="Garamond"/>
           <w:sz w:val="20"/>
           <w:szCs w:val="20"/>
           <w:rtl w:val="0"/>
@@ -6272,9 +5720,8 @@
   <w:footnote w:id="3">
     <w:p>
       <w:pPr>
-        <w:spacing w:line="240" w:lineRule="auto"/>
-        <w:rPr>
-          <w:rFonts w:ascii="Garamond" w:cs="Garamond" w:eastAsia="Garamond" w:hAnsi="Garamond"/>
+        <w:spacing w:before="0" w:line="240" w:lineRule="auto"/>
+        <w:rPr>
           <w:sz w:val="20"/>
           <w:szCs w:val="20"/>
         </w:rPr>
@@ -6288,7 +5735,6 @@
       </w:r>
       <w:r>
         <w:rPr>
-          <w:rFonts w:ascii="Garamond" w:cs="Garamond" w:eastAsia="Garamond" w:hAnsi="Garamond"/>
           <w:sz w:val="20"/>
           <w:szCs w:val="20"/>
           <w:rtl w:val="0"/>
@@ -6300,9 +5746,8 @@
   <w:footnote w:id="4">
     <w:p>
       <w:pPr>
-        <w:spacing w:line="240" w:lineRule="auto"/>
-        <w:rPr>
-          <w:rFonts w:ascii="Garamond" w:cs="Garamond" w:eastAsia="Garamond" w:hAnsi="Garamond"/>
+        <w:spacing w:before="0" w:line="240" w:lineRule="auto"/>
+        <w:rPr>
           <w:sz w:val="20"/>
           <w:szCs w:val="20"/>
         </w:rPr>
@@ -6316,7 +5761,6 @@
       </w:r>
       <w:r>
         <w:rPr>
-          <w:rFonts w:ascii="Garamond" w:cs="Garamond" w:eastAsia="Garamond" w:hAnsi="Garamond"/>
           <w:sz w:val="20"/>
           <w:szCs w:val="20"/>
           <w:rtl w:val="0"/>

</xml_diff>

<commit_message>
Rebuild from the Google files: Rules typo fixed
The framework Doc's last rule now says "HEAR Framework Guide".

Co-Authored-By: Claude Opus 5.5 <noreply@anthropic.com>
Claude-Session: https://claude.ai/code/session_01J8R4SET6LminzKA26BGVqh
</commit_message>
<xml_diff>
--- a/engine/HEARsay mysteries.docx
+++ b/engine/HEARsay mysteries.docx
@@ -42,7 +42,7 @@
           <w:pgNumType w:start="1"/>
         </w:sectPr>
       </w:pPr>
-      <w:bookmarkStart w:colFirst="0" w:colLast="0" w:name="_tkhbnfaoszso" w:id="0"/>
+      <w:bookmarkStart w:colFirst="0" w:colLast="0" w:name="_lrgs67nci5t9" w:id="0"/>
       <w:bookmarkEnd w:id="0"/>
       <w:r>
         <w:rPr>
@@ -129,12 +129,12 @@
               <wp:inline distB="114300" distT="114300" distL="114300" distR="114300">
                 <wp:extent cx="6510258" cy="892601"/>
                 <wp:effectExtent b="0" l="0" r="0" t="0"/>
-                <wp:docPr id="1" name=""/>
+                <wp:docPr id="2" name=""/>
                 <a:graphic>
                   <a:graphicData uri="http://schemas.microsoft.com/office/word/2010/wordprocessingShape">
                     <wps:wsp>
                       <wps:cNvSpPr txBox="1"/>
-                      <wps:cNvPr id="2" name="Shape 2"/>
+                      <wps:cNvPr id="3" name="Shape 3"/>
                       <wps:spPr>
                         <a:xfrm>
                           <a:off x="0" y="872975"/>
@@ -241,12 +241,12 @@
               <wp:inline distB="114300" distT="114300" distL="114300" distR="114300">
                 <wp:extent cx="6510258" cy="892601"/>
                 <wp:effectExtent b="0" l="0" r="0" t="0"/>
-                <wp:docPr id="1" name="image1.png"/>
+                <wp:docPr id="2" name="image2.png"/>
                 <a:graphic>
                   <a:graphicData uri="http://schemas.openxmlformats.org/drawingml/2006/picture">
                     <pic:pic>
                       <pic:nvPicPr>
-                        <pic:cNvPr id="0" name="image1.png"/>
+                        <pic:cNvPr id="0" name="image2.png"/>
                         <pic:cNvPicPr preferRelativeResize="0"/>
                       </pic:nvPicPr>
                       <pic:blipFill>
@@ -290,12 +290,12 @@
               <wp:inline distB="114300" distT="114300" distL="114300" distR="114300">
                 <wp:extent cx="6505575" cy="1114744"/>
                 <wp:effectExtent b="0" l="0" r="0" t="0"/>
-                <wp:docPr id="2" name=""/>
+                <wp:docPr id="1" name=""/>
                 <a:graphic>
                   <a:graphicData uri="http://schemas.microsoft.com/office/word/2010/wordprocessingShape">
                     <wps:wsp>
                       <wps:cNvSpPr txBox="1"/>
-                      <wps:cNvPr id="3" name="Shape 3"/>
+                      <wps:cNvPr id="2" name="Shape 2"/>
                       <wps:spPr>
                         <a:xfrm>
                           <a:off x="262200" y="791775"/>
@@ -435,12 +435,12 @@
               <wp:inline distB="114300" distT="114300" distL="114300" distR="114300">
                 <wp:extent cx="6505575" cy="1114744"/>
                 <wp:effectExtent b="0" l="0" r="0" t="0"/>
-                <wp:docPr id="2" name="image2.png"/>
+                <wp:docPr id="1" name="image1.png"/>
                 <a:graphic>
                   <a:graphicData uri="http://schemas.openxmlformats.org/drawingml/2006/picture">
                     <pic:pic>
                       <pic:nvPicPr>
-                        <pic:cNvPr id="0" name="image2.png"/>
+                        <pic:cNvPr id="0" name="image1.png"/>
                         <pic:cNvPicPr preferRelativeResize="0"/>
                       </pic:nvPicPr>
                       <pic:blipFill>
@@ -2153,7 +2153,7 @@
           <w:pgNumType w:start="1"/>
         </w:sectPr>
       </w:pPr>
-      <w:bookmarkStart w:colFirst="0" w:colLast="0" w:name="_ed1r6eb5gp8x" w:id="13"/>
+      <w:bookmarkStart w:colFirst="0" w:colLast="0" w:name="_beprxthnny83" w:id="13"/>
       <w:bookmarkEnd w:id="13"/>
       <w:r>
         <w:rPr>
@@ -2530,7 +2530,7 @@
           <w:pgNumType w:start="1"/>
         </w:sectPr>
       </w:pPr>
-      <w:bookmarkStart w:colFirst="0" w:colLast="0" w:name="_fcvyjb2dti1d" w:id="14"/>
+      <w:bookmarkStart w:colFirst="0" w:colLast="0" w:name="_wdglitb4awhi" w:id="14"/>
       <w:bookmarkEnd w:id="14"/>
       <w:r>
         <w:rPr>
@@ -2720,7 +2720,7 @@
         <w:rPr>
           <w:rtl w:val="0"/>
         </w:rPr>
-        <w:t xml:space="preserve">The Evidence board keeps everything you have learned. The HEAR Framework uide and these rules are always in the sidebar.</w:t>
+        <w:t xml:space="preserve">The Evidence board keeps everything you have learned. The HEAR Framework Guide and these rules are always in the sidebar.</w:t>
       </w:r>
     </w:p>
     <w:p>
@@ -2749,7 +2749,7 @@
           <w:pgNumType w:start="1"/>
         </w:sectPr>
       </w:pPr>
-      <w:bookmarkStart w:colFirst="0" w:colLast="0" w:name="_6krtdbv554k" w:id="16"/>
+      <w:bookmarkStart w:colFirst="0" w:colLast="0" w:name="_cnh63t8cd20" w:id="16"/>
       <w:bookmarkEnd w:id="16"/>
       <w:r>
         <w:rPr>
@@ -2976,7 +2976,7 @@
           <w:pgNumType w:start="1"/>
         </w:sectPr>
       </w:pPr>
-      <w:bookmarkStart w:colFirst="0" w:colLast="0" w:name="_orl4h1gpdhqh" w:id="22"/>
+      <w:bookmarkStart w:colFirst="0" w:colLast="0" w:name="_4mnllqgz1a5s" w:id="22"/>
       <w:bookmarkEnd w:id="22"/>
       <w:r>
         <w:rPr>
@@ -4722,7 +4722,7 @@
           <w:pgNumType w:start="1"/>
         </w:sectPr>
       </w:pPr>
-      <w:bookmarkStart w:colFirst="0" w:colLast="0" w:name="_7z3gy8tpsl8x" w:id="24"/>
+      <w:bookmarkStart w:colFirst="0" w:colLast="0" w:name="_pp5cy3ohxtnz" w:id="24"/>
       <w:bookmarkEnd w:id="24"/>
       <w:r>
         <w:rPr>

</xml_diff>

<commit_message>
Put the Map's buttons above the campus map; rebuild after merging main
The Evidence board and Solve the case buttons now sit right under the
witness cards, with the map below them. Rebuilt from fresh downloads:
the framework Doc's copy (new tab headings only) and the packet's copy
are updated; neither changes the game.

Co-Authored-By: Claude Opus 5.5 <noreply@anthropic.com>
Claude-Session: https://claude.ai/code/session_01TQmKVXG9NykhhpW7tHoDb5
</commit_message>
<xml_diff>
--- a/engine/HEARsay mysteries.docx
+++ b/engine/HEARsay mysteries.docx
@@ -6,42 +6,93 @@
     <w:p>
       <w:pPr>
         <w:pStyle w:val="Title"/>
-        <w:spacing w:after="60" w:before="200" w:line="276" w:lineRule="auto"/>
-        <w:jc w:val="center"/>
+        <w:keepNext w:val="0"/>
+        <w:keepLines w:val="0"/>
+        <w:pageBreakBefore w:val="0"/>
+        <w:widowControl w:val="0"/>
+        <w:pBdr>
+          <w:top w:space="0" w:sz="0" w:val="nil"/>
+          <w:left w:space="0" w:sz="0" w:val="nil"/>
+          <w:bottom w:space="0" w:sz="0" w:val="nil"/>
+          <w:right w:space="0" w:sz="0" w:val="nil"/>
+          <w:between w:space="0" w:sz="0" w:val="nil"/>
+        </w:pBdr>
+        <w:shd w:fill="auto" w:val="clear"/>
+        <w:spacing w:after="0" w:before="0" w:line="276" w:lineRule="auto"/>
+        <w:ind w:left="0" w:right="0" w:firstLine="0"/>
+        <w:jc w:val="left"/>
+        <w:rPr>
+          <w:rFonts w:ascii="Arial" w:cs="Arial" w:eastAsia="Arial" w:hAnsi="Arial"/>
+          <w:b w:val="0"/>
+          <w:bCs w:val="0"/>
+          <w:i w:val="0"/>
+          <w:iCs w:val="0"/>
+          <w:smallCaps w:val="0"/>
+          <w:strike w:val="0"/>
+          <w:color w:val="000000"/>
+          <w:sz w:val="22"/>
+          <w:szCs w:val="22"/>
+          <w:u w:val="none"/>
+          <w:shd w:fill="auto" w:val="clear"/>
+          <w:vertAlign w:val="baseline"/>
+        </w:rPr>
+        <w:sectPr>
+          <w:pgSz w:h="15840" w:w="12240" w:orient="portrait"/>
+          <w:pgMar w:bottom="1440" w:top="1440" w:left="1440" w:right="1440" w:header="720" w:footer="720"/>
+          <w:pgNumType w:start="1"/>
+        </w:sectPr>
+      </w:pPr>
+      <w:bookmarkStart w:colFirst="0" w:colLast="0" w:name="_rkh63jnbmo1x" w:id="0"/>
+      <w:bookmarkEnd w:id="0"/>
+      <w:r>
         <w:rPr>
           <w:rFonts w:ascii="Garamond" w:cs="Garamond" w:eastAsia="Garamond" w:hAnsi="Garamond"/>
+          <w:b w:val="1"/>
+          <w:bCs w:val="1"/>
+          <w:i w:val="0"/>
+          <w:iCs w:val="0"/>
+          <w:smallCaps w:val="0"/>
+          <w:strike w:val="0"/>
+          <w:color w:val="000000"/>
           <w:sz w:val="60"/>
           <w:szCs w:val="60"/>
-        </w:rPr>
-      </w:pPr>
-      <w:bookmarkStart w:colFirst="0" w:colLast="0" w:name="_ik0ajinzayw4" w:id="0"/>
-      <w:bookmarkEnd w:id="0"/>
-      <w:r>
-        <w:rPr>
-          <w:rFonts w:ascii="Garamond" w:cs="Garamond" w:eastAsia="Garamond" w:hAnsi="Garamond"/>
-          <w:sz w:val="60"/>
-          <w:szCs w:val="60"/>
+          <w:u w:val="none"/>
+          <w:shd w:fill="auto" w:val="clear"/>
+          <w:vertAlign w:val="baseline"/>
           <w:rtl w:val="0"/>
         </w:rPr>
         <w:t xml:space="preserve">HEARsay Mysteries</w:t>
       </w:r>
+      <w:r>
+        <w:rPr>
+          <w:rtl w:val="0"/>
+        </w:rPr>
+      </w:r>
+    </w:p>
+    <w:p>
+      <w:pPr>
+        <w:pStyle w:val="Title"/>
+        <w:jc w:val="center"/>
+        <w:rPr/>
+      </w:pPr>
+      <w:bookmarkStart w:colFirst="0" w:colLast="0" w:name="_ik0ajinzayw4" w:id="1"/>
+      <w:bookmarkEnd w:id="1"/>
+      <w:r>
+        <w:rPr>
+          <w:rtl w:val="0"/>
+        </w:rPr>
+        <w:t xml:space="preserve">HEARsay Mysteries</w:t>
+      </w:r>
     </w:p>
     <w:p>
       <w:pPr>
         <w:pStyle w:val="Subtitle"/>
-        <w:spacing w:after="320" w:before="200" w:line="276" w:lineRule="auto"/>
-        <w:jc w:val="center"/>
-        <w:rPr>
-          <w:sz w:val="22"/>
-          <w:szCs w:val="22"/>
-        </w:rPr>
-      </w:pPr>
-      <w:bookmarkStart w:colFirst="0" w:colLast="0" w:name="_rjfdtmwzzd07" w:id="1"/>
-      <w:bookmarkEnd w:id="1"/>
-      <w:r>
-        <w:rPr>
-          <w:sz w:val="22"/>
-          <w:szCs w:val="22"/>
+        <w:rPr/>
+      </w:pPr>
+      <w:bookmarkStart w:colFirst="0" w:colLast="0" w:name="_rjfdtmwzzd07" w:id="2"/>
+      <w:bookmarkEnd w:id="2"/>
+      <w:r>
+        <w:rPr>
           <w:rtl w:val="0"/>
         </w:rPr>
         <w:t xml:space="preserve">A mystery game framework for teaching and practicing the HEAR framework</w:t>
@@ -50,15 +101,13 @@
     <w:p>
       <w:pPr>
         <w:pStyle w:val="Subtitle"/>
-        <w:spacing w:after="320" w:before="200" w:line="276" w:lineRule="auto"/>
-        <w:jc w:val="center"/>
         <w:rPr>
           <w:sz w:val="20"/>
           <w:szCs w:val="20"/>
         </w:rPr>
       </w:pPr>
-      <w:bookmarkStart w:colFirst="0" w:colLast="0" w:name="_dhe0haaxgpbf" w:id="2"/>
-      <w:bookmarkEnd w:id="2"/>
+      <w:bookmarkStart w:colFirst="0" w:colLast="0" w:name="_dhe0haaxgpbf" w:id="3"/>
+      <w:bookmarkEnd w:id="3"/>
       <w:r>
         <w:rPr>
           <w:sz w:val="20"/>
@@ -70,31 +119,22 @@
     </w:p>
     <w:p>
       <w:pPr>
-        <w:spacing w:before="200" w:line="276" w:lineRule="auto"/>
-        <w:rPr>
-          <w:rFonts w:ascii="Garamond" w:cs="Garamond" w:eastAsia="Garamond" w:hAnsi="Garamond"/>
-          <w:sz w:val="24"/>
-          <w:szCs w:val="24"/>
-        </w:rPr>
-      </w:pPr>
-      <w:r>
-        <w:rPr>
-          <w:rFonts w:ascii="Garamond" w:cs="Garamond" w:eastAsia="Garamond" w:hAnsi="Garamond"/>
-          <w:sz w:val="24"/>
-          <w:szCs w:val="24"/>
-        </w:rPr>
+        <w:rPr/>
+      </w:pPr>
+      <w:r>
+        <w:rPr/>
         <mc:AlternateContent>
           <mc:Choice Requires="wpg">
             <w:drawing>
               <wp:inline distB="114300" distT="114300" distL="114300" distR="114300">
                 <wp:extent cx="6510258" cy="892601"/>
                 <wp:effectExtent b="0" l="0" r="0" t="0"/>
-                <wp:docPr id="2" name=""/>
+                <wp:docPr id="1" name=""/>
                 <a:graphic>
                   <a:graphicData uri="http://schemas.microsoft.com/office/word/2010/wordprocessingShape">
                     <wps:wsp>
                       <wps:cNvSpPr txBox="1"/>
-                      <wps:cNvPr id="3" name="Shape 3"/>
+                      <wps:cNvPr id="2" name="Shape 2"/>
                       <wps:spPr>
                         <a:xfrm>
                           <a:off x="0" y="872975"/>
@@ -201,12 +241,12 @@
               <wp:inline distB="114300" distT="114300" distL="114300" distR="114300">
                 <wp:extent cx="6510258" cy="892601"/>
                 <wp:effectExtent b="0" l="0" r="0" t="0"/>
-                <wp:docPr id="2" name="image2.png"/>
+                <wp:docPr id="1" name="image1.png"/>
                 <a:graphic>
                   <a:graphicData uri="http://schemas.openxmlformats.org/drawingml/2006/picture">
                     <pic:pic>
                       <pic:nvPicPr>
-                        <pic:cNvPr id="0" name="image2.png"/>
+                        <pic:cNvPr id="0" name="image1.png"/>
                         <pic:cNvPicPr preferRelativeResize="0"/>
                       </pic:nvPicPr>
                       <pic:blipFill>
@@ -240,31 +280,22 @@
     </w:p>
     <w:p>
       <w:pPr>
-        <w:spacing w:before="200" w:line="276" w:lineRule="auto"/>
-        <w:rPr>
-          <w:rFonts w:ascii="Garamond" w:cs="Garamond" w:eastAsia="Garamond" w:hAnsi="Garamond"/>
-          <w:sz w:val="24"/>
-          <w:szCs w:val="24"/>
-        </w:rPr>
-      </w:pPr>
-      <w:r>
-        <w:rPr>
-          <w:rFonts w:ascii="Garamond" w:cs="Garamond" w:eastAsia="Garamond" w:hAnsi="Garamond"/>
-          <w:sz w:val="24"/>
-          <w:szCs w:val="24"/>
-        </w:rPr>
+        <w:rPr/>
+      </w:pPr>
+      <w:r>
+        <w:rPr/>
         <mc:AlternateContent>
           <mc:Choice Requires="wpg">
             <w:drawing>
               <wp:inline distB="114300" distT="114300" distL="114300" distR="114300">
                 <wp:extent cx="6505575" cy="1114744"/>
                 <wp:effectExtent b="0" l="0" r="0" t="0"/>
-                <wp:docPr id="1" name=""/>
+                <wp:docPr id="2" name=""/>
                 <a:graphic>
                   <a:graphicData uri="http://schemas.microsoft.com/office/word/2010/wordprocessingShape">
                     <wps:wsp>
                       <wps:cNvSpPr txBox="1"/>
-                      <wps:cNvPr id="2" name="Shape 2"/>
+                      <wps:cNvPr id="3" name="Shape 3"/>
                       <wps:spPr>
                         <a:xfrm>
                           <a:off x="262200" y="791775"/>
@@ -404,12 +435,12 @@
               <wp:inline distB="114300" distT="114300" distL="114300" distR="114300">
                 <wp:extent cx="6505575" cy="1114744"/>
                 <wp:effectExtent b="0" l="0" r="0" t="0"/>
-                <wp:docPr id="1" name="image1.png"/>
+                <wp:docPr id="2" name="image2.png"/>
                 <a:graphic>
                   <a:graphicData uri="http://schemas.openxmlformats.org/drawingml/2006/picture">
                     <pic:pic>
                       <pic:nvPicPr>
-                        <pic:cNvPr id="0" name="image1.png"/>
+                        <pic:cNvPr id="0" name="image2.png"/>
                         <pic:cNvPicPr preferRelativeResize="0"/>
                       </pic:nvPicPr>
                       <pic:blipFill>
@@ -444,24 +475,12 @@
     <w:p>
       <w:pPr>
         <w:pStyle w:val="Heading1"/>
-        <w:spacing w:before="400" w:line="276" w:lineRule="auto"/>
-        <w:rPr>
-          <w:rFonts w:ascii="Garamond" w:cs="Garamond" w:eastAsia="Garamond" w:hAnsi="Garamond"/>
-          <w:b w:val="0"/>
-          <w:bCs w:val="0"/>
-          <w:sz w:val="40"/>
-          <w:szCs w:val="40"/>
-        </w:rPr>
-      </w:pPr>
-      <w:bookmarkStart w:colFirst="0" w:colLast="0" w:name="_91ezqgojjt8o" w:id="3"/>
-      <w:bookmarkEnd w:id="3"/>
-      <w:r>
-        <w:rPr>
-          <w:rFonts w:ascii="Garamond" w:cs="Garamond" w:eastAsia="Garamond" w:hAnsi="Garamond"/>
-          <w:b w:val="0"/>
-          <w:bCs w:val="0"/>
-          <w:sz w:val="40"/>
-          <w:szCs w:val="40"/>
+        <w:rPr/>
+      </w:pPr>
+      <w:bookmarkStart w:colFirst="0" w:colLast="0" w:name="_91ezqgojjt8o" w:id="4"/>
+      <w:bookmarkEnd w:id="4"/>
+      <w:r>
+        <w:rPr>
           <w:rtl w:val="0"/>
         </w:rPr>
         <w:t xml:space="preserve">1. What is a HEARsay mystery? </w:t>
@@ -474,67 +493,44 @@
     </w:p>
     <w:p>
       <w:pPr>
-        <w:spacing w:before="200" w:line="276" w:lineRule="auto"/>
-        <w:rPr>
-          <w:rFonts w:ascii="Garamond" w:cs="Garamond" w:eastAsia="Garamond" w:hAnsi="Garamond"/>
-          <w:sz w:val="24"/>
-          <w:szCs w:val="24"/>
-        </w:rPr>
-      </w:pPr>
-      <w:r>
-        <w:rPr>
-          <w:rFonts w:ascii="Garamond" w:cs="Garamond" w:eastAsia="Garamond" w:hAnsi="Garamond"/>
-          <w:sz w:val="24"/>
-          <w:szCs w:val="24"/>
+        <w:rPr/>
+      </w:pPr>
+      <w:r>
+        <w:rPr>
           <w:rtl w:val="0"/>
         </w:rPr>
         <w:t xml:space="preserve">HEARsay is a series of mystery games designed to help students learn and practice </w:t>
       </w:r>
       <w:r>
         <w:rPr>
-          <w:rFonts w:ascii="Garamond" w:cs="Garamond" w:eastAsia="Garamond" w:hAnsi="Garamond"/>
           <w:i w:val="1"/>
           <w:iCs w:val="1"/>
-          <w:sz w:val="24"/>
-          <w:szCs w:val="24"/>
           <w:rtl w:val="0"/>
         </w:rPr>
         <w:t xml:space="preserve">conversational receptiveness</w:t>
       </w:r>
       <w:r>
         <w:rPr>
-          <w:rFonts w:ascii="Garamond" w:cs="Garamond" w:eastAsia="Garamond" w:hAnsi="Garamond"/>
           <w:i w:val="1"/>
           <w:iCs w:val="1"/>
-          <w:sz w:val="24"/>
-          <w:szCs w:val="24"/>
           <w:vertAlign w:val="superscript"/>
         </w:rPr>
         <w:footnoteReference w:customMarkFollows="0" w:id="0"/>
       </w:r>
       <w:r>
         <w:rPr>
-          <w:rFonts w:ascii="Garamond" w:cs="Garamond" w:eastAsia="Garamond" w:hAnsi="Garamond"/>
-          <w:sz w:val="24"/>
-          <w:szCs w:val="24"/>
           <w:rtl w:val="0"/>
         </w:rPr>
         <w:t xml:space="preserve">- “the use of language to communicate one’s willingness to thoughtfully engage with opposing views.”</w:t>
       </w:r>
       <w:r>
         <w:rPr>
-          <w:rFonts w:ascii="Garamond" w:cs="Garamond" w:eastAsia="Garamond" w:hAnsi="Garamond"/>
-          <w:sz w:val="24"/>
-          <w:szCs w:val="24"/>
           <w:vertAlign w:val="superscript"/>
         </w:rPr>
         <w:footnoteReference w:customMarkFollows="0" w:id="1"/>
       </w:r>
       <w:r>
         <w:rPr>
-          <w:rFonts w:ascii="Garamond" w:cs="Garamond" w:eastAsia="Garamond" w:hAnsi="Garamond"/>
-          <w:sz w:val="24"/>
-          <w:szCs w:val="24"/>
           <w:rtl w:val="0"/>
         </w:rPr>
         <w:t xml:space="preserve"> The focus of the games is the HEAR Framework, a practical tool aimed to help people remember and apply the principles of conversational receptiveness. </w:t>
@@ -542,56 +538,36 @@
     </w:p>
     <w:p>
       <w:pPr>
-        <w:spacing w:before="200" w:line="276" w:lineRule="auto"/>
-        <w:rPr>
-          <w:rFonts w:ascii="Garamond" w:cs="Garamond" w:eastAsia="Garamond" w:hAnsi="Garamond"/>
-          <w:sz w:val="24"/>
-          <w:szCs w:val="24"/>
-        </w:rPr>
-      </w:pPr>
-      <w:r>
-        <w:rPr>
-          <w:rFonts w:ascii="Garamond" w:cs="Garamond" w:eastAsia="Garamond" w:hAnsi="Garamond"/>
-          <w:sz w:val="24"/>
-          <w:szCs w:val="24"/>
+        <w:rPr/>
+      </w:pPr>
+      <w:r>
+        <w:rPr>
           <w:rtl w:val="0"/>
         </w:rPr>
         <w:t xml:space="preserve">HEARsay mysteries are story-driven games built on Twine, a free choose-your-own-adventure engine game that requires little to no coding. This framework provides the details about the way the game works as well as instructions for crafting scenarios. The first scenario, </w:t>
       </w:r>
       <w:r>
         <w:rPr>
-          <w:rFonts w:ascii="Garamond" w:cs="Garamond" w:eastAsia="Garamond" w:hAnsi="Garamond"/>
           <w:i w:val="1"/>
           <w:iCs w:val="1"/>
-          <w:sz w:val="24"/>
-          <w:szCs w:val="24"/>
           <w:rtl w:val="0"/>
         </w:rPr>
         <w:t xml:space="preserve">The Commons’ Comma</w:t>
       </w:r>
       <w:r>
         <w:rPr>
-          <w:rFonts w:ascii="Garamond" w:cs="Garamond" w:eastAsia="Garamond" w:hAnsi="Garamond"/>
-          <w:sz w:val="24"/>
-          <w:szCs w:val="24"/>
           <w:rtl w:val="0"/>
         </w:rPr>
         <w:t xml:space="preserve">, is included in an accompanying folder and describes a scenario based on a university campus, which I will treat here as the default backdrop for HEARsay mysteries.</w:t>
       </w:r>
       <w:r>
         <w:rPr>
-          <w:rFonts w:ascii="Garamond" w:cs="Garamond" w:eastAsia="Garamond" w:hAnsi="Garamond"/>
-          <w:sz w:val="24"/>
-          <w:szCs w:val="24"/>
           <w:vertAlign w:val="superscript"/>
         </w:rPr>
         <w:footnoteReference w:customMarkFollows="0" w:id="2"/>
       </w:r>
       <w:r>
         <w:rPr>
-          <w:rFonts w:ascii="Garamond" w:cs="Garamond" w:eastAsia="Garamond" w:hAnsi="Garamond"/>
-          <w:sz w:val="24"/>
-          <w:szCs w:val="24"/>
           <w:rtl w:val="0"/>
         </w:rPr>
         <w:t xml:space="preserve"> </w:t>
@@ -599,54 +575,34 @@
     </w:p>
     <w:p>
       <w:pPr>
-        <w:spacing w:before="200" w:line="276" w:lineRule="auto"/>
-        <w:rPr>
-          <w:rFonts w:ascii="Garamond" w:cs="Garamond" w:eastAsia="Garamond" w:hAnsi="Garamond"/>
-          <w:sz w:val="24"/>
-          <w:szCs w:val="24"/>
-        </w:rPr>
-      </w:pPr>
-      <w:r>
-        <w:rPr>
-          <w:rFonts w:ascii="Garamond" w:cs="Garamond" w:eastAsia="Garamond" w:hAnsi="Garamond"/>
-          <w:sz w:val="24"/>
-          <w:szCs w:val="24"/>
+        <w:rPr/>
+      </w:pPr>
+      <w:r>
+        <w:rPr>
           <w:rtl w:val="0"/>
         </w:rPr>
         <w:t xml:space="preserve">Each scenario </w:t>
       </w:r>
       <w:r>
         <w:rPr>
-          <w:rFonts w:ascii="Garamond" w:cs="Garamond" w:eastAsia="Garamond" w:hAnsi="Garamond"/>
-          <w:sz w:val="24"/>
-          <w:szCs w:val="24"/>
           <w:rtl w:val="0"/>
         </w:rPr>
         <w:t xml:space="preserve">is comprised</w:t>
       </w:r>
       <w:r>
         <w:rPr>
-          <w:rFonts w:ascii="Garamond" w:cs="Garamond" w:eastAsia="Garamond" w:hAnsi="Garamond"/>
-          <w:sz w:val="24"/>
-          <w:szCs w:val="24"/>
           <w:rtl w:val="0"/>
         </w:rPr>
         <w:t xml:space="preserve"> of (a) a</w:t>
       </w:r>
       <w:r>
         <w:rPr>
-          <w:rFonts w:ascii="Garamond" w:cs="Garamond" w:eastAsia="Garamond" w:hAnsi="Garamond"/>
-          <w:sz w:val="24"/>
-          <w:szCs w:val="24"/>
           <w:rtl w:val="0"/>
         </w:rPr>
         <w:t xml:space="preserve"> puzzle the players have to solve and (b) a controversy that’s unfolding in the background, which I will call the Current Campus Controversy (CCC</w:t>
       </w:r>
       <w:r>
         <w:rPr>
-          <w:rFonts w:ascii="Garamond" w:cs="Garamond" w:eastAsia="Garamond" w:hAnsi="Garamond"/>
-          <w:sz w:val="24"/>
-          <w:szCs w:val="24"/>
           <w:vertAlign w:val="superscript"/>
           <w:rtl w:val="0"/>
         </w:rPr>
@@ -654,9 +610,6 @@
       </w:r>
       <w:r>
         <w:rPr>
-          <w:rFonts w:ascii="Garamond" w:cs="Garamond" w:eastAsia="Garamond" w:hAnsi="Garamond"/>
-          <w:sz w:val="24"/>
-          <w:szCs w:val="24"/>
           <w:rtl w:val="0"/>
         </w:rPr>
         <w:t xml:space="preserve">). Players will be interviewing witnesses, such as students or university personnel, trying to gain clues that would help them solve the mystery and avoiding red herrings that point them in the wrong direction. At the same time, witnesses will share their views on the CCC and players will have to apply the HEAR framework in order to solve the mystery and improve their scores in the game:</w:t>
@@ -668,19 +621,11 @@
           <w:ilvl w:val="0"/>
           <w:numId w:val="7"/>
         </w:numPr>
-        <w:spacing w:after="0" w:afterAutospacing="0" w:before="200" w:line="276" w:lineRule="auto"/>
+        <w:spacing w:after="0" w:afterAutospacing="0"/>
         <w:ind w:left="720" w:hanging="360"/>
-        <w:rPr>
-          <w:rFonts w:ascii="Garamond" w:cs="Garamond" w:eastAsia="Garamond" w:hAnsi="Garamond"/>
-          <w:sz w:val="24"/>
-          <w:szCs w:val="24"/>
-        </w:rPr>
-      </w:pPr>
-      <w:r>
-        <w:rPr>
-          <w:rFonts w:ascii="Garamond" w:cs="Garamond" w:eastAsia="Garamond" w:hAnsi="Garamond"/>
-          <w:sz w:val="24"/>
-          <w:szCs w:val="24"/>
+      </w:pPr>
+      <w:r>
+        <w:rPr>
           <w:rtl w:val="0"/>
         </w:rPr>
         <w:t xml:space="preserve">Once with each witness players may ask a follow-up question about the witness’s expressed view regarding the CCC. Players will have to choose between two phrasings of the question, one more receptive than the other (the difference may be stark or subtle). Choosing the receptive phrasing unlocks a Major Clue while choosing the less receptive question ends the interview abruptly (the witness storms away and will not  answer any more questions). </w:t>
@@ -692,19 +637,11 @@
           <w:ilvl w:val="0"/>
           <w:numId w:val="7"/>
         </w:numPr>
-        <w:spacing w:after="0" w:afterAutospacing="0" w:before="0" w:beforeAutospacing="0" w:line="276" w:lineRule="auto"/>
+        <w:spacing w:after="0" w:afterAutospacing="0" w:before="0" w:beforeAutospacing="0"/>
         <w:ind w:left="720" w:hanging="360"/>
-        <w:rPr>
-          <w:rFonts w:ascii="Garamond" w:cs="Garamond" w:eastAsia="Garamond" w:hAnsi="Garamond"/>
-          <w:sz w:val="24"/>
-          <w:szCs w:val="24"/>
-        </w:rPr>
-      </w:pPr>
-      <w:r>
-        <w:rPr>
-          <w:rFonts w:ascii="Garamond" w:cs="Garamond" w:eastAsia="Garamond" w:hAnsi="Garamond"/>
-          <w:sz w:val="24"/>
-          <w:szCs w:val="24"/>
+      </w:pPr>
+      <w:r>
+        <w:rPr>
           <w:rtl w:val="0"/>
         </w:rPr>
         <w:t xml:space="preserve">Unlocking a Major Clue earns the students a letter from the HEAR acronym, reinforcing the mnemonic tool, and explaining one of the four pillars of the framework.</w:t>
@@ -716,19 +653,11 @@
           <w:ilvl w:val="0"/>
           <w:numId w:val="7"/>
         </w:numPr>
-        <w:spacing w:before="0" w:beforeAutospacing="0" w:line="276" w:lineRule="auto"/>
+        <w:spacing w:before="0" w:beforeAutospacing="0"/>
         <w:ind w:left="720" w:hanging="360"/>
-        <w:rPr>
-          <w:rFonts w:ascii="Garamond" w:cs="Garamond" w:eastAsia="Garamond" w:hAnsi="Garamond"/>
-          <w:sz w:val="24"/>
-          <w:szCs w:val="24"/>
-        </w:rPr>
-      </w:pPr>
-      <w:r>
-        <w:rPr>
-          <w:rFonts w:ascii="Garamond" w:cs="Garamond" w:eastAsia="Garamond" w:hAnsi="Garamond"/>
-          <w:sz w:val="24"/>
-          <w:szCs w:val="24"/>
+      </w:pPr>
+      <w:r>
+        <w:rPr>
           <w:rtl w:val="0"/>
         </w:rPr>
         <w:t xml:space="preserve">Each witness will volunteer their opinions on the CCC, with varying degrees of receptiveness. Players will receive bonus points at the end of the game for ranking the witnesses correctly in terms of the receptiveness. </w:t>
@@ -737,24 +666,12 @@
     <w:p>
       <w:pPr>
         <w:pStyle w:val="Heading1"/>
-        <w:spacing w:before="400" w:line="276" w:lineRule="auto"/>
-        <w:rPr>
-          <w:rFonts w:ascii="Garamond" w:cs="Garamond" w:eastAsia="Garamond" w:hAnsi="Garamond"/>
-          <w:b w:val="0"/>
-          <w:bCs w:val="0"/>
-          <w:sz w:val="40"/>
-          <w:szCs w:val="40"/>
-        </w:rPr>
-      </w:pPr>
-      <w:bookmarkStart w:colFirst="0" w:colLast="0" w:name="_724y3rmj63y4" w:id="4"/>
-      <w:bookmarkEnd w:id="4"/>
-      <w:r>
-        <w:rPr>
-          <w:rFonts w:ascii="Garamond" w:cs="Garamond" w:eastAsia="Garamond" w:hAnsi="Garamond"/>
-          <w:b w:val="0"/>
-          <w:bCs w:val="0"/>
-          <w:sz w:val="40"/>
-          <w:szCs w:val="40"/>
+        <w:rPr/>
+      </w:pPr>
+      <w:bookmarkStart w:colFirst="0" w:colLast="0" w:name="_724y3rmj63y4" w:id="5"/>
+      <w:bookmarkEnd w:id="5"/>
+      <w:r>
+        <w:rPr>
           <w:rtl w:val="0"/>
         </w:rPr>
         <w:t xml:space="preserve">2. The HEAR Framework </w:t>
@@ -762,18 +679,11 @@
     </w:p>
     <w:p>
       <w:pPr>
-        <w:spacing w:after="200" w:before="200" w:line="276" w:lineRule="auto"/>
-        <w:rPr>
-          <w:rFonts w:ascii="Garamond" w:cs="Garamond" w:eastAsia="Garamond" w:hAnsi="Garamond"/>
-          <w:sz w:val="24"/>
-          <w:szCs w:val="24"/>
-        </w:rPr>
-      </w:pPr>
-      <w:r>
-        <w:rPr>
-          <w:rFonts w:ascii="Garamond" w:cs="Garamond" w:eastAsia="Garamond" w:hAnsi="Garamond"/>
-          <w:sz w:val="24"/>
-          <w:szCs w:val="24"/>
+        <w:spacing w:after="200" w:lineRule="auto"/>
+        <w:rPr/>
+      </w:pPr>
+      <w:r>
+        <w:rPr>
           <w:rtl w:val="0"/>
         </w:rPr>
         <w:t xml:space="preserve">Conversational receptiveness is the use of language that signals you are engaging thoughtfully with a view you disagree with. Minson and colleagues found that people who are perceived as receptive are seen as better teammates and advisors, are more persuasive, and are more likely to be engaged with in return, and that receptiveness can be learned as a set of concrete verbal moves. The teachable recipe is summarised as HEAR:</w:t>
@@ -813,16 +723,14 @@
           </w:tcPr>
           <w:p>
             <w:pPr>
-              <w:spacing w:line="240" w:lineRule="auto"/>
-              <w:rPr>
-                <w:rFonts w:ascii="Garamond" w:cs="Garamond" w:eastAsia="Garamond" w:hAnsi="Garamond"/>
+              <w:spacing w:before="0" w:line="240" w:lineRule="auto"/>
+              <w:rPr>
                 <w:sz w:val="32"/>
                 <w:szCs w:val="32"/>
               </w:rPr>
             </w:pPr>
             <w:r>
               <w:rPr>
-                <w:rFonts w:ascii="Garamond" w:cs="Garamond" w:eastAsia="Garamond" w:hAnsi="Garamond"/>
                 <w:sz w:val="32"/>
                 <w:szCs w:val="32"/>
                 <w:rtl w:val="0"/>
@@ -837,16 +745,14 @@
           </w:tcPr>
           <w:p>
             <w:pPr>
-              <w:spacing w:line="240" w:lineRule="auto"/>
-              <w:rPr>
-                <w:rFonts w:ascii="Garamond" w:cs="Garamond" w:eastAsia="Garamond" w:hAnsi="Garamond"/>
+              <w:spacing w:before="0" w:line="240" w:lineRule="auto"/>
+              <w:rPr>
                 <w:sz w:val="32"/>
                 <w:szCs w:val="32"/>
               </w:rPr>
             </w:pPr>
             <w:r>
               <w:rPr>
-                <w:rFonts w:ascii="Garamond" w:cs="Garamond" w:eastAsia="Garamond" w:hAnsi="Garamond"/>
                 <w:sz w:val="32"/>
                 <w:szCs w:val="32"/>
                 <w:rtl w:val="0"/>
@@ -861,16 +767,14 @@
           </w:tcPr>
           <w:p>
             <w:pPr>
-              <w:spacing w:line="240" w:lineRule="auto"/>
-              <w:rPr>
-                <w:rFonts w:ascii="Garamond" w:cs="Garamond" w:eastAsia="Garamond" w:hAnsi="Garamond"/>
+              <w:spacing w:before="0" w:line="240" w:lineRule="auto"/>
+              <w:rPr>
                 <w:sz w:val="32"/>
                 <w:szCs w:val="32"/>
               </w:rPr>
             </w:pPr>
             <w:r>
               <w:rPr>
-                <w:rFonts w:ascii="Garamond" w:cs="Garamond" w:eastAsia="Garamond" w:hAnsi="Garamond"/>
                 <w:sz w:val="32"/>
                 <w:szCs w:val="32"/>
                 <w:rtl w:val="0"/>
@@ -890,22 +794,16 @@
           <w:tcPr/>
           <w:p>
             <w:pPr>
-              <w:spacing w:line="240" w:lineRule="auto"/>
-              <w:rPr>
-                <w:rFonts w:ascii="Garamond" w:cs="Garamond" w:eastAsia="Garamond" w:hAnsi="Garamond"/>
+              <w:spacing w:before="0" w:line="240" w:lineRule="auto"/>
+              <w:rPr>
                 <w:b w:val="1"/>
                 <w:bCs w:val="1"/>
-                <w:sz w:val="24"/>
-                <w:szCs w:val="24"/>
-              </w:rPr>
-            </w:pPr>
-            <w:r>
-              <w:rPr>
-                <w:rFonts w:ascii="Garamond" w:cs="Garamond" w:eastAsia="Garamond" w:hAnsi="Garamond"/>
+              </w:rPr>
+            </w:pPr>
+            <w:r>
+              <w:rPr>
                 <w:b w:val="1"/>
                 <w:bCs w:val="1"/>
-                <w:sz w:val="24"/>
-                <w:szCs w:val="24"/>
                 <w:rtl w:val="0"/>
               </w:rPr>
               <w:t xml:space="preserve">H</w:t>
@@ -916,29 +814,19 @@
           <w:tcPr/>
           <w:p>
             <w:pPr>
-              <w:spacing w:line="240" w:lineRule="auto"/>
-              <w:rPr>
-                <w:rFonts w:ascii="Garamond" w:cs="Garamond" w:eastAsia="Garamond" w:hAnsi="Garamond"/>
-                <w:sz w:val="24"/>
-                <w:szCs w:val="24"/>
-              </w:rPr>
-            </w:pPr>
-            <w:r>
-              <w:rPr>
-                <w:rFonts w:ascii="Garamond" w:cs="Garamond" w:eastAsia="Garamond" w:hAnsi="Garamond"/>
+              <w:spacing w:before="0" w:line="240" w:lineRule="auto"/>
+              <w:rPr/>
+            </w:pPr>
+            <w:r>
+              <w:rPr>
                 <w:b w:val="1"/>
                 <w:bCs w:val="1"/>
-                <w:sz w:val="24"/>
-                <w:szCs w:val="24"/>
                 <w:rtl w:val="0"/>
               </w:rPr>
               <w:t xml:space="preserve">Hedge</w:t>
             </w:r>
             <w:r>
               <w:rPr>
-                <w:rFonts w:ascii="Garamond" w:cs="Garamond" w:eastAsia="Garamond" w:hAnsi="Garamond"/>
-                <w:sz w:val="24"/>
-                <w:szCs w:val="24"/>
                 <w:rtl w:val="0"/>
               </w:rPr>
               <w:t xml:space="preserve"> your claims</w:t>
@@ -949,18 +837,11 @@
           <w:tcPr/>
           <w:p>
             <w:pPr>
-              <w:spacing w:line="240" w:lineRule="auto"/>
-              <w:rPr>
-                <w:rFonts w:ascii="Garamond" w:cs="Garamond" w:eastAsia="Garamond" w:hAnsi="Garamond"/>
-                <w:sz w:val="24"/>
-                <w:szCs w:val="24"/>
-              </w:rPr>
-            </w:pPr>
-            <w:r>
-              <w:rPr>
-                <w:rFonts w:ascii="Garamond" w:cs="Garamond" w:eastAsia="Garamond" w:hAnsi="Garamond"/>
-                <w:sz w:val="24"/>
-                <w:szCs w:val="24"/>
+              <w:spacing w:before="0" w:line="240" w:lineRule="auto"/>
+              <w:rPr/>
+            </w:pPr>
+            <w:r>
+              <w:rPr>
                 <w:rtl w:val="0"/>
               </w:rPr>
               <w:t xml:space="preserve">“I may be wrong about this”, “in some cases”, “it seems to me”, “probably”. Hedging signals that you hold your view as a view, not as a fact the other person is failing to see.</w:t>
@@ -978,22 +859,16 @@
           <w:tcPr/>
           <w:p>
             <w:pPr>
-              <w:spacing w:line="240" w:lineRule="auto"/>
-              <w:rPr>
-                <w:rFonts w:ascii="Garamond" w:cs="Garamond" w:eastAsia="Garamond" w:hAnsi="Garamond"/>
+              <w:spacing w:before="0" w:line="240" w:lineRule="auto"/>
+              <w:rPr>
                 <w:b w:val="1"/>
                 <w:bCs w:val="1"/>
-                <w:sz w:val="24"/>
-                <w:szCs w:val="24"/>
-              </w:rPr>
-            </w:pPr>
-            <w:r>
-              <w:rPr>
-                <w:rFonts w:ascii="Garamond" w:cs="Garamond" w:eastAsia="Garamond" w:hAnsi="Garamond"/>
+              </w:rPr>
+            </w:pPr>
+            <w:r>
+              <w:rPr>
                 <w:b w:val="1"/>
                 <w:bCs w:val="1"/>
-                <w:sz w:val="24"/>
-                <w:szCs w:val="24"/>
                 <w:rtl w:val="0"/>
               </w:rPr>
               <w:t xml:space="preserve">E</w:t>
@@ -1004,29 +879,19 @@
           <w:tcPr/>
           <w:p>
             <w:pPr>
-              <w:spacing w:line="240" w:lineRule="auto"/>
-              <w:rPr>
-                <w:rFonts w:ascii="Garamond" w:cs="Garamond" w:eastAsia="Garamond" w:hAnsi="Garamond"/>
-                <w:sz w:val="24"/>
-                <w:szCs w:val="24"/>
-              </w:rPr>
-            </w:pPr>
-            <w:r>
-              <w:rPr>
-                <w:rFonts w:ascii="Garamond" w:cs="Garamond" w:eastAsia="Garamond" w:hAnsi="Garamond"/>
+              <w:spacing w:before="0" w:line="240" w:lineRule="auto"/>
+              <w:rPr/>
+            </w:pPr>
+            <w:r>
+              <w:rPr>
                 <w:b w:val="1"/>
                 <w:bCs w:val="1"/>
-                <w:sz w:val="24"/>
-                <w:szCs w:val="24"/>
                 <w:rtl w:val="0"/>
               </w:rPr>
               <w:t xml:space="preserve">Emphasize</w:t>
             </w:r>
             <w:r>
               <w:rPr>
-                <w:rFonts w:ascii="Garamond" w:cs="Garamond" w:eastAsia="Garamond" w:hAnsi="Garamond"/>
-                <w:sz w:val="24"/>
-                <w:szCs w:val="24"/>
                 <w:rtl w:val="0"/>
               </w:rPr>
               <w:t xml:space="preserve"> agreement</w:t>
@@ -1037,18 +902,11 @@
           <w:tcPr/>
           <w:p>
             <w:pPr>
-              <w:spacing w:line="240" w:lineRule="auto"/>
-              <w:rPr>
-                <w:rFonts w:ascii="Garamond" w:cs="Garamond" w:eastAsia="Garamond" w:hAnsi="Garamond"/>
-                <w:sz w:val="24"/>
-                <w:szCs w:val="24"/>
-              </w:rPr>
-            </w:pPr>
-            <w:r>
-              <w:rPr>
-                <w:rFonts w:ascii="Garamond" w:cs="Garamond" w:eastAsia="Garamond" w:hAnsi="Garamond"/>
-                <w:sz w:val="24"/>
-                <w:szCs w:val="24"/>
+              <w:spacing w:before="0" w:line="240" w:lineRule="auto"/>
+              <w:rPr/>
+            </w:pPr>
+            <w:r>
+              <w:rPr>
                 <w:rtl w:val="0"/>
               </w:rPr>
               <w:t xml:space="preserve">“We both want the building to work for students”, “I think we agree on the goal”. Naming shared ground before stating a difference makes the difference feel like a disagreement between allies.</w:t>
@@ -1066,22 +924,16 @@
           <w:tcPr/>
           <w:p>
             <w:pPr>
-              <w:spacing w:line="240" w:lineRule="auto"/>
-              <w:rPr>
-                <w:rFonts w:ascii="Garamond" w:cs="Garamond" w:eastAsia="Garamond" w:hAnsi="Garamond"/>
+              <w:spacing w:before="0" w:line="240" w:lineRule="auto"/>
+              <w:rPr>
                 <w:b w:val="1"/>
                 <w:bCs w:val="1"/>
-                <w:sz w:val="24"/>
-                <w:szCs w:val="24"/>
-              </w:rPr>
-            </w:pPr>
-            <w:r>
-              <w:rPr>
-                <w:rFonts w:ascii="Garamond" w:cs="Garamond" w:eastAsia="Garamond" w:hAnsi="Garamond"/>
+              </w:rPr>
+            </w:pPr>
+            <w:r>
+              <w:rPr>
                 <w:b w:val="1"/>
                 <w:bCs w:val="1"/>
-                <w:sz w:val="24"/>
-                <w:szCs w:val="24"/>
                 <w:rtl w:val="0"/>
               </w:rPr>
               <w:t xml:space="preserve">A</w:t>
@@ -1092,29 +944,19 @@
           <w:tcPr/>
           <w:p>
             <w:pPr>
-              <w:spacing w:line="240" w:lineRule="auto"/>
-              <w:rPr>
-                <w:rFonts w:ascii="Garamond" w:cs="Garamond" w:eastAsia="Garamond" w:hAnsi="Garamond"/>
-                <w:sz w:val="24"/>
-                <w:szCs w:val="24"/>
-              </w:rPr>
-            </w:pPr>
-            <w:r>
-              <w:rPr>
-                <w:rFonts w:ascii="Garamond" w:cs="Garamond" w:eastAsia="Garamond" w:hAnsi="Garamond"/>
+              <w:spacing w:before="0" w:line="240" w:lineRule="auto"/>
+              <w:rPr/>
+            </w:pPr>
+            <w:r>
+              <w:rPr>
                 <w:b w:val="1"/>
                 <w:bCs w:val="1"/>
-                <w:sz w:val="24"/>
-                <w:szCs w:val="24"/>
                 <w:rtl w:val="0"/>
               </w:rPr>
               <w:t xml:space="preserve">Acknowledge</w:t>
             </w:r>
             <w:r>
               <w:rPr>
-                <w:rFonts w:ascii="Garamond" w:cs="Garamond" w:eastAsia="Garamond" w:hAnsi="Garamond"/>
-                <w:sz w:val="24"/>
-                <w:szCs w:val="24"/>
                 <w:rtl w:val="0"/>
               </w:rPr>
               <w:t xml:space="preserve"> the other’s perspective</w:t>
@@ -1125,18 +967,11 @@
           <w:tcPr/>
           <w:p>
             <w:pPr>
-              <w:spacing w:line="240" w:lineRule="auto"/>
-              <w:rPr>
-                <w:rFonts w:ascii="Garamond" w:cs="Garamond" w:eastAsia="Garamond" w:hAnsi="Garamond"/>
-                <w:sz w:val="24"/>
-                <w:szCs w:val="24"/>
-              </w:rPr>
-            </w:pPr>
-            <w:r>
-              <w:rPr>
-                <w:rFonts w:ascii="Garamond" w:cs="Garamond" w:eastAsia="Garamond" w:hAnsi="Garamond"/>
-                <w:sz w:val="24"/>
-                <w:szCs w:val="24"/>
+              <w:spacing w:before="0" w:line="240" w:lineRule="auto"/>
+              <w:rPr/>
+            </w:pPr>
+            <w:r>
+              <w:rPr>
                 <w:rtl w:val="0"/>
               </w:rPr>
               <w:t xml:space="preserve">“Leo’s point about space is fair”, “I can see why you’d read it that way”. Restating the other view accurately, and granting what is right in it, shows you have actually listened.</w:t>
@@ -1154,22 +989,16 @@
           <w:tcPr/>
           <w:p>
             <w:pPr>
-              <w:spacing w:line="240" w:lineRule="auto"/>
-              <w:rPr>
-                <w:rFonts w:ascii="Garamond" w:cs="Garamond" w:eastAsia="Garamond" w:hAnsi="Garamond"/>
+              <w:spacing w:before="0" w:line="240" w:lineRule="auto"/>
+              <w:rPr>
                 <w:b w:val="1"/>
                 <w:bCs w:val="1"/>
-                <w:sz w:val="24"/>
-                <w:szCs w:val="24"/>
-              </w:rPr>
-            </w:pPr>
-            <w:r>
-              <w:rPr>
-                <w:rFonts w:ascii="Garamond" w:cs="Garamond" w:eastAsia="Garamond" w:hAnsi="Garamond"/>
+              </w:rPr>
+            </w:pPr>
+            <w:r>
+              <w:rPr>
                 <w:b w:val="1"/>
                 <w:bCs w:val="1"/>
-                <w:sz w:val="24"/>
-                <w:szCs w:val="24"/>
                 <w:rtl w:val="0"/>
               </w:rPr>
               <w:t xml:space="preserve">R</w:t>
@@ -1180,29 +1009,19 @@
           <w:tcPr/>
           <w:p>
             <w:pPr>
-              <w:spacing w:line="240" w:lineRule="auto"/>
-              <w:rPr>
-                <w:rFonts w:ascii="Garamond" w:cs="Garamond" w:eastAsia="Garamond" w:hAnsi="Garamond"/>
-                <w:sz w:val="24"/>
-                <w:szCs w:val="24"/>
-              </w:rPr>
-            </w:pPr>
-            <w:r>
-              <w:rPr>
-                <w:rFonts w:ascii="Garamond" w:cs="Garamond" w:eastAsia="Garamond" w:hAnsi="Garamond"/>
+              <w:spacing w:before="0" w:line="240" w:lineRule="auto"/>
+              <w:rPr/>
+            </w:pPr>
+            <w:r>
+              <w:rPr>
                 <w:b w:val="1"/>
                 <w:bCs w:val="1"/>
-                <w:sz w:val="24"/>
-                <w:szCs w:val="24"/>
                 <w:rtl w:val="0"/>
               </w:rPr>
               <w:t xml:space="preserve">Reframe</w:t>
             </w:r>
             <w:r>
               <w:rPr>
-                <w:rFonts w:ascii="Garamond" w:cs="Garamond" w:eastAsia="Garamond" w:hAnsi="Garamond"/>
-                <w:sz w:val="24"/>
-                <w:szCs w:val="24"/>
                 <w:rtl w:val="0"/>
               </w:rPr>
               <w:t xml:space="preserve"> to the positive</w:t>
@@ -1213,18 +1032,11 @@
           <w:tcPr/>
           <w:p>
             <w:pPr>
-              <w:spacing w:line="240" w:lineRule="auto"/>
-              <w:rPr>
-                <w:rFonts w:ascii="Garamond" w:cs="Garamond" w:eastAsia="Garamond" w:hAnsi="Garamond"/>
-                <w:sz w:val="24"/>
-                <w:szCs w:val="24"/>
-              </w:rPr>
-            </w:pPr>
-            <w:r>
-              <w:rPr>
-                <w:rFonts w:ascii="Garamond" w:cs="Garamond" w:eastAsia="Garamond" w:hAnsi="Garamond"/>
-                <w:sz w:val="24"/>
-                <w:szCs w:val="24"/>
+              <w:spacing w:before="0" w:line="240" w:lineRule="auto"/>
+              <w:rPr/>
+            </w:pPr>
+            <w:r>
+              <w:rPr>
                 <w:rtl w:val="0"/>
               </w:rPr>
               <w:t xml:space="preserve">“What would help is…” rather than “what’s wrong is…” avoiding absolute and negative language (“never”, “obviously”, “no one seriously thinks”). Positive framing keeps the exchange open rather than closing it.</w:t>
@@ -1236,24 +1048,12 @@
     <w:p>
       <w:pPr>
         <w:pStyle w:val="Heading1"/>
-        <w:spacing w:before="400" w:line="276" w:lineRule="auto"/>
-        <w:rPr>
-          <w:rFonts w:ascii="Garamond" w:cs="Garamond" w:eastAsia="Garamond" w:hAnsi="Garamond"/>
-          <w:b w:val="0"/>
-          <w:bCs w:val="0"/>
-          <w:sz w:val="40"/>
-          <w:szCs w:val="40"/>
-        </w:rPr>
-      </w:pPr>
-      <w:bookmarkStart w:colFirst="0" w:colLast="0" w:name="_8x7u4gqrdju0" w:id="5"/>
-      <w:bookmarkEnd w:id="5"/>
-      <w:r>
-        <w:rPr>
-          <w:rFonts w:ascii="Garamond" w:cs="Garamond" w:eastAsia="Garamond" w:hAnsi="Garamond"/>
-          <w:b w:val="0"/>
-          <w:bCs w:val="0"/>
-          <w:sz w:val="40"/>
-          <w:szCs w:val="40"/>
+        <w:rPr/>
+      </w:pPr>
+      <w:bookmarkStart w:colFirst="0" w:colLast="0" w:name="_8x7u4gqrdju0" w:id="6"/>
+      <w:bookmarkEnd w:id="6"/>
+      <w:r>
+        <w:rPr>
           <w:rtl w:val="0"/>
         </w:rPr>
         <w:t xml:space="preserve">3. The Game </w:t>
@@ -1261,18 +1061,10 @@
     </w:p>
     <w:p>
       <w:pPr>
-        <w:spacing w:before="200" w:line="276" w:lineRule="auto"/>
-        <w:rPr>
-          <w:rFonts w:ascii="Garamond" w:cs="Garamond" w:eastAsia="Garamond" w:hAnsi="Garamond"/>
-          <w:sz w:val="24"/>
-          <w:szCs w:val="24"/>
-        </w:rPr>
-      </w:pPr>
-      <w:r>
-        <w:rPr>
-          <w:rFonts w:ascii="Garamond" w:cs="Garamond" w:eastAsia="Garamond" w:hAnsi="Garamond"/>
-          <w:sz w:val="24"/>
-          <w:szCs w:val="24"/>
+        <w:rPr/>
+      </w:pPr>
+      <w:r>
+        <w:rPr>
           <w:rtl w:val="0"/>
         </w:rPr>
         <w:t xml:space="preserve">The game revolves around a mystery and so the game begins with a brief introduction of the game and then jumping right into the presentation of the mystery with the Hook. </w:t>
@@ -1281,24 +1073,12 @@
     <w:p>
       <w:pPr>
         <w:pStyle w:val="Heading2"/>
-        <w:spacing w:after="120" w:line="276" w:lineRule="auto"/>
-        <w:rPr>
-          <w:rFonts w:ascii="Garamond" w:cs="Garamond" w:eastAsia="Garamond" w:hAnsi="Garamond"/>
-          <w:b w:val="0"/>
-          <w:bCs w:val="0"/>
-          <w:sz w:val="32"/>
-          <w:szCs w:val="32"/>
-        </w:rPr>
-      </w:pPr>
-      <w:bookmarkStart w:colFirst="0" w:colLast="0" w:name="_h6c12zbk9cf" w:id="6"/>
-      <w:bookmarkEnd w:id="6"/>
-      <w:r>
-        <w:rPr>
-          <w:rFonts w:ascii="Garamond" w:cs="Garamond" w:eastAsia="Garamond" w:hAnsi="Garamond"/>
-          <w:b w:val="0"/>
-          <w:bCs w:val="0"/>
-          <w:sz w:val="32"/>
-          <w:szCs w:val="32"/>
+        <w:rPr/>
+      </w:pPr>
+      <w:bookmarkStart w:colFirst="0" w:colLast="0" w:name="_h6c12zbk9cf" w:id="7"/>
+      <w:bookmarkEnd w:id="7"/>
+      <w:r>
+        <w:rPr>
           <w:rtl w:val="0"/>
         </w:rPr>
         <w:t xml:space="preserve">3.1 Introduction </w:t>
@@ -1306,18 +1086,10 @@
     </w:p>
     <w:p>
       <w:pPr>
-        <w:spacing w:before="200" w:line="276" w:lineRule="auto"/>
-        <w:rPr>
-          <w:rFonts w:ascii="Garamond" w:cs="Garamond" w:eastAsia="Garamond" w:hAnsi="Garamond"/>
-          <w:sz w:val="24"/>
-          <w:szCs w:val="24"/>
-        </w:rPr>
-      </w:pPr>
-      <w:r>
-        <w:rPr>
-          <w:rFonts w:ascii="Garamond" w:cs="Garamond" w:eastAsia="Garamond" w:hAnsi="Garamond"/>
-          <w:sz w:val="24"/>
-          <w:szCs w:val="24"/>
+        <w:rPr/>
+      </w:pPr>
+      <w:r>
+        <w:rPr>
           <w:rtl w:val="0"/>
         </w:rPr>
         <w:t xml:space="preserve">In the introduction players are told that they are playing a mystery game while also practicing the HEAR framework. The game is designed to follow a module or a class where students have studied the HEAR framework, and conversational receptiveness more generally, in greater detail and so the introduction presents the framework briefly. A slide with a quick summary of the HEAR framework should be available for players throughout the game so they can review the material at any time. </w:t>
@@ -1325,18 +1097,10 @@
     </w:p>
     <w:p>
       <w:pPr>
-        <w:spacing w:before="200" w:line="276" w:lineRule="auto"/>
-        <w:rPr>
-          <w:rFonts w:ascii="Garamond" w:cs="Garamond" w:eastAsia="Garamond" w:hAnsi="Garamond"/>
-          <w:sz w:val="24"/>
-          <w:szCs w:val="24"/>
-        </w:rPr>
-      </w:pPr>
-      <w:r>
-        <w:rPr>
-          <w:rFonts w:ascii="Garamond" w:cs="Garamond" w:eastAsia="Garamond" w:hAnsi="Garamond"/>
-          <w:sz w:val="24"/>
-          <w:szCs w:val="24"/>
+        <w:rPr/>
+      </w:pPr>
+      <w:r>
+        <w:rPr>
           <w:rtl w:val="0"/>
         </w:rPr>
         <w:t xml:space="preserve">The introduction explains the rules of the game:</w:t>
@@ -1348,37 +1112,23 @@
           <w:ilvl w:val="0"/>
           <w:numId w:val="3"/>
         </w:numPr>
-        <w:spacing w:after="0" w:afterAutospacing="0" w:before="200" w:line="276" w:lineRule="auto"/>
+        <w:spacing w:after="0" w:afterAutospacing="0"/>
         <w:ind w:left="720" w:hanging="360"/>
-        <w:rPr>
-          <w:rFonts w:ascii="Garamond" w:cs="Garamond" w:eastAsia="Garamond" w:hAnsi="Garamond"/>
-          <w:sz w:val="24"/>
-          <w:szCs w:val="24"/>
-        </w:rPr>
-      </w:pPr>
-      <w:r>
-        <w:rPr>
-          <w:rFonts w:ascii="Garamond" w:cs="Garamond" w:eastAsia="Garamond" w:hAnsi="Garamond"/>
-          <w:sz w:val="24"/>
-          <w:szCs w:val="24"/>
+      </w:pPr>
+      <w:r>
+        <w:rPr>
           <w:rtl w:val="0"/>
         </w:rPr>
         <w:t xml:space="preserve">The goal of the game is to solve the mystery. At the end players will be asked to make a guess which addresses the central puzzle of the mystery. This may include identifying a culprit, if there is one, a motive or a reasoning, and the method.</w:t>
       </w:r>
       <w:r>
         <w:rPr>
-          <w:rFonts w:ascii="Garamond" w:cs="Garamond" w:eastAsia="Garamond" w:hAnsi="Garamond"/>
-          <w:sz w:val="24"/>
-          <w:szCs w:val="24"/>
           <w:vertAlign w:val="superscript"/>
         </w:rPr>
         <w:footnoteReference w:customMarkFollows="0" w:id="3"/>
       </w:r>
       <w:r>
         <w:rPr>
-          <w:rFonts w:ascii="Garamond" w:cs="Garamond" w:eastAsia="Garamond" w:hAnsi="Garamond"/>
-          <w:sz w:val="24"/>
-          <w:szCs w:val="24"/>
           <w:rtl w:val="0"/>
         </w:rPr>
         <w:t xml:space="preserve"> </w:t>
@@ -1390,19 +1140,11 @@
           <w:ilvl w:val="1"/>
           <w:numId w:val="3"/>
         </w:numPr>
-        <w:spacing w:after="0" w:afterAutospacing="0" w:before="0" w:beforeAutospacing="0" w:line="276" w:lineRule="auto"/>
+        <w:spacing w:after="0" w:afterAutospacing="0" w:before="0" w:beforeAutospacing="0"/>
         <w:ind w:left="1440" w:hanging="360"/>
-        <w:rPr>
-          <w:rFonts w:ascii="Garamond" w:cs="Garamond" w:eastAsia="Garamond" w:hAnsi="Garamond"/>
-          <w:sz w:val="24"/>
-          <w:szCs w:val="24"/>
-        </w:rPr>
-      </w:pPr>
-      <w:r>
-        <w:rPr>
-          <w:rFonts w:ascii="Garamond" w:cs="Garamond" w:eastAsia="Garamond" w:hAnsi="Garamond"/>
-          <w:sz w:val="24"/>
-          <w:szCs w:val="24"/>
+      </w:pPr>
+      <w:r>
+        <w:rPr>
           <w:rtl w:val="0"/>
         </w:rPr>
         <w:t xml:space="preserve">As a general rule, each of the witnesses should have a reasonable </w:t>
@@ -1414,19 +1156,11 @@
           <w:ilvl w:val="0"/>
           <w:numId w:val="3"/>
         </w:numPr>
-        <w:spacing w:after="0" w:afterAutospacing="0" w:before="0" w:beforeAutospacing="0" w:line="276" w:lineRule="auto"/>
+        <w:spacing w:after="0" w:afterAutospacing="0" w:before="0" w:beforeAutospacing="0"/>
         <w:ind w:left="720" w:hanging="360"/>
-        <w:rPr>
-          <w:rFonts w:ascii="Garamond" w:cs="Garamond" w:eastAsia="Garamond" w:hAnsi="Garamond"/>
-          <w:sz w:val="24"/>
-          <w:szCs w:val="24"/>
-        </w:rPr>
-      </w:pPr>
-      <w:r>
-        <w:rPr>
-          <w:rFonts w:ascii="Garamond" w:cs="Garamond" w:eastAsia="Garamond" w:hAnsi="Garamond"/>
-          <w:sz w:val="24"/>
-          <w:szCs w:val="24"/>
+      </w:pPr>
+      <w:r>
+        <w:rPr>
           <w:rtl w:val="0"/>
         </w:rPr>
         <w:t xml:space="preserve">The bulk of the game is made of students interviewing witnesses. The interview process is made of a series of questions. There are 8 witnesses and each can be asked a variant of 8 questions.</w:t>
@@ -1438,19 +1172,11 @@
           <w:ilvl w:val="0"/>
           <w:numId w:val="3"/>
         </w:numPr>
-        <w:spacing w:after="0" w:afterAutospacing="0" w:before="0" w:beforeAutospacing="0" w:line="276" w:lineRule="auto"/>
+        <w:spacing w:after="0" w:afterAutospacing="0" w:before="0" w:beforeAutospacing="0"/>
         <w:ind w:left="720" w:hanging="360"/>
-        <w:rPr>
-          <w:rFonts w:ascii="Garamond" w:cs="Garamond" w:eastAsia="Garamond" w:hAnsi="Garamond"/>
-          <w:sz w:val="24"/>
-          <w:szCs w:val="24"/>
-        </w:rPr>
-      </w:pPr>
-      <w:r>
-        <w:rPr>
-          <w:rFonts w:ascii="Garamond" w:cs="Garamond" w:eastAsia="Garamond" w:hAnsi="Garamond"/>
-          <w:sz w:val="24"/>
-          <w:szCs w:val="24"/>
+      </w:pPr>
+      <w:r>
+        <w:rPr>
           <w:rtl w:val="0"/>
         </w:rPr>
         <w:t xml:space="preserve">Students have a total ‘budget’ of </w:t>
@@ -1462,9 +1188,6 @@
       </w:r>
       <w:r>
         <w:rPr>
-          <w:rFonts w:ascii="Garamond" w:cs="Garamond" w:eastAsia="Garamond" w:hAnsi="Garamond"/>
-          <w:sz w:val="24"/>
-          <w:szCs w:val="24"/>
           <w:rtl w:val="0"/>
         </w:rPr>
         <w:t xml:space="preserve">30</w:t>
@@ -1474,9 +1197,6 @@
       </w:r>
       <w:r>
         <w:rPr>
-          <w:rFonts w:ascii="Garamond" w:cs="Garamond" w:eastAsia="Garamond" w:hAnsi="Garamond"/>
-          <w:sz w:val="24"/>
-          <w:szCs w:val="24"/>
           <w:rtl w:val="0"/>
         </w:rPr>
         <w:t xml:space="preserve"> questions that they can spread out across the witnesses however they want. Visiting a question that was asked before does not cost another question. Once they ask all their questions, or at any time before that if they like, they may make a guess and attempt to solve the mystery. Players have three chances to make a correct guess. If a player makes the wrong guess, they are told only that their guess is wrong, not which part, and they may keep investigating if they have questions left. Players gain more points if they guess correctly on their first try. </w:t>
@@ -1488,57 +1208,37 @@
           <w:ilvl w:val="0"/>
           <w:numId w:val="3"/>
         </w:numPr>
-        <w:spacing w:after="0" w:afterAutospacing="0" w:before="0" w:beforeAutospacing="0" w:line="276" w:lineRule="auto"/>
+        <w:spacing w:after="0" w:afterAutospacing="0" w:before="0" w:beforeAutospacing="0"/>
         <w:ind w:left="720" w:hanging="360"/>
-        <w:rPr>
-          <w:rFonts w:ascii="Garamond" w:cs="Garamond" w:eastAsia="Garamond" w:hAnsi="Garamond"/>
-          <w:sz w:val="24"/>
-          <w:szCs w:val="24"/>
-        </w:rPr>
-      </w:pPr>
-      <w:r>
-        <w:rPr>
-          <w:rFonts w:ascii="Garamond" w:cs="Garamond" w:eastAsia="Garamond" w:hAnsi="Garamond"/>
-          <w:sz w:val="24"/>
-          <w:szCs w:val="24"/>
+      </w:pPr>
+      <w:r>
+        <w:rPr>
           <w:rtl w:val="0"/>
         </w:rPr>
         <w:t xml:space="preserve"> For each witness, one question is a </w:t>
       </w:r>
       <w:r>
         <w:rPr>
-          <w:rFonts w:ascii="Garamond" w:cs="Garamond" w:eastAsia="Garamond" w:hAnsi="Garamond"/>
           <w:b w:val="1"/>
           <w:bCs w:val="1"/>
-          <w:sz w:val="24"/>
-          <w:szCs w:val="24"/>
           <w:rtl w:val="0"/>
         </w:rPr>
         <w:t xml:space="preserve">tripwire</w:t>
       </w:r>
       <w:r>
         <w:rPr>
-          <w:rFonts w:ascii="Garamond" w:cs="Garamond" w:eastAsia="Garamond" w:hAnsi="Garamond"/>
-          <w:sz w:val="24"/>
-          <w:szCs w:val="24"/>
           <w:rtl w:val="0"/>
         </w:rPr>
         <w:t xml:space="preserve">: it offends or annoys them such that they walk away and the interview ends abruptly. There is no asking any more questions of a witness who was </w:t>
       </w:r>
       <w:r>
         <w:rPr>
-          <w:rFonts w:ascii="Garamond" w:cs="Garamond" w:eastAsia="Garamond" w:hAnsi="Garamond"/>
-          <w:sz w:val="24"/>
-          <w:szCs w:val="24"/>
           <w:rtl w:val="0"/>
         </w:rPr>
         <w:t xml:space="preserve">asked a tripwire</w:t>
       </w:r>
       <w:r>
         <w:rPr>
-          <w:rFonts w:ascii="Garamond" w:cs="Garamond" w:eastAsia="Garamond" w:hAnsi="Garamond"/>
-          <w:sz w:val="24"/>
-          <w:szCs w:val="24"/>
           <w:rtl w:val="0"/>
         </w:rPr>
         <w:t xml:space="preserve">.</w:t>
@@ -1550,37 +1250,23 @@
           <w:ilvl w:val="0"/>
           <w:numId w:val="3"/>
         </w:numPr>
-        <w:spacing w:after="0" w:afterAutospacing="0" w:before="0" w:beforeAutospacing="0" w:line="276" w:lineRule="auto"/>
+        <w:spacing w:after="0" w:afterAutospacing="0" w:before="0" w:beforeAutospacing="0"/>
         <w:ind w:left="720" w:hanging="360"/>
-        <w:rPr>
-          <w:rFonts w:ascii="Garamond" w:cs="Garamond" w:eastAsia="Garamond" w:hAnsi="Garamond"/>
-          <w:sz w:val="24"/>
-          <w:szCs w:val="24"/>
-        </w:rPr>
-      </w:pPr>
-      <w:r>
-        <w:rPr>
-          <w:rFonts w:ascii="Garamond" w:cs="Garamond" w:eastAsia="Garamond" w:hAnsi="Garamond"/>
-          <w:sz w:val="24"/>
-          <w:szCs w:val="24"/>
+      </w:pPr>
+      <w:r>
+        <w:rPr>
           <w:rtl w:val="0"/>
         </w:rPr>
         <w:t xml:space="preserve"> With each witness, players have a chance to do a follow-up. They may do so after any answer the witness gave them (i.e. for all questions except the tripwire). To follow-up students will have to choose one of </w:t>
       </w:r>
       <w:r>
         <w:rPr>
-          <w:rFonts w:ascii="Garamond" w:cs="Garamond" w:eastAsia="Garamond" w:hAnsi="Garamond"/>
-          <w:sz w:val="24"/>
-          <w:szCs w:val="24"/>
           <w:rtl w:val="0"/>
         </w:rPr>
         <w:t xml:space="preserve">two phrasings</w:t>
       </w:r>
       <w:r>
         <w:rPr>
-          <w:rFonts w:ascii="Garamond" w:cs="Garamond" w:eastAsia="Garamond" w:hAnsi="Garamond"/>
-          <w:sz w:val="24"/>
-          <w:szCs w:val="24"/>
           <w:rtl w:val="0"/>
         </w:rPr>
         <w:t xml:space="preserve"> of a follow-up question or comment regarding the witness’s view on the CCC. If they pick correctly, they gain a Major Clue which helps them solve the mystery faster. If they pick incorrectly, the witness storms off angrily (just like they would with a tripwire).</w:t>
@@ -1592,19 +1278,11 @@
           <w:ilvl w:val="0"/>
           <w:numId w:val="3"/>
         </w:numPr>
-        <w:spacing w:after="0" w:afterAutospacing="0" w:before="0" w:beforeAutospacing="0" w:line="276" w:lineRule="auto"/>
+        <w:spacing w:after="0" w:afterAutospacing="0" w:before="0" w:beforeAutospacing="0"/>
         <w:ind w:left="720" w:hanging="360"/>
-        <w:rPr>
-          <w:rFonts w:ascii="Garamond" w:cs="Garamond" w:eastAsia="Garamond" w:hAnsi="Garamond"/>
-          <w:sz w:val="24"/>
-          <w:szCs w:val="24"/>
-        </w:rPr>
-      </w:pPr>
-      <w:r>
-        <w:rPr>
-          <w:rFonts w:ascii="Garamond" w:cs="Garamond" w:eastAsia="Garamond" w:hAnsi="Garamond"/>
-          <w:sz w:val="24"/>
-          <w:szCs w:val="24"/>
+      </w:pPr>
+      <w:r>
+        <w:rPr>
           <w:rtl w:val="0"/>
         </w:rPr>
         <w:t xml:space="preserve">The choice between the two options should present a temptation to answer the question with the ‘wrong’ answer. The emotional stakes in the case and the way in which the follow-up questions are phrased should provide some emotional satisfaction. </w:t>
@@ -1616,19 +1294,11 @@
           <w:ilvl w:val="0"/>
           <w:numId w:val="3"/>
         </w:numPr>
-        <w:spacing w:before="0" w:beforeAutospacing="0" w:line="276" w:lineRule="auto"/>
+        <w:spacing w:before="0" w:beforeAutospacing="0"/>
         <w:ind w:left="720" w:hanging="360"/>
-        <w:rPr>
-          <w:rFonts w:ascii="Garamond" w:cs="Garamond" w:eastAsia="Garamond" w:hAnsi="Garamond"/>
-          <w:sz w:val="24"/>
-          <w:szCs w:val="24"/>
-        </w:rPr>
-      </w:pPr>
-      <w:r>
-        <w:rPr>
-          <w:rFonts w:ascii="Garamond" w:cs="Garamond" w:eastAsia="Garamond" w:hAnsi="Garamond"/>
-          <w:sz w:val="24"/>
-          <w:szCs w:val="24"/>
+      </w:pPr>
+      <w:r>
+        <w:rPr>
           <w:rtl w:val="0"/>
         </w:rPr>
         <w:t xml:space="preserve">Witnesses themselves vary in their receptiveness. It would pay to pay attention to which of these witnesses is more or less receptive. </w:t>
@@ -1641,18 +1311,10 @@
     </w:p>
     <w:p>
       <w:pPr>
-        <w:spacing w:before="200" w:line="276" w:lineRule="auto"/>
-        <w:rPr>
-          <w:rFonts w:ascii="Garamond" w:cs="Garamond" w:eastAsia="Garamond" w:hAnsi="Garamond"/>
-          <w:sz w:val="24"/>
-          <w:szCs w:val="24"/>
-        </w:rPr>
-      </w:pPr>
-      <w:r>
-        <w:rPr>
-          <w:rFonts w:ascii="Garamond" w:cs="Garamond" w:eastAsia="Garamond" w:hAnsi="Garamond"/>
-          <w:sz w:val="24"/>
-          <w:szCs w:val="24"/>
+        <w:rPr/>
+      </w:pPr>
+      <w:r>
+        <w:rPr>
           <w:rtl w:val="0"/>
         </w:rPr>
         <w:t xml:space="preserve">A slide with these rules should be available for players throughout the game so they can refresh their memories if they need to. </w:t>
@@ -1661,24 +1323,12 @@
     <w:p>
       <w:pPr>
         <w:pStyle w:val="Heading2"/>
-        <w:spacing w:after="120" w:line="276" w:lineRule="auto"/>
-        <w:rPr>
-          <w:rFonts w:ascii="Garamond" w:cs="Garamond" w:eastAsia="Garamond" w:hAnsi="Garamond"/>
-          <w:b w:val="0"/>
-          <w:bCs w:val="0"/>
-          <w:sz w:val="32"/>
-          <w:szCs w:val="32"/>
-        </w:rPr>
-      </w:pPr>
-      <w:bookmarkStart w:colFirst="0" w:colLast="0" w:name="_35qvn8hk7yak" w:id="7"/>
-      <w:bookmarkEnd w:id="7"/>
-      <w:r>
-        <w:rPr>
-          <w:rFonts w:ascii="Garamond" w:cs="Garamond" w:eastAsia="Garamond" w:hAnsi="Garamond"/>
-          <w:b w:val="0"/>
-          <w:bCs w:val="0"/>
-          <w:sz w:val="32"/>
-          <w:szCs w:val="32"/>
+        <w:rPr/>
+      </w:pPr>
+      <w:bookmarkStart w:colFirst="0" w:colLast="0" w:name="_35qvn8hk7yak" w:id="8"/>
+      <w:bookmarkEnd w:id="8"/>
+      <w:r>
+        <w:rPr>
           <w:rtl w:val="0"/>
         </w:rPr>
         <w:t xml:space="preserve">3.2 The Hook</w:t>
@@ -1686,78 +1336,52 @@
     </w:p>
     <w:p>
       <w:pPr>
-        <w:spacing w:before="200" w:line="276" w:lineRule="auto"/>
-        <w:rPr>
-          <w:rFonts w:ascii="Garamond" w:cs="Garamond" w:eastAsia="Garamond" w:hAnsi="Garamond"/>
-          <w:sz w:val="24"/>
-          <w:szCs w:val="24"/>
-        </w:rPr>
-      </w:pPr>
-      <w:r>
-        <w:rPr>
-          <w:rFonts w:ascii="Garamond" w:cs="Garamond" w:eastAsia="Garamond" w:hAnsi="Garamond"/>
-          <w:sz w:val="24"/>
-          <w:szCs w:val="24"/>
+        <w:rPr/>
+      </w:pPr>
+      <w:r>
+        <w:rPr>
           <w:rtl w:val="0"/>
         </w:rPr>
         <w:t xml:space="preserve">After the introduction, players are introduced to the mystery by way of </w:t>
       </w:r>
       <w:r>
         <w:rPr>
-          <w:rFonts w:ascii="Garamond" w:cs="Garamond" w:eastAsia="Garamond" w:hAnsi="Garamond"/>
           <w:i w:val="1"/>
           <w:iCs w:val="1"/>
-          <w:sz w:val="24"/>
-          <w:szCs w:val="24"/>
           <w:rtl w:val="0"/>
         </w:rPr>
         <w:t xml:space="preserve">the hook</w:t>
       </w:r>
       <w:r>
         <w:rPr>
-          <w:rFonts w:ascii="Garamond" w:cs="Garamond" w:eastAsia="Garamond" w:hAnsi="Garamond"/>
-          <w:sz w:val="24"/>
-          <w:szCs w:val="24"/>
           <w:rtl w:val="0"/>
         </w:rPr>
         <w:t xml:space="preserve">: a piece of the narrative that presents the CCC, introduces the mystery </w:t>
       </w:r>
       <w:r>
         <w:rPr>
-          <w:rFonts w:ascii="Garamond" w:cs="Garamond" w:eastAsia="Garamond" w:hAnsi="Garamond"/>
           <w:i w:val="1"/>
           <w:iCs w:val="1"/>
-          <w:sz w:val="24"/>
-          <w:szCs w:val="24"/>
           <w:rtl w:val="0"/>
         </w:rPr>
         <w:t xml:space="preserve">and</w:t>
       </w:r>
       <w:r>
         <w:rPr>
-          <w:rFonts w:ascii="Garamond" w:cs="Garamond" w:eastAsia="Garamond" w:hAnsi="Garamond"/>
-          <w:sz w:val="24"/>
-          <w:szCs w:val="24"/>
           <w:rtl w:val="0"/>
         </w:rPr>
         <w:t xml:space="preserve"> situates the players within. For example, in </w:t>
       </w:r>
       <w:r>
         <w:rPr>
-          <w:rFonts w:ascii="Garamond" w:cs="Garamond" w:eastAsia="Garamond" w:hAnsi="Garamond"/>
           <w:i w:val="1"/>
           <w:iCs w:val="1"/>
-          <w:sz w:val="24"/>
-          <w:szCs w:val="24"/>
           <w:rtl w:val="0"/>
         </w:rPr>
         <w:t xml:space="preserve">The Commons’ Comma</w:t>
       </w:r>
       <w:r>
         <w:rPr>
-          <w:rFonts w:ascii="Garamond" w:cs="Garamond" w:eastAsia="Garamond" w:hAnsi="Garamond"/>
-          <w:sz w:val="24"/>
-          <w:szCs w:val="24"/>
           <w:rtl w:val="0"/>
         </w:rPr>
         <w:t xml:space="preserve"> players are student-interns working at the university president office and are tasked with solving their mystery as a task for a part time job they thought would be mostly scanning papers or organizing kitchenette cabinets.</w:t>
@@ -1765,18 +1389,10 @@
     </w:p>
     <w:p>
       <w:pPr>
-        <w:spacing w:before="200" w:line="276" w:lineRule="auto"/>
-        <w:rPr>
-          <w:rFonts w:ascii="Garamond" w:cs="Garamond" w:eastAsia="Garamond" w:hAnsi="Garamond"/>
-          <w:sz w:val="24"/>
-          <w:szCs w:val="24"/>
-        </w:rPr>
-      </w:pPr>
-      <w:r>
-        <w:rPr>
-          <w:rFonts w:ascii="Garamond" w:cs="Garamond" w:eastAsia="Garamond" w:hAnsi="Garamond"/>
-          <w:sz w:val="24"/>
-          <w:szCs w:val="24"/>
+        <w:rPr/>
+      </w:pPr>
+      <w:r>
+        <w:rPr>
           <w:rtl w:val="0"/>
         </w:rPr>
         <w:t xml:space="preserve">The hook should be carefully crafted to be both informative and entertaining, to give the players enough to go off of (there are no other opportunities for big chunks of exposition) as well as something interesting to pull them in and motivate them to be involved. The hook should also include a compelling time pressure which explains why there’s a limited number of questions that the players can ask before… well before something bad happens, but which bad thing, that is told during the hook. </w:t>
@@ -1785,24 +1401,12 @@
     <w:p>
       <w:pPr>
         <w:pStyle w:val="Heading2"/>
-        <w:spacing w:after="120" w:line="276" w:lineRule="auto"/>
-        <w:rPr>
-          <w:rFonts w:ascii="Garamond" w:cs="Garamond" w:eastAsia="Garamond" w:hAnsi="Garamond"/>
-          <w:b w:val="0"/>
-          <w:bCs w:val="0"/>
-          <w:sz w:val="32"/>
-          <w:szCs w:val="32"/>
-        </w:rPr>
-      </w:pPr>
-      <w:bookmarkStart w:colFirst="0" w:colLast="0" w:name="_j7v1h2yirc0i" w:id="8"/>
-      <w:bookmarkEnd w:id="8"/>
-      <w:r>
-        <w:rPr>
-          <w:rFonts w:ascii="Garamond" w:cs="Garamond" w:eastAsia="Garamond" w:hAnsi="Garamond"/>
-          <w:b w:val="0"/>
-          <w:bCs w:val="0"/>
-          <w:sz w:val="32"/>
-          <w:szCs w:val="32"/>
+        <w:rPr/>
+      </w:pPr>
+      <w:bookmarkStart w:colFirst="0" w:colLast="0" w:name="_j7v1h2yirc0i" w:id="9"/>
+      <w:bookmarkEnd w:id="9"/>
+      <w:r>
+        <w:rPr>
           <w:rtl w:val="0"/>
         </w:rPr>
         <w:t xml:space="preserve">3.3 Interviews</w:t>
@@ -1810,18 +1414,10 @@
     </w:p>
     <w:p>
       <w:pPr>
-        <w:spacing w:before="200" w:line="276" w:lineRule="auto"/>
-        <w:rPr>
-          <w:rFonts w:ascii="Garamond" w:cs="Garamond" w:eastAsia="Garamond" w:hAnsi="Garamond"/>
-          <w:sz w:val="24"/>
-          <w:szCs w:val="24"/>
-        </w:rPr>
-      </w:pPr>
-      <w:r>
-        <w:rPr>
-          <w:rFonts w:ascii="Garamond" w:cs="Garamond" w:eastAsia="Garamond" w:hAnsi="Garamond"/>
-          <w:sz w:val="24"/>
-          <w:szCs w:val="24"/>
+        <w:rPr/>
+      </w:pPr>
+      <w:r>
+        <w:rPr>
           <w:rtl w:val="0"/>
         </w:rPr>
         <w:t xml:space="preserve">As noted, the bulk of the game is made of interviews. Students will have a menu of options, each corresponding to a witness they can interview. Students can then ‘walk around’ the campus - going from witness to witness and asking each of them as many questions as they want, provided they have not yet run out of time (i.e. depleted their question ‘budget’) or angered that witness. There are 8 witnesses and each can be asked 8 questions. Since one question for each witness is a tripwire, that leaves us with 56 witness answers. Each one of these 56 answers is made of two parts.  </w:t>
@@ -1829,69 +1425,46 @@
     </w:p>
     <w:p>
       <w:pPr>
-        <w:spacing w:before="200" w:line="276" w:lineRule="auto"/>
-        <w:rPr>
-          <w:rFonts w:ascii="Garamond" w:cs="Garamond" w:eastAsia="Garamond" w:hAnsi="Garamond"/>
-          <w:sz w:val="24"/>
-          <w:szCs w:val="24"/>
-        </w:rPr>
-      </w:pPr>
-      <w:r>
-        <w:rPr>
-          <w:rFonts w:ascii="Garamond" w:cs="Garamond" w:eastAsia="Garamond" w:hAnsi="Garamond"/>
+        <w:rPr/>
+      </w:pPr>
+      <w:r>
+        <w:rPr>
           <w:b w:val="1"/>
           <w:bCs w:val="1"/>
-          <w:sz w:val="24"/>
-          <w:szCs w:val="24"/>
           <w:rtl w:val="0"/>
         </w:rPr>
         <w:t xml:space="preserve">A piece of information</w:t>
       </w:r>
       <w:r>
         <w:rPr>
-          <w:rFonts w:ascii="Garamond" w:cs="Garamond" w:eastAsia="Garamond" w:hAnsi="Garamond"/>
-          <w:sz w:val="24"/>
-          <w:szCs w:val="24"/>
           <w:rtl w:val="0"/>
         </w:rPr>
         <w:t xml:space="preserve"> about the mystery. Of the seven non-tripwire answers of each witness, 4 convey useful information, which technically will be referred to as </w:t>
       </w:r>
       <w:r>
         <w:rPr>
-          <w:rFonts w:ascii="Garamond" w:cs="Garamond" w:eastAsia="Garamond" w:hAnsi="Garamond"/>
           <w:i w:val="1"/>
           <w:iCs w:val="1"/>
-          <w:sz w:val="24"/>
-          <w:szCs w:val="24"/>
           <w:rtl w:val="0"/>
         </w:rPr>
         <w:t xml:space="preserve">Clues</w:t>
       </w:r>
       <w:r>
         <w:rPr>
-          <w:rFonts w:ascii="Garamond" w:cs="Garamond" w:eastAsia="Garamond" w:hAnsi="Garamond"/>
-          <w:sz w:val="24"/>
-          <w:szCs w:val="24"/>
           <w:rtl w:val="0"/>
         </w:rPr>
         <w:t xml:space="preserve">, and 3 pieces of misleading or unhelpful information, which technically will be referred to as </w:t>
       </w:r>
       <w:r>
         <w:rPr>
-          <w:rFonts w:ascii="Garamond" w:cs="Garamond" w:eastAsia="Garamond" w:hAnsi="Garamond"/>
           <w:i w:val="1"/>
           <w:iCs w:val="1"/>
-          <w:sz w:val="24"/>
-          <w:szCs w:val="24"/>
           <w:rtl w:val="0"/>
         </w:rPr>
         <w:t xml:space="preserve">Red Herrings,</w:t>
       </w:r>
       <w:r>
         <w:rPr>
-          <w:rFonts w:ascii="Garamond" w:cs="Garamond" w:eastAsia="Garamond" w:hAnsi="Garamond"/>
-          <w:sz w:val="24"/>
-          <w:szCs w:val="24"/>
           <w:rtl w:val="0"/>
         </w:rPr>
         <w:t xml:space="preserve"> Across eight witnesses that is 32 useful answers and 24 red herrings.</w:t>
@@ -1903,39 +1476,25 @@
           <w:ilvl w:val="0"/>
           <w:numId w:val="8"/>
         </w:numPr>
-        <w:spacing w:after="0" w:afterAutospacing="0" w:before="200" w:line="276" w:lineRule="auto"/>
+        <w:spacing w:after="0" w:afterAutospacing="0"/>
         <w:ind w:left="720" w:hanging="360"/>
-        <w:rPr>
-          <w:rFonts w:ascii="Garamond" w:cs="Garamond" w:eastAsia="Garamond" w:hAnsi="Garamond"/>
-          <w:sz w:val="24"/>
-          <w:szCs w:val="24"/>
-        </w:rPr>
-      </w:pPr>
-      <w:r>
-        <w:rPr>
-          <w:rFonts w:ascii="Garamond" w:cs="Garamond" w:eastAsia="Garamond" w:hAnsi="Garamond"/>
-          <w:sz w:val="24"/>
-          <w:szCs w:val="24"/>
+      </w:pPr>
+      <w:r>
+        <w:rPr>
           <w:rtl w:val="0"/>
         </w:rPr>
         <w:t xml:space="preserve">The 32 useful answers include </w:t>
       </w:r>
       <w:r>
         <w:rPr>
-          <w:rFonts w:ascii="Garamond" w:cs="Garamond" w:eastAsia="Garamond" w:hAnsi="Garamond"/>
           <w:b w:val="1"/>
           <w:bCs w:val="1"/>
-          <w:sz w:val="24"/>
-          <w:szCs w:val="24"/>
           <w:rtl w:val="0"/>
         </w:rPr>
         <w:t xml:space="preserve">16 Clues</w:t>
       </w:r>
       <w:r>
         <w:rPr>
-          <w:rFonts w:ascii="Garamond" w:cs="Garamond" w:eastAsia="Garamond" w:hAnsi="Garamond"/>
-          <w:sz w:val="24"/>
-          <w:szCs w:val="24"/>
           <w:rtl w:val="0"/>
         </w:rPr>
         <w:t xml:space="preserve">, each given by two different witnesses. This gives the player more than one route to access each clue as well as an (imperfect) signal regarding the reliability of the information.</w:t>
@@ -1947,57 +1506,37 @@
           <w:ilvl w:val="0"/>
           <w:numId w:val="8"/>
         </w:numPr>
-        <w:spacing w:after="0" w:afterAutospacing="0" w:before="0" w:beforeAutospacing="0" w:line="276" w:lineRule="auto"/>
+        <w:spacing w:after="0" w:afterAutospacing="0" w:before="0" w:beforeAutospacing="0"/>
         <w:ind w:left="720" w:hanging="360"/>
-        <w:rPr>
-          <w:rFonts w:ascii="Garamond" w:cs="Garamond" w:eastAsia="Garamond" w:hAnsi="Garamond"/>
-          <w:sz w:val="24"/>
-          <w:szCs w:val="24"/>
-        </w:rPr>
-      </w:pPr>
-      <w:r>
-        <w:rPr>
-          <w:rFonts w:ascii="Garamond" w:cs="Garamond" w:eastAsia="Garamond" w:hAnsi="Garamond"/>
-          <w:sz w:val="24"/>
-          <w:szCs w:val="24"/>
+      </w:pPr>
+      <w:r>
+        <w:rPr>
           <w:rtl w:val="0"/>
         </w:rPr>
         <w:t xml:space="preserve">The </w:t>
       </w:r>
       <w:r>
         <w:rPr>
-          <w:rFonts w:ascii="Garamond" w:cs="Garamond" w:eastAsia="Garamond" w:hAnsi="Garamond"/>
           <w:b w:val="1"/>
           <w:bCs w:val="1"/>
-          <w:sz w:val="24"/>
-          <w:szCs w:val="24"/>
           <w:rtl w:val="0"/>
         </w:rPr>
         <w:t xml:space="preserve">24 Red Herrings</w:t>
       </w:r>
       <w:r>
         <w:rPr>
-          <w:rFonts w:ascii="Garamond" w:cs="Garamond" w:eastAsia="Garamond" w:hAnsi="Garamond"/>
-          <w:sz w:val="24"/>
-          <w:szCs w:val="24"/>
           <w:rtl w:val="0"/>
         </w:rPr>
         <w:t xml:space="preserve"> are each given once and they are grouped in sets (of 2/3/4) such that the Red Herrings that form a set 'cancel each other out,' so if you have all members of a set you should be able to deduce that neither of them are relevant to the case. For example, a set of Red Herrings may include descriptions of suspicious-but-not-actually-incriminating behaviors by one of the suspects as well as some exonerating information about that suspect. Taken on their own, the suspicious behaviors may seem pertinent to the case but the exonerating information shows that despite their attractiveness, the pieces of information about the suspicious behavior are not helpful.</w:t>
       </w:r>
       <w:r>
         <w:rPr>
-          <w:rFonts w:ascii="Garamond" w:cs="Garamond" w:eastAsia="Garamond" w:hAnsi="Garamond"/>
-          <w:sz w:val="24"/>
-          <w:szCs w:val="24"/>
           <w:vertAlign w:val="superscript"/>
         </w:rPr>
         <w:footnoteReference w:customMarkFollows="0" w:id="4"/>
       </w:r>
       <w:r>
         <w:rPr>
-          <w:rFonts w:ascii="Garamond" w:cs="Garamond" w:eastAsia="Garamond" w:hAnsi="Garamond"/>
-          <w:sz w:val="24"/>
-          <w:szCs w:val="24"/>
           <w:rtl w:val="0"/>
         </w:rPr>
         <w:t xml:space="preserve"> Another example is a set of Red Herrings that make up lies which can be exposed when one has the whole set. </w:t>
@@ -2009,19 +1548,11 @@
           <w:ilvl w:val="0"/>
           <w:numId w:val="8"/>
         </w:numPr>
-        <w:spacing w:before="0" w:beforeAutospacing="0" w:line="276" w:lineRule="auto"/>
+        <w:spacing w:before="0" w:beforeAutospacing="0"/>
         <w:ind w:left="720" w:hanging="360"/>
-        <w:rPr>
-          <w:rFonts w:ascii="Garamond" w:cs="Garamond" w:eastAsia="Garamond" w:hAnsi="Garamond"/>
-          <w:sz w:val="24"/>
-          <w:szCs w:val="24"/>
-        </w:rPr>
-      </w:pPr>
-      <w:r>
-        <w:rPr>
-          <w:rFonts w:ascii="Garamond" w:cs="Garamond" w:eastAsia="Garamond" w:hAnsi="Garamond"/>
-          <w:sz w:val="24"/>
-          <w:szCs w:val="24"/>
+      </w:pPr>
+      <w:r>
+        <w:rPr>
           <w:rtl w:val="0"/>
         </w:rPr>
         <w:t xml:space="preserve">Useful clues gained without follow-ups point in the right direction but are individually inconclusive. Together, all 16 do add up to the solution, but a player working from ordinary clues alone will usually have to reason across gaps.</w:t>
@@ -2029,29 +1560,18 @@
     </w:p>
     <w:p>
       <w:pPr>
-        <w:spacing w:before="200" w:line="276" w:lineRule="auto"/>
-        <w:rPr>
-          <w:rFonts w:ascii="Garamond" w:cs="Garamond" w:eastAsia="Garamond" w:hAnsi="Garamond"/>
-          <w:sz w:val="24"/>
-          <w:szCs w:val="24"/>
-        </w:rPr>
-      </w:pPr>
-      <w:r>
-        <w:rPr>
-          <w:rFonts w:ascii="Garamond" w:cs="Garamond" w:eastAsia="Garamond" w:hAnsi="Garamond"/>
+        <w:rPr/>
+      </w:pPr>
+      <w:r>
+        <w:rPr>
           <w:b w:val="1"/>
           <w:bCs w:val="1"/>
-          <w:sz w:val="24"/>
-          <w:szCs w:val="24"/>
           <w:rtl w:val="0"/>
         </w:rPr>
         <w:t xml:space="preserve">An expressed opinion about the controversy</w:t>
       </w:r>
       <w:r>
         <w:rPr>
-          <w:rFonts w:ascii="Garamond" w:cs="Garamond" w:eastAsia="Garamond" w:hAnsi="Garamond"/>
-          <w:sz w:val="24"/>
-          <w:szCs w:val="24"/>
           <w:rtl w:val="0"/>
         </w:rPr>
         <w:t xml:space="preserve">. Alongside the information provided about the mystery, witnesses volunteer their view of the CCC and say how their view differs from that of one of the other witnesses. As part of the scenario setup, witnesses are ranked by their receptiveness. The witness ranked 1 expresses their opinion receptively in all seven answers, rank 2 in six of seven, rank 3 in five, and so on down to rank 8, who is receptive in none. Overall, exactly half of the 56 opinion expressions are receptive. The details of this ranking are not shared with the players though the general fact regarding the variance in receptiveness. </w:t>
@@ -2059,38 +1579,24 @@
     </w:p>
     <w:p>
       <w:pPr>
-        <w:spacing w:before="200" w:line="276" w:lineRule="auto"/>
-        <w:rPr>
-          <w:rFonts w:ascii="Garamond" w:cs="Garamond" w:eastAsia="Garamond" w:hAnsi="Garamond"/>
-          <w:sz w:val="24"/>
-          <w:szCs w:val="24"/>
-        </w:rPr>
-      </w:pPr>
-      <w:r>
-        <w:rPr>
-          <w:rFonts w:ascii="Garamond" w:cs="Garamond" w:eastAsia="Garamond" w:hAnsi="Garamond"/>
-          <w:sz w:val="24"/>
-          <w:szCs w:val="24"/>
+        <w:rPr/>
+      </w:pPr>
+      <w:r>
+        <w:rPr>
           <w:rtl w:val="0"/>
         </w:rPr>
         <w:t xml:space="preserve">Receptive expressions use one or more HEAR moves while unreceptive ones expresses their views on the basis of </w:t>
       </w:r>
       <w:r>
         <w:rPr>
-          <w:rFonts w:ascii="Garamond" w:cs="Garamond" w:eastAsia="Garamond" w:hAnsi="Garamond"/>
           <w:i w:val="1"/>
           <w:iCs w:val="1"/>
-          <w:sz w:val="24"/>
-          <w:szCs w:val="24"/>
           <w:rtl w:val="0"/>
         </w:rPr>
         <w:t xml:space="preserve">naive realism</w:t>
       </w:r>
       <w:r>
         <w:rPr>
-          <w:rFonts w:ascii="Garamond" w:cs="Garamond" w:eastAsia="Garamond" w:hAnsi="Garamond"/>
-          <w:sz w:val="24"/>
-          <w:szCs w:val="24"/>
           <w:rtl w:val="0"/>
         </w:rPr>
         <w:t xml:space="preserve">, assuming their perspective is obviously true and so uses absolute language (‘obviously’), fails to acknowledge the other perspective or recognize it as legitimate, focus on how other views are wrong rather than seek agreement and so forth.  </w:t>
@@ -2099,22 +1605,12 @@
     <w:p>
       <w:pPr>
         <w:pStyle w:val="Heading3"/>
-        <w:spacing w:before="320" w:line="276" w:lineRule="auto"/>
-        <w:rPr>
-          <w:rFonts w:ascii="Garamond" w:cs="Garamond" w:eastAsia="Garamond" w:hAnsi="Garamond"/>
-          <w:b w:val="0"/>
-          <w:bCs w:val="0"/>
-          <w:color w:val="434343"/>
-        </w:rPr>
-      </w:pPr>
-      <w:bookmarkStart w:colFirst="0" w:colLast="0" w:name="_n565rz9sqema" w:id="9"/>
-      <w:bookmarkEnd w:id="9"/>
-      <w:r>
-        <w:rPr>
-          <w:rFonts w:ascii="Garamond" w:cs="Garamond" w:eastAsia="Garamond" w:hAnsi="Garamond"/>
-          <w:b w:val="0"/>
-          <w:bCs w:val="0"/>
-          <w:color w:val="434343"/>
+        <w:rPr/>
+      </w:pPr>
+      <w:bookmarkStart w:colFirst="0" w:colLast="0" w:name="_n565rz9sqema" w:id="10"/>
+      <w:bookmarkEnd w:id="10"/>
+      <w:r>
+        <w:rPr>
           <w:rtl w:val="0"/>
         </w:rPr>
         <w:t xml:space="preserve">3.3.1 Follow-up questions and Major Clues</w:t>
@@ -2122,36 +1618,22 @@
     </w:p>
     <w:p>
       <w:pPr>
-        <w:spacing w:before="200" w:line="276" w:lineRule="auto"/>
-        <w:rPr>
-          <w:rFonts w:ascii="Garamond" w:cs="Garamond" w:eastAsia="Garamond" w:hAnsi="Garamond"/>
-          <w:sz w:val="24"/>
-          <w:szCs w:val="24"/>
-        </w:rPr>
-      </w:pPr>
-      <w:r>
-        <w:rPr>
-          <w:rFonts w:ascii="Garamond" w:cs="Garamond" w:eastAsia="Garamond" w:hAnsi="Garamond"/>
-          <w:sz w:val="24"/>
-          <w:szCs w:val="24"/>
+        <w:rPr/>
+      </w:pPr>
+      <w:r>
+        <w:rPr>
           <w:rtl w:val="0"/>
         </w:rPr>
         <w:t xml:space="preserve">Once per witness, after any answer except for the tripwire, players may choose to “ask a follow-up about their opinion”. The game then offers </w:t>
       </w:r>
       <w:r>
         <w:rPr>
-          <w:rFonts w:ascii="Garamond" w:cs="Garamond" w:eastAsia="Garamond" w:hAnsi="Garamond"/>
-          <w:sz w:val="24"/>
-          <w:szCs w:val="24"/>
           <w:rtl w:val="0"/>
         </w:rPr>
         <w:t xml:space="preserve">two </w:t>
       </w:r>
       <w:r>
         <w:rPr>
-          <w:rFonts w:ascii="Garamond" w:cs="Garamond" w:eastAsia="Garamond" w:hAnsi="Garamond"/>
-          <w:sz w:val="24"/>
-          <w:szCs w:val="24"/>
           <w:rtl w:val="0"/>
         </w:rPr>
         <w:t xml:space="preserve">follow-up questions about the witness’s view of the controversy. Both options should be relevant and seem like reasonable responses though one will be framed as more receptive than the other. Each witness has only one pair of follow-up questions so they would not be super tailored to the particular response a witness just gave but instead will be responsive to their position about the CCC. Note: The follow-up does not depend on the witness’s own receptiveness.</w:t>
@@ -2159,38 +1641,24 @@
     </w:p>
     <w:p>
       <w:pPr>
-        <w:spacing w:before="200" w:line="276" w:lineRule="auto"/>
-        <w:rPr>
-          <w:rFonts w:ascii="Garamond" w:cs="Garamond" w:eastAsia="Garamond" w:hAnsi="Garamond"/>
-          <w:sz w:val="24"/>
-          <w:szCs w:val="24"/>
-        </w:rPr>
-      </w:pPr>
-      <w:r>
-        <w:rPr>
-          <w:rFonts w:ascii="Garamond" w:cs="Garamond" w:eastAsia="Garamond" w:hAnsi="Garamond"/>
-          <w:sz w:val="24"/>
-          <w:szCs w:val="24"/>
+        <w:rPr/>
+      </w:pPr>
+      <w:r>
+        <w:rPr>
           <w:rtl w:val="0"/>
         </w:rPr>
         <w:t xml:space="preserve">How obvious or subtle this difference will be requires careful calibration. Making it too obvious will make the learning element of the game feel cheap and could render the mystery trivial. Making it too subtle can cause frustration to users who may feel like they couldn’t have been expected to interpret such a subtle difference. In general, </w:t>
       </w:r>
       <w:r>
         <w:rPr>
-          <w:rFonts w:ascii="Garamond" w:cs="Garamond" w:eastAsia="Garamond" w:hAnsi="Garamond"/>
           <w:b w:val="1"/>
           <w:bCs w:val="1"/>
-          <w:sz w:val="24"/>
-          <w:szCs w:val="24"/>
           <w:rtl w:val="0"/>
         </w:rPr>
         <w:t xml:space="preserve">picking the correct follow-up should be as difficult as possible</w:t>
       </w:r>
       <w:r>
         <w:rPr>
-          <w:rFonts w:ascii="Garamond" w:cs="Garamond" w:eastAsia="Garamond" w:hAnsi="Garamond"/>
-          <w:sz w:val="24"/>
-          <w:szCs w:val="24"/>
           <w:rtl w:val="0"/>
         </w:rPr>
         <w:t xml:space="preserve"> while having a solid justification from the HEAR framework. It’s ok if there is some variation in the difficulty between witnesses. </w:t>
@@ -2202,39 +1670,25 @@
           <w:ilvl w:val="0"/>
           <w:numId w:val="1"/>
         </w:numPr>
-        <w:spacing w:after="0" w:afterAutospacing="0" w:before="200" w:line="276" w:lineRule="auto"/>
+        <w:spacing w:after="0" w:afterAutospacing="0"/>
         <w:ind w:left="720" w:hanging="360"/>
-        <w:rPr>
-          <w:rFonts w:ascii="Garamond" w:cs="Garamond" w:eastAsia="Garamond" w:hAnsi="Garamond"/>
-          <w:sz w:val="24"/>
-          <w:szCs w:val="24"/>
-        </w:rPr>
-      </w:pPr>
-      <w:r>
-        <w:rPr>
-          <w:rFonts w:ascii="Garamond" w:cs="Garamond" w:eastAsia="Garamond" w:hAnsi="Garamond"/>
-          <w:sz w:val="24"/>
-          <w:szCs w:val="24"/>
+      </w:pPr>
+      <w:r>
+        <w:rPr>
           <w:rtl w:val="0"/>
         </w:rPr>
         <w:t xml:space="preserve">If the player picks the more receptive follow-up, the witness opens up and the player earns one of the four </w:t>
       </w:r>
       <w:r>
         <w:rPr>
-          <w:rFonts w:ascii="Garamond" w:cs="Garamond" w:eastAsia="Garamond" w:hAnsi="Garamond"/>
           <w:b w:val="1"/>
           <w:bCs w:val="1"/>
-          <w:sz w:val="24"/>
-          <w:szCs w:val="24"/>
           <w:rtl w:val="0"/>
         </w:rPr>
         <w:t xml:space="preserve">Major Clues</w:t>
       </w:r>
       <w:r>
         <w:rPr>
-          <w:rFonts w:ascii="Garamond" w:cs="Garamond" w:eastAsia="Garamond" w:hAnsi="Garamond"/>
-          <w:sz w:val="24"/>
-          <w:szCs w:val="24"/>
           <w:rtl w:val="0"/>
         </w:rPr>
         <w:t xml:space="preserve">. The game then shows a short explanation of why that phrasing worked and which HEAR elements it used.</w:t>
@@ -2246,19 +1700,11 @@
           <w:ilvl w:val="0"/>
           <w:numId w:val="1"/>
         </w:numPr>
-        <w:spacing w:before="0" w:beforeAutospacing="0" w:line="276" w:lineRule="auto"/>
+        <w:spacing w:before="0" w:beforeAutospacing="0"/>
         <w:ind w:left="720" w:hanging="360"/>
-        <w:rPr>
-          <w:rFonts w:ascii="Garamond" w:cs="Garamond" w:eastAsia="Garamond" w:hAnsi="Garamond"/>
-          <w:sz w:val="24"/>
-          <w:szCs w:val="24"/>
-        </w:rPr>
-      </w:pPr>
-      <w:r>
-        <w:rPr>
-          <w:rFonts w:ascii="Garamond" w:cs="Garamond" w:eastAsia="Garamond" w:hAnsi="Garamond"/>
-          <w:sz w:val="24"/>
-          <w:szCs w:val="24"/>
+      </w:pPr>
+      <w:r>
+        <w:rPr>
           <w:rtl w:val="0"/>
         </w:rPr>
         <w:t xml:space="preserve">If the player picks the unreceptive follow-up, the witness refuses to say anything more and the interview ends, exactly as if a tripwire had been asked.</w:t>
@@ -2266,18 +1712,10 @@
     </w:p>
     <w:p>
       <w:pPr>
-        <w:spacing w:before="200" w:line="276" w:lineRule="auto"/>
-        <w:rPr>
-          <w:rFonts w:ascii="Garamond" w:cs="Garamond" w:eastAsia="Garamond" w:hAnsi="Garamond"/>
-          <w:sz w:val="24"/>
-          <w:szCs w:val="24"/>
-        </w:rPr>
-      </w:pPr>
-      <w:r>
-        <w:rPr>
-          <w:rFonts w:ascii="Garamond" w:cs="Garamond" w:eastAsia="Garamond" w:hAnsi="Garamond"/>
-          <w:sz w:val="24"/>
-          <w:szCs w:val="24"/>
+        <w:rPr/>
+      </w:pPr>
+      <w:r>
+        <w:rPr>
           <w:rtl w:val="0"/>
         </w:rPr>
         <w:t xml:space="preserve">There are four Major Clues per scenario. Each Major Clue combines four of the 16 ordinary clues such that all four Major Clues together cover all 16 standard Clues without overlap. Therefore, together the four Major Clues make the solution unmistakable. Each time a Major Clue is earned the player also gains the next letter of the word H-E-A-R, displayed on screen. The letters are a progress tally and are not tied to specific HEAR elements or specific clues. After all four Major Clues are earned, a further successful follow-up still produces the explanation but no new clue.</w:t>
@@ -2286,24 +1724,12 @@
     <w:p>
       <w:pPr>
         <w:pStyle w:val="Heading2"/>
-        <w:spacing w:after="120" w:line="276" w:lineRule="auto"/>
-        <w:rPr>
-          <w:rFonts w:ascii="Garamond" w:cs="Garamond" w:eastAsia="Garamond" w:hAnsi="Garamond"/>
-          <w:b w:val="0"/>
-          <w:bCs w:val="0"/>
-          <w:sz w:val="32"/>
-          <w:szCs w:val="32"/>
-        </w:rPr>
-      </w:pPr>
-      <w:bookmarkStart w:colFirst="0" w:colLast="0" w:name="_1qymattj2854" w:id="10"/>
-      <w:bookmarkEnd w:id="10"/>
-      <w:r>
-        <w:rPr>
-          <w:rFonts w:ascii="Garamond" w:cs="Garamond" w:eastAsia="Garamond" w:hAnsi="Garamond"/>
-          <w:b w:val="0"/>
-          <w:bCs w:val="0"/>
-          <w:sz w:val="32"/>
-          <w:szCs w:val="32"/>
+        <w:rPr/>
+      </w:pPr>
+      <w:bookmarkStart w:colFirst="0" w:colLast="0" w:name="_1qymattj2854" w:id="11"/>
+      <w:bookmarkEnd w:id="11"/>
+      <w:r>
+        <w:rPr>
           <w:rtl w:val="0"/>
         </w:rPr>
         <w:t xml:space="preserve">3.4 Solving the Mystery and Ending</w:t>
@@ -2311,58 +1737,38 @@
     </w:p>
     <w:p>
       <w:pPr>
-        <w:spacing w:before="200" w:line="276" w:lineRule="auto"/>
-        <w:rPr>
-          <w:rFonts w:ascii="Garamond" w:cs="Garamond" w:eastAsia="Garamond" w:hAnsi="Garamond"/>
-          <w:sz w:val="24"/>
-          <w:szCs w:val="24"/>
-        </w:rPr>
-      </w:pPr>
-      <w:r>
-        <w:rPr>
-          <w:rFonts w:ascii="Garamond" w:cs="Garamond" w:eastAsia="Garamond" w:hAnsi="Garamond"/>
-          <w:sz w:val="24"/>
-          <w:szCs w:val="24"/>
+        <w:rPr/>
+      </w:pPr>
+      <w:r>
+        <w:rPr>
           <w:rtl w:val="0"/>
         </w:rPr>
         <w:t xml:space="preserve">After every interview question that’s resolved, players may choose to </w:t>
       </w:r>
       <w:r>
         <w:rPr>
-          <w:rFonts w:ascii="Garamond" w:cs="Garamond" w:eastAsia="Garamond" w:hAnsi="Garamond"/>
           <w:i w:val="1"/>
           <w:iCs w:val="1"/>
-          <w:sz w:val="24"/>
-          <w:szCs w:val="24"/>
           <w:rtl w:val="0"/>
         </w:rPr>
         <w:t xml:space="preserve">solve</w:t>
       </w:r>
       <w:r>
         <w:rPr>
-          <w:rFonts w:ascii="Garamond" w:cs="Garamond" w:eastAsia="Garamond" w:hAnsi="Garamond"/>
-          <w:sz w:val="24"/>
-          <w:szCs w:val="24"/>
           <w:rtl w:val="0"/>
         </w:rPr>
         <w:t xml:space="preserve"> the case. Solving the case just means that players are given an opportunity to submit their answers (which may be referred to as a guess, though hopefully isn’t the result of pure guesswork). </w:t>
       </w:r>
       <w:r>
         <w:rPr>
-          <w:rFonts w:ascii="Garamond" w:cs="Garamond" w:eastAsia="Garamond" w:hAnsi="Garamond"/>
           <w:b w:val="1"/>
           <w:bCs w:val="1"/>
-          <w:sz w:val="24"/>
-          <w:szCs w:val="24"/>
           <w:rtl w:val="0"/>
         </w:rPr>
         <w:t xml:space="preserve">Players are given three chances to submit their answers</w:t>
       </w:r>
       <w:r>
         <w:rPr>
-          <w:rFonts w:ascii="Garamond" w:cs="Garamond" w:eastAsia="Garamond" w:hAnsi="Garamond"/>
-          <w:sz w:val="24"/>
-          <w:szCs w:val="24"/>
           <w:rtl w:val="0"/>
         </w:rPr>
         <w:t xml:space="preserve">. After a wrong submission the game says only that it is not the solution, not which part is wrong. Players may then keep investigating (if they have questions left) or submit again. After a correct submission, or a third wrong one, they are directed to the ending. A correct solution earns 3 points on the first try, 2 on the second and 1 on the third; the debrief shows how many tries were used. </w:t>
@@ -2370,18 +1776,10 @@
     </w:p>
     <w:p>
       <w:pPr>
-        <w:spacing w:before="200" w:line="276" w:lineRule="auto"/>
-        <w:rPr>
-          <w:rFonts w:ascii="Garamond" w:cs="Garamond" w:eastAsia="Garamond" w:hAnsi="Garamond"/>
-          <w:sz w:val="24"/>
-          <w:szCs w:val="24"/>
-        </w:rPr>
-      </w:pPr>
-      <w:r>
-        <w:rPr>
-          <w:rFonts w:ascii="Garamond" w:cs="Garamond" w:eastAsia="Garamond" w:hAnsi="Garamond"/>
-          <w:sz w:val="24"/>
-          <w:szCs w:val="24"/>
+        <w:rPr/>
+      </w:pPr>
+      <w:r>
+        <w:rPr>
           <w:rtl w:val="0"/>
         </w:rPr>
         <w:t xml:space="preserve">If players have no more questions in their allotted budget, they ‘run out of time’ - they have to submit their best guess and hope for the best. </w:t>
@@ -2389,18 +1787,10 @@
     </w:p>
     <w:p>
       <w:pPr>
-        <w:spacing w:before="200" w:line="276" w:lineRule="auto"/>
-        <w:rPr>
-          <w:rFonts w:ascii="Garamond" w:cs="Garamond" w:eastAsia="Garamond" w:hAnsi="Garamond"/>
-          <w:sz w:val="24"/>
-          <w:szCs w:val="24"/>
-        </w:rPr>
-      </w:pPr>
-      <w:r>
-        <w:rPr>
-          <w:rFonts w:ascii="Garamond" w:cs="Garamond" w:eastAsia="Garamond" w:hAnsi="Garamond"/>
-          <w:sz w:val="24"/>
-          <w:szCs w:val="24"/>
+        <w:rPr/>
+      </w:pPr>
+      <w:r>
+        <w:rPr>
           <w:rtl w:val="0"/>
         </w:rPr>
         <w:t xml:space="preserve">The ending should include a reveal of the full story which should be a satisfying twist. There would be slightly different endings depending on whether the players picked the right solution or not. Alongside the satisfaction of solving the case correctly, the story reveal is a big part of the payoff players get from playing the game so hopefully even players that didn’t solve correctly will have a pleasing experience. </w:t>
@@ -2408,18 +1798,10 @@
     </w:p>
     <w:p>
       <w:pPr>
-        <w:spacing w:before="200" w:line="276" w:lineRule="auto"/>
-        <w:rPr>
-          <w:rFonts w:ascii="Garamond" w:cs="Garamond" w:eastAsia="Garamond" w:hAnsi="Garamond"/>
-          <w:sz w:val="24"/>
-          <w:szCs w:val="24"/>
-        </w:rPr>
-      </w:pPr>
-      <w:r>
-        <w:rPr>
-          <w:rFonts w:ascii="Garamond" w:cs="Garamond" w:eastAsia="Garamond" w:hAnsi="Garamond"/>
-          <w:sz w:val="24"/>
-          <w:szCs w:val="24"/>
+        <w:rPr/>
+      </w:pPr>
+      <w:r>
+        <w:rPr>
           <w:rtl w:val="0"/>
         </w:rPr>
         <w:t xml:space="preserve">After the big reveal, players should be asked to rank the witnesses in order of their receptiveness. The ranking should be graded in terms of its difference from the real ranking and a score be given. Depending on the context, there’s an option to create a leaderboard with scores of different students.</w:t>
@@ -2428,25 +1810,13 @@
     <w:p>
       <w:pPr>
         <w:pStyle w:val="Heading1"/>
-        <w:spacing w:before="400" w:line="276" w:lineRule="auto"/>
-        <w:rPr>
-          <w:rFonts w:ascii="Garamond" w:cs="Garamond" w:eastAsia="Garamond" w:hAnsi="Garamond"/>
-          <w:b w:val="0"/>
-          <w:bCs w:val="0"/>
-          <w:sz w:val="40"/>
-          <w:szCs w:val="40"/>
-        </w:rPr>
-      </w:pPr>
-      <w:bookmarkStart w:colFirst="0" w:colLast="0" w:name="_6ox7aix20q37" w:id="11"/>
-      <w:bookmarkEnd w:id="11"/>
+        <w:rPr/>
+      </w:pPr>
+      <w:bookmarkStart w:colFirst="0" w:colLast="0" w:name="_6ox7aix20q37" w:id="12"/>
+      <w:bookmarkEnd w:id="12"/>
       <w:commentRangeStart w:id="0"/>
       <w:r>
         <w:rPr>
-          <w:rFonts w:ascii="Garamond" w:cs="Garamond" w:eastAsia="Garamond" w:hAnsi="Garamond"/>
-          <w:b w:val="0"/>
-          <w:bCs w:val="0"/>
-          <w:sz w:val="40"/>
-          <w:szCs w:val="40"/>
           <w:rtl w:val="0"/>
         </w:rPr>
         <w:t xml:space="preserve">4. What a scenario packet contains</w:t>
@@ -2463,18 +1833,10 @@
     </w:p>
     <w:p>
       <w:pPr>
-        <w:spacing w:before="200" w:line="276" w:lineRule="auto"/>
-        <w:rPr>
-          <w:rFonts w:ascii="Garamond" w:cs="Garamond" w:eastAsia="Garamond" w:hAnsi="Garamond"/>
-          <w:sz w:val="24"/>
-          <w:szCs w:val="24"/>
-        </w:rPr>
-      </w:pPr>
-      <w:r>
-        <w:rPr>
-          <w:rFonts w:ascii="Garamond" w:cs="Garamond" w:eastAsia="Garamond" w:hAnsi="Garamond"/>
-          <w:sz w:val="24"/>
-          <w:szCs w:val="24"/>
+        <w:rPr/>
+      </w:pPr>
+      <w:r>
+        <w:rPr>
           <w:rtl w:val="0"/>
         </w:rPr>
         <w:t xml:space="preserve">A scenario packet is everything the Twine engine needs to produce a playable game. It consists of one narrative document, one response-matrix workbook, and an assets folder, and it must contain the following.</w:t>
@@ -2486,19 +1848,11 @@
           <w:ilvl w:val="0"/>
           <w:numId w:val="2"/>
         </w:numPr>
-        <w:spacing w:after="0" w:afterAutospacing="0" w:before="200" w:line="276" w:lineRule="auto"/>
+        <w:spacing w:after="0" w:afterAutospacing="0"/>
         <w:ind w:left="720" w:hanging="360"/>
-        <w:rPr>
-          <w:rFonts w:ascii="Garamond" w:cs="Garamond" w:eastAsia="Garamond" w:hAnsi="Garamond"/>
-          <w:sz w:val="24"/>
-          <w:szCs w:val="24"/>
-        </w:rPr>
-      </w:pPr>
-      <w:r>
-        <w:rPr>
-          <w:rFonts w:ascii="Garamond" w:cs="Garamond" w:eastAsia="Garamond" w:hAnsi="Garamond"/>
-          <w:sz w:val="24"/>
-          <w:szCs w:val="24"/>
+      </w:pPr>
+      <w:r>
+        <w:rPr>
           <w:rtl w:val="0"/>
         </w:rPr>
         <w:t xml:space="preserve">Title, scenario ID (used in filenames and the engine), background/summary. </w:t>
@@ -2510,30 +1864,19 @@
           <w:ilvl w:val="0"/>
           <w:numId w:val="2"/>
         </w:numPr>
-        <w:spacing w:after="0" w:afterAutospacing="0" w:before="0" w:beforeAutospacing="0" w:line="276" w:lineRule="auto"/>
+        <w:spacing w:after="0" w:afterAutospacing="0" w:before="0" w:beforeAutospacing="0"/>
         <w:ind w:left="720" w:hanging="360"/>
-        <w:rPr>
-          <w:rFonts w:ascii="Garamond" w:cs="Garamond" w:eastAsia="Garamond" w:hAnsi="Garamond"/>
-          <w:sz w:val="24"/>
-          <w:szCs w:val="24"/>
-        </w:rPr>
-      </w:pPr>
-      <w:r>
-        <w:rPr>
-          <w:rFonts w:ascii="Garamond" w:cs="Garamond" w:eastAsia="Garamond" w:hAnsi="Garamond"/>
+      </w:pPr>
+      <w:r>
+        <w:rPr>
           <w:b w:val="1"/>
           <w:bCs w:val="1"/>
-          <w:sz w:val="24"/>
-          <w:szCs w:val="24"/>
           <w:rtl w:val="0"/>
         </w:rPr>
         <w:t xml:space="preserve">The mystery</w:t>
       </w:r>
       <w:r>
         <w:rPr>
-          <w:rFonts w:ascii="Garamond" w:cs="Garamond" w:eastAsia="Garamond" w:hAnsi="Garamond"/>
-          <w:sz w:val="24"/>
-          <w:szCs w:val="24"/>
           <w:rtl w:val="0"/>
         </w:rPr>
         <w:t xml:space="preserve">: the question the player is asked to answer (for example “who removed X, why, and where is it now?”).</w:t>
@@ -2545,30 +1888,19 @@
           <w:ilvl w:val="0"/>
           <w:numId w:val="2"/>
         </w:numPr>
-        <w:spacing w:after="0" w:afterAutospacing="0" w:before="0" w:beforeAutospacing="0" w:line="276" w:lineRule="auto"/>
+        <w:spacing w:after="0" w:afterAutospacing="0" w:before="0" w:beforeAutospacing="0"/>
         <w:ind w:left="720" w:hanging="360"/>
-        <w:rPr>
-          <w:rFonts w:ascii="Garamond" w:cs="Garamond" w:eastAsia="Garamond" w:hAnsi="Garamond"/>
-          <w:sz w:val="24"/>
-          <w:szCs w:val="24"/>
-        </w:rPr>
-      </w:pPr>
-      <w:r>
-        <w:rPr>
-          <w:rFonts w:ascii="Garamond" w:cs="Garamond" w:eastAsia="Garamond" w:hAnsi="Garamond"/>
+      </w:pPr>
+      <w:r>
+        <w:rPr>
           <w:b w:val="1"/>
           <w:bCs w:val="1"/>
-          <w:sz w:val="24"/>
-          <w:szCs w:val="24"/>
           <w:rtl w:val="0"/>
         </w:rPr>
         <w:t xml:space="preserve">The solution: </w:t>
       </w:r>
       <w:r>
         <w:rPr>
-          <w:rFonts w:ascii="Garamond" w:cs="Garamond" w:eastAsia="Garamond" w:hAnsi="Garamond"/>
-          <w:sz w:val="24"/>
-          <w:szCs w:val="24"/>
           <w:rtl w:val="0"/>
         </w:rPr>
         <w:t xml:space="preserve">the answer to the mystery</w:t>
@@ -2580,19 +1912,11 @@
           <w:ilvl w:val="1"/>
           <w:numId w:val="2"/>
         </w:numPr>
-        <w:spacing w:after="0" w:afterAutospacing="0" w:before="0" w:beforeAutospacing="0" w:line="276" w:lineRule="auto"/>
+        <w:spacing w:after="0" w:afterAutospacing="0" w:before="0" w:beforeAutospacing="0"/>
         <w:ind w:left="1440" w:hanging="360"/>
-        <w:rPr>
-          <w:rFonts w:ascii="Garamond" w:cs="Garamond" w:eastAsia="Garamond" w:hAnsi="Garamond"/>
-          <w:sz w:val="24"/>
-          <w:szCs w:val="24"/>
-        </w:rPr>
-      </w:pPr>
-      <w:r>
-        <w:rPr>
-          <w:rFonts w:ascii="Garamond" w:cs="Garamond" w:eastAsia="Garamond" w:hAnsi="Garamond"/>
-          <w:sz w:val="24"/>
-          <w:szCs w:val="24"/>
+      </w:pPr>
+      <w:r>
+        <w:rPr>
           <w:rtl w:val="0"/>
         </w:rPr>
         <w:t xml:space="preserve">The 16 Clues that tell the story of the answer, alongside the 4 Major Clues that make each group of four.</w:t>
@@ -2604,30 +1928,19 @@
           <w:ilvl w:val="0"/>
           <w:numId w:val="2"/>
         </w:numPr>
-        <w:spacing w:after="0" w:afterAutospacing="0" w:before="0" w:beforeAutospacing="0" w:line="276" w:lineRule="auto"/>
+        <w:spacing w:after="0" w:afterAutospacing="0" w:before="0" w:beforeAutospacing="0"/>
         <w:ind w:left="720" w:hanging="360"/>
-        <w:rPr>
-          <w:rFonts w:ascii="Garamond" w:cs="Garamond" w:eastAsia="Garamond" w:hAnsi="Garamond"/>
-          <w:sz w:val="24"/>
-          <w:szCs w:val="24"/>
-        </w:rPr>
-      </w:pPr>
-      <w:r>
-        <w:rPr>
-          <w:rFonts w:ascii="Garamond" w:cs="Garamond" w:eastAsia="Garamond" w:hAnsi="Garamond"/>
+      </w:pPr>
+      <w:r>
+        <w:rPr>
           <w:b w:val="1"/>
           <w:bCs w:val="1"/>
-          <w:sz w:val="24"/>
-          <w:szCs w:val="24"/>
           <w:rtl w:val="0"/>
         </w:rPr>
         <w:t xml:space="preserve">The final-answer form</w:t>
       </w:r>
       <w:r>
         <w:rPr>
-          <w:rFonts w:ascii="Garamond" w:cs="Garamond" w:eastAsia="Garamond" w:hAnsi="Garamond"/>
-          <w:sz w:val="24"/>
-          <w:szCs w:val="24"/>
           <w:rtl w:val="0"/>
         </w:rPr>
         <w:t xml:space="preserve">: what the player must select at the end (e.g. one person from a list and one location from a list), and which combination is correct.</w:t>
@@ -2644,19 +1957,11 @@
           <w:ilvl w:val="0"/>
           <w:numId w:val="2"/>
         </w:numPr>
-        <w:spacing w:after="0" w:afterAutospacing="0" w:before="0" w:beforeAutospacing="0" w:line="276" w:lineRule="auto"/>
+        <w:spacing w:after="0" w:afterAutospacing="0" w:before="0" w:beforeAutospacing="0"/>
         <w:ind w:left="720" w:hanging="360"/>
-        <w:rPr>
-          <w:rFonts w:ascii="Garamond" w:cs="Garamond" w:eastAsia="Garamond" w:hAnsi="Garamond"/>
-          <w:sz w:val="24"/>
-          <w:szCs w:val="24"/>
-        </w:rPr>
-      </w:pPr>
-      <w:r>
-        <w:rPr>
-          <w:rFonts w:ascii="Garamond" w:cs="Garamond" w:eastAsia="Garamond" w:hAnsi="Garamond"/>
-          <w:sz w:val="24"/>
-          <w:szCs w:val="24"/>
+      </w:pPr>
+      <w:r>
+        <w:rPr>
           <w:rtl w:val="0"/>
         </w:rPr>
         <w:t xml:space="preserve">Passages text: Start, Rules, the Hook, Map, Interview, Answer, Follow-up, Evidence Board, Submission, Result, ending, ranking</w:t>
@@ -2668,19 +1973,11 @@
           <w:ilvl w:val="0"/>
           <w:numId w:val="2"/>
         </w:numPr>
-        <w:spacing w:after="0" w:afterAutospacing="0" w:before="0" w:beforeAutospacing="0" w:line="276" w:lineRule="auto"/>
+        <w:spacing w:after="0" w:afterAutospacing="0" w:before="0" w:beforeAutospacing="0"/>
         <w:ind w:left="720" w:hanging="360"/>
-        <w:rPr>
-          <w:rFonts w:ascii="Garamond" w:cs="Garamond" w:eastAsia="Garamond" w:hAnsi="Garamond"/>
-          <w:sz w:val="24"/>
-          <w:szCs w:val="24"/>
-        </w:rPr>
-      </w:pPr>
-      <w:r>
-        <w:rPr>
-          <w:rFonts w:ascii="Garamond" w:cs="Garamond" w:eastAsia="Garamond" w:hAnsi="Garamond"/>
-          <w:sz w:val="24"/>
-          <w:szCs w:val="24"/>
+      </w:pPr>
+      <w:r>
+        <w:rPr>
           <w:rtl w:val="0"/>
         </w:rPr>
         <w:t xml:space="preserve">The eight questions </w:t>
@@ -2692,19 +1989,11 @@
           <w:ilvl w:val="0"/>
           <w:numId w:val="2"/>
         </w:numPr>
-        <w:spacing w:after="0" w:afterAutospacing="0" w:before="0" w:beforeAutospacing="0" w:line="276" w:lineRule="auto"/>
+        <w:spacing w:after="0" w:afterAutospacing="0" w:before="0" w:beforeAutospacing="0"/>
         <w:ind w:left="720" w:hanging="360"/>
-        <w:rPr>
-          <w:rFonts w:ascii="Garamond" w:cs="Garamond" w:eastAsia="Garamond" w:hAnsi="Garamond"/>
-          <w:sz w:val="24"/>
-          <w:szCs w:val="24"/>
-        </w:rPr>
-      </w:pPr>
-      <w:r>
-        <w:rPr>
-          <w:rFonts w:ascii="Garamond" w:cs="Garamond" w:eastAsia="Garamond" w:hAnsi="Garamond"/>
-          <w:sz w:val="24"/>
-          <w:szCs w:val="24"/>
+      </w:pPr>
+      <w:r>
+        <w:rPr>
           <w:rtl w:val="0"/>
         </w:rPr>
         <w:t xml:space="preserve">The eight witnesses list:</w:t>
@@ -2716,19 +2005,11 @@
           <w:ilvl w:val="1"/>
           <w:numId w:val="2"/>
         </w:numPr>
-        <w:spacing w:after="0" w:afterAutospacing="0" w:before="0" w:beforeAutospacing="0" w:line="276" w:lineRule="auto"/>
+        <w:spacing w:after="0" w:afterAutospacing="0" w:before="0" w:beforeAutospacing="0"/>
         <w:ind w:left="1440" w:hanging="360"/>
-        <w:rPr>
-          <w:rFonts w:ascii="Garamond" w:cs="Garamond" w:eastAsia="Garamond" w:hAnsi="Garamond"/>
-          <w:sz w:val="24"/>
-          <w:szCs w:val="24"/>
-        </w:rPr>
-      </w:pPr>
-      <w:r>
-        <w:rPr>
-          <w:rFonts w:ascii="Garamond" w:cs="Garamond" w:eastAsia="Garamond" w:hAnsi="Garamond"/>
-          <w:sz w:val="24"/>
-          <w:szCs w:val="24"/>
+      </w:pPr>
+      <w:r>
+        <w:rPr>
           <w:rtl w:val="0"/>
         </w:rPr>
         <w:t xml:space="preserve">Information, image, ID (W01-W08)</w:t>
@@ -2740,19 +2021,11 @@
           <w:ilvl w:val="1"/>
           <w:numId w:val="2"/>
         </w:numPr>
-        <w:spacing w:after="0" w:afterAutospacing="0" w:before="0" w:beforeAutospacing="0" w:line="276" w:lineRule="auto"/>
+        <w:spacing w:after="0" w:afterAutospacing="0" w:before="0" w:beforeAutospacing="0"/>
         <w:ind w:left="1440" w:hanging="360"/>
-        <w:rPr>
-          <w:rFonts w:ascii="Garamond" w:cs="Garamond" w:eastAsia="Garamond" w:hAnsi="Garamond"/>
-          <w:sz w:val="24"/>
-          <w:szCs w:val="24"/>
-        </w:rPr>
-      </w:pPr>
-      <w:r>
-        <w:rPr>
-          <w:rFonts w:ascii="Garamond" w:cs="Garamond" w:eastAsia="Garamond" w:hAnsi="Garamond"/>
-          <w:sz w:val="24"/>
-          <w:szCs w:val="24"/>
+      </w:pPr>
+      <w:r>
+        <w:rPr>
           <w:rtl w:val="0"/>
         </w:rPr>
         <w:t xml:space="preserve">Position on the CCC</w:t>
@@ -2764,19 +2037,11 @@
           <w:ilvl w:val="1"/>
           <w:numId w:val="2"/>
         </w:numPr>
-        <w:spacing w:after="0" w:afterAutospacing="0" w:before="0" w:beforeAutospacing="0" w:line="276" w:lineRule="auto"/>
+        <w:spacing w:after="0" w:afterAutospacing="0" w:before="0" w:beforeAutospacing="0"/>
         <w:ind w:left="1440" w:hanging="360"/>
-        <w:rPr>
-          <w:rFonts w:ascii="Garamond" w:cs="Garamond" w:eastAsia="Garamond" w:hAnsi="Garamond"/>
-          <w:sz w:val="24"/>
-          <w:szCs w:val="24"/>
-        </w:rPr>
-      </w:pPr>
-      <w:r>
-        <w:rPr>
-          <w:rFonts w:ascii="Garamond" w:cs="Garamond" w:eastAsia="Garamond" w:hAnsi="Garamond"/>
-          <w:sz w:val="24"/>
-          <w:szCs w:val="24"/>
+      </w:pPr>
+      <w:r>
+        <w:rPr>
           <w:rtl w:val="0"/>
         </w:rPr>
         <w:t xml:space="preserve">Which question is their tripwire </w:t>
@@ -2788,19 +2053,11 @@
           <w:ilvl w:val="1"/>
           <w:numId w:val="2"/>
         </w:numPr>
-        <w:spacing w:after="0" w:afterAutospacing="0" w:before="0" w:beforeAutospacing="0" w:line="276" w:lineRule="auto"/>
+        <w:spacing w:after="0" w:afterAutospacing="0" w:before="0" w:beforeAutospacing="0"/>
         <w:ind w:left="1440" w:hanging="360"/>
-        <w:rPr>
-          <w:rFonts w:ascii="Garamond" w:cs="Garamond" w:eastAsia="Garamond" w:hAnsi="Garamond"/>
-          <w:sz w:val="24"/>
-          <w:szCs w:val="24"/>
-        </w:rPr>
-      </w:pPr>
-      <w:r>
-        <w:rPr>
-          <w:rFonts w:ascii="Garamond" w:cs="Garamond" w:eastAsia="Garamond" w:hAnsi="Garamond"/>
-          <w:sz w:val="24"/>
-          <w:szCs w:val="24"/>
+      </w:pPr>
+      <w:r>
+        <w:rPr>
           <w:rtl w:val="0"/>
         </w:rPr>
         <w:t xml:space="preserve">Receptiveness score</w:t>
@@ -2812,19 +2069,11 @@
           <w:ilvl w:val="1"/>
           <w:numId w:val="2"/>
         </w:numPr>
-        <w:spacing w:after="0" w:afterAutospacing="0" w:before="0" w:beforeAutospacing="0" w:line="276" w:lineRule="auto"/>
+        <w:spacing w:after="0" w:afterAutospacing="0" w:before="0" w:beforeAutospacing="0"/>
         <w:ind w:left="1440" w:hanging="360"/>
-        <w:rPr>
-          <w:rFonts w:ascii="Garamond" w:cs="Garamond" w:eastAsia="Garamond" w:hAnsi="Garamond"/>
-          <w:sz w:val="24"/>
-          <w:szCs w:val="24"/>
-        </w:rPr>
-      </w:pPr>
-      <w:r>
-        <w:rPr>
-          <w:rFonts w:ascii="Garamond" w:cs="Garamond" w:eastAsia="Garamond" w:hAnsi="Garamond"/>
-          <w:sz w:val="24"/>
-          <w:szCs w:val="24"/>
+      </w:pPr>
+      <w:r>
+        <w:rPr>
           <w:rtl w:val="0"/>
         </w:rPr>
         <w:t xml:space="preserve">A follow-up pair of questions </w:t>
@@ -2836,19 +2085,11 @@
           <w:ilvl w:val="0"/>
           <w:numId w:val="2"/>
         </w:numPr>
-        <w:spacing w:after="0" w:afterAutospacing="0" w:before="0" w:beforeAutospacing="0" w:line="276" w:lineRule="auto"/>
+        <w:spacing w:after="0" w:afterAutospacing="0" w:before="0" w:beforeAutospacing="0"/>
         <w:ind w:left="720" w:hanging="360"/>
-        <w:rPr>
-          <w:rFonts w:ascii="Garamond" w:cs="Garamond" w:eastAsia="Garamond" w:hAnsi="Garamond"/>
-          <w:sz w:val="24"/>
-          <w:szCs w:val="24"/>
-        </w:rPr>
-      </w:pPr>
-      <w:r>
-        <w:rPr>
-          <w:rFonts w:ascii="Garamond" w:cs="Garamond" w:eastAsia="Garamond" w:hAnsi="Garamond"/>
-          <w:sz w:val="24"/>
-          <w:szCs w:val="24"/>
+      </w:pPr>
+      <w:r>
+        <w:rPr>
           <w:rtl w:val="0"/>
         </w:rPr>
         <w:t xml:space="preserve">The 24 Red Herrings organized into sets</w:t>
@@ -2860,19 +2101,11 @@
           <w:ilvl w:val="0"/>
           <w:numId w:val="2"/>
         </w:numPr>
-        <w:spacing w:before="0" w:beforeAutospacing="0" w:line="276" w:lineRule="auto"/>
+        <w:spacing w:before="0" w:beforeAutospacing="0"/>
         <w:ind w:left="720" w:hanging="360"/>
-        <w:rPr>
-          <w:rFonts w:ascii="Garamond" w:cs="Garamond" w:eastAsia="Garamond" w:hAnsi="Garamond"/>
-          <w:sz w:val="24"/>
-          <w:szCs w:val="24"/>
-        </w:rPr>
-      </w:pPr>
-      <w:r>
-        <w:rPr>
-          <w:rFonts w:ascii="Garamond" w:cs="Garamond" w:eastAsia="Garamond" w:hAnsi="Garamond"/>
-          <w:sz w:val="24"/>
-          <w:szCs w:val="24"/>
+      </w:pPr>
+      <w:r>
+        <w:rPr>
           <w:rtl w:val="0"/>
         </w:rPr>
         <w:t xml:space="preserve">The Response Matrix: 8 × 8 grid of witnesses by questions. Each cell is either the tripwire (for exactly one cell per column and one per row) or an answer containing one piece of information (a clue ID or a red-herring ID) and one opinion expression (marked receptive or not, referencing another witness by name). The matrix is kept in the workbook in two forms: a readable condensed version, and a longform table (one row per cell, with columns for witness, question, item, item type, receptive flag, and text) that the engine reads.</w:t>
@@ -2880,18 +2113,67 @@
     </w:p>
     <w:p>
       <w:pPr>
-        <w:spacing w:before="200" w:line="276" w:lineRule="auto"/>
-        <w:rPr>
-          <w:rFonts w:ascii="Garamond" w:cs="Garamond" w:eastAsia="Garamond" w:hAnsi="Garamond"/>
-          <w:sz w:val="24"/>
-          <w:szCs w:val="24"/>
-        </w:rPr>
+        <w:rPr/>
         <w:sectPr>
+          <w:type w:val="nextPage"/>
           <w:pgSz w:h="15840" w:w="12240" w:orient="portrait"/>
           <w:pgMar w:bottom="1440" w:top="1440" w:left="1440" w:right="1440" w:header="720" w:footer="720"/>
           <w:pgNumType w:start="1"/>
         </w:sectPr>
       </w:pPr>
+      <w:r>
+        <w:rPr>
+          <w:rtl w:val="0"/>
+        </w:rPr>
+      </w:r>
+    </w:p>
+    <w:p>
+      <w:pPr>
+        <w:pStyle w:val="Title"/>
+        <w:keepNext w:val="0"/>
+        <w:keepLines w:val="0"/>
+        <w:pageBreakBefore w:val="0"/>
+        <w:widowControl w:val="0"/>
+        <w:pBdr>
+          <w:top w:space="0" w:sz="0" w:val="nil"/>
+          <w:left w:space="0" w:sz="0" w:val="nil"/>
+          <w:bottom w:space="0" w:sz="0" w:val="nil"/>
+          <w:right w:space="0" w:sz="0" w:val="nil"/>
+          <w:between w:space="0" w:sz="0" w:val="nil"/>
+        </w:pBdr>
+        <w:shd w:fill="auto" w:val="clear"/>
+        <w:spacing w:after="0" w:before="0" w:line="276" w:lineRule="auto"/>
+        <w:ind w:left="0" w:right="0" w:firstLine="0"/>
+        <w:jc w:val="left"/>
+        <w:rPr/>
+        <w:sectPr>
+          <w:type w:val="nextPage"/>
+          <w:pgSz w:h="15840" w:w="12240" w:orient="portrait"/>
+          <w:pgMar w:bottom="1440" w:top="1440" w:left="1440" w:right="1440" w:header="720" w:footer="720"/>
+          <w:pgNumType w:start="1"/>
+        </w:sectPr>
+      </w:pPr>
+      <w:bookmarkStart w:colFirst="0" w:colLast="0" w:name="_rpua6esl3261" w:id="13"/>
+      <w:bookmarkEnd w:id="13"/>
+      <w:r>
+        <w:rPr>
+          <w:rFonts w:ascii="Garamond" w:cs="Garamond" w:eastAsia="Garamond" w:hAnsi="Garamond"/>
+          <w:b w:val="1"/>
+          <w:bCs w:val="1"/>
+          <w:i w:val="0"/>
+          <w:iCs w:val="0"/>
+          <w:smallCaps w:val="0"/>
+          <w:strike w:val="0"/>
+          <w:color w:val="000000"/>
+          <w:sz w:val="60"/>
+          <w:szCs w:val="60"/>
+          <w:u w:val="none"/>
+          <w:shd w:fill="auto" w:val="clear"/>
+          <w:vertAlign w:val="baseline"/>
+          <w:rtl w:val="0"/>
+        </w:rPr>
+        <w:t xml:space="preserve">Notes</w:t>
+      </w:r>
       <w:r>
         <w:rPr>
           <w:rtl w:val="0"/>
@@ -3224,11 +2506,64 @@
     </w:p>
     <w:p>
       <w:pPr>
+        <w:pStyle w:val="Title"/>
+        <w:keepNext w:val="0"/>
+        <w:keepLines w:val="0"/>
+        <w:pageBreakBefore w:val="0"/>
+        <w:widowControl w:val="0"/>
+        <w:pBdr>
+          <w:top w:space="0" w:sz="0" w:val="nil"/>
+          <w:left w:space="0" w:sz="0" w:val="nil"/>
+          <w:bottom w:space="0" w:sz="0" w:val="nil"/>
+          <w:right w:space="0" w:sz="0" w:val="nil"/>
+          <w:between w:space="0" w:sz="0" w:val="nil"/>
+        </w:pBdr>
+        <w:shd w:fill="auto" w:val="clear"/>
+        <w:spacing w:after="0" w:before="0" w:line="276" w:lineRule="auto"/>
+        <w:ind w:left="0" w:right="0" w:firstLine="0"/>
+        <w:jc w:val="left"/>
+        <w:rPr/>
+        <w:sectPr>
+          <w:type w:val="nextPage"/>
+          <w:pgSz w:h="15840" w:w="12240" w:orient="portrait"/>
+          <w:pgMar w:bottom="1440" w:top="1440" w:left="1440" w:right="1440" w:header="720" w:footer="720"/>
+          <w:pgNumType w:start="1"/>
+        </w:sectPr>
+      </w:pPr>
+      <w:bookmarkStart w:colFirst="0" w:colLast="0" w:name="_dqt71mn8372w" w:id="14"/>
+      <w:bookmarkEnd w:id="14"/>
+      <w:r>
+        <w:rPr>
+          <w:rFonts w:ascii="Garamond" w:cs="Garamond" w:eastAsia="Garamond" w:hAnsi="Garamond"/>
+          <w:b w:val="1"/>
+          <w:bCs w:val="1"/>
+          <w:i w:val="0"/>
+          <w:iCs w:val="0"/>
+          <w:smallCaps w:val="0"/>
+          <w:strike w:val="0"/>
+          <w:color w:val="000000"/>
+          <w:sz w:val="60"/>
+          <w:szCs w:val="60"/>
+          <w:u w:val="none"/>
+          <w:shd w:fill="auto" w:val="clear"/>
+          <w:vertAlign w:val="baseline"/>
+          <w:rtl w:val="0"/>
+        </w:rPr>
+        <w:t xml:space="preserve">Rules of the game</w:t>
+      </w:r>
+      <w:r>
+        <w:rPr>
+          <w:rtl w:val="0"/>
+        </w:rPr>
+      </w:r>
+    </w:p>
+    <w:p>
+      <w:pPr>
         <w:pStyle w:val="Heading1"/>
         <w:rPr/>
       </w:pPr>
-      <w:bookmarkStart w:colFirst="0" w:colLast="0" w:name="_xsv09x7iedko" w:id="12"/>
-      <w:bookmarkEnd w:id="12"/>
+      <w:bookmarkStart w:colFirst="0" w:colLast="0" w:name="_xsv09x7iedko" w:id="15"/>
+      <w:bookmarkEnd w:id="15"/>
       <w:r>
         <w:rPr>
           <w:rtl w:val="0"/>
@@ -3390,163 +2725,22 @@
     </w:p>
     <w:p>
       <w:pPr>
-        <w:pStyle w:val="Heading1"/>
-        <w:rPr/>
-      </w:pPr>
-      <w:bookmarkStart w:colFirst="0" w:colLast="0" w:name="_gca2y5oth70s" w:id="13"/>
-      <w:bookmarkEnd w:id="13"/>
-      <w:r>
-        <w:rPr>
-          <w:rtl w:val="0"/>
-        </w:rPr>
-        <w:t xml:space="preserve">The HEAR framework</w:t>
-      </w:r>
-    </w:p>
-    <w:p>
-      <w:pPr>
-        <w:rPr/>
-      </w:pPr>
-      <w:r>
-        <w:rPr>
-          <w:rtl w:val="0"/>
-        </w:rPr>
-        <w:t xml:space="preserve">Conversational receptiveness is a willingness to engage with opposing views, shown through the words you use. Research by Julia Minson and colleagues found four markers that make someone come across as receptive:</w:t>
-      </w:r>
-    </w:p>
-    <w:p>
-      <w:pPr>
-        <w:pStyle w:val="Heading2"/>
-        <w:numPr>
-          <w:ilvl w:val="0"/>
-          <w:numId w:val="4"/>
-        </w:numPr>
-        <w:ind w:left="720" w:hanging="360"/>
-        <w:rPr>
-          <w:sz w:val="32"/>
-          <w:szCs w:val="32"/>
-        </w:rPr>
-      </w:pPr>
-      <w:bookmarkStart w:colFirst="0" w:colLast="0" w:name="_15kfzlgp827m" w:id="14"/>
-      <w:bookmarkEnd w:id="14"/>
-      <w:r>
-        <w:rPr>
-          <w:rtl w:val="0"/>
-        </w:rPr>
-        <w:t xml:space="preserve">Hedge your claims</w:t>
-      </w:r>
-    </w:p>
-    <w:p>
-      <w:pPr>
-        <w:rPr/>
-      </w:pPr>
-      <w:r>
-        <w:rPr>
-          <w:rtl w:val="0"/>
-        </w:rPr>
-        <w:t xml:space="preserve">Leave space alongside your views: “I think”, “it's possible that”, “I could be misreading this”.</w:t>
-      </w:r>
-    </w:p>
-    <w:p>
-      <w:pPr>
-        <w:pStyle w:val="Heading2"/>
-        <w:numPr>
-          <w:ilvl w:val="0"/>
-          <w:numId w:val="4"/>
-        </w:numPr>
-        <w:ind w:left="720" w:hanging="360"/>
-        <w:rPr>
-          <w:sz w:val="32"/>
-          <w:szCs w:val="32"/>
-        </w:rPr>
-      </w:pPr>
-      <w:bookmarkStart w:colFirst="0" w:colLast="0" w:name="_14bj2v2wcr9b" w:id="15"/>
-      <w:bookmarkEnd w:id="15"/>
-      <w:r>
-        <w:rPr>
-          <w:rtl w:val="0"/>
-        </w:rPr>
-        <w:t xml:space="preserve">Emphasize agreement</w:t>
-      </w:r>
-    </w:p>
-    <w:p>
-      <w:pPr>
-        <w:rPr/>
-      </w:pPr>
-      <w:r>
-        <w:rPr>
-          <w:rtl w:val="0"/>
-        </w:rPr>
-        <w:t xml:space="preserve">Find common ground: “We both want…”, “I agree that…”.</w:t>
-      </w:r>
-    </w:p>
-    <w:p>
-      <w:pPr>
-        <w:pStyle w:val="Heading2"/>
-        <w:numPr>
-          <w:ilvl w:val="0"/>
-          <w:numId w:val="4"/>
-        </w:numPr>
-        <w:ind w:left="720" w:hanging="360"/>
-        <w:rPr>
-          <w:sz w:val="32"/>
-          <w:szCs w:val="32"/>
-        </w:rPr>
-      </w:pPr>
-      <w:bookmarkStart w:colFirst="0" w:colLast="0" w:name="_zheajp4hsm8n" w:id="16"/>
-      <w:bookmarkEnd w:id="16"/>
-      <w:r>
-        <w:rPr>
-          <w:rtl w:val="0"/>
-        </w:rPr>
-        <w:t xml:space="preserve">Acknowledge the other's perspective</w:t>
-      </w:r>
-    </w:p>
-    <w:p>
-      <w:pPr>
-        <w:rPr/>
-      </w:pPr>
-      <w:r>
-        <w:rPr>
-          <w:rtl w:val="0"/>
-        </w:rPr>
-        <w:t xml:space="preserve">Show you have understood: “I understand that you…”, “You're right that…”.</w:t>
-      </w:r>
-    </w:p>
-    <w:p>
-      <w:pPr>
-        <w:pStyle w:val="Heading2"/>
-        <w:numPr>
-          <w:ilvl w:val="0"/>
-          <w:numId w:val="4"/>
-        </w:numPr>
-        <w:ind w:left="720" w:hanging="360"/>
-        <w:rPr>
-          <w:sz w:val="32"/>
-          <w:szCs w:val="32"/>
-        </w:rPr>
-      </w:pPr>
-      <w:bookmarkStart w:colFirst="0" w:colLast="0" w:name="_47i9enf78bla" w:id="17"/>
-      <w:bookmarkEnd w:id="17"/>
-      <w:r>
-        <w:rPr>
-          <w:rtl w:val="0"/>
-        </w:rPr>
-        <w:t xml:space="preserve">Reframe to the positive</w:t>
-      </w:r>
-    </w:p>
-    <w:p>
-      <w:pPr>
-        <w:rPr/>
-      </w:pPr>
-      <w:r>
-        <w:rPr>
-          <w:rtl w:val="0"/>
-        </w:rPr>
-        <w:t xml:space="preserve">Say what you want rather than what you oppose, avoid dismissive language such as “that's wrong” or “no serious person thinks…”.</w:t>
-      </w:r>
-    </w:p>
-    <w:p>
-      <w:pPr>
+        <w:pStyle w:val="Title"/>
+        <w:keepNext w:val="0"/>
+        <w:keepLines w:val="0"/>
+        <w:pageBreakBefore w:val="0"/>
+        <w:widowControl w:val="0"/>
+        <w:pBdr>
+          <w:top w:space="0" w:sz="0" w:val="nil"/>
+          <w:left w:space="0" w:sz="0" w:val="nil"/>
+          <w:bottom w:space="0" w:sz="0" w:val="nil"/>
+          <w:right w:space="0" w:sz="0" w:val="nil"/>
+          <w:between w:space="0" w:sz="0" w:val="nil"/>
+        </w:pBdr>
+        <w:shd w:fill="auto" w:val="clear"/>
+        <w:spacing w:after="0" w:before="0" w:line="276" w:lineRule="auto"/>
+        <w:ind w:left="0" w:right="0" w:firstLine="0"/>
+        <w:jc w:val="left"/>
         <w:rPr/>
         <w:sectPr>
           <w:type w:val="nextPage"/>
@@ -3555,11 +2749,31 @@
           <w:pgNumType w:start="1"/>
         </w:sectPr>
       </w:pPr>
-      <w:r>
-        <w:rPr>
-          <w:rtl w:val="0"/>
-        </w:rPr>
-        <w:t xml:space="preserve">Unreceptive language states opinions flatly, generalizes about the other person, attributes motives, or dismisses them. Listen for both kinds as the witnesses talk about the controversy.</w:t>
+      <w:bookmarkStart w:colFirst="0" w:colLast="0" w:name="_u317eq7vbm8w" w:id="16"/>
+      <w:bookmarkEnd w:id="16"/>
+      <w:r>
+        <w:rPr>
+          <w:rFonts w:ascii="Garamond" w:cs="Garamond" w:eastAsia="Garamond" w:hAnsi="Garamond"/>
+          <w:b w:val="1"/>
+          <w:bCs w:val="1"/>
+          <w:i w:val="0"/>
+          <w:iCs w:val="0"/>
+          <w:smallCaps w:val="0"/>
+          <w:strike w:val="0"/>
+          <w:color w:val="000000"/>
+          <w:sz w:val="60"/>
+          <w:szCs w:val="60"/>
+          <w:u w:val="none"/>
+          <w:shd w:fill="auto" w:val="clear"/>
+          <w:vertAlign w:val="baseline"/>
+          <w:rtl w:val="0"/>
+        </w:rPr>
+        <w:t xml:space="preserve">HEAR Framework introduction</w:t>
+      </w:r>
+      <w:r>
+        <w:rPr>
+          <w:rtl w:val="0"/>
+        </w:rPr>
       </w:r>
     </w:p>
     <w:p>
@@ -3567,8 +2781,235 @@
         <w:pStyle w:val="Heading1"/>
         <w:rPr/>
       </w:pPr>
-      <w:bookmarkStart w:colFirst="0" w:colLast="0" w:name="_uynt6v9uhldf" w:id="18"/>
+      <w:bookmarkStart w:colFirst="0" w:colLast="0" w:name="_gca2y5oth70s" w:id="17"/>
+      <w:bookmarkEnd w:id="17"/>
+      <w:r>
+        <w:rPr>
+          <w:rtl w:val="0"/>
+        </w:rPr>
+        <w:t xml:space="preserve">The HEAR framework</w:t>
+      </w:r>
+    </w:p>
+    <w:p>
+      <w:pPr>
+        <w:rPr/>
+      </w:pPr>
+      <w:r>
+        <w:rPr>
+          <w:rtl w:val="0"/>
+        </w:rPr>
+        <w:t xml:space="preserve">Conversational receptiveness is a willingness to engage with opposing views, shown through the words you use. Research by Julia Minson and colleagues found four markers that make someone come across as receptive:</w:t>
+      </w:r>
+    </w:p>
+    <w:p>
+      <w:pPr>
+        <w:pStyle w:val="Heading2"/>
+        <w:numPr>
+          <w:ilvl w:val="0"/>
+          <w:numId w:val="4"/>
+        </w:numPr>
+        <w:ind w:left="720" w:hanging="360"/>
+        <w:rPr>
+          <w:sz w:val="32"/>
+          <w:szCs w:val="32"/>
+        </w:rPr>
+      </w:pPr>
+      <w:bookmarkStart w:colFirst="0" w:colLast="0" w:name="_15kfzlgp827m" w:id="18"/>
       <w:bookmarkEnd w:id="18"/>
+      <w:r>
+        <w:rPr>
+          <w:rtl w:val="0"/>
+        </w:rPr>
+        <w:t xml:space="preserve">Hedge your claims</w:t>
+      </w:r>
+    </w:p>
+    <w:p>
+      <w:pPr>
+        <w:rPr/>
+      </w:pPr>
+      <w:r>
+        <w:rPr>
+          <w:rtl w:val="0"/>
+        </w:rPr>
+        <w:t xml:space="preserve">Leave space alongside your views: “I think”, “it's possible that”, “I could be misreading this”.</w:t>
+      </w:r>
+    </w:p>
+    <w:p>
+      <w:pPr>
+        <w:pStyle w:val="Heading2"/>
+        <w:numPr>
+          <w:ilvl w:val="0"/>
+          <w:numId w:val="4"/>
+        </w:numPr>
+        <w:ind w:left="720" w:hanging="360"/>
+        <w:rPr>
+          <w:sz w:val="32"/>
+          <w:szCs w:val="32"/>
+        </w:rPr>
+      </w:pPr>
+      <w:bookmarkStart w:colFirst="0" w:colLast="0" w:name="_14bj2v2wcr9b" w:id="19"/>
+      <w:bookmarkEnd w:id="19"/>
+      <w:r>
+        <w:rPr>
+          <w:rtl w:val="0"/>
+        </w:rPr>
+        <w:t xml:space="preserve">Emphasize agreement</w:t>
+      </w:r>
+    </w:p>
+    <w:p>
+      <w:pPr>
+        <w:rPr/>
+      </w:pPr>
+      <w:r>
+        <w:rPr>
+          <w:rtl w:val="0"/>
+        </w:rPr>
+        <w:t xml:space="preserve">Find common ground: “We both want…”, “I agree that…”.</w:t>
+      </w:r>
+    </w:p>
+    <w:p>
+      <w:pPr>
+        <w:pStyle w:val="Heading2"/>
+        <w:numPr>
+          <w:ilvl w:val="0"/>
+          <w:numId w:val="4"/>
+        </w:numPr>
+        <w:ind w:left="720" w:hanging="360"/>
+        <w:rPr>
+          <w:sz w:val="32"/>
+          <w:szCs w:val="32"/>
+        </w:rPr>
+      </w:pPr>
+      <w:bookmarkStart w:colFirst="0" w:colLast="0" w:name="_zheajp4hsm8n" w:id="20"/>
+      <w:bookmarkEnd w:id="20"/>
+      <w:r>
+        <w:rPr>
+          <w:rtl w:val="0"/>
+        </w:rPr>
+        <w:t xml:space="preserve">Acknowledge the other's perspective</w:t>
+      </w:r>
+    </w:p>
+    <w:p>
+      <w:pPr>
+        <w:rPr/>
+      </w:pPr>
+      <w:r>
+        <w:rPr>
+          <w:rtl w:val="0"/>
+        </w:rPr>
+        <w:t xml:space="preserve">Show you have understood: “I understand that you…”, “You're right that…”.</w:t>
+      </w:r>
+    </w:p>
+    <w:p>
+      <w:pPr>
+        <w:pStyle w:val="Heading2"/>
+        <w:numPr>
+          <w:ilvl w:val="0"/>
+          <w:numId w:val="4"/>
+        </w:numPr>
+        <w:ind w:left="720" w:hanging="360"/>
+        <w:rPr>
+          <w:sz w:val="32"/>
+          <w:szCs w:val="32"/>
+        </w:rPr>
+      </w:pPr>
+      <w:bookmarkStart w:colFirst="0" w:colLast="0" w:name="_47i9enf78bla" w:id="21"/>
+      <w:bookmarkEnd w:id="21"/>
+      <w:r>
+        <w:rPr>
+          <w:rtl w:val="0"/>
+        </w:rPr>
+        <w:t xml:space="preserve">Reframe to the positive</w:t>
+      </w:r>
+    </w:p>
+    <w:p>
+      <w:pPr>
+        <w:rPr/>
+      </w:pPr>
+      <w:r>
+        <w:rPr>
+          <w:rtl w:val="0"/>
+        </w:rPr>
+        <w:t xml:space="preserve">Say what you want rather than what you oppose, avoid dismissive language such as “that's wrong” or “no serious person thinks…”.</w:t>
+      </w:r>
+    </w:p>
+    <w:p>
+      <w:pPr>
+        <w:rPr/>
+        <w:sectPr>
+          <w:type w:val="nextPage"/>
+          <w:pgSz w:h="15840" w:w="12240" w:orient="portrait"/>
+          <w:pgMar w:bottom="1440" w:top="1440" w:left="1440" w:right="1440" w:header="720" w:footer="720"/>
+          <w:pgNumType w:start="1"/>
+        </w:sectPr>
+      </w:pPr>
+      <w:r>
+        <w:rPr>
+          <w:rtl w:val="0"/>
+        </w:rPr>
+        <w:t xml:space="preserve">Unreceptive language states opinions flatly, generalizes about the other person, attributes motives, or dismisses them. Listen for both kinds as the witnesses talk about the controversy.</w:t>
+      </w:r>
+    </w:p>
+    <w:p>
+      <w:pPr>
+        <w:pStyle w:val="Title"/>
+        <w:keepNext w:val="0"/>
+        <w:keepLines w:val="0"/>
+        <w:pageBreakBefore w:val="0"/>
+        <w:widowControl w:val="0"/>
+        <w:pBdr>
+          <w:top w:space="0" w:sz="0" w:val="nil"/>
+          <w:left w:space="0" w:sz="0" w:val="nil"/>
+          <w:bottom w:space="0" w:sz="0" w:val="nil"/>
+          <w:right w:space="0" w:sz="0" w:val="nil"/>
+          <w:between w:space="0" w:sz="0" w:val="nil"/>
+        </w:pBdr>
+        <w:shd w:fill="auto" w:val="clear"/>
+        <w:spacing w:after="0" w:before="0" w:line="276" w:lineRule="auto"/>
+        <w:ind w:left="0" w:right="0" w:firstLine="0"/>
+        <w:jc w:val="left"/>
+        <w:rPr/>
+        <w:sectPr>
+          <w:type w:val="nextPage"/>
+          <w:pgSz w:h="15840" w:w="12240" w:orient="portrait"/>
+          <w:pgMar w:bottom="1440" w:top="1440" w:left="1440" w:right="1440" w:header="720" w:footer="720"/>
+          <w:pgNumType w:start="1"/>
+        </w:sectPr>
+      </w:pPr>
+      <w:bookmarkStart w:colFirst="0" w:colLast="0" w:name="_wl0tt3pbhn35" w:id="22"/>
+      <w:bookmarkEnd w:id="22"/>
+      <w:r>
+        <w:rPr>
+          <w:rFonts w:ascii="Garamond" w:cs="Garamond" w:eastAsia="Garamond" w:hAnsi="Garamond"/>
+          <w:b w:val="1"/>
+          <w:bCs w:val="1"/>
+          <w:i w:val="0"/>
+          <w:iCs w:val="0"/>
+          <w:smallCaps w:val="0"/>
+          <w:strike w:val="0"/>
+          <w:color w:val="000000"/>
+          <w:sz w:val="60"/>
+          <w:szCs w:val="60"/>
+          <w:u w:val="none"/>
+          <w:shd w:fill="auto" w:val="clear"/>
+          <w:vertAlign w:val="baseline"/>
+          <w:rtl w:val="0"/>
+        </w:rPr>
+        <w:t xml:space="preserve">Game facts</w:t>
+      </w:r>
+      <w:r>
+        <w:rPr>
+          <w:rtl w:val="0"/>
+        </w:rPr>
+      </w:r>
+    </w:p>
+    <w:p>
+      <w:pPr>
+        <w:pStyle w:val="Heading1"/>
+        <w:rPr/>
+      </w:pPr>
+      <w:bookmarkStart w:colFirst="0" w:colLast="0" w:name="_uynt6v9uhldf" w:id="23"/>
+      <w:bookmarkEnd w:id="23"/>
       <w:r>
         <w:rPr>
           <w:rtl w:val="0"/>
@@ -5257,11 +4698,64 @@
     </w:p>
     <w:p>
       <w:pPr>
+        <w:pStyle w:val="Title"/>
+        <w:keepNext w:val="0"/>
+        <w:keepLines w:val="0"/>
+        <w:pageBreakBefore w:val="0"/>
+        <w:widowControl w:val="0"/>
+        <w:pBdr>
+          <w:top w:space="0" w:sz="0" w:val="nil"/>
+          <w:left w:space="0" w:sz="0" w:val="nil"/>
+          <w:bottom w:space="0" w:sz="0" w:val="nil"/>
+          <w:right w:space="0" w:sz="0" w:val="nil"/>
+          <w:between w:space="0" w:sz="0" w:val="nil"/>
+        </w:pBdr>
+        <w:shd w:fill="auto" w:val="clear"/>
+        <w:spacing w:after="0" w:before="0" w:line="276" w:lineRule="auto"/>
+        <w:ind w:left="0" w:right="0" w:firstLine="0"/>
+        <w:jc w:val="left"/>
+        <w:rPr/>
+        <w:sectPr>
+          <w:type w:val="nextPage"/>
+          <w:pgSz w:h="15840" w:w="12240" w:orient="portrait"/>
+          <w:pgMar w:bottom="1440" w:top="1440" w:left="1440" w:right="1440" w:header="720" w:footer="720"/>
+          <w:pgNumType w:start="1"/>
+        </w:sectPr>
+      </w:pPr>
+      <w:bookmarkStart w:colFirst="0" w:colLast="0" w:name="_vuts1532vsh5" w:id="24"/>
+      <w:bookmarkEnd w:id="24"/>
+      <w:r>
+        <w:rPr>
+          <w:rFonts w:ascii="Garamond" w:cs="Garamond" w:eastAsia="Garamond" w:hAnsi="Garamond"/>
+          <w:b w:val="1"/>
+          <w:bCs w:val="1"/>
+          <w:i w:val="0"/>
+          <w:iCs w:val="0"/>
+          <w:smallCaps w:val="0"/>
+          <w:strike w:val="0"/>
+          <w:color w:val="000000"/>
+          <w:sz w:val="60"/>
+          <w:szCs w:val="60"/>
+          <w:u w:val="none"/>
+          <w:shd w:fill="auto" w:val="clear"/>
+          <w:vertAlign w:val="baseline"/>
+          <w:rtl w:val="0"/>
+        </w:rPr>
+        <w:t xml:space="preserve">Game text</w:t>
+      </w:r>
+      <w:r>
+        <w:rPr>
+          <w:rtl w:val="0"/>
+        </w:rPr>
+      </w:r>
+    </w:p>
+    <w:p>
+      <w:pPr>
         <w:pStyle w:val="Heading1"/>
         <w:rPr/>
       </w:pPr>
-      <w:bookmarkStart w:colFirst="0" w:colLast="0" w:name="_f5xcdpggf68j" w:id="19"/>
-      <w:bookmarkEnd w:id="19"/>
+      <w:bookmarkStart w:colFirst="0" w:colLast="0" w:name="_f5xcdpggf68j" w:id="25"/>
+      <w:bookmarkEnd w:id="25"/>
       <w:r>
         <w:rPr>
           <w:rtl w:val="0"/>
@@ -6081,9 +5575,8 @@
   <w:footnote w:id="0">
     <w:p>
       <w:pPr>
-        <w:spacing w:line="240" w:lineRule="auto"/>
-        <w:rPr>
-          <w:rFonts w:ascii="Garamond" w:cs="Garamond" w:eastAsia="Garamond" w:hAnsi="Garamond"/>
+        <w:spacing w:before="0" w:line="240" w:lineRule="auto"/>
+        <w:rPr>
           <w:sz w:val="20"/>
           <w:szCs w:val="20"/>
         </w:rPr>
@@ -6097,7 +5590,6 @@
       </w:r>
       <w:r>
         <w:rPr>
-          <w:rFonts w:ascii="Garamond" w:cs="Garamond" w:eastAsia="Garamond" w:hAnsi="Garamond"/>
           <w:sz w:val="20"/>
           <w:szCs w:val="20"/>
           <w:rtl w:val="0"/>
@@ -6106,7 +5598,6 @@
       </w:r>
       <w:r>
         <w:rPr>
-          <w:rFonts w:ascii="Garamond" w:cs="Garamond" w:eastAsia="Garamond" w:hAnsi="Garamond"/>
           <w:i w:val="1"/>
           <w:iCs w:val="1"/>
           <w:sz w:val="20"/>
@@ -6117,7 +5608,6 @@
       </w:r>
       <w:r>
         <w:rPr>
-          <w:rFonts w:ascii="Garamond" w:cs="Garamond" w:eastAsia="Garamond" w:hAnsi="Garamond"/>
           <w:sz w:val="20"/>
           <w:szCs w:val="20"/>
           <w:rtl w:val="0"/>
@@ -6127,7 +5617,6 @@
       <w:hyperlink r:id="rId1">
         <w:r>
           <w:rPr>
-            <w:rFonts w:ascii="Garamond" w:cs="Garamond" w:eastAsia="Garamond" w:hAnsi="Garamond"/>
             <w:color w:val="1155cc"/>
             <w:sz w:val="20"/>
             <w:szCs w:val="20"/>
@@ -6145,9 +5634,8 @@
     </w:p>
     <w:p>
       <w:pPr>
-        <w:spacing w:line="240" w:lineRule="auto"/>
-        <w:rPr>
-          <w:rFonts w:ascii="Garamond" w:cs="Garamond" w:eastAsia="Garamond" w:hAnsi="Garamond"/>
+        <w:spacing w:before="0" w:line="240" w:lineRule="auto"/>
+        <w:rPr>
           <w:sz w:val="20"/>
           <w:szCs w:val="20"/>
         </w:rPr>
@@ -6162,9 +5650,8 @@
   <w:footnote w:id="1">
     <w:p>
       <w:pPr>
-        <w:spacing w:line="240" w:lineRule="auto"/>
-        <w:rPr>
-          <w:rFonts w:ascii="Garamond" w:cs="Garamond" w:eastAsia="Garamond" w:hAnsi="Garamond"/>
+        <w:spacing w:before="0" w:line="240" w:lineRule="auto"/>
+        <w:rPr>
           <w:sz w:val="20"/>
           <w:szCs w:val="20"/>
         </w:rPr>
@@ -6178,7 +5665,6 @@
       </w:r>
       <w:r>
         <w:rPr>
-          <w:rFonts w:ascii="Garamond" w:cs="Garamond" w:eastAsia="Garamond" w:hAnsi="Garamond"/>
           <w:sz w:val="20"/>
           <w:szCs w:val="20"/>
           <w:rtl w:val="0"/>
@@ -6187,7 +5673,6 @@
       </w:r>
       <w:r>
         <w:rPr>
-          <w:rFonts w:ascii="Garamond" w:cs="Garamond" w:eastAsia="Garamond" w:hAnsi="Garamond"/>
           <w:i w:val="1"/>
           <w:iCs w:val="1"/>
           <w:sz w:val="20"/>
@@ -6198,7 +5683,6 @@
       </w:r>
       <w:r>
         <w:rPr>
-          <w:rFonts w:ascii="Garamond" w:cs="Garamond" w:eastAsia="Garamond" w:hAnsi="Garamond"/>
           <w:sz w:val="20"/>
           <w:szCs w:val="20"/>
           <w:rtl w:val="0"/>
@@ -6210,9 +5694,8 @@
   <w:footnote w:id="2">
     <w:p>
       <w:pPr>
-        <w:spacing w:line="240" w:lineRule="auto"/>
-        <w:rPr>
-          <w:rFonts w:ascii="Garamond" w:cs="Garamond" w:eastAsia="Garamond" w:hAnsi="Garamond"/>
+        <w:spacing w:before="0" w:line="240" w:lineRule="auto"/>
+        <w:rPr>
           <w:sz w:val="20"/>
           <w:szCs w:val="20"/>
         </w:rPr>
@@ -6226,7 +5709,6 @@
       </w:r>
       <w:r>
         <w:rPr>
-          <w:rFonts w:ascii="Garamond" w:cs="Garamond" w:eastAsia="Garamond" w:hAnsi="Garamond"/>
           <w:sz w:val="20"/>
           <w:szCs w:val="20"/>
           <w:rtl w:val="0"/>
@@ -6238,9 +5720,8 @@
   <w:footnote w:id="3">
     <w:p>
       <w:pPr>
-        <w:spacing w:line="240" w:lineRule="auto"/>
-        <w:rPr>
-          <w:rFonts w:ascii="Garamond" w:cs="Garamond" w:eastAsia="Garamond" w:hAnsi="Garamond"/>
+        <w:spacing w:before="0" w:line="240" w:lineRule="auto"/>
+        <w:rPr>
           <w:sz w:val="20"/>
           <w:szCs w:val="20"/>
         </w:rPr>
@@ -6254,7 +5735,6 @@
       </w:r>
       <w:r>
         <w:rPr>
-          <w:rFonts w:ascii="Garamond" w:cs="Garamond" w:eastAsia="Garamond" w:hAnsi="Garamond"/>
           <w:sz w:val="20"/>
           <w:szCs w:val="20"/>
           <w:rtl w:val="0"/>
@@ -6266,9 +5746,8 @@
   <w:footnote w:id="4">
     <w:p>
       <w:pPr>
-        <w:spacing w:line="240" w:lineRule="auto"/>
-        <w:rPr>
-          <w:rFonts w:ascii="Garamond" w:cs="Garamond" w:eastAsia="Garamond" w:hAnsi="Garamond"/>
+        <w:spacing w:before="0" w:line="240" w:lineRule="auto"/>
+        <w:rPr>
           <w:sz w:val="20"/>
           <w:szCs w:val="20"/>
         </w:rPr>
@@ -6282,7 +5761,6 @@
       </w:r>
       <w:r>
         <w:rPr>
-          <w:rFonts w:ascii="Garamond" w:cs="Garamond" w:eastAsia="Garamond" w:hAnsi="Garamond"/>
           <w:sz w:val="20"/>
           <w:szCs w:val="20"/>
           <w:rtl w:val="0"/>

</xml_diff>

<commit_message>
Read the newspaper article from the packet's "Newspaper article" section
The build now takes the article from the Heading 1 section "Newspaper article"
(section 2 of the packet's main tab) instead of the separate tab, and reads the
packet's accepted text: pending suggestions, which Google's .docx export carries
as tracked changes, are left out. The article is unchanged.

CLAUDE.md: don't change the matrix to match a pending suggestion in the packet
unless the author asks; correct the statement that a Doc's download leaves its
suggestions out. Copies of the framework Doc and the packet refreshed from
today's downloads; the rebuilt game differs only in an engine comment.

Co-Authored-By: Claude Opus 5.5 <noreply@anthropic.com>
Claude-Session: https://claude.ai/code/session_01C1sHgjAg9WC8Y88Rj6kdpD
</commit_message>
<xml_diff>
--- a/engine/HEARsay mysteries.docx
+++ b/engine/HEARsay mysteries.docx
@@ -6,42 +6,93 @@
     <w:p>
       <w:pPr>
         <w:pStyle w:val="Title"/>
-        <w:spacing w:after="60" w:before="200" w:line="276" w:lineRule="auto"/>
-        <w:jc w:val="center"/>
+        <w:keepNext w:val="0"/>
+        <w:keepLines w:val="0"/>
+        <w:pageBreakBefore w:val="0"/>
+        <w:widowControl w:val="0"/>
+        <w:pBdr>
+          <w:top w:space="0" w:sz="0" w:val="nil"/>
+          <w:left w:space="0" w:sz="0" w:val="nil"/>
+          <w:bottom w:space="0" w:sz="0" w:val="nil"/>
+          <w:right w:space="0" w:sz="0" w:val="nil"/>
+          <w:between w:space="0" w:sz="0" w:val="nil"/>
+        </w:pBdr>
+        <w:shd w:fill="auto" w:val="clear"/>
+        <w:spacing w:after="0" w:before="0" w:line="276" w:lineRule="auto"/>
+        <w:ind w:left="0" w:right="0" w:firstLine="0"/>
+        <w:jc w:val="left"/>
+        <w:rPr>
+          <w:rFonts w:ascii="Arial" w:cs="Arial" w:eastAsia="Arial" w:hAnsi="Arial"/>
+          <w:b w:val="0"/>
+          <w:bCs w:val="0"/>
+          <w:i w:val="0"/>
+          <w:iCs w:val="0"/>
+          <w:smallCaps w:val="0"/>
+          <w:strike w:val="0"/>
+          <w:color w:val="000000"/>
+          <w:sz w:val="22"/>
+          <w:szCs w:val="22"/>
+          <w:u w:val="none"/>
+          <w:shd w:fill="auto" w:val="clear"/>
+          <w:vertAlign w:val="baseline"/>
+        </w:rPr>
+        <w:sectPr>
+          <w:pgSz w:h="15840" w:w="12240" w:orient="portrait"/>
+          <w:pgMar w:bottom="1440" w:top="1440" w:left="1440" w:right="1440" w:header="720" w:footer="720"/>
+          <w:pgNumType w:start="1"/>
+        </w:sectPr>
+      </w:pPr>
+      <w:bookmarkStart w:colFirst="0" w:colLast="0" w:name="_h7ob6279anrj" w:id="0"/>
+      <w:bookmarkEnd w:id="0"/>
+      <w:r>
         <w:rPr>
           <w:rFonts w:ascii="Garamond" w:cs="Garamond" w:eastAsia="Garamond" w:hAnsi="Garamond"/>
+          <w:b w:val="1"/>
+          <w:bCs w:val="1"/>
+          <w:i w:val="0"/>
+          <w:iCs w:val="0"/>
+          <w:smallCaps w:val="0"/>
+          <w:strike w:val="0"/>
+          <w:color w:val="000000"/>
           <w:sz w:val="60"/>
           <w:szCs w:val="60"/>
-        </w:rPr>
-      </w:pPr>
-      <w:bookmarkStart w:colFirst="0" w:colLast="0" w:name="_ik0ajinzayw4" w:id="0"/>
-      <w:bookmarkEnd w:id="0"/>
-      <w:r>
-        <w:rPr>
-          <w:rFonts w:ascii="Garamond" w:cs="Garamond" w:eastAsia="Garamond" w:hAnsi="Garamond"/>
-          <w:sz w:val="60"/>
-          <w:szCs w:val="60"/>
+          <w:u w:val="none"/>
+          <w:shd w:fill="auto" w:val="clear"/>
+          <w:vertAlign w:val="baseline"/>
           <w:rtl w:val="0"/>
         </w:rPr>
         <w:t xml:space="preserve">HEARsay Mysteries</w:t>
       </w:r>
+      <w:r>
+        <w:rPr>
+          <w:rtl w:val="0"/>
+        </w:rPr>
+      </w:r>
+    </w:p>
+    <w:p>
+      <w:pPr>
+        <w:pStyle w:val="Title"/>
+        <w:jc w:val="center"/>
+        <w:rPr/>
+      </w:pPr>
+      <w:bookmarkStart w:colFirst="0" w:colLast="0" w:name="_ik0ajinzayw4" w:id="1"/>
+      <w:bookmarkEnd w:id="1"/>
+      <w:r>
+        <w:rPr>
+          <w:rtl w:val="0"/>
+        </w:rPr>
+        <w:t xml:space="preserve">HEARsay Mysteries</w:t>
+      </w:r>
     </w:p>
     <w:p>
       <w:pPr>
         <w:pStyle w:val="Subtitle"/>
-        <w:spacing w:after="320" w:before="200" w:line="276" w:lineRule="auto"/>
-        <w:jc w:val="center"/>
-        <w:rPr>
-          <w:sz w:val="22"/>
-          <w:szCs w:val="22"/>
-        </w:rPr>
-      </w:pPr>
-      <w:bookmarkStart w:colFirst="0" w:colLast="0" w:name="_rjfdtmwzzd07" w:id="1"/>
-      <w:bookmarkEnd w:id="1"/>
-      <w:r>
-        <w:rPr>
-          <w:sz w:val="22"/>
-          <w:szCs w:val="22"/>
+        <w:rPr/>
+      </w:pPr>
+      <w:bookmarkStart w:colFirst="0" w:colLast="0" w:name="_rjfdtmwzzd07" w:id="2"/>
+      <w:bookmarkEnd w:id="2"/>
+      <w:r>
+        <w:rPr>
           <w:rtl w:val="0"/>
         </w:rPr>
         <w:t xml:space="preserve">A mystery game framework for teaching and practicing the HEAR framework</w:t>
@@ -50,15 +101,13 @@
     <w:p>
       <w:pPr>
         <w:pStyle w:val="Subtitle"/>
-        <w:spacing w:after="320" w:before="200" w:line="276" w:lineRule="auto"/>
-        <w:jc w:val="center"/>
         <w:rPr>
           <w:sz w:val="20"/>
           <w:szCs w:val="20"/>
         </w:rPr>
       </w:pPr>
-      <w:bookmarkStart w:colFirst="0" w:colLast="0" w:name="_dhe0haaxgpbf" w:id="2"/>
-      <w:bookmarkEnd w:id="2"/>
+      <w:bookmarkStart w:colFirst="0" w:colLast="0" w:name="_dhe0haaxgpbf" w:id="3"/>
+      <w:bookmarkEnd w:id="3"/>
       <w:r>
         <w:rPr>
           <w:sz w:val="20"/>
@@ -70,31 +119,22 @@
     </w:p>
     <w:p>
       <w:pPr>
-        <w:spacing w:before="200" w:line="276" w:lineRule="auto"/>
-        <w:rPr>
-          <w:rFonts w:ascii="Garamond" w:cs="Garamond" w:eastAsia="Garamond" w:hAnsi="Garamond"/>
-          <w:sz w:val="24"/>
-          <w:szCs w:val="24"/>
-        </w:rPr>
-      </w:pPr>
-      <w:r>
-        <w:rPr>
-          <w:rFonts w:ascii="Garamond" w:cs="Garamond" w:eastAsia="Garamond" w:hAnsi="Garamond"/>
-          <w:sz w:val="24"/>
-          <w:szCs w:val="24"/>
-        </w:rPr>
+        <w:rPr/>
+      </w:pPr>
+      <w:r>
+        <w:rPr/>
         <mc:AlternateContent>
           <mc:Choice Requires="wpg">
             <w:drawing>
               <wp:inline distB="114300" distT="114300" distL="114300" distR="114300">
                 <wp:extent cx="6510258" cy="892601"/>
                 <wp:effectExtent b="0" l="0" r="0" t="0"/>
-                <wp:docPr id="1" name=""/>
+                <wp:docPr id="2" name=""/>
                 <a:graphic>
                   <a:graphicData uri="http://schemas.microsoft.com/office/word/2010/wordprocessingShape">
                     <wps:wsp>
                       <wps:cNvSpPr txBox="1"/>
-                      <wps:cNvPr id="2" name="Shape 2"/>
+                      <wps:cNvPr id="3" name="Shape 3"/>
                       <wps:spPr>
                         <a:xfrm>
                           <a:off x="0" y="872975"/>
@@ -201,12 +241,12 @@
               <wp:inline distB="114300" distT="114300" distL="114300" distR="114300">
                 <wp:extent cx="6510258" cy="892601"/>
                 <wp:effectExtent b="0" l="0" r="0" t="0"/>
-                <wp:docPr id="1" name="image1.png"/>
+                <wp:docPr id="2" name="image2.png"/>
                 <a:graphic>
                   <a:graphicData uri="http://schemas.openxmlformats.org/drawingml/2006/picture">
                     <pic:pic>
                       <pic:nvPicPr>
-                        <pic:cNvPr id="0" name="image1.png"/>
+                        <pic:cNvPr id="0" name="image2.png"/>
                         <pic:cNvPicPr preferRelativeResize="0"/>
                       </pic:nvPicPr>
                       <pic:blipFill>
@@ -240,31 +280,22 @@
     </w:p>
     <w:p>
       <w:pPr>
-        <w:spacing w:before="200" w:line="276" w:lineRule="auto"/>
-        <w:rPr>
-          <w:rFonts w:ascii="Garamond" w:cs="Garamond" w:eastAsia="Garamond" w:hAnsi="Garamond"/>
-          <w:sz w:val="24"/>
-          <w:szCs w:val="24"/>
-        </w:rPr>
-      </w:pPr>
-      <w:r>
-        <w:rPr>
-          <w:rFonts w:ascii="Garamond" w:cs="Garamond" w:eastAsia="Garamond" w:hAnsi="Garamond"/>
-          <w:sz w:val="24"/>
-          <w:szCs w:val="24"/>
-        </w:rPr>
+        <w:rPr/>
+      </w:pPr>
+      <w:r>
+        <w:rPr/>
         <mc:AlternateContent>
           <mc:Choice Requires="wpg">
             <w:drawing>
               <wp:inline distB="114300" distT="114300" distL="114300" distR="114300">
                 <wp:extent cx="6505575" cy="1114744"/>
                 <wp:effectExtent b="0" l="0" r="0" t="0"/>
-                <wp:docPr id="2" name=""/>
+                <wp:docPr id="1" name=""/>
                 <a:graphic>
                   <a:graphicData uri="http://schemas.microsoft.com/office/word/2010/wordprocessingShape">
                     <wps:wsp>
                       <wps:cNvSpPr txBox="1"/>
-                      <wps:cNvPr id="3" name="Shape 3"/>
+                      <wps:cNvPr id="2" name="Shape 2"/>
                       <wps:spPr>
                         <a:xfrm>
                           <a:off x="262200" y="791775"/>
@@ -404,12 +435,12 @@
               <wp:inline distB="114300" distT="114300" distL="114300" distR="114300">
                 <wp:extent cx="6505575" cy="1114744"/>
                 <wp:effectExtent b="0" l="0" r="0" t="0"/>
-                <wp:docPr id="2" name="image2.png"/>
+                <wp:docPr id="1" name="image1.png"/>
                 <a:graphic>
                   <a:graphicData uri="http://schemas.openxmlformats.org/drawingml/2006/picture">
                     <pic:pic>
                       <pic:nvPicPr>
-                        <pic:cNvPr id="0" name="image2.png"/>
+                        <pic:cNvPr id="0" name="image1.png"/>
                         <pic:cNvPicPr preferRelativeResize="0"/>
                       </pic:nvPicPr>
                       <pic:blipFill>
@@ -444,24 +475,12 @@
     <w:p>
       <w:pPr>
         <w:pStyle w:val="Heading1"/>
-        <w:spacing w:before="400" w:line="276" w:lineRule="auto"/>
-        <w:rPr>
-          <w:rFonts w:ascii="Garamond" w:cs="Garamond" w:eastAsia="Garamond" w:hAnsi="Garamond"/>
-          <w:b w:val="0"/>
-          <w:bCs w:val="0"/>
-          <w:sz w:val="40"/>
-          <w:szCs w:val="40"/>
-        </w:rPr>
-      </w:pPr>
-      <w:bookmarkStart w:colFirst="0" w:colLast="0" w:name="_91ezqgojjt8o" w:id="3"/>
-      <w:bookmarkEnd w:id="3"/>
-      <w:r>
-        <w:rPr>
-          <w:rFonts w:ascii="Garamond" w:cs="Garamond" w:eastAsia="Garamond" w:hAnsi="Garamond"/>
-          <w:b w:val="0"/>
-          <w:bCs w:val="0"/>
-          <w:sz w:val="40"/>
-          <w:szCs w:val="40"/>
+        <w:rPr/>
+      </w:pPr>
+      <w:bookmarkStart w:colFirst="0" w:colLast="0" w:name="_91ezqgojjt8o" w:id="4"/>
+      <w:bookmarkEnd w:id="4"/>
+      <w:r>
+        <w:rPr>
           <w:rtl w:val="0"/>
         </w:rPr>
         <w:t xml:space="preserve">1. What is a HEARsay mystery? </w:t>
@@ -474,67 +493,44 @@
     </w:p>
     <w:p>
       <w:pPr>
-        <w:spacing w:before="200" w:line="276" w:lineRule="auto"/>
-        <w:rPr>
-          <w:rFonts w:ascii="Garamond" w:cs="Garamond" w:eastAsia="Garamond" w:hAnsi="Garamond"/>
-          <w:sz w:val="24"/>
-          <w:szCs w:val="24"/>
-        </w:rPr>
-      </w:pPr>
-      <w:r>
-        <w:rPr>
-          <w:rFonts w:ascii="Garamond" w:cs="Garamond" w:eastAsia="Garamond" w:hAnsi="Garamond"/>
-          <w:sz w:val="24"/>
-          <w:szCs w:val="24"/>
+        <w:rPr/>
+      </w:pPr>
+      <w:r>
+        <w:rPr>
           <w:rtl w:val="0"/>
         </w:rPr>
         <w:t xml:space="preserve">HEARsay is a series of mystery games designed to help students learn and practice </w:t>
       </w:r>
       <w:r>
         <w:rPr>
-          <w:rFonts w:ascii="Garamond" w:cs="Garamond" w:eastAsia="Garamond" w:hAnsi="Garamond"/>
           <w:i w:val="1"/>
           <w:iCs w:val="1"/>
-          <w:sz w:val="24"/>
-          <w:szCs w:val="24"/>
           <w:rtl w:val="0"/>
         </w:rPr>
         <w:t xml:space="preserve">conversational receptiveness</w:t>
       </w:r>
       <w:r>
         <w:rPr>
-          <w:rFonts w:ascii="Garamond" w:cs="Garamond" w:eastAsia="Garamond" w:hAnsi="Garamond"/>
           <w:i w:val="1"/>
           <w:iCs w:val="1"/>
-          <w:sz w:val="24"/>
-          <w:szCs w:val="24"/>
           <w:vertAlign w:val="superscript"/>
         </w:rPr>
         <w:footnoteReference w:customMarkFollows="0" w:id="0"/>
       </w:r>
       <w:r>
         <w:rPr>
-          <w:rFonts w:ascii="Garamond" w:cs="Garamond" w:eastAsia="Garamond" w:hAnsi="Garamond"/>
-          <w:sz w:val="24"/>
-          <w:szCs w:val="24"/>
           <w:rtl w:val="0"/>
         </w:rPr>
         <w:t xml:space="preserve">- “the use of language to communicate one’s willingness to thoughtfully engage with opposing views.”</w:t>
       </w:r>
       <w:r>
         <w:rPr>
-          <w:rFonts w:ascii="Garamond" w:cs="Garamond" w:eastAsia="Garamond" w:hAnsi="Garamond"/>
-          <w:sz w:val="24"/>
-          <w:szCs w:val="24"/>
           <w:vertAlign w:val="superscript"/>
         </w:rPr>
         <w:footnoteReference w:customMarkFollows="0" w:id="1"/>
       </w:r>
       <w:r>
         <w:rPr>
-          <w:rFonts w:ascii="Garamond" w:cs="Garamond" w:eastAsia="Garamond" w:hAnsi="Garamond"/>
-          <w:sz w:val="24"/>
-          <w:szCs w:val="24"/>
           <w:rtl w:val="0"/>
         </w:rPr>
         <w:t xml:space="preserve"> The focus of the games is the HEAR Framework, a practical tool aimed to help people remember and apply the principles of conversational receptiveness. </w:t>
@@ -542,56 +538,36 @@
     </w:p>
     <w:p>
       <w:pPr>
-        <w:spacing w:before="200" w:line="276" w:lineRule="auto"/>
-        <w:rPr>
-          <w:rFonts w:ascii="Garamond" w:cs="Garamond" w:eastAsia="Garamond" w:hAnsi="Garamond"/>
-          <w:sz w:val="24"/>
-          <w:szCs w:val="24"/>
-        </w:rPr>
-      </w:pPr>
-      <w:r>
-        <w:rPr>
-          <w:rFonts w:ascii="Garamond" w:cs="Garamond" w:eastAsia="Garamond" w:hAnsi="Garamond"/>
-          <w:sz w:val="24"/>
-          <w:szCs w:val="24"/>
+        <w:rPr/>
+      </w:pPr>
+      <w:r>
+        <w:rPr>
           <w:rtl w:val="0"/>
         </w:rPr>
         <w:t xml:space="preserve">HEARsay mysteries are story-driven games built on Twine, a free choose-your-own-adventure engine game that requires little to no coding. This framework provides the details about the way the game works as well as instructions for crafting scenarios. The first scenario, </w:t>
       </w:r>
       <w:r>
         <w:rPr>
-          <w:rFonts w:ascii="Garamond" w:cs="Garamond" w:eastAsia="Garamond" w:hAnsi="Garamond"/>
           <w:i w:val="1"/>
           <w:iCs w:val="1"/>
-          <w:sz w:val="24"/>
-          <w:szCs w:val="24"/>
           <w:rtl w:val="0"/>
         </w:rPr>
         <w:t xml:space="preserve">The Commons’ Comma</w:t>
       </w:r>
       <w:r>
         <w:rPr>
-          <w:rFonts w:ascii="Garamond" w:cs="Garamond" w:eastAsia="Garamond" w:hAnsi="Garamond"/>
-          <w:sz w:val="24"/>
-          <w:szCs w:val="24"/>
           <w:rtl w:val="0"/>
         </w:rPr>
         <w:t xml:space="preserve">, is included in an accompanying folder and describes a scenario based on a university campus, which I will treat here as the default backdrop for HEARsay mysteries.</w:t>
       </w:r>
       <w:r>
         <w:rPr>
-          <w:rFonts w:ascii="Garamond" w:cs="Garamond" w:eastAsia="Garamond" w:hAnsi="Garamond"/>
-          <w:sz w:val="24"/>
-          <w:szCs w:val="24"/>
           <w:vertAlign w:val="superscript"/>
         </w:rPr>
         <w:footnoteReference w:customMarkFollows="0" w:id="2"/>
       </w:r>
       <w:r>
         <w:rPr>
-          <w:rFonts w:ascii="Garamond" w:cs="Garamond" w:eastAsia="Garamond" w:hAnsi="Garamond"/>
-          <w:sz w:val="24"/>
-          <w:szCs w:val="24"/>
           <w:rtl w:val="0"/>
         </w:rPr>
         <w:t xml:space="preserve"> </w:t>
@@ -599,54 +575,34 @@
     </w:p>
     <w:p>
       <w:pPr>
-        <w:spacing w:before="200" w:line="276" w:lineRule="auto"/>
-        <w:rPr>
-          <w:rFonts w:ascii="Garamond" w:cs="Garamond" w:eastAsia="Garamond" w:hAnsi="Garamond"/>
-          <w:sz w:val="24"/>
-          <w:szCs w:val="24"/>
-        </w:rPr>
-      </w:pPr>
-      <w:r>
-        <w:rPr>
-          <w:rFonts w:ascii="Garamond" w:cs="Garamond" w:eastAsia="Garamond" w:hAnsi="Garamond"/>
-          <w:sz w:val="24"/>
-          <w:szCs w:val="24"/>
+        <w:rPr/>
+      </w:pPr>
+      <w:r>
+        <w:rPr>
           <w:rtl w:val="0"/>
         </w:rPr>
         <w:t xml:space="preserve">Each scenario </w:t>
       </w:r>
       <w:r>
         <w:rPr>
-          <w:rFonts w:ascii="Garamond" w:cs="Garamond" w:eastAsia="Garamond" w:hAnsi="Garamond"/>
-          <w:sz w:val="24"/>
-          <w:szCs w:val="24"/>
           <w:rtl w:val="0"/>
         </w:rPr>
         <w:t xml:space="preserve">is comprised</w:t>
       </w:r>
       <w:r>
         <w:rPr>
-          <w:rFonts w:ascii="Garamond" w:cs="Garamond" w:eastAsia="Garamond" w:hAnsi="Garamond"/>
-          <w:sz w:val="24"/>
-          <w:szCs w:val="24"/>
           <w:rtl w:val="0"/>
         </w:rPr>
         <w:t xml:space="preserve"> of (a) a</w:t>
       </w:r>
       <w:r>
         <w:rPr>
-          <w:rFonts w:ascii="Garamond" w:cs="Garamond" w:eastAsia="Garamond" w:hAnsi="Garamond"/>
-          <w:sz w:val="24"/>
-          <w:szCs w:val="24"/>
           <w:rtl w:val="0"/>
         </w:rPr>
         <w:t xml:space="preserve"> puzzle the players have to solve and (b) a controversy that’s unfolding in the background, which I will call the Current Campus Controversy (CCC</w:t>
       </w:r>
       <w:r>
         <w:rPr>
-          <w:rFonts w:ascii="Garamond" w:cs="Garamond" w:eastAsia="Garamond" w:hAnsi="Garamond"/>
-          <w:sz w:val="24"/>
-          <w:szCs w:val="24"/>
           <w:vertAlign w:val="superscript"/>
           <w:rtl w:val="0"/>
         </w:rPr>
@@ -654,9 +610,6 @@
       </w:r>
       <w:r>
         <w:rPr>
-          <w:rFonts w:ascii="Garamond" w:cs="Garamond" w:eastAsia="Garamond" w:hAnsi="Garamond"/>
-          <w:sz w:val="24"/>
-          <w:szCs w:val="24"/>
           <w:rtl w:val="0"/>
         </w:rPr>
         <w:t xml:space="preserve">). Players will be interviewing witnesses, such as students or university personnel, trying to gain clues that would help them solve the mystery and avoiding red herrings that point them in the wrong direction. At the same time, witnesses will share their views on the CCC and players will have to apply the HEAR framework in order to solve the mystery and improve their scores in the game:</w:t>
@@ -668,19 +621,11 @@
           <w:ilvl w:val="0"/>
           <w:numId w:val="7"/>
         </w:numPr>
-        <w:spacing w:after="0" w:afterAutospacing="0" w:before="200" w:line="276" w:lineRule="auto"/>
+        <w:spacing w:after="0" w:afterAutospacing="0"/>
         <w:ind w:left="720" w:hanging="360"/>
-        <w:rPr>
-          <w:rFonts w:ascii="Garamond" w:cs="Garamond" w:eastAsia="Garamond" w:hAnsi="Garamond"/>
-          <w:sz w:val="24"/>
-          <w:szCs w:val="24"/>
-        </w:rPr>
-      </w:pPr>
-      <w:r>
-        <w:rPr>
-          <w:rFonts w:ascii="Garamond" w:cs="Garamond" w:eastAsia="Garamond" w:hAnsi="Garamond"/>
-          <w:sz w:val="24"/>
-          <w:szCs w:val="24"/>
+      </w:pPr>
+      <w:r>
+        <w:rPr>
           <w:rtl w:val="0"/>
         </w:rPr>
         <w:t xml:space="preserve">Once with each witness players may ask a follow-up question about the witness’s expressed view regarding the CCC. Players will have to choose between two phrasings of the question, one more receptive than the other (the difference may be stark or subtle). Choosing the receptive phrasing unlocks a Major Clue while choosing the less receptive question ends the interview abruptly (the witness storms away and will not  answer any more questions). </w:t>
@@ -692,19 +637,11 @@
           <w:ilvl w:val="0"/>
           <w:numId w:val="7"/>
         </w:numPr>
-        <w:spacing w:after="0" w:afterAutospacing="0" w:before="0" w:beforeAutospacing="0" w:line="276" w:lineRule="auto"/>
+        <w:spacing w:after="0" w:afterAutospacing="0" w:before="0" w:beforeAutospacing="0"/>
         <w:ind w:left="720" w:hanging="360"/>
-        <w:rPr>
-          <w:rFonts w:ascii="Garamond" w:cs="Garamond" w:eastAsia="Garamond" w:hAnsi="Garamond"/>
-          <w:sz w:val="24"/>
-          <w:szCs w:val="24"/>
-        </w:rPr>
-      </w:pPr>
-      <w:r>
-        <w:rPr>
-          <w:rFonts w:ascii="Garamond" w:cs="Garamond" w:eastAsia="Garamond" w:hAnsi="Garamond"/>
-          <w:sz w:val="24"/>
-          <w:szCs w:val="24"/>
+      </w:pPr>
+      <w:r>
+        <w:rPr>
           <w:rtl w:val="0"/>
         </w:rPr>
         <w:t xml:space="preserve">Unlocking a Major Clue earns the students a letter from the HEAR acronym, reinforcing the mnemonic tool, and explaining one of the four pillars of the framework.</w:t>
@@ -716,19 +653,11 @@
           <w:ilvl w:val="0"/>
           <w:numId w:val="7"/>
         </w:numPr>
-        <w:spacing w:before="0" w:beforeAutospacing="0" w:line="276" w:lineRule="auto"/>
+        <w:spacing w:before="0" w:beforeAutospacing="0"/>
         <w:ind w:left="720" w:hanging="360"/>
-        <w:rPr>
-          <w:rFonts w:ascii="Garamond" w:cs="Garamond" w:eastAsia="Garamond" w:hAnsi="Garamond"/>
-          <w:sz w:val="24"/>
-          <w:szCs w:val="24"/>
-        </w:rPr>
-      </w:pPr>
-      <w:r>
-        <w:rPr>
-          <w:rFonts w:ascii="Garamond" w:cs="Garamond" w:eastAsia="Garamond" w:hAnsi="Garamond"/>
-          <w:sz w:val="24"/>
-          <w:szCs w:val="24"/>
+      </w:pPr>
+      <w:r>
+        <w:rPr>
           <w:rtl w:val="0"/>
         </w:rPr>
         <w:t xml:space="preserve">Each witness will volunteer their opinions on the CCC, with varying degrees of receptiveness. Players will receive bonus points at the end of the game for ranking the witnesses correctly in terms of the receptiveness. </w:t>
@@ -737,24 +666,12 @@
     <w:p>
       <w:pPr>
         <w:pStyle w:val="Heading1"/>
-        <w:spacing w:before="400" w:line="276" w:lineRule="auto"/>
-        <w:rPr>
-          <w:rFonts w:ascii="Garamond" w:cs="Garamond" w:eastAsia="Garamond" w:hAnsi="Garamond"/>
-          <w:b w:val="0"/>
-          <w:bCs w:val="0"/>
-          <w:sz w:val="40"/>
-          <w:szCs w:val="40"/>
-        </w:rPr>
-      </w:pPr>
-      <w:bookmarkStart w:colFirst="0" w:colLast="0" w:name="_724y3rmj63y4" w:id="4"/>
-      <w:bookmarkEnd w:id="4"/>
-      <w:r>
-        <w:rPr>
-          <w:rFonts w:ascii="Garamond" w:cs="Garamond" w:eastAsia="Garamond" w:hAnsi="Garamond"/>
-          <w:b w:val="0"/>
-          <w:bCs w:val="0"/>
-          <w:sz w:val="40"/>
-          <w:szCs w:val="40"/>
+        <w:rPr/>
+      </w:pPr>
+      <w:bookmarkStart w:colFirst="0" w:colLast="0" w:name="_724y3rmj63y4" w:id="5"/>
+      <w:bookmarkEnd w:id="5"/>
+      <w:r>
+        <w:rPr>
           <w:rtl w:val="0"/>
         </w:rPr>
         <w:t xml:space="preserve">2. The HEAR Framework </w:t>
@@ -762,18 +679,11 @@
     </w:p>
     <w:p>
       <w:pPr>
-        <w:spacing w:after="200" w:before="200" w:line="276" w:lineRule="auto"/>
-        <w:rPr>
-          <w:rFonts w:ascii="Garamond" w:cs="Garamond" w:eastAsia="Garamond" w:hAnsi="Garamond"/>
-          <w:sz w:val="24"/>
-          <w:szCs w:val="24"/>
-        </w:rPr>
-      </w:pPr>
-      <w:r>
-        <w:rPr>
-          <w:rFonts w:ascii="Garamond" w:cs="Garamond" w:eastAsia="Garamond" w:hAnsi="Garamond"/>
-          <w:sz w:val="24"/>
-          <w:szCs w:val="24"/>
+        <w:spacing w:after="200" w:lineRule="auto"/>
+        <w:rPr/>
+      </w:pPr>
+      <w:r>
+        <w:rPr>
           <w:rtl w:val="0"/>
         </w:rPr>
         <w:t xml:space="preserve">Conversational receptiveness is the use of language that signals you are engaging thoughtfully with a view you disagree with. Minson and colleagues found that people who are perceived as receptive are seen as better teammates and advisors, are more persuasive, and are more likely to be engaged with in return, and that receptiveness can be learned as a set of concrete verbal moves. The teachable recipe is summarised as HEAR:</w:t>
@@ -813,16 +723,14 @@
           </w:tcPr>
           <w:p>
             <w:pPr>
-              <w:spacing w:line="240" w:lineRule="auto"/>
-              <w:rPr>
-                <w:rFonts w:ascii="Garamond" w:cs="Garamond" w:eastAsia="Garamond" w:hAnsi="Garamond"/>
+              <w:spacing w:before="0" w:line="240" w:lineRule="auto"/>
+              <w:rPr>
                 <w:sz w:val="32"/>
                 <w:szCs w:val="32"/>
               </w:rPr>
             </w:pPr>
             <w:r>
               <w:rPr>
-                <w:rFonts w:ascii="Garamond" w:cs="Garamond" w:eastAsia="Garamond" w:hAnsi="Garamond"/>
                 <w:sz w:val="32"/>
                 <w:szCs w:val="32"/>
                 <w:rtl w:val="0"/>
@@ -837,16 +745,14 @@
           </w:tcPr>
           <w:p>
             <w:pPr>
-              <w:spacing w:line="240" w:lineRule="auto"/>
-              <w:rPr>
-                <w:rFonts w:ascii="Garamond" w:cs="Garamond" w:eastAsia="Garamond" w:hAnsi="Garamond"/>
+              <w:spacing w:before="0" w:line="240" w:lineRule="auto"/>
+              <w:rPr>
                 <w:sz w:val="32"/>
                 <w:szCs w:val="32"/>
               </w:rPr>
             </w:pPr>
             <w:r>
               <w:rPr>
-                <w:rFonts w:ascii="Garamond" w:cs="Garamond" w:eastAsia="Garamond" w:hAnsi="Garamond"/>
                 <w:sz w:val="32"/>
                 <w:szCs w:val="32"/>
                 <w:rtl w:val="0"/>
@@ -861,16 +767,14 @@
           </w:tcPr>
           <w:p>
             <w:pPr>
-              <w:spacing w:line="240" w:lineRule="auto"/>
-              <w:rPr>
-                <w:rFonts w:ascii="Garamond" w:cs="Garamond" w:eastAsia="Garamond" w:hAnsi="Garamond"/>
+              <w:spacing w:before="0" w:line="240" w:lineRule="auto"/>
+              <w:rPr>
                 <w:sz w:val="32"/>
                 <w:szCs w:val="32"/>
               </w:rPr>
             </w:pPr>
             <w:r>
               <w:rPr>
-                <w:rFonts w:ascii="Garamond" w:cs="Garamond" w:eastAsia="Garamond" w:hAnsi="Garamond"/>
                 <w:sz w:val="32"/>
                 <w:szCs w:val="32"/>
                 <w:rtl w:val="0"/>
@@ -890,22 +794,16 @@
           <w:tcPr/>
           <w:p>
             <w:pPr>
-              <w:spacing w:line="240" w:lineRule="auto"/>
-              <w:rPr>
-                <w:rFonts w:ascii="Garamond" w:cs="Garamond" w:eastAsia="Garamond" w:hAnsi="Garamond"/>
+              <w:spacing w:before="0" w:line="240" w:lineRule="auto"/>
+              <w:rPr>
                 <w:b w:val="1"/>
                 <w:bCs w:val="1"/>
-                <w:sz w:val="24"/>
-                <w:szCs w:val="24"/>
-              </w:rPr>
-            </w:pPr>
-            <w:r>
-              <w:rPr>
-                <w:rFonts w:ascii="Garamond" w:cs="Garamond" w:eastAsia="Garamond" w:hAnsi="Garamond"/>
+              </w:rPr>
+            </w:pPr>
+            <w:r>
+              <w:rPr>
                 <w:b w:val="1"/>
                 <w:bCs w:val="1"/>
-                <w:sz w:val="24"/>
-                <w:szCs w:val="24"/>
                 <w:rtl w:val="0"/>
               </w:rPr>
               <w:t xml:space="preserve">H</w:t>
@@ -916,29 +814,19 @@
           <w:tcPr/>
           <w:p>
             <w:pPr>
-              <w:spacing w:line="240" w:lineRule="auto"/>
-              <w:rPr>
-                <w:rFonts w:ascii="Garamond" w:cs="Garamond" w:eastAsia="Garamond" w:hAnsi="Garamond"/>
-                <w:sz w:val="24"/>
-                <w:szCs w:val="24"/>
-              </w:rPr>
-            </w:pPr>
-            <w:r>
-              <w:rPr>
-                <w:rFonts w:ascii="Garamond" w:cs="Garamond" w:eastAsia="Garamond" w:hAnsi="Garamond"/>
+              <w:spacing w:before="0" w:line="240" w:lineRule="auto"/>
+              <w:rPr/>
+            </w:pPr>
+            <w:r>
+              <w:rPr>
                 <w:b w:val="1"/>
                 <w:bCs w:val="1"/>
-                <w:sz w:val="24"/>
-                <w:szCs w:val="24"/>
                 <w:rtl w:val="0"/>
               </w:rPr>
               <w:t xml:space="preserve">Hedge</w:t>
             </w:r>
             <w:r>
               <w:rPr>
-                <w:rFonts w:ascii="Garamond" w:cs="Garamond" w:eastAsia="Garamond" w:hAnsi="Garamond"/>
-                <w:sz w:val="24"/>
-                <w:szCs w:val="24"/>
                 <w:rtl w:val="0"/>
               </w:rPr>
               <w:t xml:space="preserve"> your claims</w:t>
@@ -949,18 +837,11 @@
           <w:tcPr/>
           <w:p>
             <w:pPr>
-              <w:spacing w:line="240" w:lineRule="auto"/>
-              <w:rPr>
-                <w:rFonts w:ascii="Garamond" w:cs="Garamond" w:eastAsia="Garamond" w:hAnsi="Garamond"/>
-                <w:sz w:val="24"/>
-                <w:szCs w:val="24"/>
-              </w:rPr>
-            </w:pPr>
-            <w:r>
-              <w:rPr>
-                <w:rFonts w:ascii="Garamond" w:cs="Garamond" w:eastAsia="Garamond" w:hAnsi="Garamond"/>
-                <w:sz w:val="24"/>
-                <w:szCs w:val="24"/>
+              <w:spacing w:before="0" w:line="240" w:lineRule="auto"/>
+              <w:rPr/>
+            </w:pPr>
+            <w:r>
+              <w:rPr>
                 <w:rtl w:val="0"/>
               </w:rPr>
               <w:t xml:space="preserve">“I may be wrong about this”, “in some cases”, “it seems to me”, “probably”. Hedging signals that you hold your view as a view, not as a fact the other person is failing to see.</w:t>
@@ -978,22 +859,16 @@
           <w:tcPr/>
           <w:p>
             <w:pPr>
-              <w:spacing w:line="240" w:lineRule="auto"/>
-              <w:rPr>
-                <w:rFonts w:ascii="Garamond" w:cs="Garamond" w:eastAsia="Garamond" w:hAnsi="Garamond"/>
+              <w:spacing w:before="0" w:line="240" w:lineRule="auto"/>
+              <w:rPr>
                 <w:b w:val="1"/>
                 <w:bCs w:val="1"/>
-                <w:sz w:val="24"/>
-                <w:szCs w:val="24"/>
-              </w:rPr>
-            </w:pPr>
-            <w:r>
-              <w:rPr>
-                <w:rFonts w:ascii="Garamond" w:cs="Garamond" w:eastAsia="Garamond" w:hAnsi="Garamond"/>
+              </w:rPr>
+            </w:pPr>
+            <w:r>
+              <w:rPr>
                 <w:b w:val="1"/>
                 <w:bCs w:val="1"/>
-                <w:sz w:val="24"/>
-                <w:szCs w:val="24"/>
                 <w:rtl w:val="0"/>
               </w:rPr>
               <w:t xml:space="preserve">E</w:t>
@@ -1004,29 +879,19 @@
           <w:tcPr/>
           <w:p>
             <w:pPr>
-              <w:spacing w:line="240" w:lineRule="auto"/>
-              <w:rPr>
-                <w:rFonts w:ascii="Garamond" w:cs="Garamond" w:eastAsia="Garamond" w:hAnsi="Garamond"/>
-                <w:sz w:val="24"/>
-                <w:szCs w:val="24"/>
-              </w:rPr>
-            </w:pPr>
-            <w:r>
-              <w:rPr>
-                <w:rFonts w:ascii="Garamond" w:cs="Garamond" w:eastAsia="Garamond" w:hAnsi="Garamond"/>
+              <w:spacing w:before="0" w:line="240" w:lineRule="auto"/>
+              <w:rPr/>
+            </w:pPr>
+            <w:r>
+              <w:rPr>
                 <w:b w:val="1"/>
                 <w:bCs w:val="1"/>
-                <w:sz w:val="24"/>
-                <w:szCs w:val="24"/>
                 <w:rtl w:val="0"/>
               </w:rPr>
               <w:t xml:space="preserve">Emphasize</w:t>
             </w:r>
             <w:r>
               <w:rPr>
-                <w:rFonts w:ascii="Garamond" w:cs="Garamond" w:eastAsia="Garamond" w:hAnsi="Garamond"/>
-                <w:sz w:val="24"/>
-                <w:szCs w:val="24"/>
                 <w:rtl w:val="0"/>
               </w:rPr>
               <w:t xml:space="preserve"> agreement</w:t>
@@ -1037,18 +902,11 @@
           <w:tcPr/>
           <w:p>
             <w:pPr>
-              <w:spacing w:line="240" w:lineRule="auto"/>
-              <w:rPr>
-                <w:rFonts w:ascii="Garamond" w:cs="Garamond" w:eastAsia="Garamond" w:hAnsi="Garamond"/>
-                <w:sz w:val="24"/>
-                <w:szCs w:val="24"/>
-              </w:rPr>
-            </w:pPr>
-            <w:r>
-              <w:rPr>
-                <w:rFonts w:ascii="Garamond" w:cs="Garamond" w:eastAsia="Garamond" w:hAnsi="Garamond"/>
-                <w:sz w:val="24"/>
-                <w:szCs w:val="24"/>
+              <w:spacing w:before="0" w:line="240" w:lineRule="auto"/>
+              <w:rPr/>
+            </w:pPr>
+            <w:r>
+              <w:rPr>
                 <w:rtl w:val="0"/>
               </w:rPr>
               <w:t xml:space="preserve">“We both want the building to work for students”, “I think we agree on the goal”. Naming shared ground before stating a difference makes the difference feel like a disagreement between allies.</w:t>
@@ -1066,22 +924,16 @@
           <w:tcPr/>
           <w:p>
             <w:pPr>
-              <w:spacing w:line="240" w:lineRule="auto"/>
-              <w:rPr>
-                <w:rFonts w:ascii="Garamond" w:cs="Garamond" w:eastAsia="Garamond" w:hAnsi="Garamond"/>
+              <w:spacing w:before="0" w:line="240" w:lineRule="auto"/>
+              <w:rPr>
                 <w:b w:val="1"/>
                 <w:bCs w:val="1"/>
-                <w:sz w:val="24"/>
-                <w:szCs w:val="24"/>
-              </w:rPr>
-            </w:pPr>
-            <w:r>
-              <w:rPr>
-                <w:rFonts w:ascii="Garamond" w:cs="Garamond" w:eastAsia="Garamond" w:hAnsi="Garamond"/>
+              </w:rPr>
+            </w:pPr>
+            <w:r>
+              <w:rPr>
                 <w:b w:val="1"/>
                 <w:bCs w:val="1"/>
-                <w:sz w:val="24"/>
-                <w:szCs w:val="24"/>
                 <w:rtl w:val="0"/>
               </w:rPr>
               <w:t xml:space="preserve">A</w:t>
@@ -1092,29 +944,19 @@
           <w:tcPr/>
           <w:p>
             <w:pPr>
-              <w:spacing w:line="240" w:lineRule="auto"/>
-              <w:rPr>
-                <w:rFonts w:ascii="Garamond" w:cs="Garamond" w:eastAsia="Garamond" w:hAnsi="Garamond"/>
-                <w:sz w:val="24"/>
-                <w:szCs w:val="24"/>
-              </w:rPr>
-            </w:pPr>
-            <w:r>
-              <w:rPr>
-                <w:rFonts w:ascii="Garamond" w:cs="Garamond" w:eastAsia="Garamond" w:hAnsi="Garamond"/>
+              <w:spacing w:before="0" w:line="240" w:lineRule="auto"/>
+              <w:rPr/>
+            </w:pPr>
+            <w:r>
+              <w:rPr>
                 <w:b w:val="1"/>
                 <w:bCs w:val="1"/>
-                <w:sz w:val="24"/>
-                <w:szCs w:val="24"/>
                 <w:rtl w:val="0"/>
               </w:rPr>
               <w:t xml:space="preserve">Acknowledge</w:t>
             </w:r>
             <w:r>
               <w:rPr>
-                <w:rFonts w:ascii="Garamond" w:cs="Garamond" w:eastAsia="Garamond" w:hAnsi="Garamond"/>
-                <w:sz w:val="24"/>
-                <w:szCs w:val="24"/>
                 <w:rtl w:val="0"/>
               </w:rPr>
               <w:t xml:space="preserve"> the other’s perspective</w:t>
@@ -1125,18 +967,11 @@
           <w:tcPr/>
           <w:p>
             <w:pPr>
-              <w:spacing w:line="240" w:lineRule="auto"/>
-              <w:rPr>
-                <w:rFonts w:ascii="Garamond" w:cs="Garamond" w:eastAsia="Garamond" w:hAnsi="Garamond"/>
-                <w:sz w:val="24"/>
-                <w:szCs w:val="24"/>
-              </w:rPr>
-            </w:pPr>
-            <w:r>
-              <w:rPr>
-                <w:rFonts w:ascii="Garamond" w:cs="Garamond" w:eastAsia="Garamond" w:hAnsi="Garamond"/>
-                <w:sz w:val="24"/>
-                <w:szCs w:val="24"/>
+              <w:spacing w:before="0" w:line="240" w:lineRule="auto"/>
+              <w:rPr/>
+            </w:pPr>
+            <w:r>
+              <w:rPr>
                 <w:rtl w:val="0"/>
               </w:rPr>
               <w:t xml:space="preserve">“Leo’s point about space is fair”, “I can see why you’d read it that way”. Restating the other view accurately, and granting what is right in it, shows you have actually listened.</w:t>
@@ -1154,22 +989,16 @@
           <w:tcPr/>
           <w:p>
             <w:pPr>
-              <w:spacing w:line="240" w:lineRule="auto"/>
-              <w:rPr>
-                <w:rFonts w:ascii="Garamond" w:cs="Garamond" w:eastAsia="Garamond" w:hAnsi="Garamond"/>
+              <w:spacing w:before="0" w:line="240" w:lineRule="auto"/>
+              <w:rPr>
                 <w:b w:val="1"/>
                 <w:bCs w:val="1"/>
-                <w:sz w:val="24"/>
-                <w:szCs w:val="24"/>
-              </w:rPr>
-            </w:pPr>
-            <w:r>
-              <w:rPr>
-                <w:rFonts w:ascii="Garamond" w:cs="Garamond" w:eastAsia="Garamond" w:hAnsi="Garamond"/>
+              </w:rPr>
+            </w:pPr>
+            <w:r>
+              <w:rPr>
                 <w:b w:val="1"/>
                 <w:bCs w:val="1"/>
-                <w:sz w:val="24"/>
-                <w:szCs w:val="24"/>
                 <w:rtl w:val="0"/>
               </w:rPr>
               <w:t xml:space="preserve">R</w:t>
@@ -1180,29 +1009,19 @@
           <w:tcPr/>
           <w:p>
             <w:pPr>
-              <w:spacing w:line="240" w:lineRule="auto"/>
-              <w:rPr>
-                <w:rFonts w:ascii="Garamond" w:cs="Garamond" w:eastAsia="Garamond" w:hAnsi="Garamond"/>
-                <w:sz w:val="24"/>
-                <w:szCs w:val="24"/>
-              </w:rPr>
-            </w:pPr>
-            <w:r>
-              <w:rPr>
-                <w:rFonts w:ascii="Garamond" w:cs="Garamond" w:eastAsia="Garamond" w:hAnsi="Garamond"/>
+              <w:spacing w:before="0" w:line="240" w:lineRule="auto"/>
+              <w:rPr/>
+            </w:pPr>
+            <w:r>
+              <w:rPr>
                 <w:b w:val="1"/>
                 <w:bCs w:val="1"/>
-                <w:sz w:val="24"/>
-                <w:szCs w:val="24"/>
                 <w:rtl w:val="0"/>
               </w:rPr>
               <w:t xml:space="preserve">Reframe</w:t>
             </w:r>
             <w:r>
               <w:rPr>
-                <w:rFonts w:ascii="Garamond" w:cs="Garamond" w:eastAsia="Garamond" w:hAnsi="Garamond"/>
-                <w:sz w:val="24"/>
-                <w:szCs w:val="24"/>
                 <w:rtl w:val="0"/>
               </w:rPr>
               <w:t xml:space="preserve"> to the positive</w:t>
@@ -1213,18 +1032,11 @@
           <w:tcPr/>
           <w:p>
             <w:pPr>
-              <w:spacing w:line="240" w:lineRule="auto"/>
-              <w:rPr>
-                <w:rFonts w:ascii="Garamond" w:cs="Garamond" w:eastAsia="Garamond" w:hAnsi="Garamond"/>
-                <w:sz w:val="24"/>
-                <w:szCs w:val="24"/>
-              </w:rPr>
-            </w:pPr>
-            <w:r>
-              <w:rPr>
-                <w:rFonts w:ascii="Garamond" w:cs="Garamond" w:eastAsia="Garamond" w:hAnsi="Garamond"/>
-                <w:sz w:val="24"/>
-                <w:szCs w:val="24"/>
+              <w:spacing w:before="0" w:line="240" w:lineRule="auto"/>
+              <w:rPr/>
+            </w:pPr>
+            <w:r>
+              <w:rPr>
                 <w:rtl w:val="0"/>
               </w:rPr>
               <w:t xml:space="preserve">“What would help is…” rather than “what’s wrong is…” avoiding absolute and negative language (“never”, “obviously”, “no one seriously thinks”). Positive framing keeps the exchange open rather than closing it.</w:t>
@@ -1236,24 +1048,12 @@
     <w:p>
       <w:pPr>
         <w:pStyle w:val="Heading1"/>
-        <w:spacing w:before="400" w:line="276" w:lineRule="auto"/>
-        <w:rPr>
-          <w:rFonts w:ascii="Garamond" w:cs="Garamond" w:eastAsia="Garamond" w:hAnsi="Garamond"/>
-          <w:b w:val="0"/>
-          <w:bCs w:val="0"/>
-          <w:sz w:val="40"/>
-          <w:szCs w:val="40"/>
-        </w:rPr>
-      </w:pPr>
-      <w:bookmarkStart w:colFirst="0" w:colLast="0" w:name="_8x7u4gqrdju0" w:id="5"/>
-      <w:bookmarkEnd w:id="5"/>
-      <w:r>
-        <w:rPr>
-          <w:rFonts w:ascii="Garamond" w:cs="Garamond" w:eastAsia="Garamond" w:hAnsi="Garamond"/>
-          <w:b w:val="0"/>
-          <w:bCs w:val="0"/>
-          <w:sz w:val="40"/>
-          <w:szCs w:val="40"/>
+        <w:rPr/>
+      </w:pPr>
+      <w:bookmarkStart w:colFirst="0" w:colLast="0" w:name="_8x7u4gqrdju0" w:id="6"/>
+      <w:bookmarkEnd w:id="6"/>
+      <w:r>
+        <w:rPr>
           <w:rtl w:val="0"/>
         </w:rPr>
         <w:t xml:space="preserve">3. The Game </w:t>
@@ -1261,18 +1061,10 @@
     </w:p>
     <w:p>
       <w:pPr>
-        <w:spacing w:before="200" w:line="276" w:lineRule="auto"/>
-        <w:rPr>
-          <w:rFonts w:ascii="Garamond" w:cs="Garamond" w:eastAsia="Garamond" w:hAnsi="Garamond"/>
-          <w:sz w:val="24"/>
-          <w:szCs w:val="24"/>
-        </w:rPr>
-      </w:pPr>
-      <w:r>
-        <w:rPr>
-          <w:rFonts w:ascii="Garamond" w:cs="Garamond" w:eastAsia="Garamond" w:hAnsi="Garamond"/>
-          <w:sz w:val="24"/>
-          <w:szCs w:val="24"/>
+        <w:rPr/>
+      </w:pPr>
+      <w:r>
+        <w:rPr>
           <w:rtl w:val="0"/>
         </w:rPr>
         <w:t xml:space="preserve">The game revolves around a mystery and so the game begins with a brief introduction of the game and then jumping right into the presentation of the mystery with the Hook. </w:t>
@@ -1281,24 +1073,12 @@
     <w:p>
       <w:pPr>
         <w:pStyle w:val="Heading2"/>
-        <w:spacing w:after="120" w:line="276" w:lineRule="auto"/>
-        <w:rPr>
-          <w:rFonts w:ascii="Garamond" w:cs="Garamond" w:eastAsia="Garamond" w:hAnsi="Garamond"/>
-          <w:b w:val="0"/>
-          <w:bCs w:val="0"/>
-          <w:sz w:val="32"/>
-          <w:szCs w:val="32"/>
-        </w:rPr>
-      </w:pPr>
-      <w:bookmarkStart w:colFirst="0" w:colLast="0" w:name="_h6c12zbk9cf" w:id="6"/>
-      <w:bookmarkEnd w:id="6"/>
-      <w:r>
-        <w:rPr>
-          <w:rFonts w:ascii="Garamond" w:cs="Garamond" w:eastAsia="Garamond" w:hAnsi="Garamond"/>
-          <w:b w:val="0"/>
-          <w:bCs w:val="0"/>
-          <w:sz w:val="32"/>
-          <w:szCs w:val="32"/>
+        <w:rPr/>
+      </w:pPr>
+      <w:bookmarkStart w:colFirst="0" w:colLast="0" w:name="_h6c12zbk9cf" w:id="7"/>
+      <w:bookmarkEnd w:id="7"/>
+      <w:r>
+        <w:rPr>
           <w:rtl w:val="0"/>
         </w:rPr>
         <w:t xml:space="preserve">3.1 Introduction </w:t>
@@ -1306,18 +1086,10 @@
     </w:p>
     <w:p>
       <w:pPr>
-        <w:spacing w:before="200" w:line="276" w:lineRule="auto"/>
-        <w:rPr>
-          <w:rFonts w:ascii="Garamond" w:cs="Garamond" w:eastAsia="Garamond" w:hAnsi="Garamond"/>
-          <w:sz w:val="24"/>
-          <w:szCs w:val="24"/>
-        </w:rPr>
-      </w:pPr>
-      <w:r>
-        <w:rPr>
-          <w:rFonts w:ascii="Garamond" w:cs="Garamond" w:eastAsia="Garamond" w:hAnsi="Garamond"/>
-          <w:sz w:val="24"/>
-          <w:szCs w:val="24"/>
+        <w:rPr/>
+      </w:pPr>
+      <w:r>
+        <w:rPr>
           <w:rtl w:val="0"/>
         </w:rPr>
         <w:t xml:space="preserve">In the introduction players are told that they are playing a mystery game while also practicing the HEAR framework. The game is designed to follow a module or a class where students have studied the HEAR framework, and conversational receptiveness more generally, in greater detail and so the introduction presents the framework briefly. A slide with a quick summary of the HEAR framework should be available for players throughout the game so they can review the material at any time. </w:t>
@@ -1325,18 +1097,10 @@
     </w:p>
     <w:p>
       <w:pPr>
-        <w:spacing w:before="200" w:line="276" w:lineRule="auto"/>
-        <w:rPr>
-          <w:rFonts w:ascii="Garamond" w:cs="Garamond" w:eastAsia="Garamond" w:hAnsi="Garamond"/>
-          <w:sz w:val="24"/>
-          <w:szCs w:val="24"/>
-        </w:rPr>
-      </w:pPr>
-      <w:r>
-        <w:rPr>
-          <w:rFonts w:ascii="Garamond" w:cs="Garamond" w:eastAsia="Garamond" w:hAnsi="Garamond"/>
-          <w:sz w:val="24"/>
-          <w:szCs w:val="24"/>
+        <w:rPr/>
+      </w:pPr>
+      <w:r>
+        <w:rPr>
           <w:rtl w:val="0"/>
         </w:rPr>
         <w:t xml:space="preserve">The introduction explains the rules of the game:</w:t>
@@ -1348,37 +1112,23 @@
           <w:ilvl w:val="0"/>
           <w:numId w:val="3"/>
         </w:numPr>
-        <w:spacing w:after="0" w:afterAutospacing="0" w:before="200" w:line="276" w:lineRule="auto"/>
+        <w:spacing w:after="0" w:afterAutospacing="0"/>
         <w:ind w:left="720" w:hanging="360"/>
-        <w:rPr>
-          <w:rFonts w:ascii="Garamond" w:cs="Garamond" w:eastAsia="Garamond" w:hAnsi="Garamond"/>
-          <w:sz w:val="24"/>
-          <w:szCs w:val="24"/>
-        </w:rPr>
-      </w:pPr>
-      <w:r>
-        <w:rPr>
-          <w:rFonts w:ascii="Garamond" w:cs="Garamond" w:eastAsia="Garamond" w:hAnsi="Garamond"/>
-          <w:sz w:val="24"/>
-          <w:szCs w:val="24"/>
+      </w:pPr>
+      <w:r>
+        <w:rPr>
           <w:rtl w:val="0"/>
         </w:rPr>
         <w:t xml:space="preserve">The goal of the game is to solve the mystery. At the end players will be asked to make a guess which addresses the central puzzle of the mystery. This may include identifying a culprit, if there is one, a motive or a reasoning, and the method.</w:t>
       </w:r>
       <w:r>
         <w:rPr>
-          <w:rFonts w:ascii="Garamond" w:cs="Garamond" w:eastAsia="Garamond" w:hAnsi="Garamond"/>
-          <w:sz w:val="24"/>
-          <w:szCs w:val="24"/>
           <w:vertAlign w:val="superscript"/>
         </w:rPr>
         <w:footnoteReference w:customMarkFollows="0" w:id="3"/>
       </w:r>
       <w:r>
         <w:rPr>
-          <w:rFonts w:ascii="Garamond" w:cs="Garamond" w:eastAsia="Garamond" w:hAnsi="Garamond"/>
-          <w:sz w:val="24"/>
-          <w:szCs w:val="24"/>
           <w:rtl w:val="0"/>
         </w:rPr>
         <w:t xml:space="preserve"> </w:t>
@@ -1390,19 +1140,11 @@
           <w:ilvl w:val="1"/>
           <w:numId w:val="3"/>
         </w:numPr>
-        <w:spacing w:after="0" w:afterAutospacing="0" w:before="0" w:beforeAutospacing="0" w:line="276" w:lineRule="auto"/>
+        <w:spacing w:after="0" w:afterAutospacing="0" w:before="0" w:beforeAutospacing="0"/>
         <w:ind w:left="1440" w:hanging="360"/>
-        <w:rPr>
-          <w:rFonts w:ascii="Garamond" w:cs="Garamond" w:eastAsia="Garamond" w:hAnsi="Garamond"/>
-          <w:sz w:val="24"/>
-          <w:szCs w:val="24"/>
-        </w:rPr>
-      </w:pPr>
-      <w:r>
-        <w:rPr>
-          <w:rFonts w:ascii="Garamond" w:cs="Garamond" w:eastAsia="Garamond" w:hAnsi="Garamond"/>
-          <w:sz w:val="24"/>
-          <w:szCs w:val="24"/>
+      </w:pPr>
+      <w:r>
+        <w:rPr>
           <w:rtl w:val="0"/>
         </w:rPr>
         <w:t xml:space="preserve">As a general rule, each of the witnesses should have a reasonable </w:t>
@@ -1414,19 +1156,11 @@
           <w:ilvl w:val="0"/>
           <w:numId w:val="3"/>
         </w:numPr>
-        <w:spacing w:after="0" w:afterAutospacing="0" w:before="0" w:beforeAutospacing="0" w:line="276" w:lineRule="auto"/>
+        <w:spacing w:after="0" w:afterAutospacing="0" w:before="0" w:beforeAutospacing="0"/>
         <w:ind w:left="720" w:hanging="360"/>
-        <w:rPr>
-          <w:rFonts w:ascii="Garamond" w:cs="Garamond" w:eastAsia="Garamond" w:hAnsi="Garamond"/>
-          <w:sz w:val="24"/>
-          <w:szCs w:val="24"/>
-        </w:rPr>
-      </w:pPr>
-      <w:r>
-        <w:rPr>
-          <w:rFonts w:ascii="Garamond" w:cs="Garamond" w:eastAsia="Garamond" w:hAnsi="Garamond"/>
-          <w:sz w:val="24"/>
-          <w:szCs w:val="24"/>
+      </w:pPr>
+      <w:r>
+        <w:rPr>
           <w:rtl w:val="0"/>
         </w:rPr>
         <w:t xml:space="preserve">The bulk of the game is made of students interviewing witnesses. The interview process is made of a series of questions. There are 8 witnesses and each can be asked a variant of 8 questions.</w:t>
@@ -1438,19 +1172,11 @@
           <w:ilvl w:val="0"/>
           <w:numId w:val="3"/>
         </w:numPr>
-        <w:spacing w:after="0" w:afterAutospacing="0" w:before="0" w:beforeAutospacing="0" w:line="276" w:lineRule="auto"/>
+        <w:spacing w:after="0" w:afterAutospacing="0" w:before="0" w:beforeAutospacing="0"/>
         <w:ind w:left="720" w:hanging="360"/>
-        <w:rPr>
-          <w:rFonts w:ascii="Garamond" w:cs="Garamond" w:eastAsia="Garamond" w:hAnsi="Garamond"/>
-          <w:sz w:val="24"/>
-          <w:szCs w:val="24"/>
-        </w:rPr>
-      </w:pPr>
-      <w:r>
-        <w:rPr>
-          <w:rFonts w:ascii="Garamond" w:cs="Garamond" w:eastAsia="Garamond" w:hAnsi="Garamond"/>
-          <w:sz w:val="24"/>
-          <w:szCs w:val="24"/>
+      </w:pPr>
+      <w:r>
+        <w:rPr>
           <w:rtl w:val="0"/>
         </w:rPr>
         <w:t xml:space="preserve">Students have a total ‘budget’ of </w:t>
@@ -1462,9 +1188,6 @@
       </w:r>
       <w:r>
         <w:rPr>
-          <w:rFonts w:ascii="Garamond" w:cs="Garamond" w:eastAsia="Garamond" w:hAnsi="Garamond"/>
-          <w:sz w:val="24"/>
-          <w:szCs w:val="24"/>
           <w:rtl w:val="0"/>
         </w:rPr>
         <w:t xml:space="preserve">30</w:t>
@@ -1474,9 +1197,6 @@
       </w:r>
       <w:r>
         <w:rPr>
-          <w:rFonts w:ascii="Garamond" w:cs="Garamond" w:eastAsia="Garamond" w:hAnsi="Garamond"/>
-          <w:sz w:val="24"/>
-          <w:szCs w:val="24"/>
           <w:rtl w:val="0"/>
         </w:rPr>
         <w:t xml:space="preserve"> questions that they can spread out across the witnesses however they want. Visiting a question that was asked before does not cost another question. Once they ask all their questions, or at any time before that if they like, they may make a guess and attempt to solve the mystery. Players have three chances to make a correct guess. If a player makes the wrong guess, they are told only that their guess is wrong, not which part, and they may keep investigating if they have questions left. Players gain more points if they guess correctly on their first try. </w:t>
@@ -1488,57 +1208,37 @@
           <w:ilvl w:val="0"/>
           <w:numId w:val="3"/>
         </w:numPr>
-        <w:spacing w:after="0" w:afterAutospacing="0" w:before="0" w:beforeAutospacing="0" w:line="276" w:lineRule="auto"/>
+        <w:spacing w:after="0" w:afterAutospacing="0" w:before="0" w:beforeAutospacing="0"/>
         <w:ind w:left="720" w:hanging="360"/>
-        <w:rPr>
-          <w:rFonts w:ascii="Garamond" w:cs="Garamond" w:eastAsia="Garamond" w:hAnsi="Garamond"/>
-          <w:sz w:val="24"/>
-          <w:szCs w:val="24"/>
-        </w:rPr>
-      </w:pPr>
-      <w:r>
-        <w:rPr>
-          <w:rFonts w:ascii="Garamond" w:cs="Garamond" w:eastAsia="Garamond" w:hAnsi="Garamond"/>
-          <w:sz w:val="24"/>
-          <w:szCs w:val="24"/>
+      </w:pPr>
+      <w:r>
+        <w:rPr>
           <w:rtl w:val="0"/>
         </w:rPr>
         <w:t xml:space="preserve"> For each witness, one question is a </w:t>
       </w:r>
       <w:r>
         <w:rPr>
-          <w:rFonts w:ascii="Garamond" w:cs="Garamond" w:eastAsia="Garamond" w:hAnsi="Garamond"/>
           <w:b w:val="1"/>
           <w:bCs w:val="1"/>
-          <w:sz w:val="24"/>
-          <w:szCs w:val="24"/>
           <w:rtl w:val="0"/>
         </w:rPr>
         <w:t xml:space="preserve">tripwire</w:t>
       </w:r>
       <w:r>
         <w:rPr>
-          <w:rFonts w:ascii="Garamond" w:cs="Garamond" w:eastAsia="Garamond" w:hAnsi="Garamond"/>
-          <w:sz w:val="24"/>
-          <w:szCs w:val="24"/>
           <w:rtl w:val="0"/>
         </w:rPr>
         <w:t xml:space="preserve">: it offends or annoys them such that they walk away and the interview ends abruptly. There is no asking any more questions of a witness who was </w:t>
       </w:r>
       <w:r>
         <w:rPr>
-          <w:rFonts w:ascii="Garamond" w:cs="Garamond" w:eastAsia="Garamond" w:hAnsi="Garamond"/>
-          <w:sz w:val="24"/>
-          <w:szCs w:val="24"/>
           <w:rtl w:val="0"/>
         </w:rPr>
         <w:t xml:space="preserve">asked a tripwire</w:t>
       </w:r>
       <w:r>
         <w:rPr>
-          <w:rFonts w:ascii="Garamond" w:cs="Garamond" w:eastAsia="Garamond" w:hAnsi="Garamond"/>
-          <w:sz w:val="24"/>
-          <w:szCs w:val="24"/>
           <w:rtl w:val="0"/>
         </w:rPr>
         <w:t xml:space="preserve">.</w:t>
@@ -1550,37 +1250,23 @@
           <w:ilvl w:val="0"/>
           <w:numId w:val="3"/>
         </w:numPr>
-        <w:spacing w:after="0" w:afterAutospacing="0" w:before="0" w:beforeAutospacing="0" w:line="276" w:lineRule="auto"/>
+        <w:spacing w:after="0" w:afterAutospacing="0" w:before="0" w:beforeAutospacing="0"/>
         <w:ind w:left="720" w:hanging="360"/>
-        <w:rPr>
-          <w:rFonts w:ascii="Garamond" w:cs="Garamond" w:eastAsia="Garamond" w:hAnsi="Garamond"/>
-          <w:sz w:val="24"/>
-          <w:szCs w:val="24"/>
-        </w:rPr>
-      </w:pPr>
-      <w:r>
-        <w:rPr>
-          <w:rFonts w:ascii="Garamond" w:cs="Garamond" w:eastAsia="Garamond" w:hAnsi="Garamond"/>
-          <w:sz w:val="24"/>
-          <w:szCs w:val="24"/>
+      </w:pPr>
+      <w:r>
+        <w:rPr>
           <w:rtl w:val="0"/>
         </w:rPr>
         <w:t xml:space="preserve"> With each witness, players have a chance to do a follow-up. They may do so after any answer the witness gave them (i.e. for all questions except the tripwire). To follow-up students will have to choose one of </w:t>
       </w:r>
       <w:r>
         <w:rPr>
-          <w:rFonts w:ascii="Garamond" w:cs="Garamond" w:eastAsia="Garamond" w:hAnsi="Garamond"/>
-          <w:sz w:val="24"/>
-          <w:szCs w:val="24"/>
           <w:rtl w:val="0"/>
         </w:rPr>
         <w:t xml:space="preserve">two phrasings</w:t>
       </w:r>
       <w:r>
         <w:rPr>
-          <w:rFonts w:ascii="Garamond" w:cs="Garamond" w:eastAsia="Garamond" w:hAnsi="Garamond"/>
-          <w:sz w:val="24"/>
-          <w:szCs w:val="24"/>
           <w:rtl w:val="0"/>
         </w:rPr>
         <w:t xml:space="preserve"> of a follow-up question or comment regarding the witness’s view on the CCC. If they pick correctly, they gain a Major Clue which helps them solve the mystery faster. If they pick incorrectly, the witness storms off angrily (just like they would with a tripwire).</w:t>
@@ -1592,19 +1278,11 @@
           <w:ilvl w:val="0"/>
           <w:numId w:val="3"/>
         </w:numPr>
-        <w:spacing w:after="0" w:afterAutospacing="0" w:before="0" w:beforeAutospacing="0" w:line="276" w:lineRule="auto"/>
+        <w:spacing w:after="0" w:afterAutospacing="0" w:before="0" w:beforeAutospacing="0"/>
         <w:ind w:left="720" w:hanging="360"/>
-        <w:rPr>
-          <w:rFonts w:ascii="Garamond" w:cs="Garamond" w:eastAsia="Garamond" w:hAnsi="Garamond"/>
-          <w:sz w:val="24"/>
-          <w:szCs w:val="24"/>
-        </w:rPr>
-      </w:pPr>
-      <w:r>
-        <w:rPr>
-          <w:rFonts w:ascii="Garamond" w:cs="Garamond" w:eastAsia="Garamond" w:hAnsi="Garamond"/>
-          <w:sz w:val="24"/>
-          <w:szCs w:val="24"/>
+      </w:pPr>
+      <w:r>
+        <w:rPr>
           <w:rtl w:val="0"/>
         </w:rPr>
         <w:t xml:space="preserve">The choice between the two options should present a temptation to answer the question with the ‘wrong’ answer. The emotional stakes in the case and the way in which the follow-up questions are phrased should provide some emotional satisfaction. </w:t>
@@ -1616,19 +1294,11 @@
           <w:ilvl w:val="0"/>
           <w:numId w:val="3"/>
         </w:numPr>
-        <w:spacing w:before="0" w:beforeAutospacing="0" w:line="276" w:lineRule="auto"/>
+        <w:spacing w:before="0" w:beforeAutospacing="0"/>
         <w:ind w:left="720" w:hanging="360"/>
-        <w:rPr>
-          <w:rFonts w:ascii="Garamond" w:cs="Garamond" w:eastAsia="Garamond" w:hAnsi="Garamond"/>
-          <w:sz w:val="24"/>
-          <w:szCs w:val="24"/>
-        </w:rPr>
-      </w:pPr>
-      <w:r>
-        <w:rPr>
-          <w:rFonts w:ascii="Garamond" w:cs="Garamond" w:eastAsia="Garamond" w:hAnsi="Garamond"/>
-          <w:sz w:val="24"/>
-          <w:szCs w:val="24"/>
+      </w:pPr>
+      <w:r>
+        <w:rPr>
           <w:rtl w:val="0"/>
         </w:rPr>
         <w:t xml:space="preserve">Witnesses themselves vary in their receptiveness. It would pay to pay attention to which of these witnesses is more or less receptive. </w:t>
@@ -1641,18 +1311,10 @@
     </w:p>
     <w:p>
       <w:pPr>
-        <w:spacing w:before="200" w:line="276" w:lineRule="auto"/>
-        <w:rPr>
-          <w:rFonts w:ascii="Garamond" w:cs="Garamond" w:eastAsia="Garamond" w:hAnsi="Garamond"/>
-          <w:sz w:val="24"/>
-          <w:szCs w:val="24"/>
-        </w:rPr>
-      </w:pPr>
-      <w:r>
-        <w:rPr>
-          <w:rFonts w:ascii="Garamond" w:cs="Garamond" w:eastAsia="Garamond" w:hAnsi="Garamond"/>
-          <w:sz w:val="24"/>
-          <w:szCs w:val="24"/>
+        <w:rPr/>
+      </w:pPr>
+      <w:r>
+        <w:rPr>
           <w:rtl w:val="0"/>
         </w:rPr>
         <w:t xml:space="preserve">A slide with these rules should be available for players throughout the game so they can refresh their memories if they need to. </w:t>
@@ -1661,24 +1323,12 @@
     <w:p>
       <w:pPr>
         <w:pStyle w:val="Heading2"/>
-        <w:spacing w:after="120" w:line="276" w:lineRule="auto"/>
-        <w:rPr>
-          <w:rFonts w:ascii="Garamond" w:cs="Garamond" w:eastAsia="Garamond" w:hAnsi="Garamond"/>
-          <w:b w:val="0"/>
-          <w:bCs w:val="0"/>
-          <w:sz w:val="32"/>
-          <w:szCs w:val="32"/>
-        </w:rPr>
-      </w:pPr>
-      <w:bookmarkStart w:colFirst="0" w:colLast="0" w:name="_35qvn8hk7yak" w:id="7"/>
-      <w:bookmarkEnd w:id="7"/>
-      <w:r>
-        <w:rPr>
-          <w:rFonts w:ascii="Garamond" w:cs="Garamond" w:eastAsia="Garamond" w:hAnsi="Garamond"/>
-          <w:b w:val="0"/>
-          <w:bCs w:val="0"/>
-          <w:sz w:val="32"/>
-          <w:szCs w:val="32"/>
+        <w:rPr/>
+      </w:pPr>
+      <w:bookmarkStart w:colFirst="0" w:colLast="0" w:name="_35qvn8hk7yak" w:id="8"/>
+      <w:bookmarkEnd w:id="8"/>
+      <w:r>
+        <w:rPr>
           <w:rtl w:val="0"/>
         </w:rPr>
         <w:t xml:space="preserve">3.2 The Hook</w:t>
@@ -1686,78 +1336,52 @@
     </w:p>
     <w:p>
       <w:pPr>
-        <w:spacing w:before="200" w:line="276" w:lineRule="auto"/>
-        <w:rPr>
-          <w:rFonts w:ascii="Garamond" w:cs="Garamond" w:eastAsia="Garamond" w:hAnsi="Garamond"/>
-          <w:sz w:val="24"/>
-          <w:szCs w:val="24"/>
-        </w:rPr>
-      </w:pPr>
-      <w:r>
-        <w:rPr>
-          <w:rFonts w:ascii="Garamond" w:cs="Garamond" w:eastAsia="Garamond" w:hAnsi="Garamond"/>
-          <w:sz w:val="24"/>
-          <w:szCs w:val="24"/>
+        <w:rPr/>
+      </w:pPr>
+      <w:r>
+        <w:rPr>
           <w:rtl w:val="0"/>
         </w:rPr>
         <w:t xml:space="preserve">After the introduction, players are introduced to the mystery by way of </w:t>
       </w:r>
       <w:r>
         <w:rPr>
-          <w:rFonts w:ascii="Garamond" w:cs="Garamond" w:eastAsia="Garamond" w:hAnsi="Garamond"/>
           <w:i w:val="1"/>
           <w:iCs w:val="1"/>
-          <w:sz w:val="24"/>
-          <w:szCs w:val="24"/>
           <w:rtl w:val="0"/>
         </w:rPr>
         <w:t xml:space="preserve">the hook</w:t>
       </w:r>
       <w:r>
         <w:rPr>
-          <w:rFonts w:ascii="Garamond" w:cs="Garamond" w:eastAsia="Garamond" w:hAnsi="Garamond"/>
-          <w:sz w:val="24"/>
-          <w:szCs w:val="24"/>
           <w:rtl w:val="0"/>
         </w:rPr>
         <w:t xml:space="preserve">: a piece of the narrative that presents the CCC, introduces the mystery </w:t>
       </w:r>
       <w:r>
         <w:rPr>
-          <w:rFonts w:ascii="Garamond" w:cs="Garamond" w:eastAsia="Garamond" w:hAnsi="Garamond"/>
           <w:i w:val="1"/>
           <w:iCs w:val="1"/>
-          <w:sz w:val="24"/>
-          <w:szCs w:val="24"/>
           <w:rtl w:val="0"/>
         </w:rPr>
         <w:t xml:space="preserve">and</w:t>
       </w:r>
       <w:r>
         <w:rPr>
-          <w:rFonts w:ascii="Garamond" w:cs="Garamond" w:eastAsia="Garamond" w:hAnsi="Garamond"/>
-          <w:sz w:val="24"/>
-          <w:szCs w:val="24"/>
           <w:rtl w:val="0"/>
         </w:rPr>
         <w:t xml:space="preserve"> situates the players within. For example, in </w:t>
       </w:r>
       <w:r>
         <w:rPr>
-          <w:rFonts w:ascii="Garamond" w:cs="Garamond" w:eastAsia="Garamond" w:hAnsi="Garamond"/>
           <w:i w:val="1"/>
           <w:iCs w:val="1"/>
-          <w:sz w:val="24"/>
-          <w:szCs w:val="24"/>
           <w:rtl w:val="0"/>
         </w:rPr>
         <w:t xml:space="preserve">The Commons’ Comma</w:t>
       </w:r>
       <w:r>
         <w:rPr>
-          <w:rFonts w:ascii="Garamond" w:cs="Garamond" w:eastAsia="Garamond" w:hAnsi="Garamond"/>
-          <w:sz w:val="24"/>
-          <w:szCs w:val="24"/>
           <w:rtl w:val="0"/>
         </w:rPr>
         <w:t xml:space="preserve"> players are student-interns working at the university president office and are tasked with solving their mystery as a task for a part time job they thought would be mostly scanning papers or organizing kitchenette cabinets.</w:t>
@@ -1765,18 +1389,10 @@
     </w:p>
     <w:p>
       <w:pPr>
-        <w:spacing w:before="200" w:line="276" w:lineRule="auto"/>
-        <w:rPr>
-          <w:rFonts w:ascii="Garamond" w:cs="Garamond" w:eastAsia="Garamond" w:hAnsi="Garamond"/>
-          <w:sz w:val="24"/>
-          <w:szCs w:val="24"/>
-        </w:rPr>
-      </w:pPr>
-      <w:r>
-        <w:rPr>
-          <w:rFonts w:ascii="Garamond" w:cs="Garamond" w:eastAsia="Garamond" w:hAnsi="Garamond"/>
-          <w:sz w:val="24"/>
-          <w:szCs w:val="24"/>
+        <w:rPr/>
+      </w:pPr>
+      <w:r>
+        <w:rPr>
           <w:rtl w:val="0"/>
         </w:rPr>
         <w:t xml:space="preserve">The hook should be carefully crafted to be both informative and entertaining, to give the players enough to go off of (there are no other opportunities for big chunks of exposition) as well as something interesting to pull them in and motivate them to be involved. The hook should also include a compelling time pressure which explains why there’s a limited number of questions that the players can ask before… well before something bad happens, but which bad thing, that is told during the hook. </w:t>
@@ -1785,24 +1401,12 @@
     <w:p>
       <w:pPr>
         <w:pStyle w:val="Heading2"/>
-        <w:spacing w:after="120" w:line="276" w:lineRule="auto"/>
-        <w:rPr>
-          <w:rFonts w:ascii="Garamond" w:cs="Garamond" w:eastAsia="Garamond" w:hAnsi="Garamond"/>
-          <w:b w:val="0"/>
-          <w:bCs w:val="0"/>
-          <w:sz w:val="32"/>
-          <w:szCs w:val="32"/>
-        </w:rPr>
-      </w:pPr>
-      <w:bookmarkStart w:colFirst="0" w:colLast="0" w:name="_j7v1h2yirc0i" w:id="8"/>
-      <w:bookmarkEnd w:id="8"/>
-      <w:r>
-        <w:rPr>
-          <w:rFonts w:ascii="Garamond" w:cs="Garamond" w:eastAsia="Garamond" w:hAnsi="Garamond"/>
-          <w:b w:val="0"/>
-          <w:bCs w:val="0"/>
-          <w:sz w:val="32"/>
-          <w:szCs w:val="32"/>
+        <w:rPr/>
+      </w:pPr>
+      <w:bookmarkStart w:colFirst="0" w:colLast="0" w:name="_j7v1h2yirc0i" w:id="9"/>
+      <w:bookmarkEnd w:id="9"/>
+      <w:r>
+        <w:rPr>
           <w:rtl w:val="0"/>
         </w:rPr>
         <w:t xml:space="preserve">3.3 Interviews</w:t>
@@ -1810,18 +1414,10 @@
     </w:p>
     <w:p>
       <w:pPr>
-        <w:spacing w:before="200" w:line="276" w:lineRule="auto"/>
-        <w:rPr>
-          <w:rFonts w:ascii="Garamond" w:cs="Garamond" w:eastAsia="Garamond" w:hAnsi="Garamond"/>
-          <w:sz w:val="24"/>
-          <w:szCs w:val="24"/>
-        </w:rPr>
-      </w:pPr>
-      <w:r>
-        <w:rPr>
-          <w:rFonts w:ascii="Garamond" w:cs="Garamond" w:eastAsia="Garamond" w:hAnsi="Garamond"/>
-          <w:sz w:val="24"/>
-          <w:szCs w:val="24"/>
+        <w:rPr/>
+      </w:pPr>
+      <w:r>
+        <w:rPr>
           <w:rtl w:val="0"/>
         </w:rPr>
         <w:t xml:space="preserve">As noted, the bulk of the game is made of interviews. Students will have a menu of options, each corresponding to a witness they can interview. Students can then ‘walk around’ the campus - going from witness to witness and asking each of them as many questions as they want, provided they have not yet run out of time (i.e. depleted their question ‘budget’) or angered that witness. There are 8 witnesses and each can be asked 8 questions. Since one question for each witness is a tripwire, that leaves us with 56 witness answers. Each one of these 56 answers is made of two parts.  </w:t>
@@ -1829,69 +1425,46 @@
     </w:p>
     <w:p>
       <w:pPr>
-        <w:spacing w:before="200" w:line="276" w:lineRule="auto"/>
-        <w:rPr>
-          <w:rFonts w:ascii="Garamond" w:cs="Garamond" w:eastAsia="Garamond" w:hAnsi="Garamond"/>
-          <w:sz w:val="24"/>
-          <w:szCs w:val="24"/>
-        </w:rPr>
-      </w:pPr>
-      <w:r>
-        <w:rPr>
-          <w:rFonts w:ascii="Garamond" w:cs="Garamond" w:eastAsia="Garamond" w:hAnsi="Garamond"/>
+        <w:rPr/>
+      </w:pPr>
+      <w:r>
+        <w:rPr>
           <w:b w:val="1"/>
           <w:bCs w:val="1"/>
-          <w:sz w:val="24"/>
-          <w:szCs w:val="24"/>
           <w:rtl w:val="0"/>
         </w:rPr>
         <w:t xml:space="preserve">A piece of information</w:t>
       </w:r>
       <w:r>
         <w:rPr>
-          <w:rFonts w:ascii="Garamond" w:cs="Garamond" w:eastAsia="Garamond" w:hAnsi="Garamond"/>
-          <w:sz w:val="24"/>
-          <w:szCs w:val="24"/>
           <w:rtl w:val="0"/>
         </w:rPr>
         <w:t xml:space="preserve"> about the mystery. Of the seven non-tripwire answers of each witness, 4 convey useful information, which technically will be referred to as </w:t>
       </w:r>
       <w:r>
         <w:rPr>
-          <w:rFonts w:ascii="Garamond" w:cs="Garamond" w:eastAsia="Garamond" w:hAnsi="Garamond"/>
           <w:i w:val="1"/>
           <w:iCs w:val="1"/>
-          <w:sz w:val="24"/>
-          <w:szCs w:val="24"/>
           <w:rtl w:val="0"/>
         </w:rPr>
         <w:t xml:space="preserve">Clues</w:t>
       </w:r>
       <w:r>
         <w:rPr>
-          <w:rFonts w:ascii="Garamond" w:cs="Garamond" w:eastAsia="Garamond" w:hAnsi="Garamond"/>
-          <w:sz w:val="24"/>
-          <w:szCs w:val="24"/>
           <w:rtl w:val="0"/>
         </w:rPr>
         <w:t xml:space="preserve">, and 3 pieces of misleading or unhelpful information, which technically will be referred to as </w:t>
       </w:r>
       <w:r>
         <w:rPr>
-          <w:rFonts w:ascii="Garamond" w:cs="Garamond" w:eastAsia="Garamond" w:hAnsi="Garamond"/>
           <w:i w:val="1"/>
           <w:iCs w:val="1"/>
-          <w:sz w:val="24"/>
-          <w:szCs w:val="24"/>
           <w:rtl w:val="0"/>
         </w:rPr>
         <w:t xml:space="preserve">Red Herrings,</w:t>
       </w:r>
       <w:r>
         <w:rPr>
-          <w:rFonts w:ascii="Garamond" w:cs="Garamond" w:eastAsia="Garamond" w:hAnsi="Garamond"/>
-          <w:sz w:val="24"/>
-          <w:szCs w:val="24"/>
           <w:rtl w:val="0"/>
         </w:rPr>
         <w:t xml:space="preserve"> Across eight witnesses that is 32 useful answers and 24 red herrings.</w:t>
@@ -1903,39 +1476,25 @@
           <w:ilvl w:val="0"/>
           <w:numId w:val="8"/>
         </w:numPr>
-        <w:spacing w:after="0" w:afterAutospacing="0" w:before="200" w:line="276" w:lineRule="auto"/>
+        <w:spacing w:after="0" w:afterAutospacing="0"/>
         <w:ind w:left="720" w:hanging="360"/>
-        <w:rPr>
-          <w:rFonts w:ascii="Garamond" w:cs="Garamond" w:eastAsia="Garamond" w:hAnsi="Garamond"/>
-          <w:sz w:val="24"/>
-          <w:szCs w:val="24"/>
-        </w:rPr>
-      </w:pPr>
-      <w:r>
-        <w:rPr>
-          <w:rFonts w:ascii="Garamond" w:cs="Garamond" w:eastAsia="Garamond" w:hAnsi="Garamond"/>
-          <w:sz w:val="24"/>
-          <w:szCs w:val="24"/>
+      </w:pPr>
+      <w:r>
+        <w:rPr>
           <w:rtl w:val="0"/>
         </w:rPr>
         <w:t xml:space="preserve">The 32 useful answers include </w:t>
       </w:r>
       <w:r>
         <w:rPr>
-          <w:rFonts w:ascii="Garamond" w:cs="Garamond" w:eastAsia="Garamond" w:hAnsi="Garamond"/>
           <w:b w:val="1"/>
           <w:bCs w:val="1"/>
-          <w:sz w:val="24"/>
-          <w:szCs w:val="24"/>
           <w:rtl w:val="0"/>
         </w:rPr>
         <w:t xml:space="preserve">16 Clues</w:t>
       </w:r>
       <w:r>
         <w:rPr>
-          <w:rFonts w:ascii="Garamond" w:cs="Garamond" w:eastAsia="Garamond" w:hAnsi="Garamond"/>
-          <w:sz w:val="24"/>
-          <w:szCs w:val="24"/>
           <w:rtl w:val="0"/>
         </w:rPr>
         <w:t xml:space="preserve">, each given by two different witnesses. This gives the player more than one route to access each clue as well as an (imperfect) signal regarding the reliability of the information.</w:t>
@@ -1947,57 +1506,37 @@
           <w:ilvl w:val="0"/>
           <w:numId w:val="8"/>
         </w:numPr>
-        <w:spacing w:after="0" w:afterAutospacing="0" w:before="0" w:beforeAutospacing="0" w:line="276" w:lineRule="auto"/>
+        <w:spacing w:after="0" w:afterAutospacing="0" w:before="0" w:beforeAutospacing="0"/>
         <w:ind w:left="720" w:hanging="360"/>
-        <w:rPr>
-          <w:rFonts w:ascii="Garamond" w:cs="Garamond" w:eastAsia="Garamond" w:hAnsi="Garamond"/>
-          <w:sz w:val="24"/>
-          <w:szCs w:val="24"/>
-        </w:rPr>
-      </w:pPr>
-      <w:r>
-        <w:rPr>
-          <w:rFonts w:ascii="Garamond" w:cs="Garamond" w:eastAsia="Garamond" w:hAnsi="Garamond"/>
-          <w:sz w:val="24"/>
-          <w:szCs w:val="24"/>
+      </w:pPr>
+      <w:r>
+        <w:rPr>
           <w:rtl w:val="0"/>
         </w:rPr>
         <w:t xml:space="preserve">The </w:t>
       </w:r>
       <w:r>
         <w:rPr>
-          <w:rFonts w:ascii="Garamond" w:cs="Garamond" w:eastAsia="Garamond" w:hAnsi="Garamond"/>
           <w:b w:val="1"/>
           <w:bCs w:val="1"/>
-          <w:sz w:val="24"/>
-          <w:szCs w:val="24"/>
           <w:rtl w:val="0"/>
         </w:rPr>
         <w:t xml:space="preserve">24 Red Herrings</w:t>
       </w:r>
       <w:r>
         <w:rPr>
-          <w:rFonts w:ascii="Garamond" w:cs="Garamond" w:eastAsia="Garamond" w:hAnsi="Garamond"/>
-          <w:sz w:val="24"/>
-          <w:szCs w:val="24"/>
           <w:rtl w:val="0"/>
         </w:rPr>
         <w:t xml:space="preserve"> are each given once and they are grouped in sets (of 2/3/4) such that the Red Herrings that form a set 'cancel each other out,' so if you have all members of a set you should be able to deduce that neither of them are relevant to the case. For example, a set of Red Herrings may include descriptions of suspicious-but-not-actually-incriminating behaviors by one of the suspects as well as some exonerating information about that suspect. Taken on their own, the suspicious behaviors may seem pertinent to the case but the exonerating information shows that despite their attractiveness, the pieces of information about the suspicious behavior are not helpful.</w:t>
       </w:r>
       <w:r>
         <w:rPr>
-          <w:rFonts w:ascii="Garamond" w:cs="Garamond" w:eastAsia="Garamond" w:hAnsi="Garamond"/>
-          <w:sz w:val="24"/>
-          <w:szCs w:val="24"/>
           <w:vertAlign w:val="superscript"/>
         </w:rPr>
         <w:footnoteReference w:customMarkFollows="0" w:id="4"/>
       </w:r>
       <w:r>
         <w:rPr>
-          <w:rFonts w:ascii="Garamond" w:cs="Garamond" w:eastAsia="Garamond" w:hAnsi="Garamond"/>
-          <w:sz w:val="24"/>
-          <w:szCs w:val="24"/>
           <w:rtl w:val="0"/>
         </w:rPr>
         <w:t xml:space="preserve"> Another example is a set of Red Herrings that make up lies which can be exposed when one has the whole set. </w:t>
@@ -2009,19 +1548,11 @@
           <w:ilvl w:val="0"/>
           <w:numId w:val="8"/>
         </w:numPr>
-        <w:spacing w:before="0" w:beforeAutospacing="0" w:line="276" w:lineRule="auto"/>
+        <w:spacing w:before="0" w:beforeAutospacing="0"/>
         <w:ind w:left="720" w:hanging="360"/>
-        <w:rPr>
-          <w:rFonts w:ascii="Garamond" w:cs="Garamond" w:eastAsia="Garamond" w:hAnsi="Garamond"/>
-          <w:sz w:val="24"/>
-          <w:szCs w:val="24"/>
-        </w:rPr>
-      </w:pPr>
-      <w:r>
-        <w:rPr>
-          <w:rFonts w:ascii="Garamond" w:cs="Garamond" w:eastAsia="Garamond" w:hAnsi="Garamond"/>
-          <w:sz w:val="24"/>
-          <w:szCs w:val="24"/>
+      </w:pPr>
+      <w:r>
+        <w:rPr>
           <w:rtl w:val="0"/>
         </w:rPr>
         <w:t xml:space="preserve">Useful clues gained without follow-ups point in the right direction but are individually inconclusive. Together, all 16 do add up to the solution, but a player working from ordinary clues alone will usually have to reason across gaps.</w:t>
@@ -2029,29 +1560,18 @@
     </w:p>
     <w:p>
       <w:pPr>
-        <w:spacing w:before="200" w:line="276" w:lineRule="auto"/>
-        <w:rPr>
-          <w:rFonts w:ascii="Garamond" w:cs="Garamond" w:eastAsia="Garamond" w:hAnsi="Garamond"/>
-          <w:sz w:val="24"/>
-          <w:szCs w:val="24"/>
-        </w:rPr>
-      </w:pPr>
-      <w:r>
-        <w:rPr>
-          <w:rFonts w:ascii="Garamond" w:cs="Garamond" w:eastAsia="Garamond" w:hAnsi="Garamond"/>
+        <w:rPr/>
+      </w:pPr>
+      <w:r>
+        <w:rPr>
           <w:b w:val="1"/>
           <w:bCs w:val="1"/>
-          <w:sz w:val="24"/>
-          <w:szCs w:val="24"/>
           <w:rtl w:val="0"/>
         </w:rPr>
         <w:t xml:space="preserve">An expressed opinion about the controversy</w:t>
       </w:r>
       <w:r>
         <w:rPr>
-          <w:rFonts w:ascii="Garamond" w:cs="Garamond" w:eastAsia="Garamond" w:hAnsi="Garamond"/>
-          <w:sz w:val="24"/>
-          <w:szCs w:val="24"/>
           <w:rtl w:val="0"/>
         </w:rPr>
         <w:t xml:space="preserve">. Alongside the information provided about the mystery, witnesses volunteer their view of the CCC and say how their view differs from that of one of the other witnesses. As part of the scenario setup, witnesses are ranked by their receptiveness. The witness ranked 1 expresses their opinion receptively in all seven answers, rank 2 in six of seven, rank 3 in five, and so on down to rank 8, who is receptive in none. Overall, exactly half of the 56 opinion expressions are receptive. The details of this ranking are not shared with the players though the general fact regarding the variance in receptiveness. </w:t>
@@ -2059,38 +1579,24 @@
     </w:p>
     <w:p>
       <w:pPr>
-        <w:spacing w:before="200" w:line="276" w:lineRule="auto"/>
-        <w:rPr>
-          <w:rFonts w:ascii="Garamond" w:cs="Garamond" w:eastAsia="Garamond" w:hAnsi="Garamond"/>
-          <w:sz w:val="24"/>
-          <w:szCs w:val="24"/>
-        </w:rPr>
-      </w:pPr>
-      <w:r>
-        <w:rPr>
-          <w:rFonts w:ascii="Garamond" w:cs="Garamond" w:eastAsia="Garamond" w:hAnsi="Garamond"/>
-          <w:sz w:val="24"/>
-          <w:szCs w:val="24"/>
+        <w:rPr/>
+      </w:pPr>
+      <w:r>
+        <w:rPr>
           <w:rtl w:val="0"/>
         </w:rPr>
         <w:t xml:space="preserve">Receptive expressions use one or more HEAR moves while unreceptive ones expresses their views on the basis of </w:t>
       </w:r>
       <w:r>
         <w:rPr>
-          <w:rFonts w:ascii="Garamond" w:cs="Garamond" w:eastAsia="Garamond" w:hAnsi="Garamond"/>
           <w:i w:val="1"/>
           <w:iCs w:val="1"/>
-          <w:sz w:val="24"/>
-          <w:szCs w:val="24"/>
           <w:rtl w:val="0"/>
         </w:rPr>
         <w:t xml:space="preserve">naive realism</w:t>
       </w:r>
       <w:r>
         <w:rPr>
-          <w:rFonts w:ascii="Garamond" w:cs="Garamond" w:eastAsia="Garamond" w:hAnsi="Garamond"/>
-          <w:sz w:val="24"/>
-          <w:szCs w:val="24"/>
           <w:rtl w:val="0"/>
         </w:rPr>
         <w:t xml:space="preserve">, assuming their perspective is obviously true and so uses absolute language (‘obviously’), fails to acknowledge the other perspective or recognize it as legitimate, focus on how other views are wrong rather than seek agreement and so forth.  </w:t>
@@ -2099,22 +1605,12 @@
     <w:p>
       <w:pPr>
         <w:pStyle w:val="Heading3"/>
-        <w:spacing w:before="320" w:line="276" w:lineRule="auto"/>
-        <w:rPr>
-          <w:rFonts w:ascii="Garamond" w:cs="Garamond" w:eastAsia="Garamond" w:hAnsi="Garamond"/>
-          <w:b w:val="0"/>
-          <w:bCs w:val="0"/>
-          <w:color w:val="434343"/>
-        </w:rPr>
-      </w:pPr>
-      <w:bookmarkStart w:colFirst="0" w:colLast="0" w:name="_n565rz9sqema" w:id="9"/>
-      <w:bookmarkEnd w:id="9"/>
-      <w:r>
-        <w:rPr>
-          <w:rFonts w:ascii="Garamond" w:cs="Garamond" w:eastAsia="Garamond" w:hAnsi="Garamond"/>
-          <w:b w:val="0"/>
-          <w:bCs w:val="0"/>
-          <w:color w:val="434343"/>
+        <w:rPr/>
+      </w:pPr>
+      <w:bookmarkStart w:colFirst="0" w:colLast="0" w:name="_n565rz9sqema" w:id="10"/>
+      <w:bookmarkEnd w:id="10"/>
+      <w:r>
+        <w:rPr>
           <w:rtl w:val="0"/>
         </w:rPr>
         <w:t xml:space="preserve">3.3.1 Follow-up questions and Major Clues</w:t>
@@ -2122,36 +1618,22 @@
     </w:p>
     <w:p>
       <w:pPr>
-        <w:spacing w:before="200" w:line="276" w:lineRule="auto"/>
-        <w:rPr>
-          <w:rFonts w:ascii="Garamond" w:cs="Garamond" w:eastAsia="Garamond" w:hAnsi="Garamond"/>
-          <w:sz w:val="24"/>
-          <w:szCs w:val="24"/>
-        </w:rPr>
-      </w:pPr>
-      <w:r>
-        <w:rPr>
-          <w:rFonts w:ascii="Garamond" w:cs="Garamond" w:eastAsia="Garamond" w:hAnsi="Garamond"/>
-          <w:sz w:val="24"/>
-          <w:szCs w:val="24"/>
+        <w:rPr/>
+      </w:pPr>
+      <w:r>
+        <w:rPr>
           <w:rtl w:val="0"/>
         </w:rPr>
         <w:t xml:space="preserve">Once per witness, after any answer except for the tripwire, players may choose to “ask a follow-up about their opinion”. The game then offers </w:t>
       </w:r>
       <w:r>
         <w:rPr>
-          <w:rFonts w:ascii="Garamond" w:cs="Garamond" w:eastAsia="Garamond" w:hAnsi="Garamond"/>
-          <w:sz w:val="24"/>
-          <w:szCs w:val="24"/>
           <w:rtl w:val="0"/>
         </w:rPr>
         <w:t xml:space="preserve">two </w:t>
       </w:r>
       <w:r>
         <w:rPr>
-          <w:rFonts w:ascii="Garamond" w:cs="Garamond" w:eastAsia="Garamond" w:hAnsi="Garamond"/>
-          <w:sz w:val="24"/>
-          <w:szCs w:val="24"/>
           <w:rtl w:val="0"/>
         </w:rPr>
         <w:t xml:space="preserve">follow-up questions about the witness’s view of the controversy. Both options should be relevant and seem like reasonable responses though one will be framed as more receptive than the other. Each witness has only one pair of follow-up questions so they would not be super tailored to the particular response a witness just gave but instead will be responsive to their position about the CCC. Note: The follow-up does not depend on the witness’s own receptiveness.</w:t>
@@ -2159,38 +1641,24 @@
     </w:p>
     <w:p>
       <w:pPr>
-        <w:spacing w:before="200" w:line="276" w:lineRule="auto"/>
-        <w:rPr>
-          <w:rFonts w:ascii="Garamond" w:cs="Garamond" w:eastAsia="Garamond" w:hAnsi="Garamond"/>
-          <w:sz w:val="24"/>
-          <w:szCs w:val="24"/>
-        </w:rPr>
-      </w:pPr>
-      <w:r>
-        <w:rPr>
-          <w:rFonts w:ascii="Garamond" w:cs="Garamond" w:eastAsia="Garamond" w:hAnsi="Garamond"/>
-          <w:sz w:val="24"/>
-          <w:szCs w:val="24"/>
+        <w:rPr/>
+      </w:pPr>
+      <w:r>
+        <w:rPr>
           <w:rtl w:val="0"/>
         </w:rPr>
         <w:t xml:space="preserve">How obvious or subtle this difference will be requires careful calibration. Making it too obvious will make the learning element of the game feel cheap and could render the mystery trivial. Making it too subtle can cause frustration to users who may feel like they couldn’t have been expected to interpret such a subtle difference. In general, </w:t>
       </w:r>
       <w:r>
         <w:rPr>
-          <w:rFonts w:ascii="Garamond" w:cs="Garamond" w:eastAsia="Garamond" w:hAnsi="Garamond"/>
           <w:b w:val="1"/>
           <w:bCs w:val="1"/>
-          <w:sz w:val="24"/>
-          <w:szCs w:val="24"/>
           <w:rtl w:val="0"/>
         </w:rPr>
         <w:t xml:space="preserve">picking the correct follow-up should be as difficult as possible</w:t>
       </w:r>
       <w:r>
         <w:rPr>
-          <w:rFonts w:ascii="Garamond" w:cs="Garamond" w:eastAsia="Garamond" w:hAnsi="Garamond"/>
-          <w:sz w:val="24"/>
-          <w:szCs w:val="24"/>
           <w:rtl w:val="0"/>
         </w:rPr>
         <w:t xml:space="preserve"> while having a solid justification from the HEAR framework. It’s ok if there is some variation in the difficulty between witnesses. </w:t>
@@ -2202,39 +1670,25 @@
           <w:ilvl w:val="0"/>
           <w:numId w:val="1"/>
         </w:numPr>
-        <w:spacing w:after="0" w:afterAutospacing="0" w:before="200" w:line="276" w:lineRule="auto"/>
+        <w:spacing w:after="0" w:afterAutospacing="0"/>
         <w:ind w:left="720" w:hanging="360"/>
-        <w:rPr>
-          <w:rFonts w:ascii="Garamond" w:cs="Garamond" w:eastAsia="Garamond" w:hAnsi="Garamond"/>
-          <w:sz w:val="24"/>
-          <w:szCs w:val="24"/>
-        </w:rPr>
-      </w:pPr>
-      <w:r>
-        <w:rPr>
-          <w:rFonts w:ascii="Garamond" w:cs="Garamond" w:eastAsia="Garamond" w:hAnsi="Garamond"/>
-          <w:sz w:val="24"/>
-          <w:szCs w:val="24"/>
+      </w:pPr>
+      <w:r>
+        <w:rPr>
           <w:rtl w:val="0"/>
         </w:rPr>
         <w:t xml:space="preserve">If the player picks the more receptive follow-up, the witness opens up and the player earns one of the four </w:t>
       </w:r>
       <w:r>
         <w:rPr>
-          <w:rFonts w:ascii="Garamond" w:cs="Garamond" w:eastAsia="Garamond" w:hAnsi="Garamond"/>
           <w:b w:val="1"/>
           <w:bCs w:val="1"/>
-          <w:sz w:val="24"/>
-          <w:szCs w:val="24"/>
           <w:rtl w:val="0"/>
         </w:rPr>
         <w:t xml:space="preserve">Major Clues</w:t>
       </w:r>
       <w:r>
         <w:rPr>
-          <w:rFonts w:ascii="Garamond" w:cs="Garamond" w:eastAsia="Garamond" w:hAnsi="Garamond"/>
-          <w:sz w:val="24"/>
-          <w:szCs w:val="24"/>
           <w:rtl w:val="0"/>
         </w:rPr>
         <w:t xml:space="preserve">. The game then shows a short explanation of why that phrasing worked and which HEAR elements it used.</w:t>
@@ -2246,19 +1700,11 @@
           <w:ilvl w:val="0"/>
           <w:numId w:val="1"/>
         </w:numPr>
-        <w:spacing w:before="0" w:beforeAutospacing="0" w:line="276" w:lineRule="auto"/>
+        <w:spacing w:before="0" w:beforeAutospacing="0"/>
         <w:ind w:left="720" w:hanging="360"/>
-        <w:rPr>
-          <w:rFonts w:ascii="Garamond" w:cs="Garamond" w:eastAsia="Garamond" w:hAnsi="Garamond"/>
-          <w:sz w:val="24"/>
-          <w:szCs w:val="24"/>
-        </w:rPr>
-      </w:pPr>
-      <w:r>
-        <w:rPr>
-          <w:rFonts w:ascii="Garamond" w:cs="Garamond" w:eastAsia="Garamond" w:hAnsi="Garamond"/>
-          <w:sz w:val="24"/>
-          <w:szCs w:val="24"/>
+      </w:pPr>
+      <w:r>
+        <w:rPr>
           <w:rtl w:val="0"/>
         </w:rPr>
         <w:t xml:space="preserve">If the player picks the unreceptive follow-up, the witness refuses to say anything more and the interview ends, exactly as if a tripwire had been asked.</w:t>
@@ -2266,18 +1712,10 @@
     </w:p>
     <w:p>
       <w:pPr>
-        <w:spacing w:before="200" w:line="276" w:lineRule="auto"/>
-        <w:rPr>
-          <w:rFonts w:ascii="Garamond" w:cs="Garamond" w:eastAsia="Garamond" w:hAnsi="Garamond"/>
-          <w:sz w:val="24"/>
-          <w:szCs w:val="24"/>
-        </w:rPr>
-      </w:pPr>
-      <w:r>
-        <w:rPr>
-          <w:rFonts w:ascii="Garamond" w:cs="Garamond" w:eastAsia="Garamond" w:hAnsi="Garamond"/>
-          <w:sz w:val="24"/>
-          <w:szCs w:val="24"/>
+        <w:rPr/>
+      </w:pPr>
+      <w:r>
+        <w:rPr>
           <w:rtl w:val="0"/>
         </w:rPr>
         <w:t xml:space="preserve">There are four Major Clues per scenario. Each Major Clue combines four of the 16 ordinary clues such that all four Major Clues together cover all 16 standard Clues without overlap. Therefore, together the four Major Clues make the solution unmistakable. Each time a Major Clue is earned the player also gains the next letter of the word H-E-A-R, displayed on screen. The letters are a progress tally and are not tied to specific HEAR elements or specific clues. After all four Major Clues are earned, a further successful follow-up still produces the explanation but no new clue.</w:t>
@@ -2286,24 +1724,12 @@
     <w:p>
       <w:pPr>
         <w:pStyle w:val="Heading2"/>
-        <w:spacing w:after="120" w:line="276" w:lineRule="auto"/>
-        <w:rPr>
-          <w:rFonts w:ascii="Garamond" w:cs="Garamond" w:eastAsia="Garamond" w:hAnsi="Garamond"/>
-          <w:b w:val="0"/>
-          <w:bCs w:val="0"/>
-          <w:sz w:val="32"/>
-          <w:szCs w:val="32"/>
-        </w:rPr>
-      </w:pPr>
-      <w:bookmarkStart w:colFirst="0" w:colLast="0" w:name="_1qymattj2854" w:id="10"/>
-      <w:bookmarkEnd w:id="10"/>
-      <w:r>
-        <w:rPr>
-          <w:rFonts w:ascii="Garamond" w:cs="Garamond" w:eastAsia="Garamond" w:hAnsi="Garamond"/>
-          <w:b w:val="0"/>
-          <w:bCs w:val="0"/>
-          <w:sz w:val="32"/>
-          <w:szCs w:val="32"/>
+        <w:rPr/>
+      </w:pPr>
+      <w:bookmarkStart w:colFirst="0" w:colLast="0" w:name="_1qymattj2854" w:id="11"/>
+      <w:bookmarkEnd w:id="11"/>
+      <w:r>
+        <w:rPr>
           <w:rtl w:val="0"/>
         </w:rPr>
         <w:t xml:space="preserve">3.4 Solving the Mystery and Ending</w:t>
@@ -2311,58 +1737,38 @@
     </w:p>
     <w:p>
       <w:pPr>
-        <w:spacing w:before="200" w:line="276" w:lineRule="auto"/>
-        <w:rPr>
-          <w:rFonts w:ascii="Garamond" w:cs="Garamond" w:eastAsia="Garamond" w:hAnsi="Garamond"/>
-          <w:sz w:val="24"/>
-          <w:szCs w:val="24"/>
-        </w:rPr>
-      </w:pPr>
-      <w:r>
-        <w:rPr>
-          <w:rFonts w:ascii="Garamond" w:cs="Garamond" w:eastAsia="Garamond" w:hAnsi="Garamond"/>
-          <w:sz w:val="24"/>
-          <w:szCs w:val="24"/>
+        <w:rPr/>
+      </w:pPr>
+      <w:r>
+        <w:rPr>
           <w:rtl w:val="0"/>
         </w:rPr>
         <w:t xml:space="preserve">After every interview question that’s resolved, players may choose to </w:t>
       </w:r>
       <w:r>
         <w:rPr>
-          <w:rFonts w:ascii="Garamond" w:cs="Garamond" w:eastAsia="Garamond" w:hAnsi="Garamond"/>
           <w:i w:val="1"/>
           <w:iCs w:val="1"/>
-          <w:sz w:val="24"/>
-          <w:szCs w:val="24"/>
           <w:rtl w:val="0"/>
         </w:rPr>
         <w:t xml:space="preserve">solve</w:t>
       </w:r>
       <w:r>
         <w:rPr>
-          <w:rFonts w:ascii="Garamond" w:cs="Garamond" w:eastAsia="Garamond" w:hAnsi="Garamond"/>
-          <w:sz w:val="24"/>
-          <w:szCs w:val="24"/>
           <w:rtl w:val="0"/>
         </w:rPr>
         <w:t xml:space="preserve"> the case. Solving the case just means that players are given an opportunity to submit their answers (which may be referred to as a guess, though hopefully isn’t the result of pure guesswork). </w:t>
       </w:r>
       <w:r>
         <w:rPr>
-          <w:rFonts w:ascii="Garamond" w:cs="Garamond" w:eastAsia="Garamond" w:hAnsi="Garamond"/>
           <w:b w:val="1"/>
           <w:bCs w:val="1"/>
-          <w:sz w:val="24"/>
-          <w:szCs w:val="24"/>
           <w:rtl w:val="0"/>
         </w:rPr>
         <w:t xml:space="preserve">Players are given three chances to submit their answers</w:t>
       </w:r>
       <w:r>
         <w:rPr>
-          <w:rFonts w:ascii="Garamond" w:cs="Garamond" w:eastAsia="Garamond" w:hAnsi="Garamond"/>
-          <w:sz w:val="24"/>
-          <w:szCs w:val="24"/>
           <w:rtl w:val="0"/>
         </w:rPr>
         <w:t xml:space="preserve">. After a wrong submission the game says only that it is not the solution, not which part is wrong. Players may then keep investigating (if they have questions left) or submit again. After a correct submission, or a third wrong one, they are directed to the ending. A correct solution earns 3 points on the first try, 2 on the second and 1 on the third; the debrief shows how many tries were used. </w:t>
@@ -2370,18 +1776,10 @@
     </w:p>
     <w:p>
       <w:pPr>
-        <w:spacing w:before="200" w:line="276" w:lineRule="auto"/>
-        <w:rPr>
-          <w:rFonts w:ascii="Garamond" w:cs="Garamond" w:eastAsia="Garamond" w:hAnsi="Garamond"/>
-          <w:sz w:val="24"/>
-          <w:szCs w:val="24"/>
-        </w:rPr>
-      </w:pPr>
-      <w:r>
-        <w:rPr>
-          <w:rFonts w:ascii="Garamond" w:cs="Garamond" w:eastAsia="Garamond" w:hAnsi="Garamond"/>
-          <w:sz w:val="24"/>
-          <w:szCs w:val="24"/>
+        <w:rPr/>
+      </w:pPr>
+      <w:r>
+        <w:rPr>
           <w:rtl w:val="0"/>
         </w:rPr>
         <w:t xml:space="preserve">If players have no more questions in their allotted budget, they ‘run out of time’ - they have to submit their best guess and hope for the best. </w:t>
@@ -2389,18 +1787,10 @@
     </w:p>
     <w:p>
       <w:pPr>
-        <w:spacing w:before="200" w:line="276" w:lineRule="auto"/>
-        <w:rPr>
-          <w:rFonts w:ascii="Garamond" w:cs="Garamond" w:eastAsia="Garamond" w:hAnsi="Garamond"/>
-          <w:sz w:val="24"/>
-          <w:szCs w:val="24"/>
-        </w:rPr>
-      </w:pPr>
-      <w:r>
-        <w:rPr>
-          <w:rFonts w:ascii="Garamond" w:cs="Garamond" w:eastAsia="Garamond" w:hAnsi="Garamond"/>
-          <w:sz w:val="24"/>
-          <w:szCs w:val="24"/>
+        <w:rPr/>
+      </w:pPr>
+      <w:r>
+        <w:rPr>
           <w:rtl w:val="0"/>
         </w:rPr>
         <w:t xml:space="preserve">The ending should include a reveal of the full story which should be a satisfying twist. There would be slightly different endings depending on whether the players picked the right solution or not. Alongside the satisfaction of solving the case correctly, the story reveal is a big part of the payoff players get from playing the game so hopefully even players that didn’t solve correctly will have a pleasing experience. </w:t>
@@ -2408,18 +1798,10 @@
     </w:p>
     <w:p>
       <w:pPr>
-        <w:spacing w:before="200" w:line="276" w:lineRule="auto"/>
-        <w:rPr>
-          <w:rFonts w:ascii="Garamond" w:cs="Garamond" w:eastAsia="Garamond" w:hAnsi="Garamond"/>
-          <w:sz w:val="24"/>
-          <w:szCs w:val="24"/>
-        </w:rPr>
-      </w:pPr>
-      <w:r>
-        <w:rPr>
-          <w:rFonts w:ascii="Garamond" w:cs="Garamond" w:eastAsia="Garamond" w:hAnsi="Garamond"/>
-          <w:sz w:val="24"/>
-          <w:szCs w:val="24"/>
+        <w:rPr/>
+      </w:pPr>
+      <w:r>
+        <w:rPr>
           <w:rtl w:val="0"/>
         </w:rPr>
         <w:t xml:space="preserve">After the big reveal, players should be asked to rank the witnesses in order of their receptiveness. The ranking should be graded in terms of its difference from the real ranking and a score be given. Depending on the context, there’s an option to create a leaderboard with scores of different students.</w:t>
@@ -2428,25 +1810,13 @@
     <w:p>
       <w:pPr>
         <w:pStyle w:val="Heading1"/>
-        <w:spacing w:before="400" w:line="276" w:lineRule="auto"/>
-        <w:rPr>
-          <w:rFonts w:ascii="Garamond" w:cs="Garamond" w:eastAsia="Garamond" w:hAnsi="Garamond"/>
-          <w:b w:val="0"/>
-          <w:bCs w:val="0"/>
-          <w:sz w:val="40"/>
-          <w:szCs w:val="40"/>
-        </w:rPr>
-      </w:pPr>
-      <w:bookmarkStart w:colFirst="0" w:colLast="0" w:name="_6ox7aix20q37" w:id="11"/>
-      <w:bookmarkEnd w:id="11"/>
+        <w:rPr/>
+      </w:pPr>
+      <w:bookmarkStart w:colFirst="0" w:colLast="0" w:name="_6ox7aix20q37" w:id="12"/>
+      <w:bookmarkEnd w:id="12"/>
       <w:commentRangeStart w:id="0"/>
       <w:r>
         <w:rPr>
-          <w:rFonts w:ascii="Garamond" w:cs="Garamond" w:eastAsia="Garamond" w:hAnsi="Garamond"/>
-          <w:b w:val="0"/>
-          <w:bCs w:val="0"/>
-          <w:sz w:val="40"/>
-          <w:szCs w:val="40"/>
           <w:rtl w:val="0"/>
         </w:rPr>
         <w:t xml:space="preserve">4. What a scenario packet contains</w:t>
@@ -2463,18 +1833,10 @@
     </w:p>
     <w:p>
       <w:pPr>
-        <w:spacing w:before="200" w:line="276" w:lineRule="auto"/>
-        <w:rPr>
-          <w:rFonts w:ascii="Garamond" w:cs="Garamond" w:eastAsia="Garamond" w:hAnsi="Garamond"/>
-          <w:sz w:val="24"/>
-          <w:szCs w:val="24"/>
-        </w:rPr>
-      </w:pPr>
-      <w:r>
-        <w:rPr>
-          <w:rFonts w:ascii="Garamond" w:cs="Garamond" w:eastAsia="Garamond" w:hAnsi="Garamond"/>
-          <w:sz w:val="24"/>
-          <w:szCs w:val="24"/>
+        <w:rPr/>
+      </w:pPr>
+      <w:r>
+        <w:rPr>
           <w:rtl w:val="0"/>
         </w:rPr>
         <w:t xml:space="preserve">A scenario packet is everything the Twine engine needs to produce a playable game. It consists of one narrative document, one response-matrix workbook, and an assets folder, and it must contain the following.</w:t>
@@ -2486,19 +1848,11 @@
           <w:ilvl w:val="0"/>
           <w:numId w:val="2"/>
         </w:numPr>
-        <w:spacing w:after="0" w:afterAutospacing="0" w:before="200" w:line="276" w:lineRule="auto"/>
+        <w:spacing w:after="0" w:afterAutospacing="0"/>
         <w:ind w:left="720" w:hanging="360"/>
-        <w:rPr>
-          <w:rFonts w:ascii="Garamond" w:cs="Garamond" w:eastAsia="Garamond" w:hAnsi="Garamond"/>
-          <w:sz w:val="24"/>
-          <w:szCs w:val="24"/>
-        </w:rPr>
-      </w:pPr>
-      <w:r>
-        <w:rPr>
-          <w:rFonts w:ascii="Garamond" w:cs="Garamond" w:eastAsia="Garamond" w:hAnsi="Garamond"/>
-          <w:sz w:val="24"/>
-          <w:szCs w:val="24"/>
+      </w:pPr>
+      <w:r>
+        <w:rPr>
           <w:rtl w:val="0"/>
         </w:rPr>
         <w:t xml:space="preserve">Title, scenario ID (used in filenames and the engine), background/summary. </w:t>
@@ -2510,30 +1864,19 @@
           <w:ilvl w:val="0"/>
           <w:numId w:val="2"/>
         </w:numPr>
-        <w:spacing w:after="0" w:afterAutospacing="0" w:before="0" w:beforeAutospacing="0" w:line="276" w:lineRule="auto"/>
+        <w:spacing w:after="0" w:afterAutospacing="0" w:before="0" w:beforeAutospacing="0"/>
         <w:ind w:left="720" w:hanging="360"/>
-        <w:rPr>
-          <w:rFonts w:ascii="Garamond" w:cs="Garamond" w:eastAsia="Garamond" w:hAnsi="Garamond"/>
-          <w:sz w:val="24"/>
-          <w:szCs w:val="24"/>
-        </w:rPr>
-      </w:pPr>
-      <w:r>
-        <w:rPr>
-          <w:rFonts w:ascii="Garamond" w:cs="Garamond" w:eastAsia="Garamond" w:hAnsi="Garamond"/>
+      </w:pPr>
+      <w:r>
+        <w:rPr>
           <w:b w:val="1"/>
           <w:bCs w:val="1"/>
-          <w:sz w:val="24"/>
-          <w:szCs w:val="24"/>
           <w:rtl w:val="0"/>
         </w:rPr>
         <w:t xml:space="preserve">The mystery</w:t>
       </w:r>
       <w:r>
         <w:rPr>
-          <w:rFonts w:ascii="Garamond" w:cs="Garamond" w:eastAsia="Garamond" w:hAnsi="Garamond"/>
-          <w:sz w:val="24"/>
-          <w:szCs w:val="24"/>
           <w:rtl w:val="0"/>
         </w:rPr>
         <w:t xml:space="preserve">: the question the player is asked to answer (for example “who removed X, why, and where is it now?”).</w:t>
@@ -2545,30 +1888,19 @@
           <w:ilvl w:val="0"/>
           <w:numId w:val="2"/>
         </w:numPr>
-        <w:spacing w:after="0" w:afterAutospacing="0" w:before="0" w:beforeAutospacing="0" w:line="276" w:lineRule="auto"/>
+        <w:spacing w:after="0" w:afterAutospacing="0" w:before="0" w:beforeAutospacing="0"/>
         <w:ind w:left="720" w:hanging="360"/>
-        <w:rPr>
-          <w:rFonts w:ascii="Garamond" w:cs="Garamond" w:eastAsia="Garamond" w:hAnsi="Garamond"/>
-          <w:sz w:val="24"/>
-          <w:szCs w:val="24"/>
-        </w:rPr>
-      </w:pPr>
-      <w:r>
-        <w:rPr>
-          <w:rFonts w:ascii="Garamond" w:cs="Garamond" w:eastAsia="Garamond" w:hAnsi="Garamond"/>
+      </w:pPr>
+      <w:r>
+        <w:rPr>
           <w:b w:val="1"/>
           <w:bCs w:val="1"/>
-          <w:sz w:val="24"/>
-          <w:szCs w:val="24"/>
           <w:rtl w:val="0"/>
         </w:rPr>
         <w:t xml:space="preserve">The solution: </w:t>
       </w:r>
       <w:r>
         <w:rPr>
-          <w:rFonts w:ascii="Garamond" w:cs="Garamond" w:eastAsia="Garamond" w:hAnsi="Garamond"/>
-          <w:sz w:val="24"/>
-          <w:szCs w:val="24"/>
           <w:rtl w:val="0"/>
         </w:rPr>
         <w:t xml:space="preserve">the answer to the mystery</w:t>
@@ -2580,19 +1912,11 @@
           <w:ilvl w:val="1"/>
           <w:numId w:val="2"/>
         </w:numPr>
-        <w:spacing w:after="0" w:afterAutospacing="0" w:before="0" w:beforeAutospacing="0" w:line="276" w:lineRule="auto"/>
+        <w:spacing w:after="0" w:afterAutospacing="0" w:before="0" w:beforeAutospacing="0"/>
         <w:ind w:left="1440" w:hanging="360"/>
-        <w:rPr>
-          <w:rFonts w:ascii="Garamond" w:cs="Garamond" w:eastAsia="Garamond" w:hAnsi="Garamond"/>
-          <w:sz w:val="24"/>
-          <w:szCs w:val="24"/>
-        </w:rPr>
-      </w:pPr>
-      <w:r>
-        <w:rPr>
-          <w:rFonts w:ascii="Garamond" w:cs="Garamond" w:eastAsia="Garamond" w:hAnsi="Garamond"/>
-          <w:sz w:val="24"/>
-          <w:szCs w:val="24"/>
+      </w:pPr>
+      <w:r>
+        <w:rPr>
           <w:rtl w:val="0"/>
         </w:rPr>
         <w:t xml:space="preserve">The 16 Clues that tell the story of the answer, alongside the 4 Major Clues that make each group of four.</w:t>
@@ -2604,30 +1928,19 @@
           <w:ilvl w:val="0"/>
           <w:numId w:val="2"/>
         </w:numPr>
-        <w:spacing w:after="0" w:afterAutospacing="0" w:before="0" w:beforeAutospacing="0" w:line="276" w:lineRule="auto"/>
+        <w:spacing w:after="0" w:afterAutospacing="0" w:before="0" w:beforeAutospacing="0"/>
         <w:ind w:left="720" w:hanging="360"/>
-        <w:rPr>
-          <w:rFonts w:ascii="Garamond" w:cs="Garamond" w:eastAsia="Garamond" w:hAnsi="Garamond"/>
-          <w:sz w:val="24"/>
-          <w:szCs w:val="24"/>
-        </w:rPr>
-      </w:pPr>
-      <w:r>
-        <w:rPr>
-          <w:rFonts w:ascii="Garamond" w:cs="Garamond" w:eastAsia="Garamond" w:hAnsi="Garamond"/>
+      </w:pPr>
+      <w:r>
+        <w:rPr>
           <w:b w:val="1"/>
           <w:bCs w:val="1"/>
-          <w:sz w:val="24"/>
-          <w:szCs w:val="24"/>
           <w:rtl w:val="0"/>
         </w:rPr>
         <w:t xml:space="preserve">The final-answer form</w:t>
       </w:r>
       <w:r>
         <w:rPr>
-          <w:rFonts w:ascii="Garamond" w:cs="Garamond" w:eastAsia="Garamond" w:hAnsi="Garamond"/>
-          <w:sz w:val="24"/>
-          <w:szCs w:val="24"/>
           <w:rtl w:val="0"/>
         </w:rPr>
         <w:t xml:space="preserve">: what the player must select at the end (e.g. one person from a list and one location from a list), and which combination is correct.</w:t>
@@ -2644,19 +1957,11 @@
           <w:ilvl w:val="0"/>
           <w:numId w:val="2"/>
         </w:numPr>
-        <w:spacing w:after="0" w:afterAutospacing="0" w:before="0" w:beforeAutospacing="0" w:line="276" w:lineRule="auto"/>
+        <w:spacing w:after="0" w:afterAutospacing="0" w:before="0" w:beforeAutospacing="0"/>
         <w:ind w:left="720" w:hanging="360"/>
-        <w:rPr>
-          <w:rFonts w:ascii="Garamond" w:cs="Garamond" w:eastAsia="Garamond" w:hAnsi="Garamond"/>
-          <w:sz w:val="24"/>
-          <w:szCs w:val="24"/>
-        </w:rPr>
-      </w:pPr>
-      <w:r>
-        <w:rPr>
-          <w:rFonts w:ascii="Garamond" w:cs="Garamond" w:eastAsia="Garamond" w:hAnsi="Garamond"/>
-          <w:sz w:val="24"/>
-          <w:szCs w:val="24"/>
+      </w:pPr>
+      <w:r>
+        <w:rPr>
           <w:rtl w:val="0"/>
         </w:rPr>
         <w:t xml:space="preserve">Passages text: Start, Rules, the Hook, Map, Interview, Answer, Follow-up, Evidence Board, Submission, Result, ending, ranking</w:t>
@@ -2668,19 +1973,11 @@
           <w:ilvl w:val="0"/>
           <w:numId w:val="2"/>
         </w:numPr>
-        <w:spacing w:after="0" w:afterAutospacing="0" w:before="0" w:beforeAutospacing="0" w:line="276" w:lineRule="auto"/>
+        <w:spacing w:after="0" w:afterAutospacing="0" w:before="0" w:beforeAutospacing="0"/>
         <w:ind w:left="720" w:hanging="360"/>
-        <w:rPr>
-          <w:rFonts w:ascii="Garamond" w:cs="Garamond" w:eastAsia="Garamond" w:hAnsi="Garamond"/>
-          <w:sz w:val="24"/>
-          <w:szCs w:val="24"/>
-        </w:rPr>
-      </w:pPr>
-      <w:r>
-        <w:rPr>
-          <w:rFonts w:ascii="Garamond" w:cs="Garamond" w:eastAsia="Garamond" w:hAnsi="Garamond"/>
-          <w:sz w:val="24"/>
-          <w:szCs w:val="24"/>
+      </w:pPr>
+      <w:r>
+        <w:rPr>
           <w:rtl w:val="0"/>
         </w:rPr>
         <w:t xml:space="preserve">The eight questions </w:t>
@@ -2692,19 +1989,11 @@
           <w:ilvl w:val="0"/>
           <w:numId w:val="2"/>
         </w:numPr>
-        <w:spacing w:after="0" w:afterAutospacing="0" w:before="0" w:beforeAutospacing="0" w:line="276" w:lineRule="auto"/>
+        <w:spacing w:after="0" w:afterAutospacing="0" w:before="0" w:beforeAutospacing="0"/>
         <w:ind w:left="720" w:hanging="360"/>
-        <w:rPr>
-          <w:rFonts w:ascii="Garamond" w:cs="Garamond" w:eastAsia="Garamond" w:hAnsi="Garamond"/>
-          <w:sz w:val="24"/>
-          <w:szCs w:val="24"/>
-        </w:rPr>
-      </w:pPr>
-      <w:r>
-        <w:rPr>
-          <w:rFonts w:ascii="Garamond" w:cs="Garamond" w:eastAsia="Garamond" w:hAnsi="Garamond"/>
-          <w:sz w:val="24"/>
-          <w:szCs w:val="24"/>
+      </w:pPr>
+      <w:r>
+        <w:rPr>
           <w:rtl w:val="0"/>
         </w:rPr>
         <w:t xml:space="preserve">The eight witnesses list:</w:t>
@@ -2716,19 +2005,11 @@
           <w:ilvl w:val="1"/>
           <w:numId w:val="2"/>
         </w:numPr>
-        <w:spacing w:after="0" w:afterAutospacing="0" w:before="0" w:beforeAutospacing="0" w:line="276" w:lineRule="auto"/>
+        <w:spacing w:after="0" w:afterAutospacing="0" w:before="0" w:beforeAutospacing="0"/>
         <w:ind w:left="1440" w:hanging="360"/>
-        <w:rPr>
-          <w:rFonts w:ascii="Garamond" w:cs="Garamond" w:eastAsia="Garamond" w:hAnsi="Garamond"/>
-          <w:sz w:val="24"/>
-          <w:szCs w:val="24"/>
-        </w:rPr>
-      </w:pPr>
-      <w:r>
-        <w:rPr>
-          <w:rFonts w:ascii="Garamond" w:cs="Garamond" w:eastAsia="Garamond" w:hAnsi="Garamond"/>
-          <w:sz w:val="24"/>
-          <w:szCs w:val="24"/>
+      </w:pPr>
+      <w:r>
+        <w:rPr>
           <w:rtl w:val="0"/>
         </w:rPr>
         <w:t xml:space="preserve">Information, image, ID (W01-W08)</w:t>
@@ -2740,19 +2021,11 @@
           <w:ilvl w:val="1"/>
           <w:numId w:val="2"/>
         </w:numPr>
-        <w:spacing w:after="0" w:afterAutospacing="0" w:before="0" w:beforeAutospacing="0" w:line="276" w:lineRule="auto"/>
+        <w:spacing w:after="0" w:afterAutospacing="0" w:before="0" w:beforeAutospacing="0"/>
         <w:ind w:left="1440" w:hanging="360"/>
-        <w:rPr>
-          <w:rFonts w:ascii="Garamond" w:cs="Garamond" w:eastAsia="Garamond" w:hAnsi="Garamond"/>
-          <w:sz w:val="24"/>
-          <w:szCs w:val="24"/>
-        </w:rPr>
-      </w:pPr>
-      <w:r>
-        <w:rPr>
-          <w:rFonts w:ascii="Garamond" w:cs="Garamond" w:eastAsia="Garamond" w:hAnsi="Garamond"/>
-          <w:sz w:val="24"/>
-          <w:szCs w:val="24"/>
+      </w:pPr>
+      <w:r>
+        <w:rPr>
           <w:rtl w:val="0"/>
         </w:rPr>
         <w:t xml:space="preserve">Position on the CCC</w:t>
@@ -2764,19 +2037,11 @@
           <w:ilvl w:val="1"/>
           <w:numId w:val="2"/>
         </w:numPr>
-        <w:spacing w:after="0" w:afterAutospacing="0" w:before="0" w:beforeAutospacing="0" w:line="276" w:lineRule="auto"/>
+        <w:spacing w:after="0" w:afterAutospacing="0" w:before="0" w:beforeAutospacing="0"/>
         <w:ind w:left="1440" w:hanging="360"/>
-        <w:rPr>
-          <w:rFonts w:ascii="Garamond" w:cs="Garamond" w:eastAsia="Garamond" w:hAnsi="Garamond"/>
-          <w:sz w:val="24"/>
-          <w:szCs w:val="24"/>
-        </w:rPr>
-      </w:pPr>
-      <w:r>
-        <w:rPr>
-          <w:rFonts w:ascii="Garamond" w:cs="Garamond" w:eastAsia="Garamond" w:hAnsi="Garamond"/>
-          <w:sz w:val="24"/>
-          <w:szCs w:val="24"/>
+      </w:pPr>
+      <w:r>
+        <w:rPr>
           <w:rtl w:val="0"/>
         </w:rPr>
         <w:t xml:space="preserve">Which question is their tripwire </w:t>
@@ -2788,19 +2053,11 @@
           <w:ilvl w:val="1"/>
           <w:numId w:val="2"/>
         </w:numPr>
-        <w:spacing w:after="0" w:afterAutospacing="0" w:before="0" w:beforeAutospacing="0" w:line="276" w:lineRule="auto"/>
+        <w:spacing w:after="0" w:afterAutospacing="0" w:before="0" w:beforeAutospacing="0"/>
         <w:ind w:left="1440" w:hanging="360"/>
-        <w:rPr>
-          <w:rFonts w:ascii="Garamond" w:cs="Garamond" w:eastAsia="Garamond" w:hAnsi="Garamond"/>
-          <w:sz w:val="24"/>
-          <w:szCs w:val="24"/>
-        </w:rPr>
-      </w:pPr>
-      <w:r>
-        <w:rPr>
-          <w:rFonts w:ascii="Garamond" w:cs="Garamond" w:eastAsia="Garamond" w:hAnsi="Garamond"/>
-          <w:sz w:val="24"/>
-          <w:szCs w:val="24"/>
+      </w:pPr>
+      <w:r>
+        <w:rPr>
           <w:rtl w:val="0"/>
         </w:rPr>
         <w:t xml:space="preserve">Receptiveness score</w:t>
@@ -2812,19 +2069,11 @@
           <w:ilvl w:val="1"/>
           <w:numId w:val="2"/>
         </w:numPr>
-        <w:spacing w:after="0" w:afterAutospacing="0" w:before="0" w:beforeAutospacing="0" w:line="276" w:lineRule="auto"/>
+        <w:spacing w:after="0" w:afterAutospacing="0" w:before="0" w:beforeAutospacing="0"/>
         <w:ind w:left="1440" w:hanging="360"/>
-        <w:rPr>
-          <w:rFonts w:ascii="Garamond" w:cs="Garamond" w:eastAsia="Garamond" w:hAnsi="Garamond"/>
-          <w:sz w:val="24"/>
-          <w:szCs w:val="24"/>
-        </w:rPr>
-      </w:pPr>
-      <w:r>
-        <w:rPr>
-          <w:rFonts w:ascii="Garamond" w:cs="Garamond" w:eastAsia="Garamond" w:hAnsi="Garamond"/>
-          <w:sz w:val="24"/>
-          <w:szCs w:val="24"/>
+      </w:pPr>
+      <w:r>
+        <w:rPr>
           <w:rtl w:val="0"/>
         </w:rPr>
         <w:t xml:space="preserve">A follow-up pair of questions </w:t>
@@ -2836,19 +2085,11 @@
           <w:ilvl w:val="0"/>
           <w:numId w:val="2"/>
         </w:numPr>
-        <w:spacing w:after="0" w:afterAutospacing="0" w:before="0" w:beforeAutospacing="0" w:line="276" w:lineRule="auto"/>
+        <w:spacing w:after="0" w:afterAutospacing="0" w:before="0" w:beforeAutospacing="0"/>
         <w:ind w:left="720" w:hanging="360"/>
-        <w:rPr>
-          <w:rFonts w:ascii="Garamond" w:cs="Garamond" w:eastAsia="Garamond" w:hAnsi="Garamond"/>
-          <w:sz w:val="24"/>
-          <w:szCs w:val="24"/>
-        </w:rPr>
-      </w:pPr>
-      <w:r>
-        <w:rPr>
-          <w:rFonts w:ascii="Garamond" w:cs="Garamond" w:eastAsia="Garamond" w:hAnsi="Garamond"/>
-          <w:sz w:val="24"/>
-          <w:szCs w:val="24"/>
+      </w:pPr>
+      <w:r>
+        <w:rPr>
           <w:rtl w:val="0"/>
         </w:rPr>
         <w:t xml:space="preserve">The 24 Red Herrings organized into sets</w:t>
@@ -2860,19 +2101,11 @@
           <w:ilvl w:val="0"/>
           <w:numId w:val="2"/>
         </w:numPr>
-        <w:spacing w:before="0" w:beforeAutospacing="0" w:line="276" w:lineRule="auto"/>
+        <w:spacing w:before="0" w:beforeAutospacing="0"/>
         <w:ind w:left="720" w:hanging="360"/>
-        <w:rPr>
-          <w:rFonts w:ascii="Garamond" w:cs="Garamond" w:eastAsia="Garamond" w:hAnsi="Garamond"/>
-          <w:sz w:val="24"/>
-          <w:szCs w:val="24"/>
-        </w:rPr>
-      </w:pPr>
-      <w:r>
-        <w:rPr>
-          <w:rFonts w:ascii="Garamond" w:cs="Garamond" w:eastAsia="Garamond" w:hAnsi="Garamond"/>
-          <w:sz w:val="24"/>
-          <w:szCs w:val="24"/>
+      </w:pPr>
+      <w:r>
+        <w:rPr>
           <w:rtl w:val="0"/>
         </w:rPr>
         <w:t xml:space="preserve">The Response Matrix: 8 × 8 grid of witnesses by questions. Each cell is either the tripwire (for exactly one cell per column and one per row) or an answer containing one piece of information (a clue ID or a red-herring ID) and one opinion expression (marked receptive or not, referencing another witness by name). The matrix is kept in the workbook in two forms: a readable condensed version, and a longform table (one row per cell, with columns for witness, question, item, item type, receptive flag, and text) that the engine reads.</w:t>
@@ -2880,18 +2113,67 @@
     </w:p>
     <w:p>
       <w:pPr>
-        <w:spacing w:before="200" w:line="276" w:lineRule="auto"/>
-        <w:rPr>
-          <w:rFonts w:ascii="Garamond" w:cs="Garamond" w:eastAsia="Garamond" w:hAnsi="Garamond"/>
-          <w:sz w:val="24"/>
-          <w:szCs w:val="24"/>
-        </w:rPr>
+        <w:rPr/>
         <w:sectPr>
+          <w:type w:val="nextPage"/>
           <w:pgSz w:h="15840" w:w="12240" w:orient="portrait"/>
           <w:pgMar w:bottom="1440" w:top="1440" w:left="1440" w:right="1440" w:header="720" w:footer="720"/>
           <w:pgNumType w:start="1"/>
         </w:sectPr>
       </w:pPr>
+      <w:r>
+        <w:rPr>
+          <w:rtl w:val="0"/>
+        </w:rPr>
+      </w:r>
+    </w:p>
+    <w:p>
+      <w:pPr>
+        <w:pStyle w:val="Title"/>
+        <w:keepNext w:val="0"/>
+        <w:keepLines w:val="0"/>
+        <w:pageBreakBefore w:val="0"/>
+        <w:widowControl w:val="0"/>
+        <w:pBdr>
+          <w:top w:space="0" w:sz="0" w:val="nil"/>
+          <w:left w:space="0" w:sz="0" w:val="nil"/>
+          <w:bottom w:space="0" w:sz="0" w:val="nil"/>
+          <w:right w:space="0" w:sz="0" w:val="nil"/>
+          <w:between w:space="0" w:sz="0" w:val="nil"/>
+        </w:pBdr>
+        <w:shd w:fill="auto" w:val="clear"/>
+        <w:spacing w:after="0" w:before="0" w:line="276" w:lineRule="auto"/>
+        <w:ind w:left="0" w:right="0" w:firstLine="0"/>
+        <w:jc w:val="left"/>
+        <w:rPr/>
+        <w:sectPr>
+          <w:type w:val="nextPage"/>
+          <w:pgSz w:h="15840" w:w="12240" w:orient="portrait"/>
+          <w:pgMar w:bottom="1440" w:top="1440" w:left="1440" w:right="1440" w:header="720" w:footer="720"/>
+          <w:pgNumType w:start="1"/>
+        </w:sectPr>
+      </w:pPr>
+      <w:bookmarkStart w:colFirst="0" w:colLast="0" w:name="_bl5l5anmksfh" w:id="13"/>
+      <w:bookmarkEnd w:id="13"/>
+      <w:r>
+        <w:rPr>
+          <w:rFonts w:ascii="Garamond" w:cs="Garamond" w:eastAsia="Garamond" w:hAnsi="Garamond"/>
+          <w:b w:val="1"/>
+          <w:bCs w:val="1"/>
+          <w:i w:val="0"/>
+          <w:iCs w:val="0"/>
+          <w:smallCaps w:val="0"/>
+          <w:strike w:val="0"/>
+          <w:color w:val="000000"/>
+          <w:sz w:val="60"/>
+          <w:szCs w:val="60"/>
+          <w:u w:val="none"/>
+          <w:shd w:fill="auto" w:val="clear"/>
+          <w:vertAlign w:val="baseline"/>
+          <w:rtl w:val="0"/>
+        </w:rPr>
+        <w:t xml:space="preserve">Notes</w:t>
+      </w:r>
       <w:r>
         <w:rPr>
           <w:rtl w:val="0"/>
@@ -3224,11 +2506,64 @@
     </w:p>
     <w:p>
       <w:pPr>
+        <w:pStyle w:val="Title"/>
+        <w:keepNext w:val="0"/>
+        <w:keepLines w:val="0"/>
+        <w:pageBreakBefore w:val="0"/>
+        <w:widowControl w:val="0"/>
+        <w:pBdr>
+          <w:top w:space="0" w:sz="0" w:val="nil"/>
+          <w:left w:space="0" w:sz="0" w:val="nil"/>
+          <w:bottom w:space="0" w:sz="0" w:val="nil"/>
+          <w:right w:space="0" w:sz="0" w:val="nil"/>
+          <w:between w:space="0" w:sz="0" w:val="nil"/>
+        </w:pBdr>
+        <w:shd w:fill="auto" w:val="clear"/>
+        <w:spacing w:after="0" w:before="0" w:line="276" w:lineRule="auto"/>
+        <w:ind w:left="0" w:right="0" w:firstLine="0"/>
+        <w:jc w:val="left"/>
+        <w:rPr/>
+        <w:sectPr>
+          <w:type w:val="nextPage"/>
+          <w:pgSz w:h="15840" w:w="12240" w:orient="portrait"/>
+          <w:pgMar w:bottom="1440" w:top="1440" w:left="1440" w:right="1440" w:header="720" w:footer="720"/>
+          <w:pgNumType w:start="1"/>
+        </w:sectPr>
+      </w:pPr>
+      <w:bookmarkStart w:colFirst="0" w:colLast="0" w:name="_418itmn4mq7p" w:id="14"/>
+      <w:bookmarkEnd w:id="14"/>
+      <w:r>
+        <w:rPr>
+          <w:rFonts w:ascii="Garamond" w:cs="Garamond" w:eastAsia="Garamond" w:hAnsi="Garamond"/>
+          <w:b w:val="1"/>
+          <w:bCs w:val="1"/>
+          <w:i w:val="0"/>
+          <w:iCs w:val="0"/>
+          <w:smallCaps w:val="0"/>
+          <w:strike w:val="0"/>
+          <w:color w:val="000000"/>
+          <w:sz w:val="60"/>
+          <w:szCs w:val="60"/>
+          <w:u w:val="none"/>
+          <w:shd w:fill="auto" w:val="clear"/>
+          <w:vertAlign w:val="baseline"/>
+          <w:rtl w:val="0"/>
+        </w:rPr>
+        <w:t xml:space="preserve">Rules of the game</w:t>
+      </w:r>
+      <w:r>
+        <w:rPr>
+          <w:rtl w:val="0"/>
+        </w:rPr>
+      </w:r>
+    </w:p>
+    <w:p>
+      <w:pPr>
         <w:pStyle w:val="Heading1"/>
         <w:rPr/>
       </w:pPr>
-      <w:bookmarkStart w:colFirst="0" w:colLast="0" w:name="_xsv09x7iedko" w:id="12"/>
-      <w:bookmarkEnd w:id="12"/>
+      <w:bookmarkStart w:colFirst="0" w:colLast="0" w:name="_xsv09x7iedko" w:id="15"/>
+      <w:bookmarkEnd w:id="15"/>
       <w:r>
         <w:rPr>
           <w:rtl w:val="0"/>
@@ -3390,163 +2725,22 @@
     </w:p>
     <w:p>
       <w:pPr>
-        <w:pStyle w:val="Heading1"/>
-        <w:rPr/>
-      </w:pPr>
-      <w:bookmarkStart w:colFirst="0" w:colLast="0" w:name="_gca2y5oth70s" w:id="13"/>
-      <w:bookmarkEnd w:id="13"/>
-      <w:r>
-        <w:rPr>
-          <w:rtl w:val="0"/>
-        </w:rPr>
-        <w:t xml:space="preserve">The HEAR framework</w:t>
-      </w:r>
-    </w:p>
-    <w:p>
-      <w:pPr>
-        <w:rPr/>
-      </w:pPr>
-      <w:r>
-        <w:rPr>
-          <w:rtl w:val="0"/>
-        </w:rPr>
-        <w:t xml:space="preserve">Conversational receptiveness is a willingness to engage with opposing views, shown through the words you use. Research by Julia Minson and colleagues found four markers that make someone come across as receptive:</w:t>
-      </w:r>
-    </w:p>
-    <w:p>
-      <w:pPr>
-        <w:pStyle w:val="Heading2"/>
-        <w:numPr>
-          <w:ilvl w:val="0"/>
-          <w:numId w:val="4"/>
-        </w:numPr>
-        <w:ind w:left="720" w:hanging="360"/>
-        <w:rPr>
-          <w:sz w:val="32"/>
-          <w:szCs w:val="32"/>
-        </w:rPr>
-      </w:pPr>
-      <w:bookmarkStart w:colFirst="0" w:colLast="0" w:name="_15kfzlgp827m" w:id="14"/>
-      <w:bookmarkEnd w:id="14"/>
-      <w:r>
-        <w:rPr>
-          <w:rtl w:val="0"/>
-        </w:rPr>
-        <w:t xml:space="preserve">Hedge your claims</w:t>
-      </w:r>
-    </w:p>
-    <w:p>
-      <w:pPr>
-        <w:rPr/>
-      </w:pPr>
-      <w:r>
-        <w:rPr>
-          <w:rtl w:val="0"/>
-        </w:rPr>
-        <w:t xml:space="preserve">Leave space alongside your views: “I think”, “it's possible that”, “I could be misreading this”.</w:t>
-      </w:r>
-    </w:p>
-    <w:p>
-      <w:pPr>
-        <w:pStyle w:val="Heading2"/>
-        <w:numPr>
-          <w:ilvl w:val="0"/>
-          <w:numId w:val="4"/>
-        </w:numPr>
-        <w:ind w:left="720" w:hanging="360"/>
-        <w:rPr>
-          <w:sz w:val="32"/>
-          <w:szCs w:val="32"/>
-        </w:rPr>
-      </w:pPr>
-      <w:bookmarkStart w:colFirst="0" w:colLast="0" w:name="_14bj2v2wcr9b" w:id="15"/>
-      <w:bookmarkEnd w:id="15"/>
-      <w:r>
-        <w:rPr>
-          <w:rtl w:val="0"/>
-        </w:rPr>
-        <w:t xml:space="preserve">Emphasize agreement</w:t>
-      </w:r>
-    </w:p>
-    <w:p>
-      <w:pPr>
-        <w:rPr/>
-      </w:pPr>
-      <w:r>
-        <w:rPr>
-          <w:rtl w:val="0"/>
-        </w:rPr>
-        <w:t xml:space="preserve">Find common ground: “We both want…”, “I agree that…”.</w:t>
-      </w:r>
-    </w:p>
-    <w:p>
-      <w:pPr>
-        <w:pStyle w:val="Heading2"/>
-        <w:numPr>
-          <w:ilvl w:val="0"/>
-          <w:numId w:val="4"/>
-        </w:numPr>
-        <w:ind w:left="720" w:hanging="360"/>
-        <w:rPr>
-          <w:sz w:val="32"/>
-          <w:szCs w:val="32"/>
-        </w:rPr>
-      </w:pPr>
-      <w:bookmarkStart w:colFirst="0" w:colLast="0" w:name="_zheajp4hsm8n" w:id="16"/>
-      <w:bookmarkEnd w:id="16"/>
-      <w:r>
-        <w:rPr>
-          <w:rtl w:val="0"/>
-        </w:rPr>
-        <w:t xml:space="preserve">Acknowledge the other's perspective</w:t>
-      </w:r>
-    </w:p>
-    <w:p>
-      <w:pPr>
-        <w:rPr/>
-      </w:pPr>
-      <w:r>
-        <w:rPr>
-          <w:rtl w:val="0"/>
-        </w:rPr>
-        <w:t xml:space="preserve">Show you have understood: “I understand that you…”, “You're right that…”.</w:t>
-      </w:r>
-    </w:p>
-    <w:p>
-      <w:pPr>
-        <w:pStyle w:val="Heading2"/>
-        <w:numPr>
-          <w:ilvl w:val="0"/>
-          <w:numId w:val="4"/>
-        </w:numPr>
-        <w:ind w:left="720" w:hanging="360"/>
-        <w:rPr>
-          <w:sz w:val="32"/>
-          <w:szCs w:val="32"/>
-        </w:rPr>
-      </w:pPr>
-      <w:bookmarkStart w:colFirst="0" w:colLast="0" w:name="_47i9enf78bla" w:id="17"/>
-      <w:bookmarkEnd w:id="17"/>
-      <w:r>
-        <w:rPr>
-          <w:rtl w:val="0"/>
-        </w:rPr>
-        <w:t xml:space="preserve">Reframe to the positive</w:t>
-      </w:r>
-    </w:p>
-    <w:p>
-      <w:pPr>
-        <w:rPr/>
-      </w:pPr>
-      <w:r>
-        <w:rPr>
-          <w:rtl w:val="0"/>
-        </w:rPr>
-        <w:t xml:space="preserve">Say what you want rather than what you oppose, avoid dismissive language such as “that's wrong” or “no serious person thinks…”.</w:t>
-      </w:r>
-    </w:p>
-    <w:p>
-      <w:pPr>
+        <w:pStyle w:val="Title"/>
+        <w:keepNext w:val="0"/>
+        <w:keepLines w:val="0"/>
+        <w:pageBreakBefore w:val="0"/>
+        <w:widowControl w:val="0"/>
+        <w:pBdr>
+          <w:top w:space="0" w:sz="0" w:val="nil"/>
+          <w:left w:space="0" w:sz="0" w:val="nil"/>
+          <w:bottom w:space="0" w:sz="0" w:val="nil"/>
+          <w:right w:space="0" w:sz="0" w:val="nil"/>
+          <w:between w:space="0" w:sz="0" w:val="nil"/>
+        </w:pBdr>
+        <w:shd w:fill="auto" w:val="clear"/>
+        <w:spacing w:after="0" w:before="0" w:line="276" w:lineRule="auto"/>
+        <w:ind w:left="0" w:right="0" w:firstLine="0"/>
+        <w:jc w:val="left"/>
         <w:rPr/>
         <w:sectPr>
           <w:type w:val="nextPage"/>
@@ -3555,11 +2749,31 @@
           <w:pgNumType w:start="1"/>
         </w:sectPr>
       </w:pPr>
-      <w:r>
-        <w:rPr>
-          <w:rtl w:val="0"/>
-        </w:rPr>
-        <w:t xml:space="preserve">Unreceptive language states opinions flatly, generalizes about the other person, attributes motives, or dismisses them. Listen for both kinds as the witnesses talk about the controversy.</w:t>
+      <w:bookmarkStart w:colFirst="0" w:colLast="0" w:name="_tl5z2k7by2gl" w:id="16"/>
+      <w:bookmarkEnd w:id="16"/>
+      <w:r>
+        <w:rPr>
+          <w:rFonts w:ascii="Garamond" w:cs="Garamond" w:eastAsia="Garamond" w:hAnsi="Garamond"/>
+          <w:b w:val="1"/>
+          <w:bCs w:val="1"/>
+          <w:i w:val="0"/>
+          <w:iCs w:val="0"/>
+          <w:smallCaps w:val="0"/>
+          <w:strike w:val="0"/>
+          <w:color w:val="000000"/>
+          <w:sz w:val="60"/>
+          <w:szCs w:val="60"/>
+          <w:u w:val="none"/>
+          <w:shd w:fill="auto" w:val="clear"/>
+          <w:vertAlign w:val="baseline"/>
+          <w:rtl w:val="0"/>
+        </w:rPr>
+        <w:t xml:space="preserve">HEAR Framework introduction</w:t>
+      </w:r>
+      <w:r>
+        <w:rPr>
+          <w:rtl w:val="0"/>
+        </w:rPr>
       </w:r>
     </w:p>
     <w:p>
@@ -3567,8 +2781,235 @@
         <w:pStyle w:val="Heading1"/>
         <w:rPr/>
       </w:pPr>
-      <w:bookmarkStart w:colFirst="0" w:colLast="0" w:name="_uynt6v9uhldf" w:id="18"/>
+      <w:bookmarkStart w:colFirst="0" w:colLast="0" w:name="_gca2y5oth70s" w:id="17"/>
+      <w:bookmarkEnd w:id="17"/>
+      <w:r>
+        <w:rPr>
+          <w:rtl w:val="0"/>
+        </w:rPr>
+        <w:t xml:space="preserve">The HEAR framework</w:t>
+      </w:r>
+    </w:p>
+    <w:p>
+      <w:pPr>
+        <w:rPr/>
+      </w:pPr>
+      <w:r>
+        <w:rPr>
+          <w:rtl w:val="0"/>
+        </w:rPr>
+        <w:t xml:space="preserve">Conversational receptiveness is a willingness to engage with opposing views, shown through the words you use. Research by Julia Minson and colleagues found four markers that make someone come across as receptive:</w:t>
+      </w:r>
+    </w:p>
+    <w:p>
+      <w:pPr>
+        <w:pStyle w:val="Heading2"/>
+        <w:numPr>
+          <w:ilvl w:val="0"/>
+          <w:numId w:val="4"/>
+        </w:numPr>
+        <w:ind w:left="720" w:hanging="360"/>
+        <w:rPr>
+          <w:sz w:val="32"/>
+          <w:szCs w:val="32"/>
+        </w:rPr>
+      </w:pPr>
+      <w:bookmarkStart w:colFirst="0" w:colLast="0" w:name="_15kfzlgp827m" w:id="18"/>
       <w:bookmarkEnd w:id="18"/>
+      <w:r>
+        <w:rPr>
+          <w:rtl w:val="0"/>
+        </w:rPr>
+        <w:t xml:space="preserve">Hedge your claims</w:t>
+      </w:r>
+    </w:p>
+    <w:p>
+      <w:pPr>
+        <w:rPr/>
+      </w:pPr>
+      <w:r>
+        <w:rPr>
+          <w:rtl w:val="0"/>
+        </w:rPr>
+        <w:t xml:space="preserve">Leave space alongside your views: “I think”, “it's possible that”, “I could be misreading this”.</w:t>
+      </w:r>
+    </w:p>
+    <w:p>
+      <w:pPr>
+        <w:pStyle w:val="Heading2"/>
+        <w:numPr>
+          <w:ilvl w:val="0"/>
+          <w:numId w:val="4"/>
+        </w:numPr>
+        <w:ind w:left="720" w:hanging="360"/>
+        <w:rPr>
+          <w:sz w:val="32"/>
+          <w:szCs w:val="32"/>
+        </w:rPr>
+      </w:pPr>
+      <w:bookmarkStart w:colFirst="0" w:colLast="0" w:name="_14bj2v2wcr9b" w:id="19"/>
+      <w:bookmarkEnd w:id="19"/>
+      <w:r>
+        <w:rPr>
+          <w:rtl w:val="0"/>
+        </w:rPr>
+        <w:t xml:space="preserve">Emphasize agreement</w:t>
+      </w:r>
+    </w:p>
+    <w:p>
+      <w:pPr>
+        <w:rPr/>
+      </w:pPr>
+      <w:r>
+        <w:rPr>
+          <w:rtl w:val="0"/>
+        </w:rPr>
+        <w:t xml:space="preserve">Find common ground: “We both want…”, “I agree that…”.</w:t>
+      </w:r>
+    </w:p>
+    <w:p>
+      <w:pPr>
+        <w:pStyle w:val="Heading2"/>
+        <w:numPr>
+          <w:ilvl w:val="0"/>
+          <w:numId w:val="4"/>
+        </w:numPr>
+        <w:ind w:left="720" w:hanging="360"/>
+        <w:rPr>
+          <w:sz w:val="32"/>
+          <w:szCs w:val="32"/>
+        </w:rPr>
+      </w:pPr>
+      <w:bookmarkStart w:colFirst="0" w:colLast="0" w:name="_zheajp4hsm8n" w:id="20"/>
+      <w:bookmarkEnd w:id="20"/>
+      <w:r>
+        <w:rPr>
+          <w:rtl w:val="0"/>
+        </w:rPr>
+        <w:t xml:space="preserve">Acknowledge the other's perspective</w:t>
+      </w:r>
+    </w:p>
+    <w:p>
+      <w:pPr>
+        <w:rPr/>
+      </w:pPr>
+      <w:r>
+        <w:rPr>
+          <w:rtl w:val="0"/>
+        </w:rPr>
+        <w:t xml:space="preserve">Show you have understood: “I understand that you…”, “You're right that…”.</w:t>
+      </w:r>
+    </w:p>
+    <w:p>
+      <w:pPr>
+        <w:pStyle w:val="Heading2"/>
+        <w:numPr>
+          <w:ilvl w:val="0"/>
+          <w:numId w:val="4"/>
+        </w:numPr>
+        <w:ind w:left="720" w:hanging="360"/>
+        <w:rPr>
+          <w:sz w:val="32"/>
+          <w:szCs w:val="32"/>
+        </w:rPr>
+      </w:pPr>
+      <w:bookmarkStart w:colFirst="0" w:colLast="0" w:name="_47i9enf78bla" w:id="21"/>
+      <w:bookmarkEnd w:id="21"/>
+      <w:r>
+        <w:rPr>
+          <w:rtl w:val="0"/>
+        </w:rPr>
+        <w:t xml:space="preserve">Reframe to the positive</w:t>
+      </w:r>
+    </w:p>
+    <w:p>
+      <w:pPr>
+        <w:rPr/>
+      </w:pPr>
+      <w:r>
+        <w:rPr>
+          <w:rtl w:val="0"/>
+        </w:rPr>
+        <w:t xml:space="preserve">Say what you want rather than what you oppose, avoid dismissive language such as “that's wrong” or “no serious person thinks…”.</w:t>
+      </w:r>
+    </w:p>
+    <w:p>
+      <w:pPr>
+        <w:rPr/>
+        <w:sectPr>
+          <w:type w:val="nextPage"/>
+          <w:pgSz w:h="15840" w:w="12240" w:orient="portrait"/>
+          <w:pgMar w:bottom="1440" w:top="1440" w:left="1440" w:right="1440" w:header="720" w:footer="720"/>
+          <w:pgNumType w:start="1"/>
+        </w:sectPr>
+      </w:pPr>
+      <w:r>
+        <w:rPr>
+          <w:rtl w:val="0"/>
+        </w:rPr>
+        <w:t xml:space="preserve">Unreceptive language states opinions flatly, generalizes about the other person, attributes motives, or dismisses them. Listen for both kinds as the witnesses talk about the controversy.</w:t>
+      </w:r>
+    </w:p>
+    <w:p>
+      <w:pPr>
+        <w:pStyle w:val="Title"/>
+        <w:keepNext w:val="0"/>
+        <w:keepLines w:val="0"/>
+        <w:pageBreakBefore w:val="0"/>
+        <w:widowControl w:val="0"/>
+        <w:pBdr>
+          <w:top w:space="0" w:sz="0" w:val="nil"/>
+          <w:left w:space="0" w:sz="0" w:val="nil"/>
+          <w:bottom w:space="0" w:sz="0" w:val="nil"/>
+          <w:right w:space="0" w:sz="0" w:val="nil"/>
+          <w:between w:space="0" w:sz="0" w:val="nil"/>
+        </w:pBdr>
+        <w:shd w:fill="auto" w:val="clear"/>
+        <w:spacing w:after="0" w:before="0" w:line="276" w:lineRule="auto"/>
+        <w:ind w:left="0" w:right="0" w:firstLine="0"/>
+        <w:jc w:val="left"/>
+        <w:rPr/>
+        <w:sectPr>
+          <w:type w:val="nextPage"/>
+          <w:pgSz w:h="15840" w:w="12240" w:orient="portrait"/>
+          <w:pgMar w:bottom="1440" w:top="1440" w:left="1440" w:right="1440" w:header="720" w:footer="720"/>
+          <w:pgNumType w:start="1"/>
+        </w:sectPr>
+      </w:pPr>
+      <w:bookmarkStart w:colFirst="0" w:colLast="0" w:name="_yu8ysev48dqh" w:id="22"/>
+      <w:bookmarkEnd w:id="22"/>
+      <w:r>
+        <w:rPr>
+          <w:rFonts w:ascii="Garamond" w:cs="Garamond" w:eastAsia="Garamond" w:hAnsi="Garamond"/>
+          <w:b w:val="1"/>
+          <w:bCs w:val="1"/>
+          <w:i w:val="0"/>
+          <w:iCs w:val="0"/>
+          <w:smallCaps w:val="0"/>
+          <w:strike w:val="0"/>
+          <w:color w:val="000000"/>
+          <w:sz w:val="60"/>
+          <w:szCs w:val="60"/>
+          <w:u w:val="none"/>
+          <w:shd w:fill="auto" w:val="clear"/>
+          <w:vertAlign w:val="baseline"/>
+          <w:rtl w:val="0"/>
+        </w:rPr>
+        <w:t xml:space="preserve">Game facts</w:t>
+      </w:r>
+      <w:r>
+        <w:rPr>
+          <w:rtl w:val="0"/>
+        </w:rPr>
+      </w:r>
+    </w:p>
+    <w:p>
+      <w:pPr>
+        <w:pStyle w:val="Heading1"/>
+        <w:rPr/>
+      </w:pPr>
+      <w:bookmarkStart w:colFirst="0" w:colLast="0" w:name="_uynt6v9uhldf" w:id="23"/>
+      <w:bookmarkEnd w:id="23"/>
       <w:r>
         <w:rPr>
           <w:rtl w:val="0"/>
@@ -5257,11 +4698,64 @@
     </w:p>
     <w:p>
       <w:pPr>
+        <w:pStyle w:val="Title"/>
+        <w:keepNext w:val="0"/>
+        <w:keepLines w:val="0"/>
+        <w:pageBreakBefore w:val="0"/>
+        <w:widowControl w:val="0"/>
+        <w:pBdr>
+          <w:top w:space="0" w:sz="0" w:val="nil"/>
+          <w:left w:space="0" w:sz="0" w:val="nil"/>
+          <w:bottom w:space="0" w:sz="0" w:val="nil"/>
+          <w:right w:space="0" w:sz="0" w:val="nil"/>
+          <w:between w:space="0" w:sz="0" w:val="nil"/>
+        </w:pBdr>
+        <w:shd w:fill="auto" w:val="clear"/>
+        <w:spacing w:after="0" w:before="0" w:line="276" w:lineRule="auto"/>
+        <w:ind w:left="0" w:right="0" w:firstLine="0"/>
+        <w:jc w:val="left"/>
+        <w:rPr/>
+        <w:sectPr>
+          <w:type w:val="nextPage"/>
+          <w:pgSz w:h="15840" w:w="12240" w:orient="portrait"/>
+          <w:pgMar w:bottom="1440" w:top="1440" w:left="1440" w:right="1440" w:header="720" w:footer="720"/>
+          <w:pgNumType w:start="1"/>
+        </w:sectPr>
+      </w:pPr>
+      <w:bookmarkStart w:colFirst="0" w:colLast="0" w:name="_yueul5a0rrwl" w:id="24"/>
+      <w:bookmarkEnd w:id="24"/>
+      <w:r>
+        <w:rPr>
+          <w:rFonts w:ascii="Garamond" w:cs="Garamond" w:eastAsia="Garamond" w:hAnsi="Garamond"/>
+          <w:b w:val="1"/>
+          <w:bCs w:val="1"/>
+          <w:i w:val="0"/>
+          <w:iCs w:val="0"/>
+          <w:smallCaps w:val="0"/>
+          <w:strike w:val="0"/>
+          <w:color w:val="000000"/>
+          <w:sz w:val="60"/>
+          <w:szCs w:val="60"/>
+          <w:u w:val="none"/>
+          <w:shd w:fill="auto" w:val="clear"/>
+          <w:vertAlign w:val="baseline"/>
+          <w:rtl w:val="0"/>
+        </w:rPr>
+        <w:t xml:space="preserve">Game text</w:t>
+      </w:r>
+      <w:r>
+        <w:rPr>
+          <w:rtl w:val="0"/>
+        </w:rPr>
+      </w:r>
+    </w:p>
+    <w:p>
+      <w:pPr>
         <w:pStyle w:val="Heading1"/>
         <w:rPr/>
       </w:pPr>
-      <w:bookmarkStart w:colFirst="0" w:colLast="0" w:name="_f5xcdpggf68j" w:id="19"/>
-      <w:bookmarkEnd w:id="19"/>
+      <w:bookmarkStart w:colFirst="0" w:colLast="0" w:name="_f5xcdpggf68j" w:id="25"/>
+      <w:bookmarkEnd w:id="25"/>
       <w:r>
         <w:rPr>
           <w:rtl w:val="0"/>
@@ -6081,9 +5575,8 @@
   <w:footnote w:id="0">
     <w:p>
       <w:pPr>
-        <w:spacing w:line="240" w:lineRule="auto"/>
-        <w:rPr>
-          <w:rFonts w:ascii="Garamond" w:cs="Garamond" w:eastAsia="Garamond" w:hAnsi="Garamond"/>
+        <w:spacing w:before="0" w:line="240" w:lineRule="auto"/>
+        <w:rPr>
           <w:sz w:val="20"/>
           <w:szCs w:val="20"/>
         </w:rPr>
@@ -6097,7 +5590,6 @@
       </w:r>
       <w:r>
         <w:rPr>
-          <w:rFonts w:ascii="Garamond" w:cs="Garamond" w:eastAsia="Garamond" w:hAnsi="Garamond"/>
           <w:sz w:val="20"/>
           <w:szCs w:val="20"/>
           <w:rtl w:val="0"/>
@@ -6106,7 +5598,6 @@
       </w:r>
       <w:r>
         <w:rPr>
-          <w:rFonts w:ascii="Garamond" w:cs="Garamond" w:eastAsia="Garamond" w:hAnsi="Garamond"/>
           <w:i w:val="1"/>
           <w:iCs w:val="1"/>
           <w:sz w:val="20"/>
@@ -6117,7 +5608,6 @@
       </w:r>
       <w:r>
         <w:rPr>
-          <w:rFonts w:ascii="Garamond" w:cs="Garamond" w:eastAsia="Garamond" w:hAnsi="Garamond"/>
           <w:sz w:val="20"/>
           <w:szCs w:val="20"/>
           <w:rtl w:val="0"/>
@@ -6127,7 +5617,6 @@
       <w:hyperlink r:id="rId1">
         <w:r>
           <w:rPr>
-            <w:rFonts w:ascii="Garamond" w:cs="Garamond" w:eastAsia="Garamond" w:hAnsi="Garamond"/>
             <w:color w:val="1155cc"/>
             <w:sz w:val="20"/>
             <w:szCs w:val="20"/>
@@ -6145,9 +5634,8 @@
     </w:p>
     <w:p>
       <w:pPr>
-        <w:spacing w:line="240" w:lineRule="auto"/>
-        <w:rPr>
-          <w:rFonts w:ascii="Garamond" w:cs="Garamond" w:eastAsia="Garamond" w:hAnsi="Garamond"/>
+        <w:spacing w:before="0" w:line="240" w:lineRule="auto"/>
+        <w:rPr>
           <w:sz w:val="20"/>
           <w:szCs w:val="20"/>
         </w:rPr>
@@ -6162,9 +5650,8 @@
   <w:footnote w:id="1">
     <w:p>
       <w:pPr>
-        <w:spacing w:line="240" w:lineRule="auto"/>
-        <w:rPr>
-          <w:rFonts w:ascii="Garamond" w:cs="Garamond" w:eastAsia="Garamond" w:hAnsi="Garamond"/>
+        <w:spacing w:before="0" w:line="240" w:lineRule="auto"/>
+        <w:rPr>
           <w:sz w:val="20"/>
           <w:szCs w:val="20"/>
         </w:rPr>
@@ -6178,7 +5665,6 @@
       </w:r>
       <w:r>
         <w:rPr>
-          <w:rFonts w:ascii="Garamond" w:cs="Garamond" w:eastAsia="Garamond" w:hAnsi="Garamond"/>
           <w:sz w:val="20"/>
           <w:szCs w:val="20"/>
           <w:rtl w:val="0"/>
@@ -6187,7 +5673,6 @@
       </w:r>
       <w:r>
         <w:rPr>
-          <w:rFonts w:ascii="Garamond" w:cs="Garamond" w:eastAsia="Garamond" w:hAnsi="Garamond"/>
           <w:i w:val="1"/>
           <w:iCs w:val="1"/>
           <w:sz w:val="20"/>
@@ -6198,7 +5683,6 @@
       </w:r>
       <w:r>
         <w:rPr>
-          <w:rFonts w:ascii="Garamond" w:cs="Garamond" w:eastAsia="Garamond" w:hAnsi="Garamond"/>
           <w:sz w:val="20"/>
           <w:szCs w:val="20"/>
           <w:rtl w:val="0"/>
@@ -6210,9 +5694,8 @@
   <w:footnote w:id="2">
     <w:p>
       <w:pPr>
-        <w:spacing w:line="240" w:lineRule="auto"/>
-        <w:rPr>
-          <w:rFonts w:ascii="Garamond" w:cs="Garamond" w:eastAsia="Garamond" w:hAnsi="Garamond"/>
+        <w:spacing w:before="0" w:line="240" w:lineRule="auto"/>
+        <w:rPr>
           <w:sz w:val="20"/>
           <w:szCs w:val="20"/>
         </w:rPr>
@@ -6226,7 +5709,6 @@
       </w:r>
       <w:r>
         <w:rPr>
-          <w:rFonts w:ascii="Garamond" w:cs="Garamond" w:eastAsia="Garamond" w:hAnsi="Garamond"/>
           <w:sz w:val="20"/>
           <w:szCs w:val="20"/>
           <w:rtl w:val="0"/>
@@ -6238,9 +5720,8 @@
   <w:footnote w:id="3">
     <w:p>
       <w:pPr>
-        <w:spacing w:line="240" w:lineRule="auto"/>
-        <w:rPr>
-          <w:rFonts w:ascii="Garamond" w:cs="Garamond" w:eastAsia="Garamond" w:hAnsi="Garamond"/>
+        <w:spacing w:before="0" w:line="240" w:lineRule="auto"/>
+        <w:rPr>
           <w:sz w:val="20"/>
           <w:szCs w:val="20"/>
         </w:rPr>
@@ -6254,7 +5735,6 @@
       </w:r>
       <w:r>
         <w:rPr>
-          <w:rFonts w:ascii="Garamond" w:cs="Garamond" w:eastAsia="Garamond" w:hAnsi="Garamond"/>
           <w:sz w:val="20"/>
           <w:szCs w:val="20"/>
           <w:rtl w:val="0"/>
@@ -6266,9 +5746,8 @@
   <w:footnote w:id="4">
     <w:p>
       <w:pPr>
-        <w:spacing w:line="240" w:lineRule="auto"/>
-        <w:rPr>
-          <w:rFonts w:ascii="Garamond" w:cs="Garamond" w:eastAsia="Garamond" w:hAnsi="Garamond"/>
+        <w:spacing w:before="0" w:line="240" w:lineRule="auto"/>
+        <w:rPr>
           <w:sz w:val="20"/>
           <w:szCs w:val="20"/>
         </w:rPr>
@@ -6282,7 +5761,6 @@
       </w:r>
       <w:r>
         <w:rPr>
-          <w:rFonts w:ascii="Garamond" w:cs="Garamond" w:eastAsia="Garamond" w:hAnsi="Garamond"/>
           <w:sz w:val="20"/>
           <w:szCs w:val="20"/>
           <w:rtl w:val="0"/>

</xml_diff>

<commit_message>
Match the matrix to the packet's revised follow-ups and Major Clues
Mira, Leo and Priya's follow-up pairs, explanations and walk-aways,
Mira's tripwire walk-away, and Major Clues 1, 3 and 4 now say what the
packet says. Rebuilt from fresh downloads of all four Google files.

Co-Authored-By: Claude Opus 5.5 <noreply@anthropic.com>
Claude-Session: https://claude.ai/code/session_01NBkTs5k7oDn7bZ3CA5RyNc
</commit_message>
<xml_diff>
--- a/engine/HEARsay mysteries.docx
+++ b/engine/HEARsay mysteries.docx
@@ -6,42 +6,93 @@
     <w:p>
       <w:pPr>
         <w:pStyle w:val="Title"/>
-        <w:spacing w:after="60" w:before="200" w:line="276" w:lineRule="auto"/>
-        <w:jc w:val="center"/>
+        <w:keepNext w:val="0"/>
+        <w:keepLines w:val="0"/>
+        <w:pageBreakBefore w:val="0"/>
+        <w:widowControl w:val="0"/>
+        <w:pBdr>
+          <w:top w:space="0" w:sz="0" w:val="nil"/>
+          <w:left w:space="0" w:sz="0" w:val="nil"/>
+          <w:bottom w:space="0" w:sz="0" w:val="nil"/>
+          <w:right w:space="0" w:sz="0" w:val="nil"/>
+          <w:between w:space="0" w:sz="0" w:val="nil"/>
+        </w:pBdr>
+        <w:shd w:fill="auto" w:val="clear"/>
+        <w:spacing w:after="0" w:before="0" w:line="276" w:lineRule="auto"/>
+        <w:ind w:left="0" w:right="0" w:firstLine="0"/>
+        <w:jc w:val="left"/>
+        <w:rPr>
+          <w:rFonts w:ascii="Arial" w:cs="Arial" w:eastAsia="Arial" w:hAnsi="Arial"/>
+          <w:b w:val="0"/>
+          <w:bCs w:val="0"/>
+          <w:i w:val="0"/>
+          <w:iCs w:val="0"/>
+          <w:smallCaps w:val="0"/>
+          <w:strike w:val="0"/>
+          <w:color w:val="000000"/>
+          <w:sz w:val="22"/>
+          <w:szCs w:val="22"/>
+          <w:u w:val="none"/>
+          <w:shd w:fill="auto" w:val="clear"/>
+          <w:vertAlign w:val="baseline"/>
+        </w:rPr>
+        <w:sectPr>
+          <w:pgSz w:h="15840" w:w="12240" w:orient="portrait"/>
+          <w:pgMar w:bottom="1440" w:top="1440" w:left="1440" w:right="1440" w:header="720" w:footer="720"/>
+          <w:pgNumType w:start="1"/>
+        </w:sectPr>
+      </w:pPr>
+      <w:bookmarkStart w:colFirst="0" w:colLast="0" w:name="_9957xdwi6jmo" w:id="0"/>
+      <w:bookmarkEnd w:id="0"/>
+      <w:r>
         <w:rPr>
           <w:rFonts w:ascii="Garamond" w:cs="Garamond" w:eastAsia="Garamond" w:hAnsi="Garamond"/>
+          <w:b w:val="1"/>
+          <w:bCs w:val="1"/>
+          <w:i w:val="0"/>
+          <w:iCs w:val="0"/>
+          <w:smallCaps w:val="0"/>
+          <w:strike w:val="0"/>
+          <w:color w:val="000000"/>
           <w:sz w:val="60"/>
           <w:szCs w:val="60"/>
-        </w:rPr>
-      </w:pPr>
-      <w:bookmarkStart w:colFirst="0" w:colLast="0" w:name="_ik0ajinzayw4" w:id="0"/>
-      <w:bookmarkEnd w:id="0"/>
-      <w:r>
-        <w:rPr>
-          <w:rFonts w:ascii="Garamond" w:cs="Garamond" w:eastAsia="Garamond" w:hAnsi="Garamond"/>
-          <w:sz w:val="60"/>
-          <w:szCs w:val="60"/>
+          <w:u w:val="none"/>
+          <w:shd w:fill="auto" w:val="clear"/>
+          <w:vertAlign w:val="baseline"/>
           <w:rtl w:val="0"/>
         </w:rPr>
         <w:t xml:space="preserve">HEARsay Mysteries</w:t>
       </w:r>
+      <w:r>
+        <w:rPr>
+          <w:rtl w:val="0"/>
+        </w:rPr>
+      </w:r>
+    </w:p>
+    <w:p>
+      <w:pPr>
+        <w:pStyle w:val="Title"/>
+        <w:jc w:val="center"/>
+        <w:rPr/>
+      </w:pPr>
+      <w:bookmarkStart w:colFirst="0" w:colLast="0" w:name="_ik0ajinzayw4" w:id="1"/>
+      <w:bookmarkEnd w:id="1"/>
+      <w:r>
+        <w:rPr>
+          <w:rtl w:val="0"/>
+        </w:rPr>
+        <w:t xml:space="preserve">HEARsay Mysteries</w:t>
+      </w:r>
     </w:p>
     <w:p>
       <w:pPr>
         <w:pStyle w:val="Subtitle"/>
-        <w:spacing w:after="320" w:before="200" w:line="276" w:lineRule="auto"/>
-        <w:jc w:val="center"/>
-        <w:rPr>
-          <w:sz w:val="22"/>
-          <w:szCs w:val="22"/>
-        </w:rPr>
-      </w:pPr>
-      <w:bookmarkStart w:colFirst="0" w:colLast="0" w:name="_rjfdtmwzzd07" w:id="1"/>
-      <w:bookmarkEnd w:id="1"/>
-      <w:r>
-        <w:rPr>
-          <w:sz w:val="22"/>
-          <w:szCs w:val="22"/>
+        <w:rPr/>
+      </w:pPr>
+      <w:bookmarkStart w:colFirst="0" w:colLast="0" w:name="_rjfdtmwzzd07" w:id="2"/>
+      <w:bookmarkEnd w:id="2"/>
+      <w:r>
+        <w:rPr>
           <w:rtl w:val="0"/>
         </w:rPr>
         <w:t xml:space="preserve">A mystery game framework for teaching and practicing the HEAR framework</w:t>
@@ -50,15 +101,13 @@
     <w:p>
       <w:pPr>
         <w:pStyle w:val="Subtitle"/>
-        <w:spacing w:after="320" w:before="200" w:line="276" w:lineRule="auto"/>
-        <w:jc w:val="center"/>
         <w:rPr>
           <w:sz w:val="20"/>
           <w:szCs w:val="20"/>
         </w:rPr>
       </w:pPr>
-      <w:bookmarkStart w:colFirst="0" w:colLast="0" w:name="_dhe0haaxgpbf" w:id="2"/>
-      <w:bookmarkEnd w:id="2"/>
+      <w:bookmarkStart w:colFirst="0" w:colLast="0" w:name="_dhe0haaxgpbf" w:id="3"/>
+      <w:bookmarkEnd w:id="3"/>
       <w:r>
         <w:rPr>
           <w:sz w:val="20"/>
@@ -70,19 +119,10 @@
     </w:p>
     <w:p>
       <w:pPr>
-        <w:spacing w:before="200" w:line="276" w:lineRule="auto"/>
-        <w:rPr>
-          <w:rFonts w:ascii="Garamond" w:cs="Garamond" w:eastAsia="Garamond" w:hAnsi="Garamond"/>
-          <w:sz w:val="24"/>
-          <w:szCs w:val="24"/>
-        </w:rPr>
-      </w:pPr>
-      <w:r>
-        <w:rPr>
-          <w:rFonts w:ascii="Garamond" w:cs="Garamond" w:eastAsia="Garamond" w:hAnsi="Garamond"/>
-          <w:sz w:val="24"/>
-          <w:szCs w:val="24"/>
-        </w:rPr>
+        <w:rPr/>
+      </w:pPr>
+      <w:r>
+        <w:rPr/>
         <mc:AlternateContent>
           <mc:Choice Requires="wpg">
             <w:drawing>
@@ -240,19 +280,10 @@
     </w:p>
     <w:p>
       <w:pPr>
-        <w:spacing w:before="200" w:line="276" w:lineRule="auto"/>
-        <w:rPr>
-          <w:rFonts w:ascii="Garamond" w:cs="Garamond" w:eastAsia="Garamond" w:hAnsi="Garamond"/>
-          <w:sz w:val="24"/>
-          <w:szCs w:val="24"/>
-        </w:rPr>
-      </w:pPr>
-      <w:r>
-        <w:rPr>
-          <w:rFonts w:ascii="Garamond" w:cs="Garamond" w:eastAsia="Garamond" w:hAnsi="Garamond"/>
-          <w:sz w:val="24"/>
-          <w:szCs w:val="24"/>
-        </w:rPr>
+        <w:rPr/>
+      </w:pPr>
+      <w:r>
+        <w:rPr/>
         <mc:AlternateContent>
           <mc:Choice Requires="wpg">
             <w:drawing>
@@ -444,24 +475,12 @@
     <w:p>
       <w:pPr>
         <w:pStyle w:val="Heading1"/>
-        <w:spacing w:before="400" w:line="276" w:lineRule="auto"/>
-        <w:rPr>
-          <w:rFonts w:ascii="Garamond" w:cs="Garamond" w:eastAsia="Garamond" w:hAnsi="Garamond"/>
-          <w:b w:val="0"/>
-          <w:bCs w:val="0"/>
-          <w:sz w:val="40"/>
-          <w:szCs w:val="40"/>
-        </w:rPr>
-      </w:pPr>
-      <w:bookmarkStart w:colFirst="0" w:colLast="0" w:name="_91ezqgojjt8o" w:id="3"/>
-      <w:bookmarkEnd w:id="3"/>
-      <w:r>
-        <w:rPr>
-          <w:rFonts w:ascii="Garamond" w:cs="Garamond" w:eastAsia="Garamond" w:hAnsi="Garamond"/>
-          <w:b w:val="0"/>
-          <w:bCs w:val="0"/>
-          <w:sz w:val="40"/>
-          <w:szCs w:val="40"/>
+        <w:rPr/>
+      </w:pPr>
+      <w:bookmarkStart w:colFirst="0" w:colLast="0" w:name="_91ezqgojjt8o" w:id="4"/>
+      <w:bookmarkEnd w:id="4"/>
+      <w:r>
+        <w:rPr>
           <w:rtl w:val="0"/>
         </w:rPr>
         <w:t xml:space="preserve">1. What is a HEARsay mystery? </w:t>
@@ -474,67 +493,44 @@
     </w:p>
     <w:p>
       <w:pPr>
-        <w:spacing w:before="200" w:line="276" w:lineRule="auto"/>
-        <w:rPr>
-          <w:rFonts w:ascii="Garamond" w:cs="Garamond" w:eastAsia="Garamond" w:hAnsi="Garamond"/>
-          <w:sz w:val="24"/>
-          <w:szCs w:val="24"/>
-        </w:rPr>
-      </w:pPr>
-      <w:r>
-        <w:rPr>
-          <w:rFonts w:ascii="Garamond" w:cs="Garamond" w:eastAsia="Garamond" w:hAnsi="Garamond"/>
-          <w:sz w:val="24"/>
-          <w:szCs w:val="24"/>
+        <w:rPr/>
+      </w:pPr>
+      <w:r>
+        <w:rPr>
           <w:rtl w:val="0"/>
         </w:rPr>
         <w:t xml:space="preserve">HEARsay is a series of mystery games designed to help students learn and practice </w:t>
       </w:r>
       <w:r>
         <w:rPr>
-          <w:rFonts w:ascii="Garamond" w:cs="Garamond" w:eastAsia="Garamond" w:hAnsi="Garamond"/>
           <w:i w:val="1"/>
           <w:iCs w:val="1"/>
-          <w:sz w:val="24"/>
-          <w:szCs w:val="24"/>
           <w:rtl w:val="0"/>
         </w:rPr>
         <w:t xml:space="preserve">conversational receptiveness</w:t>
       </w:r>
       <w:r>
         <w:rPr>
-          <w:rFonts w:ascii="Garamond" w:cs="Garamond" w:eastAsia="Garamond" w:hAnsi="Garamond"/>
           <w:i w:val="1"/>
           <w:iCs w:val="1"/>
-          <w:sz w:val="24"/>
-          <w:szCs w:val="24"/>
           <w:vertAlign w:val="superscript"/>
         </w:rPr>
         <w:footnoteReference w:customMarkFollows="0" w:id="0"/>
       </w:r>
       <w:r>
         <w:rPr>
-          <w:rFonts w:ascii="Garamond" w:cs="Garamond" w:eastAsia="Garamond" w:hAnsi="Garamond"/>
-          <w:sz w:val="24"/>
-          <w:szCs w:val="24"/>
           <w:rtl w:val="0"/>
         </w:rPr>
         <w:t xml:space="preserve">- “the use of language to communicate one’s willingness to thoughtfully engage with opposing views.”</w:t>
       </w:r>
       <w:r>
         <w:rPr>
-          <w:rFonts w:ascii="Garamond" w:cs="Garamond" w:eastAsia="Garamond" w:hAnsi="Garamond"/>
-          <w:sz w:val="24"/>
-          <w:szCs w:val="24"/>
           <w:vertAlign w:val="superscript"/>
         </w:rPr>
         <w:footnoteReference w:customMarkFollows="0" w:id="1"/>
       </w:r>
       <w:r>
         <w:rPr>
-          <w:rFonts w:ascii="Garamond" w:cs="Garamond" w:eastAsia="Garamond" w:hAnsi="Garamond"/>
-          <w:sz w:val="24"/>
-          <w:szCs w:val="24"/>
           <w:rtl w:val="0"/>
         </w:rPr>
         <w:t xml:space="preserve"> The focus of the games is the HEAR Framework, a practical tool aimed to help people remember and apply the principles of conversational receptiveness. </w:t>
@@ -542,56 +538,36 @@
     </w:p>
     <w:p>
       <w:pPr>
-        <w:spacing w:before="200" w:line="276" w:lineRule="auto"/>
-        <w:rPr>
-          <w:rFonts w:ascii="Garamond" w:cs="Garamond" w:eastAsia="Garamond" w:hAnsi="Garamond"/>
-          <w:sz w:val="24"/>
-          <w:szCs w:val="24"/>
-        </w:rPr>
-      </w:pPr>
-      <w:r>
-        <w:rPr>
-          <w:rFonts w:ascii="Garamond" w:cs="Garamond" w:eastAsia="Garamond" w:hAnsi="Garamond"/>
-          <w:sz w:val="24"/>
-          <w:szCs w:val="24"/>
+        <w:rPr/>
+      </w:pPr>
+      <w:r>
+        <w:rPr>
           <w:rtl w:val="0"/>
         </w:rPr>
         <w:t xml:space="preserve">HEARsay mysteries are story-driven games built on Twine, a free choose-your-own-adventure engine game that requires little to no coding. This framework provides the details about the way the game works as well as instructions for crafting scenarios. The first scenario, </w:t>
       </w:r>
       <w:r>
         <w:rPr>
-          <w:rFonts w:ascii="Garamond" w:cs="Garamond" w:eastAsia="Garamond" w:hAnsi="Garamond"/>
           <w:i w:val="1"/>
           <w:iCs w:val="1"/>
-          <w:sz w:val="24"/>
-          <w:szCs w:val="24"/>
           <w:rtl w:val="0"/>
         </w:rPr>
         <w:t xml:space="preserve">The Commons’ Comma</w:t>
       </w:r>
       <w:r>
         <w:rPr>
-          <w:rFonts w:ascii="Garamond" w:cs="Garamond" w:eastAsia="Garamond" w:hAnsi="Garamond"/>
-          <w:sz w:val="24"/>
-          <w:szCs w:val="24"/>
           <w:rtl w:val="0"/>
         </w:rPr>
         <w:t xml:space="preserve">, is included in an accompanying folder and describes a scenario based on a university campus, which I will treat here as the default backdrop for HEARsay mysteries.</w:t>
       </w:r>
       <w:r>
         <w:rPr>
-          <w:rFonts w:ascii="Garamond" w:cs="Garamond" w:eastAsia="Garamond" w:hAnsi="Garamond"/>
-          <w:sz w:val="24"/>
-          <w:szCs w:val="24"/>
           <w:vertAlign w:val="superscript"/>
         </w:rPr>
         <w:footnoteReference w:customMarkFollows="0" w:id="2"/>
       </w:r>
       <w:r>
         <w:rPr>
-          <w:rFonts w:ascii="Garamond" w:cs="Garamond" w:eastAsia="Garamond" w:hAnsi="Garamond"/>
-          <w:sz w:val="24"/>
-          <w:szCs w:val="24"/>
           <w:rtl w:val="0"/>
         </w:rPr>
         <w:t xml:space="preserve"> </w:t>
@@ -599,54 +575,34 @@
     </w:p>
     <w:p>
       <w:pPr>
-        <w:spacing w:before="200" w:line="276" w:lineRule="auto"/>
-        <w:rPr>
-          <w:rFonts w:ascii="Garamond" w:cs="Garamond" w:eastAsia="Garamond" w:hAnsi="Garamond"/>
-          <w:sz w:val="24"/>
-          <w:szCs w:val="24"/>
-        </w:rPr>
-      </w:pPr>
-      <w:r>
-        <w:rPr>
-          <w:rFonts w:ascii="Garamond" w:cs="Garamond" w:eastAsia="Garamond" w:hAnsi="Garamond"/>
-          <w:sz w:val="24"/>
-          <w:szCs w:val="24"/>
+        <w:rPr/>
+      </w:pPr>
+      <w:r>
+        <w:rPr>
           <w:rtl w:val="0"/>
         </w:rPr>
         <w:t xml:space="preserve">Each scenario </w:t>
       </w:r>
       <w:r>
         <w:rPr>
-          <w:rFonts w:ascii="Garamond" w:cs="Garamond" w:eastAsia="Garamond" w:hAnsi="Garamond"/>
-          <w:sz w:val="24"/>
-          <w:szCs w:val="24"/>
           <w:rtl w:val="0"/>
         </w:rPr>
         <w:t xml:space="preserve">is comprised</w:t>
       </w:r>
       <w:r>
         <w:rPr>
-          <w:rFonts w:ascii="Garamond" w:cs="Garamond" w:eastAsia="Garamond" w:hAnsi="Garamond"/>
-          <w:sz w:val="24"/>
-          <w:szCs w:val="24"/>
           <w:rtl w:val="0"/>
         </w:rPr>
         <w:t xml:space="preserve"> of (a) a</w:t>
       </w:r>
       <w:r>
         <w:rPr>
-          <w:rFonts w:ascii="Garamond" w:cs="Garamond" w:eastAsia="Garamond" w:hAnsi="Garamond"/>
-          <w:sz w:val="24"/>
-          <w:szCs w:val="24"/>
           <w:rtl w:val="0"/>
         </w:rPr>
         <w:t xml:space="preserve"> puzzle the players have to solve and (b) a controversy that’s unfolding in the background, which I will call the Current Campus Controversy (CCC</w:t>
       </w:r>
       <w:r>
         <w:rPr>
-          <w:rFonts w:ascii="Garamond" w:cs="Garamond" w:eastAsia="Garamond" w:hAnsi="Garamond"/>
-          <w:sz w:val="24"/>
-          <w:szCs w:val="24"/>
           <w:vertAlign w:val="superscript"/>
           <w:rtl w:val="0"/>
         </w:rPr>
@@ -654,9 +610,6 @@
       </w:r>
       <w:r>
         <w:rPr>
-          <w:rFonts w:ascii="Garamond" w:cs="Garamond" w:eastAsia="Garamond" w:hAnsi="Garamond"/>
-          <w:sz w:val="24"/>
-          <w:szCs w:val="24"/>
           <w:rtl w:val="0"/>
         </w:rPr>
         <w:t xml:space="preserve">). Players will be interviewing witnesses, such as students or university personnel, trying to gain clues that would help them solve the mystery and avoiding red herrings that point them in the wrong direction. At the same time, witnesses will share their views on the CCC and players will have to apply the HEAR framework in order to solve the mystery and improve their scores in the game:</w:t>
@@ -668,19 +621,11 @@
           <w:ilvl w:val="0"/>
           <w:numId w:val="7"/>
         </w:numPr>
-        <w:spacing w:after="0" w:afterAutospacing="0" w:before="200" w:line="276" w:lineRule="auto"/>
+        <w:spacing w:after="0" w:afterAutospacing="0"/>
         <w:ind w:left="720" w:hanging="360"/>
-        <w:rPr>
-          <w:rFonts w:ascii="Garamond" w:cs="Garamond" w:eastAsia="Garamond" w:hAnsi="Garamond"/>
-          <w:sz w:val="24"/>
-          <w:szCs w:val="24"/>
-        </w:rPr>
-      </w:pPr>
-      <w:r>
-        <w:rPr>
-          <w:rFonts w:ascii="Garamond" w:cs="Garamond" w:eastAsia="Garamond" w:hAnsi="Garamond"/>
-          <w:sz w:val="24"/>
-          <w:szCs w:val="24"/>
+      </w:pPr>
+      <w:r>
+        <w:rPr>
           <w:rtl w:val="0"/>
         </w:rPr>
         <w:t xml:space="preserve">Once with each witness players may ask a follow-up question about the witness’s expressed view regarding the CCC. Players will have to choose between two phrasings of the question, one more receptive than the other (the difference may be stark or subtle). Choosing the receptive phrasing unlocks a Major Clue while choosing the less receptive question ends the interview abruptly (the witness storms away and will not  answer any more questions). </w:t>
@@ -692,19 +637,11 @@
           <w:ilvl w:val="0"/>
           <w:numId w:val="7"/>
         </w:numPr>
-        <w:spacing w:after="0" w:afterAutospacing="0" w:before="0" w:beforeAutospacing="0" w:line="276" w:lineRule="auto"/>
+        <w:spacing w:after="0" w:afterAutospacing="0" w:before="0" w:beforeAutospacing="0"/>
         <w:ind w:left="720" w:hanging="360"/>
-        <w:rPr>
-          <w:rFonts w:ascii="Garamond" w:cs="Garamond" w:eastAsia="Garamond" w:hAnsi="Garamond"/>
-          <w:sz w:val="24"/>
-          <w:szCs w:val="24"/>
-        </w:rPr>
-      </w:pPr>
-      <w:r>
-        <w:rPr>
-          <w:rFonts w:ascii="Garamond" w:cs="Garamond" w:eastAsia="Garamond" w:hAnsi="Garamond"/>
-          <w:sz w:val="24"/>
-          <w:szCs w:val="24"/>
+      </w:pPr>
+      <w:r>
+        <w:rPr>
           <w:rtl w:val="0"/>
         </w:rPr>
         <w:t xml:space="preserve">Unlocking a Major Clue earns the students a letter from the HEAR acronym, reinforcing the mnemonic tool, and explaining one of the four pillars of the framework.</w:t>
@@ -716,19 +653,11 @@
           <w:ilvl w:val="0"/>
           <w:numId w:val="7"/>
         </w:numPr>
-        <w:spacing w:before="0" w:beforeAutospacing="0" w:line="276" w:lineRule="auto"/>
+        <w:spacing w:before="0" w:beforeAutospacing="0"/>
         <w:ind w:left="720" w:hanging="360"/>
-        <w:rPr>
-          <w:rFonts w:ascii="Garamond" w:cs="Garamond" w:eastAsia="Garamond" w:hAnsi="Garamond"/>
-          <w:sz w:val="24"/>
-          <w:szCs w:val="24"/>
-        </w:rPr>
-      </w:pPr>
-      <w:r>
-        <w:rPr>
-          <w:rFonts w:ascii="Garamond" w:cs="Garamond" w:eastAsia="Garamond" w:hAnsi="Garamond"/>
-          <w:sz w:val="24"/>
-          <w:szCs w:val="24"/>
+      </w:pPr>
+      <w:r>
+        <w:rPr>
           <w:rtl w:val="0"/>
         </w:rPr>
         <w:t xml:space="preserve">Each witness will volunteer their opinions on the CCC, with varying degrees of receptiveness. Players will receive bonus points at the end of the game for ranking the witnesses correctly in terms of the receptiveness. </w:t>
@@ -737,24 +666,12 @@
     <w:p>
       <w:pPr>
         <w:pStyle w:val="Heading1"/>
-        <w:spacing w:before="400" w:line="276" w:lineRule="auto"/>
-        <w:rPr>
-          <w:rFonts w:ascii="Garamond" w:cs="Garamond" w:eastAsia="Garamond" w:hAnsi="Garamond"/>
-          <w:b w:val="0"/>
-          <w:bCs w:val="0"/>
-          <w:sz w:val="40"/>
-          <w:szCs w:val="40"/>
-        </w:rPr>
-      </w:pPr>
-      <w:bookmarkStart w:colFirst="0" w:colLast="0" w:name="_724y3rmj63y4" w:id="4"/>
-      <w:bookmarkEnd w:id="4"/>
-      <w:r>
-        <w:rPr>
-          <w:rFonts w:ascii="Garamond" w:cs="Garamond" w:eastAsia="Garamond" w:hAnsi="Garamond"/>
-          <w:b w:val="0"/>
-          <w:bCs w:val="0"/>
-          <w:sz w:val="40"/>
-          <w:szCs w:val="40"/>
+        <w:rPr/>
+      </w:pPr>
+      <w:bookmarkStart w:colFirst="0" w:colLast="0" w:name="_724y3rmj63y4" w:id="5"/>
+      <w:bookmarkEnd w:id="5"/>
+      <w:r>
+        <w:rPr>
           <w:rtl w:val="0"/>
         </w:rPr>
         <w:t xml:space="preserve">2. The HEAR Framework </w:t>
@@ -762,18 +679,11 @@
     </w:p>
     <w:p>
       <w:pPr>
-        <w:spacing w:after="200" w:before="200" w:line="276" w:lineRule="auto"/>
-        <w:rPr>
-          <w:rFonts w:ascii="Garamond" w:cs="Garamond" w:eastAsia="Garamond" w:hAnsi="Garamond"/>
-          <w:sz w:val="24"/>
-          <w:szCs w:val="24"/>
-        </w:rPr>
-      </w:pPr>
-      <w:r>
-        <w:rPr>
-          <w:rFonts w:ascii="Garamond" w:cs="Garamond" w:eastAsia="Garamond" w:hAnsi="Garamond"/>
-          <w:sz w:val="24"/>
-          <w:szCs w:val="24"/>
+        <w:spacing w:after="200" w:lineRule="auto"/>
+        <w:rPr/>
+      </w:pPr>
+      <w:r>
+        <w:rPr>
           <w:rtl w:val="0"/>
         </w:rPr>
         <w:t xml:space="preserve">Conversational receptiveness is the use of language that signals you are engaging thoughtfully with a view you disagree with. Minson and colleagues found that people who are perceived as receptive are seen as better teammates and advisors, are more persuasive, and are more likely to be engaged with in return, and that receptiveness can be learned as a set of concrete verbal moves. The teachable recipe is summarised as HEAR:</w:t>
@@ -813,16 +723,14 @@
           </w:tcPr>
           <w:p>
             <w:pPr>
-              <w:spacing w:line="240" w:lineRule="auto"/>
-              <w:rPr>
-                <w:rFonts w:ascii="Garamond" w:cs="Garamond" w:eastAsia="Garamond" w:hAnsi="Garamond"/>
+              <w:spacing w:before="0" w:line="240" w:lineRule="auto"/>
+              <w:rPr>
                 <w:sz w:val="32"/>
                 <w:szCs w:val="32"/>
               </w:rPr>
             </w:pPr>
             <w:r>
               <w:rPr>
-                <w:rFonts w:ascii="Garamond" w:cs="Garamond" w:eastAsia="Garamond" w:hAnsi="Garamond"/>
                 <w:sz w:val="32"/>
                 <w:szCs w:val="32"/>
                 <w:rtl w:val="0"/>
@@ -837,16 +745,14 @@
           </w:tcPr>
           <w:p>
             <w:pPr>
-              <w:spacing w:line="240" w:lineRule="auto"/>
-              <w:rPr>
-                <w:rFonts w:ascii="Garamond" w:cs="Garamond" w:eastAsia="Garamond" w:hAnsi="Garamond"/>
+              <w:spacing w:before="0" w:line="240" w:lineRule="auto"/>
+              <w:rPr>
                 <w:sz w:val="32"/>
                 <w:szCs w:val="32"/>
               </w:rPr>
             </w:pPr>
             <w:r>
               <w:rPr>
-                <w:rFonts w:ascii="Garamond" w:cs="Garamond" w:eastAsia="Garamond" w:hAnsi="Garamond"/>
                 <w:sz w:val="32"/>
                 <w:szCs w:val="32"/>
                 <w:rtl w:val="0"/>
@@ -861,16 +767,14 @@
           </w:tcPr>
           <w:p>
             <w:pPr>
-              <w:spacing w:line="240" w:lineRule="auto"/>
-              <w:rPr>
-                <w:rFonts w:ascii="Garamond" w:cs="Garamond" w:eastAsia="Garamond" w:hAnsi="Garamond"/>
+              <w:spacing w:before="0" w:line="240" w:lineRule="auto"/>
+              <w:rPr>
                 <w:sz w:val="32"/>
                 <w:szCs w:val="32"/>
               </w:rPr>
             </w:pPr>
             <w:r>
               <w:rPr>
-                <w:rFonts w:ascii="Garamond" w:cs="Garamond" w:eastAsia="Garamond" w:hAnsi="Garamond"/>
                 <w:sz w:val="32"/>
                 <w:szCs w:val="32"/>
                 <w:rtl w:val="0"/>
@@ -890,22 +794,16 @@
           <w:tcPr/>
           <w:p>
             <w:pPr>
-              <w:spacing w:line="240" w:lineRule="auto"/>
-              <w:rPr>
-                <w:rFonts w:ascii="Garamond" w:cs="Garamond" w:eastAsia="Garamond" w:hAnsi="Garamond"/>
+              <w:spacing w:before="0" w:line="240" w:lineRule="auto"/>
+              <w:rPr>
                 <w:b w:val="1"/>
                 <w:bCs w:val="1"/>
-                <w:sz w:val="24"/>
-                <w:szCs w:val="24"/>
-              </w:rPr>
-            </w:pPr>
-            <w:r>
-              <w:rPr>
-                <w:rFonts w:ascii="Garamond" w:cs="Garamond" w:eastAsia="Garamond" w:hAnsi="Garamond"/>
+              </w:rPr>
+            </w:pPr>
+            <w:r>
+              <w:rPr>
                 <w:b w:val="1"/>
                 <w:bCs w:val="1"/>
-                <w:sz w:val="24"/>
-                <w:szCs w:val="24"/>
                 <w:rtl w:val="0"/>
               </w:rPr>
               <w:t xml:space="preserve">H</w:t>
@@ -916,29 +814,19 @@
           <w:tcPr/>
           <w:p>
             <w:pPr>
-              <w:spacing w:line="240" w:lineRule="auto"/>
-              <w:rPr>
-                <w:rFonts w:ascii="Garamond" w:cs="Garamond" w:eastAsia="Garamond" w:hAnsi="Garamond"/>
-                <w:sz w:val="24"/>
-                <w:szCs w:val="24"/>
-              </w:rPr>
-            </w:pPr>
-            <w:r>
-              <w:rPr>
-                <w:rFonts w:ascii="Garamond" w:cs="Garamond" w:eastAsia="Garamond" w:hAnsi="Garamond"/>
+              <w:spacing w:before="0" w:line="240" w:lineRule="auto"/>
+              <w:rPr/>
+            </w:pPr>
+            <w:r>
+              <w:rPr>
                 <w:b w:val="1"/>
                 <w:bCs w:val="1"/>
-                <w:sz w:val="24"/>
-                <w:szCs w:val="24"/>
                 <w:rtl w:val="0"/>
               </w:rPr>
               <w:t xml:space="preserve">Hedge</w:t>
             </w:r>
             <w:r>
               <w:rPr>
-                <w:rFonts w:ascii="Garamond" w:cs="Garamond" w:eastAsia="Garamond" w:hAnsi="Garamond"/>
-                <w:sz w:val="24"/>
-                <w:szCs w:val="24"/>
                 <w:rtl w:val="0"/>
               </w:rPr>
               <w:t xml:space="preserve"> your claims</w:t>
@@ -949,18 +837,11 @@
           <w:tcPr/>
           <w:p>
             <w:pPr>
-              <w:spacing w:line="240" w:lineRule="auto"/>
-              <w:rPr>
-                <w:rFonts w:ascii="Garamond" w:cs="Garamond" w:eastAsia="Garamond" w:hAnsi="Garamond"/>
-                <w:sz w:val="24"/>
-                <w:szCs w:val="24"/>
-              </w:rPr>
-            </w:pPr>
-            <w:r>
-              <w:rPr>
-                <w:rFonts w:ascii="Garamond" w:cs="Garamond" w:eastAsia="Garamond" w:hAnsi="Garamond"/>
-                <w:sz w:val="24"/>
-                <w:szCs w:val="24"/>
+              <w:spacing w:before="0" w:line="240" w:lineRule="auto"/>
+              <w:rPr/>
+            </w:pPr>
+            <w:r>
+              <w:rPr>
                 <w:rtl w:val="0"/>
               </w:rPr>
               <w:t xml:space="preserve">“I may be wrong about this”, “in some cases”, “it seems to me”, “probably”. Hedging signals that you hold your view as a view, not as a fact the other person is failing to see.</w:t>
@@ -978,22 +859,16 @@
           <w:tcPr/>
           <w:p>
             <w:pPr>
-              <w:spacing w:line="240" w:lineRule="auto"/>
-              <w:rPr>
-                <w:rFonts w:ascii="Garamond" w:cs="Garamond" w:eastAsia="Garamond" w:hAnsi="Garamond"/>
+              <w:spacing w:before="0" w:line="240" w:lineRule="auto"/>
+              <w:rPr>
                 <w:b w:val="1"/>
                 <w:bCs w:val="1"/>
-                <w:sz w:val="24"/>
-                <w:szCs w:val="24"/>
-              </w:rPr>
-            </w:pPr>
-            <w:r>
-              <w:rPr>
-                <w:rFonts w:ascii="Garamond" w:cs="Garamond" w:eastAsia="Garamond" w:hAnsi="Garamond"/>
+              </w:rPr>
+            </w:pPr>
+            <w:r>
+              <w:rPr>
                 <w:b w:val="1"/>
                 <w:bCs w:val="1"/>
-                <w:sz w:val="24"/>
-                <w:szCs w:val="24"/>
                 <w:rtl w:val="0"/>
               </w:rPr>
               <w:t xml:space="preserve">E</w:t>
@@ -1004,29 +879,19 @@
           <w:tcPr/>
           <w:p>
             <w:pPr>
-              <w:spacing w:line="240" w:lineRule="auto"/>
-              <w:rPr>
-                <w:rFonts w:ascii="Garamond" w:cs="Garamond" w:eastAsia="Garamond" w:hAnsi="Garamond"/>
-                <w:sz w:val="24"/>
-                <w:szCs w:val="24"/>
-              </w:rPr>
-            </w:pPr>
-            <w:r>
-              <w:rPr>
-                <w:rFonts w:ascii="Garamond" w:cs="Garamond" w:eastAsia="Garamond" w:hAnsi="Garamond"/>
+              <w:spacing w:before="0" w:line="240" w:lineRule="auto"/>
+              <w:rPr/>
+            </w:pPr>
+            <w:r>
+              <w:rPr>
                 <w:b w:val="1"/>
                 <w:bCs w:val="1"/>
-                <w:sz w:val="24"/>
-                <w:szCs w:val="24"/>
                 <w:rtl w:val="0"/>
               </w:rPr>
               <w:t xml:space="preserve">Emphasize</w:t>
             </w:r>
             <w:r>
               <w:rPr>
-                <w:rFonts w:ascii="Garamond" w:cs="Garamond" w:eastAsia="Garamond" w:hAnsi="Garamond"/>
-                <w:sz w:val="24"/>
-                <w:szCs w:val="24"/>
                 <w:rtl w:val="0"/>
               </w:rPr>
               <w:t xml:space="preserve"> agreement</w:t>
@@ -1037,18 +902,11 @@
           <w:tcPr/>
           <w:p>
             <w:pPr>
-              <w:spacing w:line="240" w:lineRule="auto"/>
-              <w:rPr>
-                <w:rFonts w:ascii="Garamond" w:cs="Garamond" w:eastAsia="Garamond" w:hAnsi="Garamond"/>
-                <w:sz w:val="24"/>
-                <w:szCs w:val="24"/>
-              </w:rPr>
-            </w:pPr>
-            <w:r>
-              <w:rPr>
-                <w:rFonts w:ascii="Garamond" w:cs="Garamond" w:eastAsia="Garamond" w:hAnsi="Garamond"/>
-                <w:sz w:val="24"/>
-                <w:szCs w:val="24"/>
+              <w:spacing w:before="0" w:line="240" w:lineRule="auto"/>
+              <w:rPr/>
+            </w:pPr>
+            <w:r>
+              <w:rPr>
                 <w:rtl w:val="0"/>
               </w:rPr>
               <w:t xml:space="preserve">“We both want the building to work for students”, “I think we agree on the goal”. Naming shared ground before stating a difference makes the difference feel like a disagreement between allies.</w:t>
@@ -1066,22 +924,16 @@
           <w:tcPr/>
           <w:p>
             <w:pPr>
-              <w:spacing w:line="240" w:lineRule="auto"/>
-              <w:rPr>
-                <w:rFonts w:ascii="Garamond" w:cs="Garamond" w:eastAsia="Garamond" w:hAnsi="Garamond"/>
+              <w:spacing w:before="0" w:line="240" w:lineRule="auto"/>
+              <w:rPr>
                 <w:b w:val="1"/>
                 <w:bCs w:val="1"/>
-                <w:sz w:val="24"/>
-                <w:szCs w:val="24"/>
-              </w:rPr>
-            </w:pPr>
-            <w:r>
-              <w:rPr>
-                <w:rFonts w:ascii="Garamond" w:cs="Garamond" w:eastAsia="Garamond" w:hAnsi="Garamond"/>
+              </w:rPr>
+            </w:pPr>
+            <w:r>
+              <w:rPr>
                 <w:b w:val="1"/>
                 <w:bCs w:val="1"/>
-                <w:sz w:val="24"/>
-                <w:szCs w:val="24"/>
                 <w:rtl w:val="0"/>
               </w:rPr>
               <w:t xml:space="preserve">A</w:t>
@@ -1092,29 +944,19 @@
           <w:tcPr/>
           <w:p>
             <w:pPr>
-              <w:spacing w:line="240" w:lineRule="auto"/>
-              <w:rPr>
-                <w:rFonts w:ascii="Garamond" w:cs="Garamond" w:eastAsia="Garamond" w:hAnsi="Garamond"/>
-                <w:sz w:val="24"/>
-                <w:szCs w:val="24"/>
-              </w:rPr>
-            </w:pPr>
-            <w:r>
-              <w:rPr>
-                <w:rFonts w:ascii="Garamond" w:cs="Garamond" w:eastAsia="Garamond" w:hAnsi="Garamond"/>
+              <w:spacing w:before="0" w:line="240" w:lineRule="auto"/>
+              <w:rPr/>
+            </w:pPr>
+            <w:r>
+              <w:rPr>
                 <w:b w:val="1"/>
                 <w:bCs w:val="1"/>
-                <w:sz w:val="24"/>
-                <w:szCs w:val="24"/>
                 <w:rtl w:val="0"/>
               </w:rPr>
               <w:t xml:space="preserve">Acknowledge</w:t>
             </w:r>
             <w:r>
               <w:rPr>
-                <w:rFonts w:ascii="Garamond" w:cs="Garamond" w:eastAsia="Garamond" w:hAnsi="Garamond"/>
-                <w:sz w:val="24"/>
-                <w:szCs w:val="24"/>
                 <w:rtl w:val="0"/>
               </w:rPr>
               <w:t xml:space="preserve"> the other’s perspective</w:t>
@@ -1125,18 +967,11 @@
           <w:tcPr/>
           <w:p>
             <w:pPr>
-              <w:spacing w:line="240" w:lineRule="auto"/>
-              <w:rPr>
-                <w:rFonts w:ascii="Garamond" w:cs="Garamond" w:eastAsia="Garamond" w:hAnsi="Garamond"/>
-                <w:sz w:val="24"/>
-                <w:szCs w:val="24"/>
-              </w:rPr>
-            </w:pPr>
-            <w:r>
-              <w:rPr>
-                <w:rFonts w:ascii="Garamond" w:cs="Garamond" w:eastAsia="Garamond" w:hAnsi="Garamond"/>
-                <w:sz w:val="24"/>
-                <w:szCs w:val="24"/>
+              <w:spacing w:before="0" w:line="240" w:lineRule="auto"/>
+              <w:rPr/>
+            </w:pPr>
+            <w:r>
+              <w:rPr>
                 <w:rtl w:val="0"/>
               </w:rPr>
               <w:t xml:space="preserve">“Leo’s point about space is fair”, “I can see why you’d read it that way”. Restating the other view accurately, and granting what is right in it, shows you have actually listened.</w:t>
@@ -1154,22 +989,16 @@
           <w:tcPr/>
           <w:p>
             <w:pPr>
-              <w:spacing w:line="240" w:lineRule="auto"/>
-              <w:rPr>
-                <w:rFonts w:ascii="Garamond" w:cs="Garamond" w:eastAsia="Garamond" w:hAnsi="Garamond"/>
+              <w:spacing w:before="0" w:line="240" w:lineRule="auto"/>
+              <w:rPr>
                 <w:b w:val="1"/>
                 <w:bCs w:val="1"/>
-                <w:sz w:val="24"/>
-                <w:szCs w:val="24"/>
-              </w:rPr>
-            </w:pPr>
-            <w:r>
-              <w:rPr>
-                <w:rFonts w:ascii="Garamond" w:cs="Garamond" w:eastAsia="Garamond" w:hAnsi="Garamond"/>
+              </w:rPr>
+            </w:pPr>
+            <w:r>
+              <w:rPr>
                 <w:b w:val="1"/>
                 <w:bCs w:val="1"/>
-                <w:sz w:val="24"/>
-                <w:szCs w:val="24"/>
                 <w:rtl w:val="0"/>
               </w:rPr>
               <w:t xml:space="preserve">R</w:t>
@@ -1180,29 +1009,19 @@
           <w:tcPr/>
           <w:p>
             <w:pPr>
-              <w:spacing w:line="240" w:lineRule="auto"/>
-              <w:rPr>
-                <w:rFonts w:ascii="Garamond" w:cs="Garamond" w:eastAsia="Garamond" w:hAnsi="Garamond"/>
-                <w:sz w:val="24"/>
-                <w:szCs w:val="24"/>
-              </w:rPr>
-            </w:pPr>
-            <w:r>
-              <w:rPr>
-                <w:rFonts w:ascii="Garamond" w:cs="Garamond" w:eastAsia="Garamond" w:hAnsi="Garamond"/>
+              <w:spacing w:before="0" w:line="240" w:lineRule="auto"/>
+              <w:rPr/>
+            </w:pPr>
+            <w:r>
+              <w:rPr>
                 <w:b w:val="1"/>
                 <w:bCs w:val="1"/>
-                <w:sz w:val="24"/>
-                <w:szCs w:val="24"/>
                 <w:rtl w:val="0"/>
               </w:rPr>
               <w:t xml:space="preserve">Reframe</w:t>
             </w:r>
             <w:r>
               <w:rPr>
-                <w:rFonts w:ascii="Garamond" w:cs="Garamond" w:eastAsia="Garamond" w:hAnsi="Garamond"/>
-                <w:sz w:val="24"/>
-                <w:szCs w:val="24"/>
                 <w:rtl w:val="0"/>
               </w:rPr>
               <w:t xml:space="preserve"> to the positive</w:t>
@@ -1213,18 +1032,11 @@
           <w:tcPr/>
           <w:p>
             <w:pPr>
-              <w:spacing w:line="240" w:lineRule="auto"/>
-              <w:rPr>
-                <w:rFonts w:ascii="Garamond" w:cs="Garamond" w:eastAsia="Garamond" w:hAnsi="Garamond"/>
-                <w:sz w:val="24"/>
-                <w:szCs w:val="24"/>
-              </w:rPr>
-            </w:pPr>
-            <w:r>
-              <w:rPr>
-                <w:rFonts w:ascii="Garamond" w:cs="Garamond" w:eastAsia="Garamond" w:hAnsi="Garamond"/>
-                <w:sz w:val="24"/>
-                <w:szCs w:val="24"/>
+              <w:spacing w:before="0" w:line="240" w:lineRule="auto"/>
+              <w:rPr/>
+            </w:pPr>
+            <w:r>
+              <w:rPr>
                 <w:rtl w:val="0"/>
               </w:rPr>
               <w:t xml:space="preserve">“What would help is…” rather than “what’s wrong is…” avoiding absolute and negative language (“never”, “obviously”, “no one seriously thinks”). Positive framing keeps the exchange open rather than closing it.</w:t>
@@ -1236,24 +1048,12 @@
     <w:p>
       <w:pPr>
         <w:pStyle w:val="Heading1"/>
-        <w:spacing w:before="400" w:line="276" w:lineRule="auto"/>
-        <w:rPr>
-          <w:rFonts w:ascii="Garamond" w:cs="Garamond" w:eastAsia="Garamond" w:hAnsi="Garamond"/>
-          <w:b w:val="0"/>
-          <w:bCs w:val="0"/>
-          <w:sz w:val="40"/>
-          <w:szCs w:val="40"/>
-        </w:rPr>
-      </w:pPr>
-      <w:bookmarkStart w:colFirst="0" w:colLast="0" w:name="_8x7u4gqrdju0" w:id="5"/>
-      <w:bookmarkEnd w:id="5"/>
-      <w:r>
-        <w:rPr>
-          <w:rFonts w:ascii="Garamond" w:cs="Garamond" w:eastAsia="Garamond" w:hAnsi="Garamond"/>
-          <w:b w:val="0"/>
-          <w:bCs w:val="0"/>
-          <w:sz w:val="40"/>
-          <w:szCs w:val="40"/>
+        <w:rPr/>
+      </w:pPr>
+      <w:bookmarkStart w:colFirst="0" w:colLast="0" w:name="_8x7u4gqrdju0" w:id="6"/>
+      <w:bookmarkEnd w:id="6"/>
+      <w:r>
+        <w:rPr>
           <w:rtl w:val="0"/>
         </w:rPr>
         <w:t xml:space="preserve">3. The Game </w:t>
@@ -1261,18 +1061,10 @@
     </w:p>
     <w:p>
       <w:pPr>
-        <w:spacing w:before="200" w:line="276" w:lineRule="auto"/>
-        <w:rPr>
-          <w:rFonts w:ascii="Garamond" w:cs="Garamond" w:eastAsia="Garamond" w:hAnsi="Garamond"/>
-          <w:sz w:val="24"/>
-          <w:szCs w:val="24"/>
-        </w:rPr>
-      </w:pPr>
-      <w:r>
-        <w:rPr>
-          <w:rFonts w:ascii="Garamond" w:cs="Garamond" w:eastAsia="Garamond" w:hAnsi="Garamond"/>
-          <w:sz w:val="24"/>
-          <w:szCs w:val="24"/>
+        <w:rPr/>
+      </w:pPr>
+      <w:r>
+        <w:rPr>
           <w:rtl w:val="0"/>
         </w:rPr>
         <w:t xml:space="preserve">The game revolves around a mystery and so the game begins with a brief introduction of the game and then jumping right into the presentation of the mystery with the Hook. </w:t>
@@ -1281,24 +1073,12 @@
     <w:p>
       <w:pPr>
         <w:pStyle w:val="Heading2"/>
-        <w:spacing w:after="120" w:line="276" w:lineRule="auto"/>
-        <w:rPr>
-          <w:rFonts w:ascii="Garamond" w:cs="Garamond" w:eastAsia="Garamond" w:hAnsi="Garamond"/>
-          <w:b w:val="0"/>
-          <w:bCs w:val="0"/>
-          <w:sz w:val="32"/>
-          <w:szCs w:val="32"/>
-        </w:rPr>
-      </w:pPr>
-      <w:bookmarkStart w:colFirst="0" w:colLast="0" w:name="_h6c12zbk9cf" w:id="6"/>
-      <w:bookmarkEnd w:id="6"/>
-      <w:r>
-        <w:rPr>
-          <w:rFonts w:ascii="Garamond" w:cs="Garamond" w:eastAsia="Garamond" w:hAnsi="Garamond"/>
-          <w:b w:val="0"/>
-          <w:bCs w:val="0"/>
-          <w:sz w:val="32"/>
-          <w:szCs w:val="32"/>
+        <w:rPr/>
+      </w:pPr>
+      <w:bookmarkStart w:colFirst="0" w:colLast="0" w:name="_h6c12zbk9cf" w:id="7"/>
+      <w:bookmarkEnd w:id="7"/>
+      <w:r>
+        <w:rPr>
           <w:rtl w:val="0"/>
         </w:rPr>
         <w:t xml:space="preserve">3.1 Introduction </w:t>
@@ -1306,18 +1086,10 @@
     </w:p>
     <w:p>
       <w:pPr>
-        <w:spacing w:before="200" w:line="276" w:lineRule="auto"/>
-        <w:rPr>
-          <w:rFonts w:ascii="Garamond" w:cs="Garamond" w:eastAsia="Garamond" w:hAnsi="Garamond"/>
-          <w:sz w:val="24"/>
-          <w:szCs w:val="24"/>
-        </w:rPr>
-      </w:pPr>
-      <w:r>
-        <w:rPr>
-          <w:rFonts w:ascii="Garamond" w:cs="Garamond" w:eastAsia="Garamond" w:hAnsi="Garamond"/>
-          <w:sz w:val="24"/>
-          <w:szCs w:val="24"/>
+        <w:rPr/>
+      </w:pPr>
+      <w:r>
+        <w:rPr>
           <w:rtl w:val="0"/>
         </w:rPr>
         <w:t xml:space="preserve">In the introduction players are told that they are playing a mystery game while also practicing the HEAR framework. The game is designed to follow a module or a class where students have studied the HEAR framework, and conversational receptiveness more generally, in greater detail and so the introduction presents the framework briefly. A slide with a quick summary of the HEAR framework should be available for players throughout the game so they can review the material at any time. </w:t>
@@ -1325,18 +1097,10 @@
     </w:p>
     <w:p>
       <w:pPr>
-        <w:spacing w:before="200" w:line="276" w:lineRule="auto"/>
-        <w:rPr>
-          <w:rFonts w:ascii="Garamond" w:cs="Garamond" w:eastAsia="Garamond" w:hAnsi="Garamond"/>
-          <w:sz w:val="24"/>
-          <w:szCs w:val="24"/>
-        </w:rPr>
-      </w:pPr>
-      <w:r>
-        <w:rPr>
-          <w:rFonts w:ascii="Garamond" w:cs="Garamond" w:eastAsia="Garamond" w:hAnsi="Garamond"/>
-          <w:sz w:val="24"/>
-          <w:szCs w:val="24"/>
+        <w:rPr/>
+      </w:pPr>
+      <w:r>
+        <w:rPr>
           <w:rtl w:val="0"/>
         </w:rPr>
         <w:t xml:space="preserve">The introduction explains the rules of the game:</w:t>
@@ -1348,37 +1112,23 @@
           <w:ilvl w:val="0"/>
           <w:numId w:val="3"/>
         </w:numPr>
-        <w:spacing w:after="0" w:afterAutospacing="0" w:before="200" w:line="276" w:lineRule="auto"/>
+        <w:spacing w:after="0" w:afterAutospacing="0"/>
         <w:ind w:left="720" w:hanging="360"/>
-        <w:rPr>
-          <w:rFonts w:ascii="Garamond" w:cs="Garamond" w:eastAsia="Garamond" w:hAnsi="Garamond"/>
-          <w:sz w:val="24"/>
-          <w:szCs w:val="24"/>
-        </w:rPr>
-      </w:pPr>
-      <w:r>
-        <w:rPr>
-          <w:rFonts w:ascii="Garamond" w:cs="Garamond" w:eastAsia="Garamond" w:hAnsi="Garamond"/>
-          <w:sz w:val="24"/>
-          <w:szCs w:val="24"/>
+      </w:pPr>
+      <w:r>
+        <w:rPr>
           <w:rtl w:val="0"/>
         </w:rPr>
         <w:t xml:space="preserve">The goal of the game is to solve the mystery. At the end players will be asked to make a guess which addresses the central puzzle of the mystery. This may include identifying a culprit, if there is one, a motive or a reasoning, and the method.</w:t>
       </w:r>
       <w:r>
         <w:rPr>
-          <w:rFonts w:ascii="Garamond" w:cs="Garamond" w:eastAsia="Garamond" w:hAnsi="Garamond"/>
-          <w:sz w:val="24"/>
-          <w:szCs w:val="24"/>
           <w:vertAlign w:val="superscript"/>
         </w:rPr>
         <w:footnoteReference w:customMarkFollows="0" w:id="3"/>
       </w:r>
       <w:r>
         <w:rPr>
-          <w:rFonts w:ascii="Garamond" w:cs="Garamond" w:eastAsia="Garamond" w:hAnsi="Garamond"/>
-          <w:sz w:val="24"/>
-          <w:szCs w:val="24"/>
           <w:rtl w:val="0"/>
         </w:rPr>
         <w:t xml:space="preserve"> </w:t>
@@ -1390,19 +1140,11 @@
           <w:ilvl w:val="1"/>
           <w:numId w:val="3"/>
         </w:numPr>
-        <w:spacing w:after="0" w:afterAutospacing="0" w:before="0" w:beforeAutospacing="0" w:line="276" w:lineRule="auto"/>
+        <w:spacing w:after="0" w:afterAutospacing="0" w:before="0" w:beforeAutospacing="0"/>
         <w:ind w:left="1440" w:hanging="360"/>
-        <w:rPr>
-          <w:rFonts w:ascii="Garamond" w:cs="Garamond" w:eastAsia="Garamond" w:hAnsi="Garamond"/>
-          <w:sz w:val="24"/>
-          <w:szCs w:val="24"/>
-        </w:rPr>
-      </w:pPr>
-      <w:r>
-        <w:rPr>
-          <w:rFonts w:ascii="Garamond" w:cs="Garamond" w:eastAsia="Garamond" w:hAnsi="Garamond"/>
-          <w:sz w:val="24"/>
-          <w:szCs w:val="24"/>
+      </w:pPr>
+      <w:r>
+        <w:rPr>
           <w:rtl w:val="0"/>
         </w:rPr>
         <w:t xml:space="preserve">As a general rule, each of the witnesses should have a reasonable </w:t>
@@ -1414,19 +1156,11 @@
           <w:ilvl w:val="0"/>
           <w:numId w:val="3"/>
         </w:numPr>
-        <w:spacing w:after="0" w:afterAutospacing="0" w:before="0" w:beforeAutospacing="0" w:line="276" w:lineRule="auto"/>
+        <w:spacing w:after="0" w:afterAutospacing="0" w:before="0" w:beforeAutospacing="0"/>
         <w:ind w:left="720" w:hanging="360"/>
-        <w:rPr>
-          <w:rFonts w:ascii="Garamond" w:cs="Garamond" w:eastAsia="Garamond" w:hAnsi="Garamond"/>
-          <w:sz w:val="24"/>
-          <w:szCs w:val="24"/>
-        </w:rPr>
-      </w:pPr>
-      <w:r>
-        <w:rPr>
-          <w:rFonts w:ascii="Garamond" w:cs="Garamond" w:eastAsia="Garamond" w:hAnsi="Garamond"/>
-          <w:sz w:val="24"/>
-          <w:szCs w:val="24"/>
+      </w:pPr>
+      <w:r>
+        <w:rPr>
           <w:rtl w:val="0"/>
         </w:rPr>
         <w:t xml:space="preserve">The bulk of the game is made of students interviewing witnesses. The interview process is made of a series of questions. There are 8 witnesses and each can be asked a variant of 8 questions.</w:t>
@@ -1438,19 +1172,11 @@
           <w:ilvl w:val="0"/>
           <w:numId w:val="3"/>
         </w:numPr>
-        <w:spacing w:after="0" w:afterAutospacing="0" w:before="0" w:beforeAutospacing="0" w:line="276" w:lineRule="auto"/>
+        <w:spacing w:after="0" w:afterAutospacing="0" w:before="0" w:beforeAutospacing="0"/>
         <w:ind w:left="720" w:hanging="360"/>
-        <w:rPr>
-          <w:rFonts w:ascii="Garamond" w:cs="Garamond" w:eastAsia="Garamond" w:hAnsi="Garamond"/>
-          <w:sz w:val="24"/>
-          <w:szCs w:val="24"/>
-        </w:rPr>
-      </w:pPr>
-      <w:r>
-        <w:rPr>
-          <w:rFonts w:ascii="Garamond" w:cs="Garamond" w:eastAsia="Garamond" w:hAnsi="Garamond"/>
-          <w:sz w:val="24"/>
-          <w:szCs w:val="24"/>
+      </w:pPr>
+      <w:r>
+        <w:rPr>
           <w:rtl w:val="0"/>
         </w:rPr>
         <w:t xml:space="preserve">Students have a total ‘budget’ of </w:t>
@@ -1462,9 +1188,6 @@
       </w:r>
       <w:r>
         <w:rPr>
-          <w:rFonts w:ascii="Garamond" w:cs="Garamond" w:eastAsia="Garamond" w:hAnsi="Garamond"/>
-          <w:sz w:val="24"/>
-          <w:szCs w:val="24"/>
           <w:rtl w:val="0"/>
         </w:rPr>
         <w:t xml:space="preserve">30</w:t>
@@ -1474,9 +1197,6 @@
       </w:r>
       <w:r>
         <w:rPr>
-          <w:rFonts w:ascii="Garamond" w:cs="Garamond" w:eastAsia="Garamond" w:hAnsi="Garamond"/>
-          <w:sz w:val="24"/>
-          <w:szCs w:val="24"/>
           <w:rtl w:val="0"/>
         </w:rPr>
         <w:t xml:space="preserve"> questions that they can spread out across the witnesses however they want. Visiting a question that was asked before does not cost another question. Once they ask all their questions, or at any time before that if they like, they may make a guess and attempt to solve the mystery. Players have three chances to make a correct guess. If a player makes the wrong guess, they are told only that their guess is wrong, not which part, and they may keep investigating if they have questions left. Players gain more points if they guess correctly on their first try. </w:t>
@@ -1488,57 +1208,37 @@
           <w:ilvl w:val="0"/>
           <w:numId w:val="3"/>
         </w:numPr>
-        <w:spacing w:after="0" w:afterAutospacing="0" w:before="0" w:beforeAutospacing="0" w:line="276" w:lineRule="auto"/>
+        <w:spacing w:after="0" w:afterAutospacing="0" w:before="0" w:beforeAutospacing="0"/>
         <w:ind w:left="720" w:hanging="360"/>
-        <w:rPr>
-          <w:rFonts w:ascii="Garamond" w:cs="Garamond" w:eastAsia="Garamond" w:hAnsi="Garamond"/>
-          <w:sz w:val="24"/>
-          <w:szCs w:val="24"/>
-        </w:rPr>
-      </w:pPr>
-      <w:r>
-        <w:rPr>
-          <w:rFonts w:ascii="Garamond" w:cs="Garamond" w:eastAsia="Garamond" w:hAnsi="Garamond"/>
-          <w:sz w:val="24"/>
-          <w:szCs w:val="24"/>
+      </w:pPr>
+      <w:r>
+        <w:rPr>
           <w:rtl w:val="0"/>
         </w:rPr>
         <w:t xml:space="preserve"> For each witness, one question is a </w:t>
       </w:r>
       <w:r>
         <w:rPr>
-          <w:rFonts w:ascii="Garamond" w:cs="Garamond" w:eastAsia="Garamond" w:hAnsi="Garamond"/>
           <w:b w:val="1"/>
           <w:bCs w:val="1"/>
-          <w:sz w:val="24"/>
-          <w:szCs w:val="24"/>
           <w:rtl w:val="0"/>
         </w:rPr>
         <w:t xml:space="preserve">tripwire</w:t>
       </w:r>
       <w:r>
         <w:rPr>
-          <w:rFonts w:ascii="Garamond" w:cs="Garamond" w:eastAsia="Garamond" w:hAnsi="Garamond"/>
-          <w:sz w:val="24"/>
-          <w:szCs w:val="24"/>
           <w:rtl w:val="0"/>
         </w:rPr>
         <w:t xml:space="preserve">: it offends or annoys them such that they walk away and the interview ends abruptly. There is no asking any more questions of a witness who was </w:t>
       </w:r>
       <w:r>
         <w:rPr>
-          <w:rFonts w:ascii="Garamond" w:cs="Garamond" w:eastAsia="Garamond" w:hAnsi="Garamond"/>
-          <w:sz w:val="24"/>
-          <w:szCs w:val="24"/>
           <w:rtl w:val="0"/>
         </w:rPr>
         <w:t xml:space="preserve">asked a tripwire</w:t>
       </w:r>
       <w:r>
         <w:rPr>
-          <w:rFonts w:ascii="Garamond" w:cs="Garamond" w:eastAsia="Garamond" w:hAnsi="Garamond"/>
-          <w:sz w:val="24"/>
-          <w:szCs w:val="24"/>
           <w:rtl w:val="0"/>
         </w:rPr>
         <w:t xml:space="preserve">.</w:t>
@@ -1550,37 +1250,23 @@
           <w:ilvl w:val="0"/>
           <w:numId w:val="3"/>
         </w:numPr>
-        <w:spacing w:after="0" w:afterAutospacing="0" w:before="0" w:beforeAutospacing="0" w:line="276" w:lineRule="auto"/>
+        <w:spacing w:after="0" w:afterAutospacing="0" w:before="0" w:beforeAutospacing="0"/>
         <w:ind w:left="720" w:hanging="360"/>
-        <w:rPr>
-          <w:rFonts w:ascii="Garamond" w:cs="Garamond" w:eastAsia="Garamond" w:hAnsi="Garamond"/>
-          <w:sz w:val="24"/>
-          <w:szCs w:val="24"/>
-        </w:rPr>
-      </w:pPr>
-      <w:r>
-        <w:rPr>
-          <w:rFonts w:ascii="Garamond" w:cs="Garamond" w:eastAsia="Garamond" w:hAnsi="Garamond"/>
-          <w:sz w:val="24"/>
-          <w:szCs w:val="24"/>
+      </w:pPr>
+      <w:r>
+        <w:rPr>
           <w:rtl w:val="0"/>
         </w:rPr>
         <w:t xml:space="preserve"> With each witness, players have a chance to do a follow-up. They may do so after any answer the witness gave them (i.e. for all questions except the tripwire). To follow-up students will have to choose one of </w:t>
       </w:r>
       <w:r>
         <w:rPr>
-          <w:rFonts w:ascii="Garamond" w:cs="Garamond" w:eastAsia="Garamond" w:hAnsi="Garamond"/>
-          <w:sz w:val="24"/>
-          <w:szCs w:val="24"/>
           <w:rtl w:val="0"/>
         </w:rPr>
         <w:t xml:space="preserve">two phrasings</w:t>
       </w:r>
       <w:r>
         <w:rPr>
-          <w:rFonts w:ascii="Garamond" w:cs="Garamond" w:eastAsia="Garamond" w:hAnsi="Garamond"/>
-          <w:sz w:val="24"/>
-          <w:szCs w:val="24"/>
           <w:rtl w:val="0"/>
         </w:rPr>
         <w:t xml:space="preserve"> of a follow-up question or comment regarding the witness’s view on the CCC. If they pick correctly, they gain a Major Clue which helps them solve the mystery faster. If they pick incorrectly, the witness storms off angrily (just like they would with a tripwire).</w:t>
@@ -1592,19 +1278,11 @@
           <w:ilvl w:val="0"/>
           <w:numId w:val="3"/>
         </w:numPr>
-        <w:spacing w:after="0" w:afterAutospacing="0" w:before="0" w:beforeAutospacing="0" w:line="276" w:lineRule="auto"/>
+        <w:spacing w:after="0" w:afterAutospacing="0" w:before="0" w:beforeAutospacing="0"/>
         <w:ind w:left="720" w:hanging="360"/>
-        <w:rPr>
-          <w:rFonts w:ascii="Garamond" w:cs="Garamond" w:eastAsia="Garamond" w:hAnsi="Garamond"/>
-          <w:sz w:val="24"/>
-          <w:szCs w:val="24"/>
-        </w:rPr>
-      </w:pPr>
-      <w:r>
-        <w:rPr>
-          <w:rFonts w:ascii="Garamond" w:cs="Garamond" w:eastAsia="Garamond" w:hAnsi="Garamond"/>
-          <w:sz w:val="24"/>
-          <w:szCs w:val="24"/>
+      </w:pPr>
+      <w:r>
+        <w:rPr>
           <w:rtl w:val="0"/>
         </w:rPr>
         <w:t xml:space="preserve">The choice between the two options should present a temptation to answer the question with the ‘wrong’ answer. The emotional stakes in the case and the way in which the follow-up questions are phrased should provide some emotional satisfaction. </w:t>
@@ -1616,19 +1294,11 @@
           <w:ilvl w:val="0"/>
           <w:numId w:val="3"/>
         </w:numPr>
-        <w:spacing w:before="0" w:beforeAutospacing="0" w:line="276" w:lineRule="auto"/>
+        <w:spacing w:before="0" w:beforeAutospacing="0"/>
         <w:ind w:left="720" w:hanging="360"/>
-        <w:rPr>
-          <w:rFonts w:ascii="Garamond" w:cs="Garamond" w:eastAsia="Garamond" w:hAnsi="Garamond"/>
-          <w:sz w:val="24"/>
-          <w:szCs w:val="24"/>
-        </w:rPr>
-      </w:pPr>
-      <w:r>
-        <w:rPr>
-          <w:rFonts w:ascii="Garamond" w:cs="Garamond" w:eastAsia="Garamond" w:hAnsi="Garamond"/>
-          <w:sz w:val="24"/>
-          <w:szCs w:val="24"/>
+      </w:pPr>
+      <w:r>
+        <w:rPr>
           <w:rtl w:val="0"/>
         </w:rPr>
         <w:t xml:space="preserve">Witnesses themselves vary in their receptiveness. It would pay to pay attention to which of these witnesses is more or less receptive. </w:t>
@@ -1641,18 +1311,10 @@
     </w:p>
     <w:p>
       <w:pPr>
-        <w:spacing w:before="200" w:line="276" w:lineRule="auto"/>
-        <w:rPr>
-          <w:rFonts w:ascii="Garamond" w:cs="Garamond" w:eastAsia="Garamond" w:hAnsi="Garamond"/>
-          <w:sz w:val="24"/>
-          <w:szCs w:val="24"/>
-        </w:rPr>
-      </w:pPr>
-      <w:r>
-        <w:rPr>
-          <w:rFonts w:ascii="Garamond" w:cs="Garamond" w:eastAsia="Garamond" w:hAnsi="Garamond"/>
-          <w:sz w:val="24"/>
-          <w:szCs w:val="24"/>
+        <w:rPr/>
+      </w:pPr>
+      <w:r>
+        <w:rPr>
           <w:rtl w:val="0"/>
         </w:rPr>
         <w:t xml:space="preserve">A slide with these rules should be available for players throughout the game so they can refresh their memories if they need to. </w:t>
@@ -1661,24 +1323,12 @@
     <w:p>
       <w:pPr>
         <w:pStyle w:val="Heading2"/>
-        <w:spacing w:after="120" w:line="276" w:lineRule="auto"/>
-        <w:rPr>
-          <w:rFonts w:ascii="Garamond" w:cs="Garamond" w:eastAsia="Garamond" w:hAnsi="Garamond"/>
-          <w:b w:val="0"/>
-          <w:bCs w:val="0"/>
-          <w:sz w:val="32"/>
-          <w:szCs w:val="32"/>
-        </w:rPr>
-      </w:pPr>
-      <w:bookmarkStart w:colFirst="0" w:colLast="0" w:name="_35qvn8hk7yak" w:id="7"/>
-      <w:bookmarkEnd w:id="7"/>
-      <w:r>
-        <w:rPr>
-          <w:rFonts w:ascii="Garamond" w:cs="Garamond" w:eastAsia="Garamond" w:hAnsi="Garamond"/>
-          <w:b w:val="0"/>
-          <w:bCs w:val="0"/>
-          <w:sz w:val="32"/>
-          <w:szCs w:val="32"/>
+        <w:rPr/>
+      </w:pPr>
+      <w:bookmarkStart w:colFirst="0" w:colLast="0" w:name="_35qvn8hk7yak" w:id="8"/>
+      <w:bookmarkEnd w:id="8"/>
+      <w:r>
+        <w:rPr>
           <w:rtl w:val="0"/>
         </w:rPr>
         <w:t xml:space="preserve">3.2 The Hook</w:t>
@@ -1686,78 +1336,52 @@
     </w:p>
     <w:p>
       <w:pPr>
-        <w:spacing w:before="200" w:line="276" w:lineRule="auto"/>
-        <w:rPr>
-          <w:rFonts w:ascii="Garamond" w:cs="Garamond" w:eastAsia="Garamond" w:hAnsi="Garamond"/>
-          <w:sz w:val="24"/>
-          <w:szCs w:val="24"/>
-        </w:rPr>
-      </w:pPr>
-      <w:r>
-        <w:rPr>
-          <w:rFonts w:ascii="Garamond" w:cs="Garamond" w:eastAsia="Garamond" w:hAnsi="Garamond"/>
-          <w:sz w:val="24"/>
-          <w:szCs w:val="24"/>
+        <w:rPr/>
+      </w:pPr>
+      <w:r>
+        <w:rPr>
           <w:rtl w:val="0"/>
         </w:rPr>
         <w:t xml:space="preserve">After the introduction, players are introduced to the mystery by way of </w:t>
       </w:r>
       <w:r>
         <w:rPr>
-          <w:rFonts w:ascii="Garamond" w:cs="Garamond" w:eastAsia="Garamond" w:hAnsi="Garamond"/>
           <w:i w:val="1"/>
           <w:iCs w:val="1"/>
-          <w:sz w:val="24"/>
-          <w:szCs w:val="24"/>
           <w:rtl w:val="0"/>
         </w:rPr>
         <w:t xml:space="preserve">the hook</w:t>
       </w:r>
       <w:r>
         <w:rPr>
-          <w:rFonts w:ascii="Garamond" w:cs="Garamond" w:eastAsia="Garamond" w:hAnsi="Garamond"/>
-          <w:sz w:val="24"/>
-          <w:szCs w:val="24"/>
           <w:rtl w:val="0"/>
         </w:rPr>
         <w:t xml:space="preserve">: a piece of the narrative that presents the CCC, introduces the mystery </w:t>
       </w:r>
       <w:r>
         <w:rPr>
-          <w:rFonts w:ascii="Garamond" w:cs="Garamond" w:eastAsia="Garamond" w:hAnsi="Garamond"/>
           <w:i w:val="1"/>
           <w:iCs w:val="1"/>
-          <w:sz w:val="24"/>
-          <w:szCs w:val="24"/>
           <w:rtl w:val="0"/>
         </w:rPr>
         <w:t xml:space="preserve">and</w:t>
       </w:r>
       <w:r>
         <w:rPr>
-          <w:rFonts w:ascii="Garamond" w:cs="Garamond" w:eastAsia="Garamond" w:hAnsi="Garamond"/>
-          <w:sz w:val="24"/>
-          <w:szCs w:val="24"/>
           <w:rtl w:val="0"/>
         </w:rPr>
         <w:t xml:space="preserve"> situates the players within. For example, in </w:t>
       </w:r>
       <w:r>
         <w:rPr>
-          <w:rFonts w:ascii="Garamond" w:cs="Garamond" w:eastAsia="Garamond" w:hAnsi="Garamond"/>
           <w:i w:val="1"/>
           <w:iCs w:val="1"/>
-          <w:sz w:val="24"/>
-          <w:szCs w:val="24"/>
           <w:rtl w:val="0"/>
         </w:rPr>
         <w:t xml:space="preserve">The Commons’ Comma</w:t>
       </w:r>
       <w:r>
         <w:rPr>
-          <w:rFonts w:ascii="Garamond" w:cs="Garamond" w:eastAsia="Garamond" w:hAnsi="Garamond"/>
-          <w:sz w:val="24"/>
-          <w:szCs w:val="24"/>
           <w:rtl w:val="0"/>
         </w:rPr>
         <w:t xml:space="preserve"> players are student-interns working at the university president office and are tasked with solving their mystery as a task for a part time job they thought would be mostly scanning papers or organizing kitchenette cabinets.</w:t>
@@ -1765,18 +1389,10 @@
     </w:p>
     <w:p>
       <w:pPr>
-        <w:spacing w:before="200" w:line="276" w:lineRule="auto"/>
-        <w:rPr>
-          <w:rFonts w:ascii="Garamond" w:cs="Garamond" w:eastAsia="Garamond" w:hAnsi="Garamond"/>
-          <w:sz w:val="24"/>
-          <w:szCs w:val="24"/>
-        </w:rPr>
-      </w:pPr>
-      <w:r>
-        <w:rPr>
-          <w:rFonts w:ascii="Garamond" w:cs="Garamond" w:eastAsia="Garamond" w:hAnsi="Garamond"/>
-          <w:sz w:val="24"/>
-          <w:szCs w:val="24"/>
+        <w:rPr/>
+      </w:pPr>
+      <w:r>
+        <w:rPr>
           <w:rtl w:val="0"/>
         </w:rPr>
         <w:t xml:space="preserve">The hook should be carefully crafted to be both informative and entertaining, to give the players enough to go off of (there are no other opportunities for big chunks of exposition) as well as something interesting to pull them in and motivate them to be involved. The hook should also include a compelling time pressure which explains why there’s a limited number of questions that the players can ask before… well before something bad happens, but which bad thing, that is told during the hook. </w:t>
@@ -1785,24 +1401,12 @@
     <w:p>
       <w:pPr>
         <w:pStyle w:val="Heading2"/>
-        <w:spacing w:after="120" w:line="276" w:lineRule="auto"/>
-        <w:rPr>
-          <w:rFonts w:ascii="Garamond" w:cs="Garamond" w:eastAsia="Garamond" w:hAnsi="Garamond"/>
-          <w:b w:val="0"/>
-          <w:bCs w:val="0"/>
-          <w:sz w:val="32"/>
-          <w:szCs w:val="32"/>
-        </w:rPr>
-      </w:pPr>
-      <w:bookmarkStart w:colFirst="0" w:colLast="0" w:name="_j7v1h2yirc0i" w:id="8"/>
-      <w:bookmarkEnd w:id="8"/>
-      <w:r>
-        <w:rPr>
-          <w:rFonts w:ascii="Garamond" w:cs="Garamond" w:eastAsia="Garamond" w:hAnsi="Garamond"/>
-          <w:b w:val="0"/>
-          <w:bCs w:val="0"/>
-          <w:sz w:val="32"/>
-          <w:szCs w:val="32"/>
+        <w:rPr/>
+      </w:pPr>
+      <w:bookmarkStart w:colFirst="0" w:colLast="0" w:name="_j7v1h2yirc0i" w:id="9"/>
+      <w:bookmarkEnd w:id="9"/>
+      <w:r>
+        <w:rPr>
           <w:rtl w:val="0"/>
         </w:rPr>
         <w:t xml:space="preserve">3.3 Interviews</w:t>
@@ -1810,18 +1414,10 @@
     </w:p>
     <w:p>
       <w:pPr>
-        <w:spacing w:before="200" w:line="276" w:lineRule="auto"/>
-        <w:rPr>
-          <w:rFonts w:ascii="Garamond" w:cs="Garamond" w:eastAsia="Garamond" w:hAnsi="Garamond"/>
-          <w:sz w:val="24"/>
-          <w:szCs w:val="24"/>
-        </w:rPr>
-      </w:pPr>
-      <w:r>
-        <w:rPr>
-          <w:rFonts w:ascii="Garamond" w:cs="Garamond" w:eastAsia="Garamond" w:hAnsi="Garamond"/>
-          <w:sz w:val="24"/>
-          <w:szCs w:val="24"/>
+        <w:rPr/>
+      </w:pPr>
+      <w:r>
+        <w:rPr>
           <w:rtl w:val="0"/>
         </w:rPr>
         <w:t xml:space="preserve">As noted, the bulk of the game is made of interviews. Students will have a menu of options, each corresponding to a witness they can interview. Students can then ‘walk around’ the campus - going from witness to witness and asking each of them as many questions as they want, provided they have not yet run out of time (i.e. depleted their question ‘budget’) or angered that witness. There are 8 witnesses and each can be asked 8 questions. Since one question for each witness is a tripwire, that leaves us with 56 witness answers. Each one of these 56 answers is made of two parts.  </w:t>
@@ -1829,69 +1425,46 @@
     </w:p>
     <w:p>
       <w:pPr>
-        <w:spacing w:before="200" w:line="276" w:lineRule="auto"/>
-        <w:rPr>
-          <w:rFonts w:ascii="Garamond" w:cs="Garamond" w:eastAsia="Garamond" w:hAnsi="Garamond"/>
-          <w:sz w:val="24"/>
-          <w:szCs w:val="24"/>
-        </w:rPr>
-      </w:pPr>
-      <w:r>
-        <w:rPr>
-          <w:rFonts w:ascii="Garamond" w:cs="Garamond" w:eastAsia="Garamond" w:hAnsi="Garamond"/>
+        <w:rPr/>
+      </w:pPr>
+      <w:r>
+        <w:rPr>
           <w:b w:val="1"/>
           <w:bCs w:val="1"/>
-          <w:sz w:val="24"/>
-          <w:szCs w:val="24"/>
           <w:rtl w:val="0"/>
         </w:rPr>
         <w:t xml:space="preserve">A piece of information</w:t>
       </w:r>
       <w:r>
         <w:rPr>
-          <w:rFonts w:ascii="Garamond" w:cs="Garamond" w:eastAsia="Garamond" w:hAnsi="Garamond"/>
-          <w:sz w:val="24"/>
-          <w:szCs w:val="24"/>
           <w:rtl w:val="0"/>
         </w:rPr>
         <w:t xml:space="preserve"> about the mystery. Of the seven non-tripwire answers of each witness, 4 convey useful information, which technically will be referred to as </w:t>
       </w:r>
       <w:r>
         <w:rPr>
-          <w:rFonts w:ascii="Garamond" w:cs="Garamond" w:eastAsia="Garamond" w:hAnsi="Garamond"/>
           <w:i w:val="1"/>
           <w:iCs w:val="1"/>
-          <w:sz w:val="24"/>
-          <w:szCs w:val="24"/>
           <w:rtl w:val="0"/>
         </w:rPr>
         <w:t xml:space="preserve">Clues</w:t>
       </w:r>
       <w:r>
         <w:rPr>
-          <w:rFonts w:ascii="Garamond" w:cs="Garamond" w:eastAsia="Garamond" w:hAnsi="Garamond"/>
-          <w:sz w:val="24"/>
-          <w:szCs w:val="24"/>
           <w:rtl w:val="0"/>
         </w:rPr>
         <w:t xml:space="preserve">, and 3 pieces of misleading or unhelpful information, which technically will be referred to as </w:t>
       </w:r>
       <w:r>
         <w:rPr>
-          <w:rFonts w:ascii="Garamond" w:cs="Garamond" w:eastAsia="Garamond" w:hAnsi="Garamond"/>
           <w:i w:val="1"/>
           <w:iCs w:val="1"/>
-          <w:sz w:val="24"/>
-          <w:szCs w:val="24"/>
           <w:rtl w:val="0"/>
         </w:rPr>
         <w:t xml:space="preserve">Red Herrings,</w:t>
       </w:r>
       <w:r>
         <w:rPr>
-          <w:rFonts w:ascii="Garamond" w:cs="Garamond" w:eastAsia="Garamond" w:hAnsi="Garamond"/>
-          <w:sz w:val="24"/>
-          <w:szCs w:val="24"/>
           <w:rtl w:val="0"/>
         </w:rPr>
         <w:t xml:space="preserve"> Across eight witnesses that is 32 useful answers and 24 red herrings.</w:t>
@@ -1903,39 +1476,25 @@
           <w:ilvl w:val="0"/>
           <w:numId w:val="8"/>
         </w:numPr>
-        <w:spacing w:after="0" w:afterAutospacing="0" w:before="200" w:line="276" w:lineRule="auto"/>
+        <w:spacing w:after="0" w:afterAutospacing="0"/>
         <w:ind w:left="720" w:hanging="360"/>
-        <w:rPr>
-          <w:rFonts w:ascii="Garamond" w:cs="Garamond" w:eastAsia="Garamond" w:hAnsi="Garamond"/>
-          <w:sz w:val="24"/>
-          <w:szCs w:val="24"/>
-        </w:rPr>
-      </w:pPr>
-      <w:r>
-        <w:rPr>
-          <w:rFonts w:ascii="Garamond" w:cs="Garamond" w:eastAsia="Garamond" w:hAnsi="Garamond"/>
-          <w:sz w:val="24"/>
-          <w:szCs w:val="24"/>
+      </w:pPr>
+      <w:r>
+        <w:rPr>
           <w:rtl w:val="0"/>
         </w:rPr>
         <w:t xml:space="preserve">The 32 useful answers include </w:t>
       </w:r>
       <w:r>
         <w:rPr>
-          <w:rFonts w:ascii="Garamond" w:cs="Garamond" w:eastAsia="Garamond" w:hAnsi="Garamond"/>
           <w:b w:val="1"/>
           <w:bCs w:val="1"/>
-          <w:sz w:val="24"/>
-          <w:szCs w:val="24"/>
           <w:rtl w:val="0"/>
         </w:rPr>
         <w:t xml:space="preserve">16 Clues</w:t>
       </w:r>
       <w:r>
         <w:rPr>
-          <w:rFonts w:ascii="Garamond" w:cs="Garamond" w:eastAsia="Garamond" w:hAnsi="Garamond"/>
-          <w:sz w:val="24"/>
-          <w:szCs w:val="24"/>
           <w:rtl w:val="0"/>
         </w:rPr>
         <w:t xml:space="preserve">, each given by two different witnesses. This gives the player more than one route to access each clue as well as an (imperfect) signal regarding the reliability of the information.</w:t>
@@ -1947,57 +1506,37 @@
           <w:ilvl w:val="0"/>
           <w:numId w:val="8"/>
         </w:numPr>
-        <w:spacing w:after="0" w:afterAutospacing="0" w:before="0" w:beforeAutospacing="0" w:line="276" w:lineRule="auto"/>
+        <w:spacing w:after="0" w:afterAutospacing="0" w:before="0" w:beforeAutospacing="0"/>
         <w:ind w:left="720" w:hanging="360"/>
-        <w:rPr>
-          <w:rFonts w:ascii="Garamond" w:cs="Garamond" w:eastAsia="Garamond" w:hAnsi="Garamond"/>
-          <w:sz w:val="24"/>
-          <w:szCs w:val="24"/>
-        </w:rPr>
-      </w:pPr>
-      <w:r>
-        <w:rPr>
-          <w:rFonts w:ascii="Garamond" w:cs="Garamond" w:eastAsia="Garamond" w:hAnsi="Garamond"/>
-          <w:sz w:val="24"/>
-          <w:szCs w:val="24"/>
+      </w:pPr>
+      <w:r>
+        <w:rPr>
           <w:rtl w:val="0"/>
         </w:rPr>
         <w:t xml:space="preserve">The </w:t>
       </w:r>
       <w:r>
         <w:rPr>
-          <w:rFonts w:ascii="Garamond" w:cs="Garamond" w:eastAsia="Garamond" w:hAnsi="Garamond"/>
           <w:b w:val="1"/>
           <w:bCs w:val="1"/>
-          <w:sz w:val="24"/>
-          <w:szCs w:val="24"/>
           <w:rtl w:val="0"/>
         </w:rPr>
         <w:t xml:space="preserve">24 Red Herrings</w:t>
       </w:r>
       <w:r>
         <w:rPr>
-          <w:rFonts w:ascii="Garamond" w:cs="Garamond" w:eastAsia="Garamond" w:hAnsi="Garamond"/>
-          <w:sz w:val="24"/>
-          <w:szCs w:val="24"/>
           <w:rtl w:val="0"/>
         </w:rPr>
         <w:t xml:space="preserve"> are each given once and they are grouped in sets (of 2/3/4) such that the Red Herrings that form a set 'cancel each other out,' so if you have all members of a set you should be able to deduce that neither of them are relevant to the case. For example, a set of Red Herrings may include descriptions of suspicious-but-not-actually-incriminating behaviors by one of the suspects as well as some exonerating information about that suspect. Taken on their own, the suspicious behaviors may seem pertinent to the case but the exonerating information shows that despite their attractiveness, the pieces of information about the suspicious behavior are not helpful.</w:t>
       </w:r>
       <w:r>
         <w:rPr>
-          <w:rFonts w:ascii="Garamond" w:cs="Garamond" w:eastAsia="Garamond" w:hAnsi="Garamond"/>
-          <w:sz w:val="24"/>
-          <w:szCs w:val="24"/>
           <w:vertAlign w:val="superscript"/>
         </w:rPr>
         <w:footnoteReference w:customMarkFollows="0" w:id="4"/>
       </w:r>
       <w:r>
         <w:rPr>
-          <w:rFonts w:ascii="Garamond" w:cs="Garamond" w:eastAsia="Garamond" w:hAnsi="Garamond"/>
-          <w:sz w:val="24"/>
-          <w:szCs w:val="24"/>
           <w:rtl w:val="0"/>
         </w:rPr>
         <w:t xml:space="preserve"> Another example is a set of Red Herrings that make up lies which can be exposed when one has the whole set. </w:t>
@@ -2009,19 +1548,11 @@
           <w:ilvl w:val="0"/>
           <w:numId w:val="8"/>
         </w:numPr>
-        <w:spacing w:before="0" w:beforeAutospacing="0" w:line="276" w:lineRule="auto"/>
+        <w:spacing w:before="0" w:beforeAutospacing="0"/>
         <w:ind w:left="720" w:hanging="360"/>
-        <w:rPr>
-          <w:rFonts w:ascii="Garamond" w:cs="Garamond" w:eastAsia="Garamond" w:hAnsi="Garamond"/>
-          <w:sz w:val="24"/>
-          <w:szCs w:val="24"/>
-        </w:rPr>
-      </w:pPr>
-      <w:r>
-        <w:rPr>
-          <w:rFonts w:ascii="Garamond" w:cs="Garamond" w:eastAsia="Garamond" w:hAnsi="Garamond"/>
-          <w:sz w:val="24"/>
-          <w:szCs w:val="24"/>
+      </w:pPr>
+      <w:r>
+        <w:rPr>
           <w:rtl w:val="0"/>
         </w:rPr>
         <w:t xml:space="preserve">Useful clues gained without follow-ups point in the right direction but are individually inconclusive. Together, all 16 do add up to the solution, but a player working from ordinary clues alone will usually have to reason across gaps.</w:t>
@@ -2029,29 +1560,18 @@
     </w:p>
     <w:p>
       <w:pPr>
-        <w:spacing w:before="200" w:line="276" w:lineRule="auto"/>
-        <w:rPr>
-          <w:rFonts w:ascii="Garamond" w:cs="Garamond" w:eastAsia="Garamond" w:hAnsi="Garamond"/>
-          <w:sz w:val="24"/>
-          <w:szCs w:val="24"/>
-        </w:rPr>
-      </w:pPr>
-      <w:r>
-        <w:rPr>
-          <w:rFonts w:ascii="Garamond" w:cs="Garamond" w:eastAsia="Garamond" w:hAnsi="Garamond"/>
+        <w:rPr/>
+      </w:pPr>
+      <w:r>
+        <w:rPr>
           <w:b w:val="1"/>
           <w:bCs w:val="1"/>
-          <w:sz w:val="24"/>
-          <w:szCs w:val="24"/>
           <w:rtl w:val="0"/>
         </w:rPr>
         <w:t xml:space="preserve">An expressed opinion about the controversy</w:t>
       </w:r>
       <w:r>
         <w:rPr>
-          <w:rFonts w:ascii="Garamond" w:cs="Garamond" w:eastAsia="Garamond" w:hAnsi="Garamond"/>
-          <w:sz w:val="24"/>
-          <w:szCs w:val="24"/>
           <w:rtl w:val="0"/>
         </w:rPr>
         <w:t xml:space="preserve">. Alongside the information provided about the mystery, witnesses volunteer their view of the CCC and say how their view differs from that of one of the other witnesses. As part of the scenario setup, witnesses are ranked by their receptiveness. The witness ranked 1 expresses their opinion receptively in all seven answers, rank 2 in six of seven, rank 3 in five, and so on down to rank 8, who is receptive in none. Overall, exactly half of the 56 opinion expressions are receptive. The details of this ranking are not shared with the players though the general fact regarding the variance in receptiveness. </w:t>
@@ -2059,38 +1579,24 @@
     </w:p>
     <w:p>
       <w:pPr>
-        <w:spacing w:before="200" w:line="276" w:lineRule="auto"/>
-        <w:rPr>
-          <w:rFonts w:ascii="Garamond" w:cs="Garamond" w:eastAsia="Garamond" w:hAnsi="Garamond"/>
-          <w:sz w:val="24"/>
-          <w:szCs w:val="24"/>
-        </w:rPr>
-      </w:pPr>
-      <w:r>
-        <w:rPr>
-          <w:rFonts w:ascii="Garamond" w:cs="Garamond" w:eastAsia="Garamond" w:hAnsi="Garamond"/>
-          <w:sz w:val="24"/>
-          <w:szCs w:val="24"/>
+        <w:rPr/>
+      </w:pPr>
+      <w:r>
+        <w:rPr>
           <w:rtl w:val="0"/>
         </w:rPr>
         <w:t xml:space="preserve">Receptive expressions use one or more HEAR moves while unreceptive ones expresses their views on the basis of </w:t>
       </w:r>
       <w:r>
         <w:rPr>
-          <w:rFonts w:ascii="Garamond" w:cs="Garamond" w:eastAsia="Garamond" w:hAnsi="Garamond"/>
           <w:i w:val="1"/>
           <w:iCs w:val="1"/>
-          <w:sz w:val="24"/>
-          <w:szCs w:val="24"/>
           <w:rtl w:val="0"/>
         </w:rPr>
         <w:t xml:space="preserve">naive realism</w:t>
       </w:r>
       <w:r>
         <w:rPr>
-          <w:rFonts w:ascii="Garamond" w:cs="Garamond" w:eastAsia="Garamond" w:hAnsi="Garamond"/>
-          <w:sz w:val="24"/>
-          <w:szCs w:val="24"/>
           <w:rtl w:val="0"/>
         </w:rPr>
         <w:t xml:space="preserve">, assuming their perspective is obviously true and so uses absolute language (‘obviously’), fails to acknowledge the other perspective or recognize it as legitimate, focus on how other views are wrong rather than seek agreement and so forth.  </w:t>
@@ -2099,22 +1605,12 @@
     <w:p>
       <w:pPr>
         <w:pStyle w:val="Heading3"/>
-        <w:spacing w:before="320" w:line="276" w:lineRule="auto"/>
-        <w:rPr>
-          <w:rFonts w:ascii="Garamond" w:cs="Garamond" w:eastAsia="Garamond" w:hAnsi="Garamond"/>
-          <w:b w:val="0"/>
-          <w:bCs w:val="0"/>
-          <w:color w:val="434343"/>
-        </w:rPr>
-      </w:pPr>
-      <w:bookmarkStart w:colFirst="0" w:colLast="0" w:name="_n565rz9sqema" w:id="9"/>
-      <w:bookmarkEnd w:id="9"/>
-      <w:r>
-        <w:rPr>
-          <w:rFonts w:ascii="Garamond" w:cs="Garamond" w:eastAsia="Garamond" w:hAnsi="Garamond"/>
-          <w:b w:val="0"/>
-          <w:bCs w:val="0"/>
-          <w:color w:val="434343"/>
+        <w:rPr/>
+      </w:pPr>
+      <w:bookmarkStart w:colFirst="0" w:colLast="0" w:name="_n565rz9sqema" w:id="10"/>
+      <w:bookmarkEnd w:id="10"/>
+      <w:r>
+        <w:rPr>
           <w:rtl w:val="0"/>
         </w:rPr>
         <w:t xml:space="preserve">3.3.1 Follow-up questions and Major Clues</w:t>
@@ -2122,36 +1618,22 @@
     </w:p>
     <w:p>
       <w:pPr>
-        <w:spacing w:before="200" w:line="276" w:lineRule="auto"/>
-        <w:rPr>
-          <w:rFonts w:ascii="Garamond" w:cs="Garamond" w:eastAsia="Garamond" w:hAnsi="Garamond"/>
-          <w:sz w:val="24"/>
-          <w:szCs w:val="24"/>
-        </w:rPr>
-      </w:pPr>
-      <w:r>
-        <w:rPr>
-          <w:rFonts w:ascii="Garamond" w:cs="Garamond" w:eastAsia="Garamond" w:hAnsi="Garamond"/>
-          <w:sz w:val="24"/>
-          <w:szCs w:val="24"/>
+        <w:rPr/>
+      </w:pPr>
+      <w:r>
+        <w:rPr>
           <w:rtl w:val="0"/>
         </w:rPr>
         <w:t xml:space="preserve">Once per witness, after any answer except for the tripwire, players may choose to “ask a follow-up about their opinion”. The game then offers </w:t>
       </w:r>
       <w:r>
         <w:rPr>
-          <w:rFonts w:ascii="Garamond" w:cs="Garamond" w:eastAsia="Garamond" w:hAnsi="Garamond"/>
-          <w:sz w:val="24"/>
-          <w:szCs w:val="24"/>
           <w:rtl w:val="0"/>
         </w:rPr>
         <w:t xml:space="preserve">two </w:t>
       </w:r>
       <w:r>
         <w:rPr>
-          <w:rFonts w:ascii="Garamond" w:cs="Garamond" w:eastAsia="Garamond" w:hAnsi="Garamond"/>
-          <w:sz w:val="24"/>
-          <w:szCs w:val="24"/>
           <w:rtl w:val="0"/>
         </w:rPr>
         <w:t xml:space="preserve">follow-up questions about the witness’s view of the controversy. Both options should be relevant and seem like reasonable responses though one will be framed as more receptive than the other. Each witness has only one pair of follow-up questions so they would not be super tailored to the particular response a witness just gave but instead will be responsive to their position about the CCC. Note: The follow-up does not depend on the witness’s own receptiveness.</w:t>
@@ -2159,38 +1641,24 @@
     </w:p>
     <w:p>
       <w:pPr>
-        <w:spacing w:before="200" w:line="276" w:lineRule="auto"/>
-        <w:rPr>
-          <w:rFonts w:ascii="Garamond" w:cs="Garamond" w:eastAsia="Garamond" w:hAnsi="Garamond"/>
-          <w:sz w:val="24"/>
-          <w:szCs w:val="24"/>
-        </w:rPr>
-      </w:pPr>
-      <w:r>
-        <w:rPr>
-          <w:rFonts w:ascii="Garamond" w:cs="Garamond" w:eastAsia="Garamond" w:hAnsi="Garamond"/>
-          <w:sz w:val="24"/>
-          <w:szCs w:val="24"/>
+        <w:rPr/>
+      </w:pPr>
+      <w:r>
+        <w:rPr>
           <w:rtl w:val="0"/>
         </w:rPr>
         <w:t xml:space="preserve">How obvious or subtle this difference will be requires careful calibration. Making it too obvious will make the learning element of the game feel cheap and could render the mystery trivial. Making it too subtle can cause frustration to users who may feel like they couldn’t have been expected to interpret such a subtle difference. In general, </w:t>
       </w:r>
       <w:r>
         <w:rPr>
-          <w:rFonts w:ascii="Garamond" w:cs="Garamond" w:eastAsia="Garamond" w:hAnsi="Garamond"/>
           <w:b w:val="1"/>
           <w:bCs w:val="1"/>
-          <w:sz w:val="24"/>
-          <w:szCs w:val="24"/>
           <w:rtl w:val="0"/>
         </w:rPr>
         <w:t xml:space="preserve">picking the correct follow-up should be as difficult as possible</w:t>
       </w:r>
       <w:r>
         <w:rPr>
-          <w:rFonts w:ascii="Garamond" w:cs="Garamond" w:eastAsia="Garamond" w:hAnsi="Garamond"/>
-          <w:sz w:val="24"/>
-          <w:szCs w:val="24"/>
           <w:rtl w:val="0"/>
         </w:rPr>
         <w:t xml:space="preserve"> while having a solid justification from the HEAR framework. It’s ok if there is some variation in the difficulty between witnesses. </w:t>
@@ -2202,39 +1670,25 @@
           <w:ilvl w:val="0"/>
           <w:numId w:val="1"/>
         </w:numPr>
-        <w:spacing w:after="0" w:afterAutospacing="0" w:before="200" w:line="276" w:lineRule="auto"/>
+        <w:spacing w:after="0" w:afterAutospacing="0"/>
         <w:ind w:left="720" w:hanging="360"/>
-        <w:rPr>
-          <w:rFonts w:ascii="Garamond" w:cs="Garamond" w:eastAsia="Garamond" w:hAnsi="Garamond"/>
-          <w:sz w:val="24"/>
-          <w:szCs w:val="24"/>
-        </w:rPr>
-      </w:pPr>
-      <w:r>
-        <w:rPr>
-          <w:rFonts w:ascii="Garamond" w:cs="Garamond" w:eastAsia="Garamond" w:hAnsi="Garamond"/>
-          <w:sz w:val="24"/>
-          <w:szCs w:val="24"/>
+      </w:pPr>
+      <w:r>
+        <w:rPr>
           <w:rtl w:val="0"/>
         </w:rPr>
         <w:t xml:space="preserve">If the player picks the more receptive follow-up, the witness opens up and the player earns one of the four </w:t>
       </w:r>
       <w:r>
         <w:rPr>
-          <w:rFonts w:ascii="Garamond" w:cs="Garamond" w:eastAsia="Garamond" w:hAnsi="Garamond"/>
           <w:b w:val="1"/>
           <w:bCs w:val="1"/>
-          <w:sz w:val="24"/>
-          <w:szCs w:val="24"/>
           <w:rtl w:val="0"/>
         </w:rPr>
         <w:t xml:space="preserve">Major Clues</w:t>
       </w:r>
       <w:r>
         <w:rPr>
-          <w:rFonts w:ascii="Garamond" w:cs="Garamond" w:eastAsia="Garamond" w:hAnsi="Garamond"/>
-          <w:sz w:val="24"/>
-          <w:szCs w:val="24"/>
           <w:rtl w:val="0"/>
         </w:rPr>
         <w:t xml:space="preserve">. The game then shows a short explanation of why that phrasing worked and which HEAR elements it used.</w:t>
@@ -2246,19 +1700,11 @@
           <w:ilvl w:val="0"/>
           <w:numId w:val="1"/>
         </w:numPr>
-        <w:spacing w:before="0" w:beforeAutospacing="0" w:line="276" w:lineRule="auto"/>
+        <w:spacing w:before="0" w:beforeAutospacing="0"/>
         <w:ind w:left="720" w:hanging="360"/>
-        <w:rPr>
-          <w:rFonts w:ascii="Garamond" w:cs="Garamond" w:eastAsia="Garamond" w:hAnsi="Garamond"/>
-          <w:sz w:val="24"/>
-          <w:szCs w:val="24"/>
-        </w:rPr>
-      </w:pPr>
-      <w:r>
-        <w:rPr>
-          <w:rFonts w:ascii="Garamond" w:cs="Garamond" w:eastAsia="Garamond" w:hAnsi="Garamond"/>
-          <w:sz w:val="24"/>
-          <w:szCs w:val="24"/>
+      </w:pPr>
+      <w:r>
+        <w:rPr>
           <w:rtl w:val="0"/>
         </w:rPr>
         <w:t xml:space="preserve">If the player picks the unreceptive follow-up, the witness refuses to say anything more and the interview ends, exactly as if a tripwire had been asked.</w:t>
@@ -2266,18 +1712,10 @@
     </w:p>
     <w:p>
       <w:pPr>
-        <w:spacing w:before="200" w:line="276" w:lineRule="auto"/>
-        <w:rPr>
-          <w:rFonts w:ascii="Garamond" w:cs="Garamond" w:eastAsia="Garamond" w:hAnsi="Garamond"/>
-          <w:sz w:val="24"/>
-          <w:szCs w:val="24"/>
-        </w:rPr>
-      </w:pPr>
-      <w:r>
-        <w:rPr>
-          <w:rFonts w:ascii="Garamond" w:cs="Garamond" w:eastAsia="Garamond" w:hAnsi="Garamond"/>
-          <w:sz w:val="24"/>
-          <w:szCs w:val="24"/>
+        <w:rPr/>
+      </w:pPr>
+      <w:r>
+        <w:rPr>
           <w:rtl w:val="0"/>
         </w:rPr>
         <w:t xml:space="preserve">There are four Major Clues per scenario. Each Major Clue combines four of the 16 ordinary clues such that all four Major Clues together cover all 16 standard Clues without overlap. Therefore, together the four Major Clues make the solution unmistakable. Each time a Major Clue is earned the player also gains the next letter of the word H-E-A-R, displayed on screen. The letters are a progress tally and are not tied to specific HEAR elements or specific clues. After all four Major Clues are earned, a further successful follow-up still produces the explanation but no new clue.</w:t>
@@ -2286,24 +1724,12 @@
     <w:p>
       <w:pPr>
         <w:pStyle w:val="Heading2"/>
-        <w:spacing w:after="120" w:line="276" w:lineRule="auto"/>
-        <w:rPr>
-          <w:rFonts w:ascii="Garamond" w:cs="Garamond" w:eastAsia="Garamond" w:hAnsi="Garamond"/>
-          <w:b w:val="0"/>
-          <w:bCs w:val="0"/>
-          <w:sz w:val="32"/>
-          <w:szCs w:val="32"/>
-        </w:rPr>
-      </w:pPr>
-      <w:bookmarkStart w:colFirst="0" w:colLast="0" w:name="_1qymattj2854" w:id="10"/>
-      <w:bookmarkEnd w:id="10"/>
-      <w:r>
-        <w:rPr>
-          <w:rFonts w:ascii="Garamond" w:cs="Garamond" w:eastAsia="Garamond" w:hAnsi="Garamond"/>
-          <w:b w:val="0"/>
-          <w:bCs w:val="0"/>
-          <w:sz w:val="32"/>
-          <w:szCs w:val="32"/>
+        <w:rPr/>
+      </w:pPr>
+      <w:bookmarkStart w:colFirst="0" w:colLast="0" w:name="_1qymattj2854" w:id="11"/>
+      <w:bookmarkEnd w:id="11"/>
+      <w:r>
+        <w:rPr>
           <w:rtl w:val="0"/>
         </w:rPr>
         <w:t xml:space="preserve">3.4 Solving the Mystery and Ending</w:t>
@@ -2311,58 +1737,38 @@
     </w:p>
     <w:p>
       <w:pPr>
-        <w:spacing w:before="200" w:line="276" w:lineRule="auto"/>
-        <w:rPr>
-          <w:rFonts w:ascii="Garamond" w:cs="Garamond" w:eastAsia="Garamond" w:hAnsi="Garamond"/>
-          <w:sz w:val="24"/>
-          <w:szCs w:val="24"/>
-        </w:rPr>
-      </w:pPr>
-      <w:r>
-        <w:rPr>
-          <w:rFonts w:ascii="Garamond" w:cs="Garamond" w:eastAsia="Garamond" w:hAnsi="Garamond"/>
-          <w:sz w:val="24"/>
-          <w:szCs w:val="24"/>
+        <w:rPr/>
+      </w:pPr>
+      <w:r>
+        <w:rPr>
           <w:rtl w:val="0"/>
         </w:rPr>
         <w:t xml:space="preserve">After every interview question that’s resolved, players may choose to </w:t>
       </w:r>
       <w:r>
         <w:rPr>
-          <w:rFonts w:ascii="Garamond" w:cs="Garamond" w:eastAsia="Garamond" w:hAnsi="Garamond"/>
           <w:i w:val="1"/>
           <w:iCs w:val="1"/>
-          <w:sz w:val="24"/>
-          <w:szCs w:val="24"/>
           <w:rtl w:val="0"/>
         </w:rPr>
         <w:t xml:space="preserve">solve</w:t>
       </w:r>
       <w:r>
         <w:rPr>
-          <w:rFonts w:ascii="Garamond" w:cs="Garamond" w:eastAsia="Garamond" w:hAnsi="Garamond"/>
-          <w:sz w:val="24"/>
-          <w:szCs w:val="24"/>
           <w:rtl w:val="0"/>
         </w:rPr>
         <w:t xml:space="preserve"> the case. Solving the case just means that players are given an opportunity to submit their answers (which may be referred to as a guess, though hopefully isn’t the result of pure guesswork). </w:t>
       </w:r>
       <w:r>
         <w:rPr>
-          <w:rFonts w:ascii="Garamond" w:cs="Garamond" w:eastAsia="Garamond" w:hAnsi="Garamond"/>
           <w:b w:val="1"/>
           <w:bCs w:val="1"/>
-          <w:sz w:val="24"/>
-          <w:szCs w:val="24"/>
           <w:rtl w:val="0"/>
         </w:rPr>
         <w:t xml:space="preserve">Players are given three chances to submit their answers</w:t>
       </w:r>
       <w:r>
         <w:rPr>
-          <w:rFonts w:ascii="Garamond" w:cs="Garamond" w:eastAsia="Garamond" w:hAnsi="Garamond"/>
-          <w:sz w:val="24"/>
-          <w:szCs w:val="24"/>
           <w:rtl w:val="0"/>
         </w:rPr>
         <w:t xml:space="preserve">. After a wrong submission the game says only that it is not the solution, not which part is wrong. Players may then keep investigating (if they have questions left) or submit again. After a correct submission, or a third wrong one, they are directed to the ending. A correct solution earns 3 points on the first try, 2 on the second and 1 on the third; the debrief shows how many tries were used. </w:t>
@@ -2370,18 +1776,10 @@
     </w:p>
     <w:p>
       <w:pPr>
-        <w:spacing w:before="200" w:line="276" w:lineRule="auto"/>
-        <w:rPr>
-          <w:rFonts w:ascii="Garamond" w:cs="Garamond" w:eastAsia="Garamond" w:hAnsi="Garamond"/>
-          <w:sz w:val="24"/>
-          <w:szCs w:val="24"/>
-        </w:rPr>
-      </w:pPr>
-      <w:r>
-        <w:rPr>
-          <w:rFonts w:ascii="Garamond" w:cs="Garamond" w:eastAsia="Garamond" w:hAnsi="Garamond"/>
-          <w:sz w:val="24"/>
-          <w:szCs w:val="24"/>
+        <w:rPr/>
+      </w:pPr>
+      <w:r>
+        <w:rPr>
           <w:rtl w:val="0"/>
         </w:rPr>
         <w:t xml:space="preserve">If players have no more questions in their allotted budget, they ‘run out of time’ - they have to submit their best guess and hope for the best. </w:t>
@@ -2389,18 +1787,10 @@
     </w:p>
     <w:p>
       <w:pPr>
-        <w:spacing w:before="200" w:line="276" w:lineRule="auto"/>
-        <w:rPr>
-          <w:rFonts w:ascii="Garamond" w:cs="Garamond" w:eastAsia="Garamond" w:hAnsi="Garamond"/>
-          <w:sz w:val="24"/>
-          <w:szCs w:val="24"/>
-        </w:rPr>
-      </w:pPr>
-      <w:r>
-        <w:rPr>
-          <w:rFonts w:ascii="Garamond" w:cs="Garamond" w:eastAsia="Garamond" w:hAnsi="Garamond"/>
-          <w:sz w:val="24"/>
-          <w:szCs w:val="24"/>
+        <w:rPr/>
+      </w:pPr>
+      <w:r>
+        <w:rPr>
           <w:rtl w:val="0"/>
         </w:rPr>
         <w:t xml:space="preserve">The ending should include a reveal of the full story which should be a satisfying twist. There would be slightly different endings depending on whether the players picked the right solution or not. Alongside the satisfaction of solving the case correctly, the story reveal is a big part of the payoff players get from playing the game so hopefully even players that didn’t solve correctly will have a pleasing experience. </w:t>
@@ -2408,18 +1798,10 @@
     </w:p>
     <w:p>
       <w:pPr>
-        <w:spacing w:before="200" w:line="276" w:lineRule="auto"/>
-        <w:rPr>
-          <w:rFonts w:ascii="Garamond" w:cs="Garamond" w:eastAsia="Garamond" w:hAnsi="Garamond"/>
-          <w:sz w:val="24"/>
-          <w:szCs w:val="24"/>
-        </w:rPr>
-      </w:pPr>
-      <w:r>
-        <w:rPr>
-          <w:rFonts w:ascii="Garamond" w:cs="Garamond" w:eastAsia="Garamond" w:hAnsi="Garamond"/>
-          <w:sz w:val="24"/>
-          <w:szCs w:val="24"/>
+        <w:rPr/>
+      </w:pPr>
+      <w:r>
+        <w:rPr>
           <w:rtl w:val="0"/>
         </w:rPr>
         <w:t xml:space="preserve">After the big reveal, players should be asked to rank the witnesses in order of their receptiveness. The ranking should be graded in terms of its difference from the real ranking and a score be given. Depending on the context, there’s an option to create a leaderboard with scores of different students.</w:t>
@@ -2428,25 +1810,13 @@
     <w:p>
       <w:pPr>
         <w:pStyle w:val="Heading1"/>
-        <w:spacing w:before="400" w:line="276" w:lineRule="auto"/>
-        <w:rPr>
-          <w:rFonts w:ascii="Garamond" w:cs="Garamond" w:eastAsia="Garamond" w:hAnsi="Garamond"/>
-          <w:b w:val="0"/>
-          <w:bCs w:val="0"/>
-          <w:sz w:val="40"/>
-          <w:szCs w:val="40"/>
-        </w:rPr>
-      </w:pPr>
-      <w:bookmarkStart w:colFirst="0" w:colLast="0" w:name="_6ox7aix20q37" w:id="11"/>
-      <w:bookmarkEnd w:id="11"/>
+        <w:rPr/>
+      </w:pPr>
+      <w:bookmarkStart w:colFirst="0" w:colLast="0" w:name="_6ox7aix20q37" w:id="12"/>
+      <w:bookmarkEnd w:id="12"/>
       <w:commentRangeStart w:id="0"/>
       <w:r>
         <w:rPr>
-          <w:rFonts w:ascii="Garamond" w:cs="Garamond" w:eastAsia="Garamond" w:hAnsi="Garamond"/>
-          <w:b w:val="0"/>
-          <w:bCs w:val="0"/>
-          <w:sz w:val="40"/>
-          <w:szCs w:val="40"/>
           <w:rtl w:val="0"/>
         </w:rPr>
         <w:t xml:space="preserve">4. What a scenario packet contains</w:t>
@@ -2463,18 +1833,10 @@
     </w:p>
     <w:p>
       <w:pPr>
-        <w:spacing w:before="200" w:line="276" w:lineRule="auto"/>
-        <w:rPr>
-          <w:rFonts w:ascii="Garamond" w:cs="Garamond" w:eastAsia="Garamond" w:hAnsi="Garamond"/>
-          <w:sz w:val="24"/>
-          <w:szCs w:val="24"/>
-        </w:rPr>
-      </w:pPr>
-      <w:r>
-        <w:rPr>
-          <w:rFonts w:ascii="Garamond" w:cs="Garamond" w:eastAsia="Garamond" w:hAnsi="Garamond"/>
-          <w:sz w:val="24"/>
-          <w:szCs w:val="24"/>
+        <w:rPr/>
+      </w:pPr>
+      <w:r>
+        <w:rPr>
           <w:rtl w:val="0"/>
         </w:rPr>
         <w:t xml:space="preserve">A scenario packet is everything the Twine engine needs to produce a playable game. It consists of one narrative document, one response-matrix workbook, and an assets folder, and it must contain the following.</w:t>
@@ -2486,19 +1848,11 @@
           <w:ilvl w:val="0"/>
           <w:numId w:val="2"/>
         </w:numPr>
-        <w:spacing w:after="0" w:afterAutospacing="0" w:before="200" w:line="276" w:lineRule="auto"/>
+        <w:spacing w:after="0" w:afterAutospacing="0"/>
         <w:ind w:left="720" w:hanging="360"/>
-        <w:rPr>
-          <w:rFonts w:ascii="Garamond" w:cs="Garamond" w:eastAsia="Garamond" w:hAnsi="Garamond"/>
-          <w:sz w:val="24"/>
-          <w:szCs w:val="24"/>
-        </w:rPr>
-      </w:pPr>
-      <w:r>
-        <w:rPr>
-          <w:rFonts w:ascii="Garamond" w:cs="Garamond" w:eastAsia="Garamond" w:hAnsi="Garamond"/>
-          <w:sz w:val="24"/>
-          <w:szCs w:val="24"/>
+      </w:pPr>
+      <w:r>
+        <w:rPr>
           <w:rtl w:val="0"/>
         </w:rPr>
         <w:t xml:space="preserve">Title, scenario ID (used in filenames and the engine), background/summary. </w:t>
@@ -2510,30 +1864,19 @@
           <w:ilvl w:val="0"/>
           <w:numId w:val="2"/>
         </w:numPr>
-        <w:spacing w:after="0" w:afterAutospacing="0" w:before="0" w:beforeAutospacing="0" w:line="276" w:lineRule="auto"/>
+        <w:spacing w:after="0" w:afterAutospacing="0" w:before="0" w:beforeAutospacing="0"/>
         <w:ind w:left="720" w:hanging="360"/>
-        <w:rPr>
-          <w:rFonts w:ascii="Garamond" w:cs="Garamond" w:eastAsia="Garamond" w:hAnsi="Garamond"/>
-          <w:sz w:val="24"/>
-          <w:szCs w:val="24"/>
-        </w:rPr>
-      </w:pPr>
-      <w:r>
-        <w:rPr>
-          <w:rFonts w:ascii="Garamond" w:cs="Garamond" w:eastAsia="Garamond" w:hAnsi="Garamond"/>
+      </w:pPr>
+      <w:r>
+        <w:rPr>
           <w:b w:val="1"/>
           <w:bCs w:val="1"/>
-          <w:sz w:val="24"/>
-          <w:szCs w:val="24"/>
           <w:rtl w:val="0"/>
         </w:rPr>
         <w:t xml:space="preserve">The mystery</w:t>
       </w:r>
       <w:r>
         <w:rPr>
-          <w:rFonts w:ascii="Garamond" w:cs="Garamond" w:eastAsia="Garamond" w:hAnsi="Garamond"/>
-          <w:sz w:val="24"/>
-          <w:szCs w:val="24"/>
           <w:rtl w:val="0"/>
         </w:rPr>
         <w:t xml:space="preserve">: the question the player is asked to answer (for example “who removed X, why, and where is it now?”).</w:t>
@@ -2545,30 +1888,19 @@
           <w:ilvl w:val="0"/>
           <w:numId w:val="2"/>
         </w:numPr>
-        <w:spacing w:after="0" w:afterAutospacing="0" w:before="0" w:beforeAutospacing="0" w:line="276" w:lineRule="auto"/>
+        <w:spacing w:after="0" w:afterAutospacing="0" w:before="0" w:beforeAutospacing="0"/>
         <w:ind w:left="720" w:hanging="360"/>
-        <w:rPr>
-          <w:rFonts w:ascii="Garamond" w:cs="Garamond" w:eastAsia="Garamond" w:hAnsi="Garamond"/>
-          <w:sz w:val="24"/>
-          <w:szCs w:val="24"/>
-        </w:rPr>
-      </w:pPr>
-      <w:r>
-        <w:rPr>
-          <w:rFonts w:ascii="Garamond" w:cs="Garamond" w:eastAsia="Garamond" w:hAnsi="Garamond"/>
+      </w:pPr>
+      <w:r>
+        <w:rPr>
           <w:b w:val="1"/>
           <w:bCs w:val="1"/>
-          <w:sz w:val="24"/>
-          <w:szCs w:val="24"/>
           <w:rtl w:val="0"/>
         </w:rPr>
         <w:t xml:space="preserve">The solution: </w:t>
       </w:r>
       <w:r>
         <w:rPr>
-          <w:rFonts w:ascii="Garamond" w:cs="Garamond" w:eastAsia="Garamond" w:hAnsi="Garamond"/>
-          <w:sz w:val="24"/>
-          <w:szCs w:val="24"/>
           <w:rtl w:val="0"/>
         </w:rPr>
         <w:t xml:space="preserve">the answer to the mystery</w:t>
@@ -2580,19 +1912,11 @@
           <w:ilvl w:val="1"/>
           <w:numId w:val="2"/>
         </w:numPr>
-        <w:spacing w:after="0" w:afterAutospacing="0" w:before="0" w:beforeAutospacing="0" w:line="276" w:lineRule="auto"/>
+        <w:spacing w:after="0" w:afterAutospacing="0" w:before="0" w:beforeAutospacing="0"/>
         <w:ind w:left="1440" w:hanging="360"/>
-        <w:rPr>
-          <w:rFonts w:ascii="Garamond" w:cs="Garamond" w:eastAsia="Garamond" w:hAnsi="Garamond"/>
-          <w:sz w:val="24"/>
-          <w:szCs w:val="24"/>
-        </w:rPr>
-      </w:pPr>
-      <w:r>
-        <w:rPr>
-          <w:rFonts w:ascii="Garamond" w:cs="Garamond" w:eastAsia="Garamond" w:hAnsi="Garamond"/>
-          <w:sz w:val="24"/>
-          <w:szCs w:val="24"/>
+      </w:pPr>
+      <w:r>
+        <w:rPr>
           <w:rtl w:val="0"/>
         </w:rPr>
         <w:t xml:space="preserve">The 16 Clues that tell the story of the answer, alongside the 4 Major Clues that make each group of four.</w:t>
@@ -2604,30 +1928,19 @@
           <w:ilvl w:val="0"/>
           <w:numId w:val="2"/>
         </w:numPr>
-        <w:spacing w:after="0" w:afterAutospacing="0" w:before="0" w:beforeAutospacing="0" w:line="276" w:lineRule="auto"/>
+        <w:spacing w:after="0" w:afterAutospacing="0" w:before="0" w:beforeAutospacing="0"/>
         <w:ind w:left="720" w:hanging="360"/>
-        <w:rPr>
-          <w:rFonts w:ascii="Garamond" w:cs="Garamond" w:eastAsia="Garamond" w:hAnsi="Garamond"/>
-          <w:sz w:val="24"/>
-          <w:szCs w:val="24"/>
-        </w:rPr>
-      </w:pPr>
-      <w:r>
-        <w:rPr>
-          <w:rFonts w:ascii="Garamond" w:cs="Garamond" w:eastAsia="Garamond" w:hAnsi="Garamond"/>
+      </w:pPr>
+      <w:r>
+        <w:rPr>
           <w:b w:val="1"/>
           <w:bCs w:val="1"/>
-          <w:sz w:val="24"/>
-          <w:szCs w:val="24"/>
           <w:rtl w:val="0"/>
         </w:rPr>
         <w:t xml:space="preserve">The final-answer form</w:t>
       </w:r>
       <w:r>
         <w:rPr>
-          <w:rFonts w:ascii="Garamond" w:cs="Garamond" w:eastAsia="Garamond" w:hAnsi="Garamond"/>
-          <w:sz w:val="24"/>
-          <w:szCs w:val="24"/>
           <w:rtl w:val="0"/>
         </w:rPr>
         <w:t xml:space="preserve">: what the player must select at the end (e.g. one person from a list and one location from a list), and which combination is correct.</w:t>
@@ -2644,19 +1957,11 @@
           <w:ilvl w:val="0"/>
           <w:numId w:val="2"/>
         </w:numPr>
-        <w:spacing w:after="0" w:afterAutospacing="0" w:before="0" w:beforeAutospacing="0" w:line="276" w:lineRule="auto"/>
+        <w:spacing w:after="0" w:afterAutospacing="0" w:before="0" w:beforeAutospacing="0"/>
         <w:ind w:left="720" w:hanging="360"/>
-        <w:rPr>
-          <w:rFonts w:ascii="Garamond" w:cs="Garamond" w:eastAsia="Garamond" w:hAnsi="Garamond"/>
-          <w:sz w:val="24"/>
-          <w:szCs w:val="24"/>
-        </w:rPr>
-      </w:pPr>
-      <w:r>
-        <w:rPr>
-          <w:rFonts w:ascii="Garamond" w:cs="Garamond" w:eastAsia="Garamond" w:hAnsi="Garamond"/>
-          <w:sz w:val="24"/>
-          <w:szCs w:val="24"/>
+      </w:pPr>
+      <w:r>
+        <w:rPr>
           <w:rtl w:val="0"/>
         </w:rPr>
         <w:t xml:space="preserve">Passages text: Start, Rules, the Hook, Map, Interview, Answer, Follow-up, Evidence Board, Submission, Result, ending, ranking</w:t>
@@ -2668,19 +1973,11 @@
           <w:ilvl w:val="0"/>
           <w:numId w:val="2"/>
         </w:numPr>
-        <w:spacing w:after="0" w:afterAutospacing="0" w:before="0" w:beforeAutospacing="0" w:line="276" w:lineRule="auto"/>
+        <w:spacing w:after="0" w:afterAutospacing="0" w:before="0" w:beforeAutospacing="0"/>
         <w:ind w:left="720" w:hanging="360"/>
-        <w:rPr>
-          <w:rFonts w:ascii="Garamond" w:cs="Garamond" w:eastAsia="Garamond" w:hAnsi="Garamond"/>
-          <w:sz w:val="24"/>
-          <w:szCs w:val="24"/>
-        </w:rPr>
-      </w:pPr>
-      <w:r>
-        <w:rPr>
-          <w:rFonts w:ascii="Garamond" w:cs="Garamond" w:eastAsia="Garamond" w:hAnsi="Garamond"/>
-          <w:sz w:val="24"/>
-          <w:szCs w:val="24"/>
+      </w:pPr>
+      <w:r>
+        <w:rPr>
           <w:rtl w:val="0"/>
         </w:rPr>
         <w:t xml:space="preserve">The eight questions </w:t>
@@ -2692,19 +1989,11 @@
           <w:ilvl w:val="0"/>
           <w:numId w:val="2"/>
         </w:numPr>
-        <w:spacing w:after="0" w:afterAutospacing="0" w:before="0" w:beforeAutospacing="0" w:line="276" w:lineRule="auto"/>
+        <w:spacing w:after="0" w:afterAutospacing="0" w:before="0" w:beforeAutospacing="0"/>
         <w:ind w:left="720" w:hanging="360"/>
-        <w:rPr>
-          <w:rFonts w:ascii="Garamond" w:cs="Garamond" w:eastAsia="Garamond" w:hAnsi="Garamond"/>
-          <w:sz w:val="24"/>
-          <w:szCs w:val="24"/>
-        </w:rPr>
-      </w:pPr>
-      <w:r>
-        <w:rPr>
-          <w:rFonts w:ascii="Garamond" w:cs="Garamond" w:eastAsia="Garamond" w:hAnsi="Garamond"/>
-          <w:sz w:val="24"/>
-          <w:szCs w:val="24"/>
+      </w:pPr>
+      <w:r>
+        <w:rPr>
           <w:rtl w:val="0"/>
         </w:rPr>
         <w:t xml:space="preserve">The eight witnesses list:</w:t>
@@ -2716,19 +2005,11 @@
           <w:ilvl w:val="1"/>
           <w:numId w:val="2"/>
         </w:numPr>
-        <w:spacing w:after="0" w:afterAutospacing="0" w:before="0" w:beforeAutospacing="0" w:line="276" w:lineRule="auto"/>
+        <w:spacing w:after="0" w:afterAutospacing="0" w:before="0" w:beforeAutospacing="0"/>
         <w:ind w:left="1440" w:hanging="360"/>
-        <w:rPr>
-          <w:rFonts w:ascii="Garamond" w:cs="Garamond" w:eastAsia="Garamond" w:hAnsi="Garamond"/>
-          <w:sz w:val="24"/>
-          <w:szCs w:val="24"/>
-        </w:rPr>
-      </w:pPr>
-      <w:r>
-        <w:rPr>
-          <w:rFonts w:ascii="Garamond" w:cs="Garamond" w:eastAsia="Garamond" w:hAnsi="Garamond"/>
-          <w:sz w:val="24"/>
-          <w:szCs w:val="24"/>
+      </w:pPr>
+      <w:r>
+        <w:rPr>
           <w:rtl w:val="0"/>
         </w:rPr>
         <w:t xml:space="preserve">Information, image, ID (W01-W08)</w:t>
@@ -2740,19 +2021,11 @@
           <w:ilvl w:val="1"/>
           <w:numId w:val="2"/>
         </w:numPr>
-        <w:spacing w:after="0" w:afterAutospacing="0" w:before="0" w:beforeAutospacing="0" w:line="276" w:lineRule="auto"/>
+        <w:spacing w:after="0" w:afterAutospacing="0" w:before="0" w:beforeAutospacing="0"/>
         <w:ind w:left="1440" w:hanging="360"/>
-        <w:rPr>
-          <w:rFonts w:ascii="Garamond" w:cs="Garamond" w:eastAsia="Garamond" w:hAnsi="Garamond"/>
-          <w:sz w:val="24"/>
-          <w:szCs w:val="24"/>
-        </w:rPr>
-      </w:pPr>
-      <w:r>
-        <w:rPr>
-          <w:rFonts w:ascii="Garamond" w:cs="Garamond" w:eastAsia="Garamond" w:hAnsi="Garamond"/>
-          <w:sz w:val="24"/>
-          <w:szCs w:val="24"/>
+      </w:pPr>
+      <w:r>
+        <w:rPr>
           <w:rtl w:val="0"/>
         </w:rPr>
         <w:t xml:space="preserve">Position on the CCC</w:t>
@@ -2764,19 +2037,11 @@
           <w:ilvl w:val="1"/>
           <w:numId w:val="2"/>
         </w:numPr>
-        <w:spacing w:after="0" w:afterAutospacing="0" w:before="0" w:beforeAutospacing="0" w:line="276" w:lineRule="auto"/>
+        <w:spacing w:after="0" w:afterAutospacing="0" w:before="0" w:beforeAutospacing="0"/>
         <w:ind w:left="1440" w:hanging="360"/>
-        <w:rPr>
-          <w:rFonts w:ascii="Garamond" w:cs="Garamond" w:eastAsia="Garamond" w:hAnsi="Garamond"/>
-          <w:sz w:val="24"/>
-          <w:szCs w:val="24"/>
-        </w:rPr>
-      </w:pPr>
-      <w:r>
-        <w:rPr>
-          <w:rFonts w:ascii="Garamond" w:cs="Garamond" w:eastAsia="Garamond" w:hAnsi="Garamond"/>
-          <w:sz w:val="24"/>
-          <w:szCs w:val="24"/>
+      </w:pPr>
+      <w:r>
+        <w:rPr>
           <w:rtl w:val="0"/>
         </w:rPr>
         <w:t xml:space="preserve">Which question is their tripwire </w:t>
@@ -2788,19 +2053,11 @@
           <w:ilvl w:val="1"/>
           <w:numId w:val="2"/>
         </w:numPr>
-        <w:spacing w:after="0" w:afterAutospacing="0" w:before="0" w:beforeAutospacing="0" w:line="276" w:lineRule="auto"/>
+        <w:spacing w:after="0" w:afterAutospacing="0" w:before="0" w:beforeAutospacing="0"/>
         <w:ind w:left="1440" w:hanging="360"/>
-        <w:rPr>
-          <w:rFonts w:ascii="Garamond" w:cs="Garamond" w:eastAsia="Garamond" w:hAnsi="Garamond"/>
-          <w:sz w:val="24"/>
-          <w:szCs w:val="24"/>
-        </w:rPr>
-      </w:pPr>
-      <w:r>
-        <w:rPr>
-          <w:rFonts w:ascii="Garamond" w:cs="Garamond" w:eastAsia="Garamond" w:hAnsi="Garamond"/>
-          <w:sz w:val="24"/>
-          <w:szCs w:val="24"/>
+      </w:pPr>
+      <w:r>
+        <w:rPr>
           <w:rtl w:val="0"/>
         </w:rPr>
         <w:t xml:space="preserve">Receptiveness score</w:t>
@@ -2812,19 +2069,11 @@
           <w:ilvl w:val="1"/>
           <w:numId w:val="2"/>
         </w:numPr>
-        <w:spacing w:after="0" w:afterAutospacing="0" w:before="0" w:beforeAutospacing="0" w:line="276" w:lineRule="auto"/>
+        <w:spacing w:after="0" w:afterAutospacing="0" w:before="0" w:beforeAutospacing="0"/>
         <w:ind w:left="1440" w:hanging="360"/>
-        <w:rPr>
-          <w:rFonts w:ascii="Garamond" w:cs="Garamond" w:eastAsia="Garamond" w:hAnsi="Garamond"/>
-          <w:sz w:val="24"/>
-          <w:szCs w:val="24"/>
-        </w:rPr>
-      </w:pPr>
-      <w:r>
-        <w:rPr>
-          <w:rFonts w:ascii="Garamond" w:cs="Garamond" w:eastAsia="Garamond" w:hAnsi="Garamond"/>
-          <w:sz w:val="24"/>
-          <w:szCs w:val="24"/>
+      </w:pPr>
+      <w:r>
+        <w:rPr>
           <w:rtl w:val="0"/>
         </w:rPr>
         <w:t xml:space="preserve">A follow-up pair of questions </w:t>
@@ -2836,19 +2085,11 @@
           <w:ilvl w:val="0"/>
           <w:numId w:val="2"/>
         </w:numPr>
-        <w:spacing w:after="0" w:afterAutospacing="0" w:before="0" w:beforeAutospacing="0" w:line="276" w:lineRule="auto"/>
+        <w:spacing w:after="0" w:afterAutospacing="0" w:before="0" w:beforeAutospacing="0"/>
         <w:ind w:left="720" w:hanging="360"/>
-        <w:rPr>
-          <w:rFonts w:ascii="Garamond" w:cs="Garamond" w:eastAsia="Garamond" w:hAnsi="Garamond"/>
-          <w:sz w:val="24"/>
-          <w:szCs w:val="24"/>
-        </w:rPr>
-      </w:pPr>
-      <w:r>
-        <w:rPr>
-          <w:rFonts w:ascii="Garamond" w:cs="Garamond" w:eastAsia="Garamond" w:hAnsi="Garamond"/>
-          <w:sz w:val="24"/>
-          <w:szCs w:val="24"/>
+      </w:pPr>
+      <w:r>
+        <w:rPr>
           <w:rtl w:val="0"/>
         </w:rPr>
         <w:t xml:space="preserve">The 24 Red Herrings organized into sets</w:t>
@@ -2860,19 +2101,11 @@
           <w:ilvl w:val="0"/>
           <w:numId w:val="2"/>
         </w:numPr>
-        <w:spacing w:before="0" w:beforeAutospacing="0" w:line="276" w:lineRule="auto"/>
+        <w:spacing w:before="0" w:beforeAutospacing="0"/>
         <w:ind w:left="720" w:hanging="360"/>
-        <w:rPr>
-          <w:rFonts w:ascii="Garamond" w:cs="Garamond" w:eastAsia="Garamond" w:hAnsi="Garamond"/>
-          <w:sz w:val="24"/>
-          <w:szCs w:val="24"/>
-        </w:rPr>
-      </w:pPr>
-      <w:r>
-        <w:rPr>
-          <w:rFonts w:ascii="Garamond" w:cs="Garamond" w:eastAsia="Garamond" w:hAnsi="Garamond"/>
-          <w:sz w:val="24"/>
-          <w:szCs w:val="24"/>
+      </w:pPr>
+      <w:r>
+        <w:rPr>
           <w:rtl w:val="0"/>
         </w:rPr>
         <w:t xml:space="preserve">The Response Matrix: 8 × 8 grid of witnesses by questions. Each cell is either the tripwire (for exactly one cell per column and one per row) or an answer containing one piece of information (a clue ID or a red-herring ID) and one opinion expression (marked receptive or not, referencing another witness by name). The matrix is kept in the workbook in two forms: a readable condensed version, and a longform table (one row per cell, with columns for witness, question, item, item type, receptive flag, and text) that the engine reads.</w:t>
@@ -2880,18 +2113,67 @@
     </w:p>
     <w:p>
       <w:pPr>
-        <w:spacing w:before="200" w:line="276" w:lineRule="auto"/>
-        <w:rPr>
-          <w:rFonts w:ascii="Garamond" w:cs="Garamond" w:eastAsia="Garamond" w:hAnsi="Garamond"/>
-          <w:sz w:val="24"/>
-          <w:szCs w:val="24"/>
-        </w:rPr>
+        <w:rPr/>
         <w:sectPr>
+          <w:type w:val="nextPage"/>
           <w:pgSz w:h="15840" w:w="12240" w:orient="portrait"/>
           <w:pgMar w:bottom="1440" w:top="1440" w:left="1440" w:right="1440" w:header="720" w:footer="720"/>
           <w:pgNumType w:start="1"/>
         </w:sectPr>
       </w:pPr>
+      <w:r>
+        <w:rPr>
+          <w:rtl w:val="0"/>
+        </w:rPr>
+      </w:r>
+    </w:p>
+    <w:p>
+      <w:pPr>
+        <w:pStyle w:val="Title"/>
+        <w:keepNext w:val="0"/>
+        <w:keepLines w:val="0"/>
+        <w:pageBreakBefore w:val="0"/>
+        <w:widowControl w:val="0"/>
+        <w:pBdr>
+          <w:top w:space="0" w:sz="0" w:val="nil"/>
+          <w:left w:space="0" w:sz="0" w:val="nil"/>
+          <w:bottom w:space="0" w:sz="0" w:val="nil"/>
+          <w:right w:space="0" w:sz="0" w:val="nil"/>
+          <w:between w:space="0" w:sz="0" w:val="nil"/>
+        </w:pBdr>
+        <w:shd w:fill="auto" w:val="clear"/>
+        <w:spacing w:after="0" w:before="0" w:line="276" w:lineRule="auto"/>
+        <w:ind w:left="0" w:right="0" w:firstLine="0"/>
+        <w:jc w:val="left"/>
+        <w:rPr/>
+        <w:sectPr>
+          <w:type w:val="nextPage"/>
+          <w:pgSz w:h="15840" w:w="12240" w:orient="portrait"/>
+          <w:pgMar w:bottom="1440" w:top="1440" w:left="1440" w:right="1440" w:header="720" w:footer="720"/>
+          <w:pgNumType w:start="1"/>
+        </w:sectPr>
+      </w:pPr>
+      <w:bookmarkStart w:colFirst="0" w:colLast="0" w:name="_wt6ch6dha68z" w:id="13"/>
+      <w:bookmarkEnd w:id="13"/>
+      <w:r>
+        <w:rPr>
+          <w:rFonts w:ascii="Garamond" w:cs="Garamond" w:eastAsia="Garamond" w:hAnsi="Garamond"/>
+          <w:b w:val="1"/>
+          <w:bCs w:val="1"/>
+          <w:i w:val="0"/>
+          <w:iCs w:val="0"/>
+          <w:smallCaps w:val="0"/>
+          <w:strike w:val="0"/>
+          <w:color w:val="000000"/>
+          <w:sz w:val="60"/>
+          <w:szCs w:val="60"/>
+          <w:u w:val="none"/>
+          <w:shd w:fill="auto" w:val="clear"/>
+          <w:vertAlign w:val="baseline"/>
+          <w:rtl w:val="0"/>
+        </w:rPr>
+        <w:t xml:space="preserve">Notes</w:t>
+      </w:r>
       <w:r>
         <w:rPr>
           <w:rtl w:val="0"/>
@@ -3224,11 +2506,64 @@
     </w:p>
     <w:p>
       <w:pPr>
+        <w:pStyle w:val="Title"/>
+        <w:keepNext w:val="0"/>
+        <w:keepLines w:val="0"/>
+        <w:pageBreakBefore w:val="0"/>
+        <w:widowControl w:val="0"/>
+        <w:pBdr>
+          <w:top w:space="0" w:sz="0" w:val="nil"/>
+          <w:left w:space="0" w:sz="0" w:val="nil"/>
+          <w:bottom w:space="0" w:sz="0" w:val="nil"/>
+          <w:right w:space="0" w:sz="0" w:val="nil"/>
+          <w:between w:space="0" w:sz="0" w:val="nil"/>
+        </w:pBdr>
+        <w:shd w:fill="auto" w:val="clear"/>
+        <w:spacing w:after="0" w:before="0" w:line="276" w:lineRule="auto"/>
+        <w:ind w:left="0" w:right="0" w:firstLine="0"/>
+        <w:jc w:val="left"/>
+        <w:rPr/>
+        <w:sectPr>
+          <w:type w:val="nextPage"/>
+          <w:pgSz w:h="15840" w:w="12240" w:orient="portrait"/>
+          <w:pgMar w:bottom="1440" w:top="1440" w:left="1440" w:right="1440" w:header="720" w:footer="720"/>
+          <w:pgNumType w:start="1"/>
+        </w:sectPr>
+      </w:pPr>
+      <w:bookmarkStart w:colFirst="0" w:colLast="0" w:name="_bwq3e0nsr2nk" w:id="14"/>
+      <w:bookmarkEnd w:id="14"/>
+      <w:r>
+        <w:rPr>
+          <w:rFonts w:ascii="Garamond" w:cs="Garamond" w:eastAsia="Garamond" w:hAnsi="Garamond"/>
+          <w:b w:val="1"/>
+          <w:bCs w:val="1"/>
+          <w:i w:val="0"/>
+          <w:iCs w:val="0"/>
+          <w:smallCaps w:val="0"/>
+          <w:strike w:val="0"/>
+          <w:color w:val="000000"/>
+          <w:sz w:val="60"/>
+          <w:szCs w:val="60"/>
+          <w:u w:val="none"/>
+          <w:shd w:fill="auto" w:val="clear"/>
+          <w:vertAlign w:val="baseline"/>
+          <w:rtl w:val="0"/>
+        </w:rPr>
+        <w:t xml:space="preserve">Rules of the game</w:t>
+      </w:r>
+      <w:r>
+        <w:rPr>
+          <w:rtl w:val="0"/>
+        </w:rPr>
+      </w:r>
+    </w:p>
+    <w:p>
+      <w:pPr>
         <w:pStyle w:val="Heading1"/>
         <w:rPr/>
       </w:pPr>
-      <w:bookmarkStart w:colFirst="0" w:colLast="0" w:name="_xsv09x7iedko" w:id="12"/>
-      <w:bookmarkEnd w:id="12"/>
+      <w:bookmarkStart w:colFirst="0" w:colLast="0" w:name="_xsv09x7iedko" w:id="15"/>
+      <w:bookmarkEnd w:id="15"/>
       <w:r>
         <w:rPr>
           <w:rtl w:val="0"/>
@@ -3390,163 +2725,22 @@
     </w:p>
     <w:p>
       <w:pPr>
-        <w:pStyle w:val="Heading1"/>
-        <w:rPr/>
-      </w:pPr>
-      <w:bookmarkStart w:colFirst="0" w:colLast="0" w:name="_gca2y5oth70s" w:id="13"/>
-      <w:bookmarkEnd w:id="13"/>
-      <w:r>
-        <w:rPr>
-          <w:rtl w:val="0"/>
-        </w:rPr>
-        <w:t xml:space="preserve">The HEAR framework</w:t>
-      </w:r>
-    </w:p>
-    <w:p>
-      <w:pPr>
-        <w:rPr/>
-      </w:pPr>
-      <w:r>
-        <w:rPr>
-          <w:rtl w:val="0"/>
-        </w:rPr>
-        <w:t xml:space="preserve">Conversational receptiveness is a willingness to engage with opposing views, shown through the words you use. Research by Julia Minson and colleagues found four markers that make someone come across as receptive:</w:t>
-      </w:r>
-    </w:p>
-    <w:p>
-      <w:pPr>
-        <w:pStyle w:val="Heading2"/>
-        <w:numPr>
-          <w:ilvl w:val="0"/>
-          <w:numId w:val="4"/>
-        </w:numPr>
-        <w:ind w:left="720" w:hanging="360"/>
-        <w:rPr>
-          <w:sz w:val="32"/>
-          <w:szCs w:val="32"/>
-        </w:rPr>
-      </w:pPr>
-      <w:bookmarkStart w:colFirst="0" w:colLast="0" w:name="_15kfzlgp827m" w:id="14"/>
-      <w:bookmarkEnd w:id="14"/>
-      <w:r>
-        <w:rPr>
-          <w:rtl w:val="0"/>
-        </w:rPr>
-        <w:t xml:space="preserve">Hedge your claims</w:t>
-      </w:r>
-    </w:p>
-    <w:p>
-      <w:pPr>
-        <w:rPr/>
-      </w:pPr>
-      <w:r>
-        <w:rPr>
-          <w:rtl w:val="0"/>
-        </w:rPr>
-        <w:t xml:space="preserve">Leave space alongside your views: “I think”, “it's possible that”, “I could be misreading this”.</w:t>
-      </w:r>
-    </w:p>
-    <w:p>
-      <w:pPr>
-        <w:pStyle w:val="Heading2"/>
-        <w:numPr>
-          <w:ilvl w:val="0"/>
-          <w:numId w:val="4"/>
-        </w:numPr>
-        <w:ind w:left="720" w:hanging="360"/>
-        <w:rPr>
-          <w:sz w:val="32"/>
-          <w:szCs w:val="32"/>
-        </w:rPr>
-      </w:pPr>
-      <w:bookmarkStart w:colFirst="0" w:colLast="0" w:name="_14bj2v2wcr9b" w:id="15"/>
-      <w:bookmarkEnd w:id="15"/>
-      <w:r>
-        <w:rPr>
-          <w:rtl w:val="0"/>
-        </w:rPr>
-        <w:t xml:space="preserve">Emphasize agreement</w:t>
-      </w:r>
-    </w:p>
-    <w:p>
-      <w:pPr>
-        <w:rPr/>
-      </w:pPr>
-      <w:r>
-        <w:rPr>
-          <w:rtl w:val="0"/>
-        </w:rPr>
-        <w:t xml:space="preserve">Find common ground: “We both want…”, “I agree that…”.</w:t>
-      </w:r>
-    </w:p>
-    <w:p>
-      <w:pPr>
-        <w:pStyle w:val="Heading2"/>
-        <w:numPr>
-          <w:ilvl w:val="0"/>
-          <w:numId w:val="4"/>
-        </w:numPr>
-        <w:ind w:left="720" w:hanging="360"/>
-        <w:rPr>
-          <w:sz w:val="32"/>
-          <w:szCs w:val="32"/>
-        </w:rPr>
-      </w:pPr>
-      <w:bookmarkStart w:colFirst="0" w:colLast="0" w:name="_zheajp4hsm8n" w:id="16"/>
-      <w:bookmarkEnd w:id="16"/>
-      <w:r>
-        <w:rPr>
-          <w:rtl w:val="0"/>
-        </w:rPr>
-        <w:t xml:space="preserve">Acknowledge the other's perspective</w:t>
-      </w:r>
-    </w:p>
-    <w:p>
-      <w:pPr>
-        <w:rPr/>
-      </w:pPr>
-      <w:r>
-        <w:rPr>
-          <w:rtl w:val="0"/>
-        </w:rPr>
-        <w:t xml:space="preserve">Show you have understood: “I understand that you…”, “You're right that…”.</w:t>
-      </w:r>
-    </w:p>
-    <w:p>
-      <w:pPr>
-        <w:pStyle w:val="Heading2"/>
-        <w:numPr>
-          <w:ilvl w:val="0"/>
-          <w:numId w:val="4"/>
-        </w:numPr>
-        <w:ind w:left="720" w:hanging="360"/>
-        <w:rPr>
-          <w:sz w:val="32"/>
-          <w:szCs w:val="32"/>
-        </w:rPr>
-      </w:pPr>
-      <w:bookmarkStart w:colFirst="0" w:colLast="0" w:name="_47i9enf78bla" w:id="17"/>
-      <w:bookmarkEnd w:id="17"/>
-      <w:r>
-        <w:rPr>
-          <w:rtl w:val="0"/>
-        </w:rPr>
-        <w:t xml:space="preserve">Reframe to the positive</w:t>
-      </w:r>
-    </w:p>
-    <w:p>
-      <w:pPr>
-        <w:rPr/>
-      </w:pPr>
-      <w:r>
-        <w:rPr>
-          <w:rtl w:val="0"/>
-        </w:rPr>
-        <w:t xml:space="preserve">Say what you want rather than what you oppose, avoid dismissive language such as “that's wrong” or “no serious person thinks…”.</w:t>
-      </w:r>
-    </w:p>
-    <w:p>
-      <w:pPr>
+        <w:pStyle w:val="Title"/>
+        <w:keepNext w:val="0"/>
+        <w:keepLines w:val="0"/>
+        <w:pageBreakBefore w:val="0"/>
+        <w:widowControl w:val="0"/>
+        <w:pBdr>
+          <w:top w:space="0" w:sz="0" w:val="nil"/>
+          <w:left w:space="0" w:sz="0" w:val="nil"/>
+          <w:bottom w:space="0" w:sz="0" w:val="nil"/>
+          <w:right w:space="0" w:sz="0" w:val="nil"/>
+          <w:between w:space="0" w:sz="0" w:val="nil"/>
+        </w:pBdr>
+        <w:shd w:fill="auto" w:val="clear"/>
+        <w:spacing w:after="0" w:before="0" w:line="276" w:lineRule="auto"/>
+        <w:ind w:left="0" w:right="0" w:firstLine="0"/>
+        <w:jc w:val="left"/>
         <w:rPr/>
         <w:sectPr>
           <w:type w:val="nextPage"/>
@@ -3555,11 +2749,31 @@
           <w:pgNumType w:start="1"/>
         </w:sectPr>
       </w:pPr>
-      <w:r>
-        <w:rPr>
-          <w:rtl w:val="0"/>
-        </w:rPr>
-        <w:t xml:space="preserve">Unreceptive language states opinions flatly, generalizes about the other person, attributes motives, or dismisses them. Listen for both kinds as the witnesses talk about the controversy.</w:t>
+      <w:bookmarkStart w:colFirst="0" w:colLast="0" w:name="_3avzbovopry" w:id="16"/>
+      <w:bookmarkEnd w:id="16"/>
+      <w:r>
+        <w:rPr>
+          <w:rFonts w:ascii="Garamond" w:cs="Garamond" w:eastAsia="Garamond" w:hAnsi="Garamond"/>
+          <w:b w:val="1"/>
+          <w:bCs w:val="1"/>
+          <w:i w:val="0"/>
+          <w:iCs w:val="0"/>
+          <w:smallCaps w:val="0"/>
+          <w:strike w:val="0"/>
+          <w:color w:val="000000"/>
+          <w:sz w:val="60"/>
+          <w:szCs w:val="60"/>
+          <w:u w:val="none"/>
+          <w:shd w:fill="auto" w:val="clear"/>
+          <w:vertAlign w:val="baseline"/>
+          <w:rtl w:val="0"/>
+        </w:rPr>
+        <w:t xml:space="preserve">HEAR Framework introduction</w:t>
+      </w:r>
+      <w:r>
+        <w:rPr>
+          <w:rtl w:val="0"/>
+        </w:rPr>
       </w:r>
     </w:p>
     <w:p>
@@ -3567,8 +2781,235 @@
         <w:pStyle w:val="Heading1"/>
         <w:rPr/>
       </w:pPr>
-      <w:bookmarkStart w:colFirst="0" w:colLast="0" w:name="_uynt6v9uhldf" w:id="18"/>
+      <w:bookmarkStart w:colFirst="0" w:colLast="0" w:name="_gca2y5oth70s" w:id="17"/>
+      <w:bookmarkEnd w:id="17"/>
+      <w:r>
+        <w:rPr>
+          <w:rtl w:val="0"/>
+        </w:rPr>
+        <w:t xml:space="preserve">The HEAR framework</w:t>
+      </w:r>
+    </w:p>
+    <w:p>
+      <w:pPr>
+        <w:rPr/>
+      </w:pPr>
+      <w:r>
+        <w:rPr>
+          <w:rtl w:val="0"/>
+        </w:rPr>
+        <w:t xml:space="preserve">Conversational receptiveness is a willingness to engage with opposing views, shown through the words you use. Research by Julia Minson and colleagues found four markers that make someone come across as receptive:</w:t>
+      </w:r>
+    </w:p>
+    <w:p>
+      <w:pPr>
+        <w:pStyle w:val="Heading2"/>
+        <w:numPr>
+          <w:ilvl w:val="0"/>
+          <w:numId w:val="4"/>
+        </w:numPr>
+        <w:ind w:left="720" w:hanging="360"/>
+        <w:rPr>
+          <w:sz w:val="32"/>
+          <w:szCs w:val="32"/>
+        </w:rPr>
+      </w:pPr>
+      <w:bookmarkStart w:colFirst="0" w:colLast="0" w:name="_15kfzlgp827m" w:id="18"/>
       <w:bookmarkEnd w:id="18"/>
+      <w:r>
+        <w:rPr>
+          <w:rtl w:val="0"/>
+        </w:rPr>
+        <w:t xml:space="preserve">Hedge your claims</w:t>
+      </w:r>
+    </w:p>
+    <w:p>
+      <w:pPr>
+        <w:rPr/>
+      </w:pPr>
+      <w:r>
+        <w:rPr>
+          <w:rtl w:val="0"/>
+        </w:rPr>
+        <w:t xml:space="preserve">Leave space alongside your views: “I think”, “it's possible that”, “I could be misreading this”.</w:t>
+      </w:r>
+    </w:p>
+    <w:p>
+      <w:pPr>
+        <w:pStyle w:val="Heading2"/>
+        <w:numPr>
+          <w:ilvl w:val="0"/>
+          <w:numId w:val="4"/>
+        </w:numPr>
+        <w:ind w:left="720" w:hanging="360"/>
+        <w:rPr>
+          <w:sz w:val="32"/>
+          <w:szCs w:val="32"/>
+        </w:rPr>
+      </w:pPr>
+      <w:bookmarkStart w:colFirst="0" w:colLast="0" w:name="_14bj2v2wcr9b" w:id="19"/>
+      <w:bookmarkEnd w:id="19"/>
+      <w:r>
+        <w:rPr>
+          <w:rtl w:val="0"/>
+        </w:rPr>
+        <w:t xml:space="preserve">Emphasize agreement</w:t>
+      </w:r>
+    </w:p>
+    <w:p>
+      <w:pPr>
+        <w:rPr/>
+      </w:pPr>
+      <w:r>
+        <w:rPr>
+          <w:rtl w:val="0"/>
+        </w:rPr>
+        <w:t xml:space="preserve">Find common ground: “We both want…”, “I agree that…”.</w:t>
+      </w:r>
+    </w:p>
+    <w:p>
+      <w:pPr>
+        <w:pStyle w:val="Heading2"/>
+        <w:numPr>
+          <w:ilvl w:val="0"/>
+          <w:numId w:val="4"/>
+        </w:numPr>
+        <w:ind w:left="720" w:hanging="360"/>
+        <w:rPr>
+          <w:sz w:val="32"/>
+          <w:szCs w:val="32"/>
+        </w:rPr>
+      </w:pPr>
+      <w:bookmarkStart w:colFirst="0" w:colLast="0" w:name="_zheajp4hsm8n" w:id="20"/>
+      <w:bookmarkEnd w:id="20"/>
+      <w:r>
+        <w:rPr>
+          <w:rtl w:val="0"/>
+        </w:rPr>
+        <w:t xml:space="preserve">Acknowledge the other's perspective</w:t>
+      </w:r>
+    </w:p>
+    <w:p>
+      <w:pPr>
+        <w:rPr/>
+      </w:pPr>
+      <w:r>
+        <w:rPr>
+          <w:rtl w:val="0"/>
+        </w:rPr>
+        <w:t xml:space="preserve">Show you have understood: “I understand that you…”, “You're right that…”.</w:t>
+      </w:r>
+    </w:p>
+    <w:p>
+      <w:pPr>
+        <w:pStyle w:val="Heading2"/>
+        <w:numPr>
+          <w:ilvl w:val="0"/>
+          <w:numId w:val="4"/>
+        </w:numPr>
+        <w:ind w:left="720" w:hanging="360"/>
+        <w:rPr>
+          <w:sz w:val="32"/>
+          <w:szCs w:val="32"/>
+        </w:rPr>
+      </w:pPr>
+      <w:bookmarkStart w:colFirst="0" w:colLast="0" w:name="_47i9enf78bla" w:id="21"/>
+      <w:bookmarkEnd w:id="21"/>
+      <w:r>
+        <w:rPr>
+          <w:rtl w:val="0"/>
+        </w:rPr>
+        <w:t xml:space="preserve">Reframe to the positive</w:t>
+      </w:r>
+    </w:p>
+    <w:p>
+      <w:pPr>
+        <w:rPr/>
+      </w:pPr>
+      <w:r>
+        <w:rPr>
+          <w:rtl w:val="0"/>
+        </w:rPr>
+        <w:t xml:space="preserve">Say what you want rather than what you oppose, avoid dismissive language such as “that's wrong” or “no serious person thinks…”.</w:t>
+      </w:r>
+    </w:p>
+    <w:p>
+      <w:pPr>
+        <w:rPr/>
+        <w:sectPr>
+          <w:type w:val="nextPage"/>
+          <w:pgSz w:h="15840" w:w="12240" w:orient="portrait"/>
+          <w:pgMar w:bottom="1440" w:top="1440" w:left="1440" w:right="1440" w:header="720" w:footer="720"/>
+          <w:pgNumType w:start="1"/>
+        </w:sectPr>
+      </w:pPr>
+      <w:r>
+        <w:rPr>
+          <w:rtl w:val="0"/>
+        </w:rPr>
+        <w:t xml:space="preserve">Unreceptive language states opinions flatly, generalizes about the other person, attributes motives, or dismisses them. Listen for both kinds as the witnesses talk about the controversy.</w:t>
+      </w:r>
+    </w:p>
+    <w:p>
+      <w:pPr>
+        <w:pStyle w:val="Title"/>
+        <w:keepNext w:val="0"/>
+        <w:keepLines w:val="0"/>
+        <w:pageBreakBefore w:val="0"/>
+        <w:widowControl w:val="0"/>
+        <w:pBdr>
+          <w:top w:space="0" w:sz="0" w:val="nil"/>
+          <w:left w:space="0" w:sz="0" w:val="nil"/>
+          <w:bottom w:space="0" w:sz="0" w:val="nil"/>
+          <w:right w:space="0" w:sz="0" w:val="nil"/>
+          <w:between w:space="0" w:sz="0" w:val="nil"/>
+        </w:pBdr>
+        <w:shd w:fill="auto" w:val="clear"/>
+        <w:spacing w:after="0" w:before="0" w:line="276" w:lineRule="auto"/>
+        <w:ind w:left="0" w:right="0" w:firstLine="0"/>
+        <w:jc w:val="left"/>
+        <w:rPr/>
+        <w:sectPr>
+          <w:type w:val="nextPage"/>
+          <w:pgSz w:h="15840" w:w="12240" w:orient="portrait"/>
+          <w:pgMar w:bottom="1440" w:top="1440" w:left="1440" w:right="1440" w:header="720" w:footer="720"/>
+          <w:pgNumType w:start="1"/>
+        </w:sectPr>
+      </w:pPr>
+      <w:bookmarkStart w:colFirst="0" w:colLast="0" w:name="_z94m9lw7oxvw" w:id="22"/>
+      <w:bookmarkEnd w:id="22"/>
+      <w:r>
+        <w:rPr>
+          <w:rFonts w:ascii="Garamond" w:cs="Garamond" w:eastAsia="Garamond" w:hAnsi="Garamond"/>
+          <w:b w:val="1"/>
+          <w:bCs w:val="1"/>
+          <w:i w:val="0"/>
+          <w:iCs w:val="0"/>
+          <w:smallCaps w:val="0"/>
+          <w:strike w:val="0"/>
+          <w:color w:val="000000"/>
+          <w:sz w:val="60"/>
+          <w:szCs w:val="60"/>
+          <w:u w:val="none"/>
+          <w:shd w:fill="auto" w:val="clear"/>
+          <w:vertAlign w:val="baseline"/>
+          <w:rtl w:val="0"/>
+        </w:rPr>
+        <w:t xml:space="preserve">Game facts</w:t>
+      </w:r>
+      <w:r>
+        <w:rPr>
+          <w:rtl w:val="0"/>
+        </w:rPr>
+      </w:r>
+    </w:p>
+    <w:p>
+      <w:pPr>
+        <w:pStyle w:val="Heading1"/>
+        <w:rPr/>
+      </w:pPr>
+      <w:bookmarkStart w:colFirst="0" w:colLast="0" w:name="_uynt6v9uhldf" w:id="23"/>
+      <w:bookmarkEnd w:id="23"/>
       <w:r>
         <w:rPr>
           <w:rtl w:val="0"/>
@@ -5257,11 +4698,64 @@
     </w:p>
     <w:p>
       <w:pPr>
+        <w:pStyle w:val="Title"/>
+        <w:keepNext w:val="0"/>
+        <w:keepLines w:val="0"/>
+        <w:pageBreakBefore w:val="0"/>
+        <w:widowControl w:val="0"/>
+        <w:pBdr>
+          <w:top w:space="0" w:sz="0" w:val="nil"/>
+          <w:left w:space="0" w:sz="0" w:val="nil"/>
+          <w:bottom w:space="0" w:sz="0" w:val="nil"/>
+          <w:right w:space="0" w:sz="0" w:val="nil"/>
+          <w:between w:space="0" w:sz="0" w:val="nil"/>
+        </w:pBdr>
+        <w:shd w:fill="auto" w:val="clear"/>
+        <w:spacing w:after="0" w:before="0" w:line="276" w:lineRule="auto"/>
+        <w:ind w:left="0" w:right="0" w:firstLine="0"/>
+        <w:jc w:val="left"/>
+        <w:rPr/>
+        <w:sectPr>
+          <w:type w:val="nextPage"/>
+          <w:pgSz w:h="15840" w:w="12240" w:orient="portrait"/>
+          <w:pgMar w:bottom="1440" w:top="1440" w:left="1440" w:right="1440" w:header="720" w:footer="720"/>
+          <w:pgNumType w:start="1"/>
+        </w:sectPr>
+      </w:pPr>
+      <w:bookmarkStart w:colFirst="0" w:colLast="0" w:name="_4axz1vaei2kc" w:id="24"/>
+      <w:bookmarkEnd w:id="24"/>
+      <w:r>
+        <w:rPr>
+          <w:rFonts w:ascii="Garamond" w:cs="Garamond" w:eastAsia="Garamond" w:hAnsi="Garamond"/>
+          <w:b w:val="1"/>
+          <w:bCs w:val="1"/>
+          <w:i w:val="0"/>
+          <w:iCs w:val="0"/>
+          <w:smallCaps w:val="0"/>
+          <w:strike w:val="0"/>
+          <w:color w:val="000000"/>
+          <w:sz w:val="60"/>
+          <w:szCs w:val="60"/>
+          <w:u w:val="none"/>
+          <w:shd w:fill="auto" w:val="clear"/>
+          <w:vertAlign w:val="baseline"/>
+          <w:rtl w:val="0"/>
+        </w:rPr>
+        <w:t xml:space="preserve">Game text</w:t>
+      </w:r>
+      <w:r>
+        <w:rPr>
+          <w:rtl w:val="0"/>
+        </w:rPr>
+      </w:r>
+    </w:p>
+    <w:p>
+      <w:pPr>
         <w:pStyle w:val="Heading1"/>
         <w:rPr/>
       </w:pPr>
-      <w:bookmarkStart w:colFirst="0" w:colLast="0" w:name="_f5xcdpggf68j" w:id="19"/>
-      <w:bookmarkEnd w:id="19"/>
+      <w:bookmarkStart w:colFirst="0" w:colLast="0" w:name="_f5xcdpggf68j" w:id="25"/>
+      <w:bookmarkEnd w:id="25"/>
       <w:r>
         <w:rPr>
           <w:rtl w:val="0"/>
@@ -6081,9 +5575,8 @@
   <w:footnote w:id="0">
     <w:p>
       <w:pPr>
-        <w:spacing w:line="240" w:lineRule="auto"/>
-        <w:rPr>
-          <w:rFonts w:ascii="Garamond" w:cs="Garamond" w:eastAsia="Garamond" w:hAnsi="Garamond"/>
+        <w:spacing w:before="0" w:line="240" w:lineRule="auto"/>
+        <w:rPr>
           <w:sz w:val="20"/>
           <w:szCs w:val="20"/>
         </w:rPr>
@@ -6097,7 +5590,6 @@
       </w:r>
       <w:r>
         <w:rPr>
-          <w:rFonts w:ascii="Garamond" w:cs="Garamond" w:eastAsia="Garamond" w:hAnsi="Garamond"/>
           <w:sz w:val="20"/>
           <w:szCs w:val="20"/>
           <w:rtl w:val="0"/>
@@ -6106,7 +5598,6 @@
       </w:r>
       <w:r>
         <w:rPr>
-          <w:rFonts w:ascii="Garamond" w:cs="Garamond" w:eastAsia="Garamond" w:hAnsi="Garamond"/>
           <w:i w:val="1"/>
           <w:iCs w:val="1"/>
           <w:sz w:val="20"/>
@@ -6117,7 +5608,6 @@
       </w:r>
       <w:r>
         <w:rPr>
-          <w:rFonts w:ascii="Garamond" w:cs="Garamond" w:eastAsia="Garamond" w:hAnsi="Garamond"/>
           <w:sz w:val="20"/>
           <w:szCs w:val="20"/>
           <w:rtl w:val="0"/>
@@ -6127,7 +5617,6 @@
       <w:hyperlink r:id="rId1">
         <w:r>
           <w:rPr>
-            <w:rFonts w:ascii="Garamond" w:cs="Garamond" w:eastAsia="Garamond" w:hAnsi="Garamond"/>
             <w:color w:val="1155cc"/>
             <w:sz w:val="20"/>
             <w:szCs w:val="20"/>
@@ -6145,9 +5634,8 @@
     </w:p>
     <w:p>
       <w:pPr>
-        <w:spacing w:line="240" w:lineRule="auto"/>
-        <w:rPr>
-          <w:rFonts w:ascii="Garamond" w:cs="Garamond" w:eastAsia="Garamond" w:hAnsi="Garamond"/>
+        <w:spacing w:before="0" w:line="240" w:lineRule="auto"/>
+        <w:rPr>
           <w:sz w:val="20"/>
           <w:szCs w:val="20"/>
         </w:rPr>
@@ -6162,9 +5650,8 @@
   <w:footnote w:id="1">
     <w:p>
       <w:pPr>
-        <w:spacing w:line="240" w:lineRule="auto"/>
-        <w:rPr>
-          <w:rFonts w:ascii="Garamond" w:cs="Garamond" w:eastAsia="Garamond" w:hAnsi="Garamond"/>
+        <w:spacing w:before="0" w:line="240" w:lineRule="auto"/>
+        <w:rPr>
           <w:sz w:val="20"/>
           <w:szCs w:val="20"/>
         </w:rPr>
@@ -6178,7 +5665,6 @@
       </w:r>
       <w:r>
         <w:rPr>
-          <w:rFonts w:ascii="Garamond" w:cs="Garamond" w:eastAsia="Garamond" w:hAnsi="Garamond"/>
           <w:sz w:val="20"/>
           <w:szCs w:val="20"/>
           <w:rtl w:val="0"/>
@@ -6187,7 +5673,6 @@
       </w:r>
       <w:r>
         <w:rPr>
-          <w:rFonts w:ascii="Garamond" w:cs="Garamond" w:eastAsia="Garamond" w:hAnsi="Garamond"/>
           <w:i w:val="1"/>
           <w:iCs w:val="1"/>
           <w:sz w:val="20"/>
@@ -6198,7 +5683,6 @@
       </w:r>
       <w:r>
         <w:rPr>
-          <w:rFonts w:ascii="Garamond" w:cs="Garamond" w:eastAsia="Garamond" w:hAnsi="Garamond"/>
           <w:sz w:val="20"/>
           <w:szCs w:val="20"/>
           <w:rtl w:val="0"/>
@@ -6210,9 +5694,8 @@
   <w:footnote w:id="2">
     <w:p>
       <w:pPr>
-        <w:spacing w:line="240" w:lineRule="auto"/>
-        <w:rPr>
-          <w:rFonts w:ascii="Garamond" w:cs="Garamond" w:eastAsia="Garamond" w:hAnsi="Garamond"/>
+        <w:spacing w:before="0" w:line="240" w:lineRule="auto"/>
+        <w:rPr>
           <w:sz w:val="20"/>
           <w:szCs w:val="20"/>
         </w:rPr>
@@ -6226,7 +5709,6 @@
       </w:r>
       <w:r>
         <w:rPr>
-          <w:rFonts w:ascii="Garamond" w:cs="Garamond" w:eastAsia="Garamond" w:hAnsi="Garamond"/>
           <w:sz w:val="20"/>
           <w:szCs w:val="20"/>
           <w:rtl w:val="0"/>
@@ -6238,9 +5720,8 @@
   <w:footnote w:id="3">
     <w:p>
       <w:pPr>
-        <w:spacing w:line="240" w:lineRule="auto"/>
-        <w:rPr>
-          <w:rFonts w:ascii="Garamond" w:cs="Garamond" w:eastAsia="Garamond" w:hAnsi="Garamond"/>
+        <w:spacing w:before="0" w:line="240" w:lineRule="auto"/>
+        <w:rPr>
           <w:sz w:val="20"/>
           <w:szCs w:val="20"/>
         </w:rPr>
@@ -6254,7 +5735,6 @@
       </w:r>
       <w:r>
         <w:rPr>
-          <w:rFonts w:ascii="Garamond" w:cs="Garamond" w:eastAsia="Garamond" w:hAnsi="Garamond"/>
           <w:sz w:val="20"/>
           <w:szCs w:val="20"/>
           <w:rtl w:val="0"/>
@@ -6266,9 +5746,8 @@
   <w:footnote w:id="4">
     <w:p>
       <w:pPr>
-        <w:spacing w:line="240" w:lineRule="auto"/>
-        <w:rPr>
-          <w:rFonts w:ascii="Garamond" w:cs="Garamond" w:eastAsia="Garamond" w:hAnsi="Garamond"/>
+        <w:spacing w:before="0" w:line="240" w:lineRule="auto"/>
+        <w:rPr>
           <w:sz w:val="20"/>
           <w:szCs w:val="20"/>
         </w:rPr>
@@ -6282,7 +5761,6 @@
       </w:r>
       <w:r>
         <w:rPr>
-          <w:rFonts w:ascii="Garamond" w:cs="Garamond" w:eastAsia="Garamond" w:hAnsi="Garamond"/>
           <w:sz w:val="20"/>
           <w:szCs w:val="20"/>
           <w:rtl w:val="0"/>

</xml_diff>

<commit_message>
Match the matrix to the packet: Mira Shah's Q1 answer
The packet's Q1 answer for Mira Shah was edited in the Doc on 2026-10-23,
and the build stopped because the matrix still had the old text. Updated
Long table!I2 and Grid!B2 to the packet's wording and rebuilt from fresh
downloads of every Google file.

Co-Authored-By: Claude Opus 5.5 <noreply@anthropic.com>
Claude-Session: https://claude.ai/code/session_01UWGiTYgXBTbZkRBxpJsd7r
</commit_message>
<xml_diff>
--- a/engine/HEARsay mysteries.docx
+++ b/engine/HEARsay mysteries.docx
@@ -6,42 +6,93 @@
     <w:p>
       <w:pPr>
         <w:pStyle w:val="Title"/>
-        <w:spacing w:after="60" w:before="200" w:line="276" w:lineRule="auto"/>
-        <w:jc w:val="center"/>
+        <w:keepNext w:val="0"/>
+        <w:keepLines w:val="0"/>
+        <w:pageBreakBefore w:val="0"/>
+        <w:widowControl w:val="0"/>
+        <w:pBdr>
+          <w:top w:space="0" w:sz="0" w:val="nil"/>
+          <w:left w:space="0" w:sz="0" w:val="nil"/>
+          <w:bottom w:space="0" w:sz="0" w:val="nil"/>
+          <w:right w:space="0" w:sz="0" w:val="nil"/>
+          <w:between w:space="0" w:sz="0" w:val="nil"/>
+        </w:pBdr>
+        <w:shd w:fill="auto" w:val="clear"/>
+        <w:spacing w:after="0" w:before="0" w:line="276" w:lineRule="auto"/>
+        <w:ind w:left="0" w:right="0" w:firstLine="0"/>
+        <w:jc w:val="left"/>
+        <w:rPr>
+          <w:rFonts w:ascii="Arial" w:cs="Arial" w:eastAsia="Arial" w:hAnsi="Arial"/>
+          <w:b w:val="0"/>
+          <w:bCs w:val="0"/>
+          <w:i w:val="0"/>
+          <w:iCs w:val="0"/>
+          <w:smallCaps w:val="0"/>
+          <w:strike w:val="0"/>
+          <w:color w:val="000000"/>
+          <w:sz w:val="22"/>
+          <w:szCs w:val="22"/>
+          <w:u w:val="none"/>
+          <w:shd w:fill="auto" w:val="clear"/>
+          <w:vertAlign w:val="baseline"/>
+        </w:rPr>
+        <w:sectPr>
+          <w:pgSz w:h="15840" w:w="12240" w:orient="portrait"/>
+          <w:pgMar w:bottom="1440" w:top="1440" w:left="1440" w:right="1440" w:header="720" w:footer="720"/>
+          <w:pgNumType w:start="1"/>
+        </w:sectPr>
+      </w:pPr>
+      <w:bookmarkStart w:colFirst="0" w:colLast="0" w:name="_2n7zlsvrolsl" w:id="0"/>
+      <w:bookmarkEnd w:id="0"/>
+      <w:r>
         <w:rPr>
           <w:rFonts w:ascii="Garamond" w:cs="Garamond" w:eastAsia="Garamond" w:hAnsi="Garamond"/>
+          <w:b w:val="1"/>
+          <w:bCs w:val="1"/>
+          <w:i w:val="0"/>
+          <w:iCs w:val="0"/>
+          <w:smallCaps w:val="0"/>
+          <w:strike w:val="0"/>
+          <w:color w:val="000000"/>
           <w:sz w:val="60"/>
           <w:szCs w:val="60"/>
-        </w:rPr>
-      </w:pPr>
-      <w:bookmarkStart w:colFirst="0" w:colLast="0" w:name="_ik0ajinzayw4" w:id="0"/>
-      <w:bookmarkEnd w:id="0"/>
-      <w:r>
-        <w:rPr>
-          <w:rFonts w:ascii="Garamond" w:cs="Garamond" w:eastAsia="Garamond" w:hAnsi="Garamond"/>
-          <w:sz w:val="60"/>
-          <w:szCs w:val="60"/>
+          <w:u w:val="none"/>
+          <w:shd w:fill="auto" w:val="clear"/>
+          <w:vertAlign w:val="baseline"/>
           <w:rtl w:val="0"/>
         </w:rPr>
         <w:t xml:space="preserve">HEARsay Mysteries</w:t>
       </w:r>
+      <w:r>
+        <w:rPr>
+          <w:rtl w:val="0"/>
+        </w:rPr>
+      </w:r>
+    </w:p>
+    <w:p>
+      <w:pPr>
+        <w:pStyle w:val="Title"/>
+        <w:jc w:val="center"/>
+        <w:rPr/>
+      </w:pPr>
+      <w:bookmarkStart w:colFirst="0" w:colLast="0" w:name="_ik0ajinzayw4" w:id="1"/>
+      <w:bookmarkEnd w:id="1"/>
+      <w:r>
+        <w:rPr>
+          <w:rtl w:val="0"/>
+        </w:rPr>
+        <w:t xml:space="preserve">HEARsay Mysteries</w:t>
+      </w:r>
     </w:p>
     <w:p>
       <w:pPr>
         <w:pStyle w:val="Subtitle"/>
-        <w:spacing w:after="320" w:before="200" w:line="276" w:lineRule="auto"/>
-        <w:jc w:val="center"/>
-        <w:rPr>
-          <w:sz w:val="22"/>
-          <w:szCs w:val="22"/>
-        </w:rPr>
-      </w:pPr>
-      <w:bookmarkStart w:colFirst="0" w:colLast="0" w:name="_rjfdtmwzzd07" w:id="1"/>
-      <w:bookmarkEnd w:id="1"/>
-      <w:r>
-        <w:rPr>
-          <w:sz w:val="22"/>
-          <w:szCs w:val="22"/>
+        <w:rPr/>
+      </w:pPr>
+      <w:bookmarkStart w:colFirst="0" w:colLast="0" w:name="_rjfdtmwzzd07" w:id="2"/>
+      <w:bookmarkEnd w:id="2"/>
+      <w:r>
+        <w:rPr>
           <w:rtl w:val="0"/>
         </w:rPr>
         <w:t xml:space="preserve">A mystery game framework for teaching and practicing the HEAR framework</w:t>
@@ -50,15 +101,13 @@
     <w:p>
       <w:pPr>
         <w:pStyle w:val="Subtitle"/>
-        <w:spacing w:after="320" w:before="200" w:line="276" w:lineRule="auto"/>
-        <w:jc w:val="center"/>
         <w:rPr>
           <w:sz w:val="20"/>
           <w:szCs w:val="20"/>
         </w:rPr>
       </w:pPr>
-      <w:bookmarkStart w:colFirst="0" w:colLast="0" w:name="_dhe0haaxgpbf" w:id="2"/>
-      <w:bookmarkEnd w:id="2"/>
+      <w:bookmarkStart w:colFirst="0" w:colLast="0" w:name="_dhe0haaxgpbf" w:id="3"/>
+      <w:bookmarkEnd w:id="3"/>
       <w:r>
         <w:rPr>
           <w:sz w:val="20"/>
@@ -70,31 +119,22 @@
     </w:p>
     <w:p>
       <w:pPr>
-        <w:spacing w:before="200" w:line="276" w:lineRule="auto"/>
-        <w:rPr>
-          <w:rFonts w:ascii="Garamond" w:cs="Garamond" w:eastAsia="Garamond" w:hAnsi="Garamond"/>
-          <w:sz w:val="24"/>
-          <w:szCs w:val="24"/>
-        </w:rPr>
-      </w:pPr>
-      <w:r>
-        <w:rPr>
-          <w:rFonts w:ascii="Garamond" w:cs="Garamond" w:eastAsia="Garamond" w:hAnsi="Garamond"/>
-          <w:sz w:val="24"/>
-          <w:szCs w:val="24"/>
-        </w:rPr>
+        <w:rPr/>
+      </w:pPr>
+      <w:r>
+        <w:rPr/>
         <mc:AlternateContent>
           <mc:Choice Requires="wpg">
             <w:drawing>
               <wp:inline distB="114300" distT="114300" distL="114300" distR="114300">
                 <wp:extent cx="6510258" cy="892601"/>
                 <wp:effectExtent b="0" l="0" r="0" t="0"/>
-                <wp:docPr id="2" name=""/>
+                <wp:docPr id="1" name=""/>
                 <a:graphic>
                   <a:graphicData uri="http://schemas.microsoft.com/office/word/2010/wordprocessingShape">
                     <wps:wsp>
                       <wps:cNvSpPr txBox="1"/>
-                      <wps:cNvPr id="3" name="Shape 3"/>
+                      <wps:cNvPr id="2" name="Shape 2"/>
                       <wps:spPr>
                         <a:xfrm>
                           <a:off x="0" y="872975"/>
@@ -201,12 +241,12 @@
               <wp:inline distB="114300" distT="114300" distL="114300" distR="114300">
                 <wp:extent cx="6510258" cy="892601"/>
                 <wp:effectExtent b="0" l="0" r="0" t="0"/>
-                <wp:docPr id="2" name="image2.png"/>
+                <wp:docPr id="1" name="image1.png"/>
                 <a:graphic>
                   <a:graphicData uri="http://schemas.openxmlformats.org/drawingml/2006/picture">
                     <pic:pic>
                       <pic:nvPicPr>
-                        <pic:cNvPr id="0" name="image2.png"/>
+                        <pic:cNvPr id="0" name="image1.png"/>
                         <pic:cNvPicPr preferRelativeResize="0"/>
                       </pic:nvPicPr>
                       <pic:blipFill>
@@ -240,31 +280,22 @@
     </w:p>
     <w:p>
       <w:pPr>
-        <w:spacing w:before="200" w:line="276" w:lineRule="auto"/>
-        <w:rPr>
-          <w:rFonts w:ascii="Garamond" w:cs="Garamond" w:eastAsia="Garamond" w:hAnsi="Garamond"/>
-          <w:sz w:val="24"/>
-          <w:szCs w:val="24"/>
-        </w:rPr>
-      </w:pPr>
-      <w:r>
-        <w:rPr>
-          <w:rFonts w:ascii="Garamond" w:cs="Garamond" w:eastAsia="Garamond" w:hAnsi="Garamond"/>
-          <w:sz w:val="24"/>
-          <w:szCs w:val="24"/>
-        </w:rPr>
+        <w:rPr/>
+      </w:pPr>
+      <w:r>
+        <w:rPr/>
         <mc:AlternateContent>
           <mc:Choice Requires="wpg">
             <w:drawing>
               <wp:inline distB="114300" distT="114300" distL="114300" distR="114300">
                 <wp:extent cx="6505575" cy="1114744"/>
                 <wp:effectExtent b="0" l="0" r="0" t="0"/>
-                <wp:docPr id="1" name=""/>
+                <wp:docPr id="2" name=""/>
                 <a:graphic>
                   <a:graphicData uri="http://schemas.microsoft.com/office/word/2010/wordprocessingShape">
                     <wps:wsp>
                       <wps:cNvSpPr txBox="1"/>
-                      <wps:cNvPr id="2" name="Shape 2"/>
+                      <wps:cNvPr id="3" name="Shape 3"/>
                       <wps:spPr>
                         <a:xfrm>
                           <a:off x="262200" y="791775"/>
@@ -404,12 +435,12 @@
               <wp:inline distB="114300" distT="114300" distL="114300" distR="114300">
                 <wp:extent cx="6505575" cy="1114744"/>
                 <wp:effectExtent b="0" l="0" r="0" t="0"/>
-                <wp:docPr id="1" name="image1.png"/>
+                <wp:docPr id="2" name="image2.png"/>
                 <a:graphic>
                   <a:graphicData uri="http://schemas.openxmlformats.org/drawingml/2006/picture">
                     <pic:pic>
                       <pic:nvPicPr>
-                        <pic:cNvPr id="0" name="image1.png"/>
+                        <pic:cNvPr id="0" name="image2.png"/>
                         <pic:cNvPicPr preferRelativeResize="0"/>
                       </pic:nvPicPr>
                       <pic:blipFill>
@@ -444,24 +475,12 @@
     <w:p>
       <w:pPr>
         <w:pStyle w:val="Heading1"/>
-        <w:spacing w:before="400" w:line="276" w:lineRule="auto"/>
-        <w:rPr>
-          <w:rFonts w:ascii="Garamond" w:cs="Garamond" w:eastAsia="Garamond" w:hAnsi="Garamond"/>
-          <w:b w:val="0"/>
-          <w:bCs w:val="0"/>
-          <w:sz w:val="40"/>
-          <w:szCs w:val="40"/>
-        </w:rPr>
-      </w:pPr>
-      <w:bookmarkStart w:colFirst="0" w:colLast="0" w:name="_91ezqgojjt8o" w:id="3"/>
-      <w:bookmarkEnd w:id="3"/>
-      <w:r>
-        <w:rPr>
-          <w:rFonts w:ascii="Garamond" w:cs="Garamond" w:eastAsia="Garamond" w:hAnsi="Garamond"/>
-          <w:b w:val="0"/>
-          <w:bCs w:val="0"/>
-          <w:sz w:val="40"/>
-          <w:szCs w:val="40"/>
+        <w:rPr/>
+      </w:pPr>
+      <w:bookmarkStart w:colFirst="0" w:colLast="0" w:name="_91ezqgojjt8o" w:id="4"/>
+      <w:bookmarkEnd w:id="4"/>
+      <w:r>
+        <w:rPr>
           <w:rtl w:val="0"/>
         </w:rPr>
         <w:t xml:space="preserve">1. What is a HEARsay mystery? </w:t>
@@ -474,67 +493,44 @@
     </w:p>
     <w:p>
       <w:pPr>
-        <w:spacing w:before="200" w:line="276" w:lineRule="auto"/>
-        <w:rPr>
-          <w:rFonts w:ascii="Garamond" w:cs="Garamond" w:eastAsia="Garamond" w:hAnsi="Garamond"/>
-          <w:sz w:val="24"/>
-          <w:szCs w:val="24"/>
-        </w:rPr>
-      </w:pPr>
-      <w:r>
-        <w:rPr>
-          <w:rFonts w:ascii="Garamond" w:cs="Garamond" w:eastAsia="Garamond" w:hAnsi="Garamond"/>
-          <w:sz w:val="24"/>
-          <w:szCs w:val="24"/>
+        <w:rPr/>
+      </w:pPr>
+      <w:r>
+        <w:rPr>
           <w:rtl w:val="0"/>
         </w:rPr>
         <w:t xml:space="preserve">HEARsay is a series of mystery games designed to help students learn and practice </w:t>
       </w:r>
       <w:r>
         <w:rPr>
-          <w:rFonts w:ascii="Garamond" w:cs="Garamond" w:eastAsia="Garamond" w:hAnsi="Garamond"/>
           <w:i w:val="1"/>
           <w:iCs w:val="1"/>
-          <w:sz w:val="24"/>
-          <w:szCs w:val="24"/>
           <w:rtl w:val="0"/>
         </w:rPr>
         <w:t xml:space="preserve">conversational receptiveness</w:t>
       </w:r>
       <w:r>
         <w:rPr>
-          <w:rFonts w:ascii="Garamond" w:cs="Garamond" w:eastAsia="Garamond" w:hAnsi="Garamond"/>
           <w:i w:val="1"/>
           <w:iCs w:val="1"/>
-          <w:sz w:val="24"/>
-          <w:szCs w:val="24"/>
           <w:vertAlign w:val="superscript"/>
         </w:rPr>
         <w:footnoteReference w:customMarkFollows="0" w:id="0"/>
       </w:r>
       <w:r>
         <w:rPr>
-          <w:rFonts w:ascii="Garamond" w:cs="Garamond" w:eastAsia="Garamond" w:hAnsi="Garamond"/>
-          <w:sz w:val="24"/>
-          <w:szCs w:val="24"/>
           <w:rtl w:val="0"/>
         </w:rPr>
         <w:t xml:space="preserve">- “the use of language to communicate one’s willingness to thoughtfully engage with opposing views.”</w:t>
       </w:r>
       <w:r>
         <w:rPr>
-          <w:rFonts w:ascii="Garamond" w:cs="Garamond" w:eastAsia="Garamond" w:hAnsi="Garamond"/>
-          <w:sz w:val="24"/>
-          <w:szCs w:val="24"/>
           <w:vertAlign w:val="superscript"/>
         </w:rPr>
         <w:footnoteReference w:customMarkFollows="0" w:id="1"/>
       </w:r>
       <w:r>
         <w:rPr>
-          <w:rFonts w:ascii="Garamond" w:cs="Garamond" w:eastAsia="Garamond" w:hAnsi="Garamond"/>
-          <w:sz w:val="24"/>
-          <w:szCs w:val="24"/>
           <w:rtl w:val="0"/>
         </w:rPr>
         <w:t xml:space="preserve"> The focus of the games is the HEAR Framework, a practical tool aimed to help people remember and apply the principles of conversational receptiveness. </w:t>
@@ -542,56 +538,36 @@
     </w:p>
     <w:p>
       <w:pPr>
-        <w:spacing w:before="200" w:line="276" w:lineRule="auto"/>
-        <w:rPr>
-          <w:rFonts w:ascii="Garamond" w:cs="Garamond" w:eastAsia="Garamond" w:hAnsi="Garamond"/>
-          <w:sz w:val="24"/>
-          <w:szCs w:val="24"/>
-        </w:rPr>
-      </w:pPr>
-      <w:r>
-        <w:rPr>
-          <w:rFonts w:ascii="Garamond" w:cs="Garamond" w:eastAsia="Garamond" w:hAnsi="Garamond"/>
-          <w:sz w:val="24"/>
-          <w:szCs w:val="24"/>
+        <w:rPr/>
+      </w:pPr>
+      <w:r>
+        <w:rPr>
           <w:rtl w:val="0"/>
         </w:rPr>
         <w:t xml:space="preserve">HEARsay mysteries are story-driven games built on Twine, a free choose-your-own-adventure engine game that requires little to no coding. This framework provides the details about the way the game works as well as instructions for crafting scenarios. The first scenario, </w:t>
       </w:r>
       <w:r>
         <w:rPr>
-          <w:rFonts w:ascii="Garamond" w:cs="Garamond" w:eastAsia="Garamond" w:hAnsi="Garamond"/>
           <w:i w:val="1"/>
           <w:iCs w:val="1"/>
-          <w:sz w:val="24"/>
-          <w:szCs w:val="24"/>
           <w:rtl w:val="0"/>
         </w:rPr>
         <w:t xml:space="preserve">The Commons’ Comma</w:t>
       </w:r>
       <w:r>
         <w:rPr>
-          <w:rFonts w:ascii="Garamond" w:cs="Garamond" w:eastAsia="Garamond" w:hAnsi="Garamond"/>
-          <w:sz w:val="24"/>
-          <w:szCs w:val="24"/>
           <w:rtl w:val="0"/>
         </w:rPr>
         <w:t xml:space="preserve">, is included in an accompanying folder and describes a scenario based on a university campus, which I will treat here as the default backdrop for HEARsay mysteries.</w:t>
       </w:r>
       <w:r>
         <w:rPr>
-          <w:rFonts w:ascii="Garamond" w:cs="Garamond" w:eastAsia="Garamond" w:hAnsi="Garamond"/>
-          <w:sz w:val="24"/>
-          <w:szCs w:val="24"/>
           <w:vertAlign w:val="superscript"/>
         </w:rPr>
         <w:footnoteReference w:customMarkFollows="0" w:id="2"/>
       </w:r>
       <w:r>
         <w:rPr>
-          <w:rFonts w:ascii="Garamond" w:cs="Garamond" w:eastAsia="Garamond" w:hAnsi="Garamond"/>
-          <w:sz w:val="24"/>
-          <w:szCs w:val="24"/>
           <w:rtl w:val="0"/>
         </w:rPr>
         <w:t xml:space="preserve"> </w:t>
@@ -599,54 +575,34 @@
     </w:p>
     <w:p>
       <w:pPr>
-        <w:spacing w:before="200" w:line="276" w:lineRule="auto"/>
-        <w:rPr>
-          <w:rFonts w:ascii="Garamond" w:cs="Garamond" w:eastAsia="Garamond" w:hAnsi="Garamond"/>
-          <w:sz w:val="24"/>
-          <w:szCs w:val="24"/>
-        </w:rPr>
-      </w:pPr>
-      <w:r>
-        <w:rPr>
-          <w:rFonts w:ascii="Garamond" w:cs="Garamond" w:eastAsia="Garamond" w:hAnsi="Garamond"/>
-          <w:sz w:val="24"/>
-          <w:szCs w:val="24"/>
+        <w:rPr/>
+      </w:pPr>
+      <w:r>
+        <w:rPr>
           <w:rtl w:val="0"/>
         </w:rPr>
         <w:t xml:space="preserve">Each scenario </w:t>
       </w:r>
       <w:r>
         <w:rPr>
-          <w:rFonts w:ascii="Garamond" w:cs="Garamond" w:eastAsia="Garamond" w:hAnsi="Garamond"/>
-          <w:sz w:val="24"/>
-          <w:szCs w:val="24"/>
           <w:rtl w:val="0"/>
         </w:rPr>
         <w:t xml:space="preserve">is comprised</w:t>
       </w:r>
       <w:r>
         <w:rPr>
-          <w:rFonts w:ascii="Garamond" w:cs="Garamond" w:eastAsia="Garamond" w:hAnsi="Garamond"/>
-          <w:sz w:val="24"/>
-          <w:szCs w:val="24"/>
           <w:rtl w:val="0"/>
         </w:rPr>
         <w:t xml:space="preserve"> of (a) a</w:t>
       </w:r>
       <w:r>
         <w:rPr>
-          <w:rFonts w:ascii="Garamond" w:cs="Garamond" w:eastAsia="Garamond" w:hAnsi="Garamond"/>
-          <w:sz w:val="24"/>
-          <w:szCs w:val="24"/>
           <w:rtl w:val="0"/>
         </w:rPr>
         <w:t xml:space="preserve"> puzzle the players have to solve and (b) a controversy that’s unfolding in the background, which I will call the Current Campus Controversy (CCC</w:t>
       </w:r>
       <w:r>
         <w:rPr>
-          <w:rFonts w:ascii="Garamond" w:cs="Garamond" w:eastAsia="Garamond" w:hAnsi="Garamond"/>
-          <w:sz w:val="24"/>
-          <w:szCs w:val="24"/>
           <w:vertAlign w:val="superscript"/>
           <w:rtl w:val="0"/>
         </w:rPr>
@@ -654,9 +610,6 @@
       </w:r>
       <w:r>
         <w:rPr>
-          <w:rFonts w:ascii="Garamond" w:cs="Garamond" w:eastAsia="Garamond" w:hAnsi="Garamond"/>
-          <w:sz w:val="24"/>
-          <w:szCs w:val="24"/>
           <w:rtl w:val="0"/>
         </w:rPr>
         <w:t xml:space="preserve">). Players will be interviewing witnesses, such as students or university personnel, trying to gain clues that would help them solve the mystery and avoiding red herrings that point them in the wrong direction. At the same time, witnesses will share their views on the CCC and players will have to apply the HEAR framework in order to solve the mystery and improve their scores in the game:</w:t>
@@ -668,19 +621,11 @@
           <w:ilvl w:val="0"/>
           <w:numId w:val="7"/>
         </w:numPr>
-        <w:spacing w:after="0" w:afterAutospacing="0" w:before="200" w:line="276" w:lineRule="auto"/>
+        <w:spacing w:after="0" w:afterAutospacing="0"/>
         <w:ind w:left="720" w:hanging="360"/>
-        <w:rPr>
-          <w:rFonts w:ascii="Garamond" w:cs="Garamond" w:eastAsia="Garamond" w:hAnsi="Garamond"/>
-          <w:sz w:val="24"/>
-          <w:szCs w:val="24"/>
-        </w:rPr>
-      </w:pPr>
-      <w:r>
-        <w:rPr>
-          <w:rFonts w:ascii="Garamond" w:cs="Garamond" w:eastAsia="Garamond" w:hAnsi="Garamond"/>
-          <w:sz w:val="24"/>
-          <w:szCs w:val="24"/>
+      </w:pPr>
+      <w:r>
+        <w:rPr>
           <w:rtl w:val="0"/>
         </w:rPr>
         <w:t xml:space="preserve">Once with each witness players may ask a follow-up question about the witness’s expressed view regarding the CCC. Players will have to choose between two phrasings of the question, one more receptive than the other (the difference may be stark or subtle). Choosing the receptive phrasing unlocks a Major Clue while choosing the less receptive question ends the interview abruptly (the witness storms away and will not  answer any more questions). </w:t>
@@ -692,19 +637,11 @@
           <w:ilvl w:val="0"/>
           <w:numId w:val="7"/>
         </w:numPr>
-        <w:spacing w:after="0" w:afterAutospacing="0" w:before="0" w:beforeAutospacing="0" w:line="276" w:lineRule="auto"/>
+        <w:spacing w:after="0" w:afterAutospacing="0" w:before="0" w:beforeAutospacing="0"/>
         <w:ind w:left="720" w:hanging="360"/>
-        <w:rPr>
-          <w:rFonts w:ascii="Garamond" w:cs="Garamond" w:eastAsia="Garamond" w:hAnsi="Garamond"/>
-          <w:sz w:val="24"/>
-          <w:szCs w:val="24"/>
-        </w:rPr>
-      </w:pPr>
-      <w:r>
-        <w:rPr>
-          <w:rFonts w:ascii="Garamond" w:cs="Garamond" w:eastAsia="Garamond" w:hAnsi="Garamond"/>
-          <w:sz w:val="24"/>
-          <w:szCs w:val="24"/>
+      </w:pPr>
+      <w:r>
+        <w:rPr>
           <w:rtl w:val="0"/>
         </w:rPr>
         <w:t xml:space="preserve">Unlocking a Major Clue earns the students a letter from the HEAR acronym, reinforcing the mnemonic tool, and explaining one of the four pillars of the framework.</w:t>
@@ -716,19 +653,11 @@
           <w:ilvl w:val="0"/>
           <w:numId w:val="7"/>
         </w:numPr>
-        <w:spacing w:before="0" w:beforeAutospacing="0" w:line="276" w:lineRule="auto"/>
+        <w:spacing w:before="0" w:beforeAutospacing="0"/>
         <w:ind w:left="720" w:hanging="360"/>
-        <w:rPr>
-          <w:rFonts w:ascii="Garamond" w:cs="Garamond" w:eastAsia="Garamond" w:hAnsi="Garamond"/>
-          <w:sz w:val="24"/>
-          <w:szCs w:val="24"/>
-        </w:rPr>
-      </w:pPr>
-      <w:r>
-        <w:rPr>
-          <w:rFonts w:ascii="Garamond" w:cs="Garamond" w:eastAsia="Garamond" w:hAnsi="Garamond"/>
-          <w:sz w:val="24"/>
-          <w:szCs w:val="24"/>
+      </w:pPr>
+      <w:r>
+        <w:rPr>
           <w:rtl w:val="0"/>
         </w:rPr>
         <w:t xml:space="preserve">Each witness will volunteer their opinions on the CCC, with varying degrees of receptiveness. Players will receive bonus points at the end of the game for ranking the witnesses correctly in terms of the receptiveness. </w:t>
@@ -737,24 +666,12 @@
     <w:p>
       <w:pPr>
         <w:pStyle w:val="Heading1"/>
-        <w:spacing w:before="400" w:line="276" w:lineRule="auto"/>
-        <w:rPr>
-          <w:rFonts w:ascii="Garamond" w:cs="Garamond" w:eastAsia="Garamond" w:hAnsi="Garamond"/>
-          <w:b w:val="0"/>
-          <w:bCs w:val="0"/>
-          <w:sz w:val="40"/>
-          <w:szCs w:val="40"/>
-        </w:rPr>
-      </w:pPr>
-      <w:bookmarkStart w:colFirst="0" w:colLast="0" w:name="_724y3rmj63y4" w:id="4"/>
-      <w:bookmarkEnd w:id="4"/>
-      <w:r>
-        <w:rPr>
-          <w:rFonts w:ascii="Garamond" w:cs="Garamond" w:eastAsia="Garamond" w:hAnsi="Garamond"/>
-          <w:b w:val="0"/>
-          <w:bCs w:val="0"/>
-          <w:sz w:val="40"/>
-          <w:szCs w:val="40"/>
+        <w:rPr/>
+      </w:pPr>
+      <w:bookmarkStart w:colFirst="0" w:colLast="0" w:name="_724y3rmj63y4" w:id="5"/>
+      <w:bookmarkEnd w:id="5"/>
+      <w:r>
+        <w:rPr>
           <w:rtl w:val="0"/>
         </w:rPr>
         <w:t xml:space="preserve">2. The HEAR Framework </w:t>
@@ -762,18 +679,11 @@
     </w:p>
     <w:p>
       <w:pPr>
-        <w:spacing w:after="200" w:before="200" w:line="276" w:lineRule="auto"/>
-        <w:rPr>
-          <w:rFonts w:ascii="Garamond" w:cs="Garamond" w:eastAsia="Garamond" w:hAnsi="Garamond"/>
-          <w:sz w:val="24"/>
-          <w:szCs w:val="24"/>
-        </w:rPr>
-      </w:pPr>
-      <w:r>
-        <w:rPr>
-          <w:rFonts w:ascii="Garamond" w:cs="Garamond" w:eastAsia="Garamond" w:hAnsi="Garamond"/>
-          <w:sz w:val="24"/>
-          <w:szCs w:val="24"/>
+        <w:spacing w:after="200" w:lineRule="auto"/>
+        <w:rPr/>
+      </w:pPr>
+      <w:r>
+        <w:rPr>
           <w:rtl w:val="0"/>
         </w:rPr>
         <w:t xml:space="preserve">Conversational receptiveness is the use of language that signals you are engaging thoughtfully with a view you disagree with. Minson and colleagues found that people who are perceived as receptive are seen as better teammates and advisors, are more persuasive, and are more likely to be engaged with in return, and that receptiveness can be learned as a set of concrete verbal moves. The teachable recipe is summarised as HEAR:</w:t>
@@ -813,16 +723,14 @@
           </w:tcPr>
           <w:p>
             <w:pPr>
-              <w:spacing w:line="240" w:lineRule="auto"/>
-              <w:rPr>
-                <w:rFonts w:ascii="Garamond" w:cs="Garamond" w:eastAsia="Garamond" w:hAnsi="Garamond"/>
+              <w:spacing w:before="0" w:line="240" w:lineRule="auto"/>
+              <w:rPr>
                 <w:sz w:val="32"/>
                 <w:szCs w:val="32"/>
               </w:rPr>
             </w:pPr>
             <w:r>
               <w:rPr>
-                <w:rFonts w:ascii="Garamond" w:cs="Garamond" w:eastAsia="Garamond" w:hAnsi="Garamond"/>
                 <w:sz w:val="32"/>
                 <w:szCs w:val="32"/>
                 <w:rtl w:val="0"/>
@@ -837,16 +745,14 @@
           </w:tcPr>
           <w:p>
             <w:pPr>
-              <w:spacing w:line="240" w:lineRule="auto"/>
-              <w:rPr>
-                <w:rFonts w:ascii="Garamond" w:cs="Garamond" w:eastAsia="Garamond" w:hAnsi="Garamond"/>
+              <w:spacing w:before="0" w:line="240" w:lineRule="auto"/>
+              <w:rPr>
                 <w:sz w:val="32"/>
                 <w:szCs w:val="32"/>
               </w:rPr>
             </w:pPr>
             <w:r>
               <w:rPr>
-                <w:rFonts w:ascii="Garamond" w:cs="Garamond" w:eastAsia="Garamond" w:hAnsi="Garamond"/>
                 <w:sz w:val="32"/>
                 <w:szCs w:val="32"/>
                 <w:rtl w:val="0"/>
@@ -861,16 +767,14 @@
           </w:tcPr>
           <w:p>
             <w:pPr>
-              <w:spacing w:line="240" w:lineRule="auto"/>
-              <w:rPr>
-                <w:rFonts w:ascii="Garamond" w:cs="Garamond" w:eastAsia="Garamond" w:hAnsi="Garamond"/>
+              <w:spacing w:before="0" w:line="240" w:lineRule="auto"/>
+              <w:rPr>
                 <w:sz w:val="32"/>
                 <w:szCs w:val="32"/>
               </w:rPr>
             </w:pPr>
             <w:r>
               <w:rPr>
-                <w:rFonts w:ascii="Garamond" w:cs="Garamond" w:eastAsia="Garamond" w:hAnsi="Garamond"/>
                 <w:sz w:val="32"/>
                 <w:szCs w:val="32"/>
                 <w:rtl w:val="0"/>
@@ -890,22 +794,16 @@
           <w:tcPr/>
           <w:p>
             <w:pPr>
-              <w:spacing w:line="240" w:lineRule="auto"/>
-              <w:rPr>
-                <w:rFonts w:ascii="Garamond" w:cs="Garamond" w:eastAsia="Garamond" w:hAnsi="Garamond"/>
+              <w:spacing w:before="0" w:line="240" w:lineRule="auto"/>
+              <w:rPr>
                 <w:b w:val="1"/>
                 <w:bCs w:val="1"/>
-                <w:sz w:val="24"/>
-                <w:szCs w:val="24"/>
-              </w:rPr>
-            </w:pPr>
-            <w:r>
-              <w:rPr>
-                <w:rFonts w:ascii="Garamond" w:cs="Garamond" w:eastAsia="Garamond" w:hAnsi="Garamond"/>
+              </w:rPr>
+            </w:pPr>
+            <w:r>
+              <w:rPr>
                 <w:b w:val="1"/>
                 <w:bCs w:val="1"/>
-                <w:sz w:val="24"/>
-                <w:szCs w:val="24"/>
                 <w:rtl w:val="0"/>
               </w:rPr>
               <w:t xml:space="preserve">H</w:t>
@@ -916,29 +814,19 @@
           <w:tcPr/>
           <w:p>
             <w:pPr>
-              <w:spacing w:line="240" w:lineRule="auto"/>
-              <w:rPr>
-                <w:rFonts w:ascii="Garamond" w:cs="Garamond" w:eastAsia="Garamond" w:hAnsi="Garamond"/>
-                <w:sz w:val="24"/>
-                <w:szCs w:val="24"/>
-              </w:rPr>
-            </w:pPr>
-            <w:r>
-              <w:rPr>
-                <w:rFonts w:ascii="Garamond" w:cs="Garamond" w:eastAsia="Garamond" w:hAnsi="Garamond"/>
+              <w:spacing w:before="0" w:line="240" w:lineRule="auto"/>
+              <w:rPr/>
+            </w:pPr>
+            <w:r>
+              <w:rPr>
                 <w:b w:val="1"/>
                 <w:bCs w:val="1"/>
-                <w:sz w:val="24"/>
-                <w:szCs w:val="24"/>
                 <w:rtl w:val="0"/>
               </w:rPr>
               <w:t xml:space="preserve">Hedge</w:t>
             </w:r>
             <w:r>
               <w:rPr>
-                <w:rFonts w:ascii="Garamond" w:cs="Garamond" w:eastAsia="Garamond" w:hAnsi="Garamond"/>
-                <w:sz w:val="24"/>
-                <w:szCs w:val="24"/>
                 <w:rtl w:val="0"/>
               </w:rPr>
               <w:t xml:space="preserve"> your claims</w:t>
@@ -949,18 +837,11 @@
           <w:tcPr/>
           <w:p>
             <w:pPr>
-              <w:spacing w:line="240" w:lineRule="auto"/>
-              <w:rPr>
-                <w:rFonts w:ascii="Garamond" w:cs="Garamond" w:eastAsia="Garamond" w:hAnsi="Garamond"/>
-                <w:sz w:val="24"/>
-                <w:szCs w:val="24"/>
-              </w:rPr>
-            </w:pPr>
-            <w:r>
-              <w:rPr>
-                <w:rFonts w:ascii="Garamond" w:cs="Garamond" w:eastAsia="Garamond" w:hAnsi="Garamond"/>
-                <w:sz w:val="24"/>
-                <w:szCs w:val="24"/>
+              <w:spacing w:before="0" w:line="240" w:lineRule="auto"/>
+              <w:rPr/>
+            </w:pPr>
+            <w:r>
+              <w:rPr>
                 <w:rtl w:val="0"/>
               </w:rPr>
               <w:t xml:space="preserve">“I may be wrong about this”, “in some cases”, “it seems to me”, “probably”. Hedging signals that you hold your view as a view, not as a fact the other person is failing to see.</w:t>
@@ -978,22 +859,16 @@
           <w:tcPr/>
           <w:p>
             <w:pPr>
-              <w:spacing w:line="240" w:lineRule="auto"/>
-              <w:rPr>
-                <w:rFonts w:ascii="Garamond" w:cs="Garamond" w:eastAsia="Garamond" w:hAnsi="Garamond"/>
+              <w:spacing w:before="0" w:line="240" w:lineRule="auto"/>
+              <w:rPr>
                 <w:b w:val="1"/>
                 <w:bCs w:val="1"/>
-                <w:sz w:val="24"/>
-                <w:szCs w:val="24"/>
-              </w:rPr>
-            </w:pPr>
-            <w:r>
-              <w:rPr>
-                <w:rFonts w:ascii="Garamond" w:cs="Garamond" w:eastAsia="Garamond" w:hAnsi="Garamond"/>
+              </w:rPr>
+            </w:pPr>
+            <w:r>
+              <w:rPr>
                 <w:b w:val="1"/>
                 <w:bCs w:val="1"/>
-                <w:sz w:val="24"/>
-                <w:szCs w:val="24"/>
                 <w:rtl w:val="0"/>
               </w:rPr>
               <w:t xml:space="preserve">E</w:t>
@@ -1004,29 +879,19 @@
           <w:tcPr/>
           <w:p>
             <w:pPr>
-              <w:spacing w:line="240" w:lineRule="auto"/>
-              <w:rPr>
-                <w:rFonts w:ascii="Garamond" w:cs="Garamond" w:eastAsia="Garamond" w:hAnsi="Garamond"/>
-                <w:sz w:val="24"/>
-                <w:szCs w:val="24"/>
-              </w:rPr>
-            </w:pPr>
-            <w:r>
-              <w:rPr>
-                <w:rFonts w:ascii="Garamond" w:cs="Garamond" w:eastAsia="Garamond" w:hAnsi="Garamond"/>
+              <w:spacing w:before="0" w:line="240" w:lineRule="auto"/>
+              <w:rPr/>
+            </w:pPr>
+            <w:r>
+              <w:rPr>
                 <w:b w:val="1"/>
                 <w:bCs w:val="1"/>
-                <w:sz w:val="24"/>
-                <w:szCs w:val="24"/>
                 <w:rtl w:val="0"/>
               </w:rPr>
               <w:t xml:space="preserve">Emphasize</w:t>
             </w:r>
             <w:r>
               <w:rPr>
-                <w:rFonts w:ascii="Garamond" w:cs="Garamond" w:eastAsia="Garamond" w:hAnsi="Garamond"/>
-                <w:sz w:val="24"/>
-                <w:szCs w:val="24"/>
                 <w:rtl w:val="0"/>
               </w:rPr>
               <w:t xml:space="preserve"> agreement</w:t>
@@ -1037,18 +902,11 @@
           <w:tcPr/>
           <w:p>
             <w:pPr>
-              <w:spacing w:line="240" w:lineRule="auto"/>
-              <w:rPr>
-                <w:rFonts w:ascii="Garamond" w:cs="Garamond" w:eastAsia="Garamond" w:hAnsi="Garamond"/>
-                <w:sz w:val="24"/>
-                <w:szCs w:val="24"/>
-              </w:rPr>
-            </w:pPr>
-            <w:r>
-              <w:rPr>
-                <w:rFonts w:ascii="Garamond" w:cs="Garamond" w:eastAsia="Garamond" w:hAnsi="Garamond"/>
-                <w:sz w:val="24"/>
-                <w:szCs w:val="24"/>
+              <w:spacing w:before="0" w:line="240" w:lineRule="auto"/>
+              <w:rPr/>
+            </w:pPr>
+            <w:r>
+              <w:rPr>
                 <w:rtl w:val="0"/>
               </w:rPr>
               <w:t xml:space="preserve">“We both want the building to work for students”, “I think we agree on the goal”. Naming shared ground before stating a difference makes the difference feel like a disagreement between allies.</w:t>
@@ -1066,22 +924,16 @@
           <w:tcPr/>
           <w:p>
             <w:pPr>
-              <w:spacing w:line="240" w:lineRule="auto"/>
-              <w:rPr>
-                <w:rFonts w:ascii="Garamond" w:cs="Garamond" w:eastAsia="Garamond" w:hAnsi="Garamond"/>
+              <w:spacing w:before="0" w:line="240" w:lineRule="auto"/>
+              <w:rPr>
                 <w:b w:val="1"/>
                 <w:bCs w:val="1"/>
-                <w:sz w:val="24"/>
-                <w:szCs w:val="24"/>
-              </w:rPr>
-            </w:pPr>
-            <w:r>
-              <w:rPr>
-                <w:rFonts w:ascii="Garamond" w:cs="Garamond" w:eastAsia="Garamond" w:hAnsi="Garamond"/>
+              </w:rPr>
+            </w:pPr>
+            <w:r>
+              <w:rPr>
                 <w:b w:val="1"/>
                 <w:bCs w:val="1"/>
-                <w:sz w:val="24"/>
-                <w:szCs w:val="24"/>
                 <w:rtl w:val="0"/>
               </w:rPr>
               <w:t xml:space="preserve">A</w:t>
@@ -1092,29 +944,19 @@
           <w:tcPr/>
           <w:p>
             <w:pPr>
-              <w:spacing w:line="240" w:lineRule="auto"/>
-              <w:rPr>
-                <w:rFonts w:ascii="Garamond" w:cs="Garamond" w:eastAsia="Garamond" w:hAnsi="Garamond"/>
-                <w:sz w:val="24"/>
-                <w:szCs w:val="24"/>
-              </w:rPr>
-            </w:pPr>
-            <w:r>
-              <w:rPr>
-                <w:rFonts w:ascii="Garamond" w:cs="Garamond" w:eastAsia="Garamond" w:hAnsi="Garamond"/>
+              <w:spacing w:before="0" w:line="240" w:lineRule="auto"/>
+              <w:rPr/>
+            </w:pPr>
+            <w:r>
+              <w:rPr>
                 <w:b w:val="1"/>
                 <w:bCs w:val="1"/>
-                <w:sz w:val="24"/>
-                <w:szCs w:val="24"/>
                 <w:rtl w:val="0"/>
               </w:rPr>
               <w:t xml:space="preserve">Acknowledge</w:t>
             </w:r>
             <w:r>
               <w:rPr>
-                <w:rFonts w:ascii="Garamond" w:cs="Garamond" w:eastAsia="Garamond" w:hAnsi="Garamond"/>
-                <w:sz w:val="24"/>
-                <w:szCs w:val="24"/>
                 <w:rtl w:val="0"/>
               </w:rPr>
               <w:t xml:space="preserve"> the other’s perspective</w:t>
@@ -1125,18 +967,11 @@
           <w:tcPr/>
           <w:p>
             <w:pPr>
-              <w:spacing w:line="240" w:lineRule="auto"/>
-              <w:rPr>
-                <w:rFonts w:ascii="Garamond" w:cs="Garamond" w:eastAsia="Garamond" w:hAnsi="Garamond"/>
-                <w:sz w:val="24"/>
-                <w:szCs w:val="24"/>
-              </w:rPr>
-            </w:pPr>
-            <w:r>
-              <w:rPr>
-                <w:rFonts w:ascii="Garamond" w:cs="Garamond" w:eastAsia="Garamond" w:hAnsi="Garamond"/>
-                <w:sz w:val="24"/>
-                <w:szCs w:val="24"/>
+              <w:spacing w:before="0" w:line="240" w:lineRule="auto"/>
+              <w:rPr/>
+            </w:pPr>
+            <w:r>
+              <w:rPr>
                 <w:rtl w:val="0"/>
               </w:rPr>
               <w:t xml:space="preserve">“Leo’s point about space is fair”, “I can see why you’d read it that way”. Restating the other view accurately, and granting what is right in it, shows you have actually listened.</w:t>
@@ -1154,22 +989,16 @@
           <w:tcPr/>
           <w:p>
             <w:pPr>
-              <w:spacing w:line="240" w:lineRule="auto"/>
-              <w:rPr>
-                <w:rFonts w:ascii="Garamond" w:cs="Garamond" w:eastAsia="Garamond" w:hAnsi="Garamond"/>
+              <w:spacing w:before="0" w:line="240" w:lineRule="auto"/>
+              <w:rPr>
                 <w:b w:val="1"/>
                 <w:bCs w:val="1"/>
-                <w:sz w:val="24"/>
-                <w:szCs w:val="24"/>
-              </w:rPr>
-            </w:pPr>
-            <w:r>
-              <w:rPr>
-                <w:rFonts w:ascii="Garamond" w:cs="Garamond" w:eastAsia="Garamond" w:hAnsi="Garamond"/>
+              </w:rPr>
+            </w:pPr>
+            <w:r>
+              <w:rPr>
                 <w:b w:val="1"/>
                 <w:bCs w:val="1"/>
-                <w:sz w:val="24"/>
-                <w:szCs w:val="24"/>
                 <w:rtl w:val="0"/>
               </w:rPr>
               <w:t xml:space="preserve">R</w:t>
@@ -1180,29 +1009,19 @@
           <w:tcPr/>
           <w:p>
             <w:pPr>
-              <w:spacing w:line="240" w:lineRule="auto"/>
-              <w:rPr>
-                <w:rFonts w:ascii="Garamond" w:cs="Garamond" w:eastAsia="Garamond" w:hAnsi="Garamond"/>
-                <w:sz w:val="24"/>
-                <w:szCs w:val="24"/>
-              </w:rPr>
-            </w:pPr>
-            <w:r>
-              <w:rPr>
-                <w:rFonts w:ascii="Garamond" w:cs="Garamond" w:eastAsia="Garamond" w:hAnsi="Garamond"/>
+              <w:spacing w:before="0" w:line="240" w:lineRule="auto"/>
+              <w:rPr/>
+            </w:pPr>
+            <w:r>
+              <w:rPr>
                 <w:b w:val="1"/>
                 <w:bCs w:val="1"/>
-                <w:sz w:val="24"/>
-                <w:szCs w:val="24"/>
                 <w:rtl w:val="0"/>
               </w:rPr>
               <w:t xml:space="preserve">Reframe</w:t>
             </w:r>
             <w:r>
               <w:rPr>
-                <w:rFonts w:ascii="Garamond" w:cs="Garamond" w:eastAsia="Garamond" w:hAnsi="Garamond"/>
-                <w:sz w:val="24"/>
-                <w:szCs w:val="24"/>
                 <w:rtl w:val="0"/>
               </w:rPr>
               <w:t xml:space="preserve"> to the positive</w:t>
@@ -1213,18 +1032,11 @@
           <w:tcPr/>
           <w:p>
             <w:pPr>
-              <w:spacing w:line="240" w:lineRule="auto"/>
-              <w:rPr>
-                <w:rFonts w:ascii="Garamond" w:cs="Garamond" w:eastAsia="Garamond" w:hAnsi="Garamond"/>
-                <w:sz w:val="24"/>
-                <w:szCs w:val="24"/>
-              </w:rPr>
-            </w:pPr>
-            <w:r>
-              <w:rPr>
-                <w:rFonts w:ascii="Garamond" w:cs="Garamond" w:eastAsia="Garamond" w:hAnsi="Garamond"/>
-                <w:sz w:val="24"/>
-                <w:szCs w:val="24"/>
+              <w:spacing w:before="0" w:line="240" w:lineRule="auto"/>
+              <w:rPr/>
+            </w:pPr>
+            <w:r>
+              <w:rPr>
                 <w:rtl w:val="0"/>
               </w:rPr>
               <w:t xml:space="preserve">“What would help is…” rather than “what’s wrong is…” avoiding absolute and negative language (“never”, “obviously”, “no one seriously thinks”). Positive framing keeps the exchange open rather than closing it.</w:t>
@@ -1236,24 +1048,12 @@
     <w:p>
       <w:pPr>
         <w:pStyle w:val="Heading1"/>
-        <w:spacing w:before="400" w:line="276" w:lineRule="auto"/>
-        <w:rPr>
-          <w:rFonts w:ascii="Garamond" w:cs="Garamond" w:eastAsia="Garamond" w:hAnsi="Garamond"/>
-          <w:b w:val="0"/>
-          <w:bCs w:val="0"/>
-          <w:sz w:val="40"/>
-          <w:szCs w:val="40"/>
-        </w:rPr>
-      </w:pPr>
-      <w:bookmarkStart w:colFirst="0" w:colLast="0" w:name="_8x7u4gqrdju0" w:id="5"/>
-      <w:bookmarkEnd w:id="5"/>
-      <w:r>
-        <w:rPr>
-          <w:rFonts w:ascii="Garamond" w:cs="Garamond" w:eastAsia="Garamond" w:hAnsi="Garamond"/>
-          <w:b w:val="0"/>
-          <w:bCs w:val="0"/>
-          <w:sz w:val="40"/>
-          <w:szCs w:val="40"/>
+        <w:rPr/>
+      </w:pPr>
+      <w:bookmarkStart w:colFirst="0" w:colLast="0" w:name="_8x7u4gqrdju0" w:id="6"/>
+      <w:bookmarkEnd w:id="6"/>
+      <w:r>
+        <w:rPr>
           <w:rtl w:val="0"/>
         </w:rPr>
         <w:t xml:space="preserve">3. The Game </w:t>
@@ -1261,18 +1061,10 @@
     </w:p>
     <w:p>
       <w:pPr>
-        <w:spacing w:before="200" w:line="276" w:lineRule="auto"/>
-        <w:rPr>
-          <w:rFonts w:ascii="Garamond" w:cs="Garamond" w:eastAsia="Garamond" w:hAnsi="Garamond"/>
-          <w:sz w:val="24"/>
-          <w:szCs w:val="24"/>
-        </w:rPr>
-      </w:pPr>
-      <w:r>
-        <w:rPr>
-          <w:rFonts w:ascii="Garamond" w:cs="Garamond" w:eastAsia="Garamond" w:hAnsi="Garamond"/>
-          <w:sz w:val="24"/>
-          <w:szCs w:val="24"/>
+        <w:rPr/>
+      </w:pPr>
+      <w:r>
+        <w:rPr>
           <w:rtl w:val="0"/>
         </w:rPr>
         <w:t xml:space="preserve">The game revolves around a mystery and so the game begins with a brief introduction of the game and then jumping right into the presentation of the mystery with the Hook. </w:t>
@@ -1281,24 +1073,12 @@
     <w:p>
       <w:pPr>
         <w:pStyle w:val="Heading2"/>
-        <w:spacing w:after="120" w:line="276" w:lineRule="auto"/>
-        <w:rPr>
-          <w:rFonts w:ascii="Garamond" w:cs="Garamond" w:eastAsia="Garamond" w:hAnsi="Garamond"/>
-          <w:b w:val="0"/>
-          <w:bCs w:val="0"/>
-          <w:sz w:val="32"/>
-          <w:szCs w:val="32"/>
-        </w:rPr>
-      </w:pPr>
-      <w:bookmarkStart w:colFirst="0" w:colLast="0" w:name="_h6c12zbk9cf" w:id="6"/>
-      <w:bookmarkEnd w:id="6"/>
-      <w:r>
-        <w:rPr>
-          <w:rFonts w:ascii="Garamond" w:cs="Garamond" w:eastAsia="Garamond" w:hAnsi="Garamond"/>
-          <w:b w:val="0"/>
-          <w:bCs w:val="0"/>
-          <w:sz w:val="32"/>
-          <w:szCs w:val="32"/>
+        <w:rPr/>
+      </w:pPr>
+      <w:bookmarkStart w:colFirst="0" w:colLast="0" w:name="_h6c12zbk9cf" w:id="7"/>
+      <w:bookmarkEnd w:id="7"/>
+      <w:r>
+        <w:rPr>
           <w:rtl w:val="0"/>
         </w:rPr>
         <w:t xml:space="preserve">3.1 Introduction </w:t>
@@ -1306,18 +1086,10 @@
     </w:p>
     <w:p>
       <w:pPr>
-        <w:spacing w:before="200" w:line="276" w:lineRule="auto"/>
-        <w:rPr>
-          <w:rFonts w:ascii="Garamond" w:cs="Garamond" w:eastAsia="Garamond" w:hAnsi="Garamond"/>
-          <w:sz w:val="24"/>
-          <w:szCs w:val="24"/>
-        </w:rPr>
-      </w:pPr>
-      <w:r>
-        <w:rPr>
-          <w:rFonts w:ascii="Garamond" w:cs="Garamond" w:eastAsia="Garamond" w:hAnsi="Garamond"/>
-          <w:sz w:val="24"/>
-          <w:szCs w:val="24"/>
+        <w:rPr/>
+      </w:pPr>
+      <w:r>
+        <w:rPr>
           <w:rtl w:val="0"/>
         </w:rPr>
         <w:t xml:space="preserve">In the introduction players are told that they are playing a mystery game while also practicing the HEAR framework. The game is designed to follow a module or a class where students have studied the HEAR framework, and conversational receptiveness more generally, in greater detail and so the introduction presents the framework briefly. A slide with a quick summary of the HEAR framework should be available for players throughout the game so they can review the material at any time. </w:t>
@@ -1325,18 +1097,10 @@
     </w:p>
     <w:p>
       <w:pPr>
-        <w:spacing w:before="200" w:line="276" w:lineRule="auto"/>
-        <w:rPr>
-          <w:rFonts w:ascii="Garamond" w:cs="Garamond" w:eastAsia="Garamond" w:hAnsi="Garamond"/>
-          <w:sz w:val="24"/>
-          <w:szCs w:val="24"/>
-        </w:rPr>
-      </w:pPr>
-      <w:r>
-        <w:rPr>
-          <w:rFonts w:ascii="Garamond" w:cs="Garamond" w:eastAsia="Garamond" w:hAnsi="Garamond"/>
-          <w:sz w:val="24"/>
-          <w:szCs w:val="24"/>
+        <w:rPr/>
+      </w:pPr>
+      <w:r>
+        <w:rPr>
           <w:rtl w:val="0"/>
         </w:rPr>
         <w:t xml:space="preserve">The introduction explains the rules of the game:</w:t>
@@ -1348,37 +1112,23 @@
           <w:ilvl w:val="0"/>
           <w:numId w:val="3"/>
         </w:numPr>
-        <w:spacing w:after="0" w:afterAutospacing="0" w:before="200" w:line="276" w:lineRule="auto"/>
+        <w:spacing w:after="0" w:afterAutospacing="0"/>
         <w:ind w:left="720" w:hanging="360"/>
-        <w:rPr>
-          <w:rFonts w:ascii="Garamond" w:cs="Garamond" w:eastAsia="Garamond" w:hAnsi="Garamond"/>
-          <w:sz w:val="24"/>
-          <w:szCs w:val="24"/>
-        </w:rPr>
-      </w:pPr>
-      <w:r>
-        <w:rPr>
-          <w:rFonts w:ascii="Garamond" w:cs="Garamond" w:eastAsia="Garamond" w:hAnsi="Garamond"/>
-          <w:sz w:val="24"/>
-          <w:szCs w:val="24"/>
+      </w:pPr>
+      <w:r>
+        <w:rPr>
           <w:rtl w:val="0"/>
         </w:rPr>
         <w:t xml:space="preserve">The goal of the game is to solve the mystery. At the end players will be asked to make a guess which addresses the central puzzle of the mystery. This may include identifying a culprit, if there is one, a motive or a reasoning, and the method.</w:t>
       </w:r>
       <w:r>
         <w:rPr>
-          <w:rFonts w:ascii="Garamond" w:cs="Garamond" w:eastAsia="Garamond" w:hAnsi="Garamond"/>
-          <w:sz w:val="24"/>
-          <w:szCs w:val="24"/>
           <w:vertAlign w:val="superscript"/>
         </w:rPr>
         <w:footnoteReference w:customMarkFollows="0" w:id="3"/>
       </w:r>
       <w:r>
         <w:rPr>
-          <w:rFonts w:ascii="Garamond" w:cs="Garamond" w:eastAsia="Garamond" w:hAnsi="Garamond"/>
-          <w:sz w:val="24"/>
-          <w:szCs w:val="24"/>
           <w:rtl w:val="0"/>
         </w:rPr>
         <w:t xml:space="preserve"> </w:t>
@@ -1390,19 +1140,11 @@
           <w:ilvl w:val="1"/>
           <w:numId w:val="3"/>
         </w:numPr>
-        <w:spacing w:after="0" w:afterAutospacing="0" w:before="0" w:beforeAutospacing="0" w:line="276" w:lineRule="auto"/>
+        <w:spacing w:after="0" w:afterAutospacing="0" w:before="0" w:beforeAutospacing="0"/>
         <w:ind w:left="1440" w:hanging="360"/>
-        <w:rPr>
-          <w:rFonts w:ascii="Garamond" w:cs="Garamond" w:eastAsia="Garamond" w:hAnsi="Garamond"/>
-          <w:sz w:val="24"/>
-          <w:szCs w:val="24"/>
-        </w:rPr>
-      </w:pPr>
-      <w:r>
-        <w:rPr>
-          <w:rFonts w:ascii="Garamond" w:cs="Garamond" w:eastAsia="Garamond" w:hAnsi="Garamond"/>
-          <w:sz w:val="24"/>
-          <w:szCs w:val="24"/>
+      </w:pPr>
+      <w:r>
+        <w:rPr>
           <w:rtl w:val="0"/>
         </w:rPr>
         <w:t xml:space="preserve">As a general rule, each of the witnesses should have a reasonable </w:t>
@@ -1414,19 +1156,11 @@
           <w:ilvl w:val="0"/>
           <w:numId w:val="3"/>
         </w:numPr>
-        <w:spacing w:after="0" w:afterAutospacing="0" w:before="0" w:beforeAutospacing="0" w:line="276" w:lineRule="auto"/>
+        <w:spacing w:after="0" w:afterAutospacing="0" w:before="0" w:beforeAutospacing="0"/>
         <w:ind w:left="720" w:hanging="360"/>
-        <w:rPr>
-          <w:rFonts w:ascii="Garamond" w:cs="Garamond" w:eastAsia="Garamond" w:hAnsi="Garamond"/>
-          <w:sz w:val="24"/>
-          <w:szCs w:val="24"/>
-        </w:rPr>
-      </w:pPr>
-      <w:r>
-        <w:rPr>
-          <w:rFonts w:ascii="Garamond" w:cs="Garamond" w:eastAsia="Garamond" w:hAnsi="Garamond"/>
-          <w:sz w:val="24"/>
-          <w:szCs w:val="24"/>
+      </w:pPr>
+      <w:r>
+        <w:rPr>
           <w:rtl w:val="0"/>
         </w:rPr>
         <w:t xml:space="preserve">The bulk of the game is made of students interviewing witnesses. The interview process is made of a series of questions. There are 8 witnesses and each can be asked a variant of 8 questions.</w:t>
@@ -1438,19 +1172,11 @@
           <w:ilvl w:val="0"/>
           <w:numId w:val="3"/>
         </w:numPr>
-        <w:spacing w:after="0" w:afterAutospacing="0" w:before="0" w:beforeAutospacing="0" w:line="276" w:lineRule="auto"/>
+        <w:spacing w:after="0" w:afterAutospacing="0" w:before="0" w:beforeAutospacing="0"/>
         <w:ind w:left="720" w:hanging="360"/>
-        <w:rPr>
-          <w:rFonts w:ascii="Garamond" w:cs="Garamond" w:eastAsia="Garamond" w:hAnsi="Garamond"/>
-          <w:sz w:val="24"/>
-          <w:szCs w:val="24"/>
-        </w:rPr>
-      </w:pPr>
-      <w:r>
-        <w:rPr>
-          <w:rFonts w:ascii="Garamond" w:cs="Garamond" w:eastAsia="Garamond" w:hAnsi="Garamond"/>
-          <w:sz w:val="24"/>
-          <w:szCs w:val="24"/>
+      </w:pPr>
+      <w:r>
+        <w:rPr>
           <w:rtl w:val="0"/>
         </w:rPr>
         <w:t xml:space="preserve">Students have a total ‘budget’ of </w:t>
@@ -1462,9 +1188,6 @@
       </w:r>
       <w:r>
         <w:rPr>
-          <w:rFonts w:ascii="Garamond" w:cs="Garamond" w:eastAsia="Garamond" w:hAnsi="Garamond"/>
-          <w:sz w:val="24"/>
-          <w:szCs w:val="24"/>
           <w:rtl w:val="0"/>
         </w:rPr>
         <w:t xml:space="preserve">30</w:t>
@@ -1474,9 +1197,6 @@
       </w:r>
       <w:r>
         <w:rPr>
-          <w:rFonts w:ascii="Garamond" w:cs="Garamond" w:eastAsia="Garamond" w:hAnsi="Garamond"/>
-          <w:sz w:val="24"/>
-          <w:szCs w:val="24"/>
           <w:rtl w:val="0"/>
         </w:rPr>
         <w:t xml:space="preserve"> questions that they can spread out across the witnesses however they want. Visiting a question that was asked before does not cost another question. Once they ask all their questions, or at any time before that if they like, they may make a guess and attempt to solve the mystery. Players have three chances to make a correct guess. If a player makes the wrong guess, they are told only that their guess is wrong, not which part, and they may keep investigating if they have questions left. Players gain more points if they guess correctly on their first try. </w:t>
@@ -1488,57 +1208,37 @@
           <w:ilvl w:val="0"/>
           <w:numId w:val="3"/>
         </w:numPr>
-        <w:spacing w:after="0" w:afterAutospacing="0" w:before="0" w:beforeAutospacing="0" w:line="276" w:lineRule="auto"/>
+        <w:spacing w:after="0" w:afterAutospacing="0" w:before="0" w:beforeAutospacing="0"/>
         <w:ind w:left="720" w:hanging="360"/>
-        <w:rPr>
-          <w:rFonts w:ascii="Garamond" w:cs="Garamond" w:eastAsia="Garamond" w:hAnsi="Garamond"/>
-          <w:sz w:val="24"/>
-          <w:szCs w:val="24"/>
-        </w:rPr>
-      </w:pPr>
-      <w:r>
-        <w:rPr>
-          <w:rFonts w:ascii="Garamond" w:cs="Garamond" w:eastAsia="Garamond" w:hAnsi="Garamond"/>
-          <w:sz w:val="24"/>
-          <w:szCs w:val="24"/>
+      </w:pPr>
+      <w:r>
+        <w:rPr>
           <w:rtl w:val="0"/>
         </w:rPr>
         <w:t xml:space="preserve"> For each witness, one question is a </w:t>
       </w:r>
       <w:r>
         <w:rPr>
-          <w:rFonts w:ascii="Garamond" w:cs="Garamond" w:eastAsia="Garamond" w:hAnsi="Garamond"/>
           <w:b w:val="1"/>
           <w:bCs w:val="1"/>
-          <w:sz w:val="24"/>
-          <w:szCs w:val="24"/>
           <w:rtl w:val="0"/>
         </w:rPr>
         <w:t xml:space="preserve">tripwire</w:t>
       </w:r>
       <w:r>
         <w:rPr>
-          <w:rFonts w:ascii="Garamond" w:cs="Garamond" w:eastAsia="Garamond" w:hAnsi="Garamond"/>
-          <w:sz w:val="24"/>
-          <w:szCs w:val="24"/>
           <w:rtl w:val="0"/>
         </w:rPr>
         <w:t xml:space="preserve">: it offends or annoys them such that they walk away and the interview ends abruptly. There is no asking any more questions of a witness who was </w:t>
       </w:r>
       <w:r>
         <w:rPr>
-          <w:rFonts w:ascii="Garamond" w:cs="Garamond" w:eastAsia="Garamond" w:hAnsi="Garamond"/>
-          <w:sz w:val="24"/>
-          <w:szCs w:val="24"/>
           <w:rtl w:val="0"/>
         </w:rPr>
         <w:t xml:space="preserve">asked a tripwire</w:t>
       </w:r>
       <w:r>
         <w:rPr>
-          <w:rFonts w:ascii="Garamond" w:cs="Garamond" w:eastAsia="Garamond" w:hAnsi="Garamond"/>
-          <w:sz w:val="24"/>
-          <w:szCs w:val="24"/>
           <w:rtl w:val="0"/>
         </w:rPr>
         <w:t xml:space="preserve">.</w:t>
@@ -1550,37 +1250,23 @@
           <w:ilvl w:val="0"/>
           <w:numId w:val="3"/>
         </w:numPr>
-        <w:spacing w:after="0" w:afterAutospacing="0" w:before="0" w:beforeAutospacing="0" w:line="276" w:lineRule="auto"/>
+        <w:spacing w:after="0" w:afterAutospacing="0" w:before="0" w:beforeAutospacing="0"/>
         <w:ind w:left="720" w:hanging="360"/>
-        <w:rPr>
-          <w:rFonts w:ascii="Garamond" w:cs="Garamond" w:eastAsia="Garamond" w:hAnsi="Garamond"/>
-          <w:sz w:val="24"/>
-          <w:szCs w:val="24"/>
-        </w:rPr>
-      </w:pPr>
-      <w:r>
-        <w:rPr>
-          <w:rFonts w:ascii="Garamond" w:cs="Garamond" w:eastAsia="Garamond" w:hAnsi="Garamond"/>
-          <w:sz w:val="24"/>
-          <w:szCs w:val="24"/>
+      </w:pPr>
+      <w:r>
+        <w:rPr>
           <w:rtl w:val="0"/>
         </w:rPr>
         <w:t xml:space="preserve"> With each witness, players have a chance to do a follow-up. They may do so after any answer the witness gave them (i.e. for all questions except the tripwire). To follow-up students will have to choose one of </w:t>
       </w:r>
       <w:r>
         <w:rPr>
-          <w:rFonts w:ascii="Garamond" w:cs="Garamond" w:eastAsia="Garamond" w:hAnsi="Garamond"/>
-          <w:sz w:val="24"/>
-          <w:szCs w:val="24"/>
           <w:rtl w:val="0"/>
         </w:rPr>
         <w:t xml:space="preserve">two phrasings</w:t>
       </w:r>
       <w:r>
         <w:rPr>
-          <w:rFonts w:ascii="Garamond" w:cs="Garamond" w:eastAsia="Garamond" w:hAnsi="Garamond"/>
-          <w:sz w:val="24"/>
-          <w:szCs w:val="24"/>
           <w:rtl w:val="0"/>
         </w:rPr>
         <w:t xml:space="preserve"> of a follow-up question or comment regarding the witness’s view on the CCC. If they pick correctly, they gain a Major Clue which helps them solve the mystery faster. If they pick incorrectly, the witness storms off angrily (just like they would with a tripwire).</w:t>
@@ -1592,19 +1278,11 @@
           <w:ilvl w:val="0"/>
           <w:numId w:val="3"/>
         </w:numPr>
-        <w:spacing w:after="0" w:afterAutospacing="0" w:before="0" w:beforeAutospacing="0" w:line="276" w:lineRule="auto"/>
+        <w:spacing w:after="0" w:afterAutospacing="0" w:before="0" w:beforeAutospacing="0"/>
         <w:ind w:left="720" w:hanging="360"/>
-        <w:rPr>
-          <w:rFonts w:ascii="Garamond" w:cs="Garamond" w:eastAsia="Garamond" w:hAnsi="Garamond"/>
-          <w:sz w:val="24"/>
-          <w:szCs w:val="24"/>
-        </w:rPr>
-      </w:pPr>
-      <w:r>
-        <w:rPr>
-          <w:rFonts w:ascii="Garamond" w:cs="Garamond" w:eastAsia="Garamond" w:hAnsi="Garamond"/>
-          <w:sz w:val="24"/>
-          <w:szCs w:val="24"/>
+      </w:pPr>
+      <w:r>
+        <w:rPr>
           <w:rtl w:val="0"/>
         </w:rPr>
         <w:t xml:space="preserve">The choice between the two options should present a temptation to answer the question with the ‘wrong’ answer. The emotional stakes in the case and the way in which the follow-up questions are phrased should provide some emotional satisfaction. </w:t>
@@ -1616,19 +1294,11 @@
           <w:ilvl w:val="0"/>
           <w:numId w:val="3"/>
         </w:numPr>
-        <w:spacing w:before="0" w:beforeAutospacing="0" w:line="276" w:lineRule="auto"/>
+        <w:spacing w:before="0" w:beforeAutospacing="0"/>
         <w:ind w:left="720" w:hanging="360"/>
-        <w:rPr>
-          <w:rFonts w:ascii="Garamond" w:cs="Garamond" w:eastAsia="Garamond" w:hAnsi="Garamond"/>
-          <w:sz w:val="24"/>
-          <w:szCs w:val="24"/>
-        </w:rPr>
-      </w:pPr>
-      <w:r>
-        <w:rPr>
-          <w:rFonts w:ascii="Garamond" w:cs="Garamond" w:eastAsia="Garamond" w:hAnsi="Garamond"/>
-          <w:sz w:val="24"/>
-          <w:szCs w:val="24"/>
+      </w:pPr>
+      <w:r>
+        <w:rPr>
           <w:rtl w:val="0"/>
         </w:rPr>
         <w:t xml:space="preserve">Witnesses themselves vary in their receptiveness. It would pay to pay attention to which of these witnesses is more or less receptive. </w:t>
@@ -1641,18 +1311,10 @@
     </w:p>
     <w:p>
       <w:pPr>
-        <w:spacing w:before="200" w:line="276" w:lineRule="auto"/>
-        <w:rPr>
-          <w:rFonts w:ascii="Garamond" w:cs="Garamond" w:eastAsia="Garamond" w:hAnsi="Garamond"/>
-          <w:sz w:val="24"/>
-          <w:szCs w:val="24"/>
-        </w:rPr>
-      </w:pPr>
-      <w:r>
-        <w:rPr>
-          <w:rFonts w:ascii="Garamond" w:cs="Garamond" w:eastAsia="Garamond" w:hAnsi="Garamond"/>
-          <w:sz w:val="24"/>
-          <w:szCs w:val="24"/>
+        <w:rPr/>
+      </w:pPr>
+      <w:r>
+        <w:rPr>
           <w:rtl w:val="0"/>
         </w:rPr>
         <w:t xml:space="preserve">A slide with these rules should be available for players throughout the game so they can refresh their memories if they need to. </w:t>
@@ -1661,24 +1323,12 @@
     <w:p>
       <w:pPr>
         <w:pStyle w:val="Heading2"/>
-        <w:spacing w:after="120" w:line="276" w:lineRule="auto"/>
-        <w:rPr>
-          <w:rFonts w:ascii="Garamond" w:cs="Garamond" w:eastAsia="Garamond" w:hAnsi="Garamond"/>
-          <w:b w:val="0"/>
-          <w:bCs w:val="0"/>
-          <w:sz w:val="32"/>
-          <w:szCs w:val="32"/>
-        </w:rPr>
-      </w:pPr>
-      <w:bookmarkStart w:colFirst="0" w:colLast="0" w:name="_35qvn8hk7yak" w:id="7"/>
-      <w:bookmarkEnd w:id="7"/>
-      <w:r>
-        <w:rPr>
-          <w:rFonts w:ascii="Garamond" w:cs="Garamond" w:eastAsia="Garamond" w:hAnsi="Garamond"/>
-          <w:b w:val="0"/>
-          <w:bCs w:val="0"/>
-          <w:sz w:val="32"/>
-          <w:szCs w:val="32"/>
+        <w:rPr/>
+      </w:pPr>
+      <w:bookmarkStart w:colFirst="0" w:colLast="0" w:name="_35qvn8hk7yak" w:id="8"/>
+      <w:bookmarkEnd w:id="8"/>
+      <w:r>
+        <w:rPr>
           <w:rtl w:val="0"/>
         </w:rPr>
         <w:t xml:space="preserve">3.2 The Hook</w:t>
@@ -1686,78 +1336,52 @@
     </w:p>
     <w:p>
       <w:pPr>
-        <w:spacing w:before="200" w:line="276" w:lineRule="auto"/>
-        <w:rPr>
-          <w:rFonts w:ascii="Garamond" w:cs="Garamond" w:eastAsia="Garamond" w:hAnsi="Garamond"/>
-          <w:sz w:val="24"/>
-          <w:szCs w:val="24"/>
-        </w:rPr>
-      </w:pPr>
-      <w:r>
-        <w:rPr>
-          <w:rFonts w:ascii="Garamond" w:cs="Garamond" w:eastAsia="Garamond" w:hAnsi="Garamond"/>
-          <w:sz w:val="24"/>
-          <w:szCs w:val="24"/>
+        <w:rPr/>
+      </w:pPr>
+      <w:r>
+        <w:rPr>
           <w:rtl w:val="0"/>
         </w:rPr>
         <w:t xml:space="preserve">After the introduction, players are introduced to the mystery by way of </w:t>
       </w:r>
       <w:r>
         <w:rPr>
-          <w:rFonts w:ascii="Garamond" w:cs="Garamond" w:eastAsia="Garamond" w:hAnsi="Garamond"/>
           <w:i w:val="1"/>
           <w:iCs w:val="1"/>
-          <w:sz w:val="24"/>
-          <w:szCs w:val="24"/>
           <w:rtl w:val="0"/>
         </w:rPr>
         <w:t xml:space="preserve">the hook</w:t>
       </w:r>
       <w:r>
         <w:rPr>
-          <w:rFonts w:ascii="Garamond" w:cs="Garamond" w:eastAsia="Garamond" w:hAnsi="Garamond"/>
-          <w:sz w:val="24"/>
-          <w:szCs w:val="24"/>
           <w:rtl w:val="0"/>
         </w:rPr>
         <w:t xml:space="preserve">: a piece of the narrative that presents the CCC, introduces the mystery </w:t>
       </w:r>
       <w:r>
         <w:rPr>
-          <w:rFonts w:ascii="Garamond" w:cs="Garamond" w:eastAsia="Garamond" w:hAnsi="Garamond"/>
           <w:i w:val="1"/>
           <w:iCs w:val="1"/>
-          <w:sz w:val="24"/>
-          <w:szCs w:val="24"/>
           <w:rtl w:val="0"/>
         </w:rPr>
         <w:t xml:space="preserve">and</w:t>
       </w:r>
       <w:r>
         <w:rPr>
-          <w:rFonts w:ascii="Garamond" w:cs="Garamond" w:eastAsia="Garamond" w:hAnsi="Garamond"/>
-          <w:sz w:val="24"/>
-          <w:szCs w:val="24"/>
           <w:rtl w:val="0"/>
         </w:rPr>
         <w:t xml:space="preserve"> situates the players within. For example, in </w:t>
       </w:r>
       <w:r>
         <w:rPr>
-          <w:rFonts w:ascii="Garamond" w:cs="Garamond" w:eastAsia="Garamond" w:hAnsi="Garamond"/>
           <w:i w:val="1"/>
           <w:iCs w:val="1"/>
-          <w:sz w:val="24"/>
-          <w:szCs w:val="24"/>
           <w:rtl w:val="0"/>
         </w:rPr>
         <w:t xml:space="preserve">The Commons’ Comma</w:t>
       </w:r>
       <w:r>
         <w:rPr>
-          <w:rFonts w:ascii="Garamond" w:cs="Garamond" w:eastAsia="Garamond" w:hAnsi="Garamond"/>
-          <w:sz w:val="24"/>
-          <w:szCs w:val="24"/>
           <w:rtl w:val="0"/>
         </w:rPr>
         <w:t xml:space="preserve"> players are student-interns working at the university president office and are tasked with solving their mystery as a task for a part time job they thought would be mostly scanning papers or organizing kitchenette cabinets.</w:t>
@@ -1765,18 +1389,10 @@
     </w:p>
     <w:p>
       <w:pPr>
-        <w:spacing w:before="200" w:line="276" w:lineRule="auto"/>
-        <w:rPr>
-          <w:rFonts w:ascii="Garamond" w:cs="Garamond" w:eastAsia="Garamond" w:hAnsi="Garamond"/>
-          <w:sz w:val="24"/>
-          <w:szCs w:val="24"/>
-        </w:rPr>
-      </w:pPr>
-      <w:r>
-        <w:rPr>
-          <w:rFonts w:ascii="Garamond" w:cs="Garamond" w:eastAsia="Garamond" w:hAnsi="Garamond"/>
-          <w:sz w:val="24"/>
-          <w:szCs w:val="24"/>
+        <w:rPr/>
+      </w:pPr>
+      <w:r>
+        <w:rPr>
           <w:rtl w:val="0"/>
         </w:rPr>
         <w:t xml:space="preserve">The hook should be carefully crafted to be both informative and entertaining, to give the players enough to go off of (there are no other opportunities for big chunks of exposition) as well as something interesting to pull them in and motivate them to be involved. The hook should also include a compelling time pressure which explains why there’s a limited number of questions that the players can ask before… well before something bad happens, but which bad thing, that is told during the hook. </w:t>
@@ -1785,24 +1401,12 @@
     <w:p>
       <w:pPr>
         <w:pStyle w:val="Heading2"/>
-        <w:spacing w:after="120" w:line="276" w:lineRule="auto"/>
-        <w:rPr>
-          <w:rFonts w:ascii="Garamond" w:cs="Garamond" w:eastAsia="Garamond" w:hAnsi="Garamond"/>
-          <w:b w:val="0"/>
-          <w:bCs w:val="0"/>
-          <w:sz w:val="32"/>
-          <w:szCs w:val="32"/>
-        </w:rPr>
-      </w:pPr>
-      <w:bookmarkStart w:colFirst="0" w:colLast="0" w:name="_j7v1h2yirc0i" w:id="8"/>
-      <w:bookmarkEnd w:id="8"/>
-      <w:r>
-        <w:rPr>
-          <w:rFonts w:ascii="Garamond" w:cs="Garamond" w:eastAsia="Garamond" w:hAnsi="Garamond"/>
-          <w:b w:val="0"/>
-          <w:bCs w:val="0"/>
-          <w:sz w:val="32"/>
-          <w:szCs w:val="32"/>
+        <w:rPr/>
+      </w:pPr>
+      <w:bookmarkStart w:colFirst="0" w:colLast="0" w:name="_j7v1h2yirc0i" w:id="9"/>
+      <w:bookmarkEnd w:id="9"/>
+      <w:r>
+        <w:rPr>
           <w:rtl w:val="0"/>
         </w:rPr>
         <w:t xml:space="preserve">3.3 Interviews</w:t>
@@ -1810,18 +1414,10 @@
     </w:p>
     <w:p>
       <w:pPr>
-        <w:spacing w:before="200" w:line="276" w:lineRule="auto"/>
-        <w:rPr>
-          <w:rFonts w:ascii="Garamond" w:cs="Garamond" w:eastAsia="Garamond" w:hAnsi="Garamond"/>
-          <w:sz w:val="24"/>
-          <w:szCs w:val="24"/>
-        </w:rPr>
-      </w:pPr>
-      <w:r>
-        <w:rPr>
-          <w:rFonts w:ascii="Garamond" w:cs="Garamond" w:eastAsia="Garamond" w:hAnsi="Garamond"/>
-          <w:sz w:val="24"/>
-          <w:szCs w:val="24"/>
+        <w:rPr/>
+      </w:pPr>
+      <w:r>
+        <w:rPr>
           <w:rtl w:val="0"/>
         </w:rPr>
         <w:t xml:space="preserve">As noted, the bulk of the game is made of interviews. Students will have a menu of options, each corresponding to a witness they can interview. Students can then ‘walk around’ the campus - going from witness to witness and asking each of them as many questions as they want, provided they have not yet run out of time (i.e. depleted their question ‘budget’) or angered that witness. There are 8 witnesses and each can be asked 8 questions. Since one question for each witness is a tripwire, that leaves us with 56 witness answers. Each one of these 56 answers is made of two parts.  </w:t>
@@ -1829,69 +1425,46 @@
     </w:p>
     <w:p>
       <w:pPr>
-        <w:spacing w:before="200" w:line="276" w:lineRule="auto"/>
-        <w:rPr>
-          <w:rFonts w:ascii="Garamond" w:cs="Garamond" w:eastAsia="Garamond" w:hAnsi="Garamond"/>
-          <w:sz w:val="24"/>
-          <w:szCs w:val="24"/>
-        </w:rPr>
-      </w:pPr>
-      <w:r>
-        <w:rPr>
-          <w:rFonts w:ascii="Garamond" w:cs="Garamond" w:eastAsia="Garamond" w:hAnsi="Garamond"/>
+        <w:rPr/>
+      </w:pPr>
+      <w:r>
+        <w:rPr>
           <w:b w:val="1"/>
           <w:bCs w:val="1"/>
-          <w:sz w:val="24"/>
-          <w:szCs w:val="24"/>
           <w:rtl w:val="0"/>
         </w:rPr>
         <w:t xml:space="preserve">A piece of information</w:t>
       </w:r>
       <w:r>
         <w:rPr>
-          <w:rFonts w:ascii="Garamond" w:cs="Garamond" w:eastAsia="Garamond" w:hAnsi="Garamond"/>
-          <w:sz w:val="24"/>
-          <w:szCs w:val="24"/>
           <w:rtl w:val="0"/>
         </w:rPr>
         <w:t xml:space="preserve"> about the mystery. Of the seven non-tripwire answers of each witness, 4 convey useful information, which technically will be referred to as </w:t>
       </w:r>
       <w:r>
         <w:rPr>
-          <w:rFonts w:ascii="Garamond" w:cs="Garamond" w:eastAsia="Garamond" w:hAnsi="Garamond"/>
           <w:i w:val="1"/>
           <w:iCs w:val="1"/>
-          <w:sz w:val="24"/>
-          <w:szCs w:val="24"/>
           <w:rtl w:val="0"/>
         </w:rPr>
         <w:t xml:space="preserve">Clues</w:t>
       </w:r>
       <w:r>
         <w:rPr>
-          <w:rFonts w:ascii="Garamond" w:cs="Garamond" w:eastAsia="Garamond" w:hAnsi="Garamond"/>
-          <w:sz w:val="24"/>
-          <w:szCs w:val="24"/>
           <w:rtl w:val="0"/>
         </w:rPr>
         <w:t xml:space="preserve">, and 3 pieces of misleading or unhelpful information, which technically will be referred to as </w:t>
       </w:r>
       <w:r>
         <w:rPr>
-          <w:rFonts w:ascii="Garamond" w:cs="Garamond" w:eastAsia="Garamond" w:hAnsi="Garamond"/>
           <w:i w:val="1"/>
           <w:iCs w:val="1"/>
-          <w:sz w:val="24"/>
-          <w:szCs w:val="24"/>
           <w:rtl w:val="0"/>
         </w:rPr>
         <w:t xml:space="preserve">Red Herrings,</w:t>
       </w:r>
       <w:r>
         <w:rPr>
-          <w:rFonts w:ascii="Garamond" w:cs="Garamond" w:eastAsia="Garamond" w:hAnsi="Garamond"/>
-          <w:sz w:val="24"/>
-          <w:szCs w:val="24"/>
           <w:rtl w:val="0"/>
         </w:rPr>
         <w:t xml:space="preserve"> Across eight witnesses that is 32 useful answers and 24 red herrings.</w:t>
@@ -1903,39 +1476,25 @@
           <w:ilvl w:val="0"/>
           <w:numId w:val="8"/>
         </w:numPr>
-        <w:spacing w:after="0" w:afterAutospacing="0" w:before="200" w:line="276" w:lineRule="auto"/>
+        <w:spacing w:after="0" w:afterAutospacing="0"/>
         <w:ind w:left="720" w:hanging="360"/>
-        <w:rPr>
-          <w:rFonts w:ascii="Garamond" w:cs="Garamond" w:eastAsia="Garamond" w:hAnsi="Garamond"/>
-          <w:sz w:val="24"/>
-          <w:szCs w:val="24"/>
-        </w:rPr>
-      </w:pPr>
-      <w:r>
-        <w:rPr>
-          <w:rFonts w:ascii="Garamond" w:cs="Garamond" w:eastAsia="Garamond" w:hAnsi="Garamond"/>
-          <w:sz w:val="24"/>
-          <w:szCs w:val="24"/>
+      </w:pPr>
+      <w:r>
+        <w:rPr>
           <w:rtl w:val="0"/>
         </w:rPr>
         <w:t xml:space="preserve">The 32 useful answers include </w:t>
       </w:r>
       <w:r>
         <w:rPr>
-          <w:rFonts w:ascii="Garamond" w:cs="Garamond" w:eastAsia="Garamond" w:hAnsi="Garamond"/>
           <w:b w:val="1"/>
           <w:bCs w:val="1"/>
-          <w:sz w:val="24"/>
-          <w:szCs w:val="24"/>
           <w:rtl w:val="0"/>
         </w:rPr>
         <w:t xml:space="preserve">16 Clues</w:t>
       </w:r>
       <w:r>
         <w:rPr>
-          <w:rFonts w:ascii="Garamond" w:cs="Garamond" w:eastAsia="Garamond" w:hAnsi="Garamond"/>
-          <w:sz w:val="24"/>
-          <w:szCs w:val="24"/>
           <w:rtl w:val="0"/>
         </w:rPr>
         <w:t xml:space="preserve">, each given by two different witnesses. This gives the player more than one route to access each clue as well as an (imperfect) signal regarding the reliability of the information.</w:t>
@@ -1947,57 +1506,37 @@
           <w:ilvl w:val="0"/>
           <w:numId w:val="8"/>
         </w:numPr>
-        <w:spacing w:after="0" w:afterAutospacing="0" w:before="0" w:beforeAutospacing="0" w:line="276" w:lineRule="auto"/>
+        <w:spacing w:after="0" w:afterAutospacing="0" w:before="0" w:beforeAutospacing="0"/>
         <w:ind w:left="720" w:hanging="360"/>
-        <w:rPr>
-          <w:rFonts w:ascii="Garamond" w:cs="Garamond" w:eastAsia="Garamond" w:hAnsi="Garamond"/>
-          <w:sz w:val="24"/>
-          <w:szCs w:val="24"/>
-        </w:rPr>
-      </w:pPr>
-      <w:r>
-        <w:rPr>
-          <w:rFonts w:ascii="Garamond" w:cs="Garamond" w:eastAsia="Garamond" w:hAnsi="Garamond"/>
-          <w:sz w:val="24"/>
-          <w:szCs w:val="24"/>
+      </w:pPr>
+      <w:r>
+        <w:rPr>
           <w:rtl w:val="0"/>
         </w:rPr>
         <w:t xml:space="preserve">The </w:t>
       </w:r>
       <w:r>
         <w:rPr>
-          <w:rFonts w:ascii="Garamond" w:cs="Garamond" w:eastAsia="Garamond" w:hAnsi="Garamond"/>
           <w:b w:val="1"/>
           <w:bCs w:val="1"/>
-          <w:sz w:val="24"/>
-          <w:szCs w:val="24"/>
           <w:rtl w:val="0"/>
         </w:rPr>
         <w:t xml:space="preserve">24 Red Herrings</w:t>
       </w:r>
       <w:r>
         <w:rPr>
-          <w:rFonts w:ascii="Garamond" w:cs="Garamond" w:eastAsia="Garamond" w:hAnsi="Garamond"/>
-          <w:sz w:val="24"/>
-          <w:szCs w:val="24"/>
           <w:rtl w:val="0"/>
         </w:rPr>
         <w:t xml:space="preserve"> are each given once and they are grouped in sets (of 2/3/4) such that the Red Herrings that form a set 'cancel each other out,' so if you have all members of a set you should be able to deduce that neither of them are relevant to the case. For example, a set of Red Herrings may include descriptions of suspicious-but-not-actually-incriminating behaviors by one of the suspects as well as some exonerating information about that suspect. Taken on their own, the suspicious behaviors may seem pertinent to the case but the exonerating information shows that despite their attractiveness, the pieces of information about the suspicious behavior are not helpful.</w:t>
       </w:r>
       <w:r>
         <w:rPr>
-          <w:rFonts w:ascii="Garamond" w:cs="Garamond" w:eastAsia="Garamond" w:hAnsi="Garamond"/>
-          <w:sz w:val="24"/>
-          <w:szCs w:val="24"/>
           <w:vertAlign w:val="superscript"/>
         </w:rPr>
         <w:footnoteReference w:customMarkFollows="0" w:id="4"/>
       </w:r>
       <w:r>
         <w:rPr>
-          <w:rFonts w:ascii="Garamond" w:cs="Garamond" w:eastAsia="Garamond" w:hAnsi="Garamond"/>
-          <w:sz w:val="24"/>
-          <w:szCs w:val="24"/>
           <w:rtl w:val="0"/>
         </w:rPr>
         <w:t xml:space="preserve"> Another example is a set of Red Herrings that make up lies which can be exposed when one has the whole set. </w:t>
@@ -2009,19 +1548,11 @@
           <w:ilvl w:val="0"/>
           <w:numId w:val="8"/>
         </w:numPr>
-        <w:spacing w:before="0" w:beforeAutospacing="0" w:line="276" w:lineRule="auto"/>
+        <w:spacing w:before="0" w:beforeAutospacing="0"/>
         <w:ind w:left="720" w:hanging="360"/>
-        <w:rPr>
-          <w:rFonts w:ascii="Garamond" w:cs="Garamond" w:eastAsia="Garamond" w:hAnsi="Garamond"/>
-          <w:sz w:val="24"/>
-          <w:szCs w:val="24"/>
-        </w:rPr>
-      </w:pPr>
-      <w:r>
-        <w:rPr>
-          <w:rFonts w:ascii="Garamond" w:cs="Garamond" w:eastAsia="Garamond" w:hAnsi="Garamond"/>
-          <w:sz w:val="24"/>
-          <w:szCs w:val="24"/>
+      </w:pPr>
+      <w:r>
+        <w:rPr>
           <w:rtl w:val="0"/>
         </w:rPr>
         <w:t xml:space="preserve">Useful clues gained without follow-ups point in the right direction but are individually inconclusive. Together, all 16 do add up to the solution, but a player working from ordinary clues alone will usually have to reason across gaps.</w:t>
@@ -2029,29 +1560,18 @@
     </w:p>
     <w:p>
       <w:pPr>
-        <w:spacing w:before="200" w:line="276" w:lineRule="auto"/>
-        <w:rPr>
-          <w:rFonts w:ascii="Garamond" w:cs="Garamond" w:eastAsia="Garamond" w:hAnsi="Garamond"/>
-          <w:sz w:val="24"/>
-          <w:szCs w:val="24"/>
-        </w:rPr>
-      </w:pPr>
-      <w:r>
-        <w:rPr>
-          <w:rFonts w:ascii="Garamond" w:cs="Garamond" w:eastAsia="Garamond" w:hAnsi="Garamond"/>
+        <w:rPr/>
+      </w:pPr>
+      <w:r>
+        <w:rPr>
           <w:b w:val="1"/>
           <w:bCs w:val="1"/>
-          <w:sz w:val="24"/>
-          <w:szCs w:val="24"/>
           <w:rtl w:val="0"/>
         </w:rPr>
         <w:t xml:space="preserve">An expressed opinion about the controversy</w:t>
       </w:r>
       <w:r>
         <w:rPr>
-          <w:rFonts w:ascii="Garamond" w:cs="Garamond" w:eastAsia="Garamond" w:hAnsi="Garamond"/>
-          <w:sz w:val="24"/>
-          <w:szCs w:val="24"/>
           <w:rtl w:val="0"/>
         </w:rPr>
         <w:t xml:space="preserve">. Alongside the information provided about the mystery, witnesses volunteer their view of the CCC and say how their view differs from that of one of the other witnesses. As part of the scenario setup, witnesses are ranked by their receptiveness. The witness ranked 1 expresses their opinion receptively in all seven answers, rank 2 in six of seven, rank 3 in five, and so on down to rank 8, who is receptive in none. Overall, exactly half of the 56 opinion expressions are receptive. The details of this ranking are not shared with the players though the general fact regarding the variance in receptiveness. </w:t>
@@ -2059,38 +1579,24 @@
     </w:p>
     <w:p>
       <w:pPr>
-        <w:spacing w:before="200" w:line="276" w:lineRule="auto"/>
-        <w:rPr>
-          <w:rFonts w:ascii="Garamond" w:cs="Garamond" w:eastAsia="Garamond" w:hAnsi="Garamond"/>
-          <w:sz w:val="24"/>
-          <w:szCs w:val="24"/>
-        </w:rPr>
-      </w:pPr>
-      <w:r>
-        <w:rPr>
-          <w:rFonts w:ascii="Garamond" w:cs="Garamond" w:eastAsia="Garamond" w:hAnsi="Garamond"/>
-          <w:sz w:val="24"/>
-          <w:szCs w:val="24"/>
+        <w:rPr/>
+      </w:pPr>
+      <w:r>
+        <w:rPr>
           <w:rtl w:val="0"/>
         </w:rPr>
         <w:t xml:space="preserve">Receptive expressions use one or more HEAR moves while unreceptive ones expresses their views on the basis of </w:t>
       </w:r>
       <w:r>
         <w:rPr>
-          <w:rFonts w:ascii="Garamond" w:cs="Garamond" w:eastAsia="Garamond" w:hAnsi="Garamond"/>
           <w:i w:val="1"/>
           <w:iCs w:val="1"/>
-          <w:sz w:val="24"/>
-          <w:szCs w:val="24"/>
           <w:rtl w:val="0"/>
         </w:rPr>
         <w:t xml:space="preserve">naive realism</w:t>
       </w:r>
       <w:r>
         <w:rPr>
-          <w:rFonts w:ascii="Garamond" w:cs="Garamond" w:eastAsia="Garamond" w:hAnsi="Garamond"/>
-          <w:sz w:val="24"/>
-          <w:szCs w:val="24"/>
           <w:rtl w:val="0"/>
         </w:rPr>
         <w:t xml:space="preserve">, assuming their perspective is obviously true and so uses absolute language (‘obviously’), fails to acknowledge the other perspective or recognize it as legitimate, focus on how other views are wrong rather than seek agreement and so forth.  </w:t>
@@ -2099,22 +1605,12 @@
     <w:p>
       <w:pPr>
         <w:pStyle w:val="Heading3"/>
-        <w:spacing w:before="320" w:line="276" w:lineRule="auto"/>
-        <w:rPr>
-          <w:rFonts w:ascii="Garamond" w:cs="Garamond" w:eastAsia="Garamond" w:hAnsi="Garamond"/>
-          <w:b w:val="0"/>
-          <w:bCs w:val="0"/>
-          <w:color w:val="434343"/>
-        </w:rPr>
-      </w:pPr>
-      <w:bookmarkStart w:colFirst="0" w:colLast="0" w:name="_n565rz9sqema" w:id="9"/>
-      <w:bookmarkEnd w:id="9"/>
-      <w:r>
-        <w:rPr>
-          <w:rFonts w:ascii="Garamond" w:cs="Garamond" w:eastAsia="Garamond" w:hAnsi="Garamond"/>
-          <w:b w:val="0"/>
-          <w:bCs w:val="0"/>
-          <w:color w:val="434343"/>
+        <w:rPr/>
+      </w:pPr>
+      <w:bookmarkStart w:colFirst="0" w:colLast="0" w:name="_n565rz9sqema" w:id="10"/>
+      <w:bookmarkEnd w:id="10"/>
+      <w:r>
+        <w:rPr>
           <w:rtl w:val="0"/>
         </w:rPr>
         <w:t xml:space="preserve">3.3.1 Follow-up questions and Major Clues</w:t>
@@ -2122,36 +1618,22 @@
     </w:p>
     <w:p>
       <w:pPr>
-        <w:spacing w:before="200" w:line="276" w:lineRule="auto"/>
-        <w:rPr>
-          <w:rFonts w:ascii="Garamond" w:cs="Garamond" w:eastAsia="Garamond" w:hAnsi="Garamond"/>
-          <w:sz w:val="24"/>
-          <w:szCs w:val="24"/>
-        </w:rPr>
-      </w:pPr>
-      <w:r>
-        <w:rPr>
-          <w:rFonts w:ascii="Garamond" w:cs="Garamond" w:eastAsia="Garamond" w:hAnsi="Garamond"/>
-          <w:sz w:val="24"/>
-          <w:szCs w:val="24"/>
+        <w:rPr/>
+      </w:pPr>
+      <w:r>
+        <w:rPr>
           <w:rtl w:val="0"/>
         </w:rPr>
         <w:t xml:space="preserve">Once per witness, after any answer except for the tripwire, players may choose to “ask a follow-up about their opinion”. The game then offers </w:t>
       </w:r>
       <w:r>
         <w:rPr>
-          <w:rFonts w:ascii="Garamond" w:cs="Garamond" w:eastAsia="Garamond" w:hAnsi="Garamond"/>
-          <w:sz w:val="24"/>
-          <w:szCs w:val="24"/>
           <w:rtl w:val="0"/>
         </w:rPr>
         <w:t xml:space="preserve">two </w:t>
       </w:r>
       <w:r>
         <w:rPr>
-          <w:rFonts w:ascii="Garamond" w:cs="Garamond" w:eastAsia="Garamond" w:hAnsi="Garamond"/>
-          <w:sz w:val="24"/>
-          <w:szCs w:val="24"/>
           <w:rtl w:val="0"/>
         </w:rPr>
         <w:t xml:space="preserve">follow-up questions about the witness’s view of the controversy. Both options should be relevant and seem like reasonable responses though one will be framed as more receptive than the other. Each witness has only one pair of follow-up questions so they would not be super tailored to the particular response a witness just gave but instead will be responsive to their position about the CCC. Note: The follow-up does not depend on the witness’s own receptiveness.</w:t>
@@ -2159,38 +1641,24 @@
     </w:p>
     <w:p>
       <w:pPr>
-        <w:spacing w:before="200" w:line="276" w:lineRule="auto"/>
-        <w:rPr>
-          <w:rFonts w:ascii="Garamond" w:cs="Garamond" w:eastAsia="Garamond" w:hAnsi="Garamond"/>
-          <w:sz w:val="24"/>
-          <w:szCs w:val="24"/>
-        </w:rPr>
-      </w:pPr>
-      <w:r>
-        <w:rPr>
-          <w:rFonts w:ascii="Garamond" w:cs="Garamond" w:eastAsia="Garamond" w:hAnsi="Garamond"/>
-          <w:sz w:val="24"/>
-          <w:szCs w:val="24"/>
+        <w:rPr/>
+      </w:pPr>
+      <w:r>
+        <w:rPr>
           <w:rtl w:val="0"/>
         </w:rPr>
         <w:t xml:space="preserve">How obvious or subtle this difference will be requires careful calibration. Making it too obvious will make the learning element of the game feel cheap and could render the mystery trivial. Making it too subtle can cause frustration to users who may feel like they couldn’t have been expected to interpret such a subtle difference. In general, </w:t>
       </w:r>
       <w:r>
         <w:rPr>
-          <w:rFonts w:ascii="Garamond" w:cs="Garamond" w:eastAsia="Garamond" w:hAnsi="Garamond"/>
           <w:b w:val="1"/>
           <w:bCs w:val="1"/>
-          <w:sz w:val="24"/>
-          <w:szCs w:val="24"/>
           <w:rtl w:val="0"/>
         </w:rPr>
         <w:t xml:space="preserve">picking the correct follow-up should be as difficult as possible</w:t>
       </w:r>
       <w:r>
         <w:rPr>
-          <w:rFonts w:ascii="Garamond" w:cs="Garamond" w:eastAsia="Garamond" w:hAnsi="Garamond"/>
-          <w:sz w:val="24"/>
-          <w:szCs w:val="24"/>
           <w:rtl w:val="0"/>
         </w:rPr>
         <w:t xml:space="preserve"> while having a solid justification from the HEAR framework. It’s ok if there is some variation in the difficulty between witnesses. </w:t>
@@ -2202,39 +1670,25 @@
           <w:ilvl w:val="0"/>
           <w:numId w:val="1"/>
         </w:numPr>
-        <w:spacing w:after="0" w:afterAutospacing="0" w:before="200" w:line="276" w:lineRule="auto"/>
+        <w:spacing w:after="0" w:afterAutospacing="0"/>
         <w:ind w:left="720" w:hanging="360"/>
-        <w:rPr>
-          <w:rFonts w:ascii="Garamond" w:cs="Garamond" w:eastAsia="Garamond" w:hAnsi="Garamond"/>
-          <w:sz w:val="24"/>
-          <w:szCs w:val="24"/>
-        </w:rPr>
-      </w:pPr>
-      <w:r>
-        <w:rPr>
-          <w:rFonts w:ascii="Garamond" w:cs="Garamond" w:eastAsia="Garamond" w:hAnsi="Garamond"/>
-          <w:sz w:val="24"/>
-          <w:szCs w:val="24"/>
+      </w:pPr>
+      <w:r>
+        <w:rPr>
           <w:rtl w:val="0"/>
         </w:rPr>
         <w:t xml:space="preserve">If the player picks the more receptive follow-up, the witness opens up and the player earns one of the four </w:t>
       </w:r>
       <w:r>
         <w:rPr>
-          <w:rFonts w:ascii="Garamond" w:cs="Garamond" w:eastAsia="Garamond" w:hAnsi="Garamond"/>
           <w:b w:val="1"/>
           <w:bCs w:val="1"/>
-          <w:sz w:val="24"/>
-          <w:szCs w:val="24"/>
           <w:rtl w:val="0"/>
         </w:rPr>
         <w:t xml:space="preserve">Major Clues</w:t>
       </w:r>
       <w:r>
         <w:rPr>
-          <w:rFonts w:ascii="Garamond" w:cs="Garamond" w:eastAsia="Garamond" w:hAnsi="Garamond"/>
-          <w:sz w:val="24"/>
-          <w:szCs w:val="24"/>
           <w:rtl w:val="0"/>
         </w:rPr>
         <w:t xml:space="preserve">. The game then shows a short explanation of why that phrasing worked and which HEAR elements it used.</w:t>
@@ -2246,19 +1700,11 @@
           <w:ilvl w:val="0"/>
           <w:numId w:val="1"/>
         </w:numPr>
-        <w:spacing w:before="0" w:beforeAutospacing="0" w:line="276" w:lineRule="auto"/>
+        <w:spacing w:before="0" w:beforeAutospacing="0"/>
         <w:ind w:left="720" w:hanging="360"/>
-        <w:rPr>
-          <w:rFonts w:ascii="Garamond" w:cs="Garamond" w:eastAsia="Garamond" w:hAnsi="Garamond"/>
-          <w:sz w:val="24"/>
-          <w:szCs w:val="24"/>
-        </w:rPr>
-      </w:pPr>
-      <w:r>
-        <w:rPr>
-          <w:rFonts w:ascii="Garamond" w:cs="Garamond" w:eastAsia="Garamond" w:hAnsi="Garamond"/>
-          <w:sz w:val="24"/>
-          <w:szCs w:val="24"/>
+      </w:pPr>
+      <w:r>
+        <w:rPr>
           <w:rtl w:val="0"/>
         </w:rPr>
         <w:t xml:space="preserve">If the player picks the unreceptive follow-up, the witness refuses to say anything more and the interview ends, exactly as if a tripwire had been asked.</w:t>
@@ -2266,18 +1712,10 @@
     </w:p>
     <w:p>
       <w:pPr>
-        <w:spacing w:before="200" w:line="276" w:lineRule="auto"/>
-        <w:rPr>
-          <w:rFonts w:ascii="Garamond" w:cs="Garamond" w:eastAsia="Garamond" w:hAnsi="Garamond"/>
-          <w:sz w:val="24"/>
-          <w:szCs w:val="24"/>
-        </w:rPr>
-      </w:pPr>
-      <w:r>
-        <w:rPr>
-          <w:rFonts w:ascii="Garamond" w:cs="Garamond" w:eastAsia="Garamond" w:hAnsi="Garamond"/>
-          <w:sz w:val="24"/>
-          <w:szCs w:val="24"/>
+        <w:rPr/>
+      </w:pPr>
+      <w:r>
+        <w:rPr>
           <w:rtl w:val="0"/>
         </w:rPr>
         <w:t xml:space="preserve">There are four Major Clues per scenario. Each Major Clue combines four of the 16 ordinary clues such that all four Major Clues together cover all 16 standard Clues without overlap. Therefore, together the four Major Clues make the solution unmistakable. Each time a Major Clue is earned the player also gains the next letter of the word H-E-A-R, displayed on screen. The letters are a progress tally and are not tied to specific HEAR elements or specific clues. After all four Major Clues are earned, a further successful follow-up still produces the explanation but no new clue.</w:t>
@@ -2286,24 +1724,12 @@
     <w:p>
       <w:pPr>
         <w:pStyle w:val="Heading2"/>
-        <w:spacing w:after="120" w:line="276" w:lineRule="auto"/>
-        <w:rPr>
-          <w:rFonts w:ascii="Garamond" w:cs="Garamond" w:eastAsia="Garamond" w:hAnsi="Garamond"/>
-          <w:b w:val="0"/>
-          <w:bCs w:val="0"/>
-          <w:sz w:val="32"/>
-          <w:szCs w:val="32"/>
-        </w:rPr>
-      </w:pPr>
-      <w:bookmarkStart w:colFirst="0" w:colLast="0" w:name="_1qymattj2854" w:id="10"/>
-      <w:bookmarkEnd w:id="10"/>
-      <w:r>
-        <w:rPr>
-          <w:rFonts w:ascii="Garamond" w:cs="Garamond" w:eastAsia="Garamond" w:hAnsi="Garamond"/>
-          <w:b w:val="0"/>
-          <w:bCs w:val="0"/>
-          <w:sz w:val="32"/>
-          <w:szCs w:val="32"/>
+        <w:rPr/>
+      </w:pPr>
+      <w:bookmarkStart w:colFirst="0" w:colLast="0" w:name="_1qymattj2854" w:id="11"/>
+      <w:bookmarkEnd w:id="11"/>
+      <w:r>
+        <w:rPr>
           <w:rtl w:val="0"/>
         </w:rPr>
         <w:t xml:space="preserve">3.4 Solving the Mystery and Ending</w:t>
@@ -2311,58 +1737,38 @@
     </w:p>
     <w:p>
       <w:pPr>
-        <w:spacing w:before="200" w:line="276" w:lineRule="auto"/>
-        <w:rPr>
-          <w:rFonts w:ascii="Garamond" w:cs="Garamond" w:eastAsia="Garamond" w:hAnsi="Garamond"/>
-          <w:sz w:val="24"/>
-          <w:szCs w:val="24"/>
-        </w:rPr>
-      </w:pPr>
-      <w:r>
-        <w:rPr>
-          <w:rFonts w:ascii="Garamond" w:cs="Garamond" w:eastAsia="Garamond" w:hAnsi="Garamond"/>
-          <w:sz w:val="24"/>
-          <w:szCs w:val="24"/>
+        <w:rPr/>
+      </w:pPr>
+      <w:r>
+        <w:rPr>
           <w:rtl w:val="0"/>
         </w:rPr>
         <w:t xml:space="preserve">After every interview question that’s resolved, players may choose to </w:t>
       </w:r>
       <w:r>
         <w:rPr>
-          <w:rFonts w:ascii="Garamond" w:cs="Garamond" w:eastAsia="Garamond" w:hAnsi="Garamond"/>
           <w:i w:val="1"/>
           <w:iCs w:val="1"/>
-          <w:sz w:val="24"/>
-          <w:szCs w:val="24"/>
           <w:rtl w:val="0"/>
         </w:rPr>
         <w:t xml:space="preserve">solve</w:t>
       </w:r>
       <w:r>
         <w:rPr>
-          <w:rFonts w:ascii="Garamond" w:cs="Garamond" w:eastAsia="Garamond" w:hAnsi="Garamond"/>
-          <w:sz w:val="24"/>
-          <w:szCs w:val="24"/>
           <w:rtl w:val="0"/>
         </w:rPr>
         <w:t xml:space="preserve"> the case. Solving the case just means that players are given an opportunity to submit their answers (which may be referred to as a guess, though hopefully isn’t the result of pure guesswork). </w:t>
       </w:r>
       <w:r>
         <w:rPr>
-          <w:rFonts w:ascii="Garamond" w:cs="Garamond" w:eastAsia="Garamond" w:hAnsi="Garamond"/>
           <w:b w:val="1"/>
           <w:bCs w:val="1"/>
-          <w:sz w:val="24"/>
-          <w:szCs w:val="24"/>
           <w:rtl w:val="0"/>
         </w:rPr>
         <w:t xml:space="preserve">Players are given three chances to submit their answers</w:t>
       </w:r>
       <w:r>
         <w:rPr>
-          <w:rFonts w:ascii="Garamond" w:cs="Garamond" w:eastAsia="Garamond" w:hAnsi="Garamond"/>
-          <w:sz w:val="24"/>
-          <w:szCs w:val="24"/>
           <w:rtl w:val="0"/>
         </w:rPr>
         <w:t xml:space="preserve">. After a wrong submission the game says only that it is not the solution, not which part is wrong. Players may then keep investigating (if they have questions left) or submit again. After a correct submission, or a third wrong one, they are directed to the ending. A correct solution earns 3 points on the first try, 2 on the second and 1 on the third; the debrief shows how many tries were used. </w:t>
@@ -2370,18 +1776,10 @@
     </w:p>
     <w:p>
       <w:pPr>
-        <w:spacing w:before="200" w:line="276" w:lineRule="auto"/>
-        <w:rPr>
-          <w:rFonts w:ascii="Garamond" w:cs="Garamond" w:eastAsia="Garamond" w:hAnsi="Garamond"/>
-          <w:sz w:val="24"/>
-          <w:szCs w:val="24"/>
-        </w:rPr>
-      </w:pPr>
-      <w:r>
-        <w:rPr>
-          <w:rFonts w:ascii="Garamond" w:cs="Garamond" w:eastAsia="Garamond" w:hAnsi="Garamond"/>
-          <w:sz w:val="24"/>
-          <w:szCs w:val="24"/>
+        <w:rPr/>
+      </w:pPr>
+      <w:r>
+        <w:rPr>
           <w:rtl w:val="0"/>
         </w:rPr>
         <w:t xml:space="preserve">If players have no more questions in their allotted budget, they ‘run out of time’ - they have to submit their best guess and hope for the best. </w:t>
@@ -2389,18 +1787,10 @@
     </w:p>
     <w:p>
       <w:pPr>
-        <w:spacing w:before="200" w:line="276" w:lineRule="auto"/>
-        <w:rPr>
-          <w:rFonts w:ascii="Garamond" w:cs="Garamond" w:eastAsia="Garamond" w:hAnsi="Garamond"/>
-          <w:sz w:val="24"/>
-          <w:szCs w:val="24"/>
-        </w:rPr>
-      </w:pPr>
-      <w:r>
-        <w:rPr>
-          <w:rFonts w:ascii="Garamond" w:cs="Garamond" w:eastAsia="Garamond" w:hAnsi="Garamond"/>
-          <w:sz w:val="24"/>
-          <w:szCs w:val="24"/>
+        <w:rPr/>
+      </w:pPr>
+      <w:r>
+        <w:rPr>
           <w:rtl w:val="0"/>
         </w:rPr>
         <w:t xml:space="preserve">The ending should include a reveal of the full story which should be a satisfying twist. There would be slightly different endings depending on whether the players picked the right solution or not. Alongside the satisfaction of solving the case correctly, the story reveal is a big part of the payoff players get from playing the game so hopefully even players that didn’t solve correctly will have a pleasing experience. </w:t>
@@ -2408,18 +1798,10 @@
     </w:p>
     <w:p>
       <w:pPr>
-        <w:spacing w:before="200" w:line="276" w:lineRule="auto"/>
-        <w:rPr>
-          <w:rFonts w:ascii="Garamond" w:cs="Garamond" w:eastAsia="Garamond" w:hAnsi="Garamond"/>
-          <w:sz w:val="24"/>
-          <w:szCs w:val="24"/>
-        </w:rPr>
-      </w:pPr>
-      <w:r>
-        <w:rPr>
-          <w:rFonts w:ascii="Garamond" w:cs="Garamond" w:eastAsia="Garamond" w:hAnsi="Garamond"/>
-          <w:sz w:val="24"/>
-          <w:szCs w:val="24"/>
+        <w:rPr/>
+      </w:pPr>
+      <w:r>
+        <w:rPr>
           <w:rtl w:val="0"/>
         </w:rPr>
         <w:t xml:space="preserve">After the big reveal, players should be asked to rank the witnesses in order of their receptiveness. The ranking should be graded in terms of its difference from the real ranking and a score be given. Depending on the context, there’s an option to create a leaderboard with scores of different students.</w:t>
@@ -2428,25 +1810,13 @@
     <w:p>
       <w:pPr>
         <w:pStyle w:val="Heading1"/>
-        <w:spacing w:before="400" w:line="276" w:lineRule="auto"/>
-        <w:rPr>
-          <w:rFonts w:ascii="Garamond" w:cs="Garamond" w:eastAsia="Garamond" w:hAnsi="Garamond"/>
-          <w:b w:val="0"/>
-          <w:bCs w:val="0"/>
-          <w:sz w:val="40"/>
-          <w:szCs w:val="40"/>
-        </w:rPr>
-      </w:pPr>
-      <w:bookmarkStart w:colFirst="0" w:colLast="0" w:name="_6ox7aix20q37" w:id="11"/>
-      <w:bookmarkEnd w:id="11"/>
+        <w:rPr/>
+      </w:pPr>
+      <w:bookmarkStart w:colFirst="0" w:colLast="0" w:name="_6ox7aix20q37" w:id="12"/>
+      <w:bookmarkEnd w:id="12"/>
       <w:commentRangeStart w:id="0"/>
       <w:r>
         <w:rPr>
-          <w:rFonts w:ascii="Garamond" w:cs="Garamond" w:eastAsia="Garamond" w:hAnsi="Garamond"/>
-          <w:b w:val="0"/>
-          <w:bCs w:val="0"/>
-          <w:sz w:val="40"/>
-          <w:szCs w:val="40"/>
           <w:rtl w:val="0"/>
         </w:rPr>
         <w:t xml:space="preserve">4. What a scenario packet contains</w:t>
@@ -2463,18 +1833,10 @@
     </w:p>
     <w:p>
       <w:pPr>
-        <w:spacing w:before="200" w:line="276" w:lineRule="auto"/>
-        <w:rPr>
-          <w:rFonts w:ascii="Garamond" w:cs="Garamond" w:eastAsia="Garamond" w:hAnsi="Garamond"/>
-          <w:sz w:val="24"/>
-          <w:szCs w:val="24"/>
-        </w:rPr>
-      </w:pPr>
-      <w:r>
-        <w:rPr>
-          <w:rFonts w:ascii="Garamond" w:cs="Garamond" w:eastAsia="Garamond" w:hAnsi="Garamond"/>
-          <w:sz w:val="24"/>
-          <w:szCs w:val="24"/>
+        <w:rPr/>
+      </w:pPr>
+      <w:r>
+        <w:rPr>
           <w:rtl w:val="0"/>
         </w:rPr>
         <w:t xml:space="preserve">A scenario packet is everything the Twine engine needs to produce a playable game. It consists of one narrative document, one response-matrix workbook, and an assets folder, and it must contain the following.</w:t>
@@ -2486,19 +1848,11 @@
           <w:ilvl w:val="0"/>
           <w:numId w:val="2"/>
         </w:numPr>
-        <w:spacing w:after="0" w:afterAutospacing="0" w:before="200" w:line="276" w:lineRule="auto"/>
+        <w:spacing w:after="0" w:afterAutospacing="0"/>
         <w:ind w:left="720" w:hanging="360"/>
-        <w:rPr>
-          <w:rFonts w:ascii="Garamond" w:cs="Garamond" w:eastAsia="Garamond" w:hAnsi="Garamond"/>
-          <w:sz w:val="24"/>
-          <w:szCs w:val="24"/>
-        </w:rPr>
-      </w:pPr>
-      <w:r>
-        <w:rPr>
-          <w:rFonts w:ascii="Garamond" w:cs="Garamond" w:eastAsia="Garamond" w:hAnsi="Garamond"/>
-          <w:sz w:val="24"/>
-          <w:szCs w:val="24"/>
+      </w:pPr>
+      <w:r>
+        <w:rPr>
           <w:rtl w:val="0"/>
         </w:rPr>
         <w:t xml:space="preserve">Title, scenario ID (used in filenames and the engine), background/summary. </w:t>
@@ -2510,30 +1864,19 @@
           <w:ilvl w:val="0"/>
           <w:numId w:val="2"/>
         </w:numPr>
-        <w:spacing w:after="0" w:afterAutospacing="0" w:before="0" w:beforeAutospacing="0" w:line="276" w:lineRule="auto"/>
+        <w:spacing w:after="0" w:afterAutospacing="0" w:before="0" w:beforeAutospacing="0"/>
         <w:ind w:left="720" w:hanging="360"/>
-        <w:rPr>
-          <w:rFonts w:ascii="Garamond" w:cs="Garamond" w:eastAsia="Garamond" w:hAnsi="Garamond"/>
-          <w:sz w:val="24"/>
-          <w:szCs w:val="24"/>
-        </w:rPr>
-      </w:pPr>
-      <w:r>
-        <w:rPr>
-          <w:rFonts w:ascii="Garamond" w:cs="Garamond" w:eastAsia="Garamond" w:hAnsi="Garamond"/>
+      </w:pPr>
+      <w:r>
+        <w:rPr>
           <w:b w:val="1"/>
           <w:bCs w:val="1"/>
-          <w:sz w:val="24"/>
-          <w:szCs w:val="24"/>
           <w:rtl w:val="0"/>
         </w:rPr>
         <w:t xml:space="preserve">The mystery</w:t>
       </w:r>
       <w:r>
         <w:rPr>
-          <w:rFonts w:ascii="Garamond" w:cs="Garamond" w:eastAsia="Garamond" w:hAnsi="Garamond"/>
-          <w:sz w:val="24"/>
-          <w:szCs w:val="24"/>
           <w:rtl w:val="0"/>
         </w:rPr>
         <w:t xml:space="preserve">: the question the player is asked to answer (for example “who removed X, why, and where is it now?”).</w:t>
@@ -2545,30 +1888,19 @@
           <w:ilvl w:val="0"/>
           <w:numId w:val="2"/>
         </w:numPr>
-        <w:spacing w:after="0" w:afterAutospacing="0" w:before="0" w:beforeAutospacing="0" w:line="276" w:lineRule="auto"/>
+        <w:spacing w:after="0" w:afterAutospacing="0" w:before="0" w:beforeAutospacing="0"/>
         <w:ind w:left="720" w:hanging="360"/>
-        <w:rPr>
-          <w:rFonts w:ascii="Garamond" w:cs="Garamond" w:eastAsia="Garamond" w:hAnsi="Garamond"/>
-          <w:sz w:val="24"/>
-          <w:szCs w:val="24"/>
-        </w:rPr>
-      </w:pPr>
-      <w:r>
-        <w:rPr>
-          <w:rFonts w:ascii="Garamond" w:cs="Garamond" w:eastAsia="Garamond" w:hAnsi="Garamond"/>
+      </w:pPr>
+      <w:r>
+        <w:rPr>
           <w:b w:val="1"/>
           <w:bCs w:val="1"/>
-          <w:sz w:val="24"/>
-          <w:szCs w:val="24"/>
           <w:rtl w:val="0"/>
         </w:rPr>
         <w:t xml:space="preserve">The solution: </w:t>
       </w:r>
       <w:r>
         <w:rPr>
-          <w:rFonts w:ascii="Garamond" w:cs="Garamond" w:eastAsia="Garamond" w:hAnsi="Garamond"/>
-          <w:sz w:val="24"/>
-          <w:szCs w:val="24"/>
           <w:rtl w:val="0"/>
         </w:rPr>
         <w:t xml:space="preserve">the answer to the mystery</w:t>
@@ -2580,19 +1912,11 @@
           <w:ilvl w:val="1"/>
           <w:numId w:val="2"/>
         </w:numPr>
-        <w:spacing w:after="0" w:afterAutospacing="0" w:before="0" w:beforeAutospacing="0" w:line="276" w:lineRule="auto"/>
+        <w:spacing w:after="0" w:afterAutospacing="0" w:before="0" w:beforeAutospacing="0"/>
         <w:ind w:left="1440" w:hanging="360"/>
-        <w:rPr>
-          <w:rFonts w:ascii="Garamond" w:cs="Garamond" w:eastAsia="Garamond" w:hAnsi="Garamond"/>
-          <w:sz w:val="24"/>
-          <w:szCs w:val="24"/>
-        </w:rPr>
-      </w:pPr>
-      <w:r>
-        <w:rPr>
-          <w:rFonts w:ascii="Garamond" w:cs="Garamond" w:eastAsia="Garamond" w:hAnsi="Garamond"/>
-          <w:sz w:val="24"/>
-          <w:szCs w:val="24"/>
+      </w:pPr>
+      <w:r>
+        <w:rPr>
           <w:rtl w:val="0"/>
         </w:rPr>
         <w:t xml:space="preserve">The 16 Clues that tell the story of the answer, alongside the 4 Major Clues that make each group of four.</w:t>
@@ -2604,30 +1928,19 @@
           <w:ilvl w:val="0"/>
           <w:numId w:val="2"/>
         </w:numPr>
-        <w:spacing w:after="0" w:afterAutospacing="0" w:before="0" w:beforeAutospacing="0" w:line="276" w:lineRule="auto"/>
+        <w:spacing w:after="0" w:afterAutospacing="0" w:before="0" w:beforeAutospacing="0"/>
         <w:ind w:left="720" w:hanging="360"/>
-        <w:rPr>
-          <w:rFonts w:ascii="Garamond" w:cs="Garamond" w:eastAsia="Garamond" w:hAnsi="Garamond"/>
-          <w:sz w:val="24"/>
-          <w:szCs w:val="24"/>
-        </w:rPr>
-      </w:pPr>
-      <w:r>
-        <w:rPr>
-          <w:rFonts w:ascii="Garamond" w:cs="Garamond" w:eastAsia="Garamond" w:hAnsi="Garamond"/>
+      </w:pPr>
+      <w:r>
+        <w:rPr>
           <w:b w:val="1"/>
           <w:bCs w:val="1"/>
-          <w:sz w:val="24"/>
-          <w:szCs w:val="24"/>
           <w:rtl w:val="0"/>
         </w:rPr>
         <w:t xml:space="preserve">The final-answer form</w:t>
       </w:r>
       <w:r>
         <w:rPr>
-          <w:rFonts w:ascii="Garamond" w:cs="Garamond" w:eastAsia="Garamond" w:hAnsi="Garamond"/>
-          <w:sz w:val="24"/>
-          <w:szCs w:val="24"/>
           <w:rtl w:val="0"/>
         </w:rPr>
         <w:t xml:space="preserve">: what the player must select at the end (e.g. one person from a list and one location from a list), and which combination is correct.</w:t>
@@ -2644,19 +1957,11 @@
           <w:ilvl w:val="0"/>
           <w:numId w:val="2"/>
         </w:numPr>
-        <w:spacing w:after="0" w:afterAutospacing="0" w:before="0" w:beforeAutospacing="0" w:line="276" w:lineRule="auto"/>
+        <w:spacing w:after="0" w:afterAutospacing="0" w:before="0" w:beforeAutospacing="0"/>
         <w:ind w:left="720" w:hanging="360"/>
-        <w:rPr>
-          <w:rFonts w:ascii="Garamond" w:cs="Garamond" w:eastAsia="Garamond" w:hAnsi="Garamond"/>
-          <w:sz w:val="24"/>
-          <w:szCs w:val="24"/>
-        </w:rPr>
-      </w:pPr>
-      <w:r>
-        <w:rPr>
-          <w:rFonts w:ascii="Garamond" w:cs="Garamond" w:eastAsia="Garamond" w:hAnsi="Garamond"/>
-          <w:sz w:val="24"/>
-          <w:szCs w:val="24"/>
+      </w:pPr>
+      <w:r>
+        <w:rPr>
           <w:rtl w:val="0"/>
         </w:rPr>
         <w:t xml:space="preserve">Passages text: Start, Rules, the Hook, Map, Interview, Answer, Follow-up, Evidence Board, Submission, Result, ending, ranking</w:t>
@@ -2668,19 +1973,11 @@
           <w:ilvl w:val="0"/>
           <w:numId w:val="2"/>
         </w:numPr>
-        <w:spacing w:after="0" w:afterAutospacing="0" w:before="0" w:beforeAutospacing="0" w:line="276" w:lineRule="auto"/>
+        <w:spacing w:after="0" w:afterAutospacing="0" w:before="0" w:beforeAutospacing="0"/>
         <w:ind w:left="720" w:hanging="360"/>
-        <w:rPr>
-          <w:rFonts w:ascii="Garamond" w:cs="Garamond" w:eastAsia="Garamond" w:hAnsi="Garamond"/>
-          <w:sz w:val="24"/>
-          <w:szCs w:val="24"/>
-        </w:rPr>
-      </w:pPr>
-      <w:r>
-        <w:rPr>
-          <w:rFonts w:ascii="Garamond" w:cs="Garamond" w:eastAsia="Garamond" w:hAnsi="Garamond"/>
-          <w:sz w:val="24"/>
-          <w:szCs w:val="24"/>
+      </w:pPr>
+      <w:r>
+        <w:rPr>
           <w:rtl w:val="0"/>
         </w:rPr>
         <w:t xml:space="preserve">The eight questions </w:t>
@@ -2692,19 +1989,11 @@
           <w:ilvl w:val="0"/>
           <w:numId w:val="2"/>
         </w:numPr>
-        <w:spacing w:after="0" w:afterAutospacing="0" w:before="0" w:beforeAutospacing="0" w:line="276" w:lineRule="auto"/>
+        <w:spacing w:after="0" w:afterAutospacing="0" w:before="0" w:beforeAutospacing="0"/>
         <w:ind w:left="720" w:hanging="360"/>
-        <w:rPr>
-          <w:rFonts w:ascii="Garamond" w:cs="Garamond" w:eastAsia="Garamond" w:hAnsi="Garamond"/>
-          <w:sz w:val="24"/>
-          <w:szCs w:val="24"/>
-        </w:rPr>
-      </w:pPr>
-      <w:r>
-        <w:rPr>
-          <w:rFonts w:ascii="Garamond" w:cs="Garamond" w:eastAsia="Garamond" w:hAnsi="Garamond"/>
-          <w:sz w:val="24"/>
-          <w:szCs w:val="24"/>
+      </w:pPr>
+      <w:r>
+        <w:rPr>
           <w:rtl w:val="0"/>
         </w:rPr>
         <w:t xml:space="preserve">The eight witnesses list:</w:t>
@@ -2716,19 +2005,11 @@
           <w:ilvl w:val="1"/>
           <w:numId w:val="2"/>
         </w:numPr>
-        <w:spacing w:after="0" w:afterAutospacing="0" w:before="0" w:beforeAutospacing="0" w:line="276" w:lineRule="auto"/>
+        <w:spacing w:after="0" w:afterAutospacing="0" w:before="0" w:beforeAutospacing="0"/>
         <w:ind w:left="1440" w:hanging="360"/>
-        <w:rPr>
-          <w:rFonts w:ascii="Garamond" w:cs="Garamond" w:eastAsia="Garamond" w:hAnsi="Garamond"/>
-          <w:sz w:val="24"/>
-          <w:szCs w:val="24"/>
-        </w:rPr>
-      </w:pPr>
-      <w:r>
-        <w:rPr>
-          <w:rFonts w:ascii="Garamond" w:cs="Garamond" w:eastAsia="Garamond" w:hAnsi="Garamond"/>
-          <w:sz w:val="24"/>
-          <w:szCs w:val="24"/>
+      </w:pPr>
+      <w:r>
+        <w:rPr>
           <w:rtl w:val="0"/>
         </w:rPr>
         <w:t xml:space="preserve">Information, image, ID (W01-W08)</w:t>
@@ -2740,19 +2021,11 @@
           <w:ilvl w:val="1"/>
           <w:numId w:val="2"/>
         </w:numPr>
-        <w:spacing w:after="0" w:afterAutospacing="0" w:before="0" w:beforeAutospacing="0" w:line="276" w:lineRule="auto"/>
+        <w:spacing w:after="0" w:afterAutospacing="0" w:before="0" w:beforeAutospacing="0"/>
         <w:ind w:left="1440" w:hanging="360"/>
-        <w:rPr>
-          <w:rFonts w:ascii="Garamond" w:cs="Garamond" w:eastAsia="Garamond" w:hAnsi="Garamond"/>
-          <w:sz w:val="24"/>
-          <w:szCs w:val="24"/>
-        </w:rPr>
-      </w:pPr>
-      <w:r>
-        <w:rPr>
-          <w:rFonts w:ascii="Garamond" w:cs="Garamond" w:eastAsia="Garamond" w:hAnsi="Garamond"/>
-          <w:sz w:val="24"/>
-          <w:szCs w:val="24"/>
+      </w:pPr>
+      <w:r>
+        <w:rPr>
           <w:rtl w:val="0"/>
         </w:rPr>
         <w:t xml:space="preserve">Position on the CCC</w:t>
@@ -2764,19 +2037,11 @@
           <w:ilvl w:val="1"/>
           <w:numId w:val="2"/>
         </w:numPr>
-        <w:spacing w:after="0" w:afterAutospacing="0" w:before="0" w:beforeAutospacing="0" w:line="276" w:lineRule="auto"/>
+        <w:spacing w:after="0" w:afterAutospacing="0" w:before="0" w:beforeAutospacing="0"/>
         <w:ind w:left="1440" w:hanging="360"/>
-        <w:rPr>
-          <w:rFonts w:ascii="Garamond" w:cs="Garamond" w:eastAsia="Garamond" w:hAnsi="Garamond"/>
-          <w:sz w:val="24"/>
-          <w:szCs w:val="24"/>
-        </w:rPr>
-      </w:pPr>
-      <w:r>
-        <w:rPr>
-          <w:rFonts w:ascii="Garamond" w:cs="Garamond" w:eastAsia="Garamond" w:hAnsi="Garamond"/>
-          <w:sz w:val="24"/>
-          <w:szCs w:val="24"/>
+      </w:pPr>
+      <w:r>
+        <w:rPr>
           <w:rtl w:val="0"/>
         </w:rPr>
         <w:t xml:space="preserve">Which question is their tripwire </w:t>
@@ -2788,19 +2053,11 @@
           <w:ilvl w:val="1"/>
           <w:numId w:val="2"/>
         </w:numPr>
-        <w:spacing w:after="0" w:afterAutospacing="0" w:before="0" w:beforeAutospacing="0" w:line="276" w:lineRule="auto"/>
+        <w:spacing w:after="0" w:afterAutospacing="0" w:before="0" w:beforeAutospacing="0"/>
         <w:ind w:left="1440" w:hanging="360"/>
-        <w:rPr>
-          <w:rFonts w:ascii="Garamond" w:cs="Garamond" w:eastAsia="Garamond" w:hAnsi="Garamond"/>
-          <w:sz w:val="24"/>
-          <w:szCs w:val="24"/>
-        </w:rPr>
-      </w:pPr>
-      <w:r>
-        <w:rPr>
-          <w:rFonts w:ascii="Garamond" w:cs="Garamond" w:eastAsia="Garamond" w:hAnsi="Garamond"/>
-          <w:sz w:val="24"/>
-          <w:szCs w:val="24"/>
+      </w:pPr>
+      <w:r>
+        <w:rPr>
           <w:rtl w:val="0"/>
         </w:rPr>
         <w:t xml:space="preserve">Receptiveness score</w:t>
@@ -2812,19 +2069,11 @@
           <w:ilvl w:val="1"/>
           <w:numId w:val="2"/>
         </w:numPr>
-        <w:spacing w:after="0" w:afterAutospacing="0" w:before="0" w:beforeAutospacing="0" w:line="276" w:lineRule="auto"/>
+        <w:spacing w:after="0" w:afterAutospacing="0" w:before="0" w:beforeAutospacing="0"/>
         <w:ind w:left="1440" w:hanging="360"/>
-        <w:rPr>
-          <w:rFonts w:ascii="Garamond" w:cs="Garamond" w:eastAsia="Garamond" w:hAnsi="Garamond"/>
-          <w:sz w:val="24"/>
-          <w:szCs w:val="24"/>
-        </w:rPr>
-      </w:pPr>
-      <w:r>
-        <w:rPr>
-          <w:rFonts w:ascii="Garamond" w:cs="Garamond" w:eastAsia="Garamond" w:hAnsi="Garamond"/>
-          <w:sz w:val="24"/>
-          <w:szCs w:val="24"/>
+      </w:pPr>
+      <w:r>
+        <w:rPr>
           <w:rtl w:val="0"/>
         </w:rPr>
         <w:t xml:space="preserve">A follow-up pair of questions </w:t>
@@ -2836,19 +2085,11 @@
           <w:ilvl w:val="0"/>
           <w:numId w:val="2"/>
         </w:numPr>
-        <w:spacing w:after="0" w:afterAutospacing="0" w:before="0" w:beforeAutospacing="0" w:line="276" w:lineRule="auto"/>
+        <w:spacing w:after="0" w:afterAutospacing="0" w:before="0" w:beforeAutospacing="0"/>
         <w:ind w:left="720" w:hanging="360"/>
-        <w:rPr>
-          <w:rFonts w:ascii="Garamond" w:cs="Garamond" w:eastAsia="Garamond" w:hAnsi="Garamond"/>
-          <w:sz w:val="24"/>
-          <w:szCs w:val="24"/>
-        </w:rPr>
-      </w:pPr>
-      <w:r>
-        <w:rPr>
-          <w:rFonts w:ascii="Garamond" w:cs="Garamond" w:eastAsia="Garamond" w:hAnsi="Garamond"/>
-          <w:sz w:val="24"/>
-          <w:szCs w:val="24"/>
+      </w:pPr>
+      <w:r>
+        <w:rPr>
           <w:rtl w:val="0"/>
         </w:rPr>
         <w:t xml:space="preserve">The 24 Red Herrings organized into sets</w:t>
@@ -2860,19 +2101,11 @@
           <w:ilvl w:val="0"/>
           <w:numId w:val="2"/>
         </w:numPr>
-        <w:spacing w:before="0" w:beforeAutospacing="0" w:line="276" w:lineRule="auto"/>
+        <w:spacing w:before="0" w:beforeAutospacing="0"/>
         <w:ind w:left="720" w:hanging="360"/>
-        <w:rPr>
-          <w:rFonts w:ascii="Garamond" w:cs="Garamond" w:eastAsia="Garamond" w:hAnsi="Garamond"/>
-          <w:sz w:val="24"/>
-          <w:szCs w:val="24"/>
-        </w:rPr>
-      </w:pPr>
-      <w:r>
-        <w:rPr>
-          <w:rFonts w:ascii="Garamond" w:cs="Garamond" w:eastAsia="Garamond" w:hAnsi="Garamond"/>
-          <w:sz w:val="24"/>
-          <w:szCs w:val="24"/>
+      </w:pPr>
+      <w:r>
+        <w:rPr>
           <w:rtl w:val="0"/>
         </w:rPr>
         <w:t xml:space="preserve">The Response Matrix: 8 × 8 grid of witnesses by questions. Each cell is either the tripwire (for exactly one cell per column and one per row) or an answer containing one piece of information (a clue ID or a red-herring ID) and one opinion expression (marked receptive or not, referencing another witness by name). The matrix is kept in the workbook in two forms: a readable condensed version, and a longform table (one row per cell, with columns for witness, question, item, item type, receptive flag, and text) that the engine reads.</w:t>
@@ -2880,18 +2113,67 @@
     </w:p>
     <w:p>
       <w:pPr>
-        <w:spacing w:before="200" w:line="276" w:lineRule="auto"/>
-        <w:rPr>
-          <w:rFonts w:ascii="Garamond" w:cs="Garamond" w:eastAsia="Garamond" w:hAnsi="Garamond"/>
-          <w:sz w:val="24"/>
-          <w:szCs w:val="24"/>
-        </w:rPr>
+        <w:rPr/>
         <w:sectPr>
+          <w:type w:val="nextPage"/>
           <w:pgSz w:h="15840" w:w="12240" w:orient="portrait"/>
           <w:pgMar w:bottom="1440" w:top="1440" w:left="1440" w:right="1440" w:header="720" w:footer="720"/>
           <w:pgNumType w:start="1"/>
         </w:sectPr>
       </w:pPr>
+      <w:r>
+        <w:rPr>
+          <w:rtl w:val="0"/>
+        </w:rPr>
+      </w:r>
+    </w:p>
+    <w:p>
+      <w:pPr>
+        <w:pStyle w:val="Title"/>
+        <w:keepNext w:val="0"/>
+        <w:keepLines w:val="0"/>
+        <w:pageBreakBefore w:val="0"/>
+        <w:widowControl w:val="0"/>
+        <w:pBdr>
+          <w:top w:space="0" w:sz="0" w:val="nil"/>
+          <w:left w:space="0" w:sz="0" w:val="nil"/>
+          <w:bottom w:space="0" w:sz="0" w:val="nil"/>
+          <w:right w:space="0" w:sz="0" w:val="nil"/>
+          <w:between w:space="0" w:sz="0" w:val="nil"/>
+        </w:pBdr>
+        <w:shd w:fill="auto" w:val="clear"/>
+        <w:spacing w:after="0" w:before="0" w:line="276" w:lineRule="auto"/>
+        <w:ind w:left="0" w:right="0" w:firstLine="0"/>
+        <w:jc w:val="left"/>
+        <w:rPr/>
+        <w:sectPr>
+          <w:type w:val="nextPage"/>
+          <w:pgSz w:h="15840" w:w="12240" w:orient="portrait"/>
+          <w:pgMar w:bottom="1440" w:top="1440" w:left="1440" w:right="1440" w:header="720" w:footer="720"/>
+          <w:pgNumType w:start="1"/>
+        </w:sectPr>
+      </w:pPr>
+      <w:bookmarkStart w:colFirst="0" w:colLast="0" w:name="_9uh2kjneh6y" w:id="13"/>
+      <w:bookmarkEnd w:id="13"/>
+      <w:r>
+        <w:rPr>
+          <w:rFonts w:ascii="Garamond" w:cs="Garamond" w:eastAsia="Garamond" w:hAnsi="Garamond"/>
+          <w:b w:val="1"/>
+          <w:bCs w:val="1"/>
+          <w:i w:val="0"/>
+          <w:iCs w:val="0"/>
+          <w:smallCaps w:val="0"/>
+          <w:strike w:val="0"/>
+          <w:color w:val="000000"/>
+          <w:sz w:val="60"/>
+          <w:szCs w:val="60"/>
+          <w:u w:val="none"/>
+          <w:shd w:fill="auto" w:val="clear"/>
+          <w:vertAlign w:val="baseline"/>
+          <w:rtl w:val="0"/>
+        </w:rPr>
+        <w:t xml:space="preserve">Notes</w:t>
+      </w:r>
       <w:r>
         <w:rPr>
           <w:rtl w:val="0"/>
@@ -3224,11 +2506,64 @@
     </w:p>
     <w:p>
       <w:pPr>
+        <w:pStyle w:val="Title"/>
+        <w:keepNext w:val="0"/>
+        <w:keepLines w:val="0"/>
+        <w:pageBreakBefore w:val="0"/>
+        <w:widowControl w:val="0"/>
+        <w:pBdr>
+          <w:top w:space="0" w:sz="0" w:val="nil"/>
+          <w:left w:space="0" w:sz="0" w:val="nil"/>
+          <w:bottom w:space="0" w:sz="0" w:val="nil"/>
+          <w:right w:space="0" w:sz="0" w:val="nil"/>
+          <w:between w:space="0" w:sz="0" w:val="nil"/>
+        </w:pBdr>
+        <w:shd w:fill="auto" w:val="clear"/>
+        <w:spacing w:after="0" w:before="0" w:line="276" w:lineRule="auto"/>
+        <w:ind w:left="0" w:right="0" w:firstLine="0"/>
+        <w:jc w:val="left"/>
+        <w:rPr/>
+        <w:sectPr>
+          <w:type w:val="nextPage"/>
+          <w:pgSz w:h="15840" w:w="12240" w:orient="portrait"/>
+          <w:pgMar w:bottom="1440" w:top="1440" w:left="1440" w:right="1440" w:header="720" w:footer="720"/>
+          <w:pgNumType w:start="1"/>
+        </w:sectPr>
+      </w:pPr>
+      <w:bookmarkStart w:colFirst="0" w:colLast="0" w:name="_kijykyo43jn" w:id="14"/>
+      <w:bookmarkEnd w:id="14"/>
+      <w:r>
+        <w:rPr>
+          <w:rFonts w:ascii="Garamond" w:cs="Garamond" w:eastAsia="Garamond" w:hAnsi="Garamond"/>
+          <w:b w:val="1"/>
+          <w:bCs w:val="1"/>
+          <w:i w:val="0"/>
+          <w:iCs w:val="0"/>
+          <w:smallCaps w:val="0"/>
+          <w:strike w:val="0"/>
+          <w:color w:val="000000"/>
+          <w:sz w:val="60"/>
+          <w:szCs w:val="60"/>
+          <w:u w:val="none"/>
+          <w:shd w:fill="auto" w:val="clear"/>
+          <w:vertAlign w:val="baseline"/>
+          <w:rtl w:val="0"/>
+        </w:rPr>
+        <w:t xml:space="preserve">Rules of the game</w:t>
+      </w:r>
+      <w:r>
+        <w:rPr>
+          <w:rtl w:val="0"/>
+        </w:rPr>
+      </w:r>
+    </w:p>
+    <w:p>
+      <w:pPr>
         <w:pStyle w:val="Heading1"/>
         <w:rPr/>
       </w:pPr>
-      <w:bookmarkStart w:colFirst="0" w:colLast="0" w:name="_xsv09x7iedko" w:id="12"/>
-      <w:bookmarkEnd w:id="12"/>
+      <w:bookmarkStart w:colFirst="0" w:colLast="0" w:name="_xsv09x7iedko" w:id="15"/>
+      <w:bookmarkEnd w:id="15"/>
       <w:r>
         <w:rPr>
           <w:rtl w:val="0"/>
@@ -3390,163 +2725,22 @@
     </w:p>
     <w:p>
       <w:pPr>
-        <w:pStyle w:val="Heading1"/>
-        <w:rPr/>
-      </w:pPr>
-      <w:bookmarkStart w:colFirst="0" w:colLast="0" w:name="_gca2y5oth70s" w:id="13"/>
-      <w:bookmarkEnd w:id="13"/>
-      <w:r>
-        <w:rPr>
-          <w:rtl w:val="0"/>
-        </w:rPr>
-        <w:t xml:space="preserve">The HEAR framework</w:t>
-      </w:r>
-    </w:p>
-    <w:p>
-      <w:pPr>
-        <w:rPr/>
-      </w:pPr>
-      <w:r>
-        <w:rPr>
-          <w:rtl w:val="0"/>
-        </w:rPr>
-        <w:t xml:space="preserve">Conversational receptiveness is a willingness to engage with opposing views, shown through the words you use. Research by Julia Minson and colleagues found four markers that make someone come across as receptive:</w:t>
-      </w:r>
-    </w:p>
-    <w:p>
-      <w:pPr>
-        <w:pStyle w:val="Heading2"/>
-        <w:numPr>
-          <w:ilvl w:val="0"/>
-          <w:numId w:val="4"/>
-        </w:numPr>
-        <w:ind w:left="720" w:hanging="360"/>
-        <w:rPr>
-          <w:sz w:val="32"/>
-          <w:szCs w:val="32"/>
-        </w:rPr>
-      </w:pPr>
-      <w:bookmarkStart w:colFirst="0" w:colLast="0" w:name="_15kfzlgp827m" w:id="14"/>
-      <w:bookmarkEnd w:id="14"/>
-      <w:r>
-        <w:rPr>
-          <w:rtl w:val="0"/>
-        </w:rPr>
-        <w:t xml:space="preserve">Hedge your claims</w:t>
-      </w:r>
-    </w:p>
-    <w:p>
-      <w:pPr>
-        <w:rPr/>
-      </w:pPr>
-      <w:r>
-        <w:rPr>
-          <w:rtl w:val="0"/>
-        </w:rPr>
-        <w:t xml:space="preserve">Leave space alongside your views: “I think”, “it's possible that”, “I could be misreading this”.</w:t>
-      </w:r>
-    </w:p>
-    <w:p>
-      <w:pPr>
-        <w:pStyle w:val="Heading2"/>
-        <w:numPr>
-          <w:ilvl w:val="0"/>
-          <w:numId w:val="4"/>
-        </w:numPr>
-        <w:ind w:left="720" w:hanging="360"/>
-        <w:rPr>
-          <w:sz w:val="32"/>
-          <w:szCs w:val="32"/>
-        </w:rPr>
-      </w:pPr>
-      <w:bookmarkStart w:colFirst="0" w:colLast="0" w:name="_14bj2v2wcr9b" w:id="15"/>
-      <w:bookmarkEnd w:id="15"/>
-      <w:r>
-        <w:rPr>
-          <w:rtl w:val="0"/>
-        </w:rPr>
-        <w:t xml:space="preserve">Emphasize agreement</w:t>
-      </w:r>
-    </w:p>
-    <w:p>
-      <w:pPr>
-        <w:rPr/>
-      </w:pPr>
-      <w:r>
-        <w:rPr>
-          <w:rtl w:val="0"/>
-        </w:rPr>
-        <w:t xml:space="preserve">Find common ground: “We both want…”, “I agree that…”.</w:t>
-      </w:r>
-    </w:p>
-    <w:p>
-      <w:pPr>
-        <w:pStyle w:val="Heading2"/>
-        <w:numPr>
-          <w:ilvl w:val="0"/>
-          <w:numId w:val="4"/>
-        </w:numPr>
-        <w:ind w:left="720" w:hanging="360"/>
-        <w:rPr>
-          <w:sz w:val="32"/>
-          <w:szCs w:val="32"/>
-        </w:rPr>
-      </w:pPr>
-      <w:bookmarkStart w:colFirst="0" w:colLast="0" w:name="_zheajp4hsm8n" w:id="16"/>
-      <w:bookmarkEnd w:id="16"/>
-      <w:r>
-        <w:rPr>
-          <w:rtl w:val="0"/>
-        </w:rPr>
-        <w:t xml:space="preserve">Acknowledge the other's perspective</w:t>
-      </w:r>
-    </w:p>
-    <w:p>
-      <w:pPr>
-        <w:rPr/>
-      </w:pPr>
-      <w:r>
-        <w:rPr>
-          <w:rtl w:val="0"/>
-        </w:rPr>
-        <w:t xml:space="preserve">Show you have understood: “I understand that you…”, “You're right that…”.</w:t>
-      </w:r>
-    </w:p>
-    <w:p>
-      <w:pPr>
-        <w:pStyle w:val="Heading2"/>
-        <w:numPr>
-          <w:ilvl w:val="0"/>
-          <w:numId w:val="4"/>
-        </w:numPr>
-        <w:ind w:left="720" w:hanging="360"/>
-        <w:rPr>
-          <w:sz w:val="32"/>
-          <w:szCs w:val="32"/>
-        </w:rPr>
-      </w:pPr>
-      <w:bookmarkStart w:colFirst="0" w:colLast="0" w:name="_47i9enf78bla" w:id="17"/>
-      <w:bookmarkEnd w:id="17"/>
-      <w:r>
-        <w:rPr>
-          <w:rtl w:val="0"/>
-        </w:rPr>
-        <w:t xml:space="preserve">Reframe to the positive</w:t>
-      </w:r>
-    </w:p>
-    <w:p>
-      <w:pPr>
-        <w:rPr/>
-      </w:pPr>
-      <w:r>
-        <w:rPr>
-          <w:rtl w:val="0"/>
-        </w:rPr>
-        <w:t xml:space="preserve">Say what you want rather than what you oppose, avoid dismissive language such as “that's wrong” or “no serious person thinks…”.</w:t>
-      </w:r>
-    </w:p>
-    <w:p>
-      <w:pPr>
+        <w:pStyle w:val="Title"/>
+        <w:keepNext w:val="0"/>
+        <w:keepLines w:val="0"/>
+        <w:pageBreakBefore w:val="0"/>
+        <w:widowControl w:val="0"/>
+        <w:pBdr>
+          <w:top w:space="0" w:sz="0" w:val="nil"/>
+          <w:left w:space="0" w:sz="0" w:val="nil"/>
+          <w:bottom w:space="0" w:sz="0" w:val="nil"/>
+          <w:right w:space="0" w:sz="0" w:val="nil"/>
+          <w:between w:space="0" w:sz="0" w:val="nil"/>
+        </w:pBdr>
+        <w:shd w:fill="auto" w:val="clear"/>
+        <w:spacing w:after="0" w:before="0" w:line="276" w:lineRule="auto"/>
+        <w:ind w:left="0" w:right="0" w:firstLine="0"/>
+        <w:jc w:val="left"/>
         <w:rPr/>
         <w:sectPr>
           <w:type w:val="nextPage"/>
@@ -3555,11 +2749,31 @@
           <w:pgNumType w:start="1"/>
         </w:sectPr>
       </w:pPr>
-      <w:r>
-        <w:rPr>
-          <w:rtl w:val="0"/>
-        </w:rPr>
-        <w:t xml:space="preserve">Unreceptive language states opinions flatly, generalizes about the other person, attributes motives, or dismisses them. Listen for both kinds as the witnesses talk about the controversy.</w:t>
+      <w:bookmarkStart w:colFirst="0" w:colLast="0" w:name="_q5t2ln19uarf" w:id="16"/>
+      <w:bookmarkEnd w:id="16"/>
+      <w:r>
+        <w:rPr>
+          <w:rFonts w:ascii="Garamond" w:cs="Garamond" w:eastAsia="Garamond" w:hAnsi="Garamond"/>
+          <w:b w:val="1"/>
+          <w:bCs w:val="1"/>
+          <w:i w:val="0"/>
+          <w:iCs w:val="0"/>
+          <w:smallCaps w:val="0"/>
+          <w:strike w:val="0"/>
+          <w:color w:val="000000"/>
+          <w:sz w:val="60"/>
+          <w:szCs w:val="60"/>
+          <w:u w:val="none"/>
+          <w:shd w:fill="auto" w:val="clear"/>
+          <w:vertAlign w:val="baseline"/>
+          <w:rtl w:val="0"/>
+        </w:rPr>
+        <w:t xml:space="preserve">HEAR Framework introduction</w:t>
+      </w:r>
+      <w:r>
+        <w:rPr>
+          <w:rtl w:val="0"/>
+        </w:rPr>
       </w:r>
     </w:p>
     <w:p>
@@ -3567,8 +2781,235 @@
         <w:pStyle w:val="Heading1"/>
         <w:rPr/>
       </w:pPr>
-      <w:bookmarkStart w:colFirst="0" w:colLast="0" w:name="_uynt6v9uhldf" w:id="18"/>
+      <w:bookmarkStart w:colFirst="0" w:colLast="0" w:name="_gca2y5oth70s" w:id="17"/>
+      <w:bookmarkEnd w:id="17"/>
+      <w:r>
+        <w:rPr>
+          <w:rtl w:val="0"/>
+        </w:rPr>
+        <w:t xml:space="preserve">The HEAR framework</w:t>
+      </w:r>
+    </w:p>
+    <w:p>
+      <w:pPr>
+        <w:rPr/>
+      </w:pPr>
+      <w:r>
+        <w:rPr>
+          <w:rtl w:val="0"/>
+        </w:rPr>
+        <w:t xml:space="preserve">Conversational receptiveness is a willingness to engage with opposing views, shown through the words you use. Research by Julia Minson and colleagues found four markers that make someone come across as receptive:</w:t>
+      </w:r>
+    </w:p>
+    <w:p>
+      <w:pPr>
+        <w:pStyle w:val="Heading2"/>
+        <w:numPr>
+          <w:ilvl w:val="0"/>
+          <w:numId w:val="4"/>
+        </w:numPr>
+        <w:ind w:left="720" w:hanging="360"/>
+        <w:rPr>
+          <w:sz w:val="32"/>
+          <w:szCs w:val="32"/>
+        </w:rPr>
+      </w:pPr>
+      <w:bookmarkStart w:colFirst="0" w:colLast="0" w:name="_15kfzlgp827m" w:id="18"/>
       <w:bookmarkEnd w:id="18"/>
+      <w:r>
+        <w:rPr>
+          <w:rtl w:val="0"/>
+        </w:rPr>
+        <w:t xml:space="preserve">Hedge your claims</w:t>
+      </w:r>
+    </w:p>
+    <w:p>
+      <w:pPr>
+        <w:rPr/>
+      </w:pPr>
+      <w:r>
+        <w:rPr>
+          <w:rtl w:val="0"/>
+        </w:rPr>
+        <w:t xml:space="preserve">Leave space alongside your views: “I think”, “it's possible that”, “I could be misreading this”.</w:t>
+      </w:r>
+    </w:p>
+    <w:p>
+      <w:pPr>
+        <w:pStyle w:val="Heading2"/>
+        <w:numPr>
+          <w:ilvl w:val="0"/>
+          <w:numId w:val="4"/>
+        </w:numPr>
+        <w:ind w:left="720" w:hanging="360"/>
+        <w:rPr>
+          <w:sz w:val="32"/>
+          <w:szCs w:val="32"/>
+        </w:rPr>
+      </w:pPr>
+      <w:bookmarkStart w:colFirst="0" w:colLast="0" w:name="_14bj2v2wcr9b" w:id="19"/>
+      <w:bookmarkEnd w:id="19"/>
+      <w:r>
+        <w:rPr>
+          <w:rtl w:val="0"/>
+        </w:rPr>
+        <w:t xml:space="preserve">Emphasize agreement</w:t>
+      </w:r>
+    </w:p>
+    <w:p>
+      <w:pPr>
+        <w:rPr/>
+      </w:pPr>
+      <w:r>
+        <w:rPr>
+          <w:rtl w:val="0"/>
+        </w:rPr>
+        <w:t xml:space="preserve">Find common ground: “We both want…”, “I agree that…”.</w:t>
+      </w:r>
+    </w:p>
+    <w:p>
+      <w:pPr>
+        <w:pStyle w:val="Heading2"/>
+        <w:numPr>
+          <w:ilvl w:val="0"/>
+          <w:numId w:val="4"/>
+        </w:numPr>
+        <w:ind w:left="720" w:hanging="360"/>
+        <w:rPr>
+          <w:sz w:val="32"/>
+          <w:szCs w:val="32"/>
+        </w:rPr>
+      </w:pPr>
+      <w:bookmarkStart w:colFirst="0" w:colLast="0" w:name="_zheajp4hsm8n" w:id="20"/>
+      <w:bookmarkEnd w:id="20"/>
+      <w:r>
+        <w:rPr>
+          <w:rtl w:val="0"/>
+        </w:rPr>
+        <w:t xml:space="preserve">Acknowledge the other's perspective</w:t>
+      </w:r>
+    </w:p>
+    <w:p>
+      <w:pPr>
+        <w:rPr/>
+      </w:pPr>
+      <w:r>
+        <w:rPr>
+          <w:rtl w:val="0"/>
+        </w:rPr>
+        <w:t xml:space="preserve">Show you have understood: “I understand that you…”, “You're right that…”.</w:t>
+      </w:r>
+    </w:p>
+    <w:p>
+      <w:pPr>
+        <w:pStyle w:val="Heading2"/>
+        <w:numPr>
+          <w:ilvl w:val="0"/>
+          <w:numId w:val="4"/>
+        </w:numPr>
+        <w:ind w:left="720" w:hanging="360"/>
+        <w:rPr>
+          <w:sz w:val="32"/>
+          <w:szCs w:val="32"/>
+        </w:rPr>
+      </w:pPr>
+      <w:bookmarkStart w:colFirst="0" w:colLast="0" w:name="_47i9enf78bla" w:id="21"/>
+      <w:bookmarkEnd w:id="21"/>
+      <w:r>
+        <w:rPr>
+          <w:rtl w:val="0"/>
+        </w:rPr>
+        <w:t xml:space="preserve">Reframe to the positive</w:t>
+      </w:r>
+    </w:p>
+    <w:p>
+      <w:pPr>
+        <w:rPr/>
+      </w:pPr>
+      <w:r>
+        <w:rPr>
+          <w:rtl w:val="0"/>
+        </w:rPr>
+        <w:t xml:space="preserve">Say what you want rather than what you oppose, avoid dismissive language such as “that's wrong” or “no serious person thinks…”.</w:t>
+      </w:r>
+    </w:p>
+    <w:p>
+      <w:pPr>
+        <w:rPr/>
+        <w:sectPr>
+          <w:type w:val="nextPage"/>
+          <w:pgSz w:h="15840" w:w="12240" w:orient="portrait"/>
+          <w:pgMar w:bottom="1440" w:top="1440" w:left="1440" w:right="1440" w:header="720" w:footer="720"/>
+          <w:pgNumType w:start="1"/>
+        </w:sectPr>
+      </w:pPr>
+      <w:r>
+        <w:rPr>
+          <w:rtl w:val="0"/>
+        </w:rPr>
+        <w:t xml:space="preserve">Unreceptive language states opinions flatly, generalizes about the other person, attributes motives, or dismisses them. Listen for both kinds as the witnesses talk about the controversy.</w:t>
+      </w:r>
+    </w:p>
+    <w:p>
+      <w:pPr>
+        <w:pStyle w:val="Title"/>
+        <w:keepNext w:val="0"/>
+        <w:keepLines w:val="0"/>
+        <w:pageBreakBefore w:val="0"/>
+        <w:widowControl w:val="0"/>
+        <w:pBdr>
+          <w:top w:space="0" w:sz="0" w:val="nil"/>
+          <w:left w:space="0" w:sz="0" w:val="nil"/>
+          <w:bottom w:space="0" w:sz="0" w:val="nil"/>
+          <w:right w:space="0" w:sz="0" w:val="nil"/>
+          <w:between w:space="0" w:sz="0" w:val="nil"/>
+        </w:pBdr>
+        <w:shd w:fill="auto" w:val="clear"/>
+        <w:spacing w:after="0" w:before="0" w:line="276" w:lineRule="auto"/>
+        <w:ind w:left="0" w:right="0" w:firstLine="0"/>
+        <w:jc w:val="left"/>
+        <w:rPr/>
+        <w:sectPr>
+          <w:type w:val="nextPage"/>
+          <w:pgSz w:h="15840" w:w="12240" w:orient="portrait"/>
+          <w:pgMar w:bottom="1440" w:top="1440" w:left="1440" w:right="1440" w:header="720" w:footer="720"/>
+          <w:pgNumType w:start="1"/>
+        </w:sectPr>
+      </w:pPr>
+      <w:bookmarkStart w:colFirst="0" w:colLast="0" w:name="_daisb8t7nof9" w:id="22"/>
+      <w:bookmarkEnd w:id="22"/>
+      <w:r>
+        <w:rPr>
+          <w:rFonts w:ascii="Garamond" w:cs="Garamond" w:eastAsia="Garamond" w:hAnsi="Garamond"/>
+          <w:b w:val="1"/>
+          <w:bCs w:val="1"/>
+          <w:i w:val="0"/>
+          <w:iCs w:val="0"/>
+          <w:smallCaps w:val="0"/>
+          <w:strike w:val="0"/>
+          <w:color w:val="000000"/>
+          <w:sz w:val="60"/>
+          <w:szCs w:val="60"/>
+          <w:u w:val="none"/>
+          <w:shd w:fill="auto" w:val="clear"/>
+          <w:vertAlign w:val="baseline"/>
+          <w:rtl w:val="0"/>
+        </w:rPr>
+        <w:t xml:space="preserve">Game facts</w:t>
+      </w:r>
+      <w:r>
+        <w:rPr>
+          <w:rtl w:val="0"/>
+        </w:rPr>
+      </w:r>
+    </w:p>
+    <w:p>
+      <w:pPr>
+        <w:pStyle w:val="Heading1"/>
+        <w:rPr/>
+      </w:pPr>
+      <w:bookmarkStart w:colFirst="0" w:colLast="0" w:name="_uynt6v9uhldf" w:id="23"/>
+      <w:bookmarkEnd w:id="23"/>
       <w:r>
         <w:rPr>
           <w:rtl w:val="0"/>
@@ -5257,11 +4698,64 @@
     </w:p>
     <w:p>
       <w:pPr>
+        <w:pStyle w:val="Title"/>
+        <w:keepNext w:val="0"/>
+        <w:keepLines w:val="0"/>
+        <w:pageBreakBefore w:val="0"/>
+        <w:widowControl w:val="0"/>
+        <w:pBdr>
+          <w:top w:space="0" w:sz="0" w:val="nil"/>
+          <w:left w:space="0" w:sz="0" w:val="nil"/>
+          <w:bottom w:space="0" w:sz="0" w:val="nil"/>
+          <w:right w:space="0" w:sz="0" w:val="nil"/>
+          <w:between w:space="0" w:sz="0" w:val="nil"/>
+        </w:pBdr>
+        <w:shd w:fill="auto" w:val="clear"/>
+        <w:spacing w:after="0" w:before="0" w:line="276" w:lineRule="auto"/>
+        <w:ind w:left="0" w:right="0" w:firstLine="0"/>
+        <w:jc w:val="left"/>
+        <w:rPr/>
+        <w:sectPr>
+          <w:type w:val="nextPage"/>
+          <w:pgSz w:h="15840" w:w="12240" w:orient="portrait"/>
+          <w:pgMar w:bottom="1440" w:top="1440" w:left="1440" w:right="1440" w:header="720" w:footer="720"/>
+          <w:pgNumType w:start="1"/>
+        </w:sectPr>
+      </w:pPr>
+      <w:bookmarkStart w:colFirst="0" w:colLast="0" w:name="_u4o637wc6vqg" w:id="24"/>
+      <w:bookmarkEnd w:id="24"/>
+      <w:r>
+        <w:rPr>
+          <w:rFonts w:ascii="Garamond" w:cs="Garamond" w:eastAsia="Garamond" w:hAnsi="Garamond"/>
+          <w:b w:val="1"/>
+          <w:bCs w:val="1"/>
+          <w:i w:val="0"/>
+          <w:iCs w:val="0"/>
+          <w:smallCaps w:val="0"/>
+          <w:strike w:val="0"/>
+          <w:color w:val="000000"/>
+          <w:sz w:val="60"/>
+          <w:szCs w:val="60"/>
+          <w:u w:val="none"/>
+          <w:shd w:fill="auto" w:val="clear"/>
+          <w:vertAlign w:val="baseline"/>
+          <w:rtl w:val="0"/>
+        </w:rPr>
+        <w:t xml:space="preserve">Game text</w:t>
+      </w:r>
+      <w:r>
+        <w:rPr>
+          <w:rtl w:val="0"/>
+        </w:rPr>
+      </w:r>
+    </w:p>
+    <w:p>
+      <w:pPr>
         <w:pStyle w:val="Heading1"/>
         <w:rPr/>
       </w:pPr>
-      <w:bookmarkStart w:colFirst="0" w:colLast="0" w:name="_f5xcdpggf68j" w:id="19"/>
-      <w:bookmarkEnd w:id="19"/>
+      <w:bookmarkStart w:colFirst="0" w:colLast="0" w:name="_f5xcdpggf68j" w:id="25"/>
+      <w:bookmarkEnd w:id="25"/>
       <w:r>
         <w:rPr>
           <w:rtl w:val="0"/>
@@ -6081,9 +5575,8 @@
   <w:footnote w:id="0">
     <w:p>
       <w:pPr>
-        <w:spacing w:line="240" w:lineRule="auto"/>
-        <w:rPr>
-          <w:rFonts w:ascii="Garamond" w:cs="Garamond" w:eastAsia="Garamond" w:hAnsi="Garamond"/>
+        <w:spacing w:before="0" w:line="240" w:lineRule="auto"/>
+        <w:rPr>
           <w:sz w:val="20"/>
           <w:szCs w:val="20"/>
         </w:rPr>
@@ -6097,7 +5590,6 @@
       </w:r>
       <w:r>
         <w:rPr>
-          <w:rFonts w:ascii="Garamond" w:cs="Garamond" w:eastAsia="Garamond" w:hAnsi="Garamond"/>
           <w:sz w:val="20"/>
           <w:szCs w:val="20"/>
           <w:rtl w:val="0"/>
@@ -6106,7 +5598,6 @@
       </w:r>
       <w:r>
         <w:rPr>
-          <w:rFonts w:ascii="Garamond" w:cs="Garamond" w:eastAsia="Garamond" w:hAnsi="Garamond"/>
           <w:i w:val="1"/>
           <w:iCs w:val="1"/>
           <w:sz w:val="20"/>
@@ -6117,7 +5608,6 @@
       </w:r>
       <w:r>
         <w:rPr>
-          <w:rFonts w:ascii="Garamond" w:cs="Garamond" w:eastAsia="Garamond" w:hAnsi="Garamond"/>
           <w:sz w:val="20"/>
           <w:szCs w:val="20"/>
           <w:rtl w:val="0"/>
@@ -6127,7 +5617,6 @@
       <w:hyperlink r:id="rId1">
         <w:r>
           <w:rPr>
-            <w:rFonts w:ascii="Garamond" w:cs="Garamond" w:eastAsia="Garamond" w:hAnsi="Garamond"/>
             <w:color w:val="1155cc"/>
             <w:sz w:val="20"/>
             <w:szCs w:val="20"/>
@@ -6145,9 +5634,8 @@
     </w:p>
     <w:p>
       <w:pPr>
-        <w:spacing w:line="240" w:lineRule="auto"/>
-        <w:rPr>
-          <w:rFonts w:ascii="Garamond" w:cs="Garamond" w:eastAsia="Garamond" w:hAnsi="Garamond"/>
+        <w:spacing w:before="0" w:line="240" w:lineRule="auto"/>
+        <w:rPr>
           <w:sz w:val="20"/>
           <w:szCs w:val="20"/>
         </w:rPr>
@@ -6162,9 +5650,8 @@
   <w:footnote w:id="1">
     <w:p>
       <w:pPr>
-        <w:spacing w:line="240" w:lineRule="auto"/>
-        <w:rPr>
-          <w:rFonts w:ascii="Garamond" w:cs="Garamond" w:eastAsia="Garamond" w:hAnsi="Garamond"/>
+        <w:spacing w:before="0" w:line="240" w:lineRule="auto"/>
+        <w:rPr>
           <w:sz w:val="20"/>
           <w:szCs w:val="20"/>
         </w:rPr>
@@ -6178,7 +5665,6 @@
       </w:r>
       <w:r>
         <w:rPr>
-          <w:rFonts w:ascii="Garamond" w:cs="Garamond" w:eastAsia="Garamond" w:hAnsi="Garamond"/>
           <w:sz w:val="20"/>
           <w:szCs w:val="20"/>
           <w:rtl w:val="0"/>
@@ -6187,7 +5673,6 @@
       </w:r>
       <w:r>
         <w:rPr>
-          <w:rFonts w:ascii="Garamond" w:cs="Garamond" w:eastAsia="Garamond" w:hAnsi="Garamond"/>
           <w:i w:val="1"/>
           <w:iCs w:val="1"/>
           <w:sz w:val="20"/>
@@ -6198,7 +5683,6 @@
       </w:r>
       <w:r>
         <w:rPr>
-          <w:rFonts w:ascii="Garamond" w:cs="Garamond" w:eastAsia="Garamond" w:hAnsi="Garamond"/>
           <w:sz w:val="20"/>
           <w:szCs w:val="20"/>
           <w:rtl w:val="0"/>
@@ -6210,9 +5694,8 @@
   <w:footnote w:id="2">
     <w:p>
       <w:pPr>
-        <w:spacing w:line="240" w:lineRule="auto"/>
-        <w:rPr>
-          <w:rFonts w:ascii="Garamond" w:cs="Garamond" w:eastAsia="Garamond" w:hAnsi="Garamond"/>
+        <w:spacing w:before="0" w:line="240" w:lineRule="auto"/>
+        <w:rPr>
           <w:sz w:val="20"/>
           <w:szCs w:val="20"/>
         </w:rPr>
@@ -6226,7 +5709,6 @@
       </w:r>
       <w:r>
         <w:rPr>
-          <w:rFonts w:ascii="Garamond" w:cs="Garamond" w:eastAsia="Garamond" w:hAnsi="Garamond"/>
           <w:sz w:val="20"/>
           <w:szCs w:val="20"/>
           <w:rtl w:val="0"/>
@@ -6238,9 +5720,8 @@
   <w:footnote w:id="3">
     <w:p>
       <w:pPr>
-        <w:spacing w:line="240" w:lineRule="auto"/>
-        <w:rPr>
-          <w:rFonts w:ascii="Garamond" w:cs="Garamond" w:eastAsia="Garamond" w:hAnsi="Garamond"/>
+        <w:spacing w:before="0" w:line="240" w:lineRule="auto"/>
+        <w:rPr>
           <w:sz w:val="20"/>
           <w:szCs w:val="20"/>
         </w:rPr>
@@ -6254,7 +5735,6 @@
       </w:r>
       <w:r>
         <w:rPr>
-          <w:rFonts w:ascii="Garamond" w:cs="Garamond" w:eastAsia="Garamond" w:hAnsi="Garamond"/>
           <w:sz w:val="20"/>
           <w:szCs w:val="20"/>
           <w:rtl w:val="0"/>
@@ -6266,9 +5746,8 @@
   <w:footnote w:id="4">
     <w:p>
       <w:pPr>
-        <w:spacing w:line="240" w:lineRule="auto"/>
-        <w:rPr>
-          <w:rFonts w:ascii="Garamond" w:cs="Garamond" w:eastAsia="Garamond" w:hAnsi="Garamond"/>
+        <w:spacing w:before="0" w:line="240" w:lineRule="auto"/>
+        <w:rPr>
           <w:sz w:val="20"/>
           <w:szCs w:val="20"/>
         </w:rPr>
@@ -6282,7 +5761,6 @@
       </w:r>
       <w:r>
         <w:rPr>
-          <w:rFonts w:ascii="Garamond" w:cs="Garamond" w:eastAsia="Garamond" w:hAnsi="Garamond"/>
           <w:sz w:val="20"/>
           <w:szCs w:val="20"/>
           <w:rtl w:val="0"/>

</xml_diff>